<commit_message>
docs: add Chinese references and clear pagination flags
</commit_message>
<xml_diff>
--- a/docs/papers/20230411330_严何涛_基于Spring Boot的编程错题智能解析助手系统设计与实现.docx
+++ b/docs/papers/20230411330_严何涛_基于Spring Boot的编程错题智能解析助手系统设计与实现.docx
@@ -5,6 +5,10 @@
     <w:p>
       <w:pPr>
         <w:pStyle w:val="Title"/>
+        <w:keepNext w:val="0"/>
+        <w:keepLines w:val="0"/>
+        <w:pageBreakBefore w:val="0"/>
+        <w:widowControl w:val="0"/>
         <w:jc w:val="center"/>
       </w:pPr>
       <w:r>
@@ -13,6 +17,10 @@
     </w:p>
     <w:p>
       <w:pPr>
+        <w:keepNext w:val="0"/>
+        <w:keepLines w:val="0"/>
+        <w:pageBreakBefore w:val="0"/>
+        <w:widowControl w:val="0"/>
         <w:ind w:firstLine="0"/>
         <w:jc w:val="center"/>
       </w:pPr>
@@ -23,19 +31,32 @@
     <w:p>
       <w:pPr>
         <w:pStyle w:val="论文标题"/>
+        <w:keepNext w:val="0"/>
+        <w:keepLines w:val="0"/>
+        <w:pageBreakBefore w:val="0"/>
+        <w:widowControl w:val="0"/>
       </w:pPr>
       <w:r>
         <w:t>摘要</w:t>
       </w:r>
     </w:p>
     <w:p>
-      <w:pPr/>
+      <w:pPr>
+        <w:keepNext w:val="0"/>
+        <w:keepLines w:val="0"/>
+        <w:pageBreakBefore w:val="0"/>
+        <w:widowControl w:val="0"/>
+      </w:pPr>
       <w:r>
         <w:t>针对编程学习中错题材料分散、错误原因难以整理和复习缺少连续记录的问题，本文设计并实现一套基于Spring Boot的编程错题智能解析助手。系统采用浏览器页面、后端服务、MySQL数据库和可配置的模型服务组成的结构，提供账户登录、错题管理、智能解析、知识点关联、分析历史、人工反馈、复习记录和学习统计。用户录入题目描述、代码、报错信息以及实际和预期结果后，后端将这些材料按固定结构提交给模型，再检查返回内容是否包含错误类型、位置、原因、修改建议、参考代码、知识点和学习建议七项信息。解析过程和结果分别保存，便于查看与追溯。当前Maven测试共16项通过，说明被测试的接口与业务规则可按预期运行。项目另整理150条候选Java案例和300行待填写评分记录，尚不能据此给出解析准确率。系统实现了从记录错题到复习反馈的个人学习流程，为后续以人工标注和代码测试评估解析效果提供了基础。</w:t>
       </w:r>
     </w:p>
     <w:p>
       <w:pPr>
+        <w:keepNext w:val="0"/>
+        <w:keepLines w:val="0"/>
+        <w:pageBreakBefore w:val="0"/>
+        <w:widowControl w:val="0"/>
         <w:ind w:firstLine="0"/>
       </w:pPr>
       <w:r>
@@ -45,13 +66,22 @@
     <w:p>
       <w:pPr>
         <w:pStyle w:val="论文标题"/>
+        <w:keepNext w:val="0"/>
+        <w:keepLines w:val="0"/>
+        <w:pageBreakBefore w:val="0"/>
+        <w:widowControl w:val="0"/>
       </w:pPr>
       <w:r>
         <w:t>Abstract</w:t>
       </w:r>
     </w:p>
     <w:p>
-      <w:pPr/>
+      <w:pPr>
+        <w:keepNext w:val="0"/>
+        <w:keepLines w:val="0"/>
+        <w:pageBreakBefore w:val="0"/>
+        <w:widowControl w:val="0"/>
+      </w:pPr>
       <w:r>
         <w:rPr>
           <w:rFonts w:ascii="Times New Roman" w:hAnsi="Times New Roman"/>
@@ -61,6 +91,10 @@
     </w:p>
     <w:p>
       <w:pPr>
+        <w:keepNext w:val="0"/>
+        <w:keepLines w:val="0"/>
+        <w:pageBreakBefore w:val="0"/>
+        <w:widowControl w:val="0"/>
         <w:ind w:firstLine="0"/>
       </w:pPr>
       <w:r>
@@ -73,25 +107,44 @@
     <w:p>
       <w:pPr>
         <w:pStyle w:val="论文标题"/>
+        <w:keepNext w:val="0"/>
+        <w:keepLines w:val="0"/>
+        <w:pageBreakBefore w:val="0"/>
+        <w:widowControl w:val="0"/>
       </w:pPr>
       <w:r>
         <w:t>1 引言</w:t>
       </w:r>
     </w:p>
     <w:p>
-      <w:pPr/>
+      <w:pPr>
+        <w:keepNext w:val="0"/>
+        <w:keepLines w:val="0"/>
+        <w:pageBreakBefore w:val="0"/>
+        <w:widowControl w:val="0"/>
+      </w:pPr>
       <w:r>
-        <w:t>程序设计课程的练习通常伴随编译错误、运行异常和结果不符合预期等问题。学生若只保存报错截图或修正后的代码，过一段时间便难以还原原始思路，也不容易区分语法失误、边界条件遗漏和算法理解偏差。针对编程练习自动反馈的研究指出，反馈的内容、生成方式及其对学习者的帮助需要分别分析[1]。因此，错题工具除存储原始材料外，还应把错误解释、修改过程和复习活动连接起来。</w:t>
+        <w:t>程序设计课程的练习通常伴随编译错误、运行异常和结果不符合预期等问题。学生若只保存报错截图或修正后的代码，过一段时间便难以还原原始思路，也不容易区分语法失误、边界条件遗漏和算法理解偏差。唐琳等在编程实践课程中引入大语言模型[1]，陈峥等将其用于Java编程作业评估[2]。针对编程练习自动反馈的综述指出，反馈的内容、生成方式及其对学习者的帮助需要分别分析[3]。因此，错题工具除存储原始材料外，还应把错误解释、修改过程和复习活动连接起来。</w:t>
       </w:r>
     </w:p>
     <w:p>
-      <w:pPr/>
+      <w:pPr>
+        <w:keepNext w:val="0"/>
+        <w:keepLines w:val="0"/>
+        <w:pageBreakBefore w:val="0"/>
+        <w:widowControl w:val="0"/>
+      </w:pPr>
       <w:r>
-        <w:t>大语言模型能够生成自然语言解释和参考代码，但流畅的表述不能直接证明判断正确。教育领域的研究同时讨论了这类工具的学习机会与准确性、依赖性等问题[2]。本文将模型输出定位为供学生参考的分析材料，允许用户记录人工判断，并保留原始响应以便核查。研究目标是完成可运行的个人错题整理与解析流程，考察系统功能能否贯通；解析正确率则须等待独立标注与代码测试。</w:t>
+        <w:t>大语言模型能够生成自然语言解释和参考代码，但流畅的表述不能直接证明判断正确。教育领域的研究同时讨论了这类工具的学习机会与准确性、依赖性等问题[4]。本文将模型输出定位为供学生参考的分析材料，允许用户记录人工判断，并保留原始响应以便核查。研究目标是完成可运行的个人错题整理与解析流程，考察系统功能能否贯通；解析正确率则须等待独立标注与代码测试。</w:t>
       </w:r>
     </w:p>
     <w:p>
-      <w:pPr/>
+      <w:pPr>
+        <w:keepNext w:val="0"/>
+        <w:keepLines w:val="0"/>
+        <w:pageBreakBefore w:val="0"/>
+        <w:widowControl w:val="0"/>
+      </w:pPr>
       <w:r>
         <w:t>本文依次说明需求、结构设计、核心实现和验证结果。研究对象是个人编程练习中的错题记录，不涉及在线判题、班级教学管理或在服务器上执行用户提交的程序。</w:t>
       </w:r>
@@ -99,6 +152,10 @@
     <w:p>
       <w:pPr>
         <w:pStyle w:val="论文标题"/>
+        <w:keepNext w:val="0"/>
+        <w:keepLines w:val="0"/>
+        <w:pageBreakBefore w:val="0"/>
+        <w:widowControl w:val="0"/>
       </w:pPr>
       <w:r>
         <w:t>2 系统分析</w:t>
@@ -106,6 +163,10 @@
     </w:p>
     <w:p>
       <w:pPr>
+        <w:keepNext w:val="0"/>
+        <w:keepLines w:val="0"/>
+        <w:pageBreakBefore w:val="0"/>
+        <w:widowControl w:val="0"/>
         <w:ind w:firstLine="0"/>
       </w:pPr>
       <w:r>
@@ -114,6 +175,10 @@
     </w:p>
     <w:p>
       <w:pPr>
+        <w:keepNext w:val="0"/>
+        <w:keepLines w:val="0"/>
+        <w:pageBreakBefore w:val="0"/>
+        <w:widowControl w:val="0"/>
         <w:ind w:firstLine="0"/>
       </w:pPr>
       <w:r>
@@ -122,6 +187,10 @@
     </w:p>
     <w:p>
       <w:pPr>
+        <w:keepNext w:val="0"/>
+        <w:keepLines w:val="0"/>
+        <w:pageBreakBefore w:val="0"/>
+        <w:widowControl w:val="0"/>
         <w:ind w:firstLine="0"/>
       </w:pPr>
       <w:r>
@@ -131,6 +200,10 @@
     <w:p>
       <w:pPr>
         <w:pStyle w:val="论文标题"/>
+        <w:keepNext w:val="0"/>
+        <w:keepLines w:val="0"/>
+        <w:pageBreakBefore w:val="0"/>
+        <w:widowControl w:val="0"/>
       </w:pPr>
       <w:r>
         <w:t>3 系统设计</w:t>
@@ -138,22 +211,34 @@
     </w:p>
     <w:p>
       <w:pPr>
+        <w:keepNext w:val="0"/>
+        <w:keepLines w:val="0"/>
+        <w:pageBreakBefore w:val="0"/>
+        <w:widowControl w:val="0"/>
         <w:ind w:firstLine="0"/>
       </w:pPr>
       <w:r>
-        <w:t>(1) 总体结构。系统采用浏览器与后端分离的职责安排：页面负责收集材料、展示错题和解析结果；Spring Boot后端接收请求，执行身份检查与业务处理；MySQL保存用户、错题、解析、知识点和复习数据；模型服务根据组织后的输入生成建议。Spring Boot提供应用启动、接口开发和配置管理的实现基础[3]。系统默认通过本机Ollama调用模型，也预留可配置的兼容接口。Ollama的聊天接口接受模型名称与消息内容并返回生成信息[5]。</w:t>
+        <w:t>(1) 总体结构。系统采用浏览器与后端分离的职责安排：页面负责收集材料、展示错题和解析结果；Spring Boot后端接收请求，执行身份检查与业务处理；MySQL保存用户、错题、解析、知识点和复习数据；模型服务根据组织后的输入生成建议。Spring Boot提供应用启动、接口开发和配置管理的实现基础[5]。系统默认通过本机Ollama调用模型，也预留可配置的兼容接口。Ollama的聊天接口接受模型名称与消息内容并返回生成信息[7]。</w:t>
       </w:r>
     </w:p>
     <w:p>
       <w:pPr>
+        <w:keepNext w:val="0"/>
+        <w:keepLines w:val="0"/>
+        <w:pageBreakBefore w:val="0"/>
+        <w:widowControl w:val="0"/>
         <w:ind w:firstLine="0"/>
       </w:pPr>
       <w:r>
-        <w:t>(2) 数据结构。用户表与错题表形成一对多关系，错题表保存题目、编程语言、代码及错误上下文。解析结果表保存七项结构化内容，分析记录表保存请求和原始响应，二者分开后既能快速展示，也能追查生成过程。知识点表与错题之间通过关联表建立多对多关系。复习状态表记录连续记住次数和下次日期，复习明细表保存每次选择。数据库通过主键、索引与外键保持关联数据的一致性；外键在删除相关记录时的行为由建表约束确定[4]。</w:t>
+        <w:t>(2) 数据结构。用户表与错题表形成一对多关系，错题表保存题目、编程语言、代码及错误上下文。解析结果表保存七项结构化内容，分析记录表保存请求和原始响应，二者分开后既能快速展示，也能追查生成过程。知识点表与错题之间通过关联表建立多对多关系。复习状态表记录连续记住次数和下次日期，复习明细表保存每次选择。数据库通过主键、索引与外键保持关联数据的一致性；外键在删除相关记录时的行为由建表约束确定[6]。</w:t>
       </w:r>
     </w:p>
     <w:p>
       <w:pPr>
+        <w:keepNext w:val="0"/>
+        <w:keepLines w:val="0"/>
+        <w:pageBreakBefore w:val="0"/>
+        <w:widowControl w:val="0"/>
         <w:ind w:firstLine="0"/>
       </w:pPr>
       <w:r>
@@ -162,6 +247,10 @@
     </w:p>
     <w:p>
       <w:pPr>
+        <w:keepNext w:val="0"/>
+        <w:keepLines w:val="0"/>
+        <w:pageBreakBefore w:val="0"/>
+        <w:widowControl w:val="0"/>
         <w:ind w:firstLine="0"/>
       </w:pPr>
       <w:r>
@@ -171,6 +260,10 @@
     <w:p>
       <w:pPr>
         <w:pStyle w:val="论文标题"/>
+        <w:keepNext w:val="0"/>
+        <w:keepLines w:val="0"/>
+        <w:pageBreakBefore w:val="0"/>
+        <w:widowControl w:val="0"/>
       </w:pPr>
       <w:r>
         <w:t>4 系统实现</w:t>
@@ -178,6 +271,10 @@
     </w:p>
     <w:p>
       <w:pPr>
+        <w:keepNext w:val="0"/>
+        <w:keepLines w:val="0"/>
+        <w:pageBreakBefore w:val="0"/>
+        <w:widowControl w:val="0"/>
         <w:ind w:firstLine="0"/>
       </w:pPr>
       <w:r>
@@ -186,6 +283,10 @@
     </w:p>
     <w:p>
       <w:pPr>
+        <w:keepNext w:val="0"/>
+        <w:keepLines w:val="0"/>
+        <w:pageBreakBefore w:val="0"/>
+        <w:widowControl w:val="0"/>
         <w:ind w:firstLine="0"/>
       </w:pPr>
       <w:r>
@@ -194,6 +295,10 @@
     </w:p>
     <w:p>
       <w:pPr>
+        <w:keepNext w:val="0"/>
+        <w:keepLines w:val="0"/>
+        <w:pageBreakBefore w:val="0"/>
+        <w:widowControl w:val="0"/>
         <w:ind w:firstLine="0"/>
       </w:pPr>
       <w:r>
@@ -202,6 +307,10 @@
     </w:p>
     <w:p>
       <w:pPr>
+        <w:keepNext w:val="0"/>
+        <w:keepLines w:val="0"/>
+        <w:pageBreakBefore w:val="0"/>
+        <w:widowControl w:val="0"/>
         <w:ind w:firstLine="0"/>
       </w:pPr>
       <w:r>
@@ -211,6 +320,10 @@
     <w:p>
       <w:pPr>
         <w:pStyle w:val="论文标题"/>
+        <w:keepNext w:val="0"/>
+        <w:keepLines w:val="0"/>
+        <w:pageBreakBefore w:val="0"/>
+        <w:widowControl w:val="0"/>
       </w:pPr>
       <w:r>
         <w:t>5 结果与讨论</w:t>
@@ -218,6 +331,10 @@
     </w:p>
     <w:p>
       <w:pPr>
+        <w:keepNext w:val="0"/>
+        <w:keepLines w:val="0"/>
+        <w:pageBreakBefore w:val="0"/>
+        <w:widowControl w:val="0"/>
         <w:ind w:firstLine="0"/>
       </w:pPr>
       <w:r>
@@ -226,14 +343,22 @@
     </w:p>
     <w:p>
       <w:pPr>
+        <w:keepNext w:val="0"/>
+        <w:keepLines w:val="0"/>
+        <w:pageBreakBefore w:val="0"/>
+        <w:widowControl w:val="0"/>
         <w:ind w:firstLine="0"/>
       </w:pPr>
       <w:r>
-        <w:t>(2) 解析效果证据。项目实验目录保存来自IntroClassJava的150条候选Java案例及两种提示词设置的300行评分表。该公开数据集提供带错误的Java程序，适合作为可追溯的候选来源[6]。本次核查发现评分表中的核验人、原因正确性、建议正确性和代码运行结果仍为空。因而目前只能说明已准备实验材料，不能计算模型的诊断准确率、修改有效率或参考代码可运行比例。</w:t>
+        <w:t>(2) 解析效果证据。项目实验目录保存来自IntroClassJava的150条候选Java案例及两种提示词设置的300行评分表。该公开数据集提供带错误的Java程序，适合作为可追溯的候选来源[8]。本次核查发现评分表中的核验人、原因正确性、建议正确性和代码运行结果仍为空。因而目前只能说明已准备实验材料，不能计算模型的诊断准确率、修改有效率或参考代码可运行比例。</w:t>
       </w:r>
     </w:p>
     <w:p>
       <w:pPr>
+        <w:keepNext w:val="0"/>
+        <w:keepLines w:val="0"/>
+        <w:pageBreakBefore w:val="0"/>
+        <w:widowControl w:val="0"/>
         <w:ind w:firstLine="0"/>
       </w:pPr>
       <w:r>
@@ -243,19 +368,33 @@
     <w:p>
       <w:pPr>
         <w:pStyle w:val="论文标题"/>
+        <w:keepNext w:val="0"/>
+        <w:keepLines w:val="0"/>
+        <w:pageBreakBefore w:val="0"/>
+        <w:widowControl w:val="0"/>
       </w:pPr>
       <w:r>
         <w:t>6 结论</w:t>
       </w:r>
     </w:p>
     <w:p>
-      <w:pPr/>
+      <w:pPr>
+        <w:keepNext w:val="0"/>
+        <w:keepLines w:val="0"/>
+        <w:pageBreakBefore w:val="0"/>
+        <w:widowControl w:val="0"/>
+      </w:pPr>
       <w:r>
         <w:t>本文围绕个人编程错题的整理与复盘，完成了基于Spring Boot的智能解析助手设计和实现。系统将原始错误材料、模型生成解释、人工反馈及后续复习保存在同一学习流程中，并通过账户归属检查、结果格式校验和调用限额控制保证基本使用秩序。当前16项自动化测试通过，支持对已覆盖功能的实现结论。</w:t>
       </w:r>
     </w:p>
     <w:p>
-      <w:pPr/>
+      <w:pPr>
+        <w:keepNext w:val="0"/>
+        <w:keepLines w:val="0"/>
+        <w:pageBreakBefore w:val="0"/>
+        <w:widowControl w:val="0"/>
+      </w:pPr>
       <w:r>
         <w:t>本研究的现有证据主要证明系统功能可用。模型输出是否准确、参考代码是否能够修正错误、复习安排是否改善学习效果，仍需独立的人工评分与代码测试。后续完成这些验证后，才能对智能解析的实际效果作出定量判断。</w:t>
       </w:r>
@@ -263,6 +402,10 @@
     <w:p>
       <w:pPr>
         <w:pStyle w:val="论文标题"/>
+        <w:keepNext w:val="0"/>
+        <w:keepLines w:val="0"/>
+        <w:pageBreakBefore w:val="0"/>
+        <w:widowControl w:val="0"/>
       </w:pPr>
       <w:r>
         <w:t>参考文献</w:t>
@@ -271,49 +414,97 @@
     <w:p>
       <w:pPr>
         <w:pStyle w:val="参考文献正文"/>
+        <w:keepNext w:val="0"/>
+        <w:keepLines w:val="0"/>
+        <w:pageBreakBefore w:val="0"/>
+        <w:widowControl w:val="0"/>
       </w:pPr>
       <w:r>
-        <w:t>[1] KEUNING H, JEURING J T, HEEREN B. A systematic literature review of automated feedback generation for programming exercises[J]. ACM Transactions on Computing Education, 2018, 19(1).</w:t>
+        <w:t>[1] 唐琳, 张佳鑫, 徐照光. 大语言模型在计算机编程实践课程教学中的应用[J]. 计算机教育, 2025(2): 97-101, 106.</w:t>
       </w:r>
     </w:p>
     <w:p>
       <w:pPr>
         <w:pStyle w:val="参考文献正文"/>
+        <w:keepNext w:val="0"/>
+        <w:keepLines w:val="0"/>
+        <w:pageBreakBefore w:val="0"/>
+        <w:widowControl w:val="0"/>
       </w:pPr>
       <w:r>
-        <w:t>[2] KASNECI E, SESSLER K, KÜCHEMANN S, et al. ChatGPT for good? On opportunities and challenges of large language models for education[J]. Learning and Individual Differences, 2023, 103: 102274.</w:t>
+        <w:t>[2] 陈峥, 喻俊杰. 基于LLM的Java编程作业评估与教学实践[J]. 计算机教育, 2026(6): 198-205.</w:t>
       </w:r>
     </w:p>
     <w:p>
       <w:pPr>
         <w:pStyle w:val="参考文献正文"/>
+        <w:keepNext w:val="0"/>
+        <w:keepLines w:val="0"/>
+        <w:pageBreakBefore w:val="0"/>
+        <w:widowControl w:val="0"/>
       </w:pPr>
       <w:r>
-        <w:t>[3] SPRING. Spring Boot Reference Documentation[EB/OL]. https://docs.spring.io/spring-boot/reference/, 2026-10-26.</w:t>
+        <w:t>[3] KEUNING H, JEURING J T, HEEREN B. A systematic literature review of automated feedback generation for programming exercises[J]. ACM Transactions on Computing Education, 2018, 19(1).</w:t>
       </w:r>
     </w:p>
     <w:p>
       <w:pPr>
         <w:pStyle w:val="参考文献正文"/>
+        <w:keepNext w:val="0"/>
+        <w:keepLines w:val="0"/>
+        <w:pageBreakBefore w:val="0"/>
+        <w:widowControl w:val="0"/>
       </w:pPr>
       <w:r>
-        <w:t>[4] ORACLE. MySQL 8.4 Reference Manual: FOREIGN KEY Constraints[EB/OL]. https://dev.mysql.com/doc/refman/8.4/en/constraint-foreign-key.html, 2026-10-26.</w:t>
+        <w:t>[4] KASNECI E, SESSLER K, KÜCHEMANN S, et al. ChatGPT for good? On opportunities and challenges of large language models for education[J]. Learning and Individual Differences, 2023, 103: 102274.</w:t>
       </w:r>
     </w:p>
     <w:p>
       <w:pPr>
         <w:pStyle w:val="参考文献正文"/>
+        <w:keepNext w:val="0"/>
+        <w:keepLines w:val="0"/>
+        <w:pageBreakBefore w:val="0"/>
+        <w:widowControl w:val="0"/>
       </w:pPr>
       <w:r>
-        <w:t>[5] OLLAMA. Generate a chat message[EB/OL]. https://docs.ollama.com/api/chat, 2026-10-26.</w:t>
+        <w:t>[5] SPRING. Spring Boot 3.5 Reference Documentation[EB/OL]. https://docs.spring.io/spring-boot/3.5/reference/index.html, 2026-10-26.</w:t>
       </w:r>
     </w:p>
     <w:p>
       <w:pPr>
         <w:pStyle w:val="参考文献正文"/>
+        <w:keepNext w:val="0"/>
+        <w:keepLines w:val="0"/>
+        <w:pageBreakBefore w:val="0"/>
+        <w:widowControl w:val="0"/>
       </w:pPr>
       <w:r>
-        <w:t>[6] SPIRALS-TEAM. IntroClassJava: A dataset of Java bugs for automatic repair[EB/OL]. https://github.com/Spirals-Team/IntroClassJava, 2026-10-26.</w:t>
+        <w:t>[6] ORACLE. MySQL 8.4 Reference Manual: FOREIGN KEY Constraints[EB/OL]. https://dev.mysql.com/doc/refman/8.4/en/constraint-foreign-key.html, 2026-10-26.</w:t>
+      </w:r>
+    </w:p>
+    <w:p>
+      <w:pPr>
+        <w:pStyle w:val="参考文献正文"/>
+        <w:keepNext w:val="0"/>
+        <w:keepLines w:val="0"/>
+        <w:pageBreakBefore w:val="0"/>
+        <w:widowControl w:val="0"/>
+      </w:pPr>
+      <w:r>
+        <w:t>[7] OLLAMA. Generate a chat message[EB/OL]. https://docs.ollama.com/api/chat, 2026-10-26.</w:t>
+      </w:r>
+    </w:p>
+    <w:p>
+      <w:pPr>
+        <w:pStyle w:val="参考文献正文"/>
+        <w:keepNext w:val="0"/>
+        <w:keepLines w:val="0"/>
+        <w:pageBreakBefore w:val="0"/>
+        <w:widowControl w:val="0"/>
+      </w:pPr>
+      <w:r>
+        <w:t>[8] SPIRALS-TEAM. IntroClassJava: A dataset of Java bugs for automatic repair[EB/OL]. https://github.com/Spirals-Team/IntroClassJava, 2026-10-26.</w:t>
       </w:r>
     </w:p>
     <w:sectPr>
@@ -332,6 +523,10 @@
   <w:p>
     <w:pPr>
       <w:pStyle w:val="Footer"/>
+      <w:keepNext w:val="0"/>
+      <w:keepLines w:val="0"/>
+      <w:pageBreakBefore w:val="0"/>
+      <w:widowControl w:val="0"/>
       <w:ind w:firstLine="0"/>
       <w:jc w:val="center"/>
     </w:pPr>
@@ -704,6 +899,10 @@
     <w:qFormat/>
     <w:rsid w:val="00FC693F"/>
     <w:pPr>
+      <w:keepNext w:val="0"/>
+      <w:keepLines w:val="0"/>
+      <w:pageBreakBefore w:val="0"/>
+      <w:widowControl w:val="0"/>
       <w:spacing w:line="360" w:lineRule="auto" w:after="0"/>
       <w:ind w:firstLine="480"/>
       <w:jc w:val="left"/>
@@ -722,6 +921,10 @@
     <w:unhideWhenUsed/>
     <w:rsid w:val="00E618BF"/>
     <w:pPr>
+      <w:keepNext w:val="0"/>
+      <w:keepLines w:val="0"/>
+      <w:pageBreakBefore w:val="0"/>
+      <w:widowControl w:val="0"/>
       <w:tabs>
         <w:tab w:val="center" w:pos="4680"/>
         <w:tab w:val="right" w:pos="9360"/>
@@ -744,6 +947,10 @@
     <w:unhideWhenUsed/>
     <w:rsid w:val="00E618BF"/>
     <w:pPr>
+      <w:keepNext w:val="0"/>
+      <w:keepLines w:val="0"/>
+      <w:pageBreakBefore w:val="0"/>
+      <w:widowControl w:val="0"/>
       <w:tabs>
         <w:tab w:val="center" w:pos="4680"/>
         <w:tab w:val="right" w:pos="9360"/>
@@ -767,8 +974,10 @@
     <w:qFormat/>
     <w:rsid w:val="00FC693F"/>
     <w:pPr>
-      <w:keepNext/>
-      <w:keepLines/>
+      <w:keepNext w:val="0"/>
+      <w:keepLines w:val="0"/>
+      <w:pageBreakBefore w:val="0"/>
+      <w:widowControl w:val="0"/>
       <w:spacing w:before="480" w:after="0"/>
       <w:outlineLvl w:val="0"/>
     </w:pPr>
@@ -791,8 +1000,10 @@
     <w:qFormat/>
     <w:rsid w:val="00FC693F"/>
     <w:pPr>
-      <w:keepNext/>
-      <w:keepLines/>
+      <w:keepNext w:val="0"/>
+      <w:keepLines w:val="0"/>
+      <w:pageBreakBefore w:val="0"/>
+      <w:widowControl w:val="0"/>
       <w:spacing w:before="200" w:after="0"/>
       <w:outlineLvl w:val="1"/>
     </w:pPr>
@@ -815,8 +1026,10 @@
     <w:qFormat/>
     <w:rsid w:val="00FC693F"/>
     <w:pPr>
-      <w:keepNext/>
-      <w:keepLines/>
+      <w:keepNext w:val="0"/>
+      <w:keepLines w:val="0"/>
+      <w:pageBreakBefore w:val="0"/>
+      <w:widowControl w:val="0"/>
       <w:spacing w:before="200" w:after="0"/>
       <w:outlineLvl w:val="2"/>
     </w:pPr>
@@ -838,8 +1051,10 @@
     <w:qFormat/>
     <w:rsid w:val="00FC693F"/>
     <w:pPr>
-      <w:keepNext/>
-      <w:keepLines/>
+      <w:keepNext w:val="0"/>
+      <w:keepLines w:val="0"/>
+      <w:pageBreakBefore w:val="0"/>
+      <w:widowControl w:val="0"/>
       <w:spacing w:before="200" w:after="0"/>
       <w:outlineLvl w:val="3"/>
     </w:pPr>
@@ -863,8 +1078,10 @@
     <w:qFormat/>
     <w:rsid w:val="00FC693F"/>
     <w:pPr>
-      <w:keepNext/>
-      <w:keepLines/>
+      <w:keepNext w:val="0"/>
+      <w:keepLines w:val="0"/>
+      <w:pageBreakBefore w:val="0"/>
+      <w:widowControl w:val="0"/>
       <w:spacing w:before="200" w:after="0"/>
       <w:outlineLvl w:val="4"/>
     </w:pPr>
@@ -884,8 +1101,10 @@
     <w:qFormat/>
     <w:rsid w:val="00FC693F"/>
     <w:pPr>
-      <w:keepNext/>
-      <w:keepLines/>
+      <w:keepNext w:val="0"/>
+      <w:keepLines w:val="0"/>
+      <w:pageBreakBefore w:val="0"/>
+      <w:widowControl w:val="0"/>
       <w:spacing w:before="200" w:after="0"/>
       <w:outlineLvl w:val="5"/>
     </w:pPr>
@@ -907,8 +1126,10 @@
     <w:qFormat/>
     <w:rsid w:val="00FC693F"/>
     <w:pPr>
-      <w:keepNext/>
-      <w:keepLines/>
+      <w:keepNext w:val="0"/>
+      <w:keepLines w:val="0"/>
+      <w:pageBreakBefore w:val="0"/>
+      <w:widowControl w:val="0"/>
       <w:spacing w:before="200" w:after="0"/>
       <w:outlineLvl w:val="6"/>
     </w:pPr>
@@ -930,8 +1151,10 @@
     <w:qFormat/>
     <w:rsid w:val="00FC693F"/>
     <w:pPr>
-      <w:keepNext/>
-      <w:keepLines/>
+      <w:keepNext w:val="0"/>
+      <w:keepLines w:val="0"/>
+      <w:pageBreakBefore w:val="0"/>
+      <w:widowControl w:val="0"/>
       <w:spacing w:before="200" w:after="0"/>
       <w:outlineLvl w:val="7"/>
     </w:pPr>
@@ -953,8 +1176,10 @@
     <w:qFormat/>
     <w:rsid w:val="00FC693F"/>
     <w:pPr>
-      <w:keepNext/>
-      <w:keepLines/>
+      <w:keepNext w:val="0"/>
+      <w:keepLines w:val="0"/>
+      <w:pageBreakBefore w:val="0"/>
+      <w:widowControl w:val="0"/>
       <w:spacing w:before="200" w:after="0"/>
       <w:outlineLvl w:val="8"/>
     </w:pPr>
@@ -1000,6 +1225,10 @@
     <w:qFormat/>
     <w:rsid w:val="00FC693F"/>
     <w:pPr>
+      <w:keepNext w:val="0"/>
+      <w:keepLines w:val="0"/>
+      <w:pageBreakBefore w:val="0"/>
+      <w:widowControl w:val="0"/>
       <w:spacing w:after="0" w:line="240" w:lineRule="auto"/>
     </w:pPr>
   </w:style>
@@ -1055,6 +1284,10 @@
     <w:qFormat/>
     <w:rsid w:val="00FC693F"/>
     <w:pPr>
+      <w:keepNext w:val="0"/>
+      <w:keepLines w:val="0"/>
+      <w:pageBreakBefore w:val="0"/>
+      <w:widowControl w:val="0"/>
       <w:spacing w:after="200" w:line="240" w:lineRule="auto"/>
       <w:ind w:firstLine="0"/>
       <w:contextualSpacing/>
@@ -1092,6 +1325,10 @@
     <w:qFormat/>
     <w:rsid w:val="00FC693F"/>
     <w:pPr>
+      <w:keepNext w:val="0"/>
+      <w:keepLines w:val="0"/>
+      <w:pageBreakBefore w:val="0"/>
+      <w:widowControl w:val="0"/>
       <w:numPr>
         <w:ilvl w:val="1"/>
       </w:numPr>
@@ -1129,6 +1366,10 @@
     <w:qFormat/>
     <w:rsid w:val="00FC693F"/>
     <w:pPr>
+      <w:keepNext w:val="0"/>
+      <w:keepLines w:val="0"/>
+      <w:pageBreakBefore w:val="0"/>
+      <w:widowControl w:val="0"/>
       <w:ind w:left="720"/>
       <w:contextualSpacing/>
     </w:pPr>
@@ -1141,6 +1382,10 @@
     <w:unhideWhenUsed/>
     <w:rsid w:val="00AA1D8D"/>
     <w:pPr>
+      <w:keepNext w:val="0"/>
+      <w:keepLines w:val="0"/>
+      <w:pageBreakBefore w:val="0"/>
+      <w:widowControl w:val="0"/>
       <w:spacing w:after="120"/>
     </w:pPr>
   </w:style>
@@ -1159,6 +1404,10 @@
     <w:unhideWhenUsed/>
     <w:rsid w:val="00AA1D8D"/>
     <w:pPr>
+      <w:keepNext w:val="0"/>
+      <w:keepLines w:val="0"/>
+      <w:pageBreakBefore w:val="0"/>
+      <w:widowControl w:val="0"/>
       <w:spacing w:after="120" w:line="480" w:lineRule="auto"/>
     </w:pPr>
   </w:style>
@@ -1177,6 +1426,10 @@
     <w:unhideWhenUsed/>
     <w:rsid w:val="00AA1D8D"/>
     <w:pPr>
+      <w:keepNext w:val="0"/>
+      <w:keepLines w:val="0"/>
+      <w:pageBreakBefore w:val="0"/>
+      <w:widowControl w:val="0"/>
       <w:spacing w:after="120"/>
     </w:pPr>
     <w:rPr>
@@ -1202,6 +1455,10 @@
     <w:unhideWhenUsed/>
     <w:rsid w:val="00AA1D8D"/>
     <w:pPr>
+      <w:keepNext w:val="0"/>
+      <w:keepLines w:val="0"/>
+      <w:pageBreakBefore w:val="0"/>
+      <w:widowControl w:val="0"/>
       <w:ind w:left="360" w:hanging="360"/>
       <w:contextualSpacing/>
     </w:pPr>
@@ -1213,6 +1470,10 @@
     <w:unhideWhenUsed/>
     <w:rsid w:val="00326F90"/>
     <w:pPr>
+      <w:keepNext w:val="0"/>
+      <w:keepLines w:val="0"/>
+      <w:pageBreakBefore w:val="0"/>
+      <w:widowControl w:val="0"/>
       <w:ind w:left="720" w:hanging="360"/>
       <w:contextualSpacing/>
     </w:pPr>
@@ -1224,6 +1485,10 @@
     <w:unhideWhenUsed/>
     <w:rsid w:val="00326F90"/>
     <w:pPr>
+      <w:keepNext w:val="0"/>
+      <w:keepLines w:val="0"/>
+      <w:pageBreakBefore w:val="0"/>
+      <w:widowControl w:val="0"/>
       <w:ind w:left="1080" w:hanging="360"/>
       <w:contextualSpacing/>
     </w:pPr>
@@ -1235,6 +1500,10 @@
     <w:unhideWhenUsed/>
     <w:rsid w:val="00326F90"/>
     <w:pPr>
+      <w:keepNext w:val="0"/>
+      <w:keepLines w:val="0"/>
+      <w:pageBreakBefore w:val="0"/>
+      <w:widowControl w:val="0"/>
       <w:numPr>
         <w:numId w:val="1"/>
       </w:numPr>
@@ -1248,6 +1517,10 @@
     <w:unhideWhenUsed/>
     <w:rsid w:val="00326F90"/>
     <w:pPr>
+      <w:keepNext w:val="0"/>
+      <w:keepLines w:val="0"/>
+      <w:pageBreakBefore w:val="0"/>
+      <w:widowControl w:val="0"/>
       <w:numPr>
         <w:numId w:val="2"/>
       </w:numPr>
@@ -1261,6 +1534,10 @@
     <w:unhideWhenUsed/>
     <w:rsid w:val="00326F90"/>
     <w:pPr>
+      <w:keepNext w:val="0"/>
+      <w:keepLines w:val="0"/>
+      <w:pageBreakBefore w:val="0"/>
+      <w:widowControl w:val="0"/>
       <w:numPr>
         <w:numId w:val="3"/>
       </w:numPr>
@@ -1274,6 +1551,10 @@
     <w:unhideWhenUsed/>
     <w:rsid w:val="00326F90"/>
     <w:pPr>
+      <w:keepNext w:val="0"/>
+      <w:keepLines w:val="0"/>
+      <w:pageBreakBefore w:val="0"/>
+      <w:widowControl w:val="0"/>
       <w:numPr>
         <w:numId w:val="5"/>
       </w:numPr>
@@ -1287,6 +1568,10 @@
     <w:unhideWhenUsed/>
     <w:rsid w:val="0029639D"/>
     <w:pPr>
+      <w:keepNext w:val="0"/>
+      <w:keepLines w:val="0"/>
+      <w:pageBreakBefore w:val="0"/>
+      <w:widowControl w:val="0"/>
       <w:numPr>
         <w:numId w:val="6"/>
       </w:numPr>
@@ -1300,6 +1585,10 @@
     <w:unhideWhenUsed/>
     <w:rsid w:val="0029639D"/>
     <w:pPr>
+      <w:keepNext w:val="0"/>
+      <w:keepLines w:val="0"/>
+      <w:pageBreakBefore w:val="0"/>
+      <w:widowControl w:val="0"/>
       <w:numPr>
         <w:numId w:val="7"/>
       </w:numPr>
@@ -1313,6 +1602,10 @@
     <w:unhideWhenUsed/>
     <w:rsid w:val="0029639D"/>
     <w:pPr>
+      <w:keepNext w:val="0"/>
+      <w:keepLines w:val="0"/>
+      <w:pageBreakBefore w:val="0"/>
+      <w:widowControl w:val="0"/>
       <w:spacing w:after="120"/>
       <w:ind w:left="360"/>
       <w:contextualSpacing/>
@@ -1325,6 +1618,10 @@
     <w:unhideWhenUsed/>
     <w:rsid w:val="0029639D"/>
     <w:pPr>
+      <w:keepNext w:val="0"/>
+      <w:keepLines w:val="0"/>
+      <w:pageBreakBefore w:val="0"/>
+      <w:widowControl w:val="0"/>
       <w:spacing w:after="120"/>
       <w:ind w:left="720"/>
       <w:contextualSpacing/>
@@ -1337,6 +1634,10 @@
     <w:unhideWhenUsed/>
     <w:rsid w:val="0029639D"/>
     <w:pPr>
+      <w:keepNext w:val="0"/>
+      <w:keepLines w:val="0"/>
+      <w:pageBreakBefore w:val="0"/>
+      <w:widowControl w:val="0"/>
       <w:spacing w:after="120"/>
       <w:ind w:left="1080"/>
       <w:contextualSpacing/>
@@ -1349,6 +1650,10 @@
     <w:unhideWhenUsed/>
     <w:rsid w:val="0029639D"/>
     <w:pPr>
+      <w:keepNext w:val="0"/>
+      <w:keepLines w:val="0"/>
+      <w:pageBreakBefore w:val="0"/>
+      <w:widowControl w:val="0"/>
       <w:tabs>
         <w:tab w:val="left" w:pos="576"/>
         <w:tab w:val="left" w:pos="1152"/>
@@ -1385,6 +1690,12 @@
     <w:uiPriority w:val="29"/>
     <w:qFormat/>
     <w:rsid w:val="00FC693F"/>
+    <w:pPr>
+      <w:keepNext w:val="0"/>
+      <w:keepLines w:val="0"/>
+      <w:pageBreakBefore w:val="0"/>
+      <w:widowControl w:val="0"/>
+    </w:pPr>
     <w:rPr>
       <w:i/>
       <w:iCs/>
@@ -1499,6 +1810,10 @@
     <w:qFormat/>
     <w:rsid w:val="00FC693F"/>
     <w:pPr>
+      <w:keepNext w:val="0"/>
+      <w:keepLines w:val="0"/>
+      <w:pageBreakBefore w:val="0"/>
+      <w:widowControl w:val="0"/>
       <w:spacing w:line="240" w:lineRule="auto"/>
     </w:pPr>
     <w:rPr>
@@ -1540,6 +1855,10 @@
     <w:qFormat/>
     <w:rsid w:val="00FC693F"/>
     <w:pPr>
+      <w:keepNext w:val="0"/>
+      <w:keepLines w:val="0"/>
+      <w:pageBreakBefore w:val="0"/>
+      <w:widowControl w:val="0"/>
       <w:pBdr>
         <w:bottom w:val="single" w:sz="4" w:space="4" w:color="4F81BD" w:themeColor="accent1"/>
       </w:pBdr>
@@ -1644,6 +1963,10 @@
     <w:qFormat/>
     <w:rsid w:val="00FC693F"/>
     <w:pPr>
+      <w:keepNext w:val="0"/>
+      <w:keepLines w:val="0"/>
+      <w:pageBreakBefore w:val="0"/>
+      <w:widowControl w:val="0"/>
       <w:outlineLvl w:val="9"/>
     </w:pPr>
   </w:style>
@@ -12397,7 +12720,10 @@
   <w:style w:type="paragraph" w:customStyle="1" w:styleId="论文标题">
     <w:name w:val="论文标题"/>
     <w:pPr>
-      <w:keepNext/>
+      <w:keepNext w:val="0"/>
+      <w:keepLines w:val="0"/>
+      <w:pageBreakBefore w:val="0"/>
+      <w:widowControl w:val="0"/>
       <w:spacing w:before="240" w:after="120"/>
       <w:ind w:firstLine="0"/>
     </w:pPr>
@@ -12410,6 +12736,10 @@
   <w:style w:type="paragraph" w:customStyle="1" w:styleId="参考文献正文">
     <w:name w:val="参考文献正文"/>
     <w:pPr>
+      <w:keepNext w:val="0"/>
+      <w:keepLines w:val="0"/>
+      <w:pageBreakBefore w:val="0"/>
+      <w:widowControl w:val="0"/>
       <w:spacing w:after="40" w:line="300" w:lineRule="auto"/>
       <w:ind w:firstLine="0"/>
     </w:pPr>

</xml_diff>

<commit_message>
docs: refine paper prose and center abstract headings
</commit_message>
<xml_diff>
--- a/docs/papers/20230411330_严何涛_基于Spring Boot的编程错题智能解析助手系统设计与实现.docx
+++ b/docs/papers/20230411330_严何涛_基于Spring Boot的编程错题智能解析助手系统设计与实现.docx
@@ -35,6 +35,7 @@
         <w:keepLines w:val="0"/>
         <w:pageBreakBefore w:val="0"/>
         <w:widowControl w:val="0"/>
+        <w:jc w:val="center"/>
       </w:pPr>
       <w:r>
         <w:t>摘要</w:t>
@@ -48,7 +49,7 @@
         <w:widowControl w:val="0"/>
       </w:pPr>
       <w:r>
-        <w:t>针对编程学习中错题材料分散、错误原因难以整理和复习缺少连续记录的问题，本文设计并实现一套基于Spring Boot的编程错题智能解析助手。系统采用浏览器页面、后端服务、MySQL数据库和可配置的模型服务组成的结构，提供账户登录、错题管理、智能解析、知识点关联、分析历史、人工反馈、复习记录和学习统计。用户录入题目描述、代码、报错信息以及实际和预期结果后，后端将这些材料按固定结构提交给模型，再检查返回内容是否包含错误类型、位置、原因、修改建议、参考代码、知识点和学习建议七项信息。解析过程和结果分别保存，便于查看与追溯。当前Maven测试共16项通过，说明被测试的接口与业务规则可按预期运行。项目另整理150条候选Java案例和300行待填写评分记录，尚不能据此给出解析准确率。系统实现了从记录错题到复习反馈的个人学习流程，为后续以人工标注和代码测试评估解析效果提供了基础。</w:t>
+        <w:t>当报错信息、原始代码和修改记录分散保存时，复习者难以还原错误产生的原因。本文实现的助手以一条错题为中心，保存题目描述、代码、报错信息以及实际和期望结果；后端据此请求模型分析，并检查返回内容是否包含错误类型、位置、原因、修改建议、参考代码、知识点和学习建议。分析结果与原始响应分别保存，用户还能记录判断和下次复习日期。项目当前的Maven测试共16项通过，覆盖账户、模型调用限制和复习规则等实现。另有150条候选Java案例及300行未填写的评分记录，解析准确率尚无可计算的人工评分数据。</w:t>
       </w:r>
     </w:p>
     <w:p>
@@ -70,6 +71,7 @@
         <w:keepLines w:val="0"/>
         <w:pageBreakBefore w:val="0"/>
         <w:widowControl w:val="0"/>
+        <w:jc w:val="center"/>
       </w:pPr>
       <w:r>
         <w:t>Abstract</w:t>
@@ -86,7 +88,7 @@
         <w:rPr>
           <w:rFonts w:ascii="Times New Roman" w:hAnsi="Times New Roman"/>
         </w:rPr>
-        <w:t>Programming mistakes are often stored in scattered notes, while their causes and later review lack consistent records. This paper presents a programming error analysis assistant built with Spring Boot. A browser interface, backend service, MySQL database, and configurable model service support error records, generated explanations, knowledge point links, user feedback, review records, and statistics. The backend organizes the submitted code and error context, requests a model response, and checks seven required fields before saving the result. The project passes 16 Maven tests. It also contains 150 candidate Java cases and 300 blank rating rows; these materials do not yet establish the accuracy of model explanations. The workflow supports personal review and provides a basis for later evaluation with human labels and executable tests.</w:t>
+        <w:t>When error messages, source code, and revisions are stored separately, later review can lose the context of a mistake. This paper presents a Spring Boot assistant that keeps these materials in one error record. The backend requests a model explanation, checks seven required fields, and saves both the structured result and the raw response. Users can record their judgment and the next review date. Sixteen Maven tests pass for the current implementation. The project also contains 150 candidate Java cases and 300 blank rating rows; human ratings are still needed before diagnostic accuracy can be calculated.</w:t>
       </w:r>
     </w:p>
     <w:p>
@@ -146,7 +148,7 @@
         <w:widowControl w:val="0"/>
       </w:pPr>
       <w:r>
-        <w:t>本文依次说明需求、结构设计、核心实现和验证结果。研究对象是个人编程练习中的错题记录，不涉及在线判题、班级教学管理或在服务器上执行用户提交的程序。</w:t>
+        <w:t>本文以个人Java编程错题为主要分析对象：学习者提供原题、代码和运行现象，应用保存这些材料及后续分析记录。参考代码由页面展示，应用服务器不执行用户提交的程序。这一使用范围要求结果评价同时检查解释文本与参考代码。</w:t>
       </w:r>
     </w:p>
     <w:p>
@@ -218,7 +220,7 @@
         <w:ind w:firstLine="0"/>
       </w:pPr>
       <w:r>
-        <w:t>(1) 总体结构。系统采用浏览器与后端分离的职责安排：页面负责收集材料、展示错题和解析结果；Spring Boot后端接收请求，执行身份检查与业务处理；MySQL保存用户、错题、解析、知识点和复习数据；模型服务根据组织后的输入生成建议。Spring Boot提供应用启动、接口开发和配置管理的实现基础[5]。系统默认通过本机Ollama调用模型，也预留可配置的兼容接口。Ollama的聊天接口接受模型名称与消息内容并返回生成信息[7]。</w:t>
+        <w:t>(1) 总体结构。浏览器页面接收错题材料并展示历史记录；Spring Boot后端根据登录身份检查数据归属，再处理错题和解析请求；MySQL保存用户、错题、解析、知识点及复习记录。Spring Boot承担应用启动、接口接入和配置管理[5]。默认模型服务为本机Ollama，其聊天接口接收模型名称与消息内容并返回生成信息[7]；配置项也允许切换到兼容接口。</w:t>
       </w:r>
     </w:p>
     <w:p>
@@ -290,7 +292,18 @@
         <w:ind w:firstLine="0"/>
       </w:pPr>
       <w:r>
-        <w:t>(2) 解析内容生成。PromptService把错题上下文写入统一模板，并说明题目及代码属于待分析数据，不能把其中的命令当作新指令执行。模板要求模型生成错误类型、位置、原因、建议、完整参考代码、1至6个知识点及学习建议。DeepSeekClient负责调用配置的模型接口；AiResultParser读取响应，检查七项字段的类型、非空要求和长度限制，再交由AnalysisService保存。这个检查只保证结构可用，不检查解释是否符合实际代码行为。</w:t>
+        <w:t>(2) 解析内容生成。PromptService把错题上下文写入统一模板，并说明题目及代码属于待分析数据，不能把其中的命令当作新指令执行。模板要求模型生成错误类型、位置、原因、建议、完整参考代码、1至6个知识点及学习建议。DeepSeekClient调用配置的模型接口；AiResultParser检查返回字段的类型、非空要求和长度限制，AnalysisService再保存通过检查的内容。字段检查保证结果能够展示，原因是否正确仍需结合原题判断。</w:t>
+      </w:r>
+    </w:p>
+    <w:p>
+      <w:pPr>
+        <w:keepNext w:val="0"/>
+        <w:keepLines w:val="0"/>
+        <w:pageBreakBefore w:val="0"/>
+        <w:widowControl w:val="0"/>
+      </w:pPr>
+      <w:r>
+        <w:t>实验目录中的候选案例ICJ-003提供了一个具体输入：随附测试将A、B、C、D档阈值依次设为80、70、60、50，成绩45的预期输出为不及格；候选源码只处理A至D档，缺少低于D档时的输出分支[8]。录入此题时，可分别保存题目、源码、测试输入、实际输出和预期的不及格提示。后端将这些字段交给模型，并把生成的原因和建议留给用户核验；本例的源码与测试说明输入如何组织，不充当模型回答正确的证据。</w:t>
       </w:r>
     </w:p>
     <w:p>
@@ -338,7 +351,7 @@
         <w:ind w:firstLine="0"/>
       </w:pPr>
       <w:r>
-        <w:t>(1) 功能验证。2026年10月26日在项目当前检出版本执行mvn -q test，测试报告记录16项测试、0项失败、0项错误。测试覆盖账户控制、登录限制、登录凭证、模型客户端、调用配额、复习规则以及异常响应等代码路径。结合源码检查，可以确认错题、解析、反馈、知识点与复习模块均有相应的接口和数据结构。该测试结果反映被测试规则的实现状态，不代表真实课堂环境中的学习效果。</w:t>
+        <w:t>(1) 功能验证。2026年10月26日在项目当前检出版本执行mvn -q test，测试报告记录16项测试、0项失败、0项错误。测试涉及账户控制、登录限制、登录凭证、模型客户端、调用配额、复习规则和异常响应。源码中还可查到错题、解析、反馈及知识点的接口与数据表。上述证据支持已覆盖功能的实现结论。</w:t>
       </w:r>
     </w:p>
     <w:p>
@@ -362,7 +375,7 @@
         <w:ind w:firstLine="0"/>
       </w:pPr>
       <w:r>
-        <w:t>(3) 适用范围与后续验证。系统当前能够完成“录入—解析—查看—反馈—复习”的个人学习流程。下一步应先固定模型版本和案例集合，分别对错误原因、修改建议、知识点和参考代码进行人工标注与隔离环境测试，再报告各项指标和样本数量。公开案例可能与模型训练材料重合，实验结果还需要结合真实课程错题复核，才能讨论对实际学习的帮助。</w:t>
+        <w:t>(3) 后续验证。评价将固定模型版本与案例集合，分别记录错误原因、修改建议、知识点和参考代码的人工判断；参考代码需要在隔离环境中运行对应测试。报告各项结果时应给出实际完成评分的分母。公开案例可能与模型训练材料重合，因而还需加入真实课程错题，检验结论在日常学习材料上是否成立。</w:t>
       </w:r>
     </w:p>
     <w:p>
@@ -385,7 +398,7 @@
         <w:widowControl w:val="0"/>
       </w:pPr>
       <w:r>
-        <w:t>本文围绕个人编程错题的整理与复盘，完成了基于Spring Boot的智能解析助手设计和实现。系统将原始错误材料、模型生成解释、人工反馈及后续复习保存在同一学习流程中，并通过账户归属检查、结果格式校验和调用限额控制保证基本使用秩序。当前16项自动化测试通过，支持对已覆盖功能的实现结论。</w:t>
+        <w:t>系统把原题材料、模型生成解释、人工判断和复习日期关联到同一条错题。账户归属检查、字段校验和调用限额使这些记录能够按用户保存和查看；自动化测试验证了其中已覆盖的业务规则。</w:t>
       </w:r>
     </w:p>
     <w:p>
@@ -396,7 +409,7 @@
         <w:widowControl w:val="0"/>
       </w:pPr>
       <w:r>
-        <w:t>本研究的现有证据主要证明系统功能可用。模型输出是否准确、参考代码是否能够修正错误、复习安排是否改善学习效果，仍需独立的人工评分与代码测试。后续完成这些验证后，才能对智能解析的实际效果作出定量判断。</w:t>
+        <w:t>下一阶段将对候选案例完成原因与建议评分，并在隔离环境中测试参考代码，再使用真实课程错题复核结果。这些工作完成后，才能评价解析内容对学习者的实际帮助。</w:t>
       </w:r>
     </w:p>
     <w:p>
@@ -406,6 +419,7 @@
         <w:keepLines w:val="0"/>
         <w:pageBreakBefore w:val="0"/>
         <w:widowControl w:val="0"/>
+        <w:jc w:val="center"/>
       </w:pPr>
       <w:r>
         <w:t>参考文献</w:t>

</xml_diff>

<commit_message>
chore: auto sync 2026-10-27 08:49:20
</commit_message>
<xml_diff>
--- a/docs/papers/20230411330_严何涛_基于Spring Boot的编程错题智能解析助手系统设计与实现.docx
+++ b/docs/papers/20230411330_严何涛_基于Spring Boot的编程错题智能解析助手系统设计与实现.docx
@@ -27,11 +27,70 @@
           <w:lang w:eastAsia="zh-CN"/>
         </w:rPr>
       </w:pPr>
-      <w:r>
-        <w:rPr>
-          <w:lang w:eastAsia="zh-CN"/>
-        </w:rPr>
-        <w:t>严何涛  学号：20230411330</w:t>
+      <w:proofErr w:type="gramStart"/>
+      <w:r>
+        <w:rPr>
+          <w:lang w:eastAsia="zh-CN"/>
+        </w:rPr>
+        <w:t>严何涛  学号</w:t>
+      </w:r>
+      <w:proofErr w:type="gramEnd"/>
+      <w:r>
+        <w:rPr>
+          <w:lang w:eastAsia="zh-CN"/>
+        </w:rPr>
+        <w:t>：20230411330</w:t>
+      </w:r>
+    </w:p>
+    <w:p>
+      <w:pPr>
+        <w:pStyle w:val="aff9"/>
+        <w:spacing w:beforeLines="100" w:afterLines="100" w:after="240" w:line="240" w:lineRule="auto"/>
+        <w:jc w:val="center"/>
+        <w:rPr>
+          <w:rFonts w:ascii="黑体" w:eastAsia="黑体" w:hAnsi="黑体" w:hint="eastAsia"/>
+          <w:sz w:val="28"/>
+          <w:szCs w:val="28"/>
+          <w:lang w:eastAsia="zh-CN"/>
+        </w:rPr>
+      </w:pPr>
+      <w:r>
+        <w:rPr>
+          <w:rFonts w:ascii="黑体" w:eastAsia="黑体" w:hAnsi="黑体"/>
+          <w:sz w:val="28"/>
+          <w:szCs w:val="28"/>
+          <w:lang w:eastAsia="zh-CN"/>
+        </w:rPr>
+        <w:t>摘要</w:t>
+      </w:r>
+    </w:p>
+    <w:p>
+      <w:pPr>
+        <w:rPr>
+          <w:rFonts w:hint="eastAsia"/>
+          <w:lang w:eastAsia="zh-CN"/>
+        </w:rPr>
+      </w:pPr>
+      <w:r>
+        <w:rPr>
+          <w:lang w:eastAsia="zh-CN"/>
+        </w:rPr>
+        <w:t>当报错信息、原始代码和修改记录分散保存时，复习者难以还原错误产生的原因。本文实现的助手以一条错题为中心，保存题目描述、代码、报错信息以及实际和期望结果；后端据此请求模型分析，并检查返回内容是否包含错误类型、位置、原因、修改建议、参考代码、知识点和学习建议。分析结果与原始响应分别保存，用户还能记录判断和下次复习日期。项目当前的Maven测试共16项通过，覆盖账户、模型调用限制和复习规则等实现。另有150条候选Java案例及300行未填写的评分记录，解析准确率尚无可计算的人工评分数据。</w:t>
+      </w:r>
+    </w:p>
+    <w:p>
+      <w:pPr>
+        <w:ind w:firstLine="0"/>
+        <w:rPr>
+          <w:rFonts w:hint="eastAsia"/>
+          <w:lang w:eastAsia="zh-CN"/>
+        </w:rPr>
+      </w:pPr>
+      <w:r>
+        <w:rPr>
+          <w:lang w:eastAsia="zh-CN"/>
+        </w:rPr>
+        <w:t>关键词：编程错题；Spring Boot；智能解析；复习记录；人工核验</w:t>
       </w:r>
     </w:p>
     <w:p>
@@ -40,28 +99,23 @@
         <w:jc w:val="center"/>
         <w:rPr>
           <w:rFonts w:hint="eastAsia"/>
-          <w:lang w:eastAsia="zh-CN"/>
         </w:rPr>
       </w:pPr>
       <w:r>
-        <w:rPr>
-          <w:lang w:eastAsia="zh-CN"/>
-        </w:rPr>
-        <w:t>摘要</w:t>
+        <w:t>Abstract</w:t>
       </w:r>
     </w:p>
     <w:p>
       <w:pPr>
         <w:rPr>
           <w:rFonts w:hint="eastAsia"/>
-          <w:lang w:eastAsia="zh-CN"/>
         </w:rPr>
       </w:pPr>
       <w:r>
         <w:rPr>
-          <w:lang w:eastAsia="zh-CN"/>
-        </w:rPr>
-        <w:t>当报错信息、原始代码和修改记录分散保存时，复习者难以还原错误产生的原因。本文实现的助手以一条错题为中心，保存题目描述、代码、报错信息以及实际和期望结果；后端据此请求模型分析，并检查返回内容是否包含错误类型、位置、原因、修改建议、参考代码、知识点和学习建议。分析结果与原始响应分别保存，用户还能记录判断和下次复习日期。项目当前的Maven测试共16项通过，覆盖账户、模型调用限制和复习规则等实现。另有150条候选Java案例及300行未填写的评分记录，解析准确率尚无可计算的人工评分数据。</w:t>
+          <w:rFonts w:ascii="Times New Roman" w:hAnsi="Times New Roman"/>
+        </w:rPr>
+        <w:t>When error messages, source code, and revisions are stored separately, later review can lose the context of a mistake. This paper presents a Spring Boot assistant that keeps these materials in one error record. The backend requests a model explanation, checks seven required fields, and saves both the structured result and the raw response. Users can record their judgment and the next review date. Sixteen Maven tests pass for the current implementation. The project also contains 150 candidate Java cases and 300 blank rating rows; human ratings are still needed before diagnostic accuracy can be calculated.</w:t>
       </w:r>
     </w:p>
     <w:p>
@@ -69,39 +123,148 @@
         <w:ind w:firstLine="0"/>
         <w:rPr>
           <w:rFonts w:hint="eastAsia"/>
-          <w:lang w:eastAsia="zh-CN"/>
         </w:rPr>
       </w:pPr>
       <w:r>
         <w:rPr>
-          <w:lang w:eastAsia="zh-CN"/>
-        </w:rPr>
-        <w:t>关键词：编程错题；Spring Boot；智能解析；复习记录；人工核验</w:t>
+          <w:rFonts w:ascii="Times New Roman" w:hAnsi="Times New Roman"/>
+        </w:rPr>
+        <w:t>Keywords: programming mistakes; Spring Boot; error analysis; review records; human verification</w:t>
       </w:r>
     </w:p>
     <w:p>
       <w:pPr>
         <w:pStyle w:val="aff9"/>
-        <w:jc w:val="center"/>
         <w:rPr>
           <w:rFonts w:hint="eastAsia"/>
+          <w:lang w:eastAsia="zh-CN"/>
         </w:rPr>
       </w:pPr>
-      <w:r>
-        <w:t>Abstract</w:t>
-      </w:r>
+      <w:proofErr w:type="gramStart"/>
+      <w:r>
+        <w:rPr>
+          <w:lang w:eastAsia="zh-CN"/>
+        </w:rPr>
+        <w:t>1 引言</w:t>
+      </w:r>
+      <w:proofErr w:type="gramEnd"/>
     </w:p>
     <w:p>
       <w:pPr>
         <w:rPr>
           <w:rFonts w:hint="eastAsia"/>
+          <w:lang w:eastAsia="zh-CN"/>
         </w:rPr>
       </w:pPr>
       <w:r>
         <w:rPr>
-          <w:rFonts w:ascii="Times New Roman" w:hAnsi="Times New Roman"/>
-        </w:rPr>
-        <w:t>When error messages, source code, and revisions are stored separately, later review can lose the context of a mistake. This paper presents a Spring Boot assistant that keeps these materials in one error record. The backend requests a model explanation, checks seven required fields, and saves both the structured result and the raw response. Users can record their judgment and the next review date. Sixteen Maven tests pass for the current implementation. The project also contains 150 candidate Java cases and 300 blank rating rows; human ratings are still needed before diagnostic accuracy can be calculated.</w:t>
+          <w:lang w:eastAsia="zh-CN"/>
+        </w:rPr>
+        <w:t>程序设计课程的练习通常伴随编译错误、运行异常和结果不符合预期等问题。学生若只保存报错截图或修正后的代码，过一段时间便难以还原原始思路，也不容易区分语法失误、边界条件遗漏和算法理解偏差。唐琳等在编程实践课程中引入大语言模型</w:t>
+      </w:r>
+      <w:r>
+        <w:rPr>
+          <w:vertAlign w:val="superscript"/>
+          <w:lang w:eastAsia="zh-CN"/>
+        </w:rPr>
+        <w:t>[1]</w:t>
+      </w:r>
+      <w:r>
+        <w:rPr>
+          <w:lang w:eastAsia="zh-CN"/>
+        </w:rPr>
+        <w:t>，陈峥等将其用于Java编程作业评估</w:t>
+      </w:r>
+      <w:r>
+        <w:rPr>
+          <w:vertAlign w:val="superscript"/>
+          <w:lang w:eastAsia="zh-CN"/>
+        </w:rPr>
+        <w:t>[2]</w:t>
+      </w:r>
+      <w:r>
+        <w:rPr>
+          <w:lang w:eastAsia="zh-CN"/>
+        </w:rPr>
+        <w:t>。针对编程练习自动反馈的综述指出，反馈的内容、生成方式及其对学习者的帮助需要分别分析</w:t>
+      </w:r>
+      <w:r>
+        <w:rPr>
+          <w:vertAlign w:val="superscript"/>
+          <w:lang w:eastAsia="zh-CN"/>
+        </w:rPr>
+        <w:t>[3]</w:t>
+      </w:r>
+      <w:r>
+        <w:rPr>
+          <w:lang w:eastAsia="zh-CN"/>
+        </w:rPr>
+        <w:t>。因此，错题工具除存储原始材料外，还应把错误解释、修改过程和复习活动连接起来。</w:t>
+      </w:r>
+    </w:p>
+    <w:p>
+      <w:pPr>
+        <w:rPr>
+          <w:rFonts w:hint="eastAsia"/>
+          <w:lang w:eastAsia="zh-CN"/>
+        </w:rPr>
+      </w:pPr>
+      <w:r>
+        <w:rPr>
+          <w:lang w:eastAsia="zh-CN"/>
+        </w:rPr>
+        <w:lastRenderedPageBreak/>
+        <w:t>大语言模型能够生成自然语言解释和参考代码，但流畅的表述不能直接证明判断正确。教育领域的研究同时讨论了这类工具的学习机会与准确性、依赖性等问题</w:t>
+      </w:r>
+      <w:r>
+        <w:rPr>
+          <w:vertAlign w:val="superscript"/>
+          <w:lang w:eastAsia="zh-CN"/>
+        </w:rPr>
+        <w:t>[4]</w:t>
+      </w:r>
+      <w:r>
+        <w:rPr>
+          <w:lang w:eastAsia="zh-CN"/>
+        </w:rPr>
+        <w:t>。本文将模型输出定位为供学生参考的分析材料，允许用户记录人工判断，并保留原始响应以便核查。研究目标是完成可运行的个人错题整理与解析流程，考察系统功能能否贯通；解析正确率则须等待独立标注与代码测试。</w:t>
+      </w:r>
+    </w:p>
+    <w:p>
+      <w:pPr>
+        <w:rPr>
+          <w:rFonts w:hint="eastAsia"/>
+          <w:lang w:eastAsia="zh-CN"/>
+        </w:rPr>
+      </w:pPr>
+      <w:r>
+        <w:rPr>
+          <w:lang w:eastAsia="zh-CN"/>
+        </w:rPr>
+        <w:t>本文以个人Java编程错题为主要分析对象：学习者提供原题、代码和运行现象，应用保存这些材料及后续分析记录。参考代码由页面展示，应用服务器不执行用户提交的程序。这一使用范围要求结果评价同时检查解释文本与参考代码。</w:t>
+      </w:r>
+    </w:p>
+    <w:p>
+      <w:pPr>
+        <w:pStyle w:val="aff9"/>
+        <w:rPr>
+          <w:rFonts w:hint="eastAsia"/>
+          <w:lang w:eastAsia="zh-CN"/>
+        </w:rPr>
+      </w:pPr>
+      <w:proofErr w:type="gramStart"/>
+      <w:r>
+        <w:rPr>
+          <w:lang w:eastAsia="zh-CN"/>
+        </w:rPr>
+        <w:t>2 系统</w:t>
+      </w:r>
+      <w:proofErr w:type="gramEnd"/>
+      <w:r>
+        <w:rPr>
+          <w:lang w:eastAsia="zh-CN"/>
+        </w:rPr>
+        <w:t>分析</w:t>
       </w:r>
     </w:p>
     <w:p>
@@ -109,13 +272,86 @@
         <w:ind w:firstLine="0"/>
         <w:rPr>
           <w:rFonts w:hint="eastAsia"/>
+          <w:lang w:eastAsia="zh-CN"/>
         </w:rPr>
       </w:pPr>
       <w:r>
         <w:rPr>
-          <w:rFonts w:ascii="Times New Roman" w:hAnsi="Times New Roman"/>
-        </w:rPr>
-        <w:t>Keywords: programming mistakes; Spring Boot; error analysis; review records; human verification</w:t>
+          <w:lang w:eastAsia="zh-CN"/>
+        </w:rPr>
+        <w:t>(1</w:t>
+      </w:r>
+      <w:proofErr w:type="gramStart"/>
+      <w:r>
+        <w:rPr>
+          <w:lang w:eastAsia="zh-CN"/>
+        </w:rPr>
+        <w:t>) 用户</w:t>
+      </w:r>
+      <w:proofErr w:type="gramEnd"/>
+      <w:r>
+        <w:rPr>
+          <w:lang w:eastAsia="zh-CN"/>
+        </w:rPr>
+        <w:t>与任务分析。系统面向已注册的个人学习者。未登录者可访问注册、登录和密码找回入口；登录后可新增、查询、编辑及删除自己的错题，调用解析服务，查看历史分析，记录分析是否可信，并按计划复习。学习者录入的题目描述、源代码、错误消息、实际输出和期望输出共同构成分析依据。若输入缺失，系统可以提示模型说明信息不足，而不能把猜测当成确定原因。</w:t>
+      </w:r>
+    </w:p>
+    <w:p>
+      <w:pPr>
+        <w:ind w:firstLine="0"/>
+        <w:rPr>
+          <w:rFonts w:hint="eastAsia"/>
+          <w:lang w:eastAsia="zh-CN"/>
+        </w:rPr>
+      </w:pPr>
+      <w:r>
+        <w:rPr>
+          <w:lang w:eastAsia="zh-CN"/>
+        </w:rPr>
+        <w:t>(2</w:t>
+      </w:r>
+      <w:proofErr w:type="gramStart"/>
+      <w:r>
+        <w:rPr>
+          <w:lang w:eastAsia="zh-CN"/>
+        </w:rPr>
+        <w:t>) 业务</w:t>
+      </w:r>
+      <w:proofErr w:type="gramEnd"/>
+      <w:r>
+        <w:rPr>
+          <w:lang w:eastAsia="zh-CN"/>
+        </w:rPr>
+        <w:t>需求分析。一次错题分析应先确认错题归属，再控制调用次数，随后组织模型输入、检查输出并保存结果。系统需要对同一道错题的重复并发分析作限制；对模型不可用或格式错误的情况记录失败状态，避免页面显示虚假的成功。查询分析历史时仍要按当前账户核对错题归属。知识点应与错题关联，便于以后按主题回看。</w:t>
+      </w:r>
+    </w:p>
+    <w:p>
+      <w:pPr>
+        <w:ind w:firstLine="0"/>
+        <w:rPr>
+          <w:rFonts w:hint="eastAsia"/>
+          <w:lang w:eastAsia="zh-CN"/>
+        </w:rPr>
+      </w:pPr>
+      <w:r>
+        <w:rPr>
+          <w:lang w:eastAsia="zh-CN"/>
+        </w:rPr>
+        <w:t>(3</w:t>
+      </w:r>
+      <w:proofErr w:type="gramStart"/>
+      <w:r>
+        <w:rPr>
+          <w:lang w:eastAsia="zh-CN"/>
+        </w:rPr>
+        <w:t>) 非</w:t>
+      </w:r>
+      <w:proofErr w:type="gramEnd"/>
+      <w:r>
+        <w:rPr>
+          <w:lang w:eastAsia="zh-CN"/>
+        </w:rPr>
+        <w:t>功能需求分析。个人代码和学习记录需要账户隔离，登录凭证不能替代每次数据归属校验。模型请求可能耗时，因此还需限制单用户调用频率与全局并发。已有实现默认每人每天最多20次、全局同时最多3次，但该计数保存在应用进程中，若部署多个进程，应改为共享计数。页面提供中文桌面工作台；当前需求不包含独立移动端应用。</w:t>
       </w:r>
     </w:p>
     <w:p>
@@ -126,15 +362,24 @@
           <w:lang w:eastAsia="zh-CN"/>
         </w:rPr>
       </w:pPr>
-      <w:r>
-        <w:rPr>
-          <w:lang w:eastAsia="zh-CN"/>
-        </w:rPr>
-        <w:t>1 引言</w:t>
+      <w:proofErr w:type="gramStart"/>
+      <w:r>
+        <w:rPr>
+          <w:lang w:eastAsia="zh-CN"/>
+        </w:rPr>
+        <w:t>3 系统</w:t>
+      </w:r>
+      <w:proofErr w:type="gramEnd"/>
+      <w:r>
+        <w:rPr>
+          <w:lang w:eastAsia="zh-CN"/>
+        </w:rPr>
+        <w:t>设计</w:t>
       </w:r>
     </w:p>
     <w:p>
       <w:pPr>
+        <w:ind w:firstLine="0"/>
         <w:rPr>
           <w:rFonts w:hint="eastAsia"/>
           <w:lang w:eastAsia="zh-CN"/>
@@ -144,50 +389,74 @@
         <w:rPr>
           <w:lang w:eastAsia="zh-CN"/>
         </w:rPr>
-        <w:t>程序设计课程的练习通常伴随编译错误、运行异常和结果不符合预期等问题。学生若只保存报错截图或修正后的代码，过一段时间便难以还原原始思路，也不容易区分语法失误、边界条件遗漏和算法理解偏差。唐琳等在编程实践课程中引入大语言模型</w:t>
+        <w:t>(1</w:t>
+      </w:r>
+      <w:proofErr w:type="gramStart"/>
+      <w:r>
+        <w:rPr>
+          <w:lang w:eastAsia="zh-CN"/>
+        </w:rPr>
+        <w:t>) 总体</w:t>
+      </w:r>
+      <w:proofErr w:type="gramEnd"/>
+      <w:r>
+        <w:rPr>
+          <w:lang w:eastAsia="zh-CN"/>
+        </w:rPr>
+        <w:t>结构。浏览器页面接收错题材料并展示历史记录；Spring Boot后端根据登录身份检查数据归属，再处理错题和解析请求；MySQL保存用户、错题、解析、知识点及复习记录。Spring Boot承担应用启动、接口接入和配置管理</w:t>
       </w:r>
       <w:r>
         <w:rPr>
           <w:vertAlign w:val="superscript"/>
           <w:lang w:eastAsia="zh-CN"/>
         </w:rPr>
-        <w:t>[1]</w:t>
-      </w:r>
-      <w:r>
-        <w:rPr>
-          <w:lang w:eastAsia="zh-CN"/>
-        </w:rPr>
-        <w:t>，陈峥等将其用于Java编程作业评估</w:t>
+        <w:t>[5]</w:t>
+      </w:r>
+      <w:r>
+        <w:rPr>
+          <w:lang w:eastAsia="zh-CN"/>
+        </w:rPr>
+        <w:t>。默认模型</w:t>
+      </w:r>
+      <w:r>
+        <w:rPr>
+          <w:lang w:eastAsia="zh-CN"/>
+        </w:rPr>
+        <w:lastRenderedPageBreak/>
+        <w:t>服务为本机Ollama，其聊天接口接收模型名称与消息内容并返回生成信息</w:t>
       </w:r>
       <w:r>
         <w:rPr>
           <w:vertAlign w:val="superscript"/>
           <w:lang w:eastAsia="zh-CN"/>
         </w:rPr>
-        <w:t>[2]</w:t>
-      </w:r>
-      <w:r>
-        <w:rPr>
-          <w:lang w:eastAsia="zh-CN"/>
-        </w:rPr>
-        <w:t>。针对编程练习自动反馈的综述指出，反馈的内容、生成方式及其对学习者的帮助需要分别分析</w:t>
-      </w:r>
-      <w:r>
-        <w:rPr>
+        <w:t>[</w:t>
+      </w:r>
+      <w:r>
+        <w:rPr>
+          <w:rFonts w:hint="eastAsia"/>
           <w:vertAlign w:val="superscript"/>
           <w:lang w:eastAsia="zh-CN"/>
         </w:rPr>
-        <w:t>[3]</w:t>
-      </w:r>
-      <w:r>
-        <w:rPr>
-          <w:lang w:eastAsia="zh-CN"/>
-        </w:rPr>
-        <w:t>。因此，错题工具除存储原始材料外，还应把错误解释、修改过程和复习活动连接起来。</w:t>
+        <w:t>6</w:t>
+      </w:r>
+      <w:r>
+        <w:rPr>
+          <w:vertAlign w:val="superscript"/>
+          <w:lang w:eastAsia="zh-CN"/>
+        </w:rPr>
+        <w:t>]</w:t>
+      </w:r>
+      <w:r>
+        <w:rPr>
+          <w:lang w:eastAsia="zh-CN"/>
+        </w:rPr>
+        <w:t>；配置项也允许切换到兼容接口。</w:t>
       </w:r>
     </w:p>
     <w:p>
       <w:pPr>
+        <w:ind w:firstLine="0"/>
         <w:rPr>
           <w:rFonts w:hint="eastAsia"/>
           <w:lang w:eastAsia="zh-CN"/>
@@ -197,25 +466,54 @@
         <w:rPr>
           <w:lang w:eastAsia="zh-CN"/>
         </w:rPr>
-        <w:lastRenderedPageBreak/>
-        <w:t>大语言模型能够生成自然语言解释和参考代码，但流畅的表述不能直接证明判断正确。教育领域的研究同时讨论了这类工具的学习机会与准确性、依赖性等问题</w:t>
+        <w:t>(2</w:t>
+      </w:r>
+      <w:proofErr w:type="gramStart"/>
+      <w:r>
+        <w:rPr>
+          <w:lang w:eastAsia="zh-CN"/>
+        </w:rPr>
+        <w:t>) 数据</w:t>
+      </w:r>
+      <w:proofErr w:type="gramEnd"/>
+      <w:r>
+        <w:rPr>
+          <w:lang w:eastAsia="zh-CN"/>
+        </w:rPr>
+        <w:t>结构。用户表与错题表形成一对多关系，错题表保存题目、编程语言、代码及错误上下文。解析结果表保存七项结构化内容，分析记录表保存请求和原始响应，二者分开后既能快速展示，也能追查生成过程。知识点表与错题之间通过关联表建立多对多关系。复习状态表记录连续记住次数和下次日期，复习明细表保存每次选择。数据库通过主键、索引与外键保持关联数据的一致性；外键在删除相关记录时的行为由建表约束确定</w:t>
       </w:r>
       <w:r>
         <w:rPr>
           <w:vertAlign w:val="superscript"/>
           <w:lang w:eastAsia="zh-CN"/>
         </w:rPr>
-        <w:t>[4]</w:t>
-      </w:r>
-      <w:r>
-        <w:rPr>
-          <w:lang w:eastAsia="zh-CN"/>
-        </w:rPr>
-        <w:t>。本文将模型输出定位为供学生参考的分析材料，允许用户记录人工判断，并保留原始响应以便核查。研究目标是完成可运行的个人错题整理与解析流程，考察系统功能能否贯通；解析正确率则须等待独立标注与代码测试。</w:t>
+        <w:t>[</w:t>
+      </w:r>
+      <w:r>
+        <w:rPr>
+          <w:rFonts w:hint="eastAsia"/>
+          <w:vertAlign w:val="superscript"/>
+          <w:lang w:eastAsia="zh-CN"/>
+        </w:rPr>
+        <w:t>7</w:t>
+      </w:r>
+      <w:r>
+        <w:rPr>
+          <w:vertAlign w:val="superscript"/>
+          <w:lang w:eastAsia="zh-CN"/>
+        </w:rPr>
+        <w:t>]</w:t>
+      </w:r>
+      <w:r>
+        <w:rPr>
+          <w:lang w:eastAsia="zh-CN"/>
+        </w:rPr>
+        <w:t>。</w:t>
       </w:r>
     </w:p>
     <w:p>
       <w:pPr>
+        <w:ind w:firstLine="0"/>
         <w:rPr>
           <w:rFonts w:hint="eastAsia"/>
           <w:lang w:eastAsia="zh-CN"/>
@@ -225,7 +523,50 @@
         <w:rPr>
           <w:lang w:eastAsia="zh-CN"/>
         </w:rPr>
-        <w:t>本文以个人Java编程错题为主要分析对象：学习者提供原题、代码和运行现象，应用保存这些材料及后续分析记录。参考代码由页面展示，应用服务器不执行用户提交的程序。这一使用范围要求结果评价同时检查解释文本与参考代码。</w:t>
+        <w:t>(3</w:t>
+      </w:r>
+      <w:proofErr w:type="gramStart"/>
+      <w:r>
+        <w:rPr>
+          <w:lang w:eastAsia="zh-CN"/>
+        </w:rPr>
+        <w:t>) 分析</w:t>
+      </w:r>
+      <w:proofErr w:type="gramEnd"/>
+      <w:r>
+        <w:rPr>
+          <w:lang w:eastAsia="zh-CN"/>
+        </w:rPr>
+        <w:t>流程。系统先用用户编号和错题编号共同查询目标错题；确认该题未处于分析中且配额可用后，将状态设为分析中。输入模板按题目、代码、报错、实际结果与期望结果分段组织，并明确要求返回固定的JSON字段。模型响应到达后，程序逐项检查文本字段和知识点数组，拒绝缺失或空值；通过检查的内容在一次数据库处理中保存解析结果、知识点关联和成功记录。若调用或解析失败，则保存失败状态和错误信息。</w:t>
+      </w:r>
+    </w:p>
+    <w:p>
+      <w:pPr>
+        <w:ind w:firstLine="0"/>
+        <w:rPr>
+          <w:rFonts w:hint="eastAsia"/>
+          <w:lang w:eastAsia="zh-CN"/>
+        </w:rPr>
+      </w:pPr>
+      <w:r>
+        <w:rPr>
+          <w:lang w:eastAsia="zh-CN"/>
+        </w:rPr>
+        <w:t>(4</w:t>
+      </w:r>
+      <w:proofErr w:type="gramStart"/>
+      <w:r>
+        <w:rPr>
+          <w:lang w:eastAsia="zh-CN"/>
+        </w:rPr>
+        <w:t>) 学习</w:t>
+      </w:r>
+      <w:proofErr w:type="gramEnd"/>
+      <w:r>
+        <w:rPr>
+          <w:lang w:eastAsia="zh-CN"/>
+        </w:rPr>
+        <w:t>闭环。错题经过分析后，用户可将分析标为准确、不准确或无法判断，并写下依据。这是个人反馈，不等同于专家评分。复习模块记录“已经记住”或“还需练习”：连续记住时依次安排1、3、7、14、30天后的回顾，忘记时重新安排1天后复习。统计模块按当前账户汇总错题总数、已解析数和分析次数，帮助用户发现尚未处理的记录。</w:t>
       </w:r>
     </w:p>
     <w:p>
@@ -236,11 +577,19 @@
           <w:lang w:eastAsia="zh-CN"/>
         </w:rPr>
       </w:pPr>
-      <w:r>
-        <w:rPr>
-          <w:lang w:eastAsia="zh-CN"/>
-        </w:rPr>
-        <w:t>2 系统分析</w:t>
+      <w:proofErr w:type="gramStart"/>
+      <w:r>
+        <w:rPr>
+          <w:lang w:eastAsia="zh-CN"/>
+        </w:rPr>
+        <w:t>4 系统</w:t>
+      </w:r>
+      <w:proofErr w:type="gramEnd"/>
+      <w:r>
+        <w:rPr>
+          <w:lang w:eastAsia="zh-CN"/>
+        </w:rPr>
+        <w:t>实现</w:t>
       </w:r>
     </w:p>
     <w:p>
@@ -255,7 +604,21 @@
         <w:rPr>
           <w:lang w:eastAsia="zh-CN"/>
         </w:rPr>
-        <w:t>(1) 用户与任务分析。系统面向已注册的个人学习者。未登录者可访问注册、登录和密码找回入口；登录后可新增、查询、编辑及删除自己的错题，调用解析服务，查看历史分析，记录分析是否可信，并按计划复习。学习者录入的题目描述、源代码、错误消息、实际输出和期望输出共同构成分析依据。若输入缺失，系统可以提示模型说明信息不足，而不能把猜测当成确定原因。</w:t>
+        <w:t>(1</w:t>
+      </w:r>
+      <w:proofErr w:type="gramStart"/>
+      <w:r>
+        <w:rPr>
+          <w:lang w:eastAsia="zh-CN"/>
+        </w:rPr>
+        <w:t>) 账户</w:t>
+      </w:r>
+      <w:proofErr w:type="gramEnd"/>
+      <w:r>
+        <w:rPr>
+          <w:lang w:eastAsia="zh-CN"/>
+        </w:rPr>
+        <w:t>与错题操作。后端使用Spring Security检查访问权限，登录后签发携带身份信息的令牌；受保护接口先验证令牌，再按当前用户编号筛选数据。错题新增接口校验必填内容，查询接口支持分页和条件搜索，编辑与删除前再次校验归属。这样的双重检查使页面隐藏其他用户数据之外，后端也不会因为直接访问编号而返回别人的记录。</w:t>
       </w:r>
     </w:p>
     <w:p>
@@ -270,7 +633,111 @@
         <w:rPr>
           <w:lang w:eastAsia="zh-CN"/>
         </w:rPr>
-        <w:t>(2) 业务需求分析。一次错题分析应先确认错题归属，再控制调用次数，随后组织模型输入、检查输出并保存结果。系统需要对同一道错题的重复并发分析作限制；对模型不可用或格式错误的情况记录失败状态，避免页面显示虚假的成功。查询分析历史时仍要按当前账户核对错题归属。知识点应与错题关联，便于以后按主题回看。</w:t>
+        <w:t>(2</w:t>
+      </w:r>
+      <w:proofErr w:type="gramStart"/>
+      <w:r>
+        <w:rPr>
+          <w:lang w:eastAsia="zh-CN"/>
+        </w:rPr>
+        <w:t>) 解析</w:t>
+      </w:r>
+      <w:proofErr w:type="gramEnd"/>
+      <w:r>
+        <w:rPr>
+          <w:lang w:eastAsia="zh-CN"/>
+        </w:rPr>
+        <w:t>内容生成。</w:t>
+      </w:r>
+      <w:proofErr w:type="spellStart"/>
+      <w:r>
+        <w:rPr>
+          <w:lang w:eastAsia="zh-CN"/>
+        </w:rPr>
+        <w:t>PromptService</w:t>
+      </w:r>
+      <w:proofErr w:type="spellEnd"/>
+      <w:r>
+        <w:rPr>
+          <w:lang w:eastAsia="zh-CN"/>
+        </w:rPr>
+        <w:t>把错题上下文写入统一模板，并说明题目及代码属于待分析数据，不能把其中的命令当作新指令执行。模板要求模型生成错误类型、位置、原因、建议、完整参考代码、1至6个知识点及学习建议。</w:t>
+      </w:r>
+      <w:proofErr w:type="spellStart"/>
+      <w:r>
+        <w:rPr>
+          <w:lang w:eastAsia="zh-CN"/>
+        </w:rPr>
+        <w:t>DeepSeekClient</w:t>
+      </w:r>
+      <w:proofErr w:type="spellEnd"/>
+      <w:r>
+        <w:rPr>
+          <w:lang w:eastAsia="zh-CN"/>
+        </w:rPr>
+        <w:t>调用配置的模型接口；</w:t>
+      </w:r>
+      <w:proofErr w:type="spellStart"/>
+      <w:r>
+        <w:rPr>
+          <w:lang w:eastAsia="zh-CN"/>
+        </w:rPr>
+        <w:t>AiResultParser</w:t>
+      </w:r>
+      <w:proofErr w:type="spellEnd"/>
+      <w:r>
+        <w:rPr>
+          <w:lang w:eastAsia="zh-CN"/>
+        </w:rPr>
+        <w:t>检查返回字段的类型、非空</w:t>
+      </w:r>
+      <w:r>
+        <w:rPr>
+          <w:lang w:eastAsia="zh-CN"/>
+        </w:rPr>
+        <w:lastRenderedPageBreak/>
+        <w:t>要求和长度限制，</w:t>
+      </w:r>
+      <w:proofErr w:type="spellStart"/>
+      <w:r>
+        <w:rPr>
+          <w:lang w:eastAsia="zh-CN"/>
+        </w:rPr>
+        <w:t>AnalysisService</w:t>
+      </w:r>
+      <w:proofErr w:type="spellEnd"/>
+      <w:r>
+        <w:rPr>
+          <w:lang w:eastAsia="zh-CN"/>
+        </w:rPr>
+        <w:t>再保存通过检查的内容。字段检查保证结果能够展示，原因是否正确仍需结合原题判断。</w:t>
+      </w:r>
+    </w:p>
+    <w:p>
+      <w:pPr>
+        <w:rPr>
+          <w:rFonts w:hint="eastAsia"/>
+          <w:lang w:eastAsia="zh-CN"/>
+        </w:rPr>
+      </w:pPr>
+      <w:r>
+        <w:rPr>
+          <w:lang w:eastAsia="zh-CN"/>
+        </w:rPr>
+        <w:t>实验目录中的候选案例ICJ-003提供了一个具体输入：随附测试将A、B、C、D档阈值依次设为80、70、60、50，成绩45的预期输出为不及格；候选源码只处理A至D档，缺少低于D档时的输出分支</w:t>
+      </w:r>
+      <w:r>
+        <w:rPr>
+          <w:vertAlign w:val="superscript"/>
+          <w:lang w:eastAsia="zh-CN"/>
+        </w:rPr>
+        <w:t>[8]</w:t>
+      </w:r>
+      <w:r>
+        <w:rPr>
+          <w:lang w:eastAsia="zh-CN"/>
+        </w:rPr>
+        <w:t>。录入此题时，可分别保存题目、源码、测试输入、实际输出和预期的不及格提示。后端将这些字段交给模型，并把生成的原因和建议留给用户核验；本例的源码与测试说明输入如何组织，不充当模型回答正确的证据。</w:t>
       </w:r>
     </w:p>
     <w:p>
@@ -285,7 +752,78 @@
         <w:rPr>
           <w:lang w:eastAsia="zh-CN"/>
         </w:rPr>
-        <w:t>(3) 非功能需求分析。个人代码和学习记录需要账户隔离，登录凭证不能替代每次数据归属校验。模型请求可能耗时，因此还需限制单用户调用频率与全局并发。已有实现默认每人每天最多20次、全局同时最多3次，但该计数保存在应用进程中，若部署多个进程，应改为共享计数。页面提供中文桌面工作台；当前需求不包含独立移动端应用。</w:t>
+        <w:t>(3</w:t>
+      </w:r>
+      <w:proofErr w:type="gramStart"/>
+      <w:r>
+        <w:rPr>
+          <w:lang w:eastAsia="zh-CN"/>
+        </w:rPr>
+        <w:t>) 状态</w:t>
+      </w:r>
+      <w:proofErr w:type="gramEnd"/>
+      <w:r>
+        <w:rPr>
+          <w:lang w:eastAsia="zh-CN"/>
+        </w:rPr>
+        <w:t>与资源控制。</w:t>
+      </w:r>
+      <w:proofErr w:type="spellStart"/>
+      <w:r>
+        <w:rPr>
+          <w:lang w:eastAsia="zh-CN"/>
+        </w:rPr>
+        <w:t>AnalysisService</w:t>
+      </w:r>
+      <w:proofErr w:type="spellEnd"/>
+      <w:r>
+        <w:rPr>
+          <w:lang w:eastAsia="zh-CN"/>
+        </w:rPr>
+        <w:t>在模型调用前以数据库条件更新争取分析资格，避免同一道错题被重复处理；调用时获取配额许可，结束后释放。模型返回后，结果、知识点关系和成功记录在同一次处理事务中写入。发生异常时系统记录失败并向页面返回服务不可用信息，用户可以稍后重试。分析历史保留多次解析，以便比较不同时间的回答。</w:t>
+      </w:r>
+    </w:p>
+    <w:p>
+      <w:pPr>
+        <w:ind w:firstLine="0"/>
+        <w:rPr>
+          <w:rFonts w:hint="eastAsia"/>
+          <w:lang w:eastAsia="zh-CN"/>
+        </w:rPr>
+      </w:pPr>
+      <w:r>
+        <w:rPr>
+          <w:lang w:eastAsia="zh-CN"/>
+        </w:rPr>
+        <w:t>(4</w:t>
+      </w:r>
+      <w:proofErr w:type="gramStart"/>
+      <w:r>
+        <w:rPr>
+          <w:lang w:eastAsia="zh-CN"/>
+        </w:rPr>
+        <w:t>) 复习</w:t>
+      </w:r>
+      <w:proofErr w:type="gramEnd"/>
+      <w:r>
+        <w:rPr>
+          <w:lang w:eastAsia="zh-CN"/>
+        </w:rPr>
+        <w:t>与展示。</w:t>
+      </w:r>
+      <w:proofErr w:type="spellStart"/>
+      <w:r>
+        <w:rPr>
+          <w:lang w:eastAsia="zh-CN"/>
+        </w:rPr>
+        <w:t>ReviewService</w:t>
+      </w:r>
+      <w:proofErr w:type="spellEnd"/>
+      <w:r>
+        <w:rPr>
+          <w:lang w:eastAsia="zh-CN"/>
+        </w:rPr>
+        <w:t>查询当前账户待复习的错题，写入复习明细并更新下一次日期；对尚未到期的重复提交返回冲突信息。浏览器工作台把原题、模型解释、参考代码、人工判断和复习入口放在连续操作路径中。页面显示的参考代码不会由应用自动编译或运行，因此用户应结合题目要求和测试结果决定是否采纳。</w:t>
       </w:r>
     </w:p>
     <w:p>
@@ -296,11 +834,19 @@
           <w:lang w:eastAsia="zh-CN"/>
         </w:rPr>
       </w:pPr>
-      <w:r>
-        <w:rPr>
-          <w:lang w:eastAsia="zh-CN"/>
-        </w:rPr>
-        <w:t>3 系统设计</w:t>
+      <w:proofErr w:type="gramStart"/>
+      <w:r>
+        <w:rPr>
+          <w:lang w:eastAsia="zh-CN"/>
+        </w:rPr>
+        <w:t>5 结果</w:t>
+      </w:r>
+      <w:proofErr w:type="gramEnd"/>
+      <w:r>
+        <w:rPr>
+          <w:lang w:eastAsia="zh-CN"/>
+        </w:rPr>
+        <w:t>与讨论</w:t>
       </w:r>
     </w:p>
     <w:p>
@@ -315,55 +861,35 @@
         <w:rPr>
           <w:lang w:eastAsia="zh-CN"/>
         </w:rPr>
-        <w:t>(1) 总体结构。浏览器页面接收错题材料并展示历史记录；Spring Boot后端根据登录身份检查数据归属，再处理错题和解析请求；MySQL保存用户、错题、解析、知识点及复习记录。Spring Boot承担应用启动、接口接入和配置管理</w:t>
-      </w:r>
-      <w:r>
-        <w:rPr>
-          <w:vertAlign w:val="superscript"/>
-          <w:lang w:eastAsia="zh-CN"/>
-        </w:rPr>
-        <w:t>[5]</w:t>
-      </w:r>
-      <w:r>
-        <w:rPr>
-          <w:lang w:eastAsia="zh-CN"/>
-        </w:rPr>
-        <w:t>。默认模型</w:t>
-      </w:r>
-      <w:r>
-        <w:rPr>
-          <w:lang w:eastAsia="zh-CN"/>
-        </w:rPr>
-        <w:lastRenderedPageBreak/>
-        <w:t>服务为本机Ollama，其聊天接口接收模型名称与消息内容并返回生成信息</w:t>
-      </w:r>
-      <w:r>
-        <w:rPr>
-          <w:vertAlign w:val="superscript"/>
-          <w:lang w:eastAsia="zh-CN"/>
-        </w:rPr>
-        <w:t>[</w:t>
-      </w:r>
-      <w:r>
-        <w:rPr>
-          <w:rFonts w:hint="eastAsia"/>
-          <w:vertAlign w:val="superscript"/>
-          <w:lang w:eastAsia="zh-CN"/>
-        </w:rPr>
-        <w:t>6</w:t>
-      </w:r>
-      <w:r>
-        <w:rPr>
-          <w:vertAlign w:val="superscript"/>
-          <w:lang w:eastAsia="zh-CN"/>
-        </w:rPr>
-        <w:t>]</w:t>
-      </w:r>
-      <w:r>
-        <w:rPr>
-          <w:lang w:eastAsia="zh-CN"/>
-        </w:rPr>
-        <w:t>；配置项也允许切换到兼容接口。</w:t>
+        <w:t>(1</w:t>
+      </w:r>
+      <w:proofErr w:type="gramStart"/>
+      <w:r>
+        <w:rPr>
+          <w:lang w:eastAsia="zh-CN"/>
+        </w:rPr>
+        <w:t>) 功能</w:t>
+      </w:r>
+      <w:proofErr w:type="gramEnd"/>
+      <w:r>
+        <w:rPr>
+          <w:lang w:eastAsia="zh-CN"/>
+        </w:rPr>
+        <w:t>验证。2026年10月26日在项目当前检出版本执行</w:t>
+      </w:r>
+      <w:proofErr w:type="spellStart"/>
+      <w:r>
+        <w:rPr>
+          <w:lang w:eastAsia="zh-CN"/>
+        </w:rPr>
+        <w:t>mvn</w:t>
+      </w:r>
+      <w:proofErr w:type="spellEnd"/>
+      <w:r>
+        <w:rPr>
+          <w:lang w:eastAsia="zh-CN"/>
+        </w:rPr>
+        <w:t xml:space="preserve"> -q test，测试报告记录16项测试、0项失败、0项错误。测试涉及账户控制、登录限制、登录凭证、模型客户端、调用配额、复习规则和异常响应。源码中还可查到错题、解析、反馈及知识点的接口与数据表。上述证据支持已覆盖功能的实现结论。</w:t>
       </w:r>
     </w:p>
     <w:p>
@@ -378,29 +904,42 @@
         <w:rPr>
           <w:lang w:eastAsia="zh-CN"/>
         </w:rPr>
-        <w:t>(2) 数据结构。用户表与错题表形成一对多关系，错题表保存题目、编程语言、代码及错误上下文。解析结果表保存七项结构化内容，分析记录表保存请求和原始响应，二者分开后既能快速展示，也能追查生成过程。知识点表与错题之间通过关联表建立多对多关系。复习状态表记录连续记住次数和下次日期，复习明细表保存每次选择。数据库通过主键、索引与外键保持关联数据的一致性；外键在删除相关记录时的行为由建表约束确定</w:t>
+        <w:t>(2</w:t>
+      </w:r>
+      <w:proofErr w:type="gramStart"/>
+      <w:r>
+        <w:rPr>
+          <w:lang w:eastAsia="zh-CN"/>
+        </w:rPr>
+        <w:t>) 解析</w:t>
+      </w:r>
+      <w:proofErr w:type="gramEnd"/>
+      <w:r>
+        <w:rPr>
+          <w:lang w:eastAsia="zh-CN"/>
+        </w:rPr>
+        <w:t>效果证据。项目实验目录保存来自</w:t>
+      </w:r>
+      <w:proofErr w:type="spellStart"/>
+      <w:r>
+        <w:rPr>
+          <w:lang w:eastAsia="zh-CN"/>
+        </w:rPr>
+        <w:t>IntroClassJava</w:t>
+      </w:r>
+      <w:proofErr w:type="spellEnd"/>
+      <w:r>
+        <w:rPr>
+          <w:lang w:eastAsia="zh-CN"/>
+        </w:rPr>
+        <w:t>的150条候选Java案例及两种提示词设置的300行评分表。该公开数据集提供带错误的Java程序，适合作为可追溯的候选来源</w:t>
       </w:r>
       <w:r>
         <w:rPr>
           <w:vertAlign w:val="superscript"/>
           <w:lang w:eastAsia="zh-CN"/>
         </w:rPr>
-        <w:t>[</w:t>
-      </w:r>
-      <w:r>
-        <w:rPr>
-          <w:rFonts w:hint="eastAsia"/>
-          <w:vertAlign w:val="superscript"/>
-          <w:lang w:eastAsia="zh-CN"/>
-        </w:rPr>
-        <w:t>7</w:t>
-      </w:r>
-      <w:r>
-        <w:rPr>
-          <w:vertAlign w:val="superscript"/>
-          <w:lang w:eastAsia="zh-CN"/>
-        </w:rPr>
-        <w:t>]</w:t>
+        <w:t>[8]</w:t>
       </w:r>
       <w:r>
         <w:rPr>
@@ -421,22 +960,21 @@
         <w:rPr>
           <w:lang w:eastAsia="zh-CN"/>
         </w:rPr>
-        <w:t>(3) 分析流程。系统先用用户编号和错题编号共同查询目标错题；确认该题未处于分析中且配额可用后，将状态设为分析中。输入模板按题目、代码、报错、实际结果与期望结果分段组织，并明确要求返回固定的JSON字段。模型响应到达后，程序逐项检查文本字段和知识点数组，拒绝缺失或空值；通过检查的内容在一次数据库处理中保存解析结果、知识点关联和成功记录。若调用或解析失败，则保存失败状态和错误信息。</w:t>
-      </w:r>
-    </w:p>
-    <w:p>
-      <w:pPr>
-        <w:ind w:firstLine="0"/>
-        <w:rPr>
-          <w:rFonts w:hint="eastAsia"/>
-          <w:lang w:eastAsia="zh-CN"/>
-        </w:rPr>
-      </w:pPr>
-      <w:r>
-        <w:rPr>
-          <w:lang w:eastAsia="zh-CN"/>
-        </w:rPr>
-        <w:t>(4) 学习闭环。错题经过分析后，用户可将分析标为准确、不准确或无法判断，并写下依据。这是个人反馈，不等同于专家评分。复习模块记录“已经记住”或“还需练习”：连续记住时依次安排1、3、7、14、30天后的回顾，忘记时重新安排1天后复习。统计模块按当前账户汇总错题总数、已解析数和分析次数，帮助用户发现尚未处理的记录。</w:t>
+        <w:t>(3</w:t>
+      </w:r>
+      <w:proofErr w:type="gramStart"/>
+      <w:r>
+        <w:rPr>
+          <w:lang w:eastAsia="zh-CN"/>
+        </w:rPr>
+        <w:t>) 后续</w:t>
+      </w:r>
+      <w:proofErr w:type="gramEnd"/>
+      <w:r>
+        <w:rPr>
+          <w:lang w:eastAsia="zh-CN"/>
+        </w:rPr>
+        <w:t>验证。评价将固定模型版本与案例集合，分别记录错误原因、修改建议、知识点和参考代码的人工判断；参考代码需要在隔离环境中运行对应测试。报告各项结果时应给出实际完成评分的分母。公开案例可能与模型训练材料重合，因而还需加入真实课程错题，检验结论在日常学习材料上是否成立。</w:t>
       </w:r>
     </w:p>
     <w:p>
@@ -447,188 +985,7 @@
           <w:lang w:eastAsia="zh-CN"/>
         </w:rPr>
       </w:pPr>
-      <w:r>
-        <w:rPr>
-          <w:lang w:eastAsia="zh-CN"/>
-        </w:rPr>
-        <w:t>4 系统实现</w:t>
-      </w:r>
-    </w:p>
-    <w:p>
-      <w:pPr>
-        <w:ind w:firstLine="0"/>
-        <w:rPr>
-          <w:rFonts w:hint="eastAsia"/>
-          <w:lang w:eastAsia="zh-CN"/>
-        </w:rPr>
-      </w:pPr>
-      <w:r>
-        <w:rPr>
-          <w:lang w:eastAsia="zh-CN"/>
-        </w:rPr>
-        <w:t>(1) 账户与错题操作。后端使用Spring Security检查访问权限，登录后签发携带身份信息的令牌；受保护接口先验证令牌，再按当前用户编号筛选数据。错题新增接口校验必填内容，查询接口支持分页和条件搜索，编辑与删除前再次校验归属。这样的双重检查使页面隐藏其他用户数据之外，后端也不会因为直接访问编号而返回别人的记录。</w:t>
-      </w:r>
-    </w:p>
-    <w:p>
-      <w:pPr>
-        <w:ind w:firstLine="0"/>
-        <w:rPr>
-          <w:rFonts w:hint="eastAsia"/>
-          <w:lang w:eastAsia="zh-CN"/>
-        </w:rPr>
-      </w:pPr>
-      <w:r>
-        <w:rPr>
-          <w:lang w:eastAsia="zh-CN"/>
-        </w:rPr>
-        <w:t>(2) 解析内容生成。PromptService把错题上下文写入统一模板，并说明题目及代码属于待分析数据，不能把其中的命令当作新指令执行。模板要求模型生成错误类型、位置、原因、建议、完整参考代码、1至6个知识点及学习建议。DeepSeekClient调用配置的模型接口；AiResultParser检查返回字段的类型、非空</w:t>
-      </w:r>
-      <w:r>
-        <w:rPr>
-          <w:lang w:eastAsia="zh-CN"/>
-        </w:rPr>
-        <w:lastRenderedPageBreak/>
-        <w:t>要求和长度限制，AnalysisService再保存通过检查的内容。字段检查保证结果能够展示，原因是否正确仍需结合原题判断。</w:t>
-      </w:r>
-    </w:p>
-    <w:p>
-      <w:pPr>
-        <w:rPr>
-          <w:rFonts w:hint="eastAsia"/>
-          <w:lang w:eastAsia="zh-CN"/>
-        </w:rPr>
-      </w:pPr>
-      <w:r>
-        <w:rPr>
-          <w:lang w:eastAsia="zh-CN"/>
-        </w:rPr>
-        <w:t>实验目录中的候选案例ICJ-003提供了一个具体输入：随附测试将A、B、C、D档阈值依次设为80、70、60、50，成绩45的预期输出为不及格；候选源码只处理A至D档，缺少低于D档时的输出分支</w:t>
-      </w:r>
-      <w:r>
-        <w:rPr>
-          <w:vertAlign w:val="superscript"/>
-          <w:lang w:eastAsia="zh-CN"/>
-        </w:rPr>
-        <w:t>[8]</w:t>
-      </w:r>
-      <w:r>
-        <w:rPr>
-          <w:lang w:eastAsia="zh-CN"/>
-        </w:rPr>
-        <w:t>。录入此题时，可分别保存题目、源码、测试输入、实际输出和预期的不及格提示。后端将这些字段交给模型，并把生成的原因和建议留给用户核验；本例的源码与测试说明输入如何组织，不充当模型回答正确的证据。</w:t>
-      </w:r>
-    </w:p>
-    <w:p>
-      <w:pPr>
-        <w:ind w:firstLine="0"/>
-        <w:rPr>
-          <w:rFonts w:hint="eastAsia"/>
-          <w:lang w:eastAsia="zh-CN"/>
-        </w:rPr>
-      </w:pPr>
-      <w:r>
-        <w:rPr>
-          <w:lang w:eastAsia="zh-CN"/>
-        </w:rPr>
-        <w:t>(3) 状态与资源控制。AnalysisService在模型调用前以数据库条件更新争取分析资格，避免同一道错题被重复处理；调用时获取配额许可，结束后释放。模型返回后，结果、知识点关系和成功记录在同一次处理事务中写入。发生异常时系统记录失败并向页面返回服务不可用信息，用户可以稍后重试。分析历史保留多次解析，以便比较不同时间的回答。</w:t>
-      </w:r>
-    </w:p>
-    <w:p>
-      <w:pPr>
-        <w:ind w:firstLine="0"/>
-        <w:rPr>
-          <w:rFonts w:hint="eastAsia"/>
-          <w:lang w:eastAsia="zh-CN"/>
-        </w:rPr>
-      </w:pPr>
-      <w:r>
-        <w:rPr>
-          <w:lang w:eastAsia="zh-CN"/>
-        </w:rPr>
-        <w:t>(4) 复习与展示。ReviewService查询当前账户待复习的错题，写入复习明细并更新下一次日期；对尚未到期的重复提交返回冲突信息。浏览器工作台把原题、模型解释、参考代码、人工判断和复习入口放在连续操作路径中。页面显示的参考代码不会由应用自动编译或运行，因此用户应结合题目要求和测试结果决定是否采纳。</w:t>
-      </w:r>
-    </w:p>
-    <w:p>
-      <w:pPr>
-        <w:pStyle w:val="aff9"/>
-        <w:rPr>
-          <w:rFonts w:hint="eastAsia"/>
-          <w:lang w:eastAsia="zh-CN"/>
-        </w:rPr>
-      </w:pPr>
-      <w:r>
-        <w:rPr>
-          <w:lang w:eastAsia="zh-CN"/>
-        </w:rPr>
-        <w:t>5 结果与讨论</w:t>
-      </w:r>
-    </w:p>
-    <w:p>
-      <w:pPr>
-        <w:ind w:firstLine="0"/>
-        <w:rPr>
-          <w:rFonts w:hint="eastAsia"/>
-          <w:lang w:eastAsia="zh-CN"/>
-        </w:rPr>
-      </w:pPr>
-      <w:r>
-        <w:rPr>
-          <w:lang w:eastAsia="zh-CN"/>
-        </w:rPr>
-        <w:t>(1) 功能验证。2026年10月26日在项目当前检出版本执行mvn -q test，测试报告记录16项测试、0项失败、0项错误。测试涉及账户控制、登录限制、登录凭证、模型客户端、调用配额、复习规则和异常响应。源码中还可查到错题、解析、反馈及知识点的接口与数据表。上述证据支持已覆盖功能的实现结论。</w:t>
-      </w:r>
-    </w:p>
-    <w:p>
-      <w:pPr>
-        <w:ind w:firstLine="0"/>
-        <w:rPr>
-          <w:rFonts w:hint="eastAsia"/>
-          <w:lang w:eastAsia="zh-CN"/>
-        </w:rPr>
-      </w:pPr>
-      <w:r>
-        <w:rPr>
-          <w:lang w:eastAsia="zh-CN"/>
-        </w:rPr>
-        <w:t>(2) 解析效果证据。项目实验目录保存来自IntroClassJava的150条候选Java案例及两种提示词设置的300行评分表。该公开数据集提供带错误的Java程序，适合作为可追溯的候选来源</w:t>
-      </w:r>
-      <w:r>
-        <w:rPr>
-          <w:vertAlign w:val="superscript"/>
-          <w:lang w:eastAsia="zh-CN"/>
-        </w:rPr>
-        <w:t>[8]</w:t>
-      </w:r>
-      <w:r>
-        <w:rPr>
-          <w:lang w:eastAsia="zh-CN"/>
-        </w:rPr>
-        <w:t>。</w:t>
-      </w:r>
-    </w:p>
-    <w:p>
-      <w:pPr>
-        <w:ind w:firstLine="0"/>
-        <w:rPr>
-          <w:rFonts w:hint="eastAsia"/>
-          <w:lang w:eastAsia="zh-CN"/>
-        </w:rPr>
-      </w:pPr>
-      <w:r>
-        <w:rPr>
-          <w:lang w:eastAsia="zh-CN"/>
-        </w:rPr>
-        <w:t>(3) 后续验证。评价将固定模型版本与案例集合，分别记录错误原因、修改建议、知识点和参考代码的人工判断；参考代码需要在隔离环境中运行对应测试。报告各项结果时应给出实际完成评分的分母。公开案例可能与模型训练材料重合，因而还需加入真实课程错题，检验结论在日常学习材料上是否成立。</w:t>
-      </w:r>
-    </w:p>
-    <w:p>
-      <w:pPr>
-        <w:pStyle w:val="aff9"/>
-        <w:rPr>
-          <w:rFonts w:hint="eastAsia"/>
-          <w:lang w:eastAsia="zh-CN"/>
-        </w:rPr>
-      </w:pPr>
+      <w:proofErr w:type="gramStart"/>
       <w:r>
         <w:rPr>
           <w:lang w:eastAsia="zh-CN"/>
@@ -636,6 +993,7 @@
         <w:lastRenderedPageBreak/>
         <w:t>6 结论</w:t>
       </w:r>
+      <w:proofErr w:type="gramEnd"/>
     </w:p>
     <w:p>
       <w:pPr>
@@ -699,7 +1057,115 @@
           <w:szCs w:val="21"/>
           <w:lang w:eastAsia="zh-CN"/>
         </w:rPr>
-        <w:t>[1]唐琳, 张佳鑫, 徐照光. 大语言模型在计算机编程实践课程教学中的应用[J]. 计算机教育, 2025(2): 97-101, 106.</w:t>
+        <w:t>[1]</w:t>
+      </w:r>
+      <w:proofErr w:type="gramStart"/>
+      <w:r>
+        <w:rPr>
+          <w:sz w:val="21"/>
+          <w:szCs w:val="21"/>
+          <w:lang w:eastAsia="zh-CN"/>
+        </w:rPr>
+        <w:t>唐琳,</w:t>
+      </w:r>
+      <w:proofErr w:type="gramEnd"/>
+      <w:r>
+        <w:rPr>
+          <w:sz w:val="21"/>
+          <w:szCs w:val="21"/>
+          <w:lang w:eastAsia="zh-CN"/>
+        </w:rPr>
+        <w:t xml:space="preserve"> </w:t>
+      </w:r>
+      <w:proofErr w:type="gramStart"/>
+      <w:r>
+        <w:rPr>
+          <w:sz w:val="21"/>
+          <w:szCs w:val="21"/>
+          <w:lang w:eastAsia="zh-CN"/>
+        </w:rPr>
+        <w:t>张佳鑫,</w:t>
+      </w:r>
+      <w:proofErr w:type="gramEnd"/>
+      <w:r>
+        <w:rPr>
+          <w:sz w:val="21"/>
+          <w:szCs w:val="21"/>
+          <w:lang w:eastAsia="zh-CN"/>
+        </w:rPr>
+        <w:t xml:space="preserve"> </w:t>
+      </w:r>
+      <w:proofErr w:type="gramStart"/>
+      <w:r>
+        <w:rPr>
+          <w:sz w:val="21"/>
+          <w:szCs w:val="21"/>
+          <w:lang w:eastAsia="zh-CN"/>
+        </w:rPr>
+        <w:t>徐照光.</w:t>
+      </w:r>
+      <w:proofErr w:type="gramEnd"/>
+      <w:r>
+        <w:rPr>
+          <w:sz w:val="21"/>
+          <w:szCs w:val="21"/>
+          <w:lang w:eastAsia="zh-CN"/>
+        </w:rPr>
+        <w:t xml:space="preserve"> 大语言模型在计算机编程实践课程教学中的应用[J]. 计算机</w:t>
+      </w:r>
+      <w:proofErr w:type="gramStart"/>
+      <w:r>
+        <w:rPr>
+          <w:sz w:val="21"/>
+          <w:szCs w:val="21"/>
+          <w:lang w:eastAsia="zh-CN"/>
+        </w:rPr>
+        <w:t>教育,</w:t>
+      </w:r>
+      <w:proofErr w:type="gramEnd"/>
+      <w:r>
+        <w:rPr>
+          <w:sz w:val="21"/>
+          <w:szCs w:val="21"/>
+          <w:lang w:eastAsia="zh-CN"/>
+        </w:rPr>
+        <w:t xml:space="preserve"> 2025</w:t>
+      </w:r>
+      <w:proofErr w:type="gramStart"/>
+      <w:r>
+        <w:rPr>
+          <w:sz w:val="21"/>
+          <w:szCs w:val="21"/>
+          <w:lang w:eastAsia="zh-CN"/>
+        </w:rPr>
+        <w:t>(2): 97</w:t>
+      </w:r>
+      <w:proofErr w:type="gramEnd"/>
+      <w:r>
+        <w:rPr>
+          <w:sz w:val="21"/>
+          <w:szCs w:val="21"/>
+          <w:lang w:eastAsia="zh-CN"/>
+        </w:rPr>
+        <w:t>-101</w:t>
+      </w:r>
+      <w:proofErr w:type="gramStart"/>
+      <w:r>
+        <w:rPr>
+          <w:sz w:val="21"/>
+          <w:szCs w:val="21"/>
+          <w:lang w:eastAsia="zh-CN"/>
+        </w:rPr>
+        <w:t>, 106</w:t>
+      </w:r>
+      <w:proofErr w:type="gramEnd"/>
+      <w:r>
+        <w:rPr>
+          <w:sz w:val="21"/>
+          <w:szCs w:val="21"/>
+          <w:lang w:eastAsia="zh-CN"/>
+        </w:rPr>
+        <w:t>.</w:t>
       </w:r>
     </w:p>
     <w:p>
@@ -720,7 +1186,79 @@
           <w:szCs w:val="21"/>
           <w:lang w:eastAsia="zh-CN"/>
         </w:rPr>
-        <w:t>[2]陈峥, 喻俊杰. 基于LLM的Java编程作业评估与教学实践[J]. 计算机教育, 2026(6): 198-205.</w:t>
+        <w:t>[2]</w:t>
+      </w:r>
+      <w:proofErr w:type="gramStart"/>
+      <w:r>
+        <w:rPr>
+          <w:sz w:val="21"/>
+          <w:szCs w:val="21"/>
+          <w:lang w:eastAsia="zh-CN"/>
+        </w:rPr>
+        <w:t>陈峥,</w:t>
+      </w:r>
+      <w:proofErr w:type="gramEnd"/>
+      <w:r>
+        <w:rPr>
+          <w:sz w:val="21"/>
+          <w:szCs w:val="21"/>
+          <w:lang w:eastAsia="zh-CN"/>
+        </w:rPr>
+        <w:t xml:space="preserve"> 喻</w:t>
+      </w:r>
+      <w:proofErr w:type="gramStart"/>
+      <w:r>
+        <w:rPr>
+          <w:sz w:val="21"/>
+          <w:szCs w:val="21"/>
+          <w:lang w:eastAsia="zh-CN"/>
+        </w:rPr>
+        <w:t>俊杰.</w:t>
+      </w:r>
+      <w:proofErr w:type="gramEnd"/>
+      <w:r>
+        <w:rPr>
+          <w:sz w:val="21"/>
+          <w:szCs w:val="21"/>
+          <w:lang w:eastAsia="zh-CN"/>
+        </w:rPr>
+        <w:t xml:space="preserve"> 基于LLM的Java编程作业评估与教学实践[J]. 计算机</w:t>
+      </w:r>
+      <w:proofErr w:type="gramStart"/>
+      <w:r>
+        <w:rPr>
+          <w:sz w:val="21"/>
+          <w:szCs w:val="21"/>
+          <w:lang w:eastAsia="zh-CN"/>
+        </w:rPr>
+        <w:t>教育,</w:t>
+      </w:r>
+      <w:proofErr w:type="gramEnd"/>
+      <w:r>
+        <w:rPr>
+          <w:sz w:val="21"/>
+          <w:szCs w:val="21"/>
+          <w:lang w:eastAsia="zh-CN"/>
+        </w:rPr>
+        <w:t xml:space="preserve"> 2026</w:t>
+      </w:r>
+      <w:proofErr w:type="gramStart"/>
+      <w:r>
+        <w:rPr>
+          <w:sz w:val="21"/>
+          <w:szCs w:val="21"/>
+          <w:lang w:eastAsia="zh-CN"/>
+        </w:rPr>
+        <w:t>(6): 198</w:t>
+      </w:r>
+      <w:proofErr w:type="gramEnd"/>
+      <w:r>
+        <w:rPr>
+          <w:sz w:val="21"/>
+          <w:szCs w:val="21"/>
+          <w:lang w:eastAsia="zh-CN"/>
+        </w:rPr>
+        <w:t>-205.</w:t>
       </w:r>
     </w:p>
     <w:p>
@@ -740,7 +1278,16 @@
           <w:szCs w:val="21"/>
           <w:lang w:eastAsia="zh-CN"/>
         </w:rPr>
-        <w:t>[3]</w:t>
+        <w:t>[</w:t>
+      </w:r>
+      <w:proofErr w:type="gramStart"/>
+      <w:r>
+        <w:rPr>
+          <w:sz w:val="21"/>
+          <w:szCs w:val="21"/>
+          <w:lang w:eastAsia="zh-CN"/>
+        </w:rPr>
+        <w:t>3]</w:t>
       </w:r>
       <w:r>
         <w:rPr>
@@ -748,7 +1295,16 @@
           <w:sz w:val="21"/>
           <w:szCs w:val="21"/>
         </w:rPr>
-        <w:t>KEUNING H, JEURING J T, HEEREN B. A systematic literature review of automated feedback generation for programming exercises[J]. ACM Transactions on Computing Education, 2018, 19(1).</w:t>
+        <w:t>KEUNING</w:t>
+      </w:r>
+      <w:proofErr w:type="gramEnd"/>
+      <w:r>
+        <w:rPr>
+          <w:rFonts w:ascii="Times New Roman" w:hAnsi="Times New Roman" w:cs="Times New Roman"/>
+          <w:sz w:val="21"/>
+          <w:szCs w:val="21"/>
+        </w:rPr>
+        <w:t xml:space="preserve"> H, JEURING J T, HEEREN B. A systematic literature review of automated feedback generation for programming exercises[J]. ACM Transactions on Computing Education, 2018, 19(1).</w:t>
       </w:r>
     </w:p>
     <w:p>
@@ -768,7 +1324,16 @@
           <w:szCs w:val="21"/>
           <w:lang w:eastAsia="zh-CN"/>
         </w:rPr>
-        <w:t>[4]</w:t>
+        <w:t>[</w:t>
+      </w:r>
+      <w:proofErr w:type="gramStart"/>
+      <w:r>
+        <w:rPr>
+          <w:sz w:val="21"/>
+          <w:szCs w:val="21"/>
+          <w:lang w:eastAsia="zh-CN"/>
+        </w:rPr>
+        <w:t>4]</w:t>
       </w:r>
       <w:r>
         <w:rPr>
@@ -776,7 +1341,16 @@
           <w:sz w:val="21"/>
           <w:szCs w:val="21"/>
         </w:rPr>
-        <w:t>KASNECI E, SESSLER K, KÜCHEMANN S, et al. ChatGPT for good? On opportunities and challenges of large language models for education[J]. Learning and Individual Differences, 2023, 103: 102274.</w:t>
+        <w:t>KASNECI</w:t>
+      </w:r>
+      <w:proofErr w:type="gramEnd"/>
+      <w:r>
+        <w:rPr>
+          <w:rFonts w:ascii="Times New Roman" w:hAnsi="Times New Roman" w:cs="Times New Roman"/>
+          <w:sz w:val="21"/>
+          <w:szCs w:val="21"/>
+        </w:rPr>
+        <w:t xml:space="preserve"> E, SESSLER K, KÜCHEMANN S, et al. ChatGPT for good? On opportunities and challenges of large language models for education[J]. Learning and Individual Differences, 2023, 103: 102274.</w:t>
       </w:r>
     </w:p>
     <w:p>
@@ -796,7 +1370,16 @@
           <w:szCs w:val="21"/>
           <w:lang w:eastAsia="zh-CN"/>
         </w:rPr>
-        <w:t>[5]</w:t>
+        <w:t>[</w:t>
+      </w:r>
+      <w:proofErr w:type="gramStart"/>
+      <w:r>
+        <w:rPr>
+          <w:sz w:val="21"/>
+          <w:szCs w:val="21"/>
+          <w:lang w:eastAsia="zh-CN"/>
+        </w:rPr>
+        <w:t>5]</w:t>
       </w:r>
       <w:r>
         <w:rPr>
@@ -804,7 +1387,16 @@
           <w:sz w:val="21"/>
           <w:szCs w:val="21"/>
         </w:rPr>
-        <w:t>SPRING. Spring Boot 3.5 Reference Documentation[EB/OL]. https://docs.spring.io/spring-boot/3.5/reference/index.html, 2026-10-26.</w:t>
+        <w:t>SPRING</w:t>
+      </w:r>
+      <w:proofErr w:type="gramEnd"/>
+      <w:r>
+        <w:rPr>
+          <w:rFonts w:ascii="Times New Roman" w:hAnsi="Times New Roman" w:cs="Times New Roman"/>
+          <w:sz w:val="21"/>
+          <w:szCs w:val="21"/>
+        </w:rPr>
+        <w:t>. Spring Boot 3.5 Reference Documentation[EB/OL]. https://docs.spring.io/spring-boot/3.5/reference/index.html, 2026-10-26.</w:t>
       </w:r>
     </w:p>
     <w:p>
@@ -826,6 +1418,7 @@
         </w:rPr>
         <w:t>[</w:t>
       </w:r>
+      <w:proofErr w:type="gramStart"/>
       <w:r>
         <w:rPr>
           <w:rFonts w:hint="eastAsia"/>
@@ -849,7 +1442,16 @@
           <w:sz w:val="21"/>
           <w:szCs w:val="21"/>
         </w:rPr>
-        <w:t>OLLAMA. Generate a chat message[EB/OL]. https://docs.ollama.com/api/chat, 2026-10-26.</w:t>
+        <w:t>OLLAMA</w:t>
+      </w:r>
+      <w:proofErr w:type="gramEnd"/>
+      <w:r>
+        <w:rPr>
+          <w:rFonts w:ascii="Times New Roman" w:hAnsi="Times New Roman" w:cs="Times New Roman"/>
+          <w:sz w:val="21"/>
+          <w:szCs w:val="21"/>
+        </w:rPr>
+        <w:t>. Generate a chat message[EB/OL]. https://docs.ollama.com/api/chat, 2026-10-26.</w:t>
       </w:r>
     </w:p>
     <w:p>
@@ -874,6 +1476,7 @@
         </w:rPr>
         <w:t>[</w:t>
       </w:r>
+      <w:proofErr w:type="gramStart"/>
       <w:r>
         <w:rPr>
           <w:rFonts w:hint="eastAsia"/>
@@ -897,7 +1500,16 @@
           <w:sz w:val="21"/>
           <w:szCs w:val="21"/>
         </w:rPr>
-        <w:t>ORACLE.</w:t>
+        <w:t>ORACLE</w:t>
+      </w:r>
+      <w:proofErr w:type="gramEnd"/>
+      <w:r>
+        <w:rPr>
+          <w:rFonts w:ascii="Times New Roman" w:hAnsi="Times New Roman" w:cs="Times New Roman"/>
+          <w:sz w:val="21"/>
+          <w:szCs w:val="21"/>
+        </w:rPr>
+        <w:t>.</w:t>
       </w:r>
       <w:r>
         <w:rPr>
@@ -931,7 +1543,25 @@
           <w:sz w:val="21"/>
           <w:szCs w:val="21"/>
         </w:rPr>
-        <w:t>Reference Manual: FOREIGN KEY Constraints[EB/OL]. https://dev.mysql.com/doc/refman/8.4/en/constraint-foreign-key.html, 2026-10-26.</w:t>
+        <w:t xml:space="preserve">Reference Manual: FOREIGN KEY </w:t>
+      </w:r>
+      <w:proofErr w:type="gramStart"/>
+      <w:r>
+        <w:rPr>
+          <w:rFonts w:ascii="Times New Roman" w:hAnsi="Times New Roman" w:cs="Times New Roman"/>
+          <w:sz w:val="21"/>
+          <w:szCs w:val="21"/>
+        </w:rPr>
+        <w:t>Constraints[</w:t>
+      </w:r>
+      <w:proofErr w:type="gramEnd"/>
+      <w:r>
+        <w:rPr>
+          <w:rFonts w:ascii="Times New Roman" w:hAnsi="Times New Roman" w:cs="Times New Roman"/>
+          <w:sz w:val="21"/>
+          <w:szCs w:val="21"/>
+        </w:rPr>
+        <w:t>EB/OL]. https://dev.mysql.com/doc/refman/8.4/en/constraint-foreign-key.html, 2026-10-26.</w:t>
       </w:r>
     </w:p>
     <w:p>
@@ -951,7 +1581,16 @@
           <w:szCs w:val="21"/>
           <w:lang w:eastAsia="zh-CN"/>
         </w:rPr>
-        <w:t>[8]</w:t>
+        <w:t>[</w:t>
+      </w:r>
+      <w:proofErr w:type="gramStart"/>
+      <w:r>
+        <w:rPr>
+          <w:sz w:val="21"/>
+          <w:szCs w:val="21"/>
+          <w:lang w:eastAsia="zh-CN"/>
+        </w:rPr>
+        <w:t>8]</w:t>
       </w:r>
       <w:r>
         <w:rPr>
@@ -959,7 +1598,16 @@
           <w:sz w:val="21"/>
           <w:szCs w:val="21"/>
         </w:rPr>
-        <w:t>SPIRALS-TEAM. IntroClassJava: A dataset of Java bugs for automatic repair[EB/OL]. https://github.com/Spirals-Team/IntroClassJava, 2026-10-26.</w:t>
+        <w:t>SPIRALS</w:t>
+      </w:r>
+      <w:proofErr w:type="gramEnd"/>
+      <w:r>
+        <w:rPr>
+          <w:rFonts w:ascii="Times New Roman" w:hAnsi="Times New Roman" w:cs="Times New Roman"/>
+          <w:sz w:val="21"/>
+          <w:szCs w:val="21"/>
+        </w:rPr>
+        <w:t>-TEAM. IntroClassJava: A dataset of Java bugs for automatic repair[EB/OL]. https://github.com/Spirals-Team/IntroClassJava, 2026-10-26.</w:t>
       </w:r>
     </w:p>
     <w:sectPr>

</xml_diff>

<commit_message>
Format short paper to university writing guide
</commit_message>
<xml_diff>
--- a/docs/papers/20230411330_严何涛_基于Spring Boot的编程错题智能解析助手系统设计与实现.docx
+++ b/docs/papers/20230411330_严何涛_基于Spring Boot的编程错题智能解析助手系统设计与实现.docx
@@ -5,17 +5,18 @@
     <w:p>
       <w:pPr>
         <w:pStyle w:val="aa"/>
-        <w:jc w:val="center"/>
         <w:rPr>
           <w:rFonts w:hint="eastAsia"/>
-          <w:lang w:eastAsia="zh-CN"/>
         </w:rPr>
       </w:pPr>
       <w:r>
-        <w:rPr>
-          <w:lang w:eastAsia="zh-CN"/>
-        </w:rPr>
-        <w:t>基于Spring Boot的编程错题智能解析助手系统设计与实现</w:t>
+        <w:t>基于</w:t>
+      </w:r>
+      <w:r>
+        <w:t>Spring Boot</w:t>
+      </w:r>
+      <w:r>
+        <w:t>的编程错题智能解析助手系统设计与实现</w:t>
       </w:r>
     </w:p>
     <w:p>
@@ -24,85 +25,24 @@
         <w:jc w:val="center"/>
         <w:rPr>
           <w:rFonts w:hint="eastAsia"/>
-          <w:lang w:eastAsia="zh-CN"/>
         </w:rPr>
       </w:pPr>
-      <w:proofErr w:type="gramStart"/>
-      <w:r>
-        <w:rPr>
-          <w:lang w:eastAsia="zh-CN"/>
-        </w:rPr>
-        <w:t>严何涛  学号</w:t>
-      </w:r>
-      <w:proofErr w:type="gramEnd"/>
-      <w:r>
-        <w:rPr>
-          <w:lang w:eastAsia="zh-CN"/>
-        </w:rPr>
-        <w:t>：20230411330</w:t>
+      <w:r>
+        <w:t>严何涛　学号：</w:t>
+      </w:r>
+      <w:r>
+        <w:t>20230411330</w:t>
       </w:r>
     </w:p>
     <w:p>
       <w:pPr>
         <w:pStyle w:val="aff9"/>
-        <w:spacing w:beforeLines="100" w:afterLines="100" w:after="240" w:line="240" w:lineRule="auto"/>
-        <w:jc w:val="center"/>
-        <w:rPr>
-          <w:rFonts w:ascii="黑体" w:eastAsia="黑体" w:hAnsi="黑体" w:hint="eastAsia"/>
-          <w:sz w:val="28"/>
-          <w:szCs w:val="28"/>
-          <w:lang w:eastAsia="zh-CN"/>
-        </w:rPr>
-      </w:pPr>
-      <w:r>
-        <w:rPr>
-          <w:rFonts w:ascii="黑体" w:eastAsia="黑体" w:hAnsi="黑体"/>
-          <w:sz w:val="28"/>
-          <w:szCs w:val="28"/>
-          <w:lang w:eastAsia="zh-CN"/>
-        </w:rPr>
-        <w:t>摘要</w:t>
-      </w:r>
-    </w:p>
-    <w:p>
-      <w:pPr>
-        <w:rPr>
-          <w:rFonts w:hint="eastAsia"/>
-          <w:lang w:eastAsia="zh-CN"/>
-        </w:rPr>
-      </w:pPr>
-      <w:r>
-        <w:rPr>
-          <w:lang w:eastAsia="zh-CN"/>
-        </w:rPr>
-        <w:t>当报错信息、原始代码和修改记录分散保存时，复习者难以还原错误产生的原因。本文实现的助手以一条错题为中心，保存题目描述、代码、报错信息以及实际和期望结果；后端据此请求模型分析，并检查返回内容是否包含错误类型、位置、原因、修改建议、参考代码、知识点和学习建议。分析结果与原始响应分别保存，用户还能记录判断和下次复习日期。项目当前的Maven测试共16项通过，覆盖账户、模型调用限制和复习规则等实现。另有150条候选Java案例及300行未填写的评分记录，解析准确率尚无可计算的人工评分数据。</w:t>
-      </w:r>
-    </w:p>
-    <w:p>
-      <w:pPr>
-        <w:ind w:firstLine="0"/>
-        <w:rPr>
-          <w:rFonts w:hint="eastAsia"/>
-          <w:lang w:eastAsia="zh-CN"/>
-        </w:rPr>
-      </w:pPr>
-      <w:r>
-        <w:rPr>
-          <w:lang w:eastAsia="zh-CN"/>
-        </w:rPr>
-        <w:t>关键词：编程错题；Spring Boot；智能解析；复习记录；人工核验</w:t>
-      </w:r>
-    </w:p>
-    <w:p>
-      <w:pPr>
-        <w:pStyle w:val="aff9"/>
-        <w:jc w:val="center"/>
         <w:rPr>
           <w:rFonts w:hint="eastAsia"/>
         </w:rPr>
       </w:pPr>
       <w:r>
-        <w:t>Abstract</w:t>
+        <w:t>摘　　要</w:t>
       </w:r>
     </w:p>
     <w:p>
@@ -112,11 +52,988 @@
         </w:rPr>
       </w:pPr>
       <w:r>
+        <w:t>当报错信息、原始代码和修改记录分散保存时，复习者难以还原错误产生的原因。本文实现的助手以一条错题为中心，保存题目描述、代码、报错信息以及实际和期望结果；后端据此请求模型分析，并检查返回内容是否包含错误类型、位置、原因、修改建议、参考代码、知识点和学习建议。分析结果与原始响应分别保存，用户还能记录判断和下次复习日期。项目当前的</w:t>
+      </w:r>
+      <w:r>
+        <w:t>Maven</w:t>
+      </w:r>
+      <w:r>
+        <w:t>测试共</w:t>
+      </w:r>
+      <w:r>
+        <w:t>16</w:t>
+      </w:r>
+      <w:r>
+        <w:t>项通过，覆盖账户、模型调用限制和复习规则等实现。另有</w:t>
+      </w:r>
+      <w:r>
+        <w:t>150</w:t>
+      </w:r>
+      <w:r>
+        <w:t>条候选</w:t>
+      </w:r>
+      <w:r>
+        <w:t>Java</w:t>
+      </w:r>
+      <w:r>
+        <w:t>案例及</w:t>
+      </w:r>
+      <w:r>
+        <w:t>300</w:t>
+      </w:r>
+      <w:r>
+        <w:t>行未填写的评分记录，解析准确率尚无可计算的人工评分数据。</w:t>
+      </w:r>
+    </w:p>
+    <w:p>
+      <w:pPr>
+        <w:pStyle w:val="affe"/>
+        <w:rPr>
+          <w:rFonts w:hint="eastAsia"/>
+        </w:rPr>
+      </w:pPr>
+      <w:r>
+        <w:rPr>
+          <w:rFonts w:ascii="黑体" w:hAnsi="黑体"/>
+          <w:b/>
+        </w:rPr>
+        <w:t>关键词：</w:t>
+      </w:r>
+      <w:r>
+        <w:t>编程错题；</w:t>
+      </w:r>
+      <w:r>
+        <w:t>Spring Boot</w:t>
+      </w:r>
+      <w:r>
+        <w:t>；智能解析；复习记录；人工核验</w:t>
+      </w:r>
+    </w:p>
+    <w:p>
+      <w:pPr>
+        <w:rPr>
+          <w:rFonts w:hint="eastAsia"/>
+        </w:rPr>
+        <w:sectPr>
+          <w:headerReference w:type="default" r:id="rId8"/>
+          <w:footerReference w:type="default" r:id="rId9"/>
+          <w:pgSz w:w="11906" w:h="16838"/>
+          <w:pgMar w:top="1417" w:right="1474" w:bottom="1417" w:left="1871" w:header="850" w:footer="850" w:gutter="0"/>
+          <w:pgNumType w:fmt="upperRoman" w:start="1"/>
+          <w:cols w:space="720"/>
+          <w:docGrid w:linePitch="360"/>
+        </w:sectPr>
+      </w:pPr>
+    </w:p>
+    <w:p>
+      <w:pPr>
+        <w:pStyle w:val="aa"/>
+        <w:rPr>
+          <w:rFonts w:hint="eastAsia"/>
+        </w:rPr>
+      </w:pPr>
+      <w:r>
+        <w:rPr>
+          <w:rFonts w:ascii="Times New Roman" w:hAnsi="Times New Roman"/>
+          <w:b/>
+        </w:rPr>
+        <w:lastRenderedPageBreak/>
+        <w:t>Design and Implementation of an Intelligent Assistant for Analyzing Programming Mistakes Based on Spring Boot</w:t>
+      </w:r>
+    </w:p>
+    <w:p>
+      <w:pPr>
+        <w:pStyle w:val="affa"/>
+      </w:pPr>
+      <w:r>
+        <w:t>Abstract</w:t>
+      </w:r>
+    </w:p>
+    <w:p>
+      <w:pPr>
+        <w:pStyle w:val="affc"/>
+      </w:pPr>
+      <w:r>
+        <w:t xml:space="preserve">When error messages, source code, and revisions are stored separately, later review can lose the context of a mistake. This paper presents a Spring Boot assistant that keeps these materials in one error record. The backend requests a model explanation, checks seven required fields, and saves both the structured result and the raw response. Users can record their judgment and the next review date. Sixteen Maven tests pass for the current implementation. The project also contains 150 candidate Java cases and </w:t>
+      </w:r>
+      <w:r>
+        <w:t>300 blank rating rows; human ratings are still needed before diagnostic accuracy can be calculated.</w:t>
+      </w:r>
+    </w:p>
+    <w:p>
+      <w:pPr>
+        <w:pStyle w:val="affe"/>
+        <w:rPr>
+          <w:rFonts w:hint="eastAsia"/>
+        </w:rPr>
+      </w:pPr>
+      <w:r>
+        <w:rPr>
+          <w:rFonts w:ascii="Times New Roman" w:hAnsi="Times New Roman"/>
+          <w:b/>
+        </w:rPr>
+        <w:t xml:space="preserve">Keywords: </w:t>
+      </w:r>
+      <w:r>
         <w:rPr>
           <w:rFonts w:ascii="Times New Roman" w:hAnsi="Times New Roman"/>
         </w:rPr>
-        <w:t>When error messages, source code, and revisions are stored separately, later review can lose the context of a mistake. This paper presents a Spring Boot assistant that keeps these materials in one error record. The backend requests a model explanation, checks seven required fields, and saves both the structured result and the raw response. Users can record their judgment and the next review date. Sixteen Maven tests pass for the current implementation. The project also contains 150 candidate Java cases and 300 blank rating rows; human ratings are still needed before diagnostic accuracy can be calculated.</w:t>
-      </w:r>
+        <w:t>programming mistakes; Spring Boot; error analysis; review records; human verification</w:t>
+      </w:r>
+    </w:p>
+    <w:p>
+      <w:pPr>
+        <w:rPr>
+          <w:rFonts w:hint="eastAsia"/>
+        </w:rPr>
+        <w:sectPr>
+          <w:headerReference w:type="default" r:id="rId10"/>
+          <w:footerReference w:type="default" r:id="rId11"/>
+          <w:pgSz w:w="11906" w:h="16838"/>
+          <w:pgMar w:top="1417" w:right="1474" w:bottom="1417" w:left="1871" w:header="850" w:footer="850" w:gutter="0"/>
+          <w:pgNumType w:fmt="upperRoman" w:start="1"/>
+          <w:cols w:space="720"/>
+          <w:docGrid w:linePitch="360"/>
+        </w:sectPr>
+      </w:pPr>
+    </w:p>
+    <w:p>
+      <w:pPr>
+        <w:pStyle w:val="affb"/>
+        <w:rPr>
+          <w:rFonts w:hint="eastAsia"/>
+        </w:rPr>
+      </w:pPr>
+      <w:r>
+        <w:lastRenderedPageBreak/>
+        <w:t>目　　录</w:t>
+      </w:r>
+    </w:p>
+    <w:p>
+      <w:pPr>
+        <w:pStyle w:val="TOC1"/>
+        <w:tabs>
+          <w:tab w:val="right" w:leader="dot" w:pos="8551"/>
+        </w:tabs>
+        <w:rPr>
+          <w:rFonts w:asciiTheme="minorHAnsi" w:eastAsiaTheme="minorEastAsia" w:hAnsiTheme="minorHAnsi" w:hint="eastAsia"/>
+          <w:noProof/>
+          <w:color w:val="auto"/>
+          <w:kern w:val="2"/>
+          <w:sz w:val="22"/>
+          <w:szCs w:val="24"/>
+          <w:lang w:eastAsia="zh-CN"/>
+          <w14:ligatures w14:val="standardContextual"/>
+        </w:rPr>
+      </w:pPr>
+      <w:r>
+        <w:fldChar w:fldCharType="begin"/>
+      </w:r>
+      <w:r>
+        <w:instrText xml:space="preserve"> TOC \o "1-3" \h \z \u </w:instrText>
+      </w:r>
+      <w:r>
+        <w:fldChar w:fldCharType="separate"/>
+      </w:r>
+      <w:hyperlink w:anchor="_Toc243983922" w:history="1">
+        <w:r>
+          <w:rPr>
+            <w:rStyle w:val="afff0"/>
+            <w:noProof/>
+          </w:rPr>
+          <w:t>1引言</w:t>
+        </w:r>
+        <w:r>
+          <w:rPr>
+            <w:rFonts w:hint="eastAsia"/>
+            <w:noProof/>
+            <w:webHidden/>
+          </w:rPr>
+          <w:tab/>
+        </w:r>
+        <w:r>
+          <w:rPr>
+            <w:rFonts w:hint="eastAsia"/>
+            <w:noProof/>
+            <w:webHidden/>
+          </w:rPr>
+          <w:fldChar w:fldCharType="begin"/>
+        </w:r>
+        <w:r>
+          <w:rPr>
+            <w:rFonts w:hint="eastAsia"/>
+            <w:noProof/>
+            <w:webHidden/>
+          </w:rPr>
+          <w:instrText xml:space="preserve"> </w:instrText>
+        </w:r>
+        <w:r>
+          <w:rPr>
+            <w:noProof/>
+            <w:webHidden/>
+          </w:rPr>
+          <w:instrText>PAGEREF _Toc243983922 \h</w:instrText>
+        </w:r>
+        <w:r>
+          <w:rPr>
+            <w:rFonts w:hint="eastAsia"/>
+            <w:noProof/>
+            <w:webHidden/>
+          </w:rPr>
+          <w:instrText xml:space="preserve"> </w:instrText>
+        </w:r>
+        <w:r>
+          <w:rPr>
+            <w:rFonts w:hint="eastAsia"/>
+            <w:noProof/>
+            <w:webHidden/>
+          </w:rPr>
+        </w:r>
+        <w:r>
+          <w:rPr>
+            <w:rFonts w:hint="eastAsia"/>
+            <w:noProof/>
+            <w:webHidden/>
+          </w:rPr>
+          <w:fldChar w:fldCharType="separate"/>
+        </w:r>
+        <w:r>
+          <w:rPr>
+            <w:rFonts w:hint="eastAsia"/>
+            <w:noProof/>
+            <w:webHidden/>
+          </w:rPr>
+          <w:t>1</w:t>
+        </w:r>
+        <w:r>
+          <w:rPr>
+            <w:rFonts w:hint="eastAsia"/>
+            <w:noProof/>
+            <w:webHidden/>
+          </w:rPr>
+          <w:fldChar w:fldCharType="end"/>
+        </w:r>
+      </w:hyperlink>
+    </w:p>
+    <w:p>
+      <w:pPr>
+        <w:pStyle w:val="TOC1"/>
+        <w:tabs>
+          <w:tab w:val="right" w:leader="dot" w:pos="8551"/>
+        </w:tabs>
+        <w:rPr>
+          <w:rFonts w:asciiTheme="minorHAnsi" w:eastAsiaTheme="minorEastAsia" w:hAnsiTheme="minorHAnsi" w:hint="eastAsia"/>
+          <w:noProof/>
+          <w:color w:val="auto"/>
+          <w:kern w:val="2"/>
+          <w:sz w:val="22"/>
+          <w:szCs w:val="24"/>
+          <w:lang w:eastAsia="zh-CN"/>
+          <w14:ligatures w14:val="standardContextual"/>
+        </w:rPr>
+      </w:pPr>
+      <w:hyperlink w:anchor="_Toc243983923" w:history="1">
+        <w:r>
+          <w:rPr>
+            <w:rStyle w:val="afff0"/>
+            <w:noProof/>
+          </w:rPr>
+          <w:t>2系统分析</w:t>
+        </w:r>
+        <w:r>
+          <w:rPr>
+            <w:rFonts w:hint="eastAsia"/>
+            <w:noProof/>
+            <w:webHidden/>
+          </w:rPr>
+          <w:tab/>
+        </w:r>
+        <w:r>
+          <w:rPr>
+            <w:rFonts w:hint="eastAsia"/>
+            <w:noProof/>
+            <w:webHidden/>
+          </w:rPr>
+          <w:fldChar w:fldCharType="begin"/>
+        </w:r>
+        <w:r>
+          <w:rPr>
+            <w:rFonts w:hint="eastAsia"/>
+            <w:noProof/>
+            <w:webHidden/>
+          </w:rPr>
+          <w:instrText xml:space="preserve"> </w:instrText>
+        </w:r>
+        <w:r>
+          <w:rPr>
+            <w:noProof/>
+            <w:webHidden/>
+          </w:rPr>
+          <w:instrText>PAGEREF _Toc243983923 \h</w:instrText>
+        </w:r>
+        <w:r>
+          <w:rPr>
+            <w:rFonts w:hint="eastAsia"/>
+            <w:noProof/>
+            <w:webHidden/>
+          </w:rPr>
+          <w:instrText xml:space="preserve"> </w:instrText>
+        </w:r>
+        <w:r>
+          <w:rPr>
+            <w:rFonts w:hint="eastAsia"/>
+            <w:noProof/>
+            <w:webHidden/>
+          </w:rPr>
+        </w:r>
+        <w:r>
+          <w:rPr>
+            <w:rFonts w:hint="eastAsia"/>
+            <w:noProof/>
+            <w:webHidden/>
+          </w:rPr>
+          <w:fldChar w:fldCharType="separate"/>
+        </w:r>
+        <w:r>
+          <w:rPr>
+            <w:rFonts w:hint="eastAsia"/>
+            <w:noProof/>
+            <w:webHidden/>
+          </w:rPr>
+          <w:t>1</w:t>
+        </w:r>
+        <w:r>
+          <w:rPr>
+            <w:rFonts w:hint="eastAsia"/>
+            <w:noProof/>
+            <w:webHidden/>
+          </w:rPr>
+          <w:fldChar w:fldCharType="end"/>
+        </w:r>
+      </w:hyperlink>
+    </w:p>
+    <w:p>
+      <w:pPr>
+        <w:pStyle w:val="TOC1"/>
+        <w:tabs>
+          <w:tab w:val="right" w:leader="dot" w:pos="8551"/>
+        </w:tabs>
+        <w:rPr>
+          <w:rFonts w:asciiTheme="minorHAnsi" w:eastAsiaTheme="minorEastAsia" w:hAnsiTheme="minorHAnsi" w:hint="eastAsia"/>
+          <w:noProof/>
+          <w:color w:val="auto"/>
+          <w:kern w:val="2"/>
+          <w:sz w:val="22"/>
+          <w:szCs w:val="24"/>
+          <w:lang w:eastAsia="zh-CN"/>
+          <w14:ligatures w14:val="standardContextual"/>
+        </w:rPr>
+      </w:pPr>
+      <w:hyperlink w:anchor="_Toc243983924" w:history="1">
+        <w:r>
+          <w:rPr>
+            <w:rStyle w:val="afff0"/>
+            <w:noProof/>
+          </w:rPr>
+          <w:t>3系统设计</w:t>
+        </w:r>
+        <w:r>
+          <w:rPr>
+            <w:rFonts w:hint="eastAsia"/>
+            <w:noProof/>
+            <w:webHidden/>
+          </w:rPr>
+          <w:tab/>
+        </w:r>
+        <w:r>
+          <w:rPr>
+            <w:rFonts w:hint="eastAsia"/>
+            <w:noProof/>
+            <w:webHidden/>
+          </w:rPr>
+          <w:fldChar w:fldCharType="begin"/>
+        </w:r>
+        <w:r>
+          <w:rPr>
+            <w:rFonts w:hint="eastAsia"/>
+            <w:noProof/>
+            <w:webHidden/>
+          </w:rPr>
+          <w:instrText xml:space="preserve"> </w:instrText>
+        </w:r>
+        <w:r>
+          <w:rPr>
+            <w:noProof/>
+            <w:webHidden/>
+          </w:rPr>
+          <w:instrText>PAGEREF _Toc243983924 \h</w:instrText>
+        </w:r>
+        <w:r>
+          <w:rPr>
+            <w:rFonts w:hint="eastAsia"/>
+            <w:noProof/>
+            <w:webHidden/>
+          </w:rPr>
+          <w:instrText xml:space="preserve"> </w:instrText>
+        </w:r>
+        <w:r>
+          <w:rPr>
+            <w:rFonts w:hint="eastAsia"/>
+            <w:noProof/>
+            <w:webHidden/>
+          </w:rPr>
+        </w:r>
+        <w:r>
+          <w:rPr>
+            <w:rFonts w:hint="eastAsia"/>
+            <w:noProof/>
+            <w:webHidden/>
+          </w:rPr>
+          <w:fldChar w:fldCharType="separate"/>
+        </w:r>
+        <w:r>
+          <w:rPr>
+            <w:rFonts w:hint="eastAsia"/>
+            <w:noProof/>
+            <w:webHidden/>
+          </w:rPr>
+          <w:t>2</w:t>
+        </w:r>
+        <w:r>
+          <w:rPr>
+            <w:rFonts w:hint="eastAsia"/>
+            <w:noProof/>
+            <w:webHidden/>
+          </w:rPr>
+          <w:fldChar w:fldCharType="end"/>
+        </w:r>
+      </w:hyperlink>
+    </w:p>
+    <w:p>
+      <w:pPr>
+        <w:pStyle w:val="TOC1"/>
+        <w:tabs>
+          <w:tab w:val="right" w:leader="dot" w:pos="8551"/>
+        </w:tabs>
+        <w:rPr>
+          <w:rFonts w:asciiTheme="minorHAnsi" w:eastAsiaTheme="minorEastAsia" w:hAnsiTheme="minorHAnsi" w:hint="eastAsia"/>
+          <w:noProof/>
+          <w:color w:val="auto"/>
+          <w:kern w:val="2"/>
+          <w:sz w:val="22"/>
+          <w:szCs w:val="24"/>
+          <w:lang w:eastAsia="zh-CN"/>
+          <w14:ligatures w14:val="standardContextual"/>
+        </w:rPr>
+      </w:pPr>
+      <w:hyperlink w:anchor="_Toc243983925" w:history="1">
+        <w:r>
+          <w:rPr>
+            <w:rStyle w:val="afff0"/>
+            <w:noProof/>
+          </w:rPr>
+          <w:t>4系统实现</w:t>
+        </w:r>
+        <w:r>
+          <w:rPr>
+            <w:rFonts w:hint="eastAsia"/>
+            <w:noProof/>
+            <w:webHidden/>
+          </w:rPr>
+          <w:tab/>
+        </w:r>
+        <w:r>
+          <w:rPr>
+            <w:rFonts w:hint="eastAsia"/>
+            <w:noProof/>
+            <w:webHidden/>
+          </w:rPr>
+          <w:fldChar w:fldCharType="begin"/>
+        </w:r>
+        <w:r>
+          <w:rPr>
+            <w:rFonts w:hint="eastAsia"/>
+            <w:noProof/>
+            <w:webHidden/>
+          </w:rPr>
+          <w:instrText xml:space="preserve"> </w:instrText>
+        </w:r>
+        <w:r>
+          <w:rPr>
+            <w:noProof/>
+            <w:webHidden/>
+          </w:rPr>
+          <w:instrText>PAGEREF _Toc243983925 \h</w:instrText>
+        </w:r>
+        <w:r>
+          <w:rPr>
+            <w:rFonts w:hint="eastAsia"/>
+            <w:noProof/>
+            <w:webHidden/>
+          </w:rPr>
+          <w:instrText xml:space="preserve"> </w:instrText>
+        </w:r>
+        <w:r>
+          <w:rPr>
+            <w:rFonts w:hint="eastAsia"/>
+            <w:noProof/>
+            <w:webHidden/>
+          </w:rPr>
+        </w:r>
+        <w:r>
+          <w:rPr>
+            <w:rFonts w:hint="eastAsia"/>
+            <w:noProof/>
+            <w:webHidden/>
+          </w:rPr>
+          <w:fldChar w:fldCharType="separate"/>
+        </w:r>
+        <w:r>
+          <w:rPr>
+            <w:rFonts w:hint="eastAsia"/>
+            <w:noProof/>
+            <w:webHidden/>
+          </w:rPr>
+          <w:t>2</w:t>
+        </w:r>
+        <w:r>
+          <w:rPr>
+            <w:rFonts w:hint="eastAsia"/>
+            <w:noProof/>
+            <w:webHidden/>
+          </w:rPr>
+          <w:fldChar w:fldCharType="end"/>
+        </w:r>
+      </w:hyperlink>
+    </w:p>
+    <w:p>
+      <w:pPr>
+        <w:pStyle w:val="TOC1"/>
+        <w:tabs>
+          <w:tab w:val="right" w:leader="dot" w:pos="8551"/>
+        </w:tabs>
+        <w:rPr>
+          <w:rFonts w:asciiTheme="minorHAnsi" w:eastAsiaTheme="minorEastAsia" w:hAnsiTheme="minorHAnsi" w:hint="eastAsia"/>
+          <w:noProof/>
+          <w:color w:val="auto"/>
+          <w:kern w:val="2"/>
+          <w:sz w:val="22"/>
+          <w:szCs w:val="24"/>
+          <w:lang w:eastAsia="zh-CN"/>
+          <w14:ligatures w14:val="standardContextual"/>
+        </w:rPr>
+      </w:pPr>
+      <w:hyperlink w:anchor="_Toc243983926" w:history="1">
+        <w:r>
+          <w:rPr>
+            <w:rStyle w:val="afff0"/>
+            <w:noProof/>
+          </w:rPr>
+          <w:t>5结果与讨论</w:t>
+        </w:r>
+        <w:r>
+          <w:rPr>
+            <w:rFonts w:hint="eastAsia"/>
+            <w:noProof/>
+            <w:webHidden/>
+          </w:rPr>
+          <w:tab/>
+        </w:r>
+        <w:r>
+          <w:rPr>
+            <w:rFonts w:hint="eastAsia"/>
+            <w:noProof/>
+            <w:webHidden/>
+          </w:rPr>
+          <w:fldChar w:fldCharType="begin"/>
+        </w:r>
+        <w:r>
+          <w:rPr>
+            <w:rFonts w:hint="eastAsia"/>
+            <w:noProof/>
+            <w:webHidden/>
+          </w:rPr>
+          <w:instrText xml:space="preserve"> </w:instrText>
+        </w:r>
+        <w:r>
+          <w:rPr>
+            <w:noProof/>
+            <w:webHidden/>
+          </w:rPr>
+          <w:instrText>PAGEREF _Toc243983926 \h</w:instrText>
+        </w:r>
+        <w:r>
+          <w:rPr>
+            <w:rFonts w:hint="eastAsia"/>
+            <w:noProof/>
+            <w:webHidden/>
+          </w:rPr>
+          <w:instrText xml:space="preserve"> </w:instrText>
+        </w:r>
+        <w:r>
+          <w:rPr>
+            <w:rFonts w:hint="eastAsia"/>
+            <w:noProof/>
+            <w:webHidden/>
+          </w:rPr>
+        </w:r>
+        <w:r>
+          <w:rPr>
+            <w:rFonts w:hint="eastAsia"/>
+            <w:noProof/>
+            <w:webHidden/>
+          </w:rPr>
+          <w:fldChar w:fldCharType="separate"/>
+        </w:r>
+        <w:r>
+          <w:rPr>
+            <w:rFonts w:hint="eastAsia"/>
+            <w:noProof/>
+            <w:webHidden/>
+          </w:rPr>
+          <w:t>3</w:t>
+        </w:r>
+        <w:r>
+          <w:rPr>
+            <w:rFonts w:hint="eastAsia"/>
+            <w:noProof/>
+            <w:webHidden/>
+          </w:rPr>
+          <w:fldChar w:fldCharType="end"/>
+        </w:r>
+      </w:hyperlink>
+    </w:p>
+    <w:p>
+      <w:pPr>
+        <w:pStyle w:val="TOC1"/>
+        <w:tabs>
+          <w:tab w:val="right" w:leader="dot" w:pos="8551"/>
+        </w:tabs>
+        <w:rPr>
+          <w:rFonts w:asciiTheme="minorHAnsi" w:eastAsiaTheme="minorEastAsia" w:hAnsiTheme="minorHAnsi" w:hint="eastAsia"/>
+          <w:noProof/>
+          <w:color w:val="auto"/>
+          <w:kern w:val="2"/>
+          <w:sz w:val="22"/>
+          <w:szCs w:val="24"/>
+          <w:lang w:eastAsia="zh-CN"/>
+          <w14:ligatures w14:val="standardContextual"/>
+        </w:rPr>
+      </w:pPr>
+      <w:hyperlink w:anchor="_Toc243983927" w:history="1">
+        <w:r>
+          <w:rPr>
+            <w:rStyle w:val="afff0"/>
+            <w:noProof/>
+          </w:rPr>
+          <w:t>6结论</w:t>
+        </w:r>
+        <w:r>
+          <w:rPr>
+            <w:rFonts w:hint="eastAsia"/>
+            <w:noProof/>
+            <w:webHidden/>
+          </w:rPr>
+          <w:tab/>
+        </w:r>
+        <w:r>
+          <w:rPr>
+            <w:rFonts w:hint="eastAsia"/>
+            <w:noProof/>
+            <w:webHidden/>
+          </w:rPr>
+          <w:fldChar w:fldCharType="begin"/>
+        </w:r>
+        <w:r>
+          <w:rPr>
+            <w:rFonts w:hint="eastAsia"/>
+            <w:noProof/>
+            <w:webHidden/>
+          </w:rPr>
+          <w:instrText xml:space="preserve"> </w:instrText>
+        </w:r>
+        <w:r>
+          <w:rPr>
+            <w:noProof/>
+            <w:webHidden/>
+          </w:rPr>
+          <w:instrText>PAGEREF _Toc243983927 \h</w:instrText>
+        </w:r>
+        <w:r>
+          <w:rPr>
+            <w:rFonts w:hint="eastAsia"/>
+            <w:noProof/>
+            <w:webHidden/>
+          </w:rPr>
+          <w:instrText xml:space="preserve"> </w:instrText>
+        </w:r>
+        <w:r>
+          <w:rPr>
+            <w:rFonts w:hint="eastAsia"/>
+            <w:noProof/>
+            <w:webHidden/>
+          </w:rPr>
+        </w:r>
+        <w:r>
+          <w:rPr>
+            <w:rFonts w:hint="eastAsia"/>
+            <w:noProof/>
+            <w:webHidden/>
+          </w:rPr>
+          <w:fldChar w:fldCharType="separate"/>
+        </w:r>
+        <w:r>
+          <w:rPr>
+            <w:rFonts w:hint="eastAsia"/>
+            <w:noProof/>
+            <w:webHidden/>
+          </w:rPr>
+          <w:t>3</w:t>
+        </w:r>
+        <w:r>
+          <w:rPr>
+            <w:rFonts w:hint="eastAsia"/>
+            <w:noProof/>
+            <w:webHidden/>
+          </w:rPr>
+          <w:fldChar w:fldCharType="end"/>
+        </w:r>
+      </w:hyperlink>
+    </w:p>
+    <w:p>
+      <w:pPr>
+        <w:pStyle w:val="TOC1"/>
+        <w:tabs>
+          <w:tab w:val="right" w:leader="dot" w:pos="8551"/>
+        </w:tabs>
+        <w:rPr>
+          <w:rFonts w:asciiTheme="minorHAnsi" w:eastAsiaTheme="minorEastAsia" w:hAnsiTheme="minorHAnsi" w:hint="eastAsia"/>
+          <w:noProof/>
+          <w:color w:val="auto"/>
+          <w:kern w:val="2"/>
+          <w:sz w:val="22"/>
+          <w:szCs w:val="24"/>
+          <w:lang w:eastAsia="zh-CN"/>
+          <w14:ligatures w14:val="standardContextual"/>
+        </w:rPr>
+      </w:pPr>
+      <w:hyperlink w:anchor="_Toc243983928" w:history="1">
+        <w:r>
+          <w:rPr>
+            <w:rStyle w:val="afff0"/>
+            <w:noProof/>
+          </w:rPr>
+          <w:t>参考文献</w:t>
+        </w:r>
+        <w:r>
+          <w:rPr>
+            <w:rFonts w:hint="eastAsia"/>
+            <w:noProof/>
+            <w:webHidden/>
+          </w:rPr>
+          <w:tab/>
+        </w:r>
+        <w:r>
+          <w:rPr>
+            <w:rFonts w:hint="eastAsia"/>
+            <w:noProof/>
+            <w:webHidden/>
+          </w:rPr>
+          <w:fldChar w:fldCharType="begin"/>
+        </w:r>
+        <w:r>
+          <w:rPr>
+            <w:rFonts w:hint="eastAsia"/>
+            <w:noProof/>
+            <w:webHidden/>
+          </w:rPr>
+          <w:instrText xml:space="preserve"> </w:instrText>
+        </w:r>
+        <w:r>
+          <w:rPr>
+            <w:noProof/>
+            <w:webHidden/>
+          </w:rPr>
+          <w:instrText>PAGEREF _Toc243983928 \h</w:instrText>
+        </w:r>
+        <w:r>
+          <w:rPr>
+            <w:rFonts w:hint="eastAsia"/>
+            <w:noProof/>
+            <w:webHidden/>
+          </w:rPr>
+          <w:instrText xml:space="preserve"> </w:instrText>
+        </w:r>
+        <w:r>
+          <w:rPr>
+            <w:rFonts w:hint="eastAsia"/>
+            <w:noProof/>
+            <w:webHidden/>
+          </w:rPr>
+        </w:r>
+        <w:r>
+          <w:rPr>
+            <w:rFonts w:hint="eastAsia"/>
+            <w:noProof/>
+            <w:webHidden/>
+          </w:rPr>
+          <w:fldChar w:fldCharType="separate"/>
+        </w:r>
+        <w:r>
+          <w:rPr>
+            <w:rFonts w:hint="eastAsia"/>
+            <w:noProof/>
+            <w:webHidden/>
+          </w:rPr>
+          <w:t>5</w:t>
+        </w:r>
+        <w:r>
+          <w:rPr>
+            <w:rFonts w:hint="eastAsia"/>
+            <w:noProof/>
+            <w:webHidden/>
+          </w:rPr>
+          <w:fldChar w:fldCharType="end"/>
+        </w:r>
+      </w:hyperlink>
+    </w:p>
+    <w:p>
+      <w:pPr>
+        <w:pStyle w:val="afff"/>
+        <w:rPr>
+          <w:rFonts w:hint="eastAsia"/>
+        </w:rPr>
+      </w:pPr>
+      <w:r>
+        <w:fldChar w:fldCharType="end"/>
+      </w:r>
+    </w:p>
+    <w:p>
+      <w:pPr>
+        <w:rPr>
+          <w:rFonts w:hint="eastAsia"/>
+        </w:rPr>
+        <w:sectPr>
+          <w:headerReference w:type="default" r:id="rId12"/>
+          <w:footerReference w:type="default" r:id="rId13"/>
+          <w:pgSz w:w="11906" w:h="16838"/>
+          <w:pgMar w:top="1417" w:right="1474" w:bottom="1417" w:left="1871" w:header="850" w:footer="850" w:gutter="0"/>
+          <w:pgNumType w:fmt="upperRoman" w:start="1"/>
+          <w:cols w:space="720"/>
+          <w:docGrid w:linePitch="360"/>
+        </w:sectPr>
+      </w:pPr>
+    </w:p>
+    <w:p>
+      <w:pPr>
+        <w:pStyle w:val="1"/>
+        <w:rPr>
+          <w:rFonts w:hint="eastAsia"/>
+        </w:rPr>
+      </w:pPr>
+      <w:bookmarkStart w:id="0" w:name="_Toc243983922"/>
+      <w:r>
+        <w:lastRenderedPageBreak/>
+        <w:t>1</w:t>
+      </w:r>
+      <w:r>
+        <w:t>引言</w:t>
+      </w:r>
+      <w:bookmarkEnd w:id="0"/>
+    </w:p>
+    <w:p>
+      <w:pPr>
+        <w:rPr>
+          <w:rFonts w:hint="eastAsia"/>
+        </w:rPr>
+      </w:pPr>
+      <w:r>
+        <w:t>程序设计课程的练习通常伴随编译错误、运行异常和结果不符合预期等问题。学生若只保存报错截图或修正后的代码，过一段时间便难以还原原始思路，也不容易区分语法失误、边界条件遗漏和算法理解偏差。唐琳等在编程实践课程中引入大语言模型</w:t>
+      </w:r>
+      <w:r>
+        <w:rPr>
+          <w:vertAlign w:val="superscript"/>
+        </w:rPr>
+        <w:t>[1]</w:t>
+      </w:r>
+      <w:r>
+        <w:t>，陈峥等将其用于</w:t>
+      </w:r>
+      <w:r>
+        <w:t>Java</w:t>
+      </w:r>
+      <w:r>
+        <w:t>编程作业评估</w:t>
+      </w:r>
+      <w:r>
+        <w:rPr>
+          <w:vertAlign w:val="superscript"/>
+        </w:rPr>
+        <w:t>[2]</w:t>
+      </w:r>
+      <w:r>
+        <w:t>。针对编程练习自动反馈的综述指出，反馈的内容、生成方式及其对学习者的帮助需要分别分析</w:t>
+      </w:r>
+      <w:r>
+        <w:rPr>
+          <w:vertAlign w:val="superscript"/>
+        </w:rPr>
+        <w:t>[3]</w:t>
+      </w:r>
+      <w:r>
+        <w:t>。因此，错题工具除存储原始材料外，还应把错误解释、修改过程和复习活动连接起来。</w:t>
+      </w:r>
+    </w:p>
+    <w:p>
+      <w:pPr>
+        <w:rPr>
+          <w:rFonts w:hint="eastAsia"/>
+        </w:rPr>
+      </w:pPr>
+      <w:r>
+        <w:t>大语言模型能够生成自然语言解释和参考代码，但流畅的表述不能直接证明判断正确。教育领域的研究同时讨论了这类工具的学习机会与准确性、依赖性等问题</w:t>
+      </w:r>
+      <w:r>
+        <w:rPr>
+          <w:vertAlign w:val="superscript"/>
+        </w:rPr>
+        <w:t>[4]</w:t>
+      </w:r>
+      <w:r>
+        <w:t>。本文将模型输出定位为供学生参考的分析材料，允许用户记录人工判断，并保留原始响应以便核查。研究目标是完成可运行的个人错题整理与解析流程，考察系统功能能否贯通；解析正确率则须等待独立标注与代码测试。</w:t>
+      </w:r>
+    </w:p>
+    <w:p>
+      <w:pPr>
+        <w:rPr>
+          <w:rFonts w:hint="eastAsia"/>
+        </w:rPr>
+      </w:pPr>
+      <w:r>
+        <w:t>本文以个人</w:t>
+      </w:r>
+      <w:r>
+        <w:t>Java</w:t>
+      </w:r>
+      <w:r>
+        <w:t>编程错题为主要分析对象：学习者提供原题、代码和运行现象，应用保存这些材料及后续分析记录。参考代码由页面展示，应用服务器不执行用户提交的程序。这一使用范围要求结果评价同时检查解释文本与参考代码。</w:t>
+      </w:r>
+    </w:p>
+    <w:p>
+      <w:pPr>
+        <w:pStyle w:val="1"/>
+        <w:rPr>
+          <w:rFonts w:hint="eastAsia"/>
+        </w:rPr>
+      </w:pPr>
+      <w:bookmarkStart w:id="1" w:name="_Toc243983923"/>
+      <w:r>
+        <w:t>2</w:t>
+      </w:r>
+      <w:r>
+        <w:t>系统分析</w:t>
+      </w:r>
+      <w:bookmarkEnd w:id="1"/>
     </w:p>
     <w:p>
       <w:pPr>
@@ -126,145 +1043,19 @@
         </w:rPr>
       </w:pPr>
       <w:r>
-        <w:rPr>
-          <w:rFonts w:ascii="Times New Roman" w:hAnsi="Times New Roman"/>
-        </w:rPr>
-        <w:t>Keywords: programming mistakes; Spring Boot; error analysis; review records; human verification</w:t>
-      </w:r>
-    </w:p>
-    <w:p>
-      <w:pPr>
-        <w:pStyle w:val="aff9"/>
-        <w:rPr>
-          <w:rFonts w:hint="eastAsia"/>
-          <w:lang w:eastAsia="zh-CN"/>
-        </w:rPr>
-      </w:pPr>
-      <w:proofErr w:type="gramStart"/>
-      <w:r>
-        <w:rPr>
-          <w:lang w:eastAsia="zh-CN"/>
-        </w:rPr>
-        <w:t>1 引言</w:t>
-      </w:r>
-      <w:proofErr w:type="gramEnd"/>
-    </w:p>
-    <w:p>
-      <w:pPr>
-        <w:rPr>
-          <w:rFonts w:hint="eastAsia"/>
-          <w:lang w:eastAsia="zh-CN"/>
-        </w:rPr>
-      </w:pPr>
-      <w:r>
-        <w:rPr>
-          <w:lang w:eastAsia="zh-CN"/>
-        </w:rPr>
-        <w:t>程序设计课程的练习通常伴随编译错误、运行异常和结果不符合预期等问题。学生若只保存报错截图或修正后的代码，过一段时间便难以还原原始思路，也不容易区分语法失误、边界条件遗漏和算法理解偏差。唐琳等在编程实践课程中引入大语言模型</w:t>
-      </w:r>
-      <w:r>
-        <w:rPr>
-          <w:vertAlign w:val="superscript"/>
-          <w:lang w:eastAsia="zh-CN"/>
-        </w:rPr>
-        <w:t>[1]</w:t>
-      </w:r>
-      <w:r>
-        <w:rPr>
-          <w:lang w:eastAsia="zh-CN"/>
-        </w:rPr>
-        <w:t>，陈峥等将其用于Java编程作业评估</w:t>
-      </w:r>
-      <w:r>
-        <w:rPr>
-          <w:vertAlign w:val="superscript"/>
-          <w:lang w:eastAsia="zh-CN"/>
-        </w:rPr>
-        <w:t>[2]</w:t>
-      </w:r>
-      <w:r>
-        <w:rPr>
-          <w:lang w:eastAsia="zh-CN"/>
-        </w:rPr>
-        <w:t>。针对编程练习自动反馈的综述指出，反馈的内容、生成方式及其对学习者的帮助需要分别分析</w:t>
-      </w:r>
-      <w:r>
-        <w:rPr>
-          <w:vertAlign w:val="superscript"/>
-          <w:lang w:eastAsia="zh-CN"/>
-        </w:rPr>
-        <w:t>[3]</w:t>
-      </w:r>
-      <w:r>
-        <w:rPr>
-          <w:lang w:eastAsia="zh-CN"/>
-        </w:rPr>
-        <w:t>。因此，错题工具除存储原始材料外，还应把错误解释、修改过程和复习活动连接起来。</w:t>
-      </w:r>
-    </w:p>
-    <w:p>
-      <w:pPr>
-        <w:rPr>
-          <w:rFonts w:hint="eastAsia"/>
-          <w:lang w:eastAsia="zh-CN"/>
-        </w:rPr>
-      </w:pPr>
-      <w:r>
-        <w:rPr>
-          <w:lang w:eastAsia="zh-CN"/>
-        </w:rPr>
-        <w:lastRenderedPageBreak/>
-        <w:t>大语言模型能够生成自然语言解释和参考代码，但流畅的表述不能直接证明判断正确。教育领域的研究同时讨论了这类工具的学习机会与准确性、依赖性等问题</w:t>
-      </w:r>
-      <w:r>
-        <w:rPr>
-          <w:vertAlign w:val="superscript"/>
-          <w:lang w:eastAsia="zh-CN"/>
-        </w:rPr>
-        <w:t>[4]</w:t>
-      </w:r>
-      <w:r>
-        <w:rPr>
-          <w:lang w:eastAsia="zh-CN"/>
-        </w:rPr>
-        <w:t>。本文将模型输出定位为供学生参考的分析材料，允许用户记录人工判断，并保留原始响应以便核查。研究目标是完成可运行的个人错题整理与解析流程，考察系统功能能否贯通；解析正确率则须等待独立标注与代码测试。</w:t>
-      </w:r>
-    </w:p>
-    <w:p>
-      <w:pPr>
-        <w:rPr>
-          <w:rFonts w:hint="eastAsia"/>
-          <w:lang w:eastAsia="zh-CN"/>
-        </w:rPr>
-      </w:pPr>
-      <w:r>
-        <w:rPr>
-          <w:lang w:eastAsia="zh-CN"/>
-        </w:rPr>
-        <w:t>本文以个人Java编程错题为主要分析对象：学习者提供原题、代码和运行现象，应用保存这些材料及后续分析记录。参考代码由页面展示，应用服务器不执行用户提交的程序。这一使用范围要求结果评价同时检查解释文本与参考代码。</w:t>
-      </w:r>
-    </w:p>
-    <w:p>
-      <w:pPr>
-        <w:pStyle w:val="aff9"/>
-        <w:rPr>
-          <w:rFonts w:hint="eastAsia"/>
-          <w:lang w:eastAsia="zh-CN"/>
-        </w:rPr>
-      </w:pPr>
-      <w:proofErr w:type="gramStart"/>
-      <w:r>
-        <w:rPr>
-          <w:lang w:eastAsia="zh-CN"/>
-        </w:rPr>
-        <w:t>2 系统</w:t>
-      </w:r>
-      <w:proofErr w:type="gramEnd"/>
-      <w:r>
-        <w:rPr>
-          <w:lang w:eastAsia="zh-CN"/>
-        </w:rPr>
-        <w:t>分析</w:t>
+        <w:t>（</w:t>
+      </w:r>
+      <w:r>
+        <w:t>1</w:t>
+      </w:r>
+      <w:r>
+        <w:t>）</w:t>
+      </w:r>
+      <w:r>
+        <w:t xml:space="preserve"> </w:t>
+      </w:r>
+      <w:r>
+        <w:t>用户与任务分析。系统面向已注册的个人学习者。未登录者可访问注册、登录和密码找回入口；登录后可新增、查询、编辑及删除自己的错题，调用解析服务，查看历史分析，记录分析是否可信，并按计划复习。学习者录入的题目描述、源代码、错误消息、实际输出和期望输出共同构成分析依据。若输入缺失，系统可以提示模型说明信息不足，而不能把猜测当成确定原因。</w:t>
       </w:r>
     </w:p>
     <w:p>
@@ -272,28 +1063,22 @@
         <w:ind w:firstLine="0"/>
         <w:rPr>
           <w:rFonts w:hint="eastAsia"/>
-          <w:lang w:eastAsia="zh-CN"/>
         </w:rPr>
       </w:pPr>
       <w:r>
-        <w:rPr>
-          <w:lang w:eastAsia="zh-CN"/>
-        </w:rPr>
-        <w:t>(1</w:t>
-      </w:r>
-      <w:proofErr w:type="gramStart"/>
-      <w:r>
-        <w:rPr>
-          <w:lang w:eastAsia="zh-CN"/>
-        </w:rPr>
-        <w:t>) 用户</w:t>
-      </w:r>
-      <w:proofErr w:type="gramEnd"/>
-      <w:r>
-        <w:rPr>
-          <w:lang w:eastAsia="zh-CN"/>
-        </w:rPr>
-        <w:t>与任务分析。系统面向已注册的个人学习者。未登录者可访问注册、登录和密码找回入口；登录后可新增、查询、编辑及删除自己的错题，调用解析服务，查看历史分析，记录分析是否可信，并按计划复习。学习者录入的题目描述、源代码、错误消息、实际输出和期望输出共同构成分析依据。若输入缺失，系统可以提示模型说明信息不足，而不能把猜测当成确定原因。</w:t>
+        <w:t>（</w:t>
+      </w:r>
+      <w:r>
+        <w:t>2</w:t>
+      </w:r>
+      <w:r>
+        <w:t>）</w:t>
+      </w:r>
+      <w:r>
+        <w:t xml:space="preserve"> </w:t>
+      </w:r>
+      <w:r>
+        <w:t>业务需求分析。一次错题分析应先确认错题归属，再控制调用次数，随后组织模型输入、检查输出并保存结果。系统需要对同一道错题的重复并发分析作限制；对模型不可用或格式错误的情况记录失败状态，避免页面显示虚假的成功。查询分析历史时仍要按当前账户核对错题归属。知识点应与错题关联，便于以后按主题回看。</w:t>
       </w:r>
     </w:p>
     <w:p>
@@ -301,80 +1086,116 @@
         <w:ind w:firstLine="0"/>
         <w:rPr>
           <w:rFonts w:hint="eastAsia"/>
-          <w:lang w:eastAsia="zh-CN"/>
         </w:rPr>
       </w:pPr>
       <w:r>
+        <w:t>（</w:t>
+      </w:r>
+      <w:r>
+        <w:t>3</w:t>
+      </w:r>
+      <w:r>
+        <w:t>）</w:t>
+      </w:r>
+      <w:r>
+        <w:t xml:space="preserve"> </w:t>
+      </w:r>
+      <w:r>
+        <w:t>非功能需求分析。个人代码和学习记录需要账户隔离，登录凭证不能替代每次数据归属校验。模型请求可能耗时，因此还需限制单用户调用频率与全局并发。已有实现默认每人每天最多</w:t>
+      </w:r>
+      <w:r>
+        <w:t>20</w:t>
+      </w:r>
+      <w:r>
+        <w:t>次、全局同时最多</w:t>
+      </w:r>
+      <w:r>
+        <w:t>3</w:t>
+      </w:r>
+      <w:r>
+        <w:t>次，但该计数保存在应用进程中，若部署多个进程，应改为共享计数。页面提供中文桌面工作台；当前需求不包含独立移动端应用。</w:t>
+      </w:r>
+    </w:p>
+    <w:p>
+      <w:pPr>
+        <w:pStyle w:val="1"/>
         <w:rPr>
-          <w:lang w:eastAsia="zh-CN"/>
+          <w:rFonts w:hint="eastAsia"/>
         </w:rPr>
-        <w:t>(2</w:t>
-      </w:r>
-      <w:proofErr w:type="gramStart"/>
-      <w:r>
-        <w:rPr>
-          <w:lang w:eastAsia="zh-CN"/>
-        </w:rPr>
-        <w:t>) 业务</w:t>
-      </w:r>
-      <w:proofErr w:type="gramEnd"/>
-      <w:r>
-        <w:rPr>
-          <w:lang w:eastAsia="zh-CN"/>
-        </w:rPr>
-        <w:t>需求分析。一次错题分析应先确认错题归属，再控制调用次数，随后组织模型输入、检查输出并保存结果。系统需要对同一道错题的重复并发分析作限制；对模型不可用或格式错误的情况记录失败状态，避免页面显示虚假的成功。查询分析历史时仍要按当前账户核对错题归属。知识点应与错题关联，便于以后按主题回看。</w:t>
-      </w:r>
+      </w:pPr>
+      <w:bookmarkStart w:id="2" w:name="_Toc243983924"/>
+      <w:r>
+        <w:lastRenderedPageBreak/>
+        <w:t>3</w:t>
+      </w:r>
+      <w:r>
+        <w:t>系统设计</w:t>
+      </w:r>
+      <w:bookmarkEnd w:id="2"/>
     </w:p>
     <w:p>
       <w:pPr>
         <w:ind w:firstLine="0"/>
         <w:rPr>
           <w:rFonts w:hint="eastAsia"/>
-          <w:lang w:eastAsia="zh-CN"/>
         </w:rPr>
       </w:pPr>
       <w:r>
+        <w:t>（</w:t>
+      </w:r>
+      <w:r>
+        <w:t>1</w:t>
+      </w:r>
+      <w:r>
+        <w:t>）</w:t>
+      </w:r>
+      <w:r>
+        <w:t xml:space="preserve"> </w:t>
+      </w:r>
+      <w:r>
+        <w:t>总体结构。浏览器页面接收错题材料并展示历史记录；</w:t>
+      </w:r>
+      <w:r>
+        <w:t>Spring Boot</w:t>
+      </w:r>
+      <w:r>
+        <w:t>后端根据登录身份检查数据归属，再处理错题和解析请求；</w:t>
+      </w:r>
+      <w:r>
+        <w:t>MySQL</w:t>
+      </w:r>
+      <w:r>
+        <w:t>保存用户、错题、解析、知识点及复习记录。</w:t>
+      </w:r>
+      <w:r>
+        <w:t>Spring Boot</w:t>
+      </w:r>
+      <w:r>
+        <w:t>承担应用启动、接口接入和配置管理</w:t>
+      </w:r>
+      <w:r>
         <w:rPr>
-          <w:lang w:eastAsia="zh-CN"/>
+          <w:vertAlign w:val="superscript"/>
         </w:rPr>
-        <w:t>(3</w:t>
-      </w:r>
-      <w:proofErr w:type="gramStart"/>
+        <w:t>[5]</w:t>
+      </w:r>
+      <w:r>
+        <w:t>。默认模型服务为本机</w:t>
+      </w:r>
+      <w:r>
+        <w:t>Ollama</w:t>
+      </w:r>
+      <w:r>
+        <w:t>，其聊天接口接收模型名称与消息内容并返回生成信息</w:t>
+      </w:r>
       <w:r>
         <w:rPr>
-          <w:lang w:eastAsia="zh-CN"/>
+          <w:vertAlign w:val="superscript"/>
         </w:rPr>
-        <w:t>) 非</w:t>
-      </w:r>
-      <w:proofErr w:type="gramEnd"/>
-      <w:r>
-        <w:rPr>
-          <w:lang w:eastAsia="zh-CN"/>
-        </w:rPr>
-        <w:t>功能需求分析。个人代码和学习记录需要账户隔离，登录凭证不能替代每次数据归属校验。模型请求可能耗时，因此还需限制单用户调用频率与全局并发。已有实现默认每人每天最多20次、全局同时最多3次，但该计数保存在应用进程中，若部署多个进程，应改为共享计数。页面提供中文桌面工作台；当前需求不包含独立移动端应用。</w:t>
-      </w:r>
-    </w:p>
-    <w:p>
-      <w:pPr>
-        <w:pStyle w:val="aff9"/>
-        <w:rPr>
-          <w:rFonts w:hint="eastAsia"/>
-          <w:lang w:eastAsia="zh-CN"/>
-        </w:rPr>
-      </w:pPr>
-      <w:proofErr w:type="gramStart"/>
-      <w:r>
-        <w:rPr>
-          <w:lang w:eastAsia="zh-CN"/>
-        </w:rPr>
-        <w:t>3 系统</w:t>
-      </w:r>
-      <w:proofErr w:type="gramEnd"/>
-      <w:r>
-        <w:rPr>
-          <w:lang w:eastAsia="zh-CN"/>
-        </w:rPr>
-        <w:t>设计</w:t>
+        <w:t>[6]</w:t>
+      </w:r>
+      <w:r>
+        <w:t>；配置项也允许切换到兼容接口。</w:t>
       </w:r>
     </w:p>
     <w:p>
@@ -382,76 +1203,31 @@
         <w:ind w:firstLine="0"/>
         <w:rPr>
           <w:rFonts w:hint="eastAsia"/>
-          <w:lang w:eastAsia="zh-CN"/>
         </w:rPr>
       </w:pPr>
       <w:r>
-        <w:rPr>
-          <w:lang w:eastAsia="zh-CN"/>
-        </w:rPr>
-        <w:t>(1</w:t>
-      </w:r>
-      <w:proofErr w:type="gramStart"/>
-      <w:r>
-        <w:rPr>
-          <w:lang w:eastAsia="zh-CN"/>
-        </w:rPr>
-        <w:t>) 总体</w:t>
-      </w:r>
-      <w:proofErr w:type="gramEnd"/>
-      <w:r>
-        <w:rPr>
-          <w:lang w:eastAsia="zh-CN"/>
-        </w:rPr>
-        <w:t>结构。浏览器页面接收错题材料并展示历史记录；Spring Boot后端根据登录身份检查数据归属，再处理错题和解析请求；MySQL保存用户、错题、解析、知识点及复习记录。Spring Boot承担应用启动、接口接入和配置管理</w:t>
+        <w:t>（</w:t>
+      </w:r>
+      <w:r>
+        <w:t>2</w:t>
+      </w:r>
+      <w:r>
+        <w:t>）</w:t>
+      </w:r>
+      <w:r>
+        <w:t xml:space="preserve"> </w:t>
+      </w:r>
+      <w:r>
+        <w:t>数据结构。用户表与错题表形成一对多关系，错题表保存题目、编程语言、代码及错误上下文。解析结果表保存七项结构化内容，分析记录表保存请求和原始响应，二者分开后既能快速展示，也能追查生成过程。知识点表与错题之间通过关联表建立多对多关系。复习状态表记录连续记住次数和下次日期，复习明细表保存每次选择。数据库通过主键、索引与外键保持关联数据的一致性；外键在删除相关记录时的行为由建表约束确定</w:t>
       </w:r>
       <w:r>
         <w:rPr>
           <w:vertAlign w:val="superscript"/>
-          <w:lang w:eastAsia="zh-CN"/>
         </w:rPr>
-        <w:t>[5]</w:t>
-      </w:r>
-      <w:r>
-        <w:rPr>
-          <w:lang w:eastAsia="zh-CN"/>
-        </w:rPr>
-        <w:t>。默认模型</w:t>
-      </w:r>
-      <w:r>
-        <w:rPr>
-          <w:lang w:eastAsia="zh-CN"/>
-        </w:rPr>
-        <w:lastRenderedPageBreak/>
-        <w:t>服务为本机Ollama，其聊天接口接收模型名称与消息内容并返回生成信息</w:t>
-      </w:r>
-      <w:r>
-        <w:rPr>
-          <w:vertAlign w:val="superscript"/>
-          <w:lang w:eastAsia="zh-CN"/>
-        </w:rPr>
-        <w:t>[</w:t>
-      </w:r>
-      <w:r>
-        <w:rPr>
-          <w:rFonts w:hint="eastAsia"/>
-          <w:vertAlign w:val="superscript"/>
-          <w:lang w:eastAsia="zh-CN"/>
-        </w:rPr>
-        <w:t>6</w:t>
-      </w:r>
-      <w:r>
-        <w:rPr>
-          <w:vertAlign w:val="superscript"/>
-          <w:lang w:eastAsia="zh-CN"/>
-        </w:rPr>
-        <w:t>]</w:t>
-      </w:r>
-      <w:r>
-        <w:rPr>
-          <w:lang w:eastAsia="zh-CN"/>
-        </w:rPr>
-        <w:t>；配置项也允许切换到兼容接口。</w:t>
+        <w:t>[7]</w:t>
+      </w:r>
+      <w:r>
+        <w:t>。</w:t>
       </w:r>
     </w:p>
     <w:p>
@@ -459,56 +1235,28 @@
         <w:ind w:firstLine="0"/>
         <w:rPr>
           <w:rFonts w:hint="eastAsia"/>
-          <w:lang w:eastAsia="zh-CN"/>
         </w:rPr>
       </w:pPr>
       <w:r>
-        <w:rPr>
-          <w:lang w:eastAsia="zh-CN"/>
-        </w:rPr>
-        <w:t>(2</w:t>
-      </w:r>
-      <w:proofErr w:type="gramStart"/>
-      <w:r>
-        <w:rPr>
-          <w:lang w:eastAsia="zh-CN"/>
-        </w:rPr>
-        <w:t>) 数据</w:t>
-      </w:r>
-      <w:proofErr w:type="gramEnd"/>
-      <w:r>
-        <w:rPr>
-          <w:lang w:eastAsia="zh-CN"/>
-        </w:rPr>
-        <w:t>结构。用户表与错题表形成一对多关系，错题表保存题目、编程语言、代码及错误上下文。解析结果表保存七项结构化内容，分析记录表保存请求和原始响应，二者分开后既能快速展示，也能追查生成过程。知识点表与错题之间通过关联表建立多对多关系。复习状态表记录连续记住次数和下次日期，复习明细表保存每次选择。数据库通过主键、索引与外键保持关联数据的一致性；外键在删除相关记录时的行为由建表约束确定</w:t>
-      </w:r>
-      <w:r>
-        <w:rPr>
-          <w:vertAlign w:val="superscript"/>
-          <w:lang w:eastAsia="zh-CN"/>
-        </w:rPr>
-        <w:t>[</w:t>
-      </w:r>
-      <w:r>
-        <w:rPr>
-          <w:rFonts w:hint="eastAsia"/>
-          <w:vertAlign w:val="superscript"/>
-          <w:lang w:eastAsia="zh-CN"/>
-        </w:rPr>
-        <w:t>7</w:t>
-      </w:r>
-      <w:r>
-        <w:rPr>
-          <w:vertAlign w:val="superscript"/>
-          <w:lang w:eastAsia="zh-CN"/>
-        </w:rPr>
-        <w:t>]</w:t>
-      </w:r>
-      <w:r>
-        <w:rPr>
-          <w:lang w:eastAsia="zh-CN"/>
-        </w:rPr>
-        <w:t>。</w:t>
+        <w:t>（</w:t>
+      </w:r>
+      <w:r>
+        <w:t>3</w:t>
+      </w:r>
+      <w:r>
+        <w:t>）</w:t>
+      </w:r>
+      <w:r>
+        <w:t xml:space="preserve"> </w:t>
+      </w:r>
+      <w:r>
+        <w:t>分析流程。系统先用用户编号和错题编号共同查询目标错题；确认该题未处于分析中且配额可用后，将状态设为分析中。输入模板按题目、代码、报错、实际结果与期望结果分段组织，并明确要求返回固定的</w:t>
+      </w:r>
+      <w:r>
+        <w:t>JSON</w:t>
+      </w:r>
+      <w:r>
+        <w:t>字段。模型响应到达后，程序逐项检查文本字段和知识点数组，拒绝缺失或空值；通过检查的内容在一次数据库处理中保存解析结果、知识点关联和成功记录。若调用或解析失败，则保存失败状态和错误信息。</w:t>
       </w:r>
     </w:p>
     <w:p>
@@ -516,80 +1264,127 @@
         <w:ind w:firstLine="0"/>
         <w:rPr>
           <w:rFonts w:hint="eastAsia"/>
-          <w:lang w:eastAsia="zh-CN"/>
         </w:rPr>
       </w:pPr>
       <w:r>
+        <w:t>（</w:t>
+      </w:r>
+      <w:r>
+        <w:t>4</w:t>
+      </w:r>
+      <w:r>
+        <w:t>）</w:t>
+      </w:r>
+      <w:r>
+        <w:t xml:space="preserve"> </w:t>
+      </w:r>
+      <w:r>
+        <w:t>学习闭环。错题经过分析后，用户可将分析标为准确、不准确或无法判断，并写下依据。这是个人反馈，不等同于专家评分。复习模块记录</w:t>
+      </w:r>
+      <w:r>
+        <w:t>“</w:t>
+      </w:r>
+      <w:r>
+        <w:t>已经记住</w:t>
+      </w:r>
+      <w:r>
+        <w:t>”</w:t>
+      </w:r>
+      <w:r>
+        <w:t>或</w:t>
+      </w:r>
+      <w:r>
+        <w:t>“</w:t>
+      </w:r>
+      <w:r>
+        <w:t>还需练习</w:t>
+      </w:r>
+      <w:r>
+        <w:t>”</w:t>
+      </w:r>
+      <w:r>
+        <w:t>：连续记住时依次安排</w:t>
+      </w:r>
+      <w:r>
+        <w:t>1</w:t>
+      </w:r>
+      <w:r>
+        <w:t>、</w:t>
+      </w:r>
+      <w:r>
+        <w:t>3</w:t>
+      </w:r>
+      <w:r>
+        <w:t>、</w:t>
+      </w:r>
+      <w:r>
+        <w:t>7</w:t>
+      </w:r>
+      <w:r>
+        <w:t>、</w:t>
+      </w:r>
+      <w:r>
+        <w:t>14</w:t>
+      </w:r>
+      <w:r>
+        <w:t>、</w:t>
+      </w:r>
+      <w:r>
+        <w:t>30</w:t>
+      </w:r>
+      <w:r>
+        <w:t>天后的回顾，忘记时重新安排</w:t>
+      </w:r>
+      <w:r>
+        <w:t>1</w:t>
+      </w:r>
+      <w:r>
+        <w:t>天后复习。统计模块按当前账户汇总错题总数、已解析数和分析次数，帮助用户发现尚未处理的记录。</w:t>
+      </w:r>
+    </w:p>
+    <w:p>
+      <w:pPr>
+        <w:pStyle w:val="1"/>
         <w:rPr>
-          <w:lang w:eastAsia="zh-CN"/>
+          <w:rFonts w:hint="eastAsia"/>
         </w:rPr>
-        <w:t>(3</w:t>
-      </w:r>
-      <w:proofErr w:type="gramStart"/>
-      <w:r>
-        <w:rPr>
-          <w:lang w:eastAsia="zh-CN"/>
-        </w:rPr>
-        <w:t>) 分析</w:t>
-      </w:r>
-      <w:proofErr w:type="gramEnd"/>
-      <w:r>
-        <w:rPr>
-          <w:lang w:eastAsia="zh-CN"/>
-        </w:rPr>
-        <w:t>流程。系统先用用户编号和错题编号共同查询目标错题；确认该题未处于分析中且配额可用后，将状态设为分析中。输入模板按题目、代码、报错、实际结果与期望结果分段组织，并明确要求返回固定的JSON字段。模型响应到达后，程序逐项检查文本字段和知识点数组，拒绝缺失或空值；通过检查的内容在一次数据库处理中保存解析结果、知识点关联和成功记录。若调用或解析失败，则保存失败状态和错误信息。</w:t>
-      </w:r>
+      </w:pPr>
+      <w:bookmarkStart w:id="3" w:name="_Toc243983925"/>
+      <w:r>
+        <w:t>4</w:t>
+      </w:r>
+      <w:r>
+        <w:t>系统实现</w:t>
+      </w:r>
+      <w:bookmarkEnd w:id="3"/>
     </w:p>
     <w:p>
       <w:pPr>
         <w:ind w:firstLine="0"/>
         <w:rPr>
           <w:rFonts w:hint="eastAsia"/>
-          <w:lang w:eastAsia="zh-CN"/>
         </w:rPr>
       </w:pPr>
       <w:r>
-        <w:rPr>
-          <w:lang w:eastAsia="zh-CN"/>
-        </w:rPr>
-        <w:t>(4</w:t>
-      </w:r>
-      <w:proofErr w:type="gramStart"/>
-      <w:r>
-        <w:rPr>
-          <w:lang w:eastAsia="zh-CN"/>
-        </w:rPr>
-        <w:t>) 学习</w:t>
-      </w:r>
-      <w:proofErr w:type="gramEnd"/>
-      <w:r>
-        <w:rPr>
-          <w:lang w:eastAsia="zh-CN"/>
-        </w:rPr>
-        <w:t>闭环。错题经过分析后，用户可将分析标为准确、不准确或无法判断，并写下依据。这是个人反馈，不等同于专家评分。复习模块记录“已经记住”或“还需练习”：连续记住时依次安排1、3、7、14、30天后的回顾，忘记时重新安排1天后复习。统计模块按当前账户汇总错题总数、已解析数和分析次数，帮助用户发现尚未处理的记录。</w:t>
-      </w:r>
-    </w:p>
-    <w:p>
-      <w:pPr>
-        <w:pStyle w:val="aff9"/>
-        <w:rPr>
-          <w:rFonts w:hint="eastAsia"/>
-          <w:lang w:eastAsia="zh-CN"/>
-        </w:rPr>
-      </w:pPr>
-      <w:proofErr w:type="gramStart"/>
-      <w:r>
-        <w:rPr>
-          <w:lang w:eastAsia="zh-CN"/>
-        </w:rPr>
-        <w:t>4 系统</w:t>
-      </w:r>
-      <w:proofErr w:type="gramEnd"/>
-      <w:r>
-        <w:rPr>
-          <w:lang w:eastAsia="zh-CN"/>
-        </w:rPr>
-        <w:t>实现</w:t>
+        <w:t>（</w:t>
+      </w:r>
+      <w:r>
+        <w:t>1</w:t>
+      </w:r>
+      <w:r>
+        <w:t>）</w:t>
+      </w:r>
+      <w:r>
+        <w:t xml:space="preserve"> </w:t>
+      </w:r>
+      <w:r>
+        <w:t>账户与错题操作。后端使用</w:t>
+      </w:r>
+      <w:r>
+        <w:t>Spring Security</w:t>
+      </w:r>
+      <w:r>
+        <w:t>检查访问权限，登录后签发携带身份信息的令牌；受保护接口先验证令牌，再按当前用户编号筛选数据。错题新增接口校验必填内容，查询接口支持分页和条件搜索，编辑与删除前再次校验归属。这样的双重检查使页面隐藏其他用户数据之外，后端也不会因为直接访问编号而返回别人的记录。</w:t>
       </w:r>
     </w:p>
     <w:p>
@@ -597,28 +1392,156 @@
         <w:ind w:firstLine="0"/>
         <w:rPr>
           <w:rFonts w:hint="eastAsia"/>
-          <w:lang w:eastAsia="zh-CN"/>
         </w:rPr>
       </w:pPr>
       <w:r>
+        <w:t>（</w:t>
+      </w:r>
+      <w:r>
+        <w:t>2</w:t>
+      </w:r>
+      <w:r>
+        <w:t>）</w:t>
+      </w:r>
+      <w:r>
+        <w:t xml:space="preserve"> </w:t>
+      </w:r>
+      <w:r>
+        <w:t>解析内容生成。</w:t>
+      </w:r>
+      <w:r>
+        <w:t>PromptService</w:t>
+      </w:r>
+      <w:r>
+        <w:t>把错题上下文写入统一模板，并说明题目及代码属于待分析数据，不能把其中的命令当作新指令执行。模板要求模型生成错误类型、位置、原因、建议、完整参考代码、</w:t>
+      </w:r>
+      <w:r>
+        <w:t>1</w:t>
+      </w:r>
+      <w:r>
+        <w:t>至</w:t>
+      </w:r>
+      <w:r>
+        <w:t>6</w:t>
+      </w:r>
+      <w:r>
+        <w:t>个知识点及学习建议。</w:t>
+      </w:r>
+      <w:r>
+        <w:lastRenderedPageBreak/>
+        <w:t>DeepSeekClient</w:t>
+      </w:r>
+      <w:r>
+        <w:t>调用配置的模型接口；</w:t>
+      </w:r>
+      <w:r>
+        <w:t>AiResultParser</w:t>
+      </w:r>
+      <w:r>
+        <w:t>检查返回字段的类型、非空要求和长度限制，</w:t>
+      </w:r>
+      <w:r>
+        <w:t>AnalysisService</w:t>
+      </w:r>
+      <w:r>
+        <w:t>再保存通过检查的内容。字段检查保证结果能够展示，原因是否正确仍需结合原题判断。</w:t>
+      </w:r>
+    </w:p>
+    <w:p>
+      <w:pPr>
         <w:rPr>
-          <w:lang w:eastAsia="zh-CN"/>
+          <w:rFonts w:hint="eastAsia"/>
         </w:rPr>
-        <w:t>(1</w:t>
-      </w:r>
-      <w:proofErr w:type="gramStart"/>
+      </w:pPr>
+      <w:r>
+        <w:t>实验目录中的候选案例</w:t>
+      </w:r>
+      <w:r>
+        <w:t>ICJ-003</w:t>
+      </w:r>
+      <w:r>
+        <w:t>提供了一个具体输入：随附测试将</w:t>
+      </w:r>
+      <w:r>
+        <w:t>A</w:t>
+      </w:r>
+      <w:r>
+        <w:t>、</w:t>
+      </w:r>
+      <w:r>
+        <w:t>B</w:t>
+      </w:r>
+      <w:r>
+        <w:t>、</w:t>
+      </w:r>
+      <w:r>
+        <w:t>C</w:t>
+      </w:r>
+      <w:r>
+        <w:t>、</w:t>
+      </w:r>
+      <w:r>
+        <w:t>D</w:t>
+      </w:r>
+      <w:r>
+        <w:t>档阈值依次设为</w:t>
+      </w:r>
+      <w:r>
+        <w:t>80</w:t>
+      </w:r>
+      <w:r>
+        <w:t>、</w:t>
+      </w:r>
+      <w:r>
+        <w:t>70</w:t>
+      </w:r>
+      <w:r>
+        <w:t>、</w:t>
+      </w:r>
+      <w:r>
+        <w:t>60</w:t>
+      </w:r>
+      <w:r>
+        <w:t>、</w:t>
+      </w:r>
+      <w:r>
+        <w:t>50</w:t>
+      </w:r>
+      <w:r>
+        <w:t>，成绩</w:t>
+      </w:r>
+      <w:r>
+        <w:t>45</w:t>
+      </w:r>
+      <w:r>
+        <w:t>的预期输出为不及格；候选源码只处理</w:t>
+      </w:r>
+      <w:r>
+        <w:t>A</w:t>
+      </w:r>
+      <w:r>
+        <w:t>至</w:t>
+      </w:r>
+      <w:r>
+        <w:t>D</w:t>
+      </w:r>
+      <w:r>
+        <w:t>档，缺少低于</w:t>
+      </w:r>
+      <w:r>
+        <w:t>D</w:t>
+      </w:r>
+      <w:r>
+        <w:t>档时的输出分支</w:t>
+      </w:r>
       <w:r>
         <w:rPr>
-          <w:lang w:eastAsia="zh-CN"/>
+          <w:vertAlign w:val="superscript"/>
         </w:rPr>
-        <w:t>) 账户</w:t>
-      </w:r>
-      <w:proofErr w:type="gramEnd"/>
-      <w:r>
-        <w:rPr>
-          <w:lang w:eastAsia="zh-CN"/>
-        </w:rPr>
-        <w:t>与错题操作。后端使用Spring Security检查访问权限，登录后签发携带身份信息的令牌；受保护接口先验证令牌，再按当前用户编号筛选数据。错题新增接口校验必填内容，查询接口支持分页和条件搜索，编辑与删除前再次校验归属。这样的双重检查使页面隐藏其他用户数据之外，后端也不会因为直接访问编号而返回别人的记录。</w:t>
+        <w:t>[8]</w:t>
+      </w:r>
+      <w:r>
+        <w:t>。录入此题时，可分别保存题目、源码、测试输入、实际输出和预期的不及格提示。后端将这些字段交给模型，并把生成的原因和建议留给用户核验；本例的源码与测试说明输入如何组织，不充当模型回答正确的证据。</w:t>
       </w:r>
     </w:p>
     <w:p>
@@ -626,118 +1549,28 @@
         <w:ind w:firstLine="0"/>
         <w:rPr>
           <w:rFonts w:hint="eastAsia"/>
-          <w:lang w:eastAsia="zh-CN"/>
         </w:rPr>
       </w:pPr>
       <w:r>
-        <w:rPr>
-          <w:lang w:eastAsia="zh-CN"/>
-        </w:rPr>
-        <w:t>(2</w:t>
-      </w:r>
-      <w:proofErr w:type="gramStart"/>
-      <w:r>
-        <w:rPr>
-          <w:lang w:eastAsia="zh-CN"/>
-        </w:rPr>
-        <w:t>) 解析</w:t>
-      </w:r>
-      <w:proofErr w:type="gramEnd"/>
-      <w:r>
-        <w:rPr>
-          <w:lang w:eastAsia="zh-CN"/>
-        </w:rPr>
-        <w:t>内容生成。</w:t>
-      </w:r>
-      <w:proofErr w:type="spellStart"/>
-      <w:r>
-        <w:rPr>
-          <w:lang w:eastAsia="zh-CN"/>
-        </w:rPr>
-        <w:t>PromptService</w:t>
-      </w:r>
-      <w:proofErr w:type="spellEnd"/>
-      <w:r>
-        <w:rPr>
-          <w:lang w:eastAsia="zh-CN"/>
-        </w:rPr>
-        <w:t>把错题上下文写入统一模板，并说明题目及代码属于待分析数据，不能把其中的命令当作新指令执行。模板要求模型生成错误类型、位置、原因、建议、完整参考代码、1至6个知识点及学习建议。</w:t>
-      </w:r>
-      <w:proofErr w:type="spellStart"/>
-      <w:r>
-        <w:rPr>
-          <w:lang w:eastAsia="zh-CN"/>
-        </w:rPr>
-        <w:t>DeepSeekClient</w:t>
-      </w:r>
-      <w:proofErr w:type="spellEnd"/>
-      <w:r>
-        <w:rPr>
-          <w:lang w:eastAsia="zh-CN"/>
-        </w:rPr>
-        <w:t>调用配置的模型接口；</w:t>
-      </w:r>
-      <w:proofErr w:type="spellStart"/>
-      <w:r>
-        <w:rPr>
-          <w:lang w:eastAsia="zh-CN"/>
-        </w:rPr>
-        <w:t>AiResultParser</w:t>
-      </w:r>
-      <w:proofErr w:type="spellEnd"/>
-      <w:r>
-        <w:rPr>
-          <w:lang w:eastAsia="zh-CN"/>
-        </w:rPr>
-        <w:t>检查返回字段的类型、非空</w:t>
-      </w:r>
-      <w:r>
-        <w:rPr>
-          <w:lang w:eastAsia="zh-CN"/>
-        </w:rPr>
-        <w:lastRenderedPageBreak/>
-        <w:t>要求和长度限制，</w:t>
-      </w:r>
-      <w:proofErr w:type="spellStart"/>
-      <w:r>
-        <w:rPr>
-          <w:lang w:eastAsia="zh-CN"/>
-        </w:rPr>
+        <w:t>（</w:t>
+      </w:r>
+      <w:r>
+        <w:t>3</w:t>
+      </w:r>
+      <w:r>
+        <w:t>）</w:t>
+      </w:r>
+      <w:r>
+        <w:t xml:space="preserve"> </w:t>
+      </w:r>
+      <w:r>
+        <w:t>状态与资源控制。</w:t>
+      </w:r>
+      <w:r>
         <w:t>AnalysisService</w:t>
       </w:r>
-      <w:proofErr w:type="spellEnd"/>
-      <w:r>
-        <w:rPr>
-          <w:lang w:eastAsia="zh-CN"/>
-        </w:rPr>
-        <w:t>再保存通过检查的内容。字段检查保证结果能够展示，原因是否正确仍需结合原题判断。</w:t>
-      </w:r>
-    </w:p>
-    <w:p>
-      <w:pPr>
-        <w:rPr>
-          <w:rFonts w:hint="eastAsia"/>
-          <w:lang w:eastAsia="zh-CN"/>
-        </w:rPr>
-      </w:pPr>
-      <w:r>
-        <w:rPr>
-          <w:lang w:eastAsia="zh-CN"/>
-        </w:rPr>
-        <w:t>实验目录中的候选案例ICJ-003提供了一个具体输入：随附测试将A、B、C、D档阈值依次设为80、70、60、50，成绩45的预期输出为不及格；候选源码只处理A至D档，缺少低于D档时的输出分支</w:t>
-      </w:r>
-      <w:r>
-        <w:rPr>
-          <w:vertAlign w:val="superscript"/>
-          <w:lang w:eastAsia="zh-CN"/>
-        </w:rPr>
-        <w:t>[8]</w:t>
-      </w:r>
-      <w:r>
-        <w:rPr>
-          <w:lang w:eastAsia="zh-CN"/>
-        </w:rPr>
-        <w:t>。录入此题时，可分别保存题目、源码、测试输入、实际输出和预期的不及格提示。后端将这些字段交给模型，并把生成的原因和建议留给用户核验；本例的源码与测试说明输入如何组织，不充当模型回答正确的证据。</w:t>
+      <w:r>
+        <w:t>在模型调用前以数据库条件更新争取分析资格，避免同一道错题被重复处理；调用时获取配额许可，结束后释放。模型返回后，结果、知识点关系和成功记录在同一次处理事务中写入。发生异常时系统记录失败并向页面返回服务不可用信息，用户可以稍后重试。分析历史保留多次解析，以便比较不同时间的回答。</w:t>
       </w:r>
     </w:p>
     <w:p>
@@ -745,108 +1578,109 @@
         <w:ind w:firstLine="0"/>
         <w:rPr>
           <w:rFonts w:hint="eastAsia"/>
-          <w:lang w:eastAsia="zh-CN"/>
         </w:rPr>
       </w:pPr>
       <w:r>
+        <w:t>（</w:t>
+      </w:r>
+      <w:r>
+        <w:t>4</w:t>
+      </w:r>
+      <w:r>
+        <w:t>）</w:t>
+      </w:r>
+      <w:r>
+        <w:t xml:space="preserve"> </w:t>
+      </w:r>
+      <w:r>
+        <w:t>复习与展示。</w:t>
+      </w:r>
+      <w:r>
+        <w:t>ReviewService</w:t>
+      </w:r>
+      <w:r>
+        <w:t>查询当前账户待复习的错题，写入复习明细并更新下一次日期；对尚未到期的重复提交返回冲突信息。浏览器工作台把原题、模型解释、参考代码、人工判断和复习入口放在连续操作路径中。页面显示的参考代码不会由应用自动编译或运行，因此用户应结合题目要求和测试结果决定是否采纳。</w:t>
+      </w:r>
+    </w:p>
+    <w:p>
+      <w:pPr>
+        <w:pStyle w:val="1"/>
         <w:rPr>
-          <w:lang w:eastAsia="zh-CN"/>
+          <w:rFonts w:hint="eastAsia"/>
         </w:rPr>
-        <w:t>(3</w:t>
-      </w:r>
-      <w:proofErr w:type="gramStart"/>
-      <w:r>
-        <w:rPr>
-          <w:lang w:eastAsia="zh-CN"/>
-        </w:rPr>
-        <w:t>) 状态</w:t>
-      </w:r>
-      <w:proofErr w:type="gramEnd"/>
-      <w:r>
-        <w:rPr>
-          <w:lang w:eastAsia="zh-CN"/>
-        </w:rPr>
-        <w:t>与资源控制。</w:t>
-      </w:r>
-      <w:proofErr w:type="spellStart"/>
-      <w:r>
-        <w:rPr>
-          <w:lang w:eastAsia="zh-CN"/>
-        </w:rPr>
-        <w:t>AnalysisService</w:t>
-      </w:r>
-      <w:proofErr w:type="spellEnd"/>
-      <w:r>
-        <w:rPr>
-          <w:lang w:eastAsia="zh-CN"/>
-        </w:rPr>
-        <w:t>在模型调用前以数据库条件更新争取分析资格，避免同一道错题被重复处理；调用时获取配额许可，结束后释放。模型返回后，结果、知识点关系和成功记录在同一次处理事务中写入。发生异常时系统记录失败并向页面返回服务不可用信息，用户可以稍后重试。分析历史保留多次解析，以便比较不同时间的回答。</w:t>
-      </w:r>
+      </w:pPr>
+      <w:bookmarkStart w:id="4" w:name="_Toc243983926"/>
+      <w:r>
+        <w:t>5</w:t>
+      </w:r>
+      <w:r>
+        <w:t>结果与讨论</w:t>
+      </w:r>
+      <w:bookmarkEnd w:id="4"/>
     </w:p>
     <w:p>
       <w:pPr>
         <w:ind w:firstLine="0"/>
         <w:rPr>
           <w:rFonts w:hint="eastAsia"/>
-          <w:lang w:eastAsia="zh-CN"/>
         </w:rPr>
       </w:pPr>
       <w:r>
-        <w:rPr>
-          <w:lang w:eastAsia="zh-CN"/>
-        </w:rPr>
-        <w:t>(4</w:t>
-      </w:r>
-      <w:proofErr w:type="gramStart"/>
-      <w:r>
-        <w:rPr>
-          <w:lang w:eastAsia="zh-CN"/>
-        </w:rPr>
-        <w:t>) 复习</w:t>
-      </w:r>
-      <w:proofErr w:type="gramEnd"/>
-      <w:r>
-        <w:rPr>
-          <w:lang w:eastAsia="zh-CN"/>
-        </w:rPr>
-        <w:t>与展示。</w:t>
-      </w:r>
-      <w:proofErr w:type="spellStart"/>
-      <w:r>
-        <w:rPr>
-          <w:lang w:eastAsia="zh-CN"/>
-        </w:rPr>
-        <w:t>ReviewService</w:t>
-      </w:r>
-      <w:proofErr w:type="spellEnd"/>
-      <w:r>
-        <w:rPr>
-          <w:lang w:eastAsia="zh-CN"/>
-        </w:rPr>
-        <w:t>查询当前账户待复习的错题，写入复习明细并更新下一次日期；对尚未到期的重复提交返回冲突信息。浏览器工作台把原题、模型解释、参考代码、人工判断和复习入口放在连续操作路径中。页面显示的参考代码不会由应用自动编译或运行，因此用户应结合题目要求和测试结果决定是否采纳。</w:t>
-      </w:r>
-    </w:p>
-    <w:p>
-      <w:pPr>
-        <w:pStyle w:val="aff9"/>
-        <w:rPr>
-          <w:rFonts w:hint="eastAsia"/>
-          <w:lang w:eastAsia="zh-CN"/>
-        </w:rPr>
-      </w:pPr>
-      <w:proofErr w:type="gramStart"/>
-      <w:r>
-        <w:rPr>
-          <w:lang w:eastAsia="zh-CN"/>
-        </w:rPr>
-        <w:t>5 结果</w:t>
-      </w:r>
-      <w:proofErr w:type="gramEnd"/>
-      <w:r>
-        <w:rPr>
-          <w:lang w:eastAsia="zh-CN"/>
-        </w:rPr>
-        <w:t>与讨论</w:t>
+        <w:t>（</w:t>
+      </w:r>
+      <w:r>
+        <w:t>1</w:t>
+      </w:r>
+      <w:r>
+        <w:t>）</w:t>
+      </w:r>
+      <w:r>
+        <w:t xml:space="preserve"> </w:t>
+      </w:r>
+      <w:r>
+        <w:t>功能验证。</w:t>
+      </w:r>
+      <w:r>
+        <w:t>2026</w:t>
+      </w:r>
+      <w:r>
+        <w:t>年</w:t>
+      </w:r>
+      <w:r>
+        <w:t>10</w:t>
+      </w:r>
+      <w:r>
+        <w:t>月</w:t>
+      </w:r>
+      <w:r>
+        <w:t>26</w:t>
+      </w:r>
+      <w:r>
+        <w:t>日在项目当前检出版本执行</w:t>
+      </w:r>
+      <w:r>
+        <w:t>mvn -q test</w:t>
+      </w:r>
+      <w:r>
+        <w:t>，测试报告记录</w:t>
+      </w:r>
+      <w:r>
+        <w:t>16</w:t>
+      </w:r>
+      <w:r>
+        <w:t>项测试、</w:t>
+      </w:r>
+      <w:r>
+        <w:t>0</w:t>
+      </w:r>
+      <w:r>
+        <w:t>项失败、</w:t>
+      </w:r>
+      <w:r>
+        <w:t>0</w:t>
+      </w:r>
+      <w:r>
+        <w:t>项错误。测试涉及账户控制、登录限制、登录凭证、模型客户端、调用配额、复习规则和异常响应。源码中还可查到错题、解析、反馈及知识点的接口与数据表。上述证据支持已覆盖功能的实现结论。</w:t>
       </w:r>
     </w:p>
     <w:p>
@@ -854,42 +1688,61 @@
         <w:ind w:firstLine="0"/>
         <w:rPr>
           <w:rFonts w:hint="eastAsia"/>
-          <w:lang w:eastAsia="zh-CN"/>
         </w:rPr>
       </w:pPr>
       <w:r>
+        <w:t>（</w:t>
+      </w:r>
+      <w:r>
+        <w:t>2</w:t>
+      </w:r>
+      <w:r>
+        <w:t>）</w:t>
+      </w:r>
+      <w:r>
+        <w:t xml:space="preserve"> </w:t>
+      </w:r>
+      <w:r>
+        <w:t>解析效果证据。项目实验目录保存来自</w:t>
+      </w:r>
+      <w:r>
+        <w:t>IntroClassJava</w:t>
+      </w:r>
+      <w:r>
+        <w:t>的</w:t>
+      </w:r>
+      <w:r>
+        <w:t>150</w:t>
+      </w:r>
+      <w:r>
+        <w:t>条候选</w:t>
+      </w:r>
+      <w:r>
+        <w:t>Java</w:t>
+      </w:r>
+      <w:r>
+        <w:t>案例及两种提示词设置的</w:t>
+      </w:r>
+      <w:r>
+        <w:t>300</w:t>
+      </w:r>
+      <w:r>
+        <w:t>行评分表。该公开数据集提供带错误的</w:t>
+      </w:r>
+      <w:r>
+        <w:t>Java</w:t>
+      </w:r>
+      <w:r>
+        <w:t>程序，适合作为可追溯的候选来源</w:t>
+      </w:r>
+      <w:r>
         <w:rPr>
-          <w:lang w:eastAsia="zh-CN"/>
+          <w:vertAlign w:val="superscript"/>
         </w:rPr>
-        <w:t>(1</w:t>
-      </w:r>
-      <w:proofErr w:type="gramStart"/>
-      <w:r>
-        <w:rPr>
-          <w:lang w:eastAsia="zh-CN"/>
-        </w:rPr>
-        <w:t>) 功能</w:t>
-      </w:r>
-      <w:proofErr w:type="gramEnd"/>
-      <w:r>
-        <w:rPr>
-          <w:lang w:eastAsia="zh-CN"/>
-        </w:rPr>
-        <w:t>验证。2026年10月26日在项目当前检出版本执行</w:t>
-      </w:r>
-      <w:proofErr w:type="spellStart"/>
-      <w:r>
-        <w:rPr>
-          <w:lang w:eastAsia="zh-CN"/>
-        </w:rPr>
-        <w:t>mvn</w:t>
-      </w:r>
-      <w:proofErr w:type="spellEnd"/>
-      <w:r>
-        <w:rPr>
-          <w:lang w:eastAsia="zh-CN"/>
-        </w:rPr>
-        <w:t xml:space="preserve"> -q test，测试报告记录16项测试、0项失败、0项错误。测试涉及账户控制、登录限制、登录凭证、模型客户端、调用配额、复习规则和异常响应。源码中还可查到错题、解析、反馈及知识点的接口与数据表。上述证据支持已覆盖功能的实现结论。</w:t>
+        <w:t>[8]</w:t>
+      </w:r>
+      <w:r>
+        <w:t>。</w:t>
       </w:r>
     </w:p>
     <w:p>
@@ -897,115 +1750,48 @@
         <w:ind w:firstLine="0"/>
         <w:rPr>
           <w:rFonts w:hint="eastAsia"/>
-          <w:lang w:eastAsia="zh-CN"/>
         </w:rPr>
       </w:pPr>
       <w:r>
-        <w:rPr>
-          <w:lang w:eastAsia="zh-CN"/>
-        </w:rPr>
-        <w:t>(2</w:t>
-      </w:r>
-      <w:proofErr w:type="gramStart"/>
-      <w:r>
-        <w:rPr>
-          <w:lang w:eastAsia="zh-CN"/>
-        </w:rPr>
-        <w:t>) 解析</w:t>
-      </w:r>
-      <w:proofErr w:type="gramEnd"/>
-      <w:r>
-        <w:rPr>
-          <w:lang w:eastAsia="zh-CN"/>
-        </w:rPr>
-        <w:t>效果证据。项目实验目录保存来自</w:t>
-      </w:r>
-      <w:proofErr w:type="spellStart"/>
-      <w:r>
-        <w:rPr>
-          <w:lang w:eastAsia="zh-CN"/>
-        </w:rPr>
-        <w:t>IntroClassJava</w:t>
-      </w:r>
-      <w:proofErr w:type="spellEnd"/>
-      <w:r>
-        <w:rPr>
-          <w:lang w:eastAsia="zh-CN"/>
-        </w:rPr>
-        <w:t>的150条候选Java案例及两种提示词设置的300行评分表。该公开数据集提供带错误的Java程序，适合作为可追溯的候选来源</w:t>
-      </w:r>
-      <w:r>
-        <w:rPr>
-          <w:vertAlign w:val="superscript"/>
-          <w:lang w:eastAsia="zh-CN"/>
-        </w:rPr>
-        <w:t>[8]</w:t>
-      </w:r>
-      <w:r>
-        <w:rPr>
-          <w:lang w:eastAsia="zh-CN"/>
-        </w:rPr>
-        <w:t>。</w:t>
+        <w:t>（</w:t>
+      </w:r>
+      <w:r>
+        <w:t>3</w:t>
+      </w:r>
+      <w:r>
+        <w:t>）</w:t>
+      </w:r>
+      <w:r>
+        <w:t xml:space="preserve"> </w:t>
+      </w:r>
+      <w:r>
+        <w:t>后续验证。评价将固定模型版本与案例集合，分别记录错误原因、修改建议、知识点和参考代码的人工判断；参考代码需要在隔离环境中运行对应测试。报告各项结果时应给出实际完成评分的分母。公开案例可能与模型训练材料重合，因而还需加入真实课程错题，检验结论在日常学习材料上是否成立。</w:t>
       </w:r>
     </w:p>
     <w:p>
       <w:pPr>
-        <w:ind w:firstLine="0"/>
+        <w:pStyle w:val="1"/>
         <w:rPr>
           <w:rFonts w:hint="eastAsia"/>
-          <w:lang w:eastAsia="zh-CN"/>
         </w:rPr>
       </w:pPr>
-      <w:r>
-        <w:rPr>
-          <w:lang w:eastAsia="zh-CN"/>
-        </w:rPr>
-        <w:t>(3</w:t>
-      </w:r>
-      <w:proofErr w:type="gramStart"/>
-      <w:r>
-        <w:rPr>
-          <w:lang w:eastAsia="zh-CN"/>
-        </w:rPr>
-        <w:t>) 后续</w:t>
-      </w:r>
-      <w:proofErr w:type="gramEnd"/>
-      <w:r>
-        <w:rPr>
-          <w:lang w:eastAsia="zh-CN"/>
-        </w:rPr>
-        <w:t>验证。评价将固定模型版本与案例集合，分别记录错误原因、修改建议、知识点和参考代码的人工判断；参考代码需要在隔离环境中运行对应测试。报告各项结果时应给出实际完成评分的分母。公开案例可能与模型训练材料重合，因而还需加入真实课程错题，检验结论在日常学习材料上是否成立。</w:t>
-      </w:r>
-    </w:p>
-    <w:p>
-      <w:pPr>
-        <w:pStyle w:val="aff9"/>
-        <w:rPr>
-          <w:rFonts w:hint="eastAsia"/>
-          <w:lang w:eastAsia="zh-CN"/>
-        </w:rPr>
-      </w:pPr>
-      <w:proofErr w:type="gramStart"/>
-      <w:r>
-        <w:rPr>
-          <w:lang w:eastAsia="zh-CN"/>
-        </w:rPr>
-        <w:lastRenderedPageBreak/>
-        <w:t>6 结论</w:t>
-      </w:r>
-      <w:proofErr w:type="gramEnd"/>
+      <w:bookmarkStart w:id="5" w:name="_Toc243983927"/>
+      <w:r>
+        <w:t>6</w:t>
+      </w:r>
+      <w:r>
+        <w:t>结论</w:t>
+      </w:r>
+      <w:bookmarkEnd w:id="5"/>
     </w:p>
     <w:p>
       <w:pPr>
         <w:rPr>
           <w:rFonts w:hint="eastAsia"/>
-          <w:lang w:eastAsia="zh-CN"/>
         </w:rPr>
       </w:pPr>
       <w:r>
-        <w:rPr>
-          <w:lang w:eastAsia="zh-CN"/>
-        </w:rPr>
+        <w:lastRenderedPageBreak/>
         <w:t>系统把原题材料、模型生成解释、人工判断和复习日期关联到同一条错题。账户归属检查、字段校验和调用限额使这些记录能够按用户保存和查看；自动化测试验证了其中已覆盖的业务规则。</w:t>
       </w:r>
     </w:p>
@@ -1013,607 +1799,219 @@
       <w:pPr>
         <w:rPr>
           <w:rFonts w:hint="eastAsia"/>
-          <w:lang w:eastAsia="zh-CN"/>
         </w:rPr>
       </w:pPr>
       <w:r>
-        <w:rPr>
-          <w:lang w:eastAsia="zh-CN"/>
-        </w:rPr>
         <w:t>下一阶段将对候选案例完成原因与建议评分，并在隔离环境中测试参考代码，再使用真实课程错题复核结果。这些工作完成后，才能评价解析内容对学习者的实际帮助。</w:t>
       </w:r>
     </w:p>
     <w:p>
       <w:pPr>
-        <w:pStyle w:val="aff9"/>
-        <w:jc w:val="center"/>
         <w:rPr>
           <w:rFonts w:hint="eastAsia"/>
-          <w:lang w:eastAsia="zh-CN"/>
         </w:rPr>
+        <w:sectPr>
+          <w:headerReference w:type="default" r:id="rId14"/>
+          <w:footerReference w:type="default" r:id="rId15"/>
+          <w:pgSz w:w="11906" w:h="16838"/>
+          <w:pgMar w:top="1417" w:right="1474" w:bottom="1417" w:left="1871" w:header="850" w:footer="850" w:gutter="0"/>
+          <w:pgNumType w:start="1"/>
+          <w:cols w:space="720"/>
+          <w:docGrid w:linePitch="360"/>
+        </w:sectPr>
       </w:pPr>
-      <w:r>
-        <w:rPr>
-          <w:lang w:eastAsia="zh-CN"/>
-        </w:rPr>
-        <w:t>参考文献</w:t>
-      </w:r>
     </w:p>
     <w:p>
       <w:pPr>
-        <w:pStyle w:val="affa"/>
-        <w:spacing w:after="0" w:line="400" w:lineRule="exact"/>
-        <w:jc w:val="both"/>
+        <w:pStyle w:val="1"/>
         <w:rPr>
           <w:rFonts w:hint="eastAsia"/>
-          <w:sz w:val="21"/>
-          <w:szCs w:val="21"/>
-          <w:lang w:eastAsia="zh-CN"/>
         </w:rPr>
       </w:pPr>
-      <w:r>
-        <w:rPr>
-          <w:sz w:val="21"/>
-          <w:szCs w:val="21"/>
-          <w:lang w:eastAsia="zh-CN"/>
-        </w:rPr>
-        <w:t>[1]</w:t>
-      </w:r>
-      <w:proofErr w:type="gramStart"/>
-      <w:r>
-        <w:rPr>
-          <w:sz w:val="21"/>
-          <w:szCs w:val="21"/>
-          <w:lang w:eastAsia="zh-CN"/>
-        </w:rPr>
-        <w:t>唐琳,</w:t>
-      </w:r>
-      <w:proofErr w:type="gramEnd"/>
-      <w:r>
-        <w:rPr>
-          <w:sz w:val="21"/>
-          <w:szCs w:val="21"/>
-          <w:lang w:eastAsia="zh-CN"/>
-        </w:rPr>
-        <w:t xml:space="preserve"> </w:t>
-      </w:r>
-      <w:proofErr w:type="gramStart"/>
-      <w:r>
-        <w:rPr>
-          <w:sz w:val="21"/>
-          <w:szCs w:val="21"/>
-          <w:lang w:eastAsia="zh-CN"/>
-        </w:rPr>
-        <w:t>张佳鑫,</w:t>
-      </w:r>
-      <w:proofErr w:type="gramEnd"/>
-      <w:r>
-        <w:rPr>
-          <w:sz w:val="21"/>
-          <w:szCs w:val="21"/>
-          <w:lang w:eastAsia="zh-CN"/>
-        </w:rPr>
-        <w:t xml:space="preserve"> </w:t>
-      </w:r>
-      <w:proofErr w:type="gramStart"/>
-      <w:r>
-        <w:rPr>
-          <w:sz w:val="21"/>
-          <w:szCs w:val="21"/>
-          <w:lang w:eastAsia="zh-CN"/>
-        </w:rPr>
-        <w:t>徐照光.</w:t>
-      </w:r>
-      <w:proofErr w:type="gramEnd"/>
-      <w:r>
-        <w:rPr>
-          <w:sz w:val="21"/>
-          <w:szCs w:val="21"/>
-          <w:lang w:eastAsia="zh-CN"/>
-        </w:rPr>
-        <w:t xml:space="preserve"> 大语言模型在计算机编程实践课程教学中的应用[J]. 计算机</w:t>
-      </w:r>
-      <w:proofErr w:type="gramStart"/>
-      <w:r>
-        <w:rPr>
-          <w:sz w:val="21"/>
-          <w:szCs w:val="21"/>
-          <w:lang w:eastAsia="zh-CN"/>
-        </w:rPr>
-        <w:t>教育,</w:t>
-      </w:r>
-      <w:proofErr w:type="gramEnd"/>
-      <w:r>
-        <w:rPr>
-          <w:sz w:val="21"/>
-          <w:szCs w:val="21"/>
-          <w:lang w:eastAsia="zh-CN"/>
-        </w:rPr>
-        <w:t xml:space="preserve"> 2025</w:t>
-      </w:r>
-      <w:proofErr w:type="gramStart"/>
-      <w:r>
-        <w:rPr>
-          <w:sz w:val="21"/>
-          <w:szCs w:val="21"/>
-          <w:lang w:eastAsia="zh-CN"/>
-        </w:rPr>
-        <w:t>(2): 97</w:t>
-      </w:r>
-      <w:proofErr w:type="gramEnd"/>
-      <w:r>
-        <w:rPr>
-          <w:sz w:val="21"/>
-          <w:szCs w:val="21"/>
-          <w:lang w:eastAsia="zh-CN"/>
-        </w:rPr>
-        <w:t>-101</w:t>
-      </w:r>
-      <w:proofErr w:type="gramStart"/>
-      <w:r>
-        <w:rPr>
-          <w:sz w:val="21"/>
-          <w:szCs w:val="21"/>
-          <w:lang w:eastAsia="zh-CN"/>
-        </w:rPr>
-        <w:t>, 106</w:t>
-      </w:r>
-      <w:proofErr w:type="gramEnd"/>
-      <w:r>
-        <w:rPr>
-          <w:sz w:val="21"/>
-          <w:szCs w:val="21"/>
-          <w:lang w:eastAsia="zh-CN"/>
-        </w:rPr>
-        <w:t>.</w:t>
-      </w:r>
+      <w:bookmarkStart w:id="6" w:name="_Toc243983928"/>
+      <w:r>
+        <w:lastRenderedPageBreak/>
+        <w:t>参考文献</w:t>
+      </w:r>
+      <w:bookmarkEnd w:id="6"/>
     </w:p>
     <w:p>
       <w:pPr>
-        <w:pStyle w:val="affa"/>
-        <w:spacing w:after="0" w:line="400" w:lineRule="exact"/>
-        <w:jc w:val="both"/>
+        <w:pStyle w:val="affd"/>
         <w:rPr>
           <w:rFonts w:hint="eastAsia"/>
-          <w:sz w:val="21"/>
-          <w:szCs w:val="21"/>
-          <w:lang w:eastAsia="zh-CN"/>
         </w:rPr>
       </w:pPr>
       <w:r>
-        <w:rPr>
-          <w:sz w:val="21"/>
-          <w:szCs w:val="21"/>
-          <w:lang w:eastAsia="zh-CN"/>
-        </w:rPr>
-        <w:t>[2]</w:t>
-      </w:r>
-      <w:proofErr w:type="gramStart"/>
-      <w:r>
-        <w:rPr>
-          <w:sz w:val="21"/>
-          <w:szCs w:val="21"/>
-          <w:lang w:eastAsia="zh-CN"/>
-        </w:rPr>
-        <w:t>陈峥,</w:t>
-      </w:r>
-      <w:proofErr w:type="gramEnd"/>
-      <w:r>
-        <w:rPr>
-          <w:sz w:val="21"/>
-          <w:szCs w:val="21"/>
-          <w:lang w:eastAsia="zh-CN"/>
-        </w:rPr>
-        <w:t xml:space="preserve"> 喻</w:t>
-      </w:r>
-      <w:proofErr w:type="gramStart"/>
-      <w:r>
-        <w:rPr>
-          <w:sz w:val="21"/>
-          <w:szCs w:val="21"/>
-          <w:lang w:eastAsia="zh-CN"/>
-        </w:rPr>
-        <w:t>俊杰.</w:t>
-      </w:r>
-      <w:proofErr w:type="gramEnd"/>
-      <w:r>
-        <w:rPr>
-          <w:sz w:val="21"/>
-          <w:szCs w:val="21"/>
-          <w:lang w:eastAsia="zh-CN"/>
-        </w:rPr>
-        <w:t xml:space="preserve"> 基于LLM的Java编程作业评估与教学实践[J]. 计算机</w:t>
-      </w:r>
-      <w:proofErr w:type="gramStart"/>
-      <w:r>
-        <w:rPr>
-          <w:sz w:val="21"/>
-          <w:szCs w:val="21"/>
-          <w:lang w:eastAsia="zh-CN"/>
-        </w:rPr>
-        <w:t>教育,</w:t>
-      </w:r>
-      <w:proofErr w:type="gramEnd"/>
-      <w:r>
-        <w:rPr>
-          <w:sz w:val="21"/>
-          <w:szCs w:val="21"/>
-          <w:lang w:eastAsia="zh-CN"/>
-        </w:rPr>
-        <w:t xml:space="preserve"> 2026</w:t>
-      </w:r>
-      <w:proofErr w:type="gramStart"/>
-      <w:r>
-        <w:rPr>
-          <w:sz w:val="21"/>
-          <w:szCs w:val="21"/>
-          <w:lang w:eastAsia="zh-CN"/>
-        </w:rPr>
-        <w:t>(6): 198</w:t>
-      </w:r>
-      <w:proofErr w:type="gramEnd"/>
-      <w:r>
-        <w:rPr>
-          <w:sz w:val="21"/>
-          <w:szCs w:val="21"/>
-          <w:lang w:eastAsia="zh-CN"/>
-        </w:rPr>
-        <w:t>-205.</w:t>
+        <w:t>[1]</w:t>
+      </w:r>
+      <w:r>
+        <w:t>唐琳</w:t>
+      </w:r>
+      <w:r>
+        <w:t xml:space="preserve">, </w:t>
+      </w:r>
+      <w:r>
+        <w:t>张佳鑫</w:t>
+      </w:r>
+      <w:r>
+        <w:t xml:space="preserve">, </w:t>
+      </w:r>
+      <w:r>
+        <w:t>徐照光</w:t>
+      </w:r>
+      <w:r>
+        <w:t xml:space="preserve">. </w:t>
+      </w:r>
+      <w:r>
+        <w:t>大语言模型在计算机编程实践课程教学中的应用</w:t>
+      </w:r>
+      <w:r>
+        <w:t xml:space="preserve">[J]. </w:t>
+      </w:r>
+      <w:r>
+        <w:t>计算机教育</w:t>
+      </w:r>
+      <w:r>
+        <w:t>, 2025(2): 97-101, 106.</w:t>
       </w:r>
     </w:p>
     <w:p>
       <w:pPr>
-        <w:pStyle w:val="affa"/>
-        <w:spacing w:after="0" w:line="400" w:lineRule="exact"/>
-        <w:jc w:val="both"/>
+        <w:pStyle w:val="affd"/>
         <w:rPr>
-          <w:rFonts w:ascii="Times New Roman" w:hAnsi="Times New Roman" w:cs="Times New Roman"/>
-          <w:sz w:val="21"/>
-          <w:szCs w:val="21"/>
+          <w:rFonts w:hint="eastAsia"/>
         </w:rPr>
       </w:pPr>
       <w:r>
-        <w:rPr>
-          <w:sz w:val="21"/>
-          <w:szCs w:val="21"/>
-          <w:lang w:eastAsia="zh-CN"/>
-        </w:rPr>
-        <w:t>[</w:t>
-      </w:r>
-      <w:proofErr w:type="gramStart"/>
-      <w:r>
-        <w:rPr>
-          <w:sz w:val="21"/>
-          <w:szCs w:val="21"/>
-          <w:lang w:eastAsia="zh-CN"/>
-        </w:rPr>
-        <w:t>3]</w:t>
-      </w:r>
-      <w:r>
-        <w:rPr>
-          <w:rFonts w:ascii="Times New Roman" w:hAnsi="Times New Roman" w:cs="Times New Roman"/>
-          <w:sz w:val="21"/>
-          <w:szCs w:val="21"/>
-        </w:rPr>
-        <w:t>KEUNING</w:t>
-      </w:r>
-      <w:proofErr w:type="gramEnd"/>
-      <w:r>
-        <w:rPr>
-          <w:rFonts w:ascii="Times New Roman" w:hAnsi="Times New Roman" w:cs="Times New Roman"/>
-          <w:sz w:val="21"/>
-          <w:szCs w:val="21"/>
-        </w:rPr>
-        <w:t xml:space="preserve"> H, JEURING J T, HEEREN B. A systematic literature review of automated feedback generation for programming exercises[J]. ACM Transactions on Computing Education, 2018, 19(1).</w:t>
+        <w:t>[2]</w:t>
+      </w:r>
+      <w:r>
+        <w:t>陈峥</w:t>
+      </w:r>
+      <w:r>
+        <w:t xml:space="preserve">, </w:t>
+      </w:r>
+      <w:r>
+        <w:t>喻俊杰</w:t>
+      </w:r>
+      <w:r>
+        <w:t xml:space="preserve">. </w:t>
+      </w:r>
+      <w:r>
+        <w:t>基于</w:t>
+      </w:r>
+      <w:r>
+        <w:t>LLM</w:t>
+      </w:r>
+      <w:r>
+        <w:t>的</w:t>
+      </w:r>
+      <w:r>
+        <w:t>Java</w:t>
+      </w:r>
+      <w:r>
+        <w:t>编程作业评估与教学实践</w:t>
+      </w:r>
+      <w:r>
+        <w:t xml:space="preserve">[J]. </w:t>
+      </w:r>
+      <w:r>
+        <w:t>计算机教育</w:t>
+      </w:r>
+      <w:r>
+        <w:t>, 2026(6): 198-205.</w:t>
       </w:r>
     </w:p>
     <w:p>
       <w:pPr>
-        <w:pStyle w:val="affa"/>
-        <w:spacing w:after="0" w:line="400" w:lineRule="exact"/>
-        <w:jc w:val="both"/>
+        <w:pStyle w:val="affd"/>
         <w:rPr>
-          <w:rFonts w:ascii="Times New Roman" w:hAnsi="Times New Roman" w:cs="Times New Roman" w:hint="eastAsia"/>
-          <w:sz w:val="21"/>
-          <w:szCs w:val="21"/>
+          <w:rFonts w:hint="eastAsia"/>
         </w:rPr>
       </w:pPr>
       <w:r>
         <w:rPr>
-          <w:sz w:val="21"/>
-          <w:szCs w:val="21"/>
-          <w:lang w:eastAsia="zh-CN"/>
+          <w:rFonts w:ascii="Times New Roman" w:eastAsia="Times New Roman" w:hAnsi="Times New Roman"/>
         </w:rPr>
-        <w:t>[</w:t>
-      </w:r>
-      <w:proofErr w:type="gramStart"/>
-      <w:r>
-        <w:rPr>
-          <w:sz w:val="21"/>
-          <w:szCs w:val="21"/>
-          <w:lang w:eastAsia="zh-CN"/>
-        </w:rPr>
-        <w:t>4]</w:t>
-      </w:r>
-      <w:r>
-        <w:rPr>
-          <w:rFonts w:ascii="Times New Roman" w:hAnsi="Times New Roman" w:cs="Times New Roman"/>
-          <w:sz w:val="21"/>
-          <w:szCs w:val="21"/>
-        </w:rPr>
-        <w:t>KASNECI</w:t>
-      </w:r>
-      <w:proofErr w:type="gramEnd"/>
-      <w:r>
-        <w:rPr>
-          <w:rFonts w:ascii="Times New Roman" w:hAnsi="Times New Roman" w:cs="Times New Roman"/>
-          <w:sz w:val="21"/>
-          <w:szCs w:val="21"/>
-        </w:rPr>
-        <w:t xml:space="preserve"> E, SESSLER K, KÜCHEMANN S, et al. ChatGPT for good? On opportunities and challenges of large language models for education[J]. Learning and Individual Differences, 2023, 103: 102274.</w:t>
+        <w:t>[3]KEUNING H, JEURING J T, HEEREN B. A systematic literature review of automated feedback generation for programming exercises[J]. ACM Transactions on Computing Education, 2018, 19(1).</w:t>
       </w:r>
     </w:p>
     <w:p>
       <w:pPr>
-        <w:pStyle w:val="affa"/>
-        <w:spacing w:after="0" w:line="400" w:lineRule="exact"/>
-        <w:jc w:val="both"/>
+        <w:pStyle w:val="affd"/>
         <w:rPr>
-          <w:rFonts w:ascii="Times New Roman" w:hAnsi="Times New Roman" w:cs="Times New Roman" w:hint="eastAsia"/>
-          <w:sz w:val="21"/>
-          <w:szCs w:val="21"/>
+          <w:rFonts w:hint="eastAsia"/>
         </w:rPr>
       </w:pPr>
       <w:r>
         <w:rPr>
-          <w:sz w:val="21"/>
-          <w:szCs w:val="21"/>
-          <w:lang w:eastAsia="zh-CN"/>
+          <w:rFonts w:ascii="Times New Roman" w:eastAsia="Times New Roman" w:hAnsi="Times New Roman"/>
         </w:rPr>
-        <w:t>[</w:t>
-      </w:r>
-      <w:proofErr w:type="gramStart"/>
-      <w:r>
-        <w:rPr>
-          <w:sz w:val="21"/>
-          <w:szCs w:val="21"/>
-          <w:lang w:eastAsia="zh-CN"/>
-        </w:rPr>
-        <w:t>5]</w:t>
-      </w:r>
-      <w:r>
-        <w:rPr>
-          <w:rFonts w:ascii="Times New Roman" w:hAnsi="Times New Roman" w:cs="Times New Roman"/>
-          <w:sz w:val="21"/>
-          <w:szCs w:val="21"/>
-        </w:rPr>
-        <w:t>SPRING</w:t>
-      </w:r>
-      <w:proofErr w:type="gramEnd"/>
-      <w:r>
-        <w:rPr>
-          <w:rFonts w:ascii="Times New Roman" w:hAnsi="Times New Roman" w:cs="Times New Roman"/>
-          <w:sz w:val="21"/>
-          <w:szCs w:val="21"/>
-        </w:rPr>
-        <w:t>. Spring Boot 3.5 Reference Documentation[EB/OL]. https://docs.spring.io/spring-boot/3.5/reference/index.html, 2026-10-26.</w:t>
+        <w:t>[4]KASNECI E, SESSLER K, KÜCHEMANN S, et al. ChatGPT for good? On opportunities and challenges of large language models for education[J]. Learning and Individual Differences, 2023, 103: 102274.</w:t>
       </w:r>
     </w:p>
     <w:p>
       <w:pPr>
-        <w:pStyle w:val="affa"/>
-        <w:spacing w:after="0" w:line="400" w:lineRule="exact"/>
-        <w:jc w:val="both"/>
+        <w:pStyle w:val="affd"/>
         <w:rPr>
-          <w:rFonts w:ascii="Times New Roman" w:hAnsi="Times New Roman" w:cs="Times New Roman"/>
-          <w:sz w:val="21"/>
-          <w:szCs w:val="21"/>
+          <w:rFonts w:hint="eastAsia"/>
         </w:rPr>
       </w:pPr>
       <w:r>
         <w:rPr>
-          <w:sz w:val="21"/>
-          <w:szCs w:val="21"/>
-          <w:lang w:eastAsia="zh-CN"/>
+          <w:rFonts w:ascii="Times New Roman" w:eastAsia="Times New Roman" w:hAnsi="Times New Roman"/>
         </w:rPr>
-        <w:t>[</w:t>
-      </w:r>
-      <w:proofErr w:type="gramStart"/>
-      <w:r>
-        <w:rPr>
-          <w:rFonts w:hint="eastAsia"/>
-          <w:sz w:val="21"/>
-          <w:szCs w:val="21"/>
-          <w:lang w:eastAsia="zh-CN"/>
-        </w:rPr>
-        <w:t>6</w:t>
-      </w:r>
-      <w:r>
-        <w:rPr>
-          <w:sz w:val="21"/>
-          <w:szCs w:val="21"/>
-          <w:lang w:eastAsia="zh-CN"/>
-        </w:rPr>
-        <w:t>]</w:t>
-      </w:r>
-      <w:r>
-        <w:rPr>
-          <w:rFonts w:ascii="Times New Roman" w:hAnsi="Times New Roman" w:cs="Times New Roman"/>
-          <w:sz w:val="21"/>
-          <w:szCs w:val="21"/>
-        </w:rPr>
-        <w:t>OLLAMA</w:t>
-      </w:r>
-      <w:proofErr w:type="gramEnd"/>
-      <w:r>
-        <w:rPr>
-          <w:rFonts w:ascii="Times New Roman" w:hAnsi="Times New Roman" w:cs="Times New Roman"/>
-          <w:sz w:val="21"/>
-          <w:szCs w:val="21"/>
-        </w:rPr>
-        <w:t>. Generate a chat message[EB/OL]. https://docs.ollama.com/api/chat, 2026-10-26.</w:t>
+        <w:t>[5]SPRING. Spring Boot 3.5 Reference Documentation[EB/OL]. https://docs.spring.io/spring-boot/3.5/reference/index.html, 2026-10-26.</w:t>
       </w:r>
     </w:p>
     <w:p>
       <w:pPr>
-        <w:pStyle w:val="affa"/>
-        <w:autoSpaceDE w:val="0"/>
-        <w:autoSpaceDN w:val="0"/>
-        <w:spacing w:after="0" w:line="400" w:lineRule="exact"/>
-        <w:jc w:val="both"/>
+        <w:pStyle w:val="affd"/>
         <w:rPr>
-          <w:rFonts w:ascii="Times New Roman" w:hAnsi="Times New Roman" w:cs="Times New Roman" w:hint="eastAsia"/>
-          <w:sz w:val="21"/>
-          <w:szCs w:val="21"/>
-          <w:lang w:eastAsia="zh-CN"/>
+          <w:rFonts w:hint="eastAsia"/>
         </w:rPr>
       </w:pPr>
       <w:r>
         <w:rPr>
-          <w:sz w:val="21"/>
-          <w:szCs w:val="21"/>
-          <w:lang w:eastAsia="zh-CN"/>
+          <w:rFonts w:ascii="Times New Roman" w:eastAsia="Times New Roman" w:hAnsi="Times New Roman"/>
         </w:rPr>
-        <w:t>[</w:t>
-      </w:r>
-      <w:proofErr w:type="gramStart"/>
-      <w:r>
-        <w:rPr>
-          <w:rFonts w:hint="eastAsia"/>
-          <w:sz w:val="21"/>
-          <w:szCs w:val="21"/>
-          <w:lang w:eastAsia="zh-CN"/>
-        </w:rPr>
-        <w:t>7</w:t>
-      </w:r>
-      <w:r>
-        <w:rPr>
-          <w:sz w:val="21"/>
-          <w:szCs w:val="21"/>
-          <w:lang w:eastAsia="zh-CN"/>
-        </w:rPr>
-        <w:t>]</w:t>
-      </w:r>
-      <w:r>
-        <w:rPr>
-          <w:rFonts w:ascii="Times New Roman" w:hAnsi="Times New Roman" w:cs="Times New Roman"/>
-          <w:sz w:val="21"/>
-          <w:szCs w:val="21"/>
-        </w:rPr>
-        <w:t>ORACLE</w:t>
-      </w:r>
-      <w:proofErr w:type="gramEnd"/>
-      <w:r>
-        <w:rPr>
-          <w:rFonts w:ascii="Times New Roman" w:hAnsi="Times New Roman" w:cs="Times New Roman"/>
-          <w:sz w:val="21"/>
-          <w:szCs w:val="21"/>
-        </w:rPr>
-        <w:t>.</w:t>
-      </w:r>
-      <w:r>
-        <w:rPr>
-          <w:rFonts w:ascii="Times New Roman" w:hAnsi="Times New Roman" w:cs="Times New Roman" w:hint="eastAsia"/>
-          <w:sz w:val="21"/>
-          <w:szCs w:val="21"/>
-          <w:lang w:eastAsia="zh-CN"/>
-        </w:rPr>
-        <w:t xml:space="preserve"> </w:t>
-      </w:r>
-      <w:r>
-        <w:rPr>
-          <w:rFonts w:ascii="Times New Roman" w:hAnsi="Times New Roman" w:cs="Times New Roman"/>
-          <w:sz w:val="21"/>
-          <w:szCs w:val="21"/>
-        </w:rPr>
-        <w:t>MySQL8.4</w:t>
-      </w:r>
-      <w:r>
-        <w:rPr>
-          <w:rFonts w:ascii="Times New Roman" w:hAnsi="Times New Roman" w:cs="Times New Roman" w:hint="eastAsia"/>
-          <w:sz w:val="21"/>
-          <w:szCs w:val="21"/>
-          <w:lang w:eastAsia="zh-CN"/>
-        </w:rPr>
-        <w:t xml:space="preserve"> </w:t>
-      </w:r>
-      <w:r>
-        <w:rPr>
-          <w:rFonts w:ascii="Times New Roman" w:hAnsi="Times New Roman" w:cs="Times New Roman"/>
-          <w:sz w:val="21"/>
-          <w:szCs w:val="21"/>
-        </w:rPr>
-        <w:t xml:space="preserve">Reference Manual: FOREIGN KEY </w:t>
-      </w:r>
-      <w:proofErr w:type="gramStart"/>
-      <w:r>
-        <w:rPr>
-          <w:rFonts w:ascii="Times New Roman" w:hAnsi="Times New Roman" w:cs="Times New Roman"/>
-          <w:sz w:val="21"/>
-          <w:szCs w:val="21"/>
-        </w:rPr>
-        <w:t>Constraints[</w:t>
-      </w:r>
-      <w:proofErr w:type="gramEnd"/>
-      <w:r>
-        <w:rPr>
-          <w:rFonts w:ascii="Times New Roman" w:hAnsi="Times New Roman" w:cs="Times New Roman"/>
-          <w:sz w:val="21"/>
-          <w:szCs w:val="21"/>
-        </w:rPr>
-        <w:t>EB/OL]. https://dev.mysql.com/doc/refman/8.4/en/constraint-foreign-key.html, 2026-10-26.</w:t>
+        <w:t>[6]OLLAMA. Generate a chat message[EB/OL]. https://docs.ollama.com/api/chat, 2026-10-26.</w:t>
       </w:r>
     </w:p>
     <w:p>
       <w:pPr>
-        <w:pStyle w:val="affa"/>
-        <w:spacing w:after="0" w:line="400" w:lineRule="exact"/>
-        <w:jc w:val="both"/>
+        <w:pStyle w:val="affd"/>
         <w:rPr>
-          <w:rFonts w:ascii="Times New Roman" w:hAnsi="Times New Roman" w:cs="Times New Roman" w:hint="eastAsia"/>
-          <w:sz w:val="21"/>
-          <w:szCs w:val="21"/>
+          <w:rFonts w:hint="eastAsia"/>
         </w:rPr>
       </w:pPr>
       <w:r>
         <w:rPr>
-          <w:sz w:val="21"/>
-          <w:szCs w:val="21"/>
-          <w:lang w:eastAsia="zh-CN"/>
+          <w:rFonts w:ascii="Times New Roman" w:eastAsia="Times New Roman" w:hAnsi="Times New Roman"/>
         </w:rPr>
-        <w:t>[</w:t>
-      </w:r>
-      <w:proofErr w:type="gramStart"/>
-      <w:r>
+        <w:t>[7]ORACLE. MySQL8.4 Reference Manual: FOREIGN KEY Constraints[EB/OL]. https://dev.mysql.com/doc/refman/8.4/en/constraint-foreign-key.html, 2026-10-26.</w:t>
+      </w:r>
+    </w:p>
+    <w:p>
+      <w:pPr>
+        <w:pStyle w:val="affd"/>
         <w:rPr>
-          <w:sz w:val="21"/>
-          <w:szCs w:val="21"/>
-          <w:lang w:eastAsia="zh-CN"/>
+          <w:rFonts w:hint="eastAsia"/>
         </w:rPr>
-        <w:t>8]</w:t>
-      </w:r>
+      </w:pPr>
       <w:r>
         <w:rPr>
-          <w:rFonts w:ascii="Times New Roman" w:hAnsi="Times New Roman" w:cs="Times New Roman"/>
-          <w:sz w:val="21"/>
-          <w:szCs w:val="21"/>
+          <w:rFonts w:ascii="Times New Roman" w:eastAsia="Times New Roman" w:hAnsi="Times New Roman"/>
         </w:rPr>
-        <w:t>SPIRALS</w:t>
-      </w:r>
-      <w:proofErr w:type="gramEnd"/>
-      <w:r>
-        <w:rPr>
-          <w:rFonts w:ascii="Times New Roman" w:hAnsi="Times New Roman" w:cs="Times New Roman"/>
-          <w:sz w:val="21"/>
-          <w:szCs w:val="21"/>
-        </w:rPr>
-        <w:t>-TEAM. IntroClassJava: A dataset of Java bugs for automatic repair[EB/OL]. https://github.com/Spirals-Team/IntroClassJava, 2026-10-26.</w:t>
+        <w:t>[8]SPIRALS-TEAM. IntroClassJava: A dataset of Java bugs for automatic repair[EB/OL]. https://github.com/Spirals-Team/IntroClassJava, 2026-10-26.</w:t>
       </w:r>
     </w:p>
     <w:sectPr>
-      <w:footerReference w:type="default" r:id="rId8"/>
+      <w:headerReference w:type="default" r:id="rId16"/>
+      <w:footerReference w:type="default" r:id="rId17"/>
       <w:pgSz w:w="11906" w:h="16838"/>
-      <w:pgMar w:top="1417" w:right="1417" w:bottom="1417" w:left="1701" w:header="720" w:footer="720" w:gutter="0"/>
+      <w:pgMar w:top="1417" w:right="1474" w:bottom="1417" w:left="1871" w:header="850" w:footer="850" w:gutter="0"/>
       <w:cols w:space="720"/>
       <w:docGrid w:linePitch="360"/>
     </w:sectPr>
@@ -1664,25 +2062,228 @@
       </w:rPr>
     </w:pPr>
     <w:r>
+      <w:rPr>
+        <w:rFonts w:ascii="Times New Roman" w:hAnsi="Times New Roman"/>
+        <w:sz w:val="18"/>
+      </w:rPr>
       <w:fldChar w:fldCharType="begin"/>
     </w:r>
     <w:r>
-      <w:instrText>PAGE</w:instrText>
+      <w:rPr>
+        <w:rFonts w:ascii="Times New Roman" w:hAnsi="Times New Roman"/>
+        <w:sz w:val="18"/>
+      </w:rPr>
+      <w:instrText xml:space="preserve"> PAGE </w:instrText>
     </w:r>
     <w:r>
       <w:rPr>
-        <w:rFonts w:hint="eastAsia"/>
+        <w:rFonts w:ascii="Times New Roman" w:hAnsi="Times New Roman"/>
+        <w:sz w:val="18"/>
       </w:rPr>
       <w:fldChar w:fldCharType="separate"/>
     </w:r>
     <w:r>
       <w:rPr>
-        <w:rFonts w:hint="eastAsia"/>
-        <w:noProof/>
+        <w:rFonts w:ascii="Times New Roman" w:hAnsi="Times New Roman"/>
+        <w:sz w:val="18"/>
       </w:rPr>
       <w:t>1</w:t>
     </w:r>
     <w:r>
+      <w:rPr>
+        <w:rFonts w:ascii="Times New Roman" w:hAnsi="Times New Roman"/>
+        <w:sz w:val="18"/>
+      </w:rPr>
+      <w:fldChar w:fldCharType="end"/>
+    </w:r>
+  </w:p>
+</w:ftr>
+</file>
+
+<file path=word/footer2.xml><?xml version="1.0" encoding="utf-8"?>
+<w:ftr xmlns:wpc="http://schemas.microsoft.com/office/word/2010/wordprocessingCanvas" xmlns:cx="http://schemas.microsoft.com/office/drawing/2014/chartex" xmlns:cx1="http://schemas.microsoft.com/office/drawing/2015/9/8/chartex" xmlns:cx2="http://schemas.microsoft.com/office/drawing/2015/10/21/chartex" xmlns:cx3="http://schemas.microsoft.com/office/drawing/2016/5/9/chartex" xmlns:cx4="http://schemas.microsoft.com/office/drawing/2016/5/10/chartex" xmlns:cx5="http://schemas.microsoft.com/office/drawing/2016/5/11/chartex" xmlns:cx6="http://schemas.microsoft.com/office/drawing/2016/5/12/chartex" xmlns:cx7="http://schemas.microsoft.com/office/drawing/2016/5/13/chartex" xmlns:cx8="http://schemas.microsoft.com/office/drawing/2016/5/14/chartex" xmlns:mc="http://schemas.openxmlformats.org/markup-compatibility/2006" xmlns:aink="http://schemas.microsoft.com/office/drawing/2016/ink" xmlns:am3d="http://schemas.microsoft.com/office/drawing/2017/model3d" xmlns:o="urn:schemas-microsoft-com:office:office" xmlns:oel="http://schemas.microsoft.com/office/2019/extlst" xmlns:r="http://schemas.openxmlformats.org/officeDocument/2006/relationships" xmlns:m="http://schemas.openxmlformats.org/officeDocument/2006/math" xmlns:v="urn:schemas-microsoft-com:vml" xmlns:wp14="http://schemas.microsoft.com/office/word/2010/wordprocessingDrawing" xmlns:wp="http://schemas.openxmlformats.org/drawingml/2006/wordprocessingDrawing" xmlns:w10="urn:schemas-microsoft-com:office:word" xmlns:w="http://schemas.openxmlformats.org/wordprocessingml/2006/main" xmlns:w14="http://schemas.microsoft.com/office/word/2010/wordml" xmlns:w15="http://schemas.microsoft.com/office/word/2012/wordml" xmlns:w16cex="http://schemas.microsoft.com/office/word/2018/wordml/cex" xmlns:w16cid="http://schemas.microsoft.com/office/word/2016/wordml/cid" xmlns:w16="http://schemas.microsoft.com/office/word/2018/wordml" xmlns:w16du="http://schemas.microsoft.com/office/word/2023/wordml/word16du" xmlns:w16sdtdh="http://schemas.microsoft.com/office/word/2020/wordml/sdtdatahash" xmlns:w16sdtfl="http://schemas.microsoft.com/office/word/2024/wordml/sdtformatlock" xmlns:w16se="http://schemas.microsoft.com/office/word/2015/wordml/symex" xmlns:wpg="http://schemas.microsoft.com/office/word/2010/wordprocessingGroup" xmlns:wpi="http://schemas.microsoft.com/office/word/2010/wordprocessingInk" xmlns:wne="http://schemas.microsoft.com/office/word/2006/wordml" xmlns:wps="http://schemas.microsoft.com/office/word/2010/wordprocessingShape" mc:Ignorable="w14 w15 w16se w16cid w16 w16cex w16sdtdh w16sdtfl w16du wp14">
+  <w:p>
+    <w:pPr>
+      <w:pStyle w:val="a7"/>
+      <w:ind w:firstLine="0"/>
+      <w:jc w:val="center"/>
+      <w:rPr>
+        <w:rFonts w:hint="eastAsia"/>
+      </w:rPr>
+    </w:pPr>
+    <w:r>
+      <w:rPr>
+        <w:rFonts w:ascii="Times New Roman" w:hAnsi="Times New Roman"/>
+        <w:sz w:val="18"/>
+      </w:rPr>
+      <w:fldChar w:fldCharType="begin"/>
+    </w:r>
+    <w:r>
+      <w:rPr>
+        <w:rFonts w:ascii="Times New Roman" w:hAnsi="Times New Roman"/>
+        <w:sz w:val="18"/>
+      </w:rPr>
+      <w:instrText xml:space="preserve"> PAGE </w:instrText>
+    </w:r>
+    <w:r>
+      <w:rPr>
+        <w:rFonts w:ascii="Times New Roman" w:hAnsi="Times New Roman"/>
+        <w:sz w:val="18"/>
+      </w:rPr>
+      <w:fldChar w:fldCharType="separate"/>
+    </w:r>
+    <w:r>
+      <w:rPr>
+        <w:rFonts w:ascii="Times New Roman" w:hAnsi="Times New Roman"/>
+        <w:sz w:val="18"/>
+      </w:rPr>
+      <w:t>1</w:t>
+    </w:r>
+    <w:r>
+      <w:rPr>
+        <w:rFonts w:ascii="Times New Roman" w:hAnsi="Times New Roman"/>
+        <w:sz w:val="18"/>
+      </w:rPr>
+      <w:fldChar w:fldCharType="end"/>
+    </w:r>
+  </w:p>
+</w:ftr>
+</file>
+
+<file path=word/footer3.xml><?xml version="1.0" encoding="utf-8"?>
+<w:ftr xmlns:wpc="http://schemas.microsoft.com/office/word/2010/wordprocessingCanvas" xmlns:cx="http://schemas.microsoft.com/office/drawing/2014/chartex" xmlns:cx1="http://schemas.microsoft.com/office/drawing/2015/9/8/chartex" xmlns:cx2="http://schemas.microsoft.com/office/drawing/2015/10/21/chartex" xmlns:cx3="http://schemas.microsoft.com/office/drawing/2016/5/9/chartex" xmlns:cx4="http://schemas.microsoft.com/office/drawing/2016/5/10/chartex" xmlns:cx5="http://schemas.microsoft.com/office/drawing/2016/5/11/chartex" xmlns:cx6="http://schemas.microsoft.com/office/drawing/2016/5/12/chartex" xmlns:cx7="http://schemas.microsoft.com/office/drawing/2016/5/13/chartex" xmlns:cx8="http://schemas.microsoft.com/office/drawing/2016/5/14/chartex" xmlns:mc="http://schemas.openxmlformats.org/markup-compatibility/2006" xmlns:aink="http://schemas.microsoft.com/office/drawing/2016/ink" xmlns:am3d="http://schemas.microsoft.com/office/drawing/2017/model3d" xmlns:o="urn:schemas-microsoft-com:office:office" xmlns:oel="http://schemas.microsoft.com/office/2019/extlst" xmlns:r="http://schemas.openxmlformats.org/officeDocument/2006/relationships" xmlns:m="http://schemas.openxmlformats.org/officeDocument/2006/math" xmlns:v="urn:schemas-microsoft-com:vml" xmlns:wp14="http://schemas.microsoft.com/office/word/2010/wordprocessingDrawing" xmlns:wp="http://schemas.openxmlformats.org/drawingml/2006/wordprocessingDrawing" xmlns:w10="urn:schemas-microsoft-com:office:word" xmlns:w="http://schemas.openxmlformats.org/wordprocessingml/2006/main" xmlns:w14="http://schemas.microsoft.com/office/word/2010/wordml" xmlns:w15="http://schemas.microsoft.com/office/word/2012/wordml" xmlns:w16cex="http://schemas.microsoft.com/office/word/2018/wordml/cex" xmlns:w16cid="http://schemas.microsoft.com/office/word/2016/wordml/cid" xmlns:w16="http://schemas.microsoft.com/office/word/2018/wordml" xmlns:w16du="http://schemas.microsoft.com/office/word/2023/wordml/word16du" xmlns:w16sdtdh="http://schemas.microsoft.com/office/word/2020/wordml/sdtdatahash" xmlns:w16sdtfl="http://schemas.microsoft.com/office/word/2024/wordml/sdtformatlock" xmlns:w16se="http://schemas.microsoft.com/office/word/2015/wordml/symex" xmlns:wpg="http://schemas.microsoft.com/office/word/2010/wordprocessingGroup" xmlns:wpi="http://schemas.microsoft.com/office/word/2010/wordprocessingInk" xmlns:wne="http://schemas.microsoft.com/office/word/2006/wordml" xmlns:wps="http://schemas.microsoft.com/office/word/2010/wordprocessingShape" mc:Ignorable="w14 w15 w16se w16cid w16 w16cex w16sdtdh w16sdtfl w16du wp14">
+  <w:p>
+    <w:pPr>
+      <w:pStyle w:val="a7"/>
+      <w:ind w:firstLine="0"/>
+      <w:jc w:val="center"/>
+      <w:rPr>
+        <w:rFonts w:hint="eastAsia"/>
+      </w:rPr>
+    </w:pPr>
+    <w:r>
+      <w:rPr>
+        <w:rFonts w:ascii="Times New Roman" w:hAnsi="Times New Roman"/>
+        <w:sz w:val="18"/>
+      </w:rPr>
+      <w:fldChar w:fldCharType="begin"/>
+    </w:r>
+    <w:r>
+      <w:rPr>
+        <w:rFonts w:ascii="Times New Roman" w:hAnsi="Times New Roman"/>
+        <w:sz w:val="18"/>
+      </w:rPr>
+      <w:instrText xml:space="preserve"> PAGE </w:instrText>
+    </w:r>
+    <w:r>
+      <w:rPr>
+        <w:rFonts w:ascii="Times New Roman" w:hAnsi="Times New Roman"/>
+        <w:sz w:val="18"/>
+      </w:rPr>
+      <w:fldChar w:fldCharType="separate"/>
+    </w:r>
+    <w:r>
+      <w:rPr>
+        <w:rFonts w:ascii="Times New Roman" w:hAnsi="Times New Roman"/>
+        <w:sz w:val="18"/>
+      </w:rPr>
+      <w:t>1</w:t>
+    </w:r>
+    <w:r>
+      <w:rPr>
+        <w:rFonts w:ascii="Times New Roman" w:hAnsi="Times New Roman"/>
+        <w:sz w:val="18"/>
+      </w:rPr>
+      <w:fldChar w:fldCharType="end"/>
+    </w:r>
+  </w:p>
+</w:ftr>
+</file>
+
+<file path=word/footer4.xml><?xml version="1.0" encoding="utf-8"?>
+<w:ftr xmlns:wpc="http://schemas.microsoft.com/office/word/2010/wordprocessingCanvas" xmlns:cx="http://schemas.microsoft.com/office/drawing/2014/chartex" xmlns:cx1="http://schemas.microsoft.com/office/drawing/2015/9/8/chartex" xmlns:cx2="http://schemas.microsoft.com/office/drawing/2015/10/21/chartex" xmlns:cx3="http://schemas.microsoft.com/office/drawing/2016/5/9/chartex" xmlns:cx4="http://schemas.microsoft.com/office/drawing/2016/5/10/chartex" xmlns:cx5="http://schemas.microsoft.com/office/drawing/2016/5/11/chartex" xmlns:cx6="http://schemas.microsoft.com/office/drawing/2016/5/12/chartex" xmlns:cx7="http://schemas.microsoft.com/office/drawing/2016/5/13/chartex" xmlns:cx8="http://schemas.microsoft.com/office/drawing/2016/5/14/chartex" xmlns:mc="http://schemas.openxmlformats.org/markup-compatibility/2006" xmlns:aink="http://schemas.microsoft.com/office/drawing/2016/ink" xmlns:am3d="http://schemas.microsoft.com/office/drawing/2017/model3d" xmlns:o="urn:schemas-microsoft-com:office:office" xmlns:oel="http://schemas.microsoft.com/office/2019/extlst" xmlns:r="http://schemas.openxmlformats.org/officeDocument/2006/relationships" xmlns:m="http://schemas.openxmlformats.org/officeDocument/2006/math" xmlns:v="urn:schemas-microsoft-com:vml" xmlns:wp14="http://schemas.microsoft.com/office/word/2010/wordprocessingDrawing" xmlns:wp="http://schemas.openxmlformats.org/drawingml/2006/wordprocessingDrawing" xmlns:w10="urn:schemas-microsoft-com:office:word" xmlns:w="http://schemas.openxmlformats.org/wordprocessingml/2006/main" xmlns:w14="http://schemas.microsoft.com/office/word/2010/wordml" xmlns:w15="http://schemas.microsoft.com/office/word/2012/wordml" xmlns:w16cex="http://schemas.microsoft.com/office/word/2018/wordml/cex" xmlns:w16cid="http://schemas.microsoft.com/office/word/2016/wordml/cid" xmlns:w16="http://schemas.microsoft.com/office/word/2018/wordml" xmlns:w16du="http://schemas.microsoft.com/office/word/2023/wordml/word16du" xmlns:w16sdtdh="http://schemas.microsoft.com/office/word/2020/wordml/sdtdatahash" xmlns:w16sdtfl="http://schemas.microsoft.com/office/word/2024/wordml/sdtformatlock" xmlns:w16se="http://schemas.microsoft.com/office/word/2015/wordml/symex" xmlns:wpg="http://schemas.microsoft.com/office/word/2010/wordprocessingGroup" xmlns:wpi="http://schemas.microsoft.com/office/word/2010/wordprocessingInk" xmlns:wne="http://schemas.microsoft.com/office/word/2006/wordml" xmlns:wps="http://schemas.microsoft.com/office/word/2010/wordprocessingShape" mc:Ignorable="w14 w15 w16se w16cid w16 w16cex w16sdtdh w16sdtfl w16du wp14">
+  <w:p>
+    <w:pPr>
+      <w:pStyle w:val="a7"/>
+      <w:ind w:firstLine="0"/>
+      <w:jc w:val="center"/>
+      <w:rPr>
+        <w:rFonts w:hint="eastAsia"/>
+      </w:rPr>
+    </w:pPr>
+    <w:r>
+      <w:rPr>
+        <w:sz w:val="18"/>
+      </w:rPr>
+      <w:fldChar w:fldCharType="begin"/>
+    </w:r>
+    <w:r>
+      <w:rPr>
+        <w:sz w:val="18"/>
+      </w:rPr>
+      <w:instrText xml:space="preserve"> PAGE </w:instrText>
+    </w:r>
+    <w:r>
+      <w:rPr>
+        <w:sz w:val="18"/>
+      </w:rPr>
+      <w:fldChar w:fldCharType="separate"/>
+    </w:r>
+    <w:r>
+      <w:rPr>
+        <w:sz w:val="18"/>
+      </w:rPr>
+      <w:t>1</w:t>
+    </w:r>
+    <w:r>
+      <w:rPr>
+        <w:sz w:val="18"/>
+      </w:rPr>
+      <w:fldChar w:fldCharType="end"/>
+    </w:r>
+  </w:p>
+</w:ftr>
+</file>
+
+<file path=word/footer5.xml><?xml version="1.0" encoding="utf-8"?>
+<w:ftr xmlns:wpc="http://schemas.microsoft.com/office/word/2010/wordprocessingCanvas" xmlns:cx="http://schemas.microsoft.com/office/drawing/2014/chartex" xmlns:cx1="http://schemas.microsoft.com/office/drawing/2015/9/8/chartex" xmlns:cx2="http://schemas.microsoft.com/office/drawing/2015/10/21/chartex" xmlns:cx3="http://schemas.microsoft.com/office/drawing/2016/5/9/chartex" xmlns:cx4="http://schemas.microsoft.com/office/drawing/2016/5/10/chartex" xmlns:cx5="http://schemas.microsoft.com/office/drawing/2016/5/11/chartex" xmlns:cx6="http://schemas.microsoft.com/office/drawing/2016/5/12/chartex" xmlns:cx7="http://schemas.microsoft.com/office/drawing/2016/5/13/chartex" xmlns:cx8="http://schemas.microsoft.com/office/drawing/2016/5/14/chartex" xmlns:mc="http://schemas.openxmlformats.org/markup-compatibility/2006" xmlns:aink="http://schemas.microsoft.com/office/drawing/2016/ink" xmlns:am3d="http://schemas.microsoft.com/office/drawing/2017/model3d" xmlns:o="urn:schemas-microsoft-com:office:office" xmlns:oel="http://schemas.microsoft.com/office/2019/extlst" xmlns:r="http://schemas.openxmlformats.org/officeDocument/2006/relationships" xmlns:m="http://schemas.openxmlformats.org/officeDocument/2006/math" xmlns:v="urn:schemas-microsoft-com:vml" xmlns:wp14="http://schemas.microsoft.com/office/word/2010/wordprocessingDrawing" xmlns:wp="http://schemas.openxmlformats.org/drawingml/2006/wordprocessingDrawing" xmlns:w10="urn:schemas-microsoft-com:office:word" xmlns:w="http://schemas.openxmlformats.org/wordprocessingml/2006/main" xmlns:w14="http://schemas.microsoft.com/office/word/2010/wordml" xmlns:w15="http://schemas.microsoft.com/office/word/2012/wordml" xmlns:w16cex="http://schemas.microsoft.com/office/word/2018/wordml/cex" xmlns:w16cid="http://schemas.microsoft.com/office/word/2016/wordml/cid" xmlns:w16="http://schemas.microsoft.com/office/word/2018/wordml" xmlns:w16du="http://schemas.microsoft.com/office/word/2023/wordml/word16du" xmlns:w16sdtdh="http://schemas.microsoft.com/office/word/2020/wordml/sdtdatahash" xmlns:w16sdtfl="http://schemas.microsoft.com/office/word/2024/wordml/sdtformatlock" xmlns:w16se="http://schemas.microsoft.com/office/word/2015/wordml/symex" xmlns:wpg="http://schemas.microsoft.com/office/word/2010/wordprocessingGroup" xmlns:wpi="http://schemas.microsoft.com/office/word/2010/wordprocessingInk" xmlns:wne="http://schemas.microsoft.com/office/word/2006/wordml" xmlns:wps="http://schemas.microsoft.com/office/word/2010/wordprocessingShape" mc:Ignorable="w14 w15 w16se w16cid w16 w16cex w16sdtdh w16sdtfl w16du wp14">
+  <w:p>
+    <w:pPr>
+      <w:pStyle w:val="a7"/>
+      <w:ind w:firstLine="0"/>
+      <w:jc w:val="center"/>
+      <w:rPr>
+        <w:rFonts w:hint="eastAsia"/>
+      </w:rPr>
+    </w:pPr>
+    <w:r>
+      <w:rPr>
+        <w:sz w:val="18"/>
+      </w:rPr>
+      <w:fldChar w:fldCharType="begin"/>
+    </w:r>
+    <w:r>
+      <w:rPr>
+        <w:sz w:val="18"/>
+      </w:rPr>
+      <w:instrText xml:space="preserve"> PAGE </w:instrText>
+    </w:r>
+    <w:r>
+      <w:rPr>
+        <w:sz w:val="18"/>
+      </w:rPr>
+      <w:fldChar w:fldCharType="separate"/>
+    </w:r>
+    <w:r>
+      <w:rPr>
+        <w:sz w:val="18"/>
+      </w:rPr>
+      <w:t>1</w:t>
+    </w:r>
+    <w:r>
+      <w:rPr>
+        <w:sz w:val="18"/>
+      </w:rPr>
       <w:fldChar w:fldCharType="end"/>
     </w:r>
   </w:p>
@@ -1718,6 +2319,156 @@
     </w:p>
   </w:footnote>
 </w:footnotes>
+</file>
+
+<file path=word/header1.xml><?xml version="1.0" encoding="utf-8"?>
+<w:hdr xmlns:wpc="http://schemas.microsoft.com/office/word/2010/wordprocessingCanvas" xmlns:cx="http://schemas.microsoft.com/office/drawing/2014/chartex" xmlns:cx1="http://schemas.microsoft.com/office/drawing/2015/9/8/chartex" xmlns:cx2="http://schemas.microsoft.com/office/drawing/2015/10/21/chartex" xmlns:cx3="http://schemas.microsoft.com/office/drawing/2016/5/9/chartex" xmlns:cx4="http://schemas.microsoft.com/office/drawing/2016/5/10/chartex" xmlns:cx5="http://schemas.microsoft.com/office/drawing/2016/5/11/chartex" xmlns:cx6="http://schemas.microsoft.com/office/drawing/2016/5/12/chartex" xmlns:cx7="http://schemas.microsoft.com/office/drawing/2016/5/13/chartex" xmlns:cx8="http://schemas.microsoft.com/office/drawing/2016/5/14/chartex" xmlns:mc="http://schemas.openxmlformats.org/markup-compatibility/2006" xmlns:aink="http://schemas.microsoft.com/office/drawing/2016/ink" xmlns:am3d="http://schemas.microsoft.com/office/drawing/2017/model3d" xmlns:o="urn:schemas-microsoft-com:office:office" xmlns:oel="http://schemas.microsoft.com/office/2019/extlst" xmlns:r="http://schemas.openxmlformats.org/officeDocument/2006/relationships" xmlns:m="http://schemas.openxmlformats.org/officeDocument/2006/math" xmlns:v="urn:schemas-microsoft-com:vml" xmlns:wp14="http://schemas.microsoft.com/office/word/2010/wordprocessingDrawing" xmlns:wp="http://schemas.openxmlformats.org/drawingml/2006/wordprocessingDrawing" xmlns:w10="urn:schemas-microsoft-com:office:word" xmlns:w="http://schemas.openxmlformats.org/wordprocessingml/2006/main" xmlns:w14="http://schemas.microsoft.com/office/word/2010/wordml" xmlns:w15="http://schemas.microsoft.com/office/word/2012/wordml" xmlns:w16cex="http://schemas.microsoft.com/office/word/2018/wordml/cex" xmlns:w16cid="http://schemas.microsoft.com/office/word/2016/wordml/cid" xmlns:w16="http://schemas.microsoft.com/office/word/2018/wordml" xmlns:w16du="http://schemas.microsoft.com/office/word/2023/wordml/word16du" xmlns:w16sdtdh="http://schemas.microsoft.com/office/word/2020/wordml/sdtdatahash" xmlns:w16sdtfl="http://schemas.microsoft.com/office/word/2024/wordml/sdtformatlock" xmlns:w16se="http://schemas.microsoft.com/office/word/2015/wordml/symex" xmlns:wpg="http://schemas.microsoft.com/office/word/2010/wordprocessingGroup" xmlns:wpi="http://schemas.microsoft.com/office/word/2010/wordprocessingInk" xmlns:wne="http://schemas.microsoft.com/office/word/2006/wordml" xmlns:wps="http://schemas.microsoft.com/office/word/2010/wordprocessingShape" mc:Ignorable="w14 w15 w16se w16cid w16 w16cex w16sdtdh w16sdtfl w16du wp14">
+  <w:p>
+    <w:pPr>
+      <w:pStyle w:val="a5"/>
+      <w:pBdr>
+        <w:bottom w:val="double" w:sz="6" w:space="1" w:color="000000"/>
+      </w:pBdr>
+      <w:spacing w:line="240" w:lineRule="exact"/>
+      <w:ind w:firstLine="0"/>
+      <w:jc w:val="center"/>
+      <w:rPr>
+        <w:rFonts w:hint="eastAsia"/>
+      </w:rPr>
+    </w:pPr>
+    <w:r>
+      <w:rPr>
+        <w:sz w:val="18"/>
+      </w:rPr>
+      <w:t>摘要</w:t>
+    </w:r>
+  </w:p>
+</w:hdr>
+</file>
+
+<file path=word/header2.xml><?xml version="1.0" encoding="utf-8"?>
+<w:hdr xmlns:wpc="http://schemas.microsoft.com/office/word/2010/wordprocessingCanvas" xmlns:cx="http://schemas.microsoft.com/office/drawing/2014/chartex" xmlns:cx1="http://schemas.microsoft.com/office/drawing/2015/9/8/chartex" xmlns:cx2="http://schemas.microsoft.com/office/drawing/2015/10/21/chartex" xmlns:cx3="http://schemas.microsoft.com/office/drawing/2016/5/9/chartex" xmlns:cx4="http://schemas.microsoft.com/office/drawing/2016/5/10/chartex" xmlns:cx5="http://schemas.microsoft.com/office/drawing/2016/5/11/chartex" xmlns:cx6="http://schemas.microsoft.com/office/drawing/2016/5/12/chartex" xmlns:cx7="http://schemas.microsoft.com/office/drawing/2016/5/13/chartex" xmlns:cx8="http://schemas.microsoft.com/office/drawing/2016/5/14/chartex" xmlns:mc="http://schemas.openxmlformats.org/markup-compatibility/2006" xmlns:aink="http://schemas.microsoft.com/office/drawing/2016/ink" xmlns:am3d="http://schemas.microsoft.com/office/drawing/2017/model3d" xmlns:o="urn:schemas-microsoft-com:office:office" xmlns:oel="http://schemas.microsoft.com/office/2019/extlst" xmlns:r="http://schemas.openxmlformats.org/officeDocument/2006/relationships" xmlns:m="http://schemas.openxmlformats.org/officeDocument/2006/math" xmlns:v="urn:schemas-microsoft-com:vml" xmlns:wp14="http://schemas.microsoft.com/office/word/2010/wordprocessingDrawing" xmlns:wp="http://schemas.openxmlformats.org/drawingml/2006/wordprocessingDrawing" xmlns:w10="urn:schemas-microsoft-com:office:word" xmlns:w="http://schemas.openxmlformats.org/wordprocessingml/2006/main" xmlns:w14="http://schemas.microsoft.com/office/word/2010/wordml" xmlns:w15="http://schemas.microsoft.com/office/word/2012/wordml" xmlns:w16cex="http://schemas.microsoft.com/office/word/2018/wordml/cex" xmlns:w16cid="http://schemas.microsoft.com/office/word/2016/wordml/cid" xmlns:w16="http://schemas.microsoft.com/office/word/2018/wordml" xmlns:w16du="http://schemas.microsoft.com/office/word/2023/wordml/word16du" xmlns:w16sdtdh="http://schemas.microsoft.com/office/word/2020/wordml/sdtdatahash" xmlns:w16sdtfl="http://schemas.microsoft.com/office/word/2024/wordml/sdtformatlock" xmlns:w16se="http://schemas.microsoft.com/office/word/2015/wordml/symex" xmlns:wpg="http://schemas.microsoft.com/office/word/2010/wordprocessingGroup" xmlns:wpi="http://schemas.microsoft.com/office/word/2010/wordprocessingInk" xmlns:wne="http://schemas.microsoft.com/office/word/2006/wordml" xmlns:wps="http://schemas.microsoft.com/office/word/2010/wordprocessingShape" mc:Ignorable="w14 w15 w16se w16cid w16 w16cex w16sdtdh w16sdtfl w16du wp14">
+  <w:p>
+    <w:pPr>
+      <w:pStyle w:val="a5"/>
+      <w:pBdr>
+        <w:bottom w:val="double" w:sz="6" w:space="1" w:color="000000"/>
+      </w:pBdr>
+      <w:spacing w:line="240" w:lineRule="exact"/>
+      <w:ind w:firstLine="0"/>
+      <w:jc w:val="center"/>
+      <w:rPr>
+        <w:rFonts w:hint="eastAsia"/>
+      </w:rPr>
+    </w:pPr>
+    <w:r>
+      <w:rPr>
+        <w:rFonts w:ascii="Times New Roman" w:hAnsi="Times New Roman"/>
+        <w:sz w:val="18"/>
+      </w:rPr>
+      <w:t>ABSTRACT</w:t>
+    </w:r>
+  </w:p>
+</w:hdr>
+</file>
+
+<file path=word/header3.xml><?xml version="1.0" encoding="utf-8"?>
+<w:hdr xmlns:wpc="http://schemas.microsoft.com/office/word/2010/wordprocessingCanvas" xmlns:cx="http://schemas.microsoft.com/office/drawing/2014/chartex" xmlns:cx1="http://schemas.microsoft.com/office/drawing/2015/9/8/chartex" xmlns:cx2="http://schemas.microsoft.com/office/drawing/2015/10/21/chartex" xmlns:cx3="http://schemas.microsoft.com/office/drawing/2016/5/9/chartex" xmlns:cx4="http://schemas.microsoft.com/office/drawing/2016/5/10/chartex" xmlns:cx5="http://schemas.microsoft.com/office/drawing/2016/5/11/chartex" xmlns:cx6="http://schemas.microsoft.com/office/drawing/2016/5/12/chartex" xmlns:cx7="http://schemas.microsoft.com/office/drawing/2016/5/13/chartex" xmlns:cx8="http://schemas.microsoft.com/office/drawing/2016/5/14/chartex" xmlns:mc="http://schemas.openxmlformats.org/markup-compatibility/2006" xmlns:aink="http://schemas.microsoft.com/office/drawing/2016/ink" xmlns:am3d="http://schemas.microsoft.com/office/drawing/2017/model3d" xmlns:o="urn:schemas-microsoft-com:office:office" xmlns:oel="http://schemas.microsoft.com/office/2019/extlst" xmlns:r="http://schemas.openxmlformats.org/officeDocument/2006/relationships" xmlns:m="http://schemas.openxmlformats.org/officeDocument/2006/math" xmlns:v="urn:schemas-microsoft-com:vml" xmlns:wp14="http://schemas.microsoft.com/office/word/2010/wordprocessingDrawing" xmlns:wp="http://schemas.openxmlformats.org/drawingml/2006/wordprocessingDrawing" xmlns:w10="urn:schemas-microsoft-com:office:word" xmlns:w="http://schemas.openxmlformats.org/wordprocessingml/2006/main" xmlns:w14="http://schemas.microsoft.com/office/word/2010/wordml" xmlns:w15="http://schemas.microsoft.com/office/word/2012/wordml" xmlns:w16cex="http://schemas.microsoft.com/office/word/2018/wordml/cex" xmlns:w16cid="http://schemas.microsoft.com/office/word/2016/wordml/cid" xmlns:w16="http://schemas.microsoft.com/office/word/2018/wordml" xmlns:w16du="http://schemas.microsoft.com/office/word/2023/wordml/word16du" xmlns:w16sdtdh="http://schemas.microsoft.com/office/word/2020/wordml/sdtdatahash" xmlns:w16sdtfl="http://schemas.microsoft.com/office/word/2024/wordml/sdtformatlock" xmlns:w16se="http://schemas.microsoft.com/office/word/2015/wordml/symex" xmlns:wpg="http://schemas.microsoft.com/office/word/2010/wordprocessingGroup" xmlns:wpi="http://schemas.microsoft.com/office/word/2010/wordprocessingInk" xmlns:wne="http://schemas.microsoft.com/office/word/2006/wordml" xmlns:wps="http://schemas.microsoft.com/office/word/2010/wordprocessingShape" mc:Ignorable="w14 w15 w16se w16cid w16 w16cex w16sdtdh w16sdtfl w16du wp14">
+  <w:p>
+    <w:pPr>
+      <w:pStyle w:val="a5"/>
+      <w:pBdr>
+        <w:bottom w:val="double" w:sz="6" w:space="1" w:color="000000"/>
+      </w:pBdr>
+      <w:spacing w:line="240" w:lineRule="exact"/>
+      <w:ind w:firstLine="0"/>
+      <w:jc w:val="center"/>
+      <w:rPr>
+        <w:rFonts w:hint="eastAsia"/>
+      </w:rPr>
+    </w:pPr>
+    <w:r>
+      <w:rPr>
+        <w:sz w:val="18"/>
+      </w:rPr>
+      <w:t>目录</w:t>
+    </w:r>
+  </w:p>
+</w:hdr>
+</file>
+
+<file path=word/header4.xml><?xml version="1.0" encoding="utf-8"?>
+<w:hdr xmlns:wpc="http://schemas.microsoft.com/office/word/2010/wordprocessingCanvas" xmlns:cx="http://schemas.microsoft.com/office/drawing/2014/chartex" xmlns:cx1="http://schemas.microsoft.com/office/drawing/2015/9/8/chartex" xmlns:cx2="http://schemas.microsoft.com/office/drawing/2015/10/21/chartex" xmlns:cx3="http://schemas.microsoft.com/office/drawing/2016/5/9/chartex" xmlns:cx4="http://schemas.microsoft.com/office/drawing/2016/5/10/chartex" xmlns:cx5="http://schemas.microsoft.com/office/drawing/2016/5/11/chartex" xmlns:cx6="http://schemas.microsoft.com/office/drawing/2016/5/12/chartex" xmlns:cx7="http://schemas.microsoft.com/office/drawing/2016/5/13/chartex" xmlns:cx8="http://schemas.microsoft.com/office/drawing/2016/5/14/chartex" xmlns:mc="http://schemas.openxmlformats.org/markup-compatibility/2006" xmlns:aink="http://schemas.microsoft.com/office/drawing/2016/ink" xmlns:am3d="http://schemas.microsoft.com/office/drawing/2017/model3d" xmlns:o="urn:schemas-microsoft-com:office:office" xmlns:oel="http://schemas.microsoft.com/office/2019/extlst" xmlns:r="http://schemas.openxmlformats.org/officeDocument/2006/relationships" xmlns:m="http://schemas.openxmlformats.org/officeDocument/2006/math" xmlns:v="urn:schemas-microsoft-com:vml" xmlns:wp14="http://schemas.microsoft.com/office/word/2010/wordprocessingDrawing" xmlns:wp="http://schemas.openxmlformats.org/drawingml/2006/wordprocessingDrawing" xmlns:w10="urn:schemas-microsoft-com:office:word" xmlns:w="http://schemas.openxmlformats.org/wordprocessingml/2006/main" xmlns:w14="http://schemas.microsoft.com/office/word/2010/wordml" xmlns:w15="http://schemas.microsoft.com/office/word/2012/wordml" xmlns:w16cex="http://schemas.microsoft.com/office/word/2018/wordml/cex" xmlns:w16cid="http://schemas.microsoft.com/office/word/2016/wordml/cid" xmlns:w16="http://schemas.microsoft.com/office/word/2018/wordml" xmlns:w16du="http://schemas.microsoft.com/office/word/2023/wordml/word16du" xmlns:w16sdtdh="http://schemas.microsoft.com/office/word/2020/wordml/sdtdatahash" xmlns:w16sdtfl="http://schemas.microsoft.com/office/word/2024/wordml/sdtformatlock" xmlns:w16se="http://schemas.microsoft.com/office/word/2015/wordml/symex" xmlns:wpg="http://schemas.microsoft.com/office/word/2010/wordprocessingGroup" xmlns:wpi="http://schemas.microsoft.com/office/word/2010/wordprocessingInk" xmlns:wne="http://schemas.microsoft.com/office/word/2006/wordml" xmlns:wps="http://schemas.microsoft.com/office/word/2010/wordprocessingShape" mc:Ignorable="w14 w15 w16se w16cid w16 w16cex w16sdtdh w16sdtfl w16du wp14">
+  <w:p>
+    <w:pPr>
+      <w:pStyle w:val="a5"/>
+      <w:pBdr>
+        <w:bottom w:val="double" w:sz="6" w:space="1" w:color="000000"/>
+      </w:pBdr>
+      <w:spacing w:line="240" w:lineRule="exact"/>
+      <w:ind w:firstLine="0"/>
+      <w:jc w:val="center"/>
+      <w:rPr>
+        <w:rFonts w:hint="eastAsia"/>
+      </w:rPr>
+    </w:pPr>
+    <w:r>
+      <w:rPr>
+        <w:sz w:val="18"/>
+      </w:rPr>
+      <w:t>基于</w:t>
+    </w:r>
+    <w:r>
+      <w:rPr>
+        <w:sz w:val="18"/>
+      </w:rPr>
+      <w:t>Spring Boot</w:t>
+    </w:r>
+    <w:r>
+      <w:rPr>
+        <w:sz w:val="18"/>
+      </w:rPr>
+      <w:t>的编程错题智能解析助手系统设计与实现</w:t>
+    </w:r>
+  </w:p>
+</w:hdr>
+</file>
+
+<file path=word/header5.xml><?xml version="1.0" encoding="utf-8"?>
+<w:hdr xmlns:wpc="http://schemas.microsoft.com/office/word/2010/wordprocessingCanvas" xmlns:cx="http://schemas.microsoft.com/office/drawing/2014/chartex" xmlns:cx1="http://schemas.microsoft.com/office/drawing/2015/9/8/chartex" xmlns:cx2="http://schemas.microsoft.com/office/drawing/2015/10/21/chartex" xmlns:cx3="http://schemas.microsoft.com/office/drawing/2016/5/9/chartex" xmlns:cx4="http://schemas.microsoft.com/office/drawing/2016/5/10/chartex" xmlns:cx5="http://schemas.microsoft.com/office/drawing/2016/5/11/chartex" xmlns:cx6="http://schemas.microsoft.com/office/drawing/2016/5/12/chartex" xmlns:cx7="http://schemas.microsoft.com/office/drawing/2016/5/13/chartex" xmlns:cx8="http://schemas.microsoft.com/office/drawing/2016/5/14/chartex" xmlns:mc="http://schemas.openxmlformats.org/markup-compatibility/2006" xmlns:aink="http://schemas.microsoft.com/office/drawing/2016/ink" xmlns:am3d="http://schemas.microsoft.com/office/drawing/2017/model3d" xmlns:o="urn:schemas-microsoft-com:office:office" xmlns:oel="http://schemas.microsoft.com/office/2019/extlst" xmlns:r="http://schemas.openxmlformats.org/officeDocument/2006/relationships" xmlns:m="http://schemas.openxmlformats.org/officeDocument/2006/math" xmlns:v="urn:schemas-microsoft-com:vml" xmlns:wp14="http://schemas.microsoft.com/office/word/2010/wordprocessingDrawing" xmlns:wp="http://schemas.openxmlformats.org/drawingml/2006/wordprocessingDrawing" xmlns:w10="urn:schemas-microsoft-com:office:word" xmlns:w="http://schemas.openxmlformats.org/wordprocessingml/2006/main" xmlns:w14="http://schemas.microsoft.com/office/word/2010/wordml" xmlns:w15="http://schemas.microsoft.com/office/word/2012/wordml" xmlns:w16cex="http://schemas.microsoft.com/office/word/2018/wordml/cex" xmlns:w16cid="http://schemas.microsoft.com/office/word/2016/wordml/cid" xmlns:w16="http://schemas.microsoft.com/office/word/2018/wordml" xmlns:w16du="http://schemas.microsoft.com/office/word/2023/wordml/word16du" xmlns:w16sdtdh="http://schemas.microsoft.com/office/word/2020/wordml/sdtdatahash" xmlns:w16sdtfl="http://schemas.microsoft.com/office/word/2024/wordml/sdtformatlock" xmlns:w16se="http://schemas.microsoft.com/office/word/2015/wordml/symex" xmlns:wpg="http://schemas.microsoft.com/office/word/2010/wordprocessingGroup" xmlns:wpi="http://schemas.microsoft.com/office/word/2010/wordprocessingInk" xmlns:wne="http://schemas.microsoft.com/office/word/2006/wordml" xmlns:wps="http://schemas.microsoft.com/office/word/2010/wordprocessingShape" mc:Ignorable="w14 w15 w16se w16cid w16 w16cex w16sdtdh w16sdtfl w16du wp14">
+  <w:p>
+    <w:pPr>
+      <w:pStyle w:val="a5"/>
+      <w:pBdr>
+        <w:bottom w:val="double" w:sz="6" w:space="1" w:color="000000"/>
+      </w:pBdr>
+      <w:spacing w:line="240" w:lineRule="exact"/>
+      <w:ind w:firstLine="0"/>
+      <w:jc w:val="center"/>
+      <w:rPr>
+        <w:rFonts w:hint="eastAsia"/>
+      </w:rPr>
+    </w:pPr>
+    <w:r>
+      <w:rPr>
+        <w:sz w:val="18"/>
+      </w:rPr>
+      <w:t>基于</w:t>
+    </w:r>
+    <w:r>
+      <w:rPr>
+        <w:sz w:val="18"/>
+      </w:rPr>
+      <w:t>Spring Boot</w:t>
+    </w:r>
+    <w:r>
+      <w:rPr>
+        <w:sz w:val="18"/>
+      </w:rPr>
+      <w:t>的编程错题智能解析助手系统设计与实现</w:t>
+    </w:r>
+  </w:p>
+</w:hdr>
 </file>
 
 <file path=word/numbering.xml><?xml version="1.0" encoding="utf-8"?>
@@ -1893,31 +2644,31 @@
       </w:rPr>
     </w:lvl>
   </w:abstractNum>
-  <w:num w:numId="1" w16cid:durableId="456070967">
+  <w:num w:numId="1" w16cid:durableId="418016514">
     <w:abstractNumId w:val="8"/>
   </w:num>
-  <w:num w:numId="2" w16cid:durableId="2089419700">
+  <w:num w:numId="2" w16cid:durableId="1817411077">
     <w:abstractNumId w:val="6"/>
   </w:num>
-  <w:num w:numId="3" w16cid:durableId="612126484">
+  <w:num w:numId="3" w16cid:durableId="235628597">
     <w:abstractNumId w:val="5"/>
   </w:num>
-  <w:num w:numId="4" w16cid:durableId="1161653455">
+  <w:num w:numId="4" w16cid:durableId="1275090183">
     <w:abstractNumId w:val="4"/>
   </w:num>
-  <w:num w:numId="5" w16cid:durableId="2134522208">
+  <w:num w:numId="5" w16cid:durableId="794328566">
     <w:abstractNumId w:val="7"/>
   </w:num>
-  <w:num w:numId="6" w16cid:durableId="902562740">
+  <w:num w:numId="6" w16cid:durableId="463430757">
     <w:abstractNumId w:val="3"/>
   </w:num>
-  <w:num w:numId="7" w16cid:durableId="70584234">
+  <w:num w:numId="7" w16cid:durableId="196356904">
     <w:abstractNumId w:val="2"/>
   </w:num>
-  <w:num w:numId="8" w16cid:durableId="531188688">
+  <w:num w:numId="8" w16cid:durableId="2006207957">
     <w:abstractNumId w:val="1"/>
   </w:num>
-  <w:num w:numId="9" w16cid:durableId="447891380">
+  <w:num w:numId="9" w16cid:durableId="585573988">
     <w:abstractNumId w:val="0"/>
   </w:num>
 </w:numbering>
@@ -2315,11 +3066,12 @@
     <w:rsid w:val="00FC693F"/>
     <w:pPr>
       <w:widowControl w:val="0"/>
-      <w:spacing w:after="0" w:line="360" w:lineRule="auto"/>
+      <w:spacing w:after="0" w:line="400" w:lineRule="exact"/>
       <w:ind w:firstLine="480"/>
     </w:pPr>
     <w:rPr>
       <w:rFonts w:ascii="宋体" w:eastAsia="宋体" w:hAnsi="宋体"/>
+      <w:color w:val="000000"/>
       <w:sz w:val="24"/>
     </w:rPr>
   </w:style>
@@ -2332,15 +3084,15 @@
     <w:qFormat/>
     <w:rsid w:val="00FC693F"/>
     <w:pPr>
-      <w:spacing w:before="480"/>
+      <w:spacing w:before="400" w:after="400" w:line="240" w:lineRule="auto"/>
+      <w:ind w:firstLine="0"/>
+      <w:jc w:val="center"/>
       <w:outlineLvl w:val="0"/>
     </w:pPr>
     <w:rPr>
-      <w:rFonts w:asciiTheme="majorHAnsi" w:eastAsiaTheme="majorEastAsia" w:hAnsiTheme="majorHAnsi" w:cstheme="majorBidi"/>
-      <w:b/>
+      <w:rFonts w:ascii="黑体" w:eastAsia="黑体" w:hAnsi="黑体"/>
       <w:bCs/>
-      <w:color w:val="365F91" w:themeColor="accent1" w:themeShade="BF"/>
-      <w:sz w:val="28"/>
+      <w:sz w:val="30"/>
       <w:szCs w:val="28"/>
     </w:rPr>
   </w:style>
@@ -2647,15 +3399,16 @@
     <w:qFormat/>
     <w:rsid w:val="00FC693F"/>
     <w:pPr>
-      <w:spacing w:after="200" w:line="240" w:lineRule="auto"/>
+      <w:spacing w:before="720" w:line="240" w:lineRule="auto"/>
       <w:ind w:firstLine="0"/>
       <w:contextualSpacing/>
+      <w:jc w:val="center"/>
     </w:pPr>
     <w:rPr>
-      <w:b/>
+      <w:rFonts w:ascii="黑体" w:eastAsia="黑体" w:hAnsi="黑体"/>
       <w:spacing w:val="5"/>
       <w:kern w:val="28"/>
-      <w:sz w:val="30"/>
+      <w:sz w:val="36"/>
       <w:szCs w:val="52"/>
     </w:rPr>
   </w:style>
@@ -13294,26 +14047,112 @@
     </w:tblStylePr>
   </w:style>
   <w:style w:type="paragraph" w:customStyle="1" w:styleId="aff9">
-    <w:name w:val="论文标题"/>
+    <w:name w:val="摘要标题"/>
     <w:pPr>
       <w:widowControl w:val="0"/>
-      <w:spacing w:before="240" w:after="120"/>
+      <w:spacing w:before="400" w:after="400" w:line="240" w:lineRule="auto"/>
+      <w:jc w:val="center"/>
+    </w:pPr>
+    <w:rPr>
+      <w:rFonts w:ascii="黑体" w:eastAsia="黑体" w:hAnsi="黑体"/>
+      <w:color w:val="000000"/>
+      <w:sz w:val="28"/>
+    </w:rPr>
+  </w:style>
+  <w:style w:type="paragraph" w:customStyle="1" w:styleId="affa">
+    <w:name w:val="英文摘要标题"/>
+    <w:pPr>
+      <w:widowControl w:val="0"/>
+      <w:spacing w:before="400" w:after="400" w:line="240" w:lineRule="auto"/>
+      <w:jc w:val="center"/>
+    </w:pPr>
+    <w:rPr>
+      <w:rFonts w:ascii="Times New Roman" w:eastAsia="Times New Roman" w:hAnsi="Times New Roman"/>
+      <w:b/>
+      <w:color w:val="000000"/>
+      <w:sz w:val="28"/>
+    </w:rPr>
+  </w:style>
+  <w:style w:type="paragraph" w:customStyle="1" w:styleId="affb">
+    <w:name w:val="目录标题"/>
+    <w:pPr>
+      <w:widowControl w:val="0"/>
+      <w:spacing w:before="400" w:after="400" w:line="240" w:lineRule="auto"/>
+      <w:jc w:val="center"/>
+    </w:pPr>
+    <w:rPr>
+      <w:rFonts w:ascii="黑体" w:eastAsia="黑体" w:hAnsi="黑体"/>
+      <w:color w:val="000000"/>
+      <w:sz w:val="28"/>
+    </w:rPr>
+  </w:style>
+  <w:style w:type="paragraph" w:customStyle="1" w:styleId="affc">
+    <w:name w:val="英文摘要正文"/>
+    <w:pPr>
+      <w:widowControl w:val="0"/>
+      <w:spacing w:after="0" w:line="400" w:lineRule="exact"/>
+      <w:ind w:firstLine="480"/>
+    </w:pPr>
+    <w:rPr>
+      <w:rFonts w:ascii="Times New Roman" w:eastAsia="Times New Roman" w:hAnsi="Times New Roman"/>
+      <w:color w:val="000000"/>
+      <w:sz w:val="24"/>
+    </w:rPr>
+  </w:style>
+  <w:style w:type="paragraph" w:customStyle="1" w:styleId="affd">
+    <w:name w:val="参考文献正文"/>
+    <w:pPr>
+      <w:widowControl w:val="0"/>
+      <w:spacing w:after="0" w:line="400" w:lineRule="exact"/>
     </w:pPr>
     <w:rPr>
       <w:rFonts w:ascii="宋体" w:eastAsia="宋体" w:hAnsi="宋体"/>
-      <w:b/>
-      <w:sz w:val="30"/>
+      <w:color w:val="000000"/>
+      <w:sz w:val="21"/>
     </w:rPr>
   </w:style>
-  <w:style w:type="paragraph" w:customStyle="1" w:styleId="affa">
-    <w:name w:val="参考文献正文"/>
+  <w:style w:type="paragraph" w:customStyle="1" w:styleId="affe">
+    <w:name w:val="关键词"/>
     <w:pPr>
       <w:widowControl w:val="0"/>
-      <w:spacing w:after="40" w:line="300" w:lineRule="auto"/>
+      <w:spacing w:after="0" w:line="400" w:lineRule="exact"/>
     </w:pPr>
     <w:rPr>
       <w:rFonts w:ascii="宋体" w:eastAsia="宋体" w:hAnsi="宋体"/>
+      <w:color w:val="000000"/>
       <w:sz w:val="24"/>
+    </w:rPr>
+  </w:style>
+  <w:style w:type="paragraph" w:customStyle="1" w:styleId="afff">
+    <w:name w:val="目录正文"/>
+    <w:pPr>
+      <w:widowControl w:val="0"/>
+      <w:spacing w:after="0" w:line="400" w:lineRule="exact"/>
+    </w:pPr>
+    <w:rPr>
+      <w:rFonts w:ascii="宋体" w:eastAsia="宋体" w:hAnsi="宋体"/>
+      <w:color w:val="000000"/>
+      <w:sz w:val="24"/>
+    </w:rPr>
+  </w:style>
+  <w:style w:type="paragraph" w:styleId="TOC1">
+    <w:name w:val="toc 1"/>
+    <w:basedOn w:val="a1"/>
+    <w:next w:val="a1"/>
+    <w:autoRedefine/>
+    <w:uiPriority w:val="39"/>
+    <w:unhideWhenUsed/>
+    <w:rsid w:val="00AF7207"/>
+  </w:style>
+  <w:style w:type="character" w:styleId="afff0">
+    <w:name w:val="Hyperlink"/>
+    <w:basedOn w:val="a2"/>
+    <w:uiPriority w:val="99"/>
+    <w:unhideWhenUsed/>
+    <w:rsid w:val="00AF7207"/>
+    <w:rPr>
+      <w:color w:val="0000FF" w:themeColor="hyperlink"/>
+      <w:u w:val="single"/>
     </w:rPr>
   </w:style>
 </w:styles>

</xml_diff>

<commit_message>
Make paper validation and evaluation wording concrete
</commit_message>
<xml_diff>
--- a/docs/papers/20230411330_严何涛_基于Spring Boot的编程错题智能解析助手系统设计与实现.docx
+++ b/docs/papers/20230411330_严何涛_基于Spring Boot的编程错题智能解析助手系统设计与实现.docx
@@ -10,13 +10,7 @@
         </w:rPr>
       </w:pPr>
       <w:r>
-        <w:t>基于</w:t>
-      </w:r>
-      <w:r>
-        <w:t>Spring Boot</w:t>
-      </w:r>
-      <w:r>
-        <w:t>的编程错题智能解析助手系统设计与实现</w:t>
+        <w:t>基于Spring Boot的编程错题智能解析助手系统设计与实现</w:t>
       </w:r>
     </w:p>
     <w:p>
@@ -28,10 +22,7 @@
         </w:rPr>
       </w:pPr>
       <w:r>
-        <w:t>严何涛　学号：</w:t>
-      </w:r>
-      <w:r>
-        <w:t>20230411330</w:t>
+        <w:t>严何涛　学号：20230411330</w:t>
       </w:r>
     </w:p>
     <w:p>
@@ -52,37 +43,7 @@
         </w:rPr>
       </w:pPr>
       <w:r>
-        <w:t>当报错信息、原始代码和修改记录分散保存时，复习者难以还原错误产生的原因。本文实现的助手以一条错题为中心，保存题目描述、代码、报错信息以及实际和期望结果；后端据此请求模型分析，并检查返回内容是否包含错误类型、位置、原因、修改建议、参考代码、知识点和学习建议。分析结果与原始响应分别保存，用户还能记录判断和下次复习日期。项目当前的</w:t>
-      </w:r>
-      <w:r>
-        <w:t>Maven</w:t>
-      </w:r>
-      <w:r>
-        <w:t>测试共</w:t>
-      </w:r>
-      <w:r>
-        <w:t>16</w:t>
-      </w:r>
-      <w:r>
-        <w:t>项通过，覆盖账户、模型调用限制和复习规则等实现。另有</w:t>
-      </w:r>
-      <w:r>
-        <w:t>150</w:t>
-      </w:r>
-      <w:r>
-        <w:t>条候选</w:t>
-      </w:r>
-      <w:r>
-        <w:t>Java</w:t>
-      </w:r>
-      <w:r>
-        <w:t>案例及</w:t>
-      </w:r>
-      <w:r>
-        <w:t>300</w:t>
-      </w:r>
-      <w:r>
-        <w:t>行未填写的评分记录，解析准确率尚无可计算的人工评分数据。</w:t>
+        <w:t>当报错信息、原始代码和修改记录分散保存时，复习者难以还原错误产生的原因。本文实现的助手以一条错题为中心，保存题目描述、代码、报错信息以及实际和期望结果；后端据此请求模型分析，并检查返回内容是否包含错误类型、位置、原因、修改建议、参考代码、知识点和学习建议。分析结果与原始响应分别保存，用户还能记录判断和下次复习日期。项目当前的Maven测试共16项通过，覆盖账户、模型调用限制和复习规则等实现。另有150条候选Java案例及300行未填写的评分记录，解析准确率尚无可计算的人工评分数据。</w:t>
       </w:r>
     </w:p>
     <w:p>
@@ -100,13 +61,7 @@
         <w:t>关键词：</w:t>
       </w:r>
       <w:r>
-        <w:t>编程错题；</w:t>
-      </w:r>
-      <w:r>
-        <w:t>Spring Boot</w:t>
-      </w:r>
-      <w:r>
-        <w:t>；智能解析；复习记录；人工核验</w:t>
+        <w:t>编程错题；Spring Boot；智能解析；复习记录；人工核验</w:t>
       </w:r>
     </w:p>
     <w:p>
@@ -154,10 +109,7 @@
         <w:pStyle w:val="affc"/>
       </w:pPr>
       <w:r>
-        <w:t xml:space="preserve">When error messages, source code, and revisions are stored separately, later review can lose the context of a mistake. This paper presents a Spring Boot assistant that keeps these materials in one error record. The backend requests a model explanation, checks seven required fields, and saves both the structured result and the raw response. Users can record their judgment and the next review date. Sixteen Maven tests pass for the current implementation. The project also contains 150 candidate Java cases and </w:t>
-      </w:r>
-      <w:r>
-        <w:t>300 blank rating rows; human ratings are still needed before diagnostic accuracy can be calculated.</w:t>
+        <w:t>When error messages, source code, and revisions are stored separately, later review can lose the context of a mistake. This paper presents a Spring Boot assistant that keeps these materials in one error record. The backend requests a model explanation, checks seven required fields, and saves both the structured result and the raw response. Users can record their judgment and the next review date. Sixteen Maven tests pass for the current implementation. The project also contains 150 candidate Java cases and 300 blank rating rows; human ratings are still needed before diagnostic accuracy can be calculated.</w:t>
       </w:r>
     </w:p>
     <w:p>
@@ -235,7 +187,7 @@
       <w:r>
         <w:fldChar w:fldCharType="separate"/>
       </w:r>
-      <w:hyperlink w:anchor="_Toc243983922" w:history="1">
+      <w:hyperlink w:anchor="_Toc243984165" w:history="1">
         <w:r>
           <w:rPr>
             <w:rStyle w:val="afff0"/>
@@ -272,7 +224,7 @@
             <w:noProof/>
             <w:webHidden/>
           </w:rPr>
-          <w:instrText>PAGEREF _Toc243983922 \h</w:instrText>
+          <w:instrText>PAGEREF _Toc243984165 \h</w:instrText>
         </w:r>
         <w:r>
           <w:rPr>
@@ -332,7 +284,7 @@
           <w14:ligatures w14:val="standardContextual"/>
         </w:rPr>
       </w:pPr>
-      <w:hyperlink w:anchor="_Toc243983923" w:history="1">
+      <w:hyperlink w:anchor="_Toc243984166" w:history="1">
         <w:r>
           <w:rPr>
             <w:rStyle w:val="afff0"/>
@@ -369,7 +321,7 @@
             <w:noProof/>
             <w:webHidden/>
           </w:rPr>
-          <w:instrText>PAGEREF _Toc243983923 \h</w:instrText>
+          <w:instrText>PAGEREF _Toc243984166 \h</w:instrText>
         </w:r>
         <w:r>
           <w:rPr>
@@ -429,7 +381,7 @@
           <w14:ligatures w14:val="standardContextual"/>
         </w:rPr>
       </w:pPr>
-      <w:hyperlink w:anchor="_Toc243983924" w:history="1">
+      <w:hyperlink w:anchor="_Toc243984167" w:history="1">
         <w:r>
           <w:rPr>
             <w:rStyle w:val="afff0"/>
@@ -466,7 +418,7 @@
             <w:noProof/>
             <w:webHidden/>
           </w:rPr>
-          <w:instrText>PAGEREF _Toc243983924 \h</w:instrText>
+          <w:instrText>PAGEREF _Toc243984167 \h</w:instrText>
         </w:r>
         <w:r>
           <w:rPr>
@@ -526,7 +478,7 @@
           <w14:ligatures w14:val="standardContextual"/>
         </w:rPr>
       </w:pPr>
-      <w:hyperlink w:anchor="_Toc243983925" w:history="1">
+      <w:hyperlink w:anchor="_Toc243984168" w:history="1">
         <w:r>
           <w:rPr>
             <w:rStyle w:val="afff0"/>
@@ -563,7 +515,7 @@
             <w:noProof/>
             <w:webHidden/>
           </w:rPr>
-          <w:instrText>PAGEREF _Toc243983925 \h</w:instrText>
+          <w:instrText>PAGEREF _Toc243984168 \h</w:instrText>
         </w:r>
         <w:r>
           <w:rPr>
@@ -623,7 +575,7 @@
           <w14:ligatures w14:val="standardContextual"/>
         </w:rPr>
       </w:pPr>
-      <w:hyperlink w:anchor="_Toc243983926" w:history="1">
+      <w:hyperlink w:anchor="_Toc243984169" w:history="1">
         <w:r>
           <w:rPr>
             <w:rStyle w:val="afff0"/>
@@ -660,7 +612,7 @@
             <w:noProof/>
             <w:webHidden/>
           </w:rPr>
-          <w:instrText>PAGEREF _Toc243983926 \h</w:instrText>
+          <w:instrText>PAGEREF _Toc243984169 \h</w:instrText>
         </w:r>
         <w:r>
           <w:rPr>
@@ -720,7 +672,7 @@
           <w14:ligatures w14:val="standardContextual"/>
         </w:rPr>
       </w:pPr>
-      <w:hyperlink w:anchor="_Toc243983927" w:history="1">
+      <w:hyperlink w:anchor="_Toc243984170" w:history="1">
         <w:r>
           <w:rPr>
             <w:rStyle w:val="afff0"/>
@@ -757,7 +709,7 @@
             <w:noProof/>
             <w:webHidden/>
           </w:rPr>
-          <w:instrText>PAGEREF _Toc243983927 \h</w:instrText>
+          <w:instrText>PAGEREF _Toc243984170 \h</w:instrText>
         </w:r>
         <w:r>
           <w:rPr>
@@ -788,7 +740,7 @@
             <w:noProof/>
             <w:webHidden/>
           </w:rPr>
-          <w:t>3</w:t>
+          <w:t>4</w:t>
         </w:r>
         <w:r>
           <w:rPr>
@@ -817,7 +769,7 @@
           <w14:ligatures w14:val="standardContextual"/>
         </w:rPr>
       </w:pPr>
-      <w:hyperlink w:anchor="_Toc243983928" w:history="1">
+      <w:hyperlink w:anchor="_Toc243984171" w:history="1">
         <w:r>
           <w:rPr>
             <w:rStyle w:val="afff0"/>
@@ -854,7 +806,7 @@
             <w:noProof/>
             <w:webHidden/>
           </w:rPr>
-          <w:instrText>PAGEREF _Toc243983928 \h</w:instrText>
+          <w:instrText>PAGEREF _Toc243984171 \h</w:instrText>
         </w:r>
         <w:r>
           <w:rPr>
@@ -931,13 +883,10 @@
           <w:rFonts w:hint="eastAsia"/>
         </w:rPr>
       </w:pPr>
-      <w:bookmarkStart w:id="0" w:name="_Toc243983922"/>
+      <w:bookmarkStart w:id="0" w:name="_Toc243984165"/>
       <w:r>
         <w:lastRenderedPageBreak/>
-        <w:t>1</w:t>
-      </w:r>
-      <w:r>
-        <w:t>引言</w:t>
+        <w:t>1引言</w:t>
       </w:r>
       <w:bookmarkEnd w:id="0"/>
     </w:p>
@@ -957,13 +906,7 @@
         <w:t>[1]</w:t>
       </w:r>
       <w:r>
-        <w:t>，陈峥等将其用于</w:t>
-      </w:r>
-      <w:r>
-        <w:t>Java</w:t>
-      </w:r>
-      <w:r>
-        <w:t>编程作业评估</w:t>
+        <w:t>，陈峥等将其用于Java编程作业评估</w:t>
       </w:r>
       <w:r>
         <w:rPr>
@@ -1000,7 +943,7 @@
         <w:t>[4]</w:t>
       </w:r>
       <w:r>
-        <w:t>。本文将模型输出定位为供学生参考的分析材料，允许用户记录人工判断，并保留原始响应以便核查。研究目标是完成可运行的个人错题整理与解析流程，考察系统功能能否贯通；解析正确率则须等待独立标注与代码测试。</w:t>
+        <w:t>。学生在“AI分析”页查看错误原因、修改建议和参考代码后，可选择“分析正确”“分析有误”或“暂不确定”，填写核验说明；系统按当前账户保存判断，并保留原始模型响应供后续核查。研究目标是完成可运行的个人错题整理与解析流程，考察系统功能能否贯通；解析正确率则须等待独立标注与代码测试。</w:t>
       </w:r>
     </w:p>
     <w:p>
@@ -1010,13 +953,7 @@
         </w:rPr>
       </w:pPr>
       <w:r>
-        <w:t>本文以个人</w:t>
-      </w:r>
-      <w:r>
-        <w:t>Java</w:t>
-      </w:r>
-      <w:r>
-        <w:t>编程错题为主要分析对象：学习者提供原题、代码和运行现象，应用保存这些材料及后续分析记录。参考代码由页面展示，应用服务器不执行用户提交的程序。这一使用范围要求结果评价同时检查解释文本与参考代码。</w:t>
+        <w:t>本文以个人Java编程错题为主要分析对象：学习者提供原题、代码和运行现象，应用保存这些材料及后续分析记录。参考代码由页面展示，应用服务器不执行用户提交的程序。这一使用范围要求结果评价同时检查解释文本与参考代码。</w:t>
       </w:r>
     </w:p>
     <w:p>
@@ -1026,12 +963,9 @@
           <w:rFonts w:hint="eastAsia"/>
         </w:rPr>
       </w:pPr>
-      <w:bookmarkStart w:id="1" w:name="_Toc243983923"/>
+      <w:bookmarkStart w:id="1" w:name="_Toc243984166"/>
       <w:r>
-        <w:t>2</w:t>
-      </w:r>
-      <w:r>
-        <w:t>系统分析</w:t>
+        <w:t>2系统分析</w:t>
       </w:r>
       <w:bookmarkEnd w:id="1"/>
     </w:p>
@@ -1043,19 +977,7 @@
         </w:rPr>
       </w:pPr>
       <w:r>
-        <w:t>（</w:t>
-      </w:r>
-      <w:r>
-        <w:t>1</w:t>
-      </w:r>
-      <w:r>
-        <w:t>）</w:t>
-      </w:r>
-      <w:r>
-        <w:t xml:space="preserve"> </w:t>
-      </w:r>
-      <w:r>
-        <w:t>用户与任务分析。系统面向已注册的个人学习者。未登录者可访问注册、登录和密码找回入口；登录后可新增、查询、编辑及删除自己的错题，调用解析服务，查看历史分析，记录分析是否可信，并按计划复习。学习者录入的题目描述、源代码、错误消息、实际输出和期望输出共同构成分析依据。若输入缺失，系统可以提示模型说明信息不足，而不能把猜测当成确定原因。</w:t>
+        <w:t>（1） 用户与任务分析。系统面向已注册的个人学习者。未登录者可访问注册、登录和密码找回入口；登录后可新增、查询、编辑及删除自己的错题，调用解析服务，查看历史分析，记录分析是否可信，并按计划复习。学习者录入的题目描述、源代码、错误消息、实际输出和期望输出共同构成分析依据。若输入缺失，系统可以提示模型说明信息不足，而不能把猜测当成确定原因。</w:t>
       </w:r>
     </w:p>
     <w:p>
@@ -1066,19 +988,7 @@
         </w:rPr>
       </w:pPr>
       <w:r>
-        <w:t>（</w:t>
-      </w:r>
-      <w:r>
-        <w:t>2</w:t>
-      </w:r>
-      <w:r>
-        <w:t>）</w:t>
-      </w:r>
-      <w:r>
-        <w:t xml:space="preserve"> </w:t>
-      </w:r>
-      <w:r>
-        <w:t>业务需求分析。一次错题分析应先确认错题归属，再控制调用次数，随后组织模型输入、检查输出并保存结果。系统需要对同一道错题的重复并发分析作限制；对模型不可用或格式错误的情况记录失败状态，避免页面显示虚假的成功。查询分析历史时仍要按当前账户核对错题归属。知识点应与错题关联，便于以后按主题回看。</w:t>
+        <w:t>（2） 业务需求分析。一次错题分析应先确认错题归属，再控制调用次数，随后组织模型输入、检查输出并保存结果。系统需要对同一道错题的重复并发分析作限制；对模型不可用或格式错误的情况记录失败状态，避免页面显示虚假的成功。查询分析历史时仍要按当前账户核对错题归属。知识点应与错题关联，便于以后按主题回看。</w:t>
       </w:r>
     </w:p>
     <w:p>
@@ -1089,31 +999,11 @@
         </w:rPr>
       </w:pPr>
       <w:r>
-        <w:t>（</w:t>
+        <w:t>（3） 非功能需求分析。个人代码和学习记录需要账户隔离，登录凭证不能替代每次数据归属校验。模型请求可能耗时，因此还需限制单用户调用频率与全局并发。已有实现默认每人每天最多20次、全局同时最多3次，但该计数保存在应用</w:t>
       </w:r>
       <w:r>
-        <w:t>3</w:t>
-      </w:r>
-      <w:r>
-        <w:t>）</w:t>
-      </w:r>
-      <w:r>
-        <w:t xml:space="preserve"> </w:t>
-      </w:r>
-      <w:r>
-        <w:t>非功能需求分析。个人代码和学习记录需要账户隔离，登录凭证不能替代每次数据归属校验。模型请求可能耗时，因此还需限制单用户调用频率与全局并发。已有实现默认每人每天最多</w:t>
-      </w:r>
-      <w:r>
-        <w:t>20</w:t>
-      </w:r>
-      <w:r>
-        <w:t>次、全局同时最多</w:t>
-      </w:r>
-      <w:r>
-        <w:t>3</w:t>
-      </w:r>
-      <w:r>
-        <w:t>次，但该计数保存在应用进程中，若部署多个进程，应改为共享计数。页面提供中文桌面工作台；当前需求不包含独立移动端应用。</w:t>
+        <w:lastRenderedPageBreak/>
+        <w:t>进程中，若部署多个进程，应改为共享计数。页面提供中文桌面工作台；当前需求不包含独立移动端应用。</w:t>
       </w:r>
     </w:p>
     <w:p>
@@ -1123,13 +1013,9 @@
           <w:rFonts w:hint="eastAsia"/>
         </w:rPr>
       </w:pPr>
-      <w:bookmarkStart w:id="2" w:name="_Toc243983924"/>
+      <w:bookmarkStart w:id="2" w:name="_Toc243984167"/>
       <w:r>
-        <w:lastRenderedPageBreak/>
-        <w:t>3</w:t>
-      </w:r>
-      <w:r>
-        <w:t>系统设计</w:t>
+        <w:t>3系统设计</w:t>
       </w:r>
       <w:bookmarkEnd w:id="2"/>
     </w:p>
@@ -1141,37 +1027,7 @@
         </w:rPr>
       </w:pPr>
       <w:r>
-        <w:t>（</w:t>
-      </w:r>
-      <w:r>
-        <w:t>1</w:t>
-      </w:r>
-      <w:r>
-        <w:t>）</w:t>
-      </w:r>
-      <w:r>
-        <w:t xml:space="preserve"> </w:t>
-      </w:r>
-      <w:r>
-        <w:t>总体结构。浏览器页面接收错题材料并展示历史记录；</w:t>
-      </w:r>
-      <w:r>
-        <w:t>Spring Boot</w:t>
-      </w:r>
-      <w:r>
-        <w:t>后端根据登录身份检查数据归属，再处理错题和解析请求；</w:t>
-      </w:r>
-      <w:r>
-        <w:t>MySQL</w:t>
-      </w:r>
-      <w:r>
-        <w:t>保存用户、错题、解析、知识点及复习记录。</w:t>
-      </w:r>
-      <w:r>
-        <w:t>Spring Boot</w:t>
-      </w:r>
-      <w:r>
-        <w:t>承担应用启动、接口接入和配置管理</w:t>
+        <w:t>（1） 总体结构。浏览器页面接收错题材料并展示历史记录；Spring Boot后端根据登录身份检查数据归属，再处理错题和解析请求；MySQL保存用户、错题、解析、知识点及复习记录。Spring Boot承担应用启动、接口接入和配置管理</w:t>
       </w:r>
       <w:r>
         <w:rPr>
@@ -1180,13 +1036,7 @@
         <w:t>[5]</w:t>
       </w:r>
       <w:r>
-        <w:t>。默认模型服务为本机</w:t>
-      </w:r>
-      <w:r>
-        <w:t>Ollama</w:t>
-      </w:r>
-      <w:r>
-        <w:t>，其聊天接口接收模型名称与消息内容并返回生成信息</w:t>
+        <w:t>。默认模型服务为本机Ollama，其聊天接口接收模型名称与消息内容并返回生成信息</w:t>
       </w:r>
       <w:r>
         <w:rPr>
@@ -1206,19 +1056,7 @@
         </w:rPr>
       </w:pPr>
       <w:r>
-        <w:t>（</w:t>
-      </w:r>
-      <w:r>
-        <w:t>2</w:t>
-      </w:r>
-      <w:r>
-        <w:t>）</w:t>
-      </w:r>
-      <w:r>
-        <w:t xml:space="preserve"> </w:t>
-      </w:r>
-      <w:r>
-        <w:t>数据结构。用户表与错题表形成一对多关系，错题表保存题目、编程语言、代码及错误上下文。解析结果表保存七项结构化内容，分析记录表保存请求和原始响应，二者分开后既能快速展示，也能追查生成过程。知识点表与错题之间通过关联表建立多对多关系。复习状态表记录连续记住次数和下次日期，复习明细表保存每次选择。数据库通过主键、索引与外键保持关联数据的一致性；外键在删除相关记录时的行为由建表约束确定</w:t>
+        <w:t>（2） 数据结构。用户表与错题表形成一对多关系，错题表保存题目、编程语言、代码及错误上下文。解析结果表保存七项结构化内容，分析记录表保存请求和原始响应，二者分开后既能快速展示，也能追查生成过程。知识点表与错题之间通过关联表建立多对多关系。复习状态表记录连续记住次数和下次日期，复习明细表保存每次选择。数据库通过主键、索引与外键保持关联数据的一致性；外键在删除相关记录时的行为由建表约束确定</w:t>
       </w:r>
       <w:r>
         <w:rPr>
@@ -1238,25 +1076,7 @@
         </w:rPr>
       </w:pPr>
       <w:r>
-        <w:t>（</w:t>
-      </w:r>
-      <w:r>
-        <w:t>3</w:t>
-      </w:r>
-      <w:r>
-        <w:t>）</w:t>
-      </w:r>
-      <w:r>
-        <w:t xml:space="preserve"> </w:t>
-      </w:r>
-      <w:r>
-        <w:t>分析流程。系统先用用户编号和错题编号共同查询目标错题；确认该题未处于分析中且配额可用后，将状态设为分析中。输入模板按题目、代码、报错、实际结果与期望结果分段组织，并明确要求返回固定的</w:t>
-      </w:r>
-      <w:r>
-        <w:t>JSON</w:t>
-      </w:r>
-      <w:r>
-        <w:t>字段。模型响应到达后，程序逐项检查文本字段和知识点数组，拒绝缺失或空值；通过检查的内容在一次数据库处理中保存解析结果、知识点关联和成功记录。若调用或解析失败，则保存失败状态和错误信息。</w:t>
+        <w:t>（3） 分析流程。系统先用用户编号和错题编号共同查询目标错题；确认该题未处于分析中且配额可用后，将状态设为分析中。输入模板按题目、代码、报错、实际结果与期望结果分段组织，并明确要求返回固定的JSON字段。模型响应到达后，程序逐项检查文本字段和知识点数组，拒绝缺失或空值；通过检查的内容在一次数据库处理中保存解析结果、知识点关联和成功记录。若调用或解析失败，则保存失败状态和错误信息。</w:t>
       </w:r>
     </w:p>
     <w:p>
@@ -1267,79 +1087,7 @@
         </w:rPr>
       </w:pPr>
       <w:r>
-        <w:t>（</w:t>
-      </w:r>
-      <w:r>
-        <w:t>4</w:t>
-      </w:r>
-      <w:r>
-        <w:t>）</w:t>
-      </w:r>
-      <w:r>
-        <w:t xml:space="preserve"> </w:t>
-      </w:r>
-      <w:r>
-        <w:t>学习闭环。错题经过分析后，用户可将分析标为准确、不准确或无法判断，并写下依据。这是个人反馈，不等同于专家评分。复习模块记录</w:t>
-      </w:r>
-      <w:r>
-        <w:t>“</w:t>
-      </w:r>
-      <w:r>
-        <w:t>已经记住</w:t>
-      </w:r>
-      <w:r>
-        <w:t>”</w:t>
-      </w:r>
-      <w:r>
-        <w:t>或</w:t>
-      </w:r>
-      <w:r>
-        <w:t>“</w:t>
-      </w:r>
-      <w:r>
-        <w:t>还需练习</w:t>
-      </w:r>
-      <w:r>
-        <w:t>”</w:t>
-      </w:r>
-      <w:r>
-        <w:t>：连续记住时依次安排</w:t>
-      </w:r>
-      <w:r>
-        <w:t>1</w:t>
-      </w:r>
-      <w:r>
-        <w:t>、</w:t>
-      </w:r>
-      <w:r>
-        <w:t>3</w:t>
-      </w:r>
-      <w:r>
-        <w:t>、</w:t>
-      </w:r>
-      <w:r>
-        <w:t>7</w:t>
-      </w:r>
-      <w:r>
-        <w:t>、</w:t>
-      </w:r>
-      <w:r>
-        <w:t>14</w:t>
-      </w:r>
-      <w:r>
-        <w:t>、</w:t>
-      </w:r>
-      <w:r>
-        <w:t>30</w:t>
-      </w:r>
-      <w:r>
-        <w:t>天后的回顾，忘记时重新安排</w:t>
-      </w:r>
-      <w:r>
-        <w:t>1</w:t>
-      </w:r>
-      <w:r>
-        <w:t>天后复习。统计模块按当前账户汇总错题总数、已解析数和分析次数，帮助用户发现尚未处理的记录。</w:t>
+        <w:t>（4） 学习闭环。错题经过分析后，用户可将分析标为准确、不准确或无法判断，并写下依据。这是个人反馈，不等同于专家评分。复习模块记录“已经记住”或“还需练习”：连续记住时依次安排1、3、7、14、30天后的回顾，忘记时重新安排1天后复习。统计模块按当前账户汇总错题总数、已解析数和分析次数，帮助用户发现尚未处理的记录。</w:t>
       </w:r>
     </w:p>
     <w:p>
@@ -1349,12 +1097,9 @@
           <w:rFonts w:hint="eastAsia"/>
         </w:rPr>
       </w:pPr>
-      <w:bookmarkStart w:id="3" w:name="_Toc243983925"/>
+      <w:bookmarkStart w:id="3" w:name="_Toc243984168"/>
       <w:r>
-        <w:t>4</w:t>
-      </w:r>
-      <w:r>
-        <w:t>系统实现</w:t>
+        <w:t>4系统实现</w:t>
       </w:r>
       <w:bookmarkEnd w:id="3"/>
     </w:p>
@@ -1366,25 +1111,7 @@
         </w:rPr>
       </w:pPr>
       <w:r>
-        <w:t>（</w:t>
-      </w:r>
-      <w:r>
-        <w:t>1</w:t>
-      </w:r>
-      <w:r>
-        <w:t>）</w:t>
-      </w:r>
-      <w:r>
-        <w:t xml:space="preserve"> </w:t>
-      </w:r>
-      <w:r>
-        <w:t>账户与错题操作。后端使用</w:t>
-      </w:r>
-      <w:r>
-        <w:t>Spring Security</w:t>
-      </w:r>
-      <w:r>
-        <w:t>检查访问权限，登录后签发携带身份信息的令牌；受保护接口先验证令牌，再按当前用户编号筛选数据。错题新增接口校验必填内容，查询接口支持分页和条件搜索，编辑与删除前再次校验归属。这样的双重检查使页面隐藏其他用户数据之外，后端也不会因为直接访问编号而返回别人的记录。</w:t>
+        <w:t>（1） 账户与错题操作。后端使用Spring Security检查访问权限，登录后签发携带身份信息的令牌；受保护接口先验证令牌，再按当前用户编号筛选数据。错题新增接口校验必填内容，查询接口支持分页和条件搜索，编辑与删除前再次校验归属。这样的双重检查使页面隐藏其他用户数据之外，后端也不会因为直接访问编号而返回别人的记录。</w:t>
       </w:r>
     </w:p>
     <w:p>
@@ -1395,56 +1122,8 @@
         </w:rPr>
       </w:pPr>
       <w:r>
-        <w:t>（</w:t>
-      </w:r>
-      <w:r>
-        <w:t>2</w:t>
-      </w:r>
-      <w:r>
-        <w:t>）</w:t>
-      </w:r>
-      <w:r>
-        <w:t xml:space="preserve"> </w:t>
-      </w:r>
-      <w:r>
-        <w:t>解析内容生成。</w:t>
-      </w:r>
-      <w:r>
-        <w:t>PromptService</w:t>
-      </w:r>
-      <w:r>
-        <w:t>把错题上下文写入统一模板，并说明题目及代码属于待分析数据，不能把其中的命令当作新指令执行。模板要求模型生成错误类型、位置、原因、建议、完整参考代码、</w:t>
-      </w:r>
-      <w:r>
-        <w:t>1</w:t>
-      </w:r>
-      <w:r>
-        <w:t>至</w:t>
-      </w:r>
-      <w:r>
-        <w:t>6</w:t>
-      </w:r>
-      <w:r>
-        <w:t>个知识点及学习建议。</w:t>
-      </w:r>
-      <w:r>
         <w:lastRenderedPageBreak/>
-        <w:t>DeepSeekClient</w:t>
-      </w:r>
-      <w:r>
-        <w:t>调用配置的模型接口；</w:t>
-      </w:r>
-      <w:r>
-        <w:t>AiResultParser</w:t>
-      </w:r>
-      <w:r>
-        <w:t>检查返回字段的类型、非空要求和长度限制，</w:t>
-      </w:r>
-      <w:r>
-        <w:t>AnalysisService</w:t>
-      </w:r>
-      <w:r>
-        <w:t>再保存通过检查的内容。字段检查保证结果能够展示，原因是否正确仍需结合原题判断。</w:t>
+        <w:t>（2） 解析内容生成。PromptService把错题上下文写入统一模板，并说明题目及代码属于待分析数据，不能把其中的命令当作新指令执行。模板要求模型生成错误类型、位置、原因、建议、完整参考代码、1至6个知识点及学习建议。DeepSeekClient调用配置的模型接口；AiResultParser检查返回字段的类型、非空要求和长度限制，AnalysisService再保存通过检查的内容。字段检查保证结果能够展示，原因是否正确仍需结合原题判断。</w:t>
       </w:r>
     </w:p>
     <w:p>
@@ -1454,85 +1133,7 @@
         </w:rPr>
       </w:pPr>
       <w:r>
-        <w:t>实验目录中的候选案例</w:t>
-      </w:r>
-      <w:r>
-        <w:t>ICJ-003</w:t>
-      </w:r>
-      <w:r>
-        <w:t>提供了一个具体输入：随附测试将</w:t>
-      </w:r>
-      <w:r>
-        <w:t>A</w:t>
-      </w:r>
-      <w:r>
-        <w:t>、</w:t>
-      </w:r>
-      <w:r>
-        <w:t>B</w:t>
-      </w:r>
-      <w:r>
-        <w:t>、</w:t>
-      </w:r>
-      <w:r>
-        <w:t>C</w:t>
-      </w:r>
-      <w:r>
-        <w:t>、</w:t>
-      </w:r>
-      <w:r>
-        <w:t>D</w:t>
-      </w:r>
-      <w:r>
-        <w:t>档阈值依次设为</w:t>
-      </w:r>
-      <w:r>
-        <w:t>80</w:t>
-      </w:r>
-      <w:r>
-        <w:t>、</w:t>
-      </w:r>
-      <w:r>
-        <w:t>70</w:t>
-      </w:r>
-      <w:r>
-        <w:t>、</w:t>
-      </w:r>
-      <w:r>
-        <w:t>60</w:t>
-      </w:r>
-      <w:r>
-        <w:t>、</w:t>
-      </w:r>
-      <w:r>
-        <w:t>50</w:t>
-      </w:r>
-      <w:r>
-        <w:t>，成绩</w:t>
-      </w:r>
-      <w:r>
-        <w:t>45</w:t>
-      </w:r>
-      <w:r>
-        <w:t>的预期输出为不及格；候选源码只处理</w:t>
-      </w:r>
-      <w:r>
-        <w:t>A</w:t>
-      </w:r>
-      <w:r>
-        <w:t>至</w:t>
-      </w:r>
-      <w:r>
-        <w:t>D</w:t>
-      </w:r>
-      <w:r>
-        <w:t>档，缺少低于</w:t>
-      </w:r>
-      <w:r>
-        <w:t>D</w:t>
-      </w:r>
-      <w:r>
-        <w:t>档时的输出分支</w:t>
+        <w:t>实验目录中的候选案例ICJ-003提供了一个具体输入：随附测试将A、B、C、D档阈值依次设为80、70、60、50，成绩45的预期输出为不及格；候选源码只处理A至D档，缺少低于D档时的输出分支</w:t>
       </w:r>
       <w:r>
         <w:rPr>
@@ -1552,25 +1153,7 @@
         </w:rPr>
       </w:pPr>
       <w:r>
-        <w:t>（</w:t>
-      </w:r>
-      <w:r>
-        <w:t>3</w:t>
-      </w:r>
-      <w:r>
-        <w:t>）</w:t>
-      </w:r>
-      <w:r>
-        <w:t xml:space="preserve"> </w:t>
-      </w:r>
-      <w:r>
-        <w:t>状态与资源控制。</w:t>
-      </w:r>
-      <w:r>
-        <w:t>AnalysisService</w:t>
-      </w:r>
-      <w:r>
-        <w:t>在模型调用前以数据库条件更新争取分析资格，避免同一道错题被重复处理；调用时获取配额许可，结束后释放。模型返回后，结果、知识点关系和成功记录在同一次处理事务中写入。发生异常时系统记录失败并向页面返回服务不可用信息，用户可以稍后重试。分析历史保留多次解析，以便比较不同时间的回答。</w:t>
+        <w:t>（3） 状态与资源控制。AnalysisService在模型调用前以数据库条件更新争取分析资格，避免同一道错题被重复处理；调用时获取配额许可，结束后释放。模型返回后，结果、知识点关系和成功记录在同一次处理事务中写入。发生异常时系统记录失败并向页面返回服务不可用信息，用户可以稍后重试。分析历史保留多次解析，以便比较不同时间的回答。</w:t>
       </w:r>
     </w:p>
     <w:p>
@@ -1581,25 +1164,7 @@
         </w:rPr>
       </w:pPr>
       <w:r>
-        <w:t>（</w:t>
-      </w:r>
-      <w:r>
-        <w:t>4</w:t>
-      </w:r>
-      <w:r>
-        <w:t>）</w:t>
-      </w:r>
-      <w:r>
-        <w:t xml:space="preserve"> </w:t>
-      </w:r>
-      <w:r>
-        <w:t>复习与展示。</w:t>
-      </w:r>
-      <w:r>
-        <w:t>ReviewService</w:t>
-      </w:r>
-      <w:r>
-        <w:t>查询当前账户待复习的错题，写入复习明细并更新下一次日期；对尚未到期的重复提交返回冲突信息。浏览器工作台把原题、模型解释、参考代码、人工判断和复习入口放在连续操作路径中。页面显示的参考代码不会由应用自动编译或运行，因此用户应结合题目要求和测试结果决定是否采纳。</w:t>
+        <w:t>（4） 复习与展示。ReviewService查询当前账户待复习的错题，写入复习明细并更新下一次日期；对尚未到期的重复提交返回冲突信息。浏览器工作台把原题、模型解释、参考代码、人工判断和复习入口放在连续操作路径中。页面显示的参考代码不会由应用自动编译或运行，因此用户应结合题目要求和测试结果决定是否采纳。</w:t>
       </w:r>
     </w:p>
     <w:p>
@@ -1609,12 +1174,9 @@
           <w:rFonts w:hint="eastAsia"/>
         </w:rPr>
       </w:pPr>
-      <w:bookmarkStart w:id="4" w:name="_Toc243983926"/>
+      <w:bookmarkStart w:id="4" w:name="_Toc243984169"/>
       <w:r>
-        <w:t>5</w:t>
-      </w:r>
-      <w:r>
-        <w:t>结果与讨论</w:t>
+        <w:t>5结果与讨论</w:t>
       </w:r>
       <w:bookmarkEnd w:id="4"/>
     </w:p>
@@ -1626,61 +1188,7 @@
         </w:rPr>
       </w:pPr>
       <w:r>
-        <w:t>（</w:t>
-      </w:r>
-      <w:r>
-        <w:t>1</w:t>
-      </w:r>
-      <w:r>
-        <w:t>）</w:t>
-      </w:r>
-      <w:r>
-        <w:t xml:space="preserve"> </w:t>
-      </w:r>
-      <w:r>
-        <w:t>功能验证。</w:t>
-      </w:r>
-      <w:r>
-        <w:t>2026</w:t>
-      </w:r>
-      <w:r>
-        <w:t>年</w:t>
-      </w:r>
-      <w:r>
-        <w:t>10</w:t>
-      </w:r>
-      <w:r>
-        <w:t>月</w:t>
-      </w:r>
-      <w:r>
-        <w:t>26</w:t>
-      </w:r>
-      <w:r>
-        <w:t>日在项目当前检出版本执行</w:t>
-      </w:r>
-      <w:r>
-        <w:t>mvn -q test</w:t>
-      </w:r>
-      <w:r>
-        <w:t>，测试报告记录</w:t>
-      </w:r>
-      <w:r>
-        <w:t>16</w:t>
-      </w:r>
-      <w:r>
-        <w:t>项测试、</w:t>
-      </w:r>
-      <w:r>
-        <w:t>0</w:t>
-      </w:r>
-      <w:r>
-        <w:t>项失败、</w:t>
-      </w:r>
-      <w:r>
-        <w:t>0</w:t>
-      </w:r>
-      <w:r>
-        <w:t>项错误。测试涉及账户控制、登录限制、登录凭证、模型客户端、调用配额、复习规则和异常响应。源码中还可查到错题、解析、反馈及知识点的接口与数据表。上述证据支持已覆盖功能的实现结论。</w:t>
+        <w:t>（1） 功能验证。2026年10月26日在项目当前检出版本执行mvn -q test，测试报告记录16项测试、0项失败、0项错误。测试涉及账户控制、登录限制、登录凭证、模型客户端、调用配额、复习规则和异常响应。源码中还可查到错题、解析、反馈及知识点的接口与数据表。上述证据支持已覆盖功能的实现结论。</w:t>
       </w:r>
     </w:p>
     <w:p>
@@ -1691,49 +1199,7 @@
         </w:rPr>
       </w:pPr>
       <w:r>
-        <w:t>（</w:t>
-      </w:r>
-      <w:r>
-        <w:t>2</w:t>
-      </w:r>
-      <w:r>
-        <w:t>）</w:t>
-      </w:r>
-      <w:r>
-        <w:t xml:space="preserve"> </w:t>
-      </w:r>
-      <w:r>
-        <w:t>解析效果证据。项目实验目录保存来自</w:t>
-      </w:r>
-      <w:r>
-        <w:t>IntroClassJava</w:t>
-      </w:r>
-      <w:r>
-        <w:t>的</w:t>
-      </w:r>
-      <w:r>
-        <w:t>150</w:t>
-      </w:r>
-      <w:r>
-        <w:t>条候选</w:t>
-      </w:r>
-      <w:r>
-        <w:t>Java</w:t>
-      </w:r>
-      <w:r>
-        <w:t>案例及两种提示词设置的</w:t>
-      </w:r>
-      <w:r>
-        <w:t>300</w:t>
-      </w:r>
-      <w:r>
-        <w:t>行评分表。该公开数据集提供带错误的</w:t>
-      </w:r>
-      <w:r>
-        <w:t>Java</w:t>
-      </w:r>
-      <w:r>
-        <w:t>程序，适合作为可追溯的候选来源</w:t>
+        <w:t>（2） 解析效果证据。项目实验目录保存来自IntroClassJava的150条候选Java案例及两种提示词设置的300行评分表。该公开数据集提供带错误的Java程序，适合作为可追溯的候选来源</w:t>
       </w:r>
       <w:r>
         <w:rPr>
@@ -1753,19 +1219,11 @@
         </w:rPr>
       </w:pPr>
       <w:r>
-        <w:t>（</w:t>
+        <w:t>（3） 后续验证。评价将固定模型版本与案例集合，分别记录错误原因、修改建议、知识点和参考代码的人工判断；参考代码需要在隔离环境中运行对应测试。报告各项结果时应给出实际完成评分的分母。公开案例可能与模型训练材料重合，</w:t>
       </w:r>
       <w:r>
-        <w:t>3</w:t>
-      </w:r>
-      <w:r>
-        <w:t>）</w:t>
-      </w:r>
-      <w:r>
-        <w:t xml:space="preserve"> </w:t>
-      </w:r>
-      <w:r>
-        <w:t>后续验证。评价将固定模型版本与案例集合，分别记录错误原因、修改建议、知识点和参考代码的人工判断；参考代码需要在隔离环境中运行对应测试。报告各项结果时应给出实际完成评分的分母。公开案例可能与模型训练材料重合，因而还需加入真实课程错题，检验结论在日常学习材料上是否成立。</w:t>
+        <w:lastRenderedPageBreak/>
+        <w:t>因而还需加入真实课程错题，检验结论在日常学习材料上是否成立。</w:t>
       </w:r>
     </w:p>
     <w:p>
@@ -1775,12 +1233,9 @@
           <w:rFonts w:hint="eastAsia"/>
         </w:rPr>
       </w:pPr>
-      <w:bookmarkStart w:id="5" w:name="_Toc243983927"/>
+      <w:bookmarkStart w:id="5" w:name="_Toc243984170"/>
       <w:r>
-        <w:t>6</w:t>
-      </w:r>
-      <w:r>
-        <w:t>结论</w:t>
+        <w:t>6结论</w:t>
       </w:r>
       <w:bookmarkEnd w:id="5"/>
     </w:p>
@@ -1791,7 +1246,6 @@
         </w:rPr>
       </w:pPr>
       <w:r>
-        <w:lastRenderedPageBreak/>
         <w:t>系统把原题材料、模型生成解释、人工判断和复习日期关联到同一条错题。账户归属检查、字段校验和调用限额使这些记录能够按用户保存和查看；自动化测试验证了其中已覆盖的业务规则。</w:t>
       </w:r>
     </w:p>
@@ -1802,7 +1256,7 @@
         </w:rPr>
       </w:pPr>
       <w:r>
-        <w:t>下一阶段将对候选案例完成原因与建议评分，并在隔离环境中测试参考代码，再使用真实课程错题复核结果。这些工作完成后，才能评价解析内容对学习者的实际帮助。</w:t>
+        <w:t>实验表按150条案例和两种提示词设置预留300行。实际评估时，核验者需分别记录错误原因与修改建议是否正确、参考代码是否通过对应测试，三项用0或1填写；缺项不计入已核验样本。取得模型输出并完成标注后，按两种设置分别报告有效样本数和三项通过比例，再用真实课程错题复核。</w:t>
       </w:r>
     </w:p>
     <w:p>
@@ -1828,7 +1282,7 @@
           <w:rFonts w:hint="eastAsia"/>
         </w:rPr>
       </w:pPr>
-      <w:bookmarkStart w:id="6" w:name="_Toc243983928"/>
+      <w:bookmarkStart w:id="6" w:name="_Toc243984171"/>
       <w:r>
         <w:lastRenderedPageBreak/>
         <w:t>参考文献</w:t>
@@ -1843,37 +1297,7 @@
         </w:rPr>
       </w:pPr>
       <w:r>
-        <w:t>[1]</w:t>
-      </w:r>
-      <w:r>
-        <w:t>唐琳</w:t>
-      </w:r>
-      <w:r>
-        <w:t xml:space="preserve">, </w:t>
-      </w:r>
-      <w:r>
-        <w:t>张佳鑫</w:t>
-      </w:r>
-      <w:r>
-        <w:t xml:space="preserve">, </w:t>
-      </w:r>
-      <w:r>
-        <w:t>徐照光</w:t>
-      </w:r>
-      <w:r>
-        <w:t xml:space="preserve">. </w:t>
-      </w:r>
-      <w:r>
-        <w:t>大语言模型在计算机编程实践课程教学中的应用</w:t>
-      </w:r>
-      <w:r>
-        <w:t xml:space="preserve">[J]. </w:t>
-      </w:r>
-      <w:r>
-        <w:t>计算机教育</w:t>
-      </w:r>
-      <w:r>
-        <w:t>, 2025(2): 97-101, 106.</w:t>
+        <w:t>[1]唐琳, 张佳鑫, 徐照光. 大语言模型在计算机编程实践课程教学中的应用[J]. 计算机教育, 2025(2): 97-101, 106.</w:t>
       </w:r>
     </w:p>
     <w:p>
@@ -1884,43 +1308,7 @@
         </w:rPr>
       </w:pPr>
       <w:r>
-        <w:t>[2]</w:t>
-      </w:r>
-      <w:r>
-        <w:t>陈峥</w:t>
-      </w:r>
-      <w:r>
-        <w:t xml:space="preserve">, </w:t>
-      </w:r>
-      <w:r>
-        <w:t>喻俊杰</w:t>
-      </w:r>
-      <w:r>
-        <w:t xml:space="preserve">. </w:t>
-      </w:r>
-      <w:r>
-        <w:t>基于</w:t>
-      </w:r>
-      <w:r>
-        <w:t>LLM</w:t>
-      </w:r>
-      <w:r>
-        <w:t>的</w:t>
-      </w:r>
-      <w:r>
-        <w:t>Java</w:t>
-      </w:r>
-      <w:r>
-        <w:t>编程作业评估与教学实践</w:t>
-      </w:r>
-      <w:r>
-        <w:t xml:space="preserve">[J]. </w:t>
-      </w:r>
-      <w:r>
-        <w:t>计算机教育</w:t>
-      </w:r>
-      <w:r>
-        <w:t>, 2026(6): 198-205.</w:t>
+        <w:t>[2]陈峥, 喻俊杰. 基于LLM的Java编程作业评估与教学实践[J]. 计算机教育, 2026(6): 198-205.</w:t>
       </w:r>
     </w:p>
     <w:p>
@@ -2416,19 +1804,7 @@
       <w:rPr>
         <w:sz w:val="18"/>
       </w:rPr>
-      <w:t>基于</w:t>
-    </w:r>
-    <w:r>
-      <w:rPr>
-        <w:sz w:val="18"/>
-      </w:rPr>
-      <w:t>Spring Boot</w:t>
-    </w:r>
-    <w:r>
-      <w:rPr>
-        <w:sz w:val="18"/>
-      </w:rPr>
-      <w:t>的编程错题智能解析助手系统设计与实现</w:t>
+      <w:t>基于Spring Boot的编程错题智能解析助手系统设计与实现</w:t>
     </w:r>
   </w:p>
 </w:hdr>
@@ -2453,19 +1829,7 @@
       <w:rPr>
         <w:sz w:val="18"/>
       </w:rPr>
-      <w:t>基于</w:t>
-    </w:r>
-    <w:r>
-      <w:rPr>
-        <w:sz w:val="18"/>
-      </w:rPr>
-      <w:t>Spring Boot</w:t>
-    </w:r>
-    <w:r>
-      <w:rPr>
-        <w:sz w:val="18"/>
-      </w:rPr>
-      <w:t>的编程错题智能解析助手系统设计与实现</w:t>
+      <w:t>基于Spring Boot的编程错题智能解析助手系统设计与实现</w:t>
     </w:r>
   </w:p>
 </w:hdr>

</xml_diff>

<commit_message>
chore: auto sync 2026-10-27 09:13:36
</commit_message>
<xml_diff>
--- a/docs/papers/20230411330_严何涛_基于Spring Boot的编程错题智能解析助手系统设计与实现.docx
+++ b/docs/papers/20230411330_严何涛_基于Spring Boot的编程错题智能解析助手系统设计与实现.docx
@@ -7,9 +7,13 @@
         <w:pStyle w:val="aa"/>
         <w:rPr>
           <w:rFonts w:hint="eastAsia"/>
+          <w:lang w:eastAsia="zh-CN"/>
         </w:rPr>
       </w:pPr>
       <w:r>
+        <w:rPr>
+          <w:lang w:eastAsia="zh-CN"/>
+        </w:rPr>
         <w:t>基于Spring Boot的编程错题智能解析助手系统设计与实现</w:t>
       </w:r>
     </w:p>
@@ -19,10 +23,35 @@
         <w:jc w:val="center"/>
         <w:rPr>
           <w:rFonts w:hint="eastAsia"/>
+          <w:lang w:eastAsia="zh-CN"/>
         </w:rPr>
       </w:pPr>
-      <w:r>
-        <w:t>严何涛　学号：20230411330</w:t>
+      <w:proofErr w:type="gramStart"/>
+      <w:r>
+        <w:rPr>
+          <w:lang w:eastAsia="zh-CN"/>
+        </w:rPr>
+        <w:t>严何涛</w:t>
+      </w:r>
+      <w:r>
+        <w:rPr>
+          <w:rFonts w:hint="eastAsia"/>
+          <w:lang w:eastAsia="zh-CN"/>
+        </w:rPr>
+        <w:t xml:space="preserve">  </w:t>
+      </w:r>
+      <w:r>
+        <w:rPr>
+          <w:lang w:eastAsia="zh-CN"/>
+        </w:rPr>
+        <w:t>学号</w:t>
+      </w:r>
+      <w:proofErr w:type="gramEnd"/>
+      <w:r>
+        <w:rPr>
+          <w:lang w:eastAsia="zh-CN"/>
+        </w:rPr>
+        <w:t>：20230411330</w:t>
       </w:r>
     </w:p>
     <w:p>
@@ -30,19 +59,27 @@
         <w:pStyle w:val="aff9"/>
         <w:rPr>
           <w:rFonts w:hint="eastAsia"/>
+          <w:lang w:eastAsia="zh-CN"/>
         </w:rPr>
       </w:pPr>
       <w:r>
-        <w:t>摘　　要</w:t>
+        <w:rPr>
+          <w:lang w:eastAsia="zh-CN"/>
+        </w:rPr>
+        <w:t>摘要</w:t>
       </w:r>
     </w:p>
     <w:p>
       <w:pPr>
         <w:rPr>
           <w:rFonts w:hint="eastAsia"/>
+          <w:lang w:eastAsia="zh-CN"/>
         </w:rPr>
       </w:pPr>
       <w:r>
+        <w:rPr>
+          <w:lang w:eastAsia="zh-CN"/>
+        </w:rPr>
         <w:t>当报错信息、原始代码和修改记录分散保存时，复习者难以还原错误产生的原因。本文实现的助手以一条错题为中心，保存题目描述、代码、报错信息以及实际和期望结果；后端据此请求模型分析，并检查返回内容是否包含错误类型、位置、原因、修改建议、参考代码、知识点和学习建议。分析结果与原始响应分别保存，用户还能记录判断和下次复习日期。项目当前的Maven测试共16项通过，覆盖账户、模型调用限制和复习规则等实现。另有150条候选Java案例及300行未填写的评分记录，解析准确率尚无可计算的人工评分数据。</w:t>
       </w:r>
     </w:p>
@@ -51,16 +88,21 @@
         <w:pStyle w:val="affe"/>
         <w:rPr>
           <w:rFonts w:hint="eastAsia"/>
+          <w:lang w:eastAsia="zh-CN"/>
         </w:rPr>
       </w:pPr>
       <w:r>
         <w:rPr>
           <w:rFonts w:ascii="黑体" w:hAnsi="黑体"/>
           <w:b/>
+          <w:lang w:eastAsia="zh-CN"/>
         </w:rPr>
         <w:t>关键词：</w:t>
       </w:r>
       <w:r>
+        <w:rPr>
+          <w:lang w:eastAsia="zh-CN"/>
+        </w:rPr>
         <w:t>编程错题；Spring Boot；智能解析；复习记录；人工核验</w:t>
       </w:r>
     </w:p>
@@ -68,6 +110,7 @@
       <w:pPr>
         <w:rPr>
           <w:rFonts w:hint="eastAsia"/>
+          <w:lang w:eastAsia="zh-CN"/>
         </w:rPr>
         <w:sectPr>
           <w:headerReference w:type="default" r:id="rId8"/>
@@ -109,7 +152,15 @@
         <w:pStyle w:val="affc"/>
       </w:pPr>
       <w:r>
-        <w:t>When error messages, source code, and revisions are stored separately, later review can lose the context of a mistake. This paper presents a Spring Boot assistant that keeps these materials in one error record. The backend requests a model explanation, checks seven required fields, and saves both the structured result and the raw response. Users can record their judgment and the next review date. Sixteen Maven tests pass for the current implementation. The project also contains 150 candidate Java cases and 300 blank rating rows; human ratings are still needed before diagnostic accuracy can be calculated.</w:t>
+        <w:t xml:space="preserve">When error messages, source code, and revisions are stored separately, later </w:t>
+      </w:r>
+      <w:proofErr w:type="gramStart"/>
+      <w:r>
+        <w:t>review</w:t>
+      </w:r>
+      <w:proofErr w:type="gramEnd"/>
+      <w:r>
+        <w:t xml:space="preserve"> can lose the context of a mistake. This paper presents a Spring Boot assistant that keeps these materials in one error record. The backend requests a model explanation, checks seven required fields, and saves both the structured result and the raw response. Users can record their judgment and the next review date. Sixteen Maven tests pass for the current implementation. The project also contains 150 candidate Java cases and 300 blank rating rows; human ratings are still needed before diagnostic accuracy can be calculated.</w:t>
       </w:r>
     </w:p>
     <w:p>
@@ -151,820 +202,129 @@
     </w:p>
     <w:p>
       <w:pPr>
-        <w:pStyle w:val="affb"/>
+        <w:pStyle w:val="1"/>
         <w:rPr>
           <w:rFonts w:hint="eastAsia"/>
+          <w:lang w:eastAsia="zh-CN"/>
         </w:rPr>
       </w:pPr>
-      <w:r>
+      <w:bookmarkStart w:id="0" w:name="_Toc243984165"/>
+      <w:r>
+        <w:rPr>
+          <w:lang w:eastAsia="zh-CN"/>
+        </w:rPr>
         <w:lastRenderedPageBreak/>
-        <w:t>目　　录</w:t>
-      </w:r>
+        <w:t>1引言</w:t>
+      </w:r>
+      <w:bookmarkEnd w:id="0"/>
     </w:p>
     <w:p>
       <w:pPr>
-        <w:pStyle w:val="TOC1"/>
-        <w:tabs>
-          <w:tab w:val="right" w:leader="dot" w:pos="8551"/>
-        </w:tabs>
-        <w:rPr>
-          <w:rFonts w:asciiTheme="minorHAnsi" w:eastAsiaTheme="minorEastAsia" w:hAnsiTheme="minorHAnsi" w:hint="eastAsia"/>
-          <w:noProof/>
-          <w:color w:val="auto"/>
-          <w:kern w:val="2"/>
-          <w:sz w:val="22"/>
-          <w:szCs w:val="24"/>
-          <w:lang w:eastAsia="zh-CN"/>
-          <w14:ligatures w14:val="standardContextual"/>
+        <w:rPr>
+          <w:rFonts w:hint="eastAsia"/>
+          <w:lang w:eastAsia="zh-CN"/>
         </w:rPr>
       </w:pPr>
       <w:r>
-        <w:fldChar w:fldCharType="begin"/>
-      </w:r>
-      <w:r>
-        <w:instrText xml:space="preserve"> TOC \o "1-3" \h \z \u </w:instrText>
-      </w:r>
-      <w:r>
-        <w:fldChar w:fldCharType="separate"/>
-      </w:r>
-      <w:hyperlink w:anchor="_Toc243984165" w:history="1">
-        <w:r>
-          <w:rPr>
-            <w:rStyle w:val="afff0"/>
-            <w:noProof/>
-          </w:rPr>
-          <w:t>1引言</w:t>
-        </w:r>
-        <w:r>
-          <w:rPr>
-            <w:rFonts w:hint="eastAsia"/>
-            <w:noProof/>
-            <w:webHidden/>
-          </w:rPr>
-          <w:tab/>
-        </w:r>
-        <w:r>
-          <w:rPr>
-            <w:rFonts w:hint="eastAsia"/>
-            <w:noProof/>
-            <w:webHidden/>
-          </w:rPr>
-          <w:fldChar w:fldCharType="begin"/>
-        </w:r>
-        <w:r>
-          <w:rPr>
-            <w:rFonts w:hint="eastAsia"/>
-            <w:noProof/>
-            <w:webHidden/>
-          </w:rPr>
-          <w:instrText xml:space="preserve"> </w:instrText>
-        </w:r>
-        <w:r>
-          <w:rPr>
-            <w:noProof/>
-            <w:webHidden/>
-          </w:rPr>
-          <w:instrText>PAGEREF _Toc243984165 \h</w:instrText>
-        </w:r>
-        <w:r>
-          <w:rPr>
-            <w:rFonts w:hint="eastAsia"/>
-            <w:noProof/>
-            <w:webHidden/>
-          </w:rPr>
-          <w:instrText xml:space="preserve"> </w:instrText>
-        </w:r>
-        <w:r>
-          <w:rPr>
-            <w:rFonts w:hint="eastAsia"/>
-            <w:noProof/>
-            <w:webHidden/>
-          </w:rPr>
-        </w:r>
-        <w:r>
-          <w:rPr>
-            <w:rFonts w:hint="eastAsia"/>
-            <w:noProof/>
-            <w:webHidden/>
-          </w:rPr>
-          <w:fldChar w:fldCharType="separate"/>
-        </w:r>
-        <w:r>
-          <w:rPr>
-            <w:rFonts w:hint="eastAsia"/>
-            <w:noProof/>
-            <w:webHidden/>
-          </w:rPr>
-          <w:t>1</w:t>
-        </w:r>
-        <w:r>
-          <w:rPr>
-            <w:rFonts w:hint="eastAsia"/>
-            <w:noProof/>
-            <w:webHidden/>
-          </w:rPr>
-          <w:fldChar w:fldCharType="end"/>
-        </w:r>
-      </w:hyperlink>
+        <w:rPr>
+          <w:lang w:eastAsia="zh-CN"/>
+        </w:rPr>
+        <w:t>程序设计课程的练习通常伴随编译错误、运行异常和结果不符合预期等问题。学生若只保存报错截图或修正后的代码，过一段时间便难以还原原始思路，也不容易区分语法失误、边界条件遗漏和算法理解偏差。唐琳等在编程实践课程中引入大语言模型</w:t>
+      </w:r>
+      <w:r>
+        <w:rPr>
+          <w:vertAlign w:val="superscript"/>
+          <w:lang w:eastAsia="zh-CN"/>
+        </w:rPr>
+        <w:t>[1]</w:t>
+      </w:r>
+      <w:r>
+        <w:rPr>
+          <w:lang w:eastAsia="zh-CN"/>
+        </w:rPr>
+        <w:t>，陈峥等将其用于Java编程作业评估</w:t>
+      </w:r>
+      <w:r>
+        <w:rPr>
+          <w:vertAlign w:val="superscript"/>
+          <w:lang w:eastAsia="zh-CN"/>
+        </w:rPr>
+        <w:t>[2]</w:t>
+      </w:r>
+      <w:r>
+        <w:rPr>
+          <w:lang w:eastAsia="zh-CN"/>
+        </w:rPr>
+        <w:t>。针对编程练习自动反馈的综述指出，反馈的内容、生成方式及其对学习者的帮助需要分别分析</w:t>
+      </w:r>
+      <w:r>
+        <w:rPr>
+          <w:vertAlign w:val="superscript"/>
+          <w:lang w:eastAsia="zh-CN"/>
+        </w:rPr>
+        <w:t>[3]</w:t>
+      </w:r>
+      <w:r>
+        <w:rPr>
+          <w:lang w:eastAsia="zh-CN"/>
+        </w:rPr>
+        <w:t>。因此，错题工具除存储原始材料外，还应把错误解释、修改过程和复习活动连接起来。</w:t>
+      </w:r>
     </w:p>
     <w:p>
       <w:pPr>
-        <w:pStyle w:val="TOC1"/>
-        <w:tabs>
-          <w:tab w:val="right" w:leader="dot" w:pos="8551"/>
-        </w:tabs>
-        <w:rPr>
-          <w:rFonts w:asciiTheme="minorHAnsi" w:eastAsiaTheme="minorEastAsia" w:hAnsiTheme="minorHAnsi" w:hint="eastAsia"/>
-          <w:noProof/>
-          <w:color w:val="auto"/>
-          <w:kern w:val="2"/>
-          <w:sz w:val="22"/>
-          <w:szCs w:val="24"/>
-          <w:lang w:eastAsia="zh-CN"/>
-          <w14:ligatures w14:val="standardContextual"/>
+        <w:rPr>
+          <w:rFonts w:hint="eastAsia"/>
+          <w:lang w:eastAsia="zh-CN"/>
         </w:rPr>
       </w:pPr>
-      <w:hyperlink w:anchor="_Toc243984166" w:history="1">
-        <w:r>
-          <w:rPr>
-            <w:rStyle w:val="afff0"/>
-            <w:noProof/>
-          </w:rPr>
-          <w:t>2系统分析</w:t>
-        </w:r>
-        <w:r>
-          <w:rPr>
-            <w:rFonts w:hint="eastAsia"/>
-            <w:noProof/>
-            <w:webHidden/>
-          </w:rPr>
-          <w:tab/>
-        </w:r>
-        <w:r>
-          <w:rPr>
-            <w:rFonts w:hint="eastAsia"/>
-            <w:noProof/>
-            <w:webHidden/>
-          </w:rPr>
-          <w:fldChar w:fldCharType="begin"/>
-        </w:r>
-        <w:r>
-          <w:rPr>
-            <w:rFonts w:hint="eastAsia"/>
-            <w:noProof/>
-            <w:webHidden/>
-          </w:rPr>
-          <w:instrText xml:space="preserve"> </w:instrText>
-        </w:r>
-        <w:r>
-          <w:rPr>
-            <w:noProof/>
-            <w:webHidden/>
-          </w:rPr>
-          <w:instrText>PAGEREF _Toc243984166 \h</w:instrText>
-        </w:r>
-        <w:r>
-          <w:rPr>
-            <w:rFonts w:hint="eastAsia"/>
-            <w:noProof/>
-            <w:webHidden/>
-          </w:rPr>
-          <w:instrText xml:space="preserve"> </w:instrText>
-        </w:r>
-        <w:r>
-          <w:rPr>
-            <w:rFonts w:hint="eastAsia"/>
-            <w:noProof/>
-            <w:webHidden/>
-          </w:rPr>
-        </w:r>
-        <w:r>
-          <w:rPr>
-            <w:rFonts w:hint="eastAsia"/>
-            <w:noProof/>
-            <w:webHidden/>
-          </w:rPr>
-          <w:fldChar w:fldCharType="separate"/>
-        </w:r>
-        <w:r>
-          <w:rPr>
-            <w:rFonts w:hint="eastAsia"/>
-            <w:noProof/>
-            <w:webHidden/>
-          </w:rPr>
-          <w:t>1</w:t>
-        </w:r>
-        <w:r>
-          <w:rPr>
-            <w:rFonts w:hint="eastAsia"/>
-            <w:noProof/>
-            <w:webHidden/>
-          </w:rPr>
-          <w:fldChar w:fldCharType="end"/>
-        </w:r>
-      </w:hyperlink>
+      <w:r>
+        <w:rPr>
+          <w:lang w:eastAsia="zh-CN"/>
+        </w:rPr>
+        <w:t>大语言模型能够生成自然语言解释和参考代码，但流畅的表述不能直接证明判断正确。教育领域的研究同时讨论了这类工具的学习机会与准确性、依赖性等问题</w:t>
+      </w:r>
+      <w:r>
+        <w:rPr>
+          <w:vertAlign w:val="superscript"/>
+          <w:lang w:eastAsia="zh-CN"/>
+        </w:rPr>
+        <w:t>[4]</w:t>
+      </w:r>
+      <w:r>
+        <w:rPr>
+          <w:lang w:eastAsia="zh-CN"/>
+        </w:rPr>
+        <w:t>。学生在“AI分析”页查看错误原因、修改建议和参考代码后，可选择“分析正确”“分析有误”或“暂不确定”，填写核验说明；系统按当前账户保存判断，并保留原始模型响应供后续核查。研究目标是完成可运行的个人错题整理与解析流程，考察系统功能能否贯通；解析正确率则须等待独立标注与代码测试。</w:t>
+      </w:r>
     </w:p>
     <w:p>
       <w:pPr>
-        <w:pStyle w:val="TOC1"/>
-        <w:tabs>
-          <w:tab w:val="right" w:leader="dot" w:pos="8551"/>
-        </w:tabs>
-        <w:rPr>
-          <w:rFonts w:asciiTheme="minorHAnsi" w:eastAsiaTheme="minorEastAsia" w:hAnsiTheme="minorHAnsi" w:hint="eastAsia"/>
-          <w:noProof/>
-          <w:color w:val="auto"/>
-          <w:kern w:val="2"/>
-          <w:sz w:val="22"/>
-          <w:szCs w:val="24"/>
-          <w:lang w:eastAsia="zh-CN"/>
-          <w14:ligatures w14:val="standardContextual"/>
+        <w:rPr>
+          <w:rFonts w:hint="eastAsia"/>
+          <w:lang w:eastAsia="zh-CN"/>
         </w:rPr>
       </w:pPr>
-      <w:hyperlink w:anchor="_Toc243984167" w:history="1">
-        <w:r>
-          <w:rPr>
-            <w:rStyle w:val="afff0"/>
-            <w:noProof/>
-          </w:rPr>
-          <w:t>3系统设计</w:t>
-        </w:r>
-        <w:r>
-          <w:rPr>
-            <w:rFonts w:hint="eastAsia"/>
-            <w:noProof/>
-            <w:webHidden/>
-          </w:rPr>
-          <w:tab/>
-        </w:r>
-        <w:r>
-          <w:rPr>
-            <w:rFonts w:hint="eastAsia"/>
-            <w:noProof/>
-            <w:webHidden/>
-          </w:rPr>
-          <w:fldChar w:fldCharType="begin"/>
-        </w:r>
-        <w:r>
-          <w:rPr>
-            <w:rFonts w:hint="eastAsia"/>
-            <w:noProof/>
-            <w:webHidden/>
-          </w:rPr>
-          <w:instrText xml:space="preserve"> </w:instrText>
-        </w:r>
-        <w:r>
-          <w:rPr>
-            <w:noProof/>
-            <w:webHidden/>
-          </w:rPr>
-          <w:instrText>PAGEREF _Toc243984167 \h</w:instrText>
-        </w:r>
-        <w:r>
-          <w:rPr>
-            <w:rFonts w:hint="eastAsia"/>
-            <w:noProof/>
-            <w:webHidden/>
-          </w:rPr>
-          <w:instrText xml:space="preserve"> </w:instrText>
-        </w:r>
-        <w:r>
-          <w:rPr>
-            <w:rFonts w:hint="eastAsia"/>
-            <w:noProof/>
-            <w:webHidden/>
-          </w:rPr>
-        </w:r>
-        <w:r>
-          <w:rPr>
-            <w:rFonts w:hint="eastAsia"/>
-            <w:noProof/>
-            <w:webHidden/>
-          </w:rPr>
-          <w:fldChar w:fldCharType="separate"/>
-        </w:r>
-        <w:r>
-          <w:rPr>
-            <w:rFonts w:hint="eastAsia"/>
-            <w:noProof/>
-            <w:webHidden/>
-          </w:rPr>
-          <w:t>2</w:t>
-        </w:r>
-        <w:r>
-          <w:rPr>
-            <w:rFonts w:hint="eastAsia"/>
-            <w:noProof/>
-            <w:webHidden/>
-          </w:rPr>
-          <w:fldChar w:fldCharType="end"/>
-        </w:r>
-      </w:hyperlink>
-    </w:p>
-    <w:p>
-      <w:pPr>
-        <w:pStyle w:val="TOC1"/>
-        <w:tabs>
-          <w:tab w:val="right" w:leader="dot" w:pos="8551"/>
-        </w:tabs>
-        <w:rPr>
-          <w:rFonts w:asciiTheme="minorHAnsi" w:eastAsiaTheme="minorEastAsia" w:hAnsiTheme="minorHAnsi" w:hint="eastAsia"/>
-          <w:noProof/>
-          <w:color w:val="auto"/>
-          <w:kern w:val="2"/>
-          <w:sz w:val="22"/>
-          <w:szCs w:val="24"/>
-          <w:lang w:eastAsia="zh-CN"/>
-          <w14:ligatures w14:val="standardContextual"/>
-        </w:rPr>
-      </w:pPr>
-      <w:hyperlink w:anchor="_Toc243984168" w:history="1">
-        <w:r>
-          <w:rPr>
-            <w:rStyle w:val="afff0"/>
-            <w:noProof/>
-          </w:rPr>
-          <w:t>4系统实现</w:t>
-        </w:r>
-        <w:r>
-          <w:rPr>
-            <w:rFonts w:hint="eastAsia"/>
-            <w:noProof/>
-            <w:webHidden/>
-          </w:rPr>
-          <w:tab/>
-        </w:r>
-        <w:r>
-          <w:rPr>
-            <w:rFonts w:hint="eastAsia"/>
-            <w:noProof/>
-            <w:webHidden/>
-          </w:rPr>
-          <w:fldChar w:fldCharType="begin"/>
-        </w:r>
-        <w:r>
-          <w:rPr>
-            <w:rFonts w:hint="eastAsia"/>
-            <w:noProof/>
-            <w:webHidden/>
-          </w:rPr>
-          <w:instrText xml:space="preserve"> </w:instrText>
-        </w:r>
-        <w:r>
-          <w:rPr>
-            <w:noProof/>
-            <w:webHidden/>
-          </w:rPr>
-          <w:instrText>PAGEREF _Toc243984168 \h</w:instrText>
-        </w:r>
-        <w:r>
-          <w:rPr>
-            <w:rFonts w:hint="eastAsia"/>
-            <w:noProof/>
-            <w:webHidden/>
-          </w:rPr>
-          <w:instrText xml:space="preserve"> </w:instrText>
-        </w:r>
-        <w:r>
-          <w:rPr>
-            <w:rFonts w:hint="eastAsia"/>
-            <w:noProof/>
-            <w:webHidden/>
-          </w:rPr>
-        </w:r>
-        <w:r>
-          <w:rPr>
-            <w:rFonts w:hint="eastAsia"/>
-            <w:noProof/>
-            <w:webHidden/>
-          </w:rPr>
-          <w:fldChar w:fldCharType="separate"/>
-        </w:r>
-        <w:r>
-          <w:rPr>
-            <w:rFonts w:hint="eastAsia"/>
-            <w:noProof/>
-            <w:webHidden/>
-          </w:rPr>
-          <w:t>2</w:t>
-        </w:r>
-        <w:r>
-          <w:rPr>
-            <w:rFonts w:hint="eastAsia"/>
-            <w:noProof/>
-            <w:webHidden/>
-          </w:rPr>
-          <w:fldChar w:fldCharType="end"/>
-        </w:r>
-      </w:hyperlink>
-    </w:p>
-    <w:p>
-      <w:pPr>
-        <w:pStyle w:val="TOC1"/>
-        <w:tabs>
-          <w:tab w:val="right" w:leader="dot" w:pos="8551"/>
-        </w:tabs>
-        <w:rPr>
-          <w:rFonts w:asciiTheme="minorHAnsi" w:eastAsiaTheme="minorEastAsia" w:hAnsiTheme="minorHAnsi" w:hint="eastAsia"/>
-          <w:noProof/>
-          <w:color w:val="auto"/>
-          <w:kern w:val="2"/>
-          <w:sz w:val="22"/>
-          <w:szCs w:val="24"/>
-          <w:lang w:eastAsia="zh-CN"/>
-          <w14:ligatures w14:val="standardContextual"/>
-        </w:rPr>
-      </w:pPr>
-      <w:hyperlink w:anchor="_Toc243984169" w:history="1">
-        <w:r>
-          <w:rPr>
-            <w:rStyle w:val="afff0"/>
-            <w:noProof/>
-          </w:rPr>
-          <w:t>5结果与讨论</w:t>
-        </w:r>
-        <w:r>
-          <w:rPr>
-            <w:rFonts w:hint="eastAsia"/>
-            <w:noProof/>
-            <w:webHidden/>
-          </w:rPr>
-          <w:tab/>
-        </w:r>
-        <w:r>
-          <w:rPr>
-            <w:rFonts w:hint="eastAsia"/>
-            <w:noProof/>
-            <w:webHidden/>
-          </w:rPr>
-          <w:fldChar w:fldCharType="begin"/>
-        </w:r>
-        <w:r>
-          <w:rPr>
-            <w:rFonts w:hint="eastAsia"/>
-            <w:noProof/>
-            <w:webHidden/>
-          </w:rPr>
-          <w:instrText xml:space="preserve"> </w:instrText>
-        </w:r>
-        <w:r>
-          <w:rPr>
-            <w:noProof/>
-            <w:webHidden/>
-          </w:rPr>
-          <w:instrText>PAGEREF _Toc243984169 \h</w:instrText>
-        </w:r>
-        <w:r>
-          <w:rPr>
-            <w:rFonts w:hint="eastAsia"/>
-            <w:noProof/>
-            <w:webHidden/>
-          </w:rPr>
-          <w:instrText xml:space="preserve"> </w:instrText>
-        </w:r>
-        <w:r>
-          <w:rPr>
-            <w:rFonts w:hint="eastAsia"/>
-            <w:noProof/>
-            <w:webHidden/>
-          </w:rPr>
-        </w:r>
-        <w:r>
-          <w:rPr>
-            <w:rFonts w:hint="eastAsia"/>
-            <w:noProof/>
-            <w:webHidden/>
-          </w:rPr>
-          <w:fldChar w:fldCharType="separate"/>
-        </w:r>
-        <w:r>
-          <w:rPr>
-            <w:rFonts w:hint="eastAsia"/>
-            <w:noProof/>
-            <w:webHidden/>
-          </w:rPr>
-          <w:t>3</w:t>
-        </w:r>
-        <w:r>
-          <w:rPr>
-            <w:rFonts w:hint="eastAsia"/>
-            <w:noProof/>
-            <w:webHidden/>
-          </w:rPr>
-          <w:fldChar w:fldCharType="end"/>
-        </w:r>
-      </w:hyperlink>
-    </w:p>
-    <w:p>
-      <w:pPr>
-        <w:pStyle w:val="TOC1"/>
-        <w:tabs>
-          <w:tab w:val="right" w:leader="dot" w:pos="8551"/>
-        </w:tabs>
-        <w:rPr>
-          <w:rFonts w:asciiTheme="minorHAnsi" w:eastAsiaTheme="minorEastAsia" w:hAnsiTheme="minorHAnsi" w:hint="eastAsia"/>
-          <w:noProof/>
-          <w:color w:val="auto"/>
-          <w:kern w:val="2"/>
-          <w:sz w:val="22"/>
-          <w:szCs w:val="24"/>
-          <w:lang w:eastAsia="zh-CN"/>
-          <w14:ligatures w14:val="standardContextual"/>
-        </w:rPr>
-      </w:pPr>
-      <w:hyperlink w:anchor="_Toc243984170" w:history="1">
-        <w:r>
-          <w:rPr>
-            <w:rStyle w:val="afff0"/>
-            <w:noProof/>
-          </w:rPr>
-          <w:t>6结论</w:t>
-        </w:r>
-        <w:r>
-          <w:rPr>
-            <w:rFonts w:hint="eastAsia"/>
-            <w:noProof/>
-            <w:webHidden/>
-          </w:rPr>
-          <w:tab/>
-        </w:r>
-        <w:r>
-          <w:rPr>
-            <w:rFonts w:hint="eastAsia"/>
-            <w:noProof/>
-            <w:webHidden/>
-          </w:rPr>
-          <w:fldChar w:fldCharType="begin"/>
-        </w:r>
-        <w:r>
-          <w:rPr>
-            <w:rFonts w:hint="eastAsia"/>
-            <w:noProof/>
-            <w:webHidden/>
-          </w:rPr>
-          <w:instrText xml:space="preserve"> </w:instrText>
-        </w:r>
-        <w:r>
-          <w:rPr>
-            <w:noProof/>
-            <w:webHidden/>
-          </w:rPr>
-          <w:instrText>PAGEREF _Toc243984170 \h</w:instrText>
-        </w:r>
-        <w:r>
-          <w:rPr>
-            <w:rFonts w:hint="eastAsia"/>
-            <w:noProof/>
-            <w:webHidden/>
-          </w:rPr>
-          <w:instrText xml:space="preserve"> </w:instrText>
-        </w:r>
-        <w:r>
-          <w:rPr>
-            <w:rFonts w:hint="eastAsia"/>
-            <w:noProof/>
-            <w:webHidden/>
-          </w:rPr>
-        </w:r>
-        <w:r>
-          <w:rPr>
-            <w:rFonts w:hint="eastAsia"/>
-            <w:noProof/>
-            <w:webHidden/>
-          </w:rPr>
-          <w:fldChar w:fldCharType="separate"/>
-        </w:r>
-        <w:r>
-          <w:rPr>
-            <w:rFonts w:hint="eastAsia"/>
-            <w:noProof/>
-            <w:webHidden/>
-          </w:rPr>
-          <w:t>4</w:t>
-        </w:r>
-        <w:r>
-          <w:rPr>
-            <w:rFonts w:hint="eastAsia"/>
-            <w:noProof/>
-            <w:webHidden/>
-          </w:rPr>
-          <w:fldChar w:fldCharType="end"/>
-        </w:r>
-      </w:hyperlink>
-    </w:p>
-    <w:p>
-      <w:pPr>
-        <w:pStyle w:val="TOC1"/>
-        <w:tabs>
-          <w:tab w:val="right" w:leader="dot" w:pos="8551"/>
-        </w:tabs>
-        <w:rPr>
-          <w:rFonts w:asciiTheme="minorHAnsi" w:eastAsiaTheme="minorEastAsia" w:hAnsiTheme="minorHAnsi" w:hint="eastAsia"/>
-          <w:noProof/>
-          <w:color w:val="auto"/>
-          <w:kern w:val="2"/>
-          <w:sz w:val="22"/>
-          <w:szCs w:val="24"/>
-          <w:lang w:eastAsia="zh-CN"/>
-          <w14:ligatures w14:val="standardContextual"/>
-        </w:rPr>
-      </w:pPr>
-      <w:hyperlink w:anchor="_Toc243984171" w:history="1">
-        <w:r>
-          <w:rPr>
-            <w:rStyle w:val="afff0"/>
-            <w:noProof/>
-          </w:rPr>
-          <w:t>参考文献</w:t>
-        </w:r>
-        <w:r>
-          <w:rPr>
-            <w:rFonts w:hint="eastAsia"/>
-            <w:noProof/>
-            <w:webHidden/>
-          </w:rPr>
-          <w:tab/>
-        </w:r>
-        <w:r>
-          <w:rPr>
-            <w:rFonts w:hint="eastAsia"/>
-            <w:noProof/>
-            <w:webHidden/>
-          </w:rPr>
-          <w:fldChar w:fldCharType="begin"/>
-        </w:r>
-        <w:r>
-          <w:rPr>
-            <w:rFonts w:hint="eastAsia"/>
-            <w:noProof/>
-            <w:webHidden/>
-          </w:rPr>
-          <w:instrText xml:space="preserve"> </w:instrText>
-        </w:r>
-        <w:r>
-          <w:rPr>
-            <w:noProof/>
-            <w:webHidden/>
-          </w:rPr>
-          <w:instrText>PAGEREF _Toc243984171 \h</w:instrText>
-        </w:r>
-        <w:r>
-          <w:rPr>
-            <w:rFonts w:hint="eastAsia"/>
-            <w:noProof/>
-            <w:webHidden/>
-          </w:rPr>
-          <w:instrText xml:space="preserve"> </w:instrText>
-        </w:r>
-        <w:r>
-          <w:rPr>
-            <w:rFonts w:hint="eastAsia"/>
-            <w:noProof/>
-            <w:webHidden/>
-          </w:rPr>
-        </w:r>
-        <w:r>
-          <w:rPr>
-            <w:rFonts w:hint="eastAsia"/>
-            <w:noProof/>
-            <w:webHidden/>
-          </w:rPr>
-          <w:fldChar w:fldCharType="separate"/>
-        </w:r>
-        <w:r>
-          <w:rPr>
-            <w:rFonts w:hint="eastAsia"/>
-            <w:noProof/>
-            <w:webHidden/>
-          </w:rPr>
-          <w:t>5</w:t>
-        </w:r>
-        <w:r>
-          <w:rPr>
-            <w:rFonts w:hint="eastAsia"/>
-            <w:noProof/>
-            <w:webHidden/>
-          </w:rPr>
-          <w:fldChar w:fldCharType="end"/>
-        </w:r>
-      </w:hyperlink>
-    </w:p>
-    <w:p>
-      <w:pPr>
-        <w:pStyle w:val="afff"/>
-        <w:rPr>
-          <w:rFonts w:hint="eastAsia"/>
-        </w:rPr>
-      </w:pPr>
-      <w:r>
-        <w:fldChar w:fldCharType="end"/>
-      </w:r>
-    </w:p>
-    <w:p>
-      <w:pPr>
-        <w:rPr>
-          <w:rFonts w:hint="eastAsia"/>
-        </w:rPr>
-        <w:sectPr>
-          <w:headerReference w:type="default" r:id="rId12"/>
-          <w:footerReference w:type="default" r:id="rId13"/>
-          <w:pgSz w:w="11906" w:h="16838"/>
-          <w:pgMar w:top="1417" w:right="1474" w:bottom="1417" w:left="1871" w:header="850" w:footer="850" w:gutter="0"/>
-          <w:pgNumType w:fmt="upperRoman" w:start="1"/>
-          <w:cols w:space="720"/>
-          <w:docGrid w:linePitch="360"/>
-        </w:sectPr>
-      </w:pPr>
+      <w:r>
+        <w:rPr>
+          <w:lang w:eastAsia="zh-CN"/>
+        </w:rPr>
+        <w:t>本文以个人Java编程错题为主要分析对象：学习者提供原题、代码和运行现象，应用保存这些材料及后续分析记录。参考代码由页面展示，应用服务器不执行用户提交的程序。这一使用范围要求结果评价同时检查解释文本与参考代码。</w:t>
+      </w:r>
     </w:p>
     <w:p>
       <w:pPr>
         <w:pStyle w:val="1"/>
         <w:rPr>
           <w:rFonts w:hint="eastAsia"/>
-        </w:rPr>
-      </w:pPr>
-      <w:bookmarkStart w:id="0" w:name="_Toc243984165"/>
-      <w:r>
-        <w:lastRenderedPageBreak/>
-        <w:t>1引言</w:t>
-      </w:r>
-      <w:bookmarkEnd w:id="0"/>
-    </w:p>
-    <w:p>
-      <w:pPr>
-        <w:rPr>
-          <w:rFonts w:hint="eastAsia"/>
-        </w:rPr>
-      </w:pPr>
-      <w:r>
-        <w:t>程序设计课程的练习通常伴随编译错误、运行异常和结果不符合预期等问题。学生若只保存报错截图或修正后的代码，过一段时间便难以还原原始思路，也不容易区分语法失误、边界条件遗漏和算法理解偏差。唐琳等在编程实践课程中引入大语言模型</w:t>
-      </w:r>
-      <w:r>
-        <w:rPr>
-          <w:vertAlign w:val="superscript"/>
-        </w:rPr>
-        <w:t>[1]</w:t>
-      </w:r>
-      <w:r>
-        <w:t>，陈峥等将其用于Java编程作业评估</w:t>
-      </w:r>
-      <w:r>
-        <w:rPr>
-          <w:vertAlign w:val="superscript"/>
-        </w:rPr>
-        <w:t>[2]</w:t>
-      </w:r>
-      <w:r>
-        <w:t>。针对编程练习自动反馈的综述指出，反馈的内容、生成方式及其对学习者的帮助需要分别分析</w:t>
-      </w:r>
-      <w:r>
-        <w:rPr>
-          <w:vertAlign w:val="superscript"/>
-        </w:rPr>
-        <w:t>[3]</w:t>
-      </w:r>
-      <w:r>
-        <w:t>。因此，错题工具除存储原始材料外，还应把错误解释、修改过程和复习活动连接起来。</w:t>
-      </w:r>
-    </w:p>
-    <w:p>
-      <w:pPr>
-        <w:rPr>
-          <w:rFonts w:hint="eastAsia"/>
-        </w:rPr>
-      </w:pPr>
-      <w:r>
-        <w:t>大语言模型能够生成自然语言解释和参考代码，但流畅的表述不能直接证明判断正确。教育领域的研究同时讨论了这类工具的学习机会与准确性、依赖性等问题</w:t>
-      </w:r>
-      <w:r>
-        <w:rPr>
-          <w:vertAlign w:val="superscript"/>
-        </w:rPr>
-        <w:t>[4]</w:t>
-      </w:r>
-      <w:r>
-        <w:t>。学生在“AI分析”页查看错误原因、修改建议和参考代码后，可选择“分析正确”“分析有误”或“暂不确定”，填写核验说明；系统按当前账户保存判断，并保留原始模型响应供后续核查。研究目标是完成可运行的个人错题整理与解析流程，考察系统功能能否贯通；解析正确率则须等待独立标注与代码测试。</w:t>
-      </w:r>
-    </w:p>
-    <w:p>
-      <w:pPr>
-        <w:rPr>
-          <w:rFonts w:hint="eastAsia"/>
-        </w:rPr>
-      </w:pPr>
-      <w:r>
-        <w:t>本文以个人Java编程错题为主要分析对象：学习者提供原题、代码和运行现象，应用保存这些材料及后续分析记录。参考代码由页面展示，应用服务器不执行用户提交的程序。这一使用范围要求结果评价同时检查解释文本与参考代码。</w:t>
-      </w:r>
-    </w:p>
-    <w:p>
-      <w:pPr>
-        <w:pStyle w:val="1"/>
-        <w:rPr>
-          <w:rFonts w:hint="eastAsia"/>
+          <w:lang w:eastAsia="zh-CN"/>
         </w:rPr>
       </w:pPr>
       <w:bookmarkStart w:id="1" w:name="_Toc243984166"/>
       <w:r>
+        <w:rPr>
+          <w:lang w:eastAsia="zh-CN"/>
+        </w:rPr>
         <w:t>2系统分析</w:t>
       </w:r>
       <w:bookmarkEnd w:id="1"/>
@@ -974,10 +334,28 @@
         <w:ind w:firstLine="0"/>
         <w:rPr>
           <w:rFonts w:hint="eastAsia"/>
+          <w:lang w:eastAsia="zh-CN"/>
         </w:rPr>
       </w:pPr>
       <w:r>
-        <w:t>（1） 用户与任务分析。系统面向已注册的个人学习者。未登录者可访问注册、登录和密码找回入口；登录后可新增、查询、编辑及删除自己的错题，调用解析服务，查看历史分析，记录分析是否可信，并按计划复习。学习者录入的题目描述、源代码、错误消息、实际输出和期望输出共同构成分析依据。若输入缺失，系统可以提示模型说明信息不足，而不能把猜测当成确定原因。</w:t>
+        <w:rPr>
+          <w:lang w:eastAsia="zh-CN"/>
+        </w:rPr>
+        <w:t>（1</w:t>
+      </w:r>
+      <w:proofErr w:type="gramStart"/>
+      <w:r>
+        <w:rPr>
+          <w:lang w:eastAsia="zh-CN"/>
+        </w:rPr>
+        <w:t>） 用户</w:t>
+      </w:r>
+      <w:proofErr w:type="gramEnd"/>
+      <w:r>
+        <w:rPr>
+          <w:lang w:eastAsia="zh-CN"/>
+        </w:rPr>
+        <w:t>与任务分析。系统面向已注册的个人学习者。未登录者可访问注册、登录和密码找回入口；登录后可新增、查询、编辑及删除自己的错题，调用解析服务，查看历史分析，记录分析是否可信，并按计划复习。学习者录入的题目描述、源代码、错误消息、实际输出和期望输出共同构成分析依据。若输入缺失，系统可以提示模型说明信息不足，而不能把猜测当成确定原因。</w:t>
       </w:r>
     </w:p>
     <w:p>
@@ -985,10 +363,28 @@
         <w:ind w:firstLine="0"/>
         <w:rPr>
           <w:rFonts w:hint="eastAsia"/>
+          <w:lang w:eastAsia="zh-CN"/>
         </w:rPr>
       </w:pPr>
       <w:r>
-        <w:t>（2） 业务需求分析。一次错题分析应先确认错题归属，再控制调用次数，随后组织模型输入、检查输出并保存结果。系统需要对同一道错题的重复并发分析作限制；对模型不可用或格式错误的情况记录失败状态，避免页面显示虚假的成功。查询分析历史时仍要按当前账户核对错题归属。知识点应与错题关联，便于以后按主题回看。</w:t>
+        <w:rPr>
+          <w:lang w:eastAsia="zh-CN"/>
+        </w:rPr>
+        <w:t>（2</w:t>
+      </w:r>
+      <w:proofErr w:type="gramStart"/>
+      <w:r>
+        <w:rPr>
+          <w:lang w:eastAsia="zh-CN"/>
+        </w:rPr>
+        <w:t>） 业务</w:t>
+      </w:r>
+      <w:proofErr w:type="gramEnd"/>
+      <w:r>
+        <w:rPr>
+          <w:lang w:eastAsia="zh-CN"/>
+        </w:rPr>
+        <w:t>需求分析。一次错题分析应先确认错题归属，再控制调用次数，随后组织模型输入、检查输出并保存结果。系统需要对同一道错题的重复并发分析作限制；对模型不可用或格式错误的情况记录失败状态，避免页面显示虚假的成功。查询分析历史时仍要按当前账户核对错题归属。知识点应与错题关联，便于以后按主题回看。</w:t>
       </w:r>
     </w:p>
     <w:p>
@@ -996,12 +392,33 @@
         <w:ind w:firstLine="0"/>
         <w:rPr>
           <w:rFonts w:hint="eastAsia"/>
+          <w:lang w:eastAsia="zh-CN"/>
         </w:rPr>
       </w:pPr>
       <w:r>
-        <w:t>（3） 非功能需求分析。个人代码和学习记录需要账户隔离，登录凭证不能替代每次数据归属校验。模型请求可能耗时，因此还需限制单用户调用频率与全局并发。已有实现默认每人每天最多20次、全局同时最多3次，但该计数保存在应用</w:t>
-      </w:r>
-      <w:r>
+        <w:rPr>
+          <w:lang w:eastAsia="zh-CN"/>
+        </w:rPr>
+        <w:t>（3</w:t>
+      </w:r>
+      <w:proofErr w:type="gramStart"/>
+      <w:r>
+        <w:rPr>
+          <w:lang w:eastAsia="zh-CN"/>
+        </w:rPr>
+        <w:t>） 非</w:t>
+      </w:r>
+      <w:proofErr w:type="gramEnd"/>
+      <w:r>
+        <w:rPr>
+          <w:lang w:eastAsia="zh-CN"/>
+        </w:rPr>
+        <w:t>功能需求分析。个人代码和学习记录需要账户隔离，登录凭证不能替代每次数据归属校验。模型请求可能耗时，因此还需限制单用户调用频率与全局并发。已有实现默认每人每天最多20次、全局同时最多3次，但该计数保存在应用</w:t>
+      </w:r>
+      <w:r>
+        <w:rPr>
+          <w:lang w:eastAsia="zh-CN"/>
+        </w:rPr>
         <w:lastRenderedPageBreak/>
         <w:t>进程中，若部署多个进程，应改为共享计数。页面提供中文桌面工作台；当前需求不包含独立移动端应用。</w:t>
       </w:r>
@@ -1011,10 +428,14 @@
         <w:pStyle w:val="1"/>
         <w:rPr>
           <w:rFonts w:hint="eastAsia"/>
+          <w:lang w:eastAsia="zh-CN"/>
         </w:rPr>
       </w:pPr>
       <w:bookmarkStart w:id="2" w:name="_Toc243984167"/>
       <w:r>
+        <w:rPr>
+          <w:lang w:eastAsia="zh-CN"/>
+        </w:rPr>
         <w:t>3系统设计</w:t>
       </w:r>
       <w:bookmarkEnd w:id="2"/>
@@ -1024,27 +445,53 @@
         <w:ind w:firstLine="0"/>
         <w:rPr>
           <w:rFonts w:hint="eastAsia"/>
+          <w:lang w:eastAsia="zh-CN"/>
         </w:rPr>
       </w:pPr>
       <w:r>
-        <w:t>（1） 总体结构。浏览器页面接收错题材料并展示历史记录；Spring Boot后端根据登录身份检查数据归属，再处理错题和解析请求；MySQL保存用户、错题、解析、知识点及复习记录。Spring Boot承担应用启动、接口接入和配置管理</w:t>
+        <w:rPr>
+          <w:lang w:eastAsia="zh-CN"/>
+        </w:rPr>
+        <w:t>（1</w:t>
+      </w:r>
+      <w:proofErr w:type="gramStart"/>
+      <w:r>
+        <w:rPr>
+          <w:lang w:eastAsia="zh-CN"/>
+        </w:rPr>
+        <w:t>） 总体</w:t>
+      </w:r>
+      <w:proofErr w:type="gramEnd"/>
+      <w:r>
+        <w:rPr>
+          <w:lang w:eastAsia="zh-CN"/>
+        </w:rPr>
+        <w:t>结构。浏览器页面接收错题材料并展示历史记录；Spring Boot后端根据登录身份检查数据归属，再处理错题和解析请求；MySQL保存用户、错题、解析、知识点及复习记录。Spring Boot承担应用启动、接口接入和配置管理</w:t>
       </w:r>
       <w:r>
         <w:rPr>
           <w:vertAlign w:val="superscript"/>
+          <w:lang w:eastAsia="zh-CN"/>
         </w:rPr>
         <w:t>[5]</w:t>
       </w:r>
       <w:r>
+        <w:rPr>
+          <w:lang w:eastAsia="zh-CN"/>
+        </w:rPr>
         <w:t>。默认模型服务为本机Ollama，其聊天接口接收模型名称与消息内容并返回生成信息</w:t>
       </w:r>
       <w:r>
         <w:rPr>
           <w:vertAlign w:val="superscript"/>
+          <w:lang w:eastAsia="zh-CN"/>
         </w:rPr>
         <w:t>[6]</w:t>
       </w:r>
       <w:r>
+        <w:rPr>
+          <w:lang w:eastAsia="zh-CN"/>
+        </w:rPr>
         <w:t>；配置项也允许切换到兼容接口。</w:t>
       </w:r>
     </w:p>
@@ -1053,18 +500,40 @@
         <w:ind w:firstLine="0"/>
         <w:rPr>
           <w:rFonts w:hint="eastAsia"/>
+          <w:lang w:eastAsia="zh-CN"/>
         </w:rPr>
       </w:pPr>
       <w:r>
-        <w:t>（2） 数据结构。用户表与错题表形成一对多关系，错题表保存题目、编程语言、代码及错误上下文。解析结果表保存七项结构化内容，分析记录表保存请求和原始响应，二者分开后既能快速展示，也能追查生成过程。知识点表与错题之间通过关联表建立多对多关系。复习状态表记录连续记住次数和下次日期，复习明细表保存每次选择。数据库通过主键、索引与外键保持关联数据的一致性；外键在删除相关记录时的行为由建表约束确定</w:t>
+        <w:rPr>
+          <w:lang w:eastAsia="zh-CN"/>
+        </w:rPr>
+        <w:t>（2</w:t>
+      </w:r>
+      <w:proofErr w:type="gramStart"/>
+      <w:r>
+        <w:rPr>
+          <w:lang w:eastAsia="zh-CN"/>
+        </w:rPr>
+        <w:t>） 数据</w:t>
+      </w:r>
+      <w:proofErr w:type="gramEnd"/>
+      <w:r>
+        <w:rPr>
+          <w:lang w:eastAsia="zh-CN"/>
+        </w:rPr>
+        <w:t>结构。用户表与错题表形成一对多关系，错题表保存题目、编程语言、代码及错误上下文。解析结果表保存七项结构化内容，分析记录表保存请求和原始响应，二者分开后既能快速展示，也能追查生成过程。知识点表与错题之间通过关联表建立多对多关系。复习状态表记录连续记住次数和下次日期，复习明细表保存每次选择。数据库通过主键、索引与外键保持关联数据的一致性；外键在删除相关记录时的行为由建表约束确定</w:t>
       </w:r>
       <w:r>
         <w:rPr>
           <w:vertAlign w:val="superscript"/>
+          <w:lang w:eastAsia="zh-CN"/>
         </w:rPr>
         <w:t>[7]</w:t>
       </w:r>
       <w:r>
+        <w:rPr>
+          <w:lang w:eastAsia="zh-CN"/>
+        </w:rPr>
         <w:t>。</w:t>
       </w:r>
     </w:p>
@@ -1073,10 +542,28 @@
         <w:ind w:firstLine="0"/>
         <w:rPr>
           <w:rFonts w:hint="eastAsia"/>
+          <w:lang w:eastAsia="zh-CN"/>
         </w:rPr>
       </w:pPr>
       <w:r>
-        <w:t>（3） 分析流程。系统先用用户编号和错题编号共同查询目标错题；确认该题未处于分析中且配额可用后，将状态设为分析中。输入模板按题目、代码、报错、实际结果与期望结果分段组织，并明确要求返回固定的JSON字段。模型响应到达后，程序逐项检查文本字段和知识点数组，拒绝缺失或空值；通过检查的内容在一次数据库处理中保存解析结果、知识点关联和成功记录。若调用或解析失败，则保存失败状态和错误信息。</w:t>
+        <w:rPr>
+          <w:lang w:eastAsia="zh-CN"/>
+        </w:rPr>
+        <w:t>（3</w:t>
+      </w:r>
+      <w:proofErr w:type="gramStart"/>
+      <w:r>
+        <w:rPr>
+          <w:lang w:eastAsia="zh-CN"/>
+        </w:rPr>
+        <w:t>） 分析</w:t>
+      </w:r>
+      <w:proofErr w:type="gramEnd"/>
+      <w:r>
+        <w:rPr>
+          <w:lang w:eastAsia="zh-CN"/>
+        </w:rPr>
+        <w:t>流程。系统先用用户编号和错题编号共同查询目标错题；确认该题未处于分析中且配额可用后，将状态设为分析中。输入模板按题目、代码、报错、实际结果与期望结果分段组织，并明确要求返回固定的JSON字段。模型响应到达后，程序逐项检查文本字段和知识点数组，拒绝缺失或空值；通过检查的内容在一次数据库处理中保存解析结果、知识点关联和成功记录。若调用或解析失败，则保存失败状态和错误信息。</w:t>
       </w:r>
     </w:p>
     <w:p>
@@ -1084,10 +571,28 @@
         <w:ind w:firstLine="0"/>
         <w:rPr>
           <w:rFonts w:hint="eastAsia"/>
+          <w:lang w:eastAsia="zh-CN"/>
         </w:rPr>
       </w:pPr>
       <w:r>
-        <w:t>（4） 学习闭环。错题经过分析后，用户可将分析标为准确、不准确或无法判断，并写下依据。这是个人反馈，不等同于专家评分。复习模块记录“已经记住”或“还需练习”：连续记住时依次安排1、3、7、14、30天后的回顾，忘记时重新安排1天后复习。统计模块按当前账户汇总错题总数、已解析数和分析次数，帮助用户发现尚未处理的记录。</w:t>
+        <w:rPr>
+          <w:lang w:eastAsia="zh-CN"/>
+        </w:rPr>
+        <w:t>（4</w:t>
+      </w:r>
+      <w:proofErr w:type="gramStart"/>
+      <w:r>
+        <w:rPr>
+          <w:lang w:eastAsia="zh-CN"/>
+        </w:rPr>
+        <w:t>） 学习</w:t>
+      </w:r>
+      <w:proofErr w:type="gramEnd"/>
+      <w:r>
+        <w:rPr>
+          <w:lang w:eastAsia="zh-CN"/>
+        </w:rPr>
+        <w:t>闭环。错题经过分析后，用户可将分析标为准确、不准确或无法判断，并写下依据。这是个人反馈，不等同于专家评分。复习模块记录“已经记住”或“还需练习”：连续记住时依次安排1、3、7、14、30天后的回顾，忘记时重新安排1天后复习。统计模块按当前账户汇总错题总数、已解析数和分析次数，帮助用户发现尚未处理的记录。</w:t>
       </w:r>
     </w:p>
     <w:p>
@@ -1095,10 +600,14 @@
         <w:pStyle w:val="1"/>
         <w:rPr>
           <w:rFonts w:hint="eastAsia"/>
+          <w:lang w:eastAsia="zh-CN"/>
         </w:rPr>
       </w:pPr>
       <w:bookmarkStart w:id="3" w:name="_Toc243984168"/>
       <w:r>
+        <w:rPr>
+          <w:lang w:eastAsia="zh-CN"/>
+        </w:rPr>
         <w:t>4系统实现</w:t>
       </w:r>
       <w:bookmarkEnd w:id="3"/>
@@ -1108,10 +617,28 @@
         <w:ind w:firstLine="0"/>
         <w:rPr>
           <w:rFonts w:hint="eastAsia"/>
+          <w:lang w:eastAsia="zh-CN"/>
         </w:rPr>
       </w:pPr>
       <w:r>
-        <w:t>（1） 账户与错题操作。后端使用Spring Security检查访问权限，登录后签发携带身份信息的令牌；受保护接口先验证令牌，再按当前用户编号筛选数据。错题新增接口校验必填内容，查询接口支持分页和条件搜索，编辑与删除前再次校验归属。这样的双重检查使页面隐藏其他用户数据之外，后端也不会因为直接访问编号而返回别人的记录。</w:t>
+        <w:rPr>
+          <w:lang w:eastAsia="zh-CN"/>
+        </w:rPr>
+        <w:t>（1</w:t>
+      </w:r>
+      <w:proofErr w:type="gramStart"/>
+      <w:r>
+        <w:rPr>
+          <w:lang w:eastAsia="zh-CN"/>
+        </w:rPr>
+        <w:t>） 账户</w:t>
+      </w:r>
+      <w:proofErr w:type="gramEnd"/>
+      <w:r>
+        <w:rPr>
+          <w:lang w:eastAsia="zh-CN"/>
+        </w:rPr>
+        <w:t>与错题操作。后端使用Spring Security检查访问权限，登录后签发携带身份信息的令牌；受保护接口先验证令牌，再按当前用户编号筛选数据。错题新增接口校验必填内容，查询接口支持分页和条件搜索，编辑与删除前再次校验归属。这样的双重检查使页面隐藏其他用户数据之外，后端也不会因为直接访问编号而返回别人的记录。</w:t>
       </w:r>
     </w:p>
     <w:p>
@@ -1119,29 +646,111 @@
         <w:ind w:firstLine="0"/>
         <w:rPr>
           <w:rFonts w:hint="eastAsia"/>
+          <w:lang w:eastAsia="zh-CN"/>
         </w:rPr>
       </w:pPr>
       <w:r>
+        <w:rPr>
+          <w:lang w:eastAsia="zh-CN"/>
+        </w:rPr>
         <w:lastRenderedPageBreak/>
-        <w:t>（2） 解析内容生成。PromptService把错题上下文写入统一模板，并说明题目及代码属于待分析数据，不能把其中的命令当作新指令执行。模板要求模型生成错误类型、位置、原因、建议、完整参考代码、1至6个知识点及学习建议。DeepSeekClient调用配置的模型接口；AiResultParser检查返回字段的类型、非空要求和长度限制，AnalysisService再保存通过检查的内容。字段检查保证结果能够展示，原因是否正确仍需结合原题判断。</w:t>
+        <w:t>（2</w:t>
+      </w:r>
+      <w:proofErr w:type="gramStart"/>
+      <w:r>
+        <w:rPr>
+          <w:lang w:eastAsia="zh-CN"/>
+        </w:rPr>
+        <w:t>） 解析</w:t>
+      </w:r>
+      <w:proofErr w:type="gramEnd"/>
+      <w:r>
+        <w:rPr>
+          <w:lang w:eastAsia="zh-CN"/>
+        </w:rPr>
+        <w:t>内容生成。</w:t>
+      </w:r>
+      <w:proofErr w:type="spellStart"/>
+      <w:r>
+        <w:rPr>
+          <w:lang w:eastAsia="zh-CN"/>
+        </w:rPr>
+        <w:t>PromptService</w:t>
+      </w:r>
+      <w:proofErr w:type="spellEnd"/>
+      <w:r>
+        <w:rPr>
+          <w:lang w:eastAsia="zh-CN"/>
+        </w:rPr>
+        <w:t>把错题上下文写入统一模板，并说明题目及代码属于待分析数据，不能把其中的命令当作新指令执行。模板要求模型生成错误类型、位置、原因、建议、完整参考代码、1至6个知识点及学习建议。</w:t>
+      </w:r>
+      <w:proofErr w:type="spellStart"/>
+      <w:r>
+        <w:rPr>
+          <w:lang w:eastAsia="zh-CN"/>
+        </w:rPr>
+        <w:t>DeepSeekClient</w:t>
+      </w:r>
+      <w:proofErr w:type="spellEnd"/>
+      <w:r>
+        <w:rPr>
+          <w:lang w:eastAsia="zh-CN"/>
+        </w:rPr>
+        <w:t>调用配置的模型接口；</w:t>
+      </w:r>
+      <w:proofErr w:type="spellStart"/>
+      <w:r>
+        <w:rPr>
+          <w:lang w:eastAsia="zh-CN"/>
+        </w:rPr>
+        <w:t>AiResultParser</w:t>
+      </w:r>
+      <w:proofErr w:type="spellEnd"/>
+      <w:r>
+        <w:rPr>
+          <w:lang w:eastAsia="zh-CN"/>
+        </w:rPr>
+        <w:t>检查返回字段的类型、非空要求和长度限制，</w:t>
+      </w:r>
+      <w:proofErr w:type="spellStart"/>
+      <w:r>
+        <w:rPr>
+          <w:lang w:eastAsia="zh-CN"/>
+        </w:rPr>
+        <w:t>AnalysisService</w:t>
+      </w:r>
+      <w:proofErr w:type="spellEnd"/>
+      <w:r>
+        <w:rPr>
+          <w:lang w:eastAsia="zh-CN"/>
+        </w:rPr>
+        <w:t>再保存通过检查的内容。字段检查保证结果能够展示，原因是否正确仍需结合原题判断。</w:t>
       </w:r>
     </w:p>
     <w:p>
       <w:pPr>
         <w:rPr>
           <w:rFonts w:hint="eastAsia"/>
+          <w:lang w:eastAsia="zh-CN"/>
         </w:rPr>
       </w:pPr>
       <w:r>
+        <w:rPr>
+          <w:lang w:eastAsia="zh-CN"/>
+        </w:rPr>
         <w:t>实验目录中的候选案例ICJ-003提供了一个具体输入：随附测试将A、B、C、D档阈值依次设为80、70、60、50，成绩45的预期输出为不及格；候选源码只处理A至D档，缺少低于D档时的输出分支</w:t>
       </w:r>
       <w:r>
         <w:rPr>
           <w:vertAlign w:val="superscript"/>
+          <w:lang w:eastAsia="zh-CN"/>
         </w:rPr>
         <w:t>[8]</w:t>
       </w:r>
       <w:r>
+        <w:rPr>
+          <w:lang w:eastAsia="zh-CN"/>
+        </w:rPr>
         <w:t>。录入此题时，可分别保存题目、源码、测试输入、实际输出和预期的不及格提示。后端将这些字段交给模型，并把生成的原因和建议留给用户核验；本例的源码与测试说明输入如何组织，不充当模型回答正确的证据。</w:t>
       </w:r>
     </w:p>
@@ -1150,10 +759,42 @@
         <w:ind w:firstLine="0"/>
         <w:rPr>
           <w:rFonts w:hint="eastAsia"/>
+          <w:lang w:eastAsia="zh-CN"/>
         </w:rPr>
       </w:pPr>
       <w:r>
-        <w:t>（3） 状态与资源控制。AnalysisService在模型调用前以数据库条件更新争取分析资格，避免同一道错题被重复处理；调用时获取配额许可，结束后释放。模型返回后，结果、知识点关系和成功记录在同一次处理事务中写入。发生异常时系统记录失败并向页面返回服务不可用信息，用户可以稍后重试。分析历史保留多次解析，以便比较不同时间的回答。</w:t>
+        <w:rPr>
+          <w:lang w:eastAsia="zh-CN"/>
+        </w:rPr>
+        <w:t>（3</w:t>
+      </w:r>
+      <w:proofErr w:type="gramStart"/>
+      <w:r>
+        <w:rPr>
+          <w:lang w:eastAsia="zh-CN"/>
+        </w:rPr>
+        <w:t>） 状态</w:t>
+      </w:r>
+      <w:proofErr w:type="gramEnd"/>
+      <w:r>
+        <w:rPr>
+          <w:lang w:eastAsia="zh-CN"/>
+        </w:rPr>
+        <w:t>与资源控制。</w:t>
+      </w:r>
+      <w:proofErr w:type="spellStart"/>
+      <w:r>
+        <w:rPr>
+          <w:lang w:eastAsia="zh-CN"/>
+        </w:rPr>
+        <w:t>AnalysisService</w:t>
+      </w:r>
+      <w:proofErr w:type="spellEnd"/>
+      <w:r>
+        <w:rPr>
+          <w:lang w:eastAsia="zh-CN"/>
+        </w:rPr>
+        <w:t>在模型调用前以数据库条件更新争取分析资格，避免同一道错题被重复处理；调用时获取配额许可，结束后释放。模型返回后，结果、知识点关系和成功记录在同一次处理事务中写入。发生异常时系统记录失败并向页面返回服务不可用信息，用户可以稍后重试。分析历史保留多次解析，以便比较不同时间的回答。</w:t>
       </w:r>
     </w:p>
     <w:p>
@@ -1161,10 +802,42 @@
         <w:ind w:firstLine="0"/>
         <w:rPr>
           <w:rFonts w:hint="eastAsia"/>
+          <w:lang w:eastAsia="zh-CN"/>
         </w:rPr>
       </w:pPr>
       <w:r>
-        <w:t>（4） 复习与展示。ReviewService查询当前账户待复习的错题，写入复习明细并更新下一次日期；对尚未到期的重复提交返回冲突信息。浏览器工作台把原题、模型解释、参考代码、人工判断和复习入口放在连续操作路径中。页面显示的参考代码不会由应用自动编译或运行，因此用户应结合题目要求和测试结果决定是否采纳。</w:t>
+        <w:rPr>
+          <w:lang w:eastAsia="zh-CN"/>
+        </w:rPr>
+        <w:t>（4</w:t>
+      </w:r>
+      <w:proofErr w:type="gramStart"/>
+      <w:r>
+        <w:rPr>
+          <w:lang w:eastAsia="zh-CN"/>
+        </w:rPr>
+        <w:t>） 复习</w:t>
+      </w:r>
+      <w:proofErr w:type="gramEnd"/>
+      <w:r>
+        <w:rPr>
+          <w:lang w:eastAsia="zh-CN"/>
+        </w:rPr>
+        <w:t>与展示。</w:t>
+      </w:r>
+      <w:proofErr w:type="spellStart"/>
+      <w:r>
+        <w:rPr>
+          <w:lang w:eastAsia="zh-CN"/>
+        </w:rPr>
+        <w:t>ReviewService</w:t>
+      </w:r>
+      <w:proofErr w:type="spellEnd"/>
+      <w:r>
+        <w:rPr>
+          <w:lang w:eastAsia="zh-CN"/>
+        </w:rPr>
+        <w:t>查询当前账户待复习的错题，写入复习明细并更新下一次日期；对尚未到期的重复提交返回冲突信息。浏览器工作台把原题、模型解释、参考代码、人工判断和复习入口放在连续操作路径中。页面显示的参考代码不会由应用自动编译或运行，因此用户应结合题目要求和测试结果决定是否采纳。</w:t>
       </w:r>
     </w:p>
     <w:p>
@@ -1172,10 +845,14 @@
         <w:pStyle w:val="1"/>
         <w:rPr>
           <w:rFonts w:hint="eastAsia"/>
+          <w:lang w:eastAsia="zh-CN"/>
         </w:rPr>
       </w:pPr>
       <w:bookmarkStart w:id="4" w:name="_Toc243984169"/>
       <w:r>
+        <w:rPr>
+          <w:lang w:eastAsia="zh-CN"/>
+        </w:rPr>
         <w:t>5结果与讨论</w:t>
       </w:r>
       <w:bookmarkEnd w:id="4"/>
@@ -1185,10 +862,42 @@
         <w:ind w:firstLine="0"/>
         <w:rPr>
           <w:rFonts w:hint="eastAsia"/>
+          <w:lang w:eastAsia="zh-CN"/>
         </w:rPr>
       </w:pPr>
       <w:r>
-        <w:t>（1） 功能验证。2026年10月26日在项目当前检出版本执行mvn -q test，测试报告记录16项测试、0项失败、0项错误。测试涉及账户控制、登录限制、登录凭证、模型客户端、调用配额、复习规则和异常响应。源码中还可查到错题、解析、反馈及知识点的接口与数据表。上述证据支持已覆盖功能的实现结论。</w:t>
+        <w:rPr>
+          <w:lang w:eastAsia="zh-CN"/>
+        </w:rPr>
+        <w:t>（1</w:t>
+      </w:r>
+      <w:proofErr w:type="gramStart"/>
+      <w:r>
+        <w:rPr>
+          <w:lang w:eastAsia="zh-CN"/>
+        </w:rPr>
+        <w:t>） 功能</w:t>
+      </w:r>
+      <w:proofErr w:type="gramEnd"/>
+      <w:r>
+        <w:rPr>
+          <w:lang w:eastAsia="zh-CN"/>
+        </w:rPr>
+        <w:t>验证。2026年10月26日在项目当前检出版本执行</w:t>
+      </w:r>
+      <w:proofErr w:type="spellStart"/>
+      <w:r>
+        <w:rPr>
+          <w:lang w:eastAsia="zh-CN"/>
+        </w:rPr>
+        <w:t>mvn</w:t>
+      </w:r>
+      <w:proofErr w:type="spellEnd"/>
+      <w:r>
+        <w:rPr>
+          <w:lang w:eastAsia="zh-CN"/>
+        </w:rPr>
+        <w:t xml:space="preserve"> -q test，测试报告记录16项测试、0项失败、0项错误。测试涉及账户控制、登录限制、登录凭证、模型客户端、调用配额、复习规则和异常响应。源码中还可查到错题、解析、反馈及知识点的接口与数据表。上述证据支持已覆盖功能的实现结论。</w:t>
       </w:r>
     </w:p>
     <w:p>
@@ -1196,18 +905,54 @@
         <w:ind w:firstLine="0"/>
         <w:rPr>
           <w:rFonts w:hint="eastAsia"/>
+          <w:lang w:eastAsia="zh-CN"/>
         </w:rPr>
       </w:pPr>
       <w:r>
-        <w:t>（2） 解析效果证据。项目实验目录保存来自IntroClassJava的150条候选Java案例及两种提示词设置的300行评分表。该公开数据集提供带错误的Java程序，适合作为可追溯的候选来源</w:t>
+        <w:rPr>
+          <w:lang w:eastAsia="zh-CN"/>
+        </w:rPr>
+        <w:t>（2</w:t>
+      </w:r>
+      <w:proofErr w:type="gramStart"/>
+      <w:r>
+        <w:rPr>
+          <w:lang w:eastAsia="zh-CN"/>
+        </w:rPr>
+        <w:t>） 解析</w:t>
+      </w:r>
+      <w:proofErr w:type="gramEnd"/>
+      <w:r>
+        <w:rPr>
+          <w:lang w:eastAsia="zh-CN"/>
+        </w:rPr>
+        <w:t>效果证据。项目实验目录保存来自</w:t>
+      </w:r>
+      <w:proofErr w:type="spellStart"/>
+      <w:r>
+        <w:rPr>
+          <w:lang w:eastAsia="zh-CN"/>
+        </w:rPr>
+        <w:t>IntroClassJava</w:t>
+      </w:r>
+      <w:proofErr w:type="spellEnd"/>
+      <w:r>
+        <w:rPr>
+          <w:lang w:eastAsia="zh-CN"/>
+        </w:rPr>
+        <w:t>的150条候选Java案例及两种提示词设置的300行评分表。该公开数据集提供带错误的Java程序，适合作为可追溯的候选来源</w:t>
       </w:r>
       <w:r>
         <w:rPr>
           <w:vertAlign w:val="superscript"/>
+          <w:lang w:eastAsia="zh-CN"/>
         </w:rPr>
         <w:t>[8]</w:t>
       </w:r>
       <w:r>
+        <w:rPr>
+          <w:lang w:eastAsia="zh-CN"/>
+        </w:rPr>
         <w:t>。</w:t>
       </w:r>
     </w:p>
@@ -1216,12 +961,33 @@
         <w:ind w:firstLine="0"/>
         <w:rPr>
           <w:rFonts w:hint="eastAsia"/>
+          <w:lang w:eastAsia="zh-CN"/>
         </w:rPr>
       </w:pPr>
       <w:r>
-        <w:t>（3） 后续验证。评价将固定模型版本与案例集合，分别记录错误原因、修改建议、知识点和参考代码的人工判断；参考代码需要在隔离环境中运行对应测试。报告各项结果时应给出实际完成评分的分母。公开案例可能与模型训练材料重合，</w:t>
-      </w:r>
-      <w:r>
+        <w:rPr>
+          <w:lang w:eastAsia="zh-CN"/>
+        </w:rPr>
+        <w:t>（3</w:t>
+      </w:r>
+      <w:proofErr w:type="gramStart"/>
+      <w:r>
+        <w:rPr>
+          <w:lang w:eastAsia="zh-CN"/>
+        </w:rPr>
+        <w:t>） 后续</w:t>
+      </w:r>
+      <w:proofErr w:type="gramEnd"/>
+      <w:r>
+        <w:rPr>
+          <w:lang w:eastAsia="zh-CN"/>
+        </w:rPr>
+        <w:t>验证。评价将固定模型版本与案例集合，分别记录错误原因、修改建议、知识点和参考代码的人工判断；参考代码需要在隔离环境中运行对应测试。报告各项结果时应给出实际完成评分的分母。公开案例可能与模型训练材料重合，</w:t>
+      </w:r>
+      <w:r>
+        <w:rPr>
+          <w:lang w:eastAsia="zh-CN"/>
+        </w:rPr>
         <w:lastRenderedPageBreak/>
         <w:t>因而还需加入真实课程错题，检验结论在日常学习材料上是否成立。</w:t>
       </w:r>
@@ -1231,10 +997,14 @@
         <w:pStyle w:val="1"/>
         <w:rPr>
           <w:rFonts w:hint="eastAsia"/>
+          <w:lang w:eastAsia="zh-CN"/>
         </w:rPr>
       </w:pPr>
       <w:bookmarkStart w:id="5" w:name="_Toc243984170"/>
       <w:r>
+        <w:rPr>
+          <w:lang w:eastAsia="zh-CN"/>
+        </w:rPr>
         <w:t>6结论</w:t>
       </w:r>
       <w:bookmarkEnd w:id="5"/>
@@ -1243,9 +1013,13 @@
       <w:pPr>
         <w:rPr>
           <w:rFonts w:hint="eastAsia"/>
+          <w:lang w:eastAsia="zh-CN"/>
         </w:rPr>
       </w:pPr>
       <w:r>
+        <w:rPr>
+          <w:lang w:eastAsia="zh-CN"/>
+        </w:rPr>
         <w:t>系统把原题材料、模型生成解释、人工判断和复习日期关联到同一条错题。账户归属检查、字段校验和调用限额使这些记录能够按用户保存和查看；自动化测试验证了其中已覆盖的业务规则。</w:t>
       </w:r>
     </w:p>
@@ -1253,9 +1027,13 @@
       <w:pPr>
         <w:rPr>
           <w:rFonts w:hint="eastAsia"/>
+          <w:lang w:eastAsia="zh-CN"/>
         </w:rPr>
       </w:pPr>
       <w:r>
+        <w:rPr>
+          <w:lang w:eastAsia="zh-CN"/>
+        </w:rPr>
         <w:t>实验表按150条案例和两种提示词设置预留300行。实际评估时，核验者需分别记录错误原因与修改建议是否正确、参考代码是否通过对应测试，三项用0或1填写；缺项不计入已核验样本。取得模型输出并完成标注后，按两种设置分别报告有效样本数和三项通过比例，再用真实课程错题复核。</w:t>
       </w:r>
     </w:p>
@@ -1263,10 +1041,11 @@
       <w:pPr>
         <w:rPr>
           <w:rFonts w:hint="eastAsia"/>
+          <w:lang w:eastAsia="zh-CN"/>
         </w:rPr>
         <w:sectPr>
-          <w:headerReference w:type="default" r:id="rId14"/>
-          <w:footerReference w:type="default" r:id="rId15"/>
+          <w:headerReference w:type="default" r:id="rId12"/>
+          <w:footerReference w:type="default" r:id="rId13"/>
           <w:pgSz w:w="11906" w:h="16838"/>
           <w:pgMar w:top="1417" w:right="1474" w:bottom="1417" w:left="1871" w:header="850" w:footer="850" w:gutter="0"/>
           <w:pgNumType w:start="1"/>
@@ -1280,10 +1059,14 @@
         <w:pStyle w:val="1"/>
         <w:rPr>
           <w:rFonts w:hint="eastAsia"/>
+          <w:lang w:eastAsia="zh-CN"/>
         </w:rPr>
       </w:pPr>
       <w:bookmarkStart w:id="6" w:name="_Toc243984171"/>
       <w:r>
+        <w:rPr>
+          <w:lang w:eastAsia="zh-CN"/>
+        </w:rPr>
         <w:lastRenderedPageBreak/>
         <w:t>参考文献</w:t>
       </w:r>
@@ -1294,10 +1077,98 @@
         <w:pStyle w:val="affd"/>
         <w:rPr>
           <w:rFonts w:hint="eastAsia"/>
+          <w:lang w:eastAsia="zh-CN"/>
         </w:rPr>
       </w:pPr>
       <w:r>
-        <w:t>[1]唐琳, 张佳鑫, 徐照光. 大语言模型在计算机编程实践课程教学中的应用[J]. 计算机教育, 2025(2): 97-101, 106.</w:t>
+        <w:rPr>
+          <w:lang w:eastAsia="zh-CN"/>
+        </w:rPr>
+        <w:t>[1]</w:t>
+      </w:r>
+      <w:proofErr w:type="gramStart"/>
+      <w:r>
+        <w:rPr>
+          <w:lang w:eastAsia="zh-CN"/>
+        </w:rPr>
+        <w:t>唐琳,</w:t>
+      </w:r>
+      <w:proofErr w:type="gramEnd"/>
+      <w:r>
+        <w:rPr>
+          <w:lang w:eastAsia="zh-CN"/>
+        </w:rPr>
+        <w:t xml:space="preserve"> </w:t>
+      </w:r>
+      <w:proofErr w:type="gramStart"/>
+      <w:r>
+        <w:rPr>
+          <w:lang w:eastAsia="zh-CN"/>
+        </w:rPr>
+        <w:t>张佳鑫,</w:t>
+      </w:r>
+      <w:proofErr w:type="gramEnd"/>
+      <w:r>
+        <w:rPr>
+          <w:lang w:eastAsia="zh-CN"/>
+        </w:rPr>
+        <w:t xml:space="preserve"> </w:t>
+      </w:r>
+      <w:proofErr w:type="gramStart"/>
+      <w:r>
+        <w:rPr>
+          <w:lang w:eastAsia="zh-CN"/>
+        </w:rPr>
+        <w:t>徐照光.</w:t>
+      </w:r>
+      <w:proofErr w:type="gramEnd"/>
+      <w:r>
+        <w:rPr>
+          <w:lang w:eastAsia="zh-CN"/>
+        </w:rPr>
+        <w:t xml:space="preserve"> 大语言模型在计算机编程实践课程教学中的应用[J]. 计算机</w:t>
+      </w:r>
+      <w:proofErr w:type="gramStart"/>
+      <w:r>
+        <w:rPr>
+          <w:lang w:eastAsia="zh-CN"/>
+        </w:rPr>
+        <w:t>教育,</w:t>
+      </w:r>
+      <w:proofErr w:type="gramEnd"/>
+      <w:r>
+        <w:rPr>
+          <w:lang w:eastAsia="zh-CN"/>
+        </w:rPr>
+        <w:t xml:space="preserve"> 2025</w:t>
+      </w:r>
+      <w:proofErr w:type="gramStart"/>
+      <w:r>
+        <w:rPr>
+          <w:lang w:eastAsia="zh-CN"/>
+        </w:rPr>
+        <w:t>(2): 97</w:t>
+      </w:r>
+      <w:proofErr w:type="gramEnd"/>
+      <w:r>
+        <w:rPr>
+          <w:lang w:eastAsia="zh-CN"/>
+        </w:rPr>
+        <w:t>-101</w:t>
+      </w:r>
+      <w:proofErr w:type="gramStart"/>
+      <w:r>
+        <w:rPr>
+          <w:lang w:eastAsia="zh-CN"/>
+        </w:rPr>
+        <w:t>, 106</w:t>
+      </w:r>
+      <w:proofErr w:type="gramEnd"/>
+      <w:r>
+        <w:rPr>
+          <w:lang w:eastAsia="zh-CN"/>
+        </w:rPr>
+        <w:t>.</w:t>
       </w:r>
     </w:p>
     <w:p>
@@ -1305,10 +1176,70 @@
         <w:pStyle w:val="affd"/>
         <w:rPr>
           <w:rFonts w:hint="eastAsia"/>
+          <w:lang w:eastAsia="zh-CN"/>
         </w:rPr>
       </w:pPr>
       <w:r>
-        <w:t>[2]陈峥, 喻俊杰. 基于LLM的Java编程作业评估与教学实践[J]. 计算机教育, 2026(6): 198-205.</w:t>
+        <w:rPr>
+          <w:lang w:eastAsia="zh-CN"/>
+        </w:rPr>
+        <w:t>[2]</w:t>
+      </w:r>
+      <w:proofErr w:type="gramStart"/>
+      <w:r>
+        <w:rPr>
+          <w:lang w:eastAsia="zh-CN"/>
+        </w:rPr>
+        <w:t>陈峥,</w:t>
+      </w:r>
+      <w:proofErr w:type="gramEnd"/>
+      <w:r>
+        <w:rPr>
+          <w:lang w:eastAsia="zh-CN"/>
+        </w:rPr>
+        <w:t xml:space="preserve"> 喻</w:t>
+      </w:r>
+      <w:proofErr w:type="gramStart"/>
+      <w:r>
+        <w:rPr>
+          <w:lang w:eastAsia="zh-CN"/>
+        </w:rPr>
+        <w:t>俊杰.</w:t>
+      </w:r>
+      <w:proofErr w:type="gramEnd"/>
+      <w:r>
+        <w:rPr>
+          <w:lang w:eastAsia="zh-CN"/>
+        </w:rPr>
+        <w:t xml:space="preserve"> 基于LLM的Java编程作业评估与教学实践[J]. 计算机</w:t>
+      </w:r>
+      <w:proofErr w:type="gramStart"/>
+      <w:r>
+        <w:rPr>
+          <w:lang w:eastAsia="zh-CN"/>
+        </w:rPr>
+        <w:t>教育,</w:t>
+      </w:r>
+      <w:proofErr w:type="gramEnd"/>
+      <w:r>
+        <w:rPr>
+          <w:lang w:eastAsia="zh-CN"/>
+        </w:rPr>
+        <w:t xml:space="preserve"> 2026</w:t>
+      </w:r>
+      <w:proofErr w:type="gramStart"/>
+      <w:r>
+        <w:rPr>
+          <w:lang w:eastAsia="zh-CN"/>
+        </w:rPr>
+        <w:t>(6): 198</w:t>
+      </w:r>
+      <w:proofErr w:type="gramEnd"/>
+      <w:r>
+        <w:rPr>
+          <w:lang w:eastAsia="zh-CN"/>
+        </w:rPr>
+        <w:t>-205.</w:t>
       </w:r>
     </w:p>
     <w:p>
@@ -1322,7 +1253,21 @@
         <w:rPr>
           <w:rFonts w:ascii="Times New Roman" w:eastAsia="Times New Roman" w:hAnsi="Times New Roman"/>
         </w:rPr>
-        <w:t>[3]KEUNING H, JEURING J T, HEEREN B. A systematic literature review of automated feedback generation for programming exercises[J]. ACM Transactions on Computing Education, 2018, 19(1).</w:t>
+        <w:t>[</w:t>
+      </w:r>
+      <w:proofErr w:type="gramStart"/>
+      <w:r>
+        <w:rPr>
+          <w:rFonts w:ascii="Times New Roman" w:eastAsia="Times New Roman" w:hAnsi="Times New Roman"/>
+        </w:rPr>
+        <w:t>3]KEUNING</w:t>
+      </w:r>
+      <w:proofErr w:type="gramEnd"/>
+      <w:r>
+        <w:rPr>
+          <w:rFonts w:ascii="Times New Roman" w:eastAsia="Times New Roman" w:hAnsi="Times New Roman"/>
+        </w:rPr>
+        <w:t xml:space="preserve"> H, JEURING J T, HEEREN B. A systematic literature review of automated feedback generation for programming exercises[J]. ACM Transactions on Computing Education, 2018, 19(1).</w:t>
       </w:r>
     </w:p>
     <w:p>
@@ -1336,7 +1281,21 @@
         <w:rPr>
           <w:rFonts w:ascii="Times New Roman" w:eastAsia="Times New Roman" w:hAnsi="Times New Roman"/>
         </w:rPr>
-        <w:t>[4]KASNECI E, SESSLER K, KÜCHEMANN S, et al. ChatGPT for good? On opportunities and challenges of large language models for education[J]. Learning and Individual Differences, 2023, 103: 102274.</w:t>
+        <w:t>[</w:t>
+      </w:r>
+      <w:proofErr w:type="gramStart"/>
+      <w:r>
+        <w:rPr>
+          <w:rFonts w:ascii="Times New Roman" w:eastAsia="Times New Roman" w:hAnsi="Times New Roman"/>
+        </w:rPr>
+        <w:t>4]KASNECI</w:t>
+      </w:r>
+      <w:proofErr w:type="gramEnd"/>
+      <w:r>
+        <w:rPr>
+          <w:rFonts w:ascii="Times New Roman" w:eastAsia="Times New Roman" w:hAnsi="Times New Roman"/>
+        </w:rPr>
+        <w:t xml:space="preserve"> E, SESSLER K, KÜCHEMANN S, et al. ChatGPT for good? On opportunities and challenges of large language models for education[J]. Learning and Individual Differences, 2023, 103: 102274.</w:t>
       </w:r>
     </w:p>
     <w:p>
@@ -1350,7 +1309,35 @@
         <w:rPr>
           <w:rFonts w:ascii="Times New Roman" w:eastAsia="Times New Roman" w:hAnsi="Times New Roman"/>
         </w:rPr>
-        <w:t>[5]SPRING. Spring Boot 3.5 Reference Documentation[EB/OL]. https://docs.spring.io/spring-boot/3.5/reference/index.html, 2026-10-26.</w:t>
+        <w:t>[</w:t>
+      </w:r>
+      <w:proofErr w:type="gramStart"/>
+      <w:r>
+        <w:rPr>
+          <w:rFonts w:ascii="Times New Roman" w:eastAsia="Times New Roman" w:hAnsi="Times New Roman"/>
+        </w:rPr>
+        <w:t>5]SPRING</w:t>
+      </w:r>
+      <w:proofErr w:type="gramEnd"/>
+      <w:r>
+        <w:rPr>
+          <w:rFonts w:ascii="Times New Roman" w:eastAsia="Times New Roman" w:hAnsi="Times New Roman"/>
+        </w:rPr>
+        <w:t xml:space="preserve">. Spring Boot 3.5 Reference </w:t>
+      </w:r>
+      <w:proofErr w:type="gramStart"/>
+      <w:r>
+        <w:rPr>
+          <w:rFonts w:ascii="Times New Roman" w:eastAsia="Times New Roman" w:hAnsi="Times New Roman"/>
+        </w:rPr>
+        <w:t>Documentation[</w:t>
+      </w:r>
+      <w:proofErr w:type="gramEnd"/>
+      <w:r>
+        <w:rPr>
+          <w:rFonts w:ascii="Times New Roman" w:eastAsia="Times New Roman" w:hAnsi="Times New Roman"/>
+        </w:rPr>
+        <w:t>EB/OL]. https://docs.spring.io/spring-boot/3.5/reference/index.html, 2026-10-26.</w:t>
       </w:r>
     </w:p>
     <w:p>
@@ -1364,7 +1351,35 @@
         <w:rPr>
           <w:rFonts w:ascii="Times New Roman" w:eastAsia="Times New Roman" w:hAnsi="Times New Roman"/>
         </w:rPr>
-        <w:t>[6]OLLAMA. Generate a chat message[EB/OL]. https://docs.ollama.com/api/chat, 2026-10-26.</w:t>
+        <w:t>[</w:t>
+      </w:r>
+      <w:proofErr w:type="gramStart"/>
+      <w:r>
+        <w:rPr>
+          <w:rFonts w:ascii="Times New Roman" w:eastAsia="Times New Roman" w:hAnsi="Times New Roman"/>
+        </w:rPr>
+        <w:t>6]OLLAMA</w:t>
+      </w:r>
+      <w:proofErr w:type="gramEnd"/>
+      <w:r>
+        <w:rPr>
+          <w:rFonts w:ascii="Times New Roman" w:eastAsia="Times New Roman" w:hAnsi="Times New Roman"/>
+        </w:rPr>
+        <w:t xml:space="preserve">. Generate a chat </w:t>
+      </w:r>
+      <w:proofErr w:type="gramStart"/>
+      <w:r>
+        <w:rPr>
+          <w:rFonts w:ascii="Times New Roman" w:eastAsia="Times New Roman" w:hAnsi="Times New Roman"/>
+        </w:rPr>
+        <w:t>message[</w:t>
+      </w:r>
+      <w:proofErr w:type="gramEnd"/>
+      <w:r>
+        <w:rPr>
+          <w:rFonts w:ascii="Times New Roman" w:eastAsia="Times New Roman" w:hAnsi="Times New Roman"/>
+        </w:rPr>
+        <w:t>EB/OL]. https://docs.ollama.com/api/chat, 2026-10-26.</w:t>
       </w:r>
     </w:p>
     <w:p>
@@ -1378,7 +1393,35 @@
         <w:rPr>
           <w:rFonts w:ascii="Times New Roman" w:eastAsia="Times New Roman" w:hAnsi="Times New Roman"/>
         </w:rPr>
-        <w:t>[7]ORACLE. MySQL8.4 Reference Manual: FOREIGN KEY Constraints[EB/OL]. https://dev.mysql.com/doc/refman/8.4/en/constraint-foreign-key.html, 2026-10-26.</w:t>
+        <w:t>[</w:t>
+      </w:r>
+      <w:proofErr w:type="gramStart"/>
+      <w:r>
+        <w:rPr>
+          <w:rFonts w:ascii="Times New Roman" w:eastAsia="Times New Roman" w:hAnsi="Times New Roman"/>
+        </w:rPr>
+        <w:t>7]ORACLE</w:t>
+      </w:r>
+      <w:proofErr w:type="gramEnd"/>
+      <w:r>
+        <w:rPr>
+          <w:rFonts w:ascii="Times New Roman" w:eastAsia="Times New Roman" w:hAnsi="Times New Roman"/>
+        </w:rPr>
+        <w:t xml:space="preserve">. MySQL8.4 Reference Manual: FOREIGN KEY </w:t>
+      </w:r>
+      <w:proofErr w:type="gramStart"/>
+      <w:r>
+        <w:rPr>
+          <w:rFonts w:ascii="Times New Roman" w:eastAsia="Times New Roman" w:hAnsi="Times New Roman"/>
+        </w:rPr>
+        <w:t>Constraints[</w:t>
+      </w:r>
+      <w:proofErr w:type="gramEnd"/>
+      <w:r>
+        <w:rPr>
+          <w:rFonts w:ascii="Times New Roman" w:eastAsia="Times New Roman" w:hAnsi="Times New Roman"/>
+        </w:rPr>
+        <w:t>EB/OL]. https://dev.mysql.com/doc/refman/8.4/en/constraint-foreign-key.html, 2026-10-26.</w:t>
       </w:r>
     </w:p>
     <w:p>
@@ -1392,12 +1435,54 @@
         <w:rPr>
           <w:rFonts w:ascii="Times New Roman" w:eastAsia="Times New Roman" w:hAnsi="Times New Roman"/>
         </w:rPr>
-        <w:t>[8]SPIRALS-TEAM. IntroClassJava: A dataset of Java bugs for automatic repair[EB/OL]. https://github.com/Spirals-Team/IntroClassJava, 2026-10-26.</w:t>
+        <w:t>[</w:t>
+      </w:r>
+      <w:proofErr w:type="gramStart"/>
+      <w:r>
+        <w:rPr>
+          <w:rFonts w:ascii="Times New Roman" w:eastAsia="Times New Roman" w:hAnsi="Times New Roman"/>
+        </w:rPr>
+        <w:t>8]SPIRALS</w:t>
+      </w:r>
+      <w:proofErr w:type="gramEnd"/>
+      <w:r>
+        <w:rPr>
+          <w:rFonts w:ascii="Times New Roman" w:eastAsia="Times New Roman" w:hAnsi="Times New Roman"/>
+        </w:rPr>
+        <w:t xml:space="preserve">-TEAM. </w:t>
+      </w:r>
+      <w:proofErr w:type="spellStart"/>
+      <w:r>
+        <w:rPr>
+          <w:rFonts w:ascii="Times New Roman" w:eastAsia="Times New Roman" w:hAnsi="Times New Roman"/>
+        </w:rPr>
+        <w:t>IntroClassJava</w:t>
+      </w:r>
+      <w:proofErr w:type="spellEnd"/>
+      <w:r>
+        <w:rPr>
+          <w:rFonts w:ascii="Times New Roman" w:eastAsia="Times New Roman" w:hAnsi="Times New Roman"/>
+        </w:rPr>
+        <w:t xml:space="preserve">: A dataset of Java bugs for automatic </w:t>
+      </w:r>
+      <w:proofErr w:type="gramStart"/>
+      <w:r>
+        <w:rPr>
+          <w:rFonts w:ascii="Times New Roman" w:eastAsia="Times New Roman" w:hAnsi="Times New Roman"/>
+        </w:rPr>
+        <w:t>repair[</w:t>
+      </w:r>
+      <w:proofErr w:type="gramEnd"/>
+      <w:r>
+        <w:rPr>
+          <w:rFonts w:ascii="Times New Roman" w:eastAsia="Times New Roman" w:hAnsi="Times New Roman"/>
+        </w:rPr>
+        <w:t>EB/OL]. https://github.com/Spirals-Team/IntroClassJava, 2026-10-26.</w:t>
       </w:r>
     </w:p>
     <w:sectPr>
-      <w:headerReference w:type="default" r:id="rId16"/>
-      <w:footerReference w:type="default" r:id="rId17"/>
+      <w:headerReference w:type="default" r:id="rId14"/>
+      <w:footerReference w:type="default" r:id="rId15"/>
       <w:pgSz w:w="11906" w:h="16838"/>
       <w:pgMar w:top="1417" w:right="1474" w:bottom="1417" w:left="1871" w:header="850" w:footer="850" w:gutter="0"/>
       <w:cols w:space="720"/>
@@ -1551,35 +1636,30 @@
     </w:pPr>
     <w:r>
       <w:rPr>
-        <w:rFonts w:ascii="Times New Roman" w:hAnsi="Times New Roman"/>
         <w:sz w:val="18"/>
       </w:rPr>
       <w:fldChar w:fldCharType="begin"/>
     </w:r>
     <w:r>
       <w:rPr>
-        <w:rFonts w:ascii="Times New Roman" w:hAnsi="Times New Roman"/>
         <w:sz w:val="18"/>
       </w:rPr>
       <w:instrText xml:space="preserve"> PAGE </w:instrText>
     </w:r>
     <w:r>
       <w:rPr>
-        <w:rFonts w:ascii="Times New Roman" w:hAnsi="Times New Roman"/>
         <w:sz w:val="18"/>
       </w:rPr>
       <w:fldChar w:fldCharType="separate"/>
     </w:r>
     <w:r>
       <w:rPr>
-        <w:rFonts w:ascii="Times New Roman" w:hAnsi="Times New Roman"/>
         <w:sz w:val="18"/>
       </w:rPr>
       <w:t>1</w:t>
     </w:r>
     <w:r>
       <w:rPr>
-        <w:rFonts w:ascii="Times New Roman" w:hAnsi="Times New Roman"/>
         <w:sz w:val="18"/>
       </w:rPr>
       <w:fldChar w:fldCharType="end"/>
@@ -1589,51 +1669,6 @@
 </file>
 
 <file path=word/footer4.xml><?xml version="1.0" encoding="utf-8"?>
-<w:ftr xmlns:wpc="http://schemas.microsoft.com/office/word/2010/wordprocessingCanvas" xmlns:cx="http://schemas.microsoft.com/office/drawing/2014/chartex" xmlns:cx1="http://schemas.microsoft.com/office/drawing/2015/9/8/chartex" xmlns:cx2="http://schemas.microsoft.com/office/drawing/2015/10/21/chartex" xmlns:cx3="http://schemas.microsoft.com/office/drawing/2016/5/9/chartex" xmlns:cx4="http://schemas.microsoft.com/office/drawing/2016/5/10/chartex" xmlns:cx5="http://schemas.microsoft.com/office/drawing/2016/5/11/chartex" xmlns:cx6="http://schemas.microsoft.com/office/drawing/2016/5/12/chartex" xmlns:cx7="http://schemas.microsoft.com/office/drawing/2016/5/13/chartex" xmlns:cx8="http://schemas.microsoft.com/office/drawing/2016/5/14/chartex" xmlns:mc="http://schemas.openxmlformats.org/markup-compatibility/2006" xmlns:aink="http://schemas.microsoft.com/office/drawing/2016/ink" xmlns:am3d="http://schemas.microsoft.com/office/drawing/2017/model3d" xmlns:o="urn:schemas-microsoft-com:office:office" xmlns:oel="http://schemas.microsoft.com/office/2019/extlst" xmlns:r="http://schemas.openxmlformats.org/officeDocument/2006/relationships" xmlns:m="http://schemas.openxmlformats.org/officeDocument/2006/math" xmlns:v="urn:schemas-microsoft-com:vml" xmlns:wp14="http://schemas.microsoft.com/office/word/2010/wordprocessingDrawing" xmlns:wp="http://schemas.openxmlformats.org/drawingml/2006/wordprocessingDrawing" xmlns:w10="urn:schemas-microsoft-com:office:word" xmlns:w="http://schemas.openxmlformats.org/wordprocessingml/2006/main" xmlns:w14="http://schemas.microsoft.com/office/word/2010/wordml" xmlns:w15="http://schemas.microsoft.com/office/word/2012/wordml" xmlns:w16cex="http://schemas.microsoft.com/office/word/2018/wordml/cex" xmlns:w16cid="http://schemas.microsoft.com/office/word/2016/wordml/cid" xmlns:w16="http://schemas.microsoft.com/office/word/2018/wordml" xmlns:w16du="http://schemas.microsoft.com/office/word/2023/wordml/word16du" xmlns:w16sdtdh="http://schemas.microsoft.com/office/word/2020/wordml/sdtdatahash" xmlns:w16sdtfl="http://schemas.microsoft.com/office/word/2024/wordml/sdtformatlock" xmlns:w16se="http://schemas.microsoft.com/office/word/2015/wordml/symex" xmlns:wpg="http://schemas.microsoft.com/office/word/2010/wordprocessingGroup" xmlns:wpi="http://schemas.microsoft.com/office/word/2010/wordprocessingInk" xmlns:wne="http://schemas.microsoft.com/office/word/2006/wordml" xmlns:wps="http://schemas.microsoft.com/office/word/2010/wordprocessingShape" mc:Ignorable="w14 w15 w16se w16cid w16 w16cex w16sdtdh w16sdtfl w16du wp14">
-  <w:p>
-    <w:pPr>
-      <w:pStyle w:val="a7"/>
-      <w:ind w:firstLine="0"/>
-      <w:jc w:val="center"/>
-      <w:rPr>
-        <w:rFonts w:hint="eastAsia"/>
-      </w:rPr>
-    </w:pPr>
-    <w:r>
-      <w:rPr>
-        <w:sz w:val="18"/>
-      </w:rPr>
-      <w:fldChar w:fldCharType="begin"/>
-    </w:r>
-    <w:r>
-      <w:rPr>
-        <w:sz w:val="18"/>
-      </w:rPr>
-      <w:instrText xml:space="preserve"> PAGE </w:instrText>
-    </w:r>
-    <w:r>
-      <w:rPr>
-        <w:sz w:val="18"/>
-      </w:rPr>
-      <w:fldChar w:fldCharType="separate"/>
-    </w:r>
-    <w:r>
-      <w:rPr>
-        <w:sz w:val="18"/>
-      </w:rPr>
-      <w:t>1</w:t>
-    </w:r>
-    <w:r>
-      <w:rPr>
-        <w:sz w:val="18"/>
-      </w:rPr>
-      <w:fldChar w:fldCharType="end"/>
-    </w:r>
-  </w:p>
-</w:ftr>
-</file>
-
-<file path=word/footer5.xml><?xml version="1.0" encoding="utf-8"?>
 <w:ftr xmlns:wpc="http://schemas.microsoft.com/office/word/2010/wordprocessingCanvas" xmlns:cx="http://schemas.microsoft.com/office/drawing/2014/chartex" xmlns:cx1="http://schemas.microsoft.com/office/drawing/2015/9/8/chartex" xmlns:cx2="http://schemas.microsoft.com/office/drawing/2015/10/21/chartex" xmlns:cx3="http://schemas.microsoft.com/office/drawing/2016/5/9/chartex" xmlns:cx4="http://schemas.microsoft.com/office/drawing/2016/5/10/chartex" xmlns:cx5="http://schemas.microsoft.com/office/drawing/2016/5/11/chartex" xmlns:cx6="http://schemas.microsoft.com/office/drawing/2016/5/12/chartex" xmlns:cx7="http://schemas.microsoft.com/office/drawing/2016/5/13/chartex" xmlns:cx8="http://schemas.microsoft.com/office/drawing/2016/5/14/chartex" xmlns:mc="http://schemas.openxmlformats.org/markup-compatibility/2006" xmlns:aink="http://schemas.microsoft.com/office/drawing/2016/ink" xmlns:am3d="http://schemas.microsoft.com/office/drawing/2017/model3d" xmlns:o="urn:schemas-microsoft-com:office:office" xmlns:oel="http://schemas.microsoft.com/office/2019/extlst" xmlns:r="http://schemas.openxmlformats.org/officeDocument/2006/relationships" xmlns:m="http://schemas.openxmlformats.org/officeDocument/2006/math" xmlns:v="urn:schemas-microsoft-com:vml" xmlns:wp14="http://schemas.microsoft.com/office/word/2010/wordprocessingDrawing" xmlns:wp="http://schemas.openxmlformats.org/drawingml/2006/wordprocessingDrawing" xmlns:w10="urn:schemas-microsoft-com:office:word" xmlns:w="http://schemas.openxmlformats.org/wordprocessingml/2006/main" xmlns:w14="http://schemas.microsoft.com/office/word/2010/wordml" xmlns:w15="http://schemas.microsoft.com/office/word/2012/wordml" xmlns:w16cex="http://schemas.microsoft.com/office/word/2018/wordml/cex" xmlns:w16cid="http://schemas.microsoft.com/office/word/2016/wordml/cid" xmlns:w16="http://schemas.microsoft.com/office/word/2018/wordml" xmlns:w16du="http://schemas.microsoft.com/office/word/2023/wordml/word16du" xmlns:w16sdtdh="http://schemas.microsoft.com/office/word/2020/wordml/sdtdatahash" xmlns:w16sdtfl="http://schemas.microsoft.com/office/word/2024/wordml/sdtformatlock" xmlns:w16se="http://schemas.microsoft.com/office/word/2015/wordml/symex" xmlns:wpg="http://schemas.microsoft.com/office/word/2010/wordprocessingGroup" xmlns:wpi="http://schemas.microsoft.com/office/word/2010/wordprocessingInk" xmlns:wne="http://schemas.microsoft.com/office/word/2006/wordml" xmlns:wps="http://schemas.microsoft.com/office/word/2010/wordprocessingShape" mc:Ignorable="w14 w15 w16se w16cid w16 w16cex w16sdtdh w16sdtfl w16du wp14">
   <w:p>
     <w:pPr>
@@ -1724,12 +1759,14 @@
         <w:rFonts w:hint="eastAsia"/>
       </w:rPr>
     </w:pPr>
+    <w:proofErr w:type="spellStart"/>
     <w:r>
       <w:rPr>
         <w:sz w:val="18"/>
       </w:rPr>
       <w:t>摘要</w:t>
     </w:r>
+    <w:proofErr w:type="spellEnd"/>
   </w:p>
 </w:hdr>
 </file>
@@ -1775,12 +1812,28 @@
         <w:rFonts w:hint="eastAsia"/>
       </w:rPr>
     </w:pPr>
+    <w:proofErr w:type="spellStart"/>
     <w:r>
       <w:rPr>
         <w:sz w:val="18"/>
       </w:rPr>
-      <w:t>目录</w:t>
+      <w:t>基于Spring</w:t>
     </w:r>
+    <w:proofErr w:type="spellEnd"/>
+    <w:r>
+      <w:rPr>
+        <w:sz w:val="18"/>
+      </w:rPr>
+      <w:t xml:space="preserve"> </w:t>
+    </w:r>
+    <w:proofErr w:type="spellStart"/>
+    <w:r>
+      <w:rPr>
+        <w:sz w:val="18"/>
+      </w:rPr>
+      <w:t>Boot的编程错题智能解析助手系统设计与实现</w:t>
+    </w:r>
+    <w:proofErr w:type="spellEnd"/>
   </w:p>
 </w:hdr>
 </file>
@@ -1800,37 +1853,28 @@
         <w:rFonts w:hint="eastAsia"/>
       </w:rPr>
     </w:pPr>
+    <w:proofErr w:type="spellStart"/>
     <w:r>
       <w:rPr>
         <w:sz w:val="18"/>
       </w:rPr>
-      <w:t>基于Spring Boot的编程错题智能解析助手系统设计与实现</w:t>
+      <w:t>基于Spring</w:t>
     </w:r>
-  </w:p>
-</w:hdr>
-</file>
-
-<file path=word/header5.xml><?xml version="1.0" encoding="utf-8"?>
-<w:hdr xmlns:wpc="http://schemas.microsoft.com/office/word/2010/wordprocessingCanvas" xmlns:cx="http://schemas.microsoft.com/office/drawing/2014/chartex" xmlns:cx1="http://schemas.microsoft.com/office/drawing/2015/9/8/chartex" xmlns:cx2="http://schemas.microsoft.com/office/drawing/2015/10/21/chartex" xmlns:cx3="http://schemas.microsoft.com/office/drawing/2016/5/9/chartex" xmlns:cx4="http://schemas.microsoft.com/office/drawing/2016/5/10/chartex" xmlns:cx5="http://schemas.microsoft.com/office/drawing/2016/5/11/chartex" xmlns:cx6="http://schemas.microsoft.com/office/drawing/2016/5/12/chartex" xmlns:cx7="http://schemas.microsoft.com/office/drawing/2016/5/13/chartex" xmlns:cx8="http://schemas.microsoft.com/office/drawing/2016/5/14/chartex" xmlns:mc="http://schemas.openxmlformats.org/markup-compatibility/2006" xmlns:aink="http://schemas.microsoft.com/office/drawing/2016/ink" xmlns:am3d="http://schemas.microsoft.com/office/drawing/2017/model3d" xmlns:o="urn:schemas-microsoft-com:office:office" xmlns:oel="http://schemas.microsoft.com/office/2019/extlst" xmlns:r="http://schemas.openxmlformats.org/officeDocument/2006/relationships" xmlns:m="http://schemas.openxmlformats.org/officeDocument/2006/math" xmlns:v="urn:schemas-microsoft-com:vml" xmlns:wp14="http://schemas.microsoft.com/office/word/2010/wordprocessingDrawing" xmlns:wp="http://schemas.openxmlformats.org/drawingml/2006/wordprocessingDrawing" xmlns:w10="urn:schemas-microsoft-com:office:word" xmlns:w="http://schemas.openxmlformats.org/wordprocessingml/2006/main" xmlns:w14="http://schemas.microsoft.com/office/word/2010/wordml" xmlns:w15="http://schemas.microsoft.com/office/word/2012/wordml" xmlns:w16cex="http://schemas.microsoft.com/office/word/2018/wordml/cex" xmlns:w16cid="http://schemas.microsoft.com/office/word/2016/wordml/cid" xmlns:w16="http://schemas.microsoft.com/office/word/2018/wordml" xmlns:w16du="http://schemas.microsoft.com/office/word/2023/wordml/word16du" xmlns:w16sdtdh="http://schemas.microsoft.com/office/word/2020/wordml/sdtdatahash" xmlns:w16sdtfl="http://schemas.microsoft.com/office/word/2024/wordml/sdtformatlock" xmlns:w16se="http://schemas.microsoft.com/office/word/2015/wordml/symex" xmlns:wpg="http://schemas.microsoft.com/office/word/2010/wordprocessingGroup" xmlns:wpi="http://schemas.microsoft.com/office/word/2010/wordprocessingInk" xmlns:wne="http://schemas.microsoft.com/office/word/2006/wordml" xmlns:wps="http://schemas.microsoft.com/office/word/2010/wordprocessingShape" mc:Ignorable="w14 w15 w16se w16cid w16 w16cex w16sdtdh w16sdtfl w16du wp14">
-  <w:p>
-    <w:pPr>
-      <w:pStyle w:val="a5"/>
-      <w:pBdr>
-        <w:bottom w:val="double" w:sz="6" w:space="1" w:color="000000"/>
-      </w:pBdr>
-      <w:spacing w:line="240" w:lineRule="exact"/>
-      <w:ind w:firstLine="0"/>
-      <w:jc w:val="center"/>
-      <w:rPr>
-        <w:rFonts w:hint="eastAsia"/>
-      </w:rPr>
-    </w:pPr>
+    <w:proofErr w:type="spellEnd"/>
     <w:r>
       <w:rPr>
         <w:sz w:val="18"/>
       </w:rPr>
-      <w:t>基于Spring Boot的编程错题智能解析助手系统设计与实现</w:t>
+      <w:t xml:space="preserve"> </w:t>
     </w:r>
+    <w:proofErr w:type="spellStart"/>
+    <w:r>
+      <w:rPr>
+        <w:sz w:val="18"/>
+      </w:rPr>
+      <w:t>Boot的编程错题智能解析助手系统设计与实现</w:t>
+    </w:r>
+    <w:proofErr w:type="spellEnd"/>
   </w:p>
 </w:hdr>
 </file>

</xml_diff>

<commit_message>
chore: auto sync 2026-10-27 09:22:20
</commit_message>
<xml_diff>
--- a/docs/papers/20230411330_严何涛_基于Spring Boot的编程错题智能解析助手系统设计与实现.docx
+++ b/docs/papers/20230411330_严何涛_基于Spring Boot的编程错题智能解析助手系统设计与实现.docx
@@ -331,7 +331,8 @@
     </w:p>
     <w:p>
       <w:pPr>
-        <w:ind w:firstLine="0"/>
+        <w:spacing w:line="240" w:lineRule="auto"/>
+        <w:ind w:firstLineChars="200"/>
         <w:rPr>
           <w:rFonts w:hint="eastAsia"/>
           <w:lang w:eastAsia="zh-CN"/>
@@ -343,24 +344,23 @@
         </w:rPr>
         <w:t>（1</w:t>
       </w:r>
-      <w:proofErr w:type="gramStart"/>
-      <w:r>
-        <w:rPr>
-          <w:lang w:eastAsia="zh-CN"/>
-        </w:rPr>
-        <w:t>） 用户</w:t>
-      </w:r>
-      <w:proofErr w:type="gramEnd"/>
-      <w:r>
-        <w:rPr>
-          <w:lang w:eastAsia="zh-CN"/>
-        </w:rPr>
-        <w:t>与任务分析。系统面向已注册的个人学习者。未登录者可访问注册、登录和密码找回入口；登录后可新增、查询、编辑及删除自己的错题，调用解析服务，查看历史分析，记录分析是否可信，并按计划复习。学习者录入的题目描述、源代码、错误消息、实际输出和期望输出共同构成分析依据。若输入缺失，系统可以提示模型说明信息不足，而不能把猜测当成确定原因。</w:t>
+      <w:r>
+        <w:rPr>
+          <w:lang w:eastAsia="zh-CN"/>
+        </w:rPr>
+        <w:t>）</w:t>
+      </w:r>
+      <w:r>
+        <w:rPr>
+          <w:lang w:eastAsia="zh-CN"/>
+        </w:rPr>
+        <w:t>用户与任务分析。系统面向已注册的个人学习者。未登录者可访问注册、登录和密码找回入口；登录后可新增、查询、编辑及删除自己的错题，调用解析服务，查看历史分析，记录分析是否可信，并按计划复习。学习者录入的题目描述、源代码、错误消息、实际输出和期望输出共同构成分析依据。若输入缺失，系统可以提示模型说明信息不足，而不能把猜测当成确定原因。</w:t>
       </w:r>
     </w:p>
     <w:p>
       <w:pPr>
-        <w:ind w:firstLine="0"/>
+        <w:spacing w:line="240" w:lineRule="auto"/>
+        <w:ind w:firstLineChars="200"/>
         <w:rPr>
           <w:rFonts w:hint="eastAsia"/>
           <w:lang w:eastAsia="zh-CN"/>
@@ -370,26 +370,13 @@
         <w:rPr>
           <w:lang w:eastAsia="zh-CN"/>
         </w:rPr>
-        <w:t>（2</w:t>
-      </w:r>
-      <w:proofErr w:type="gramStart"/>
-      <w:r>
-        <w:rPr>
-          <w:lang w:eastAsia="zh-CN"/>
-        </w:rPr>
-        <w:t>） 业务</w:t>
-      </w:r>
-      <w:proofErr w:type="gramEnd"/>
-      <w:r>
-        <w:rPr>
-          <w:lang w:eastAsia="zh-CN"/>
-        </w:rPr>
-        <w:t>需求分析。一次错题分析应先确认错题归属，再控制调用次数，随后组织模型输入、检查输出并保存结果。系统需要对同一道错题的重复并发分析作限制；对模型不可用或格式错误的情况记录失败状态，避免页面显示虚假的成功。查询分析历史时仍要按当前账户核对错题归属。知识点应与错题关联，便于以后按主题回看。</w:t>
+        <w:t>（2）业务需求分析。一次错题分析应先确认错题归属，再控制调用次数，随后组织模型输入、检查输出并保存结果。系统需要对同一道错题的重复并发分析作限制；对模型不可用或格式错误的情况记录失败状态，避免页面显示虚假的成功。查询分析历史时仍要按当前账户核对错题归属。知识点应与错题关联，便于以后按主题回看。</w:t>
       </w:r>
     </w:p>
     <w:p>
       <w:pPr>
-        <w:ind w:firstLine="0"/>
+        <w:spacing w:line="240" w:lineRule="auto"/>
+        <w:ind w:firstLineChars="200"/>
         <w:rPr>
           <w:rFonts w:hint="eastAsia"/>
           <w:lang w:eastAsia="zh-CN"/>
@@ -399,28 +386,7 @@
         <w:rPr>
           <w:lang w:eastAsia="zh-CN"/>
         </w:rPr>
-        <w:t>（3</w:t>
-      </w:r>
-      <w:proofErr w:type="gramStart"/>
-      <w:r>
-        <w:rPr>
-          <w:lang w:eastAsia="zh-CN"/>
-        </w:rPr>
-        <w:t>） 非</w:t>
-      </w:r>
-      <w:proofErr w:type="gramEnd"/>
-      <w:r>
-        <w:rPr>
-          <w:lang w:eastAsia="zh-CN"/>
-        </w:rPr>
-        <w:t>功能需求分析。个人代码和学习记录需要账户隔离，登录凭证不能替代每次数据归属校验。模型请求可能耗时，因此还需限制单用户调用频率与全局并发。已有实现默认每人每天最多20次、全局同时最多3次，但该计数保存在应用</w:t>
-      </w:r>
-      <w:r>
-        <w:rPr>
-          <w:lang w:eastAsia="zh-CN"/>
-        </w:rPr>
-        <w:lastRenderedPageBreak/>
-        <w:t>进程中，若部署多个进程，应改为共享计数。页面提供中文桌面工作台；当前需求不包含独立移动端应用。</w:t>
+        <w:t>（3）非功能需求分析。个人代码和学习记录需要账户隔离，登录凭证不能替代每次数据归属校验。模型请求可能耗时，因此还需限制单用户调用频率与全局并发。已有实现默认每人每天最多20次、全局同时最多3次，但该计数保存在应用进程中，若部署多个进程，应改为共享计数。页面提供中文桌面工作台；当前需求不包含独立移动端应用。</w:t>
       </w:r>
     </w:p>
     <w:p>
@@ -436,13 +402,15 @@
         <w:rPr>
           <w:lang w:eastAsia="zh-CN"/>
         </w:rPr>
+        <w:lastRenderedPageBreak/>
         <w:t>3系统设计</w:t>
       </w:r>
       <w:bookmarkEnd w:id="2"/>
     </w:p>
     <w:p>
       <w:pPr>
-        <w:ind w:firstLine="0"/>
+        <w:spacing w:line="240" w:lineRule="auto"/>
+        <w:ind w:firstLineChars="200"/>
         <w:rPr>
           <w:rFonts w:hint="eastAsia"/>
           <w:lang w:eastAsia="zh-CN"/>
@@ -452,21 +420,7 @@
         <w:rPr>
           <w:lang w:eastAsia="zh-CN"/>
         </w:rPr>
-        <w:t>（1</w:t>
-      </w:r>
-      <w:proofErr w:type="gramStart"/>
-      <w:r>
-        <w:rPr>
-          <w:lang w:eastAsia="zh-CN"/>
-        </w:rPr>
-        <w:t>） 总体</w:t>
-      </w:r>
-      <w:proofErr w:type="gramEnd"/>
-      <w:r>
-        <w:rPr>
-          <w:lang w:eastAsia="zh-CN"/>
-        </w:rPr>
-        <w:t>结构。浏览器页面接收错题材料并展示历史记录；Spring Boot后端根据登录身份检查数据归属，再处理错题和解析请求；MySQL保存用户、错题、解析、知识点及复习记录。Spring Boot承担应用启动、接口接入和配置管理</w:t>
+        <w:t>（1）总体结构。浏览器页面接收错题材料并展示历史记录；Spring Boot后端根据登录身份检查数据归属，再处理错题和解析请求；MySQL保存用户、错题、解析、知识点及复习记录。Spring Boot承担应用启动、接口接入和配置管理</w:t>
       </w:r>
       <w:r>
         <w:rPr>
@@ -497,7 +451,8 @@
     </w:p>
     <w:p>
       <w:pPr>
-        <w:ind w:firstLine="0"/>
+        <w:spacing w:line="240" w:lineRule="auto"/>
+        <w:ind w:firstLineChars="200"/>
         <w:rPr>
           <w:rFonts w:hint="eastAsia"/>
           <w:lang w:eastAsia="zh-CN"/>
@@ -507,21 +462,7 @@
         <w:rPr>
           <w:lang w:eastAsia="zh-CN"/>
         </w:rPr>
-        <w:t>（2</w:t>
-      </w:r>
-      <w:proofErr w:type="gramStart"/>
-      <w:r>
-        <w:rPr>
-          <w:lang w:eastAsia="zh-CN"/>
-        </w:rPr>
-        <w:t>） 数据</w:t>
-      </w:r>
-      <w:proofErr w:type="gramEnd"/>
-      <w:r>
-        <w:rPr>
-          <w:lang w:eastAsia="zh-CN"/>
-        </w:rPr>
-        <w:t>结构。用户表与错题表形成一对多关系，错题表保存题目、编程语言、代码及错误上下文。解析结果表保存七项结构化内容，分析记录表保存请求和原始响应，二者分开后既能快速展示，也能追查生成过程。知识点表与错题之间通过关联表建立多对多关系。复习状态表记录连续记住次数和下次日期，复习明细表保存每次选择。数据库通过主键、索引与外键保持关联数据的一致性；外键在删除相关记录时的行为由建表约束确定</w:t>
+        <w:t>（2）数据结构。用户表与错题表形成一对多关系，错题表保存题目、编程语言、代码及错误上下文。解析结果表保存七项结构化内容，分析记录表保存请求和原始响应，二者分开后既能快速展示，也能追查生成过程。知识点表与错题之间通过关联表建立多对多关系。复习状态表记录连续记住次数和下次日期，复习明细表保存每次选择。数据库通过主键、索引与外键保持关联数据的一致性；外键在删除相关记录时的行为由建表约束确定</w:t>
       </w:r>
       <w:r>
         <w:rPr>
@@ -539,7 +480,8 @@
     </w:p>
     <w:p>
       <w:pPr>
-        <w:ind w:firstLine="0"/>
+        <w:spacing w:line="240" w:lineRule="auto"/>
+        <w:ind w:firstLineChars="200"/>
         <w:rPr>
           <w:rFonts w:hint="eastAsia"/>
           <w:lang w:eastAsia="zh-CN"/>
@@ -549,26 +491,13 @@
         <w:rPr>
           <w:lang w:eastAsia="zh-CN"/>
         </w:rPr>
-        <w:t>（3</w:t>
-      </w:r>
-      <w:proofErr w:type="gramStart"/>
-      <w:r>
-        <w:rPr>
-          <w:lang w:eastAsia="zh-CN"/>
-        </w:rPr>
-        <w:t>） 分析</w:t>
-      </w:r>
-      <w:proofErr w:type="gramEnd"/>
-      <w:r>
-        <w:rPr>
-          <w:lang w:eastAsia="zh-CN"/>
-        </w:rPr>
-        <w:t>流程。系统先用用户编号和错题编号共同查询目标错题；确认该题未处于分析中且配额可用后，将状态设为分析中。输入模板按题目、代码、报错、实际结果与期望结果分段组织，并明确要求返回固定的JSON字段。模型响应到达后，程序逐项检查文本字段和知识点数组，拒绝缺失或空值；通过检查的内容在一次数据库处理中保存解析结果、知识点关联和成功记录。若调用或解析失败，则保存失败状态和错误信息。</w:t>
+        <w:t>（3）分析流程。系统先用用户编号和错题编号共同查询目标错题；确认该题未处于分析中且配额可用后，将状态设为分析中。输入模板按题目、代码、报错、实际结果与期望结果分段组织，并明确要求返回固定的JSON字段。模型响应到达后，程序逐项检查文本字段和知识点数组，拒绝缺失或空值；通过检查的内容在一次数据库处理中保存解析结果、知识点关联和成功记录。若调用或解析失败，则保存失败状态和错误信息。</w:t>
       </w:r>
     </w:p>
     <w:p>
       <w:pPr>
-        <w:ind w:firstLine="0"/>
+        <w:spacing w:line="240" w:lineRule="auto"/>
+        <w:ind w:firstLineChars="200"/>
         <w:rPr>
           <w:rFonts w:hint="eastAsia"/>
           <w:lang w:eastAsia="zh-CN"/>
@@ -578,21 +507,7 @@
         <w:rPr>
           <w:lang w:eastAsia="zh-CN"/>
         </w:rPr>
-        <w:t>（4</w:t>
-      </w:r>
-      <w:proofErr w:type="gramStart"/>
-      <w:r>
-        <w:rPr>
-          <w:lang w:eastAsia="zh-CN"/>
-        </w:rPr>
-        <w:t>） 学习</w:t>
-      </w:r>
-      <w:proofErr w:type="gramEnd"/>
-      <w:r>
-        <w:rPr>
-          <w:lang w:eastAsia="zh-CN"/>
-        </w:rPr>
-        <w:t>闭环。错题经过分析后，用户可将分析标为准确、不准确或无法判断，并写下依据。这是个人反馈，不等同于专家评分。复习模块记录“已经记住”或“还需练习”：连续记住时依次安排1、3、7、14、30天后的回顾，忘记时重新安排1天后复习。统计模块按当前账户汇总错题总数、已解析数和分析次数，帮助用户发现尚未处理的记录。</w:t>
+        <w:t>（4）学习闭环。错题经过分析后，用户可将分析标为准确、不准确或无法判断，并写下依据。这是个人反馈，不等同于专家评分。复习模块记录“已经记住”或“还需练习”：连续记住时依次安排1、3、7、14、30天后的回顾，忘记时重新安排1天后复习。统计模块按当前账户汇总错题总数、已解析数和分析次数，帮助用户发现尚未处理的记录。</w:t>
       </w:r>
     </w:p>
     <w:p>
@@ -614,7 +529,8 @@
     </w:p>
     <w:p>
       <w:pPr>
-        <w:ind w:firstLine="0"/>
+        <w:spacing w:line="240" w:lineRule="auto"/>
+        <w:ind w:firstLineChars="200"/>
         <w:rPr>
           <w:rFonts w:hint="eastAsia"/>
           <w:lang w:eastAsia="zh-CN"/>
@@ -643,7 +559,8 @@
     </w:p>
     <w:p>
       <w:pPr>
-        <w:ind w:firstLine="0"/>
+        <w:spacing w:line="240" w:lineRule="auto"/>
+        <w:ind w:firstLineChars="200"/>
         <w:rPr>
           <w:rFonts w:hint="eastAsia"/>
           <w:lang w:eastAsia="zh-CN"/>
@@ -653,7 +570,6 @@
         <w:rPr>
           <w:lang w:eastAsia="zh-CN"/>
         </w:rPr>
-        <w:lastRenderedPageBreak/>
         <w:t>（2</w:t>
       </w:r>
       <w:proofErr w:type="gramStart"/>
@@ -729,6 +645,8 @@
     </w:p>
     <w:p>
       <w:pPr>
+        <w:spacing w:line="240" w:lineRule="auto"/>
+        <w:ind w:firstLineChars="200"/>
         <w:rPr>
           <w:rFonts w:hint="eastAsia"/>
           <w:lang w:eastAsia="zh-CN"/>
@@ -742,7 +660,6 @@
       </w:r>
       <w:r>
         <w:rPr>
-          <w:vertAlign w:val="superscript"/>
           <w:lang w:eastAsia="zh-CN"/>
         </w:rPr>
         <w:t>[8]</w:t>
@@ -751,12 +668,20 @@
         <w:rPr>
           <w:lang w:eastAsia="zh-CN"/>
         </w:rPr>
-        <w:t>。录入此题时，可分别保存题目、源码、测试输入、实际输出和预期的不及格提示。后端将这些字段交给模型，并把生成的原因和建议留给用户核验；本例的源码与测试说明输入如何组织，不充当模型回答正确的证据。</w:t>
+        <w:t>。录入此题时，可分别保存题目、源码、测试输入、实际输出和预期的不及格提示。后端将这些字段交给模型，并把生成的原因和建议留给用户核验；本例的源码与测试说明输入如何组织，不充当</w:t>
+      </w:r>
+      <w:r>
+        <w:rPr>
+          <w:lang w:eastAsia="zh-CN"/>
+        </w:rPr>
+        <w:lastRenderedPageBreak/>
+        <w:t>模型回答正确的证据。</w:t>
       </w:r>
     </w:p>
     <w:p>
       <w:pPr>
-        <w:ind w:firstLine="0"/>
+        <w:spacing w:line="240" w:lineRule="auto"/>
+        <w:ind w:firstLineChars="200"/>
         <w:rPr>
           <w:rFonts w:hint="eastAsia"/>
           <w:lang w:eastAsia="zh-CN"/>
@@ -799,7 +724,8 @@
     </w:p>
     <w:p>
       <w:pPr>
-        <w:ind w:firstLine="0"/>
+        <w:spacing w:line="240" w:lineRule="auto"/>
+        <w:ind w:firstLineChars="200"/>
         <w:rPr>
           <w:rFonts w:hint="eastAsia"/>
           <w:lang w:eastAsia="zh-CN"/>
@@ -859,7 +785,8 @@
     </w:p>
     <w:p>
       <w:pPr>
-        <w:ind w:firstLine="0"/>
+        <w:spacing w:line="240" w:lineRule="auto"/>
+        <w:ind w:firstLineChars="200"/>
         <w:rPr>
           <w:rFonts w:hint="eastAsia"/>
           <w:lang w:eastAsia="zh-CN"/>
@@ -902,7 +829,8 @@
     </w:p>
     <w:p>
       <w:pPr>
-        <w:ind w:firstLine="0"/>
+        <w:spacing w:line="240" w:lineRule="auto"/>
+        <w:ind w:firstLineChars="200"/>
         <w:rPr>
           <w:rFonts w:hint="eastAsia"/>
           <w:lang w:eastAsia="zh-CN"/>
@@ -944,7 +872,6 @@
       </w:r>
       <w:r>
         <w:rPr>
-          <w:vertAlign w:val="superscript"/>
           <w:lang w:eastAsia="zh-CN"/>
         </w:rPr>
         <w:t>[8]</w:t>
@@ -958,7 +885,8 @@
     </w:p>
     <w:p>
       <w:pPr>
-        <w:ind w:firstLine="0"/>
+        <w:spacing w:line="240" w:lineRule="auto"/>
+        <w:ind w:firstLineChars="200"/>
         <w:rPr>
           <w:rFonts w:hint="eastAsia"/>
           <w:lang w:eastAsia="zh-CN"/>
@@ -982,14 +910,7 @@
         <w:rPr>
           <w:lang w:eastAsia="zh-CN"/>
         </w:rPr>
-        <w:t>验证。评价将固定模型版本与案例集合，分别记录错误原因、修改建议、知识点和参考代码的人工判断；参考代码需要在隔离环境中运行对应测试。报告各项结果时应给出实际完成评分的分母。公开案例可能与模型训练材料重合，</w:t>
-      </w:r>
-      <w:r>
-        <w:rPr>
-          <w:lang w:eastAsia="zh-CN"/>
-        </w:rPr>
-        <w:lastRenderedPageBreak/>
-        <w:t>因而还需加入真实课程错题，检验结论在日常学习材料上是否成立。</w:t>
+        <w:t>验证。评价将固定模型版本与案例集合，分别记录错误原因、修改建议、知识点和参考代码的人工判断；参考代码需要在隔离环境中运行对应测试。报告各项结果时应给出实际完成评分的分母。公开案例可能与模型训练材料重合，因而还需加入真实课程错题，检验结论在日常学习材料上是否成立。</w:t>
       </w:r>
     </w:p>
     <w:p>
@@ -1011,6 +932,8 @@
     </w:p>
     <w:p>
       <w:pPr>
+        <w:spacing w:line="240" w:lineRule="auto"/>
+        <w:ind w:firstLineChars="200"/>
         <w:rPr>
           <w:rFonts w:hint="eastAsia"/>
           <w:lang w:eastAsia="zh-CN"/>
@@ -1025,6 +948,8 @@
     </w:p>
     <w:p>
       <w:pPr>
+        <w:spacing w:line="240" w:lineRule="auto"/>
+        <w:ind w:firstLineChars="200"/>
         <w:rPr>
           <w:rFonts w:hint="eastAsia"/>
           <w:lang w:eastAsia="zh-CN"/>

</xml_diff>

<commit_message>
Clarify tested rules while preserving user paper edits
</commit_message>
<xml_diff>
--- a/docs/papers/20230411330_严何涛_基于Spring Boot的编程错题智能解析助手系统设计与实现.docx
+++ b/docs/papers/20230411330_严何涛_基于Spring Boot的编程错题智能解析助手系统设计与实现.docx
@@ -26,7 +26,6 @@
           <w:lang w:eastAsia="zh-CN"/>
         </w:rPr>
       </w:pPr>
-      <w:proofErr w:type="gramStart"/>
       <w:r>
         <w:rPr>
           <w:lang w:eastAsia="zh-CN"/>
@@ -44,14 +43,7 @@
         <w:rPr>
           <w:lang w:eastAsia="zh-CN"/>
         </w:rPr>
-        <w:t>学号</w:t>
-      </w:r>
-      <w:proofErr w:type="gramEnd"/>
-      <w:r>
-        <w:rPr>
-          <w:lang w:eastAsia="zh-CN"/>
-        </w:rPr>
-        <w:t>：20230411330</w:t>
+        <w:t>学号：20230411330</w:t>
       </w:r>
     </w:p>
     <w:p>
@@ -152,15 +144,7 @@
         <w:pStyle w:val="affc"/>
       </w:pPr>
       <w:r>
-        <w:t xml:space="preserve">When error messages, source code, and revisions are stored separately, later </w:t>
-      </w:r>
-      <w:proofErr w:type="gramStart"/>
-      <w:r>
-        <w:t>review</w:t>
-      </w:r>
-      <w:proofErr w:type="gramEnd"/>
-      <w:r>
-        <w:t xml:space="preserve"> can lose the context of a mistake. This paper presents a Spring Boot assistant that keeps these materials in one error record. The backend requests a model explanation, checks seven required fields, and saves both the structured result and the raw response. Users can record their judgment and the next review date. Sixteen Maven tests pass for the current implementation. The project also contains 150 candidate Java cases and 300 blank rating rows; human ratings are still needed before diagnostic accuracy can be calculated.</w:t>
+        <w:t>When error messages, source code, and revisions are stored separately, later review can lose the context of a mistake. This paper presents a Spring Boot assistant that keeps these materials in one error record. The backend requests a model explanation, checks seven required fields, and saves both the structured result and the raw response. Users can record their judgment and the next review date. Sixteen Maven tests pass for the current implementation. The project also contains 150 candidate Java cases and 300 blank rating rows; human ratings are still needed before diagnostic accuracy can be calculated.</w:t>
       </w:r>
     </w:p>
     <w:p>
@@ -540,21 +524,7 @@
         <w:rPr>
           <w:lang w:eastAsia="zh-CN"/>
         </w:rPr>
-        <w:t>（1</w:t>
-      </w:r>
-      <w:proofErr w:type="gramStart"/>
-      <w:r>
-        <w:rPr>
-          <w:lang w:eastAsia="zh-CN"/>
-        </w:rPr>
-        <w:t>） 账户</w:t>
-      </w:r>
-      <w:proofErr w:type="gramEnd"/>
-      <w:r>
-        <w:rPr>
-          <w:lang w:eastAsia="zh-CN"/>
-        </w:rPr>
-        <w:t>与错题操作。后端使用Spring Security检查访问权限，登录后签发携带身份信息的令牌；受保护接口先验证令牌，再按当前用户编号筛选数据。错题新增接口校验必填内容，查询接口支持分页和条件搜索，编辑与删除前再次校验归属。这样的双重检查使页面隐藏其他用户数据之外，后端也不会因为直接访问编号而返回别人的记录。</w:t>
+        <w:t>（1） 账户与错题操作。后端使用Spring Security检查访问权限，登录后签发携带身份信息的令牌；受保护接口先验证令牌，再按当前用户编号筛选数据。错题新增接口校验必填内容，查询接口支持分页和条件搜索，编辑与删除前再次校验归属。这样的双重检查使页面隐藏其他用户数据之外，后端也不会因为直接访问编号而返回别人的记录。</w:t>
       </w:r>
     </w:p>
     <w:p>
@@ -570,77 +540,7 @@
         <w:rPr>
           <w:lang w:eastAsia="zh-CN"/>
         </w:rPr>
-        <w:t>（2</w:t>
-      </w:r>
-      <w:proofErr w:type="gramStart"/>
-      <w:r>
-        <w:rPr>
-          <w:lang w:eastAsia="zh-CN"/>
-        </w:rPr>
-        <w:t>） 解析</w:t>
-      </w:r>
-      <w:proofErr w:type="gramEnd"/>
-      <w:r>
-        <w:rPr>
-          <w:lang w:eastAsia="zh-CN"/>
-        </w:rPr>
-        <w:t>内容生成。</w:t>
-      </w:r>
-      <w:proofErr w:type="spellStart"/>
-      <w:r>
-        <w:rPr>
-          <w:lang w:eastAsia="zh-CN"/>
-        </w:rPr>
-        <w:t>PromptService</w:t>
-      </w:r>
-      <w:proofErr w:type="spellEnd"/>
-      <w:r>
-        <w:rPr>
-          <w:lang w:eastAsia="zh-CN"/>
-        </w:rPr>
-        <w:t>把错题上下文写入统一模板，并说明题目及代码属于待分析数据，不能把其中的命令当作新指令执行。模板要求模型生成错误类型、位置、原因、建议、完整参考代码、1至6个知识点及学习建议。</w:t>
-      </w:r>
-      <w:proofErr w:type="spellStart"/>
-      <w:r>
-        <w:rPr>
-          <w:lang w:eastAsia="zh-CN"/>
-        </w:rPr>
-        <w:t>DeepSeekClient</w:t>
-      </w:r>
-      <w:proofErr w:type="spellEnd"/>
-      <w:r>
-        <w:rPr>
-          <w:lang w:eastAsia="zh-CN"/>
-        </w:rPr>
-        <w:t>调用配置的模型接口；</w:t>
-      </w:r>
-      <w:proofErr w:type="spellStart"/>
-      <w:r>
-        <w:rPr>
-          <w:lang w:eastAsia="zh-CN"/>
-        </w:rPr>
-        <w:t>AiResultParser</w:t>
-      </w:r>
-      <w:proofErr w:type="spellEnd"/>
-      <w:r>
-        <w:rPr>
-          <w:lang w:eastAsia="zh-CN"/>
-        </w:rPr>
-        <w:t>检查返回字段的类型、非空要求和长度限制，</w:t>
-      </w:r>
-      <w:proofErr w:type="spellStart"/>
-      <w:r>
-        <w:rPr>
-          <w:lang w:eastAsia="zh-CN"/>
-        </w:rPr>
-        <w:t>AnalysisService</w:t>
-      </w:r>
-      <w:proofErr w:type="spellEnd"/>
-      <w:r>
-        <w:rPr>
-          <w:lang w:eastAsia="zh-CN"/>
-        </w:rPr>
-        <w:t>再保存通过检查的内容。字段检查保证结果能够展示，原因是否正确仍需结合原题判断。</w:t>
+        <w:t>（2） 解析内容生成。PromptService把错题上下文写入统一模板，并说明题目及代码属于待分析数据，不能把其中的命令当作新指令执行。模板要求模型生成错误类型、位置、原因、建议、完整参考代码、1至6个知识点及学习建议。DeepSeekClient调用配置的模型接口；AiResultParser检查返回字段的类型、非空要求和长度限制，AnalysisService再保存通过检查的内容。字段检查保证结果能够展示，原因是否正确仍需结合原题判断。</w:t>
       </w:r>
     </w:p>
     <w:p>
@@ -691,35 +591,7 @@
         <w:rPr>
           <w:lang w:eastAsia="zh-CN"/>
         </w:rPr>
-        <w:t>（3</w:t>
-      </w:r>
-      <w:proofErr w:type="gramStart"/>
-      <w:r>
-        <w:rPr>
-          <w:lang w:eastAsia="zh-CN"/>
-        </w:rPr>
-        <w:t>） 状态</w:t>
-      </w:r>
-      <w:proofErr w:type="gramEnd"/>
-      <w:r>
-        <w:rPr>
-          <w:lang w:eastAsia="zh-CN"/>
-        </w:rPr>
-        <w:t>与资源控制。</w:t>
-      </w:r>
-      <w:proofErr w:type="spellStart"/>
-      <w:r>
-        <w:rPr>
-          <w:lang w:eastAsia="zh-CN"/>
-        </w:rPr>
-        <w:t>AnalysisService</w:t>
-      </w:r>
-      <w:proofErr w:type="spellEnd"/>
-      <w:r>
-        <w:rPr>
-          <w:lang w:eastAsia="zh-CN"/>
-        </w:rPr>
-        <w:t>在模型调用前以数据库条件更新争取分析资格，避免同一道错题被重复处理；调用时获取配额许可，结束后释放。模型返回后，结果、知识点关系和成功记录在同一次处理事务中写入。发生异常时系统记录失败并向页面返回服务不可用信息，用户可以稍后重试。分析历史保留多次解析，以便比较不同时间的回答。</w:t>
+        <w:t>（3） 状态与资源控制。AnalysisService在模型调用前以数据库条件更新争取分析资格，避免同一道错题被重复处理；调用时获取配额许可，结束后释放。模型返回后，结果、知识点关系和成功记录在同一次处理事务中写入。发生异常时系统记录失败并向页面返回服务不可用信息，用户可以稍后重试。分析历史保留多次解析，以便比较不同时间的回答。</w:t>
       </w:r>
     </w:p>
     <w:p>
@@ -735,35 +607,7 @@
         <w:rPr>
           <w:lang w:eastAsia="zh-CN"/>
         </w:rPr>
-        <w:t>（4</w:t>
-      </w:r>
-      <w:proofErr w:type="gramStart"/>
-      <w:r>
-        <w:rPr>
-          <w:lang w:eastAsia="zh-CN"/>
-        </w:rPr>
-        <w:t>） 复习</w:t>
-      </w:r>
-      <w:proofErr w:type="gramEnd"/>
-      <w:r>
-        <w:rPr>
-          <w:lang w:eastAsia="zh-CN"/>
-        </w:rPr>
-        <w:t>与展示。</w:t>
-      </w:r>
-      <w:proofErr w:type="spellStart"/>
-      <w:r>
-        <w:rPr>
-          <w:lang w:eastAsia="zh-CN"/>
-        </w:rPr>
-        <w:t>ReviewService</w:t>
-      </w:r>
-      <w:proofErr w:type="spellEnd"/>
-      <w:r>
-        <w:rPr>
-          <w:lang w:eastAsia="zh-CN"/>
-        </w:rPr>
-        <w:t>查询当前账户待复习的错题，写入复习明细并更新下一次日期；对尚未到期的重复提交返回冲突信息。浏览器工作台把原题、模型解释、参考代码、人工判断和复习入口放在连续操作路径中。页面显示的参考代码不会由应用自动编译或运行，因此用户应结合题目要求和测试结果决定是否采纳。</w:t>
+        <w:t>（4） 复习与展示。ReviewService查询当前账户待复习的错题，写入复习明细并更新下一次日期；对尚未到期的重复提交返回冲突信息。浏览器工作台把原题、模型解释、参考代码、人工判断和复习入口放在连续操作路径中。页面显示的参考代码不会由应用自动编译或运行，因此用户应结合题目要求和测试结果决定是否采纳。</w:t>
       </w:r>
     </w:p>
     <w:p>
@@ -796,35 +640,13 @@
         <w:rPr>
           <w:lang w:eastAsia="zh-CN"/>
         </w:rPr>
-        <w:t>（1</w:t>
+        <w:t>（1） 功能验证。2026年10月26日在项目当前检出版本执行mvn -q test，测试报告记录16项测试、0项失败、0项错误。测试涉及账户控制、登录限制、登录凭证、模型客户端、调用配额、复习规则和异常响应。源码中还可查到错题、解析、反馈及知识点的接口与数据表。</w:t>
       </w:r>
-      <w:proofErr w:type="gramStart"/>
       <w:r>
         <w:rPr>
           <w:lang w:eastAsia="zh-CN"/>
         </w:rPr>
-        <w:t>） 功能</w:t>
-      </w:r>
-      <w:proofErr w:type="gramEnd"/>
-      <w:r>
-        <w:rPr>
-          <w:lang w:eastAsia="zh-CN"/>
-        </w:rPr>
-        <w:t>验证。2026年10月26日在项目当前检出版本执行</w:t>
-      </w:r>
-      <w:proofErr w:type="spellStart"/>
-      <w:r>
-        <w:rPr>
-          <w:lang w:eastAsia="zh-CN"/>
-        </w:rPr>
-        <w:t>mvn</w:t>
-      </w:r>
-      <w:proofErr w:type="spellEnd"/>
-      <w:r>
-        <w:rPr>
-          <w:lang w:eastAsia="zh-CN"/>
-        </w:rPr>
-        <w:t xml:space="preserve"> -q test，测试报告记录16项测试、0项失败、0项错误。测试涉及账户控制、登录限制、登录凭证、模型客户端、调用配额、复习规则和异常响应。源码中还可查到错题、解析、反馈及知识点的接口与数据表。上述证据支持已覆盖功能的实现结论。</w:t>
+        <w:t>其中，复习测试验证了越权和未到期提交会被拒绝，配额测试验证了每日次数与并发上限；这16项测试本身未覆盖从页面录入错题到展示解析结果的完整操作。</w:t>
       </w:r>
     </w:p>
     <w:p>
@@ -840,35 +662,7 @@
         <w:rPr>
           <w:lang w:eastAsia="zh-CN"/>
         </w:rPr>
-        <w:t>（2</w:t>
-      </w:r>
-      <w:proofErr w:type="gramStart"/>
-      <w:r>
-        <w:rPr>
-          <w:lang w:eastAsia="zh-CN"/>
-        </w:rPr>
-        <w:t>） 解析</w:t>
-      </w:r>
-      <w:proofErr w:type="gramEnd"/>
-      <w:r>
-        <w:rPr>
-          <w:lang w:eastAsia="zh-CN"/>
-        </w:rPr>
-        <w:t>效果证据。项目实验目录保存来自</w:t>
-      </w:r>
-      <w:proofErr w:type="spellStart"/>
-      <w:r>
-        <w:rPr>
-          <w:lang w:eastAsia="zh-CN"/>
-        </w:rPr>
-        <w:t>IntroClassJava</w:t>
-      </w:r>
-      <w:proofErr w:type="spellEnd"/>
-      <w:r>
-        <w:rPr>
-          <w:lang w:eastAsia="zh-CN"/>
-        </w:rPr>
-        <w:t>的150条候选Java案例及两种提示词设置的300行评分表。该公开数据集提供带错误的Java程序，适合作为可追溯的候选来源</w:t>
+        <w:t>（2） 解析效果证据。项目实验目录保存来自IntroClassJava的150条候选Java案例及两种提示词设置的300行评分表。该公开数据集提供带错误的Java程序，适合作为可追溯的候选来源</w:t>
       </w:r>
       <w:r>
         <w:rPr>
@@ -896,21 +690,7 @@
         <w:rPr>
           <w:lang w:eastAsia="zh-CN"/>
         </w:rPr>
-        <w:t>（3</w:t>
-      </w:r>
-      <w:proofErr w:type="gramStart"/>
-      <w:r>
-        <w:rPr>
-          <w:lang w:eastAsia="zh-CN"/>
-        </w:rPr>
-        <w:t>） 后续</w:t>
-      </w:r>
-      <w:proofErr w:type="gramEnd"/>
-      <w:r>
-        <w:rPr>
-          <w:lang w:eastAsia="zh-CN"/>
-        </w:rPr>
-        <w:t>验证。评价将固定模型版本与案例集合，分别记录错误原因、修改建议、知识点和参考代码的人工判断；参考代码需要在隔离环境中运行对应测试。报告各项结果时应给出实际完成评分的分母。公开案例可能与模型训练材料重合，因而还需加入真实课程错题，检验结论在日常学习材料上是否成立。</w:t>
+        <w:t>（3） 后续验证。评价将固定模型版本与案例集合，分别记录错误原因、修改建议、知识点和参考代码的人工判断；参考代码需要在隔离环境中运行对应测试。报告各项结果时应给出实际完成评分的分母。公开案例可能与模型训练材料重合，因而还需加入真实课程错题，检验结论在日常学习材料上是否成立。</w:t>
       </w:r>
     </w:p>
     <w:p>
@@ -1009,91 +789,7 @@
         <w:rPr>
           <w:lang w:eastAsia="zh-CN"/>
         </w:rPr>
-        <w:t>[1]</w:t>
-      </w:r>
-      <w:proofErr w:type="gramStart"/>
-      <w:r>
-        <w:rPr>
-          <w:lang w:eastAsia="zh-CN"/>
-        </w:rPr>
-        <w:t>唐琳,</w:t>
-      </w:r>
-      <w:proofErr w:type="gramEnd"/>
-      <w:r>
-        <w:rPr>
-          <w:lang w:eastAsia="zh-CN"/>
-        </w:rPr>
-        <w:t xml:space="preserve"> </w:t>
-      </w:r>
-      <w:proofErr w:type="gramStart"/>
-      <w:r>
-        <w:rPr>
-          <w:lang w:eastAsia="zh-CN"/>
-        </w:rPr>
-        <w:t>张佳鑫,</w:t>
-      </w:r>
-      <w:proofErr w:type="gramEnd"/>
-      <w:r>
-        <w:rPr>
-          <w:lang w:eastAsia="zh-CN"/>
-        </w:rPr>
-        <w:t xml:space="preserve"> </w:t>
-      </w:r>
-      <w:proofErr w:type="gramStart"/>
-      <w:r>
-        <w:rPr>
-          <w:lang w:eastAsia="zh-CN"/>
-        </w:rPr>
-        <w:t>徐照光.</w:t>
-      </w:r>
-      <w:proofErr w:type="gramEnd"/>
-      <w:r>
-        <w:rPr>
-          <w:lang w:eastAsia="zh-CN"/>
-        </w:rPr>
-        <w:t xml:space="preserve"> 大语言模型在计算机编程实践课程教学中的应用[J]. 计算机</w:t>
-      </w:r>
-      <w:proofErr w:type="gramStart"/>
-      <w:r>
-        <w:rPr>
-          <w:lang w:eastAsia="zh-CN"/>
-        </w:rPr>
-        <w:t>教育,</w:t>
-      </w:r>
-      <w:proofErr w:type="gramEnd"/>
-      <w:r>
-        <w:rPr>
-          <w:lang w:eastAsia="zh-CN"/>
-        </w:rPr>
-        <w:t xml:space="preserve"> 2025</w:t>
-      </w:r>
-      <w:proofErr w:type="gramStart"/>
-      <w:r>
-        <w:rPr>
-          <w:lang w:eastAsia="zh-CN"/>
-        </w:rPr>
-        <w:t>(2): 97</w:t>
-      </w:r>
-      <w:proofErr w:type="gramEnd"/>
-      <w:r>
-        <w:rPr>
-          <w:lang w:eastAsia="zh-CN"/>
-        </w:rPr>
-        <w:t>-101</w:t>
-      </w:r>
-      <w:proofErr w:type="gramStart"/>
-      <w:r>
-        <w:rPr>
-          <w:lang w:eastAsia="zh-CN"/>
-        </w:rPr>
-        <w:t>, 106</w:t>
-      </w:r>
-      <w:proofErr w:type="gramEnd"/>
-      <w:r>
-        <w:rPr>
-          <w:lang w:eastAsia="zh-CN"/>
-        </w:rPr>
-        <w:t>.</w:t>
+        <w:t>[1]唐琳, 张佳鑫, 徐照光. 大语言模型在计算机编程实践课程教学中的应用[J]. 计算机教育, 2025(2): 97-101, 106.</w:t>
       </w:r>
     </w:p>
     <w:p>
@@ -1108,63 +804,7 @@
         <w:rPr>
           <w:lang w:eastAsia="zh-CN"/>
         </w:rPr>
-        <w:t>[2]</w:t>
-      </w:r>
-      <w:proofErr w:type="gramStart"/>
-      <w:r>
-        <w:rPr>
-          <w:lang w:eastAsia="zh-CN"/>
-        </w:rPr>
-        <w:t>陈峥,</w:t>
-      </w:r>
-      <w:proofErr w:type="gramEnd"/>
-      <w:r>
-        <w:rPr>
-          <w:lang w:eastAsia="zh-CN"/>
-        </w:rPr>
-        <w:t xml:space="preserve"> 喻</w:t>
-      </w:r>
-      <w:proofErr w:type="gramStart"/>
-      <w:r>
-        <w:rPr>
-          <w:lang w:eastAsia="zh-CN"/>
-        </w:rPr>
-        <w:t>俊杰.</w:t>
-      </w:r>
-      <w:proofErr w:type="gramEnd"/>
-      <w:r>
-        <w:rPr>
-          <w:lang w:eastAsia="zh-CN"/>
-        </w:rPr>
-        <w:t xml:space="preserve"> 基于LLM的Java编程作业评估与教学实践[J]. 计算机</w:t>
-      </w:r>
-      <w:proofErr w:type="gramStart"/>
-      <w:r>
-        <w:rPr>
-          <w:lang w:eastAsia="zh-CN"/>
-        </w:rPr>
-        <w:t>教育,</w:t>
-      </w:r>
-      <w:proofErr w:type="gramEnd"/>
-      <w:r>
-        <w:rPr>
-          <w:lang w:eastAsia="zh-CN"/>
-        </w:rPr>
-        <w:t xml:space="preserve"> 2026</w:t>
-      </w:r>
-      <w:proofErr w:type="gramStart"/>
-      <w:r>
-        <w:rPr>
-          <w:lang w:eastAsia="zh-CN"/>
-        </w:rPr>
-        <w:t>(6): 198</w:t>
-      </w:r>
-      <w:proofErr w:type="gramEnd"/>
-      <w:r>
-        <w:rPr>
-          <w:lang w:eastAsia="zh-CN"/>
-        </w:rPr>
-        <w:t>-205.</w:t>
+        <w:t>[2]陈峥, 喻俊杰. 基于LLM的Java编程作业评估与教学实践[J]. 计算机教育, 2026(6): 198-205.</w:t>
       </w:r>
     </w:p>
     <w:p>
@@ -1178,21 +818,7 @@
         <w:rPr>
           <w:rFonts w:ascii="Times New Roman" w:eastAsia="Times New Roman" w:hAnsi="Times New Roman"/>
         </w:rPr>
-        <w:t>[</w:t>
-      </w:r>
-      <w:proofErr w:type="gramStart"/>
-      <w:r>
-        <w:rPr>
-          <w:rFonts w:ascii="Times New Roman" w:eastAsia="Times New Roman" w:hAnsi="Times New Roman"/>
-        </w:rPr>
-        <w:t>3]KEUNING</w:t>
-      </w:r>
-      <w:proofErr w:type="gramEnd"/>
-      <w:r>
-        <w:rPr>
-          <w:rFonts w:ascii="Times New Roman" w:eastAsia="Times New Roman" w:hAnsi="Times New Roman"/>
-        </w:rPr>
-        <w:t xml:space="preserve"> H, JEURING J T, HEEREN B. A systematic literature review of automated feedback generation for programming exercises[J]. ACM Transactions on Computing Education, 2018, 19(1).</w:t>
+        <w:t>[3]KEUNING H, JEURING J T, HEEREN B. A systematic literature review of automated feedback generation for programming exercises[J]. ACM Transactions on Computing Education, 2018, 19(1).</w:t>
       </w:r>
     </w:p>
     <w:p>
@@ -1206,21 +832,7 @@
         <w:rPr>
           <w:rFonts w:ascii="Times New Roman" w:eastAsia="Times New Roman" w:hAnsi="Times New Roman"/>
         </w:rPr>
-        <w:t>[</w:t>
-      </w:r>
-      <w:proofErr w:type="gramStart"/>
-      <w:r>
-        <w:rPr>
-          <w:rFonts w:ascii="Times New Roman" w:eastAsia="Times New Roman" w:hAnsi="Times New Roman"/>
-        </w:rPr>
-        <w:t>4]KASNECI</w:t>
-      </w:r>
-      <w:proofErr w:type="gramEnd"/>
-      <w:r>
-        <w:rPr>
-          <w:rFonts w:ascii="Times New Roman" w:eastAsia="Times New Roman" w:hAnsi="Times New Roman"/>
-        </w:rPr>
-        <w:t xml:space="preserve"> E, SESSLER K, KÜCHEMANN S, et al. ChatGPT for good? On opportunities and challenges of large language models for education[J]. Learning and Individual Differences, 2023, 103: 102274.</w:t>
+        <w:t>[4]KASNECI E, SESSLER K, KÜCHEMANN S, et al. ChatGPT for good? On opportunities and challenges of large language models for education[J]. Learning and Individual Differences, 2023, 103: 102274.</w:t>
       </w:r>
     </w:p>
     <w:p>
@@ -1234,35 +846,7 @@
         <w:rPr>
           <w:rFonts w:ascii="Times New Roman" w:eastAsia="Times New Roman" w:hAnsi="Times New Roman"/>
         </w:rPr>
-        <w:t>[</w:t>
-      </w:r>
-      <w:proofErr w:type="gramStart"/>
-      <w:r>
-        <w:rPr>
-          <w:rFonts w:ascii="Times New Roman" w:eastAsia="Times New Roman" w:hAnsi="Times New Roman"/>
-        </w:rPr>
-        <w:t>5]SPRING</w:t>
-      </w:r>
-      <w:proofErr w:type="gramEnd"/>
-      <w:r>
-        <w:rPr>
-          <w:rFonts w:ascii="Times New Roman" w:eastAsia="Times New Roman" w:hAnsi="Times New Roman"/>
-        </w:rPr>
-        <w:t xml:space="preserve">. Spring Boot 3.5 Reference </w:t>
-      </w:r>
-      <w:proofErr w:type="gramStart"/>
-      <w:r>
-        <w:rPr>
-          <w:rFonts w:ascii="Times New Roman" w:eastAsia="Times New Roman" w:hAnsi="Times New Roman"/>
-        </w:rPr>
-        <w:t>Documentation[</w:t>
-      </w:r>
-      <w:proofErr w:type="gramEnd"/>
-      <w:r>
-        <w:rPr>
-          <w:rFonts w:ascii="Times New Roman" w:eastAsia="Times New Roman" w:hAnsi="Times New Roman"/>
-        </w:rPr>
-        <w:t>EB/OL]. https://docs.spring.io/spring-boot/3.5/reference/index.html, 2026-10-26.</w:t>
+        <w:t>[5]SPRING. Spring Boot 3.5 Reference Documentation[EB/OL]. https://docs.spring.io/spring-boot/3.5/reference/index.html, 2026-10-26.</w:t>
       </w:r>
     </w:p>
     <w:p>
@@ -1276,35 +860,7 @@
         <w:rPr>
           <w:rFonts w:ascii="Times New Roman" w:eastAsia="Times New Roman" w:hAnsi="Times New Roman"/>
         </w:rPr>
-        <w:t>[</w:t>
-      </w:r>
-      <w:proofErr w:type="gramStart"/>
-      <w:r>
-        <w:rPr>
-          <w:rFonts w:ascii="Times New Roman" w:eastAsia="Times New Roman" w:hAnsi="Times New Roman"/>
-        </w:rPr>
-        <w:t>6]OLLAMA</w:t>
-      </w:r>
-      <w:proofErr w:type="gramEnd"/>
-      <w:r>
-        <w:rPr>
-          <w:rFonts w:ascii="Times New Roman" w:eastAsia="Times New Roman" w:hAnsi="Times New Roman"/>
-        </w:rPr>
-        <w:t xml:space="preserve">. Generate a chat </w:t>
-      </w:r>
-      <w:proofErr w:type="gramStart"/>
-      <w:r>
-        <w:rPr>
-          <w:rFonts w:ascii="Times New Roman" w:eastAsia="Times New Roman" w:hAnsi="Times New Roman"/>
-        </w:rPr>
-        <w:t>message[</w:t>
-      </w:r>
-      <w:proofErr w:type="gramEnd"/>
-      <w:r>
-        <w:rPr>
-          <w:rFonts w:ascii="Times New Roman" w:eastAsia="Times New Roman" w:hAnsi="Times New Roman"/>
-        </w:rPr>
-        <w:t>EB/OL]. https://docs.ollama.com/api/chat, 2026-10-26.</w:t>
+        <w:t>[6]OLLAMA. Generate a chat message[EB/OL]. https://docs.ollama.com/api/chat, 2026-10-26.</w:t>
       </w:r>
     </w:p>
     <w:p>
@@ -1318,35 +874,7 @@
         <w:rPr>
           <w:rFonts w:ascii="Times New Roman" w:eastAsia="Times New Roman" w:hAnsi="Times New Roman"/>
         </w:rPr>
-        <w:t>[</w:t>
-      </w:r>
-      <w:proofErr w:type="gramStart"/>
-      <w:r>
-        <w:rPr>
-          <w:rFonts w:ascii="Times New Roman" w:eastAsia="Times New Roman" w:hAnsi="Times New Roman"/>
-        </w:rPr>
-        <w:t>7]ORACLE</w:t>
-      </w:r>
-      <w:proofErr w:type="gramEnd"/>
-      <w:r>
-        <w:rPr>
-          <w:rFonts w:ascii="Times New Roman" w:eastAsia="Times New Roman" w:hAnsi="Times New Roman"/>
-        </w:rPr>
-        <w:t xml:space="preserve">. MySQL8.4 Reference Manual: FOREIGN KEY </w:t>
-      </w:r>
-      <w:proofErr w:type="gramStart"/>
-      <w:r>
-        <w:rPr>
-          <w:rFonts w:ascii="Times New Roman" w:eastAsia="Times New Roman" w:hAnsi="Times New Roman"/>
-        </w:rPr>
-        <w:t>Constraints[</w:t>
-      </w:r>
-      <w:proofErr w:type="gramEnd"/>
-      <w:r>
-        <w:rPr>
-          <w:rFonts w:ascii="Times New Roman" w:eastAsia="Times New Roman" w:hAnsi="Times New Roman"/>
-        </w:rPr>
-        <w:t>EB/OL]. https://dev.mysql.com/doc/refman/8.4/en/constraint-foreign-key.html, 2026-10-26.</w:t>
+        <w:t>[7]ORACLE. MySQL8.4 Reference Manual: FOREIGN KEY Constraints[EB/OL]. https://dev.mysql.com/doc/refman/8.4/en/constraint-foreign-key.html, 2026-10-26.</w:t>
       </w:r>
     </w:p>
     <w:p>
@@ -1360,49 +888,7 @@
         <w:rPr>
           <w:rFonts w:ascii="Times New Roman" w:eastAsia="Times New Roman" w:hAnsi="Times New Roman"/>
         </w:rPr>
-        <w:t>[</w:t>
-      </w:r>
-      <w:proofErr w:type="gramStart"/>
-      <w:r>
-        <w:rPr>
-          <w:rFonts w:ascii="Times New Roman" w:eastAsia="Times New Roman" w:hAnsi="Times New Roman"/>
-        </w:rPr>
-        <w:t>8]SPIRALS</w:t>
-      </w:r>
-      <w:proofErr w:type="gramEnd"/>
-      <w:r>
-        <w:rPr>
-          <w:rFonts w:ascii="Times New Roman" w:eastAsia="Times New Roman" w:hAnsi="Times New Roman"/>
-        </w:rPr>
-        <w:t xml:space="preserve">-TEAM. </w:t>
-      </w:r>
-      <w:proofErr w:type="spellStart"/>
-      <w:r>
-        <w:rPr>
-          <w:rFonts w:ascii="Times New Roman" w:eastAsia="Times New Roman" w:hAnsi="Times New Roman"/>
-        </w:rPr>
-        <w:t>IntroClassJava</w:t>
-      </w:r>
-      <w:proofErr w:type="spellEnd"/>
-      <w:r>
-        <w:rPr>
-          <w:rFonts w:ascii="Times New Roman" w:eastAsia="Times New Roman" w:hAnsi="Times New Roman"/>
-        </w:rPr>
-        <w:t xml:space="preserve">: A dataset of Java bugs for automatic </w:t>
-      </w:r>
-      <w:proofErr w:type="gramStart"/>
-      <w:r>
-        <w:rPr>
-          <w:rFonts w:ascii="Times New Roman" w:eastAsia="Times New Roman" w:hAnsi="Times New Roman"/>
-        </w:rPr>
-        <w:t>repair[</w:t>
-      </w:r>
-      <w:proofErr w:type="gramEnd"/>
-      <w:r>
-        <w:rPr>
-          <w:rFonts w:ascii="Times New Roman" w:eastAsia="Times New Roman" w:hAnsi="Times New Roman"/>
-        </w:rPr>
-        <w:t>EB/OL]. https://github.com/Spirals-Team/IntroClassJava, 2026-10-26.</w:t>
+        <w:t>[8]SPIRALS-TEAM. IntroClassJava: A dataset of Java bugs for automatic repair[EB/OL]. https://github.com/Spirals-Team/IntroClassJava, 2026-10-26.</w:t>
       </w:r>
     </w:p>
     <w:sectPr>
@@ -1684,14 +1170,12 @@
         <w:rFonts w:hint="eastAsia"/>
       </w:rPr>
     </w:pPr>
-    <w:proofErr w:type="spellStart"/>
     <w:r>
       <w:rPr>
         <w:sz w:val="18"/>
       </w:rPr>
       <w:t>摘要</w:t>
     </w:r>
-    <w:proofErr w:type="spellEnd"/>
   </w:p>
 </w:hdr>
 </file>
@@ -1737,28 +1221,12 @@
         <w:rFonts w:hint="eastAsia"/>
       </w:rPr>
     </w:pPr>
-    <w:proofErr w:type="spellStart"/>
     <w:r>
       <w:rPr>
         <w:sz w:val="18"/>
       </w:rPr>
-      <w:t>基于Spring</w:t>
+      <w:t>基于Spring Boot的编程错题智能解析助手系统设计与实现</w:t>
     </w:r>
-    <w:proofErr w:type="spellEnd"/>
-    <w:r>
-      <w:rPr>
-        <w:sz w:val="18"/>
-      </w:rPr>
-      <w:t xml:space="preserve"> </w:t>
-    </w:r>
-    <w:proofErr w:type="spellStart"/>
-    <w:r>
-      <w:rPr>
-        <w:sz w:val="18"/>
-      </w:rPr>
-      <w:t>Boot的编程错题智能解析助手系统设计与实现</w:t>
-    </w:r>
-    <w:proofErr w:type="spellEnd"/>
   </w:p>
 </w:hdr>
 </file>
@@ -1778,28 +1246,12 @@
         <w:rFonts w:hint="eastAsia"/>
       </w:rPr>
     </w:pPr>
-    <w:proofErr w:type="spellStart"/>
     <w:r>
       <w:rPr>
         <w:sz w:val="18"/>
       </w:rPr>
-      <w:t>基于Spring</w:t>
+      <w:t>基于Spring Boot的编程错题智能解析助手系统设计与实现</w:t>
     </w:r>
-    <w:proofErr w:type="spellEnd"/>
-    <w:r>
-      <w:rPr>
-        <w:sz w:val="18"/>
-      </w:rPr>
-      <w:t xml:space="preserve"> </w:t>
-    </w:r>
-    <w:proofErr w:type="spellStart"/>
-    <w:r>
-      <w:rPr>
-        <w:sz w:val="18"/>
-      </w:rPr>
-      <w:t>Boot的编程错题智能解析助手系统设计与实现</w:t>
-    </w:r>
-    <w:proofErr w:type="spellEnd"/>
   </w:p>
 </w:hdr>
 </file>

</xml_diff>

<commit_message>
chore: auto sync 2026-10-27 09:47:36
</commit_message>
<xml_diff>
--- a/docs/papers/20230411330_严何涛_基于Spring Boot的编程错题智能解析助手系统设计与实现.docx
+++ b/docs/papers/20230411330_严何涛_基于Spring Boot的编程错题智能解析助手系统设计与实现.docx
@@ -72,7 +72,7 @@
         <w:rPr>
           <w:lang w:eastAsia="zh-CN"/>
         </w:rPr>
-        <w:t>当报错信息、原始代码和修改记录分散保存时，复习者难以还原错误产生的原因。本文实现的助手以一条错题为中心，保存题目描述、代码、报错信息以及实际和期望结果；后端据此请求模型分析，并检查返回内容是否包含错误类型、位置、原因、修改建议、参考代码、知识点和学习建议。分析结果与原始响应分别保存，用户还能记录判断和下次复习日期。项目当前的Maven测试共16项通过，覆盖账户、模型调用限制和复习规则等实现。另有150条候选Java案例及300行未填写的评分记录，解析准确率尚无可计算的人工评分数据。</w:t>
+        <w:t>编程练习中的报错信息、源代码与修改经过若分散保存，学生复习时难以追溯错误原因；直接采用模型生成的答案，还可能跳过对错误的判断。针对这一问题，本文设计并实现基于Spring Boot的编程错题智能解析助手。系统以错题为单位保存题目、原始代码、报错信息和实际、预期输出，再将这些信息提交给模型生成错误定位、原因解释、修改建议与参考代码。后端检查返回字段并保留原始响应，供学生结合代码和运行结果核验；学生可记录判断及依据，并根据复习表现安排下次回顾。当前版本16项自动化测试全部通过，覆盖登录控制、模型调用限额和复习规则等逻辑。项目已整理150条Java候选案例，但人工评分尚未完成，也未进行学习效果对照，因此不能报告解析准确率或学习成效。</w:t>
       </w:r>
     </w:p>
     <w:p>
@@ -144,7 +144,7 @@
         <w:pStyle w:val="affc"/>
       </w:pPr>
       <w:r>
-        <w:t>When error messages, source code, and revisions are stored separately, later review can lose the context of a mistake. This paper presents a Spring Boot assistant that keeps these materials in one error record. The backend requests a model explanation, checks seven required fields, and saves both the structured result and the raw response. Users can record their judgment and the next review date. Sixteen Maven tests pass for the current implementation. The project also contains 150 candidate Java cases and 300 blank rating rows; human ratings are still needed before diagnostic accuracy can be calculated.</w:t>
+        <w:t>When error messages, source code, and revisions are stored separately, students may struggle to trace the cause of a mistake during review. Accepting a model-generated answer without checking it can also bypass the reasoning needed to understand the error. This paper designs and implements a Spring Boot assistant for programming mistakes. Each record stores the task, original code, error message, and actual and expected output. The backend sends this context to a model for error localization, an explanation, revision advice, and reference code. It checks the returned fields and retains the raw response so that students can verify the advice against the code and output. They can record a judgment with reasons and schedule the next review according to their recall. All 16 automated tests pass in the current version, covering login controls, model-call limits, and review rules. The project has collected 150 candidate Java cases, but human ratings are incomplete and learning outcomes have not been compared. Diagnostic accuracy and educational effectiveness therefore remain unmeasured.</w:t>
       </w:r>
     </w:p>
     <w:p>

</xml_diff>

<commit_message>
chore: auto sync 2026-10-27 09:51:55
</commit_message>
<xml_diff>
--- a/docs/papers/20230411330_严何涛_基于Spring Boot的编程错题智能解析助手系统设计与实现.docx
+++ b/docs/papers/20230411330_严何涛_基于Spring Boot的编程错题智能解析助手系统设计与实现.docx
@@ -26,6 +26,7 @@
           <w:lang w:eastAsia="zh-CN"/>
         </w:rPr>
       </w:pPr>
+      <w:proofErr w:type="gramStart"/>
       <w:r>
         <w:rPr>
           <w:lang w:eastAsia="zh-CN"/>
@@ -43,7 +44,14 @@
         <w:rPr>
           <w:lang w:eastAsia="zh-CN"/>
         </w:rPr>
-        <w:t>学号：20230411330</w:t>
+        <w:t>学号</w:t>
+      </w:r>
+      <w:proofErr w:type="gramEnd"/>
+      <w:r>
+        <w:rPr>
+          <w:lang w:eastAsia="zh-CN"/>
+        </w:rPr>
+        <w:t>：20230411330</w:t>
       </w:r>
     </w:p>
     <w:p>
@@ -72,7 +80,20 @@
         <w:rPr>
           <w:lang w:eastAsia="zh-CN"/>
         </w:rPr>
-        <w:t>编程练习中的报错信息、源代码与修改经过若分散保存，学生复习时难以追溯错误原因；直接采用模型生成的答案，还可能跳过对错误的判断。针对这一问题，本文设计并实现基于Spring Boot的编程错题智能解析助手。系统以错题为单位保存题目、原始代码、报错信息和实际、预期输出，再将这些信息提交给模型生成错误定位、原因解释、修改建议与参考代码。后端检查返回字段并保留原始响应，供学生结合代码和运行结果核验；学生可记录判断及依据，并根据复习表现安排下次回顾。当前版本16项自动化测试全部通过，覆盖登录控制、模型调用限额和复习规则等逻辑。项目已整理150条Java候选案例，但人工评分尚未完成，也未进行学习效果对照，因此不能报告解析准确率或学习成效。</w:t>
+        <w:t>编程练习中的报错信息、源代码与修改经过</w:t>
+      </w:r>
+      <w:r>
+        <w:rPr>
+          <w:rFonts w:hint="eastAsia"/>
+          <w:lang w:eastAsia="zh-CN"/>
+        </w:rPr>
+        <w:t>被</w:t>
+      </w:r>
+      <w:r>
+        <w:rPr>
+          <w:lang w:eastAsia="zh-CN"/>
+        </w:rPr>
+        <w:t>分散保存，学生复习时难以追溯错误原因；直接采用模型生成的答案，还可能跳过对错误的判断。针对这一问题，本文设计并实现基于Spring Boot的编程错题智能解析助手。系统以错题为单位保存题目、原始代码、报错信息和实际、预期输出，再将这些信息提交给模型生成错误定位、原因解释、修改建议与参考代码。后端检查返回字段并保留原始响应，供学生结合代码和运行结果核验；学生可记录判断及依据，并根据复习表现安排下次回顾。当前版本16项自动化测试全部通过，覆盖登录控制、模型调用限额和复习规则等逻辑。项目已整理150条Java候选案例，但人工评分尚未完成，也未进行学习效果对照，因此不能报告解析准确率或学习成效。</w:t>
       </w:r>
     </w:p>
     <w:p>
@@ -524,7 +545,21 @@
         <w:rPr>
           <w:lang w:eastAsia="zh-CN"/>
         </w:rPr>
-        <w:t>（1） 账户与错题操作。后端使用Spring Security检查访问权限，登录后签发携带身份信息的令牌；受保护接口先验证令牌，再按当前用户编号筛选数据。错题新增接口校验必填内容，查询接口支持分页和条件搜索，编辑与删除前再次校验归属。这样的双重检查使页面隐藏其他用户数据之外，后端也不会因为直接访问编号而返回别人的记录。</w:t>
+        <w:t>（1</w:t>
+      </w:r>
+      <w:proofErr w:type="gramStart"/>
+      <w:r>
+        <w:rPr>
+          <w:lang w:eastAsia="zh-CN"/>
+        </w:rPr>
+        <w:t>） 账户</w:t>
+      </w:r>
+      <w:proofErr w:type="gramEnd"/>
+      <w:r>
+        <w:rPr>
+          <w:lang w:eastAsia="zh-CN"/>
+        </w:rPr>
+        <w:t>与错题操作。后端使用Spring Security检查访问权限，登录后签发携带身份信息的令牌；受保护接口先验证令牌，再按当前用户编号筛选数据。错题新增接口校验必填内容，查询接口支持分页和条件搜索，编辑与删除前再次校验归属。这样的双重检查使页面隐藏其他用户数据之外，后端也不会因为直接访问编号而返回别人的记录。</w:t>
       </w:r>
     </w:p>
     <w:p>
@@ -540,7 +575,77 @@
         <w:rPr>
           <w:lang w:eastAsia="zh-CN"/>
         </w:rPr>
-        <w:t>（2） 解析内容生成。PromptService把错题上下文写入统一模板，并说明题目及代码属于待分析数据，不能把其中的命令当作新指令执行。模板要求模型生成错误类型、位置、原因、建议、完整参考代码、1至6个知识点及学习建议。DeepSeekClient调用配置的模型接口；AiResultParser检查返回字段的类型、非空要求和长度限制，AnalysisService再保存通过检查的内容。字段检查保证结果能够展示，原因是否正确仍需结合原题判断。</w:t>
+        <w:t>（2</w:t>
+      </w:r>
+      <w:proofErr w:type="gramStart"/>
+      <w:r>
+        <w:rPr>
+          <w:lang w:eastAsia="zh-CN"/>
+        </w:rPr>
+        <w:t>） 解析</w:t>
+      </w:r>
+      <w:proofErr w:type="gramEnd"/>
+      <w:r>
+        <w:rPr>
+          <w:lang w:eastAsia="zh-CN"/>
+        </w:rPr>
+        <w:t>内容生成。</w:t>
+      </w:r>
+      <w:proofErr w:type="spellStart"/>
+      <w:r>
+        <w:rPr>
+          <w:lang w:eastAsia="zh-CN"/>
+        </w:rPr>
+        <w:t>PromptService</w:t>
+      </w:r>
+      <w:proofErr w:type="spellEnd"/>
+      <w:r>
+        <w:rPr>
+          <w:lang w:eastAsia="zh-CN"/>
+        </w:rPr>
+        <w:t>把错题上下文写入统一模板，并说明题目及代码属于待分析数据，不能把其中的命令当作新指令执行。模板要求模型生成错误类型、位置、原因、建议、完整参考代码、1至6个知识点及学习建议。</w:t>
+      </w:r>
+      <w:proofErr w:type="spellStart"/>
+      <w:r>
+        <w:rPr>
+          <w:lang w:eastAsia="zh-CN"/>
+        </w:rPr>
+        <w:t>DeepSeekClient</w:t>
+      </w:r>
+      <w:proofErr w:type="spellEnd"/>
+      <w:r>
+        <w:rPr>
+          <w:lang w:eastAsia="zh-CN"/>
+        </w:rPr>
+        <w:t>调用配置的模型接口；</w:t>
+      </w:r>
+      <w:proofErr w:type="spellStart"/>
+      <w:r>
+        <w:rPr>
+          <w:lang w:eastAsia="zh-CN"/>
+        </w:rPr>
+        <w:t>AiResultParser</w:t>
+      </w:r>
+      <w:proofErr w:type="spellEnd"/>
+      <w:r>
+        <w:rPr>
+          <w:lang w:eastAsia="zh-CN"/>
+        </w:rPr>
+        <w:t>检查返回字段的类型、非空要求和长度限制，</w:t>
+      </w:r>
+      <w:proofErr w:type="spellStart"/>
+      <w:r>
+        <w:rPr>
+          <w:lang w:eastAsia="zh-CN"/>
+        </w:rPr>
+        <w:t>AnalysisService</w:t>
+      </w:r>
+      <w:proofErr w:type="spellEnd"/>
+      <w:r>
+        <w:rPr>
+          <w:lang w:eastAsia="zh-CN"/>
+        </w:rPr>
+        <w:t>再保存通过检查的内容。字段检查保证结果能够展示，原因是否正确仍需结合原题判断。</w:t>
       </w:r>
     </w:p>
     <w:p>
@@ -591,7 +696,35 @@
         <w:rPr>
           <w:lang w:eastAsia="zh-CN"/>
         </w:rPr>
-        <w:t>（3） 状态与资源控制。AnalysisService在模型调用前以数据库条件更新争取分析资格，避免同一道错题被重复处理；调用时获取配额许可，结束后释放。模型返回后，结果、知识点关系和成功记录在同一次处理事务中写入。发生异常时系统记录失败并向页面返回服务不可用信息，用户可以稍后重试。分析历史保留多次解析，以便比较不同时间的回答。</w:t>
+        <w:t>（3</w:t>
+      </w:r>
+      <w:proofErr w:type="gramStart"/>
+      <w:r>
+        <w:rPr>
+          <w:lang w:eastAsia="zh-CN"/>
+        </w:rPr>
+        <w:t>） 状态</w:t>
+      </w:r>
+      <w:proofErr w:type="gramEnd"/>
+      <w:r>
+        <w:rPr>
+          <w:lang w:eastAsia="zh-CN"/>
+        </w:rPr>
+        <w:t>与资源控制。</w:t>
+      </w:r>
+      <w:proofErr w:type="spellStart"/>
+      <w:r>
+        <w:rPr>
+          <w:lang w:eastAsia="zh-CN"/>
+        </w:rPr>
+        <w:t>AnalysisService</w:t>
+      </w:r>
+      <w:proofErr w:type="spellEnd"/>
+      <w:r>
+        <w:rPr>
+          <w:lang w:eastAsia="zh-CN"/>
+        </w:rPr>
+        <w:t>在模型调用前以数据库条件更新争取分析资格，避免同一道错题被重复处理；调用时获取配额许可，结束后释放。模型返回后，结果、知识点关系和成功记录在同一次处理事务中写入。发生异常时系统记录失败并向页面返回服务不可用信息，用户可以稍后重试。分析历史保留多次解析，以便比较不同时间的回答。</w:t>
       </w:r>
     </w:p>
     <w:p>
@@ -607,7 +740,35 @@
         <w:rPr>
           <w:lang w:eastAsia="zh-CN"/>
         </w:rPr>
-        <w:t>（4） 复习与展示。ReviewService查询当前账户待复习的错题，写入复习明细并更新下一次日期；对尚未到期的重复提交返回冲突信息。浏览器工作台把原题、模型解释、参考代码、人工判断和复习入口放在连续操作路径中。页面显示的参考代码不会由应用自动编译或运行，因此用户应结合题目要求和测试结果决定是否采纳。</w:t>
+        <w:t>（4</w:t>
+      </w:r>
+      <w:proofErr w:type="gramStart"/>
+      <w:r>
+        <w:rPr>
+          <w:lang w:eastAsia="zh-CN"/>
+        </w:rPr>
+        <w:t>） 复习</w:t>
+      </w:r>
+      <w:proofErr w:type="gramEnd"/>
+      <w:r>
+        <w:rPr>
+          <w:lang w:eastAsia="zh-CN"/>
+        </w:rPr>
+        <w:t>与展示。</w:t>
+      </w:r>
+      <w:proofErr w:type="spellStart"/>
+      <w:r>
+        <w:rPr>
+          <w:lang w:eastAsia="zh-CN"/>
+        </w:rPr>
+        <w:t>ReviewService</w:t>
+      </w:r>
+      <w:proofErr w:type="spellEnd"/>
+      <w:r>
+        <w:rPr>
+          <w:lang w:eastAsia="zh-CN"/>
+        </w:rPr>
+        <w:t>查询当前账户待复习的错题，写入复习明细并更新下一次日期；对尚未到期的重复提交返回冲突信息。浏览器工作台把原题、模型解释、参考代码、人工判断和复习入口放在连续操作路径中。页面显示的参考代码不会由应用自动编译或运行，因此用户应结合题目要求和测试结果决定是否采纳。</w:t>
       </w:r>
     </w:p>
     <w:p>
@@ -640,7 +801,35 @@
         <w:rPr>
           <w:lang w:eastAsia="zh-CN"/>
         </w:rPr>
-        <w:t>（1） 功能验证。2026年10月26日在项目当前检出版本执行mvn -q test，测试报告记录16项测试、0项失败、0项错误。测试涉及账户控制、登录限制、登录凭证、模型客户端、调用配额、复习规则和异常响应。源码中还可查到错题、解析、反馈及知识点的接口与数据表。</w:t>
+        <w:t>（1</w:t>
+      </w:r>
+      <w:proofErr w:type="gramStart"/>
+      <w:r>
+        <w:rPr>
+          <w:lang w:eastAsia="zh-CN"/>
+        </w:rPr>
+        <w:t>） 功能</w:t>
+      </w:r>
+      <w:proofErr w:type="gramEnd"/>
+      <w:r>
+        <w:rPr>
+          <w:lang w:eastAsia="zh-CN"/>
+        </w:rPr>
+        <w:t>验证。2026年10月26日在项目当前检出版本执行</w:t>
+      </w:r>
+      <w:proofErr w:type="spellStart"/>
+      <w:r>
+        <w:rPr>
+          <w:lang w:eastAsia="zh-CN"/>
+        </w:rPr>
+        <w:t>mvn</w:t>
+      </w:r>
+      <w:proofErr w:type="spellEnd"/>
+      <w:r>
+        <w:rPr>
+          <w:lang w:eastAsia="zh-CN"/>
+        </w:rPr>
+        <w:t xml:space="preserve"> -q test，测试报告记录16项测试、0项失败、0项错误。测试涉及账户控制、登录限制、登录凭证、模型客户端、调用配额、复习规则和异常响应。源码中还可查到错题、解析、反馈及知识点的接口与数据表。</w:t>
       </w:r>
       <w:r>
         <w:rPr>
@@ -662,7 +851,35 @@
         <w:rPr>
           <w:lang w:eastAsia="zh-CN"/>
         </w:rPr>
-        <w:t>（2） 解析效果证据。项目实验目录保存来自IntroClassJava的150条候选Java案例及两种提示词设置的300行评分表。该公开数据集提供带错误的Java程序，适合作为可追溯的候选来源</w:t>
+        <w:t>（2</w:t>
+      </w:r>
+      <w:proofErr w:type="gramStart"/>
+      <w:r>
+        <w:rPr>
+          <w:lang w:eastAsia="zh-CN"/>
+        </w:rPr>
+        <w:t>） 解析</w:t>
+      </w:r>
+      <w:proofErr w:type="gramEnd"/>
+      <w:r>
+        <w:rPr>
+          <w:lang w:eastAsia="zh-CN"/>
+        </w:rPr>
+        <w:t>效果证据。项目实验目录保存来自</w:t>
+      </w:r>
+      <w:proofErr w:type="spellStart"/>
+      <w:r>
+        <w:rPr>
+          <w:lang w:eastAsia="zh-CN"/>
+        </w:rPr>
+        <w:t>IntroClassJava</w:t>
+      </w:r>
+      <w:proofErr w:type="spellEnd"/>
+      <w:r>
+        <w:rPr>
+          <w:lang w:eastAsia="zh-CN"/>
+        </w:rPr>
+        <w:t>的150条候选Java案例及两种提示词设置的300行评分表。该公开数据集提供带错误的Java程序，适合作为可追溯的候选来源</w:t>
       </w:r>
       <w:r>
         <w:rPr>
@@ -690,7 +907,21 @@
         <w:rPr>
           <w:lang w:eastAsia="zh-CN"/>
         </w:rPr>
-        <w:t>（3） 后续验证。评价将固定模型版本与案例集合，分别记录错误原因、修改建议、知识点和参考代码的人工判断；参考代码需要在隔离环境中运行对应测试。报告各项结果时应给出实际完成评分的分母。公开案例可能与模型训练材料重合，因而还需加入真实课程错题，检验结论在日常学习材料上是否成立。</w:t>
+        <w:t>（3</w:t>
+      </w:r>
+      <w:proofErr w:type="gramStart"/>
+      <w:r>
+        <w:rPr>
+          <w:lang w:eastAsia="zh-CN"/>
+        </w:rPr>
+        <w:t>） 后续</w:t>
+      </w:r>
+      <w:proofErr w:type="gramEnd"/>
+      <w:r>
+        <w:rPr>
+          <w:lang w:eastAsia="zh-CN"/>
+        </w:rPr>
+        <w:t>验证。评价将固定模型版本与案例集合，分别记录错误原因、修改建议、知识点和参考代码的人工判断；参考代码需要在隔离环境中运行对应测试。报告各项结果时应给出实际完成评分的分母。公开案例可能与模型训练材料重合，因而还需加入真实课程错题，检验结论在日常学习材料上是否成立。</w:t>
       </w:r>
     </w:p>
     <w:p>
@@ -789,7 +1020,91 @@
         <w:rPr>
           <w:lang w:eastAsia="zh-CN"/>
         </w:rPr>
-        <w:t>[1]唐琳, 张佳鑫, 徐照光. 大语言模型在计算机编程实践课程教学中的应用[J]. 计算机教育, 2025(2): 97-101, 106.</w:t>
+        <w:t>[1]</w:t>
+      </w:r>
+      <w:proofErr w:type="gramStart"/>
+      <w:r>
+        <w:rPr>
+          <w:lang w:eastAsia="zh-CN"/>
+        </w:rPr>
+        <w:t>唐琳,</w:t>
+      </w:r>
+      <w:proofErr w:type="gramEnd"/>
+      <w:r>
+        <w:rPr>
+          <w:lang w:eastAsia="zh-CN"/>
+        </w:rPr>
+        <w:t xml:space="preserve"> </w:t>
+      </w:r>
+      <w:proofErr w:type="gramStart"/>
+      <w:r>
+        <w:rPr>
+          <w:lang w:eastAsia="zh-CN"/>
+        </w:rPr>
+        <w:t>张佳鑫,</w:t>
+      </w:r>
+      <w:proofErr w:type="gramEnd"/>
+      <w:r>
+        <w:rPr>
+          <w:lang w:eastAsia="zh-CN"/>
+        </w:rPr>
+        <w:t xml:space="preserve"> </w:t>
+      </w:r>
+      <w:proofErr w:type="gramStart"/>
+      <w:r>
+        <w:rPr>
+          <w:lang w:eastAsia="zh-CN"/>
+        </w:rPr>
+        <w:t>徐照光.</w:t>
+      </w:r>
+      <w:proofErr w:type="gramEnd"/>
+      <w:r>
+        <w:rPr>
+          <w:lang w:eastAsia="zh-CN"/>
+        </w:rPr>
+        <w:t xml:space="preserve"> 大语言模型在计算机编程实践课程教学中的应用[J]. 计算机</w:t>
+      </w:r>
+      <w:proofErr w:type="gramStart"/>
+      <w:r>
+        <w:rPr>
+          <w:lang w:eastAsia="zh-CN"/>
+        </w:rPr>
+        <w:t>教育,</w:t>
+      </w:r>
+      <w:proofErr w:type="gramEnd"/>
+      <w:r>
+        <w:rPr>
+          <w:lang w:eastAsia="zh-CN"/>
+        </w:rPr>
+        <w:t xml:space="preserve"> 2025</w:t>
+      </w:r>
+      <w:proofErr w:type="gramStart"/>
+      <w:r>
+        <w:rPr>
+          <w:lang w:eastAsia="zh-CN"/>
+        </w:rPr>
+        <w:t>(2): 97</w:t>
+      </w:r>
+      <w:proofErr w:type="gramEnd"/>
+      <w:r>
+        <w:rPr>
+          <w:lang w:eastAsia="zh-CN"/>
+        </w:rPr>
+        <w:t>-101</w:t>
+      </w:r>
+      <w:proofErr w:type="gramStart"/>
+      <w:r>
+        <w:rPr>
+          <w:lang w:eastAsia="zh-CN"/>
+        </w:rPr>
+        <w:t>, 106</w:t>
+      </w:r>
+      <w:proofErr w:type="gramEnd"/>
+      <w:r>
+        <w:rPr>
+          <w:lang w:eastAsia="zh-CN"/>
+        </w:rPr>
+        <w:t>.</w:t>
       </w:r>
     </w:p>
     <w:p>
@@ -804,7 +1119,63 @@
         <w:rPr>
           <w:lang w:eastAsia="zh-CN"/>
         </w:rPr>
-        <w:t>[2]陈峥, 喻俊杰. 基于LLM的Java编程作业评估与教学实践[J]. 计算机教育, 2026(6): 198-205.</w:t>
+        <w:t>[2]</w:t>
+      </w:r>
+      <w:proofErr w:type="gramStart"/>
+      <w:r>
+        <w:rPr>
+          <w:lang w:eastAsia="zh-CN"/>
+        </w:rPr>
+        <w:t>陈峥,</w:t>
+      </w:r>
+      <w:proofErr w:type="gramEnd"/>
+      <w:r>
+        <w:rPr>
+          <w:lang w:eastAsia="zh-CN"/>
+        </w:rPr>
+        <w:t xml:space="preserve"> 喻</w:t>
+      </w:r>
+      <w:proofErr w:type="gramStart"/>
+      <w:r>
+        <w:rPr>
+          <w:lang w:eastAsia="zh-CN"/>
+        </w:rPr>
+        <w:t>俊杰.</w:t>
+      </w:r>
+      <w:proofErr w:type="gramEnd"/>
+      <w:r>
+        <w:rPr>
+          <w:lang w:eastAsia="zh-CN"/>
+        </w:rPr>
+        <w:t xml:space="preserve"> 基于LLM的Java编程作业评估与教学实践[J]. 计算机</w:t>
+      </w:r>
+      <w:proofErr w:type="gramStart"/>
+      <w:r>
+        <w:rPr>
+          <w:lang w:eastAsia="zh-CN"/>
+        </w:rPr>
+        <w:t>教育,</w:t>
+      </w:r>
+      <w:proofErr w:type="gramEnd"/>
+      <w:r>
+        <w:rPr>
+          <w:lang w:eastAsia="zh-CN"/>
+        </w:rPr>
+        <w:t xml:space="preserve"> 2026</w:t>
+      </w:r>
+      <w:proofErr w:type="gramStart"/>
+      <w:r>
+        <w:rPr>
+          <w:lang w:eastAsia="zh-CN"/>
+        </w:rPr>
+        <w:t>(6): 198</w:t>
+      </w:r>
+      <w:proofErr w:type="gramEnd"/>
+      <w:r>
+        <w:rPr>
+          <w:lang w:eastAsia="zh-CN"/>
+        </w:rPr>
+        <w:t>-205.</w:t>
       </w:r>
     </w:p>
     <w:p>
@@ -818,7 +1189,21 @@
         <w:rPr>
           <w:rFonts w:ascii="Times New Roman" w:eastAsia="Times New Roman" w:hAnsi="Times New Roman"/>
         </w:rPr>
-        <w:t>[3]KEUNING H, JEURING J T, HEEREN B. A systematic literature review of automated feedback generation for programming exercises[J]. ACM Transactions on Computing Education, 2018, 19(1).</w:t>
+        <w:t>[</w:t>
+      </w:r>
+      <w:proofErr w:type="gramStart"/>
+      <w:r>
+        <w:rPr>
+          <w:rFonts w:ascii="Times New Roman" w:eastAsia="Times New Roman" w:hAnsi="Times New Roman"/>
+        </w:rPr>
+        <w:t>3]KEUNING</w:t>
+      </w:r>
+      <w:proofErr w:type="gramEnd"/>
+      <w:r>
+        <w:rPr>
+          <w:rFonts w:ascii="Times New Roman" w:eastAsia="Times New Roman" w:hAnsi="Times New Roman"/>
+        </w:rPr>
+        <w:t xml:space="preserve"> H, JEURING J T, HEEREN B. A systematic literature review of automated feedback generation for programming exercises[J]. ACM Transactions on Computing Education, 2018, 19(1).</w:t>
       </w:r>
     </w:p>
     <w:p>
@@ -832,7 +1217,21 @@
         <w:rPr>
           <w:rFonts w:ascii="Times New Roman" w:eastAsia="Times New Roman" w:hAnsi="Times New Roman"/>
         </w:rPr>
-        <w:t>[4]KASNECI E, SESSLER K, KÜCHEMANN S, et al. ChatGPT for good? On opportunities and challenges of large language models for education[J]. Learning and Individual Differences, 2023, 103: 102274.</w:t>
+        <w:t>[</w:t>
+      </w:r>
+      <w:proofErr w:type="gramStart"/>
+      <w:r>
+        <w:rPr>
+          <w:rFonts w:ascii="Times New Roman" w:eastAsia="Times New Roman" w:hAnsi="Times New Roman"/>
+        </w:rPr>
+        <w:t>4]KASNECI</w:t>
+      </w:r>
+      <w:proofErr w:type="gramEnd"/>
+      <w:r>
+        <w:rPr>
+          <w:rFonts w:ascii="Times New Roman" w:eastAsia="Times New Roman" w:hAnsi="Times New Roman"/>
+        </w:rPr>
+        <w:t xml:space="preserve"> E, SESSLER K, KÜCHEMANN S, et al. ChatGPT for good? On opportunities and challenges of large language models for education[J]. Learning and Individual Differences, 2023, 103: 102274.</w:t>
       </w:r>
     </w:p>
     <w:p>
@@ -846,7 +1245,35 @@
         <w:rPr>
           <w:rFonts w:ascii="Times New Roman" w:eastAsia="Times New Roman" w:hAnsi="Times New Roman"/>
         </w:rPr>
-        <w:t>[5]SPRING. Spring Boot 3.5 Reference Documentation[EB/OL]. https://docs.spring.io/spring-boot/3.5/reference/index.html, 2026-10-26.</w:t>
+        <w:t>[</w:t>
+      </w:r>
+      <w:proofErr w:type="gramStart"/>
+      <w:r>
+        <w:rPr>
+          <w:rFonts w:ascii="Times New Roman" w:eastAsia="Times New Roman" w:hAnsi="Times New Roman"/>
+        </w:rPr>
+        <w:t>5]SPRING</w:t>
+      </w:r>
+      <w:proofErr w:type="gramEnd"/>
+      <w:r>
+        <w:rPr>
+          <w:rFonts w:ascii="Times New Roman" w:eastAsia="Times New Roman" w:hAnsi="Times New Roman"/>
+        </w:rPr>
+        <w:t xml:space="preserve">. Spring Boot 3.5 Reference </w:t>
+      </w:r>
+      <w:proofErr w:type="gramStart"/>
+      <w:r>
+        <w:rPr>
+          <w:rFonts w:ascii="Times New Roman" w:eastAsia="Times New Roman" w:hAnsi="Times New Roman"/>
+        </w:rPr>
+        <w:t>Documentation[</w:t>
+      </w:r>
+      <w:proofErr w:type="gramEnd"/>
+      <w:r>
+        <w:rPr>
+          <w:rFonts w:ascii="Times New Roman" w:eastAsia="Times New Roman" w:hAnsi="Times New Roman"/>
+        </w:rPr>
+        <w:t>EB/OL]. https://docs.spring.io/spring-boot/3.5/reference/index.html, 2026-10-26.</w:t>
       </w:r>
     </w:p>
     <w:p>
@@ -860,7 +1287,35 @@
         <w:rPr>
           <w:rFonts w:ascii="Times New Roman" w:eastAsia="Times New Roman" w:hAnsi="Times New Roman"/>
         </w:rPr>
-        <w:t>[6]OLLAMA. Generate a chat message[EB/OL]. https://docs.ollama.com/api/chat, 2026-10-26.</w:t>
+        <w:t>[</w:t>
+      </w:r>
+      <w:proofErr w:type="gramStart"/>
+      <w:r>
+        <w:rPr>
+          <w:rFonts w:ascii="Times New Roman" w:eastAsia="Times New Roman" w:hAnsi="Times New Roman"/>
+        </w:rPr>
+        <w:t>6]OLLAMA</w:t>
+      </w:r>
+      <w:proofErr w:type="gramEnd"/>
+      <w:r>
+        <w:rPr>
+          <w:rFonts w:ascii="Times New Roman" w:eastAsia="Times New Roman" w:hAnsi="Times New Roman"/>
+        </w:rPr>
+        <w:t xml:space="preserve">. Generate a chat </w:t>
+      </w:r>
+      <w:proofErr w:type="gramStart"/>
+      <w:r>
+        <w:rPr>
+          <w:rFonts w:ascii="Times New Roman" w:eastAsia="Times New Roman" w:hAnsi="Times New Roman"/>
+        </w:rPr>
+        <w:t>message[</w:t>
+      </w:r>
+      <w:proofErr w:type="gramEnd"/>
+      <w:r>
+        <w:rPr>
+          <w:rFonts w:ascii="Times New Roman" w:eastAsia="Times New Roman" w:hAnsi="Times New Roman"/>
+        </w:rPr>
+        <w:t>EB/OL]. https://docs.ollama.com/api/chat, 2026-10-26.</w:t>
       </w:r>
     </w:p>
     <w:p>
@@ -874,7 +1329,35 @@
         <w:rPr>
           <w:rFonts w:ascii="Times New Roman" w:eastAsia="Times New Roman" w:hAnsi="Times New Roman"/>
         </w:rPr>
-        <w:t>[7]ORACLE. MySQL8.4 Reference Manual: FOREIGN KEY Constraints[EB/OL]. https://dev.mysql.com/doc/refman/8.4/en/constraint-foreign-key.html, 2026-10-26.</w:t>
+        <w:t>[</w:t>
+      </w:r>
+      <w:proofErr w:type="gramStart"/>
+      <w:r>
+        <w:rPr>
+          <w:rFonts w:ascii="Times New Roman" w:eastAsia="Times New Roman" w:hAnsi="Times New Roman"/>
+        </w:rPr>
+        <w:t>7]ORACLE</w:t>
+      </w:r>
+      <w:proofErr w:type="gramEnd"/>
+      <w:r>
+        <w:rPr>
+          <w:rFonts w:ascii="Times New Roman" w:eastAsia="Times New Roman" w:hAnsi="Times New Roman"/>
+        </w:rPr>
+        <w:t xml:space="preserve">. MySQL8.4 Reference Manual: FOREIGN KEY </w:t>
+      </w:r>
+      <w:proofErr w:type="gramStart"/>
+      <w:r>
+        <w:rPr>
+          <w:rFonts w:ascii="Times New Roman" w:eastAsia="Times New Roman" w:hAnsi="Times New Roman"/>
+        </w:rPr>
+        <w:t>Constraints[</w:t>
+      </w:r>
+      <w:proofErr w:type="gramEnd"/>
+      <w:r>
+        <w:rPr>
+          <w:rFonts w:ascii="Times New Roman" w:eastAsia="Times New Roman" w:hAnsi="Times New Roman"/>
+        </w:rPr>
+        <w:t>EB/OL]. https://dev.mysql.com/doc/refman/8.4/en/constraint-foreign-key.html, 2026-10-26.</w:t>
       </w:r>
     </w:p>
     <w:p>
@@ -888,7 +1371,49 @@
         <w:rPr>
           <w:rFonts w:ascii="Times New Roman" w:eastAsia="Times New Roman" w:hAnsi="Times New Roman"/>
         </w:rPr>
-        <w:t>[8]SPIRALS-TEAM. IntroClassJava: A dataset of Java bugs for automatic repair[EB/OL]. https://github.com/Spirals-Team/IntroClassJava, 2026-10-26.</w:t>
+        <w:t>[</w:t>
+      </w:r>
+      <w:proofErr w:type="gramStart"/>
+      <w:r>
+        <w:rPr>
+          <w:rFonts w:ascii="Times New Roman" w:eastAsia="Times New Roman" w:hAnsi="Times New Roman"/>
+        </w:rPr>
+        <w:t>8]SPIRALS</w:t>
+      </w:r>
+      <w:proofErr w:type="gramEnd"/>
+      <w:r>
+        <w:rPr>
+          <w:rFonts w:ascii="Times New Roman" w:eastAsia="Times New Roman" w:hAnsi="Times New Roman"/>
+        </w:rPr>
+        <w:t xml:space="preserve">-TEAM. </w:t>
+      </w:r>
+      <w:proofErr w:type="spellStart"/>
+      <w:r>
+        <w:rPr>
+          <w:rFonts w:ascii="Times New Roman" w:eastAsia="Times New Roman" w:hAnsi="Times New Roman"/>
+        </w:rPr>
+        <w:t>IntroClassJava</w:t>
+      </w:r>
+      <w:proofErr w:type="spellEnd"/>
+      <w:r>
+        <w:rPr>
+          <w:rFonts w:ascii="Times New Roman" w:eastAsia="Times New Roman" w:hAnsi="Times New Roman"/>
+        </w:rPr>
+        <w:t xml:space="preserve">: A dataset of Java bugs for automatic </w:t>
+      </w:r>
+      <w:proofErr w:type="gramStart"/>
+      <w:r>
+        <w:rPr>
+          <w:rFonts w:ascii="Times New Roman" w:eastAsia="Times New Roman" w:hAnsi="Times New Roman"/>
+        </w:rPr>
+        <w:t>repair[</w:t>
+      </w:r>
+      <w:proofErr w:type="gramEnd"/>
+      <w:r>
+        <w:rPr>
+          <w:rFonts w:ascii="Times New Roman" w:eastAsia="Times New Roman" w:hAnsi="Times New Roman"/>
+        </w:rPr>
+        <w:t>EB/OL]. https://github.com/Spirals-Team/IntroClassJava, 2026-10-26.</w:t>
       </w:r>
     </w:p>
     <w:sectPr>
@@ -1170,12 +1695,14 @@
         <w:rFonts w:hint="eastAsia"/>
       </w:rPr>
     </w:pPr>
+    <w:proofErr w:type="spellStart"/>
     <w:r>
       <w:rPr>
         <w:sz w:val="18"/>
       </w:rPr>
       <w:t>摘要</w:t>
     </w:r>
+    <w:proofErr w:type="spellEnd"/>
   </w:p>
 </w:hdr>
 </file>
@@ -1221,12 +1748,28 @@
         <w:rFonts w:hint="eastAsia"/>
       </w:rPr>
     </w:pPr>
+    <w:proofErr w:type="spellStart"/>
     <w:r>
       <w:rPr>
         <w:sz w:val="18"/>
       </w:rPr>
-      <w:t>基于Spring Boot的编程错题智能解析助手系统设计与实现</w:t>
+      <w:t>基于Spring</w:t>
     </w:r>
+    <w:proofErr w:type="spellEnd"/>
+    <w:r>
+      <w:rPr>
+        <w:sz w:val="18"/>
+      </w:rPr>
+      <w:t xml:space="preserve"> </w:t>
+    </w:r>
+    <w:proofErr w:type="spellStart"/>
+    <w:r>
+      <w:rPr>
+        <w:sz w:val="18"/>
+      </w:rPr>
+      <w:t>Boot的编程错题智能解析助手系统设计与实现</w:t>
+    </w:r>
+    <w:proofErr w:type="spellEnd"/>
   </w:p>
 </w:hdr>
 </file>
@@ -1246,12 +1789,28 @@
         <w:rFonts w:hint="eastAsia"/>
       </w:rPr>
     </w:pPr>
+    <w:proofErr w:type="spellStart"/>
     <w:r>
       <w:rPr>
         <w:sz w:val="18"/>
       </w:rPr>
-      <w:t>基于Spring Boot的编程错题智能解析助手系统设计与实现</w:t>
+      <w:t>基于Spring</w:t>
     </w:r>
+    <w:proofErr w:type="spellEnd"/>
+    <w:r>
+      <w:rPr>
+        <w:sz w:val="18"/>
+      </w:rPr>
+      <w:t xml:space="preserve"> </w:t>
+    </w:r>
+    <w:proofErr w:type="spellStart"/>
+    <w:r>
+      <w:rPr>
+        <w:sz w:val="18"/>
+      </w:rPr>
+      <w:t>Boot的编程错题智能解析助手系统设计与实现</w:t>
+    </w:r>
+    <w:proofErr w:type="spellEnd"/>
   </w:p>
 </w:hdr>
 </file>

</xml_diff>

<commit_message>
Trim unfinished test plans and clarify paper wording
</commit_message>
<xml_diff>
--- a/docs/papers/20230411330_严何涛_基于Spring Boot的编程错题智能解析助手系统设计与实现.docx
+++ b/docs/papers/20230411330_严何涛_基于Spring Boot的编程错题智能解析助手系统设计与实现.docx
@@ -93,7 +93,7 @@
         <w:rPr>
           <w:lang w:eastAsia="zh-CN"/>
         </w:rPr>
-        <w:t>分散保存，学生复习时难以追溯错误原因；直接采用模型生成的答案，还可能跳过对错误的判断。针对这一问题，本文设计并实现基于Spring Boot的编程错题智能解析助手。系统以错题为单位保存题目、原始代码、报错信息和实际、预期输出，再将这些信息提交给模型生成错误定位、原因解释、修改建议与参考代码。后端检查返回字段并保留原始响应，供学生结合代码和运行结果核验；学生可记录判断及依据，并根据复习表现安排下次回顾。当前版本16项自动化测试全部通过，覆盖登录控制、模型调用限额和复习规则等逻辑。项目已整理150条Java候选案例，但人工评分尚未完成，也未进行学习效果对照，因此不能报告解析准确率或学习成效。</w:t>
+        <w:t>分散保存，学生复习时难以追溯错误原因；直接采用模型生成的答案，还可能跳过对错误的判断。为在复习时保留原始报错和修改依据，本文设计并实现基于Spring Boot的编程错题智能解析助手。系统以错题为单位保存题目、原始代码、报错信息和实际、预期输出，再将这些信息提交给模型生成错误定位、原因解释、修改建议与参考代码。后端检查返回字段并保留原始响应，供学生结合代码和运行结果核验；学生可记录判断及依据，并根据复习表现安排下次回顾。当前版本的16项自动化测试全部通过。</w:t>
       </w:r>
     </w:p>
     <w:p>
@@ -165,7 +165,7 @@
         <w:pStyle w:val="affc"/>
       </w:pPr>
       <w:r>
-        <w:t>When error messages, source code, and revisions are stored separately, students may struggle to trace the cause of a mistake during review. Accepting a model-generated answer without checking it can also bypass the reasoning needed to understand the error. This paper designs and implements a Spring Boot assistant for programming mistakes. Each record stores the task, original code, error message, and actual and expected output. The backend sends this context to a model for error localization, an explanation, revision advice, and reference code. It checks the returned fields and retains the raw response so that students can verify the advice against the code and output. They can record a judgment with reasons and schedule the next review according to their recall. All 16 automated tests pass in the current version, covering login controls, model-call limits, and review rules. The project has collected 150 candidate Java cases, but human ratings are incomplete and learning outcomes have not been compared. Diagnostic accuracy and educational effectiveness therefore remain unmeasured.</w:t>
+        <w:t>When error messages, source code, and revisions are stored separately, students may struggle to trace the cause of a mistake during review. Accepting a model-generated answer without checking it can also bypass the reasoning needed to understand the error. To preserve the original error context and the reasons for revisions during review, this paper presents a Spring Boot assistant for programming mistakes. Each record stores the task, original code, error message, and actual and expected output. The backend sends this context to a model for error localization, an explanation, revision advice, and reference code. It checks the returned fields and retains the raw response so that students can verify the advice against the code and output. They can record a judgment with reasons and schedule the next review according to their recall. All 16 automated tests pass in the current version.</w:t>
       </w:r>
     </w:p>
     <w:p>
@@ -300,7 +300,7 @@
         <w:rPr>
           <w:lang w:eastAsia="zh-CN"/>
         </w:rPr>
-        <w:t>。学生在“AI分析”页查看错误原因、修改建议和参考代码后，可选择“分析正确”“分析有误”或“暂不确定”，填写核验说明；系统按当前账户保存判断，并保留原始模型响应供后续核查。研究目标是完成可运行的个人错题整理与解析流程，考察系统功能能否贯通；解析正确率则须等待独立标注与代码测试。</w:t>
+        <w:t>。学生在“AI分析”页查看错误原因、修改建议和参考代码后，可选择“分析正确”“分析有误”或“暂不确定”，填写核验说明；系统按当前账户保存判断，并保留原始模型响应供后续核查。本文围绕个人错题的保存、解释查看、人工核验和定期复习设计操作流程。</w:t>
       </w:r>
     </w:p>
     <w:p>
@@ -512,7 +512,7 @@
         <w:rPr>
           <w:lang w:eastAsia="zh-CN"/>
         </w:rPr>
-        <w:t>（4）学习闭环。错题经过分析后，用户可将分析标为准确、不准确或无法判断，并写下依据。这是个人反馈，不等同于专家评分。复习模块记录“已经记住”或“还需练习”：连续记住时依次安排1、3、7、14、30天后的回顾，忘记时重新安排1天后复习。统计模块按当前账户汇总错题总数、已解析数和分析次数，帮助用户发现尚未处理的记录。</w:t>
+        <w:t>（4）分析核验与复习安排。错题经过分析后，用户可将分析标为准确、不准确或无法判断，并写下依据。这是个人反馈，不等同于专家评分。复习模块记录“已经记住”或“还需练习”：连续记住时依次安排1、3、7、14、30天后的回顾，忘记时重新安排1天后复习。统计模块按当前账户汇总错题总数、已解析数和分析次数，帮助用户发现尚未处理的记录。</w:t>
       </w:r>
     </w:p>
     <w:p>
@@ -661,41 +661,6 @@
         <w:rPr>
           <w:lang w:eastAsia="zh-CN"/>
         </w:rPr>
-        <w:t>实验目录中的候选案例ICJ-003提供了一个具体输入：随附测试将A、B、C、D档阈值依次设为80、70、60、50，成绩45的预期输出为不及格；候选源码只处理A至D档，缺少低于D档时的输出分支</w:t>
-      </w:r>
-      <w:r>
-        <w:rPr>
-          <w:lang w:eastAsia="zh-CN"/>
-        </w:rPr>
-        <w:t>[8]</w:t>
-      </w:r>
-      <w:r>
-        <w:rPr>
-          <w:lang w:eastAsia="zh-CN"/>
-        </w:rPr>
-        <w:t>。录入此题时，可分别保存题目、源码、测试输入、实际输出和预期的不及格提示。后端将这些字段交给模型，并把生成的原因和建议留给用户核验；本例的源码与测试说明输入如何组织，不充当</w:t>
-      </w:r>
-      <w:r>
-        <w:rPr>
-          <w:lang w:eastAsia="zh-CN"/>
-        </w:rPr>
-        <w:lastRenderedPageBreak/>
-        <w:t>模型回答正确的证据。</w:t>
-      </w:r>
-    </w:p>
-    <w:p>
-      <w:pPr>
-        <w:spacing w:line="240" w:lineRule="auto"/>
-        <w:ind w:firstLineChars="200"/>
-        <w:rPr>
-          <w:rFonts w:hint="eastAsia"/>
-          <w:lang w:eastAsia="zh-CN"/>
-        </w:rPr>
-      </w:pPr>
-      <w:r>
-        <w:rPr>
-          <w:lang w:eastAsia="zh-CN"/>
-        </w:rPr>
         <w:t>（3</w:t>
       </w:r>
       <w:proofErr w:type="gramStart"/>
@@ -801,127 +766,41 @@
         <w:rPr>
           <w:lang w:eastAsia="zh-CN"/>
         </w:rPr>
-        <w:t>（1</w:t>
+        <w:t>2026年10月27日在项目版本中执行mvn -q test，测试报告记录16项测试、0项失败、0项错误。验证范围包括登录限制、登录身份校验、模型调用次数与同时处理数量限制，以及复习记录的归属检查和到期判断。复习测试确认了访问他人错题、未到期重复提交会被拒绝；配额测试确认了每日次数和同时调用数量的上限。上述结果支持账户访问、调用限制与复习规则按既定要求运行</w:t>
       </w:r>
       <w:proofErr w:type="gramStart"/>
       <w:r>
         <w:rPr>
           <w:lang w:eastAsia="zh-CN"/>
         </w:rPr>
-        <w:t>） 功能</w:t>
+        <w:t/>
       </w:r>
       <w:proofErr w:type="gramEnd"/>
       <w:r>
         <w:rPr>
           <w:lang w:eastAsia="zh-CN"/>
         </w:rPr>
-        <w:t>验证。2026年10月26日在项目当前检出版本执行</w:t>
+        <w:t/>
       </w:r>
       <w:proofErr w:type="spellStart"/>
       <w:r>
         <w:rPr>
           <w:lang w:eastAsia="zh-CN"/>
         </w:rPr>
-        <w:t>mvn</w:t>
+        <w:t/>
       </w:r>
       <w:proofErr w:type="spellEnd"/>
       <w:r>
         <w:rPr>
           <w:lang w:eastAsia="zh-CN"/>
         </w:rPr>
-        <w:t xml:space="preserve"> -q test，测试报告记录16项测试、0项失败、0项错误。测试涉及账户控制、登录限制、登录凭证、模型客户端、调用配额、复习规则和异常响应。源码中还可查到错题、解析、反馈及知识点的接口与数据表。</w:t>
+        <w:t xml:space="preserve"/>
       </w:r>
       <w:r>
         <w:rPr>
           <w:lang w:eastAsia="zh-CN"/>
         </w:rPr>
-        <w:t>其中，复习测试验证了越权和未到期提交会被拒绝，配额测试验证了每日次数与并发上限；这16项测试本身未覆盖从页面录入错题到展示解析结果的完整操作。</w:t>
-      </w:r>
-    </w:p>
-    <w:p>
-      <w:pPr>
-        <w:spacing w:line="240" w:lineRule="auto"/>
-        <w:ind w:firstLineChars="200"/>
-        <w:rPr>
-          <w:rFonts w:hint="eastAsia"/>
-          <w:lang w:eastAsia="zh-CN"/>
-        </w:rPr>
-      </w:pPr>
-      <w:r>
-        <w:rPr>
-          <w:lang w:eastAsia="zh-CN"/>
-        </w:rPr>
-        <w:t>（2</w:t>
-      </w:r>
-      <w:proofErr w:type="gramStart"/>
-      <w:r>
-        <w:rPr>
-          <w:lang w:eastAsia="zh-CN"/>
-        </w:rPr>
-        <w:t>） 解析</w:t>
-      </w:r>
-      <w:proofErr w:type="gramEnd"/>
-      <w:r>
-        <w:rPr>
-          <w:lang w:eastAsia="zh-CN"/>
-        </w:rPr>
-        <w:t>效果证据。项目实验目录保存来自</w:t>
-      </w:r>
-      <w:proofErr w:type="spellStart"/>
-      <w:r>
-        <w:rPr>
-          <w:lang w:eastAsia="zh-CN"/>
-        </w:rPr>
-        <w:t>IntroClassJava</w:t>
-      </w:r>
-      <w:proofErr w:type="spellEnd"/>
-      <w:r>
-        <w:rPr>
-          <w:lang w:eastAsia="zh-CN"/>
-        </w:rPr>
-        <w:t>的150条候选Java案例及两种提示词设置的300行评分表。该公开数据集提供带错误的Java程序，适合作为可追溯的候选来源</w:t>
-      </w:r>
-      <w:r>
-        <w:rPr>
-          <w:lang w:eastAsia="zh-CN"/>
-        </w:rPr>
-        <w:t>[8]</w:t>
-      </w:r>
-      <w:r>
-        <w:rPr>
-          <w:lang w:eastAsia="zh-CN"/>
-        </w:rPr>
         <w:t>。</w:t>
-      </w:r>
-    </w:p>
-    <w:p>
-      <w:pPr>
-        <w:spacing w:line="240" w:lineRule="auto"/>
-        <w:ind w:firstLineChars="200"/>
-        <w:rPr>
-          <w:rFonts w:hint="eastAsia"/>
-          <w:lang w:eastAsia="zh-CN"/>
-        </w:rPr>
-      </w:pPr>
-      <w:r>
-        <w:rPr>
-          <w:lang w:eastAsia="zh-CN"/>
-        </w:rPr>
-        <w:t>（3</w:t>
-      </w:r>
-      <w:proofErr w:type="gramStart"/>
-      <w:r>
-        <w:rPr>
-          <w:lang w:eastAsia="zh-CN"/>
-        </w:rPr>
-        <w:t>） 后续</w:t>
-      </w:r>
-      <w:proofErr w:type="gramEnd"/>
-      <w:r>
-        <w:rPr>
-          <w:lang w:eastAsia="zh-CN"/>
-        </w:rPr>
-        <w:t>验证。评价将固定模型版本与案例集合，分别记录错误原因、修改建议、知识点和参考代码的人工判断；参考代码需要在隔离环境中运行对应测试。报告各项结果时应给出实际完成评分的分母。公开案例可能与模型训练材料重合，因而还需加入真实课程错题，检验结论在日常学习材料上是否成立。</w:t>
       </w:r>
     </w:p>
     <w:p>
@@ -954,23 +833,7 @@
         <w:rPr>
           <w:lang w:eastAsia="zh-CN"/>
         </w:rPr>
-        <w:t>系统把原题材料、模型生成解释、人工判断和复习日期关联到同一条错题。账户归属检查、字段校验和调用限额使这些记录能够按用户保存和查看；自动化测试验证了其中已覆盖的业务规则。</w:t>
-      </w:r>
-    </w:p>
-    <w:p>
-      <w:pPr>
-        <w:spacing w:line="240" w:lineRule="auto"/>
-        <w:ind w:firstLineChars="200"/>
-        <w:rPr>
-          <w:rFonts w:hint="eastAsia"/>
-          <w:lang w:eastAsia="zh-CN"/>
-        </w:rPr>
-      </w:pPr>
-      <w:r>
-        <w:rPr>
-          <w:lang w:eastAsia="zh-CN"/>
-        </w:rPr>
-        <w:t>实验表按150条案例和两种提示词设置预留300行。实际评估时，核验者需分别记录错误原因与修改建议是否正确、参考代码是否通过对应测试，三项用0或1填写；缺项不计入已核验样本。取得模型输出并完成标注后，按两种设置分别报告有效样本数和三项通过比例，再用真实课程错题复核。</w:t>
+        <w:t>系统把原题材料、模型生成解释、人工判断和复习日期关联到同一条错题。账户归属检查、字段校验和调用限额使这些记录能够按用户保存和查看。个人学习者可沿同一条记录查看原始问题、核对模型建议并安排复习。</w:t>
       </w:r>
     </w:p>
     <w:p>
@@ -1358,62 +1221,6 @@
           <w:rFonts w:ascii="Times New Roman" w:eastAsia="Times New Roman" w:hAnsi="Times New Roman"/>
         </w:rPr>
         <w:t>EB/OL]. https://dev.mysql.com/doc/refman/8.4/en/constraint-foreign-key.html, 2026-10-26.</w:t>
-      </w:r>
-    </w:p>
-    <w:p>
-      <w:pPr>
-        <w:pStyle w:val="affd"/>
-        <w:rPr>
-          <w:rFonts w:hint="eastAsia"/>
-        </w:rPr>
-      </w:pPr>
-      <w:r>
-        <w:rPr>
-          <w:rFonts w:ascii="Times New Roman" w:eastAsia="Times New Roman" w:hAnsi="Times New Roman"/>
-        </w:rPr>
-        <w:t>[</w:t>
-      </w:r>
-      <w:proofErr w:type="gramStart"/>
-      <w:r>
-        <w:rPr>
-          <w:rFonts w:ascii="Times New Roman" w:eastAsia="Times New Roman" w:hAnsi="Times New Roman"/>
-        </w:rPr>
-        <w:t>8]SPIRALS</w:t>
-      </w:r>
-      <w:proofErr w:type="gramEnd"/>
-      <w:r>
-        <w:rPr>
-          <w:rFonts w:ascii="Times New Roman" w:eastAsia="Times New Roman" w:hAnsi="Times New Roman"/>
-        </w:rPr>
-        <w:t xml:space="preserve">-TEAM. </w:t>
-      </w:r>
-      <w:proofErr w:type="spellStart"/>
-      <w:r>
-        <w:rPr>
-          <w:rFonts w:ascii="Times New Roman" w:eastAsia="Times New Roman" w:hAnsi="Times New Roman"/>
-        </w:rPr>
-        <w:t>IntroClassJava</w:t>
-      </w:r>
-      <w:proofErr w:type="spellEnd"/>
-      <w:r>
-        <w:rPr>
-          <w:rFonts w:ascii="Times New Roman" w:eastAsia="Times New Roman" w:hAnsi="Times New Roman"/>
-        </w:rPr>
-        <w:t xml:space="preserve">: A dataset of Java bugs for automatic </w:t>
-      </w:r>
-      <w:proofErr w:type="gramStart"/>
-      <w:r>
-        <w:rPr>
-          <w:rFonts w:ascii="Times New Roman" w:eastAsia="Times New Roman" w:hAnsi="Times New Roman"/>
-        </w:rPr>
-        <w:t>repair[</w:t>
-      </w:r>
-      <w:proofErr w:type="gramEnd"/>
-      <w:r>
-        <w:rPr>
-          <w:rFonts w:ascii="Times New Roman" w:eastAsia="Times New Roman" w:hAnsi="Times New Roman"/>
-        </w:rPr>
-        <w:t>EB/OL]. https://github.com/Spirals-Team/IntroClassJava, 2026-10-26.</w:t>
       </w:r>
     </w:p>
     <w:sectPr>

</xml_diff>

<commit_message>
chore: auto sync 2026-10-27 10:25:53
</commit_message>
<xml_diff>
--- a/docs/papers/20230411330_严何涛_基于Spring Boot的编程错题智能解析助手系统设计与实现.docx
+++ b/docs/papers/20230411330_严何涛_基于Spring Boot的编程错题智能解析助手系统设计与实现.docx
@@ -225,6 +225,8 @@
     </w:p>
     <w:p>
       <w:pPr>
+        <w:spacing w:line="240" w:lineRule="auto"/>
+        <w:ind w:firstLine="482"/>
         <w:rPr>
           <w:rFonts w:hint="eastAsia"/>
           <w:lang w:eastAsia="zh-CN"/>
@@ -278,6 +280,8 @@
     </w:p>
     <w:p>
       <w:pPr>
+        <w:spacing w:line="240" w:lineRule="auto"/>
+        <w:ind w:firstLine="482"/>
         <w:rPr>
           <w:rFonts w:hint="eastAsia"/>
           <w:lang w:eastAsia="zh-CN"/>
@@ -305,6 +309,8 @@
     </w:p>
     <w:p>
       <w:pPr>
+        <w:spacing w:line="240" w:lineRule="auto"/>
+        <w:ind w:firstLine="482"/>
         <w:rPr>
           <w:rFonts w:hint="eastAsia"/>
           <w:lang w:eastAsia="zh-CN"/>
@@ -337,7 +343,7 @@
     <w:p>
       <w:pPr>
         <w:spacing w:line="240" w:lineRule="auto"/>
-        <w:ind w:firstLineChars="200"/>
+        <w:ind w:firstLine="482"/>
         <w:rPr>
           <w:rFonts w:hint="eastAsia"/>
           <w:lang w:eastAsia="zh-CN"/>
@@ -365,7 +371,7 @@
     <w:p>
       <w:pPr>
         <w:spacing w:line="240" w:lineRule="auto"/>
-        <w:ind w:firstLineChars="200"/>
+        <w:ind w:firstLine="482"/>
         <w:rPr>
           <w:rFonts w:hint="eastAsia"/>
           <w:lang w:eastAsia="zh-CN"/>
@@ -381,7 +387,7 @@
     <w:p>
       <w:pPr>
         <w:spacing w:line="240" w:lineRule="auto"/>
-        <w:ind w:firstLineChars="200"/>
+        <w:ind w:firstLine="482"/>
         <w:rPr>
           <w:rFonts w:hint="eastAsia"/>
           <w:lang w:eastAsia="zh-CN"/>
@@ -407,7 +413,6 @@
         <w:rPr>
           <w:lang w:eastAsia="zh-CN"/>
         </w:rPr>
-        <w:lastRenderedPageBreak/>
         <w:t>3系统设计</w:t>
       </w:r>
       <w:bookmarkEnd w:id="2"/>
@@ -415,7 +420,7 @@
     <w:p>
       <w:pPr>
         <w:spacing w:line="240" w:lineRule="auto"/>
-        <w:ind w:firstLineChars="200"/>
+        <w:ind w:firstLine="482"/>
         <w:rPr>
           <w:rFonts w:hint="eastAsia"/>
           <w:lang w:eastAsia="zh-CN"/>
@@ -429,7 +434,6 @@
       </w:r>
       <w:r>
         <w:rPr>
-          <w:vertAlign w:val="superscript"/>
           <w:lang w:eastAsia="zh-CN"/>
         </w:rPr>
         <w:t>[5]</w:t>
@@ -438,11 +442,17 @@
         <w:rPr>
           <w:lang w:eastAsia="zh-CN"/>
         </w:rPr>
-        <w:t>。默认模型服务为本机Ollama，其聊天接口接收模型名称与消息内容并返回生成信息</w:t>
+        <w:t>。</w:t>
       </w:r>
       <w:r>
         <w:rPr>
-          <w:vertAlign w:val="superscript"/>
+          <w:lang w:eastAsia="zh-CN"/>
+        </w:rPr>
+        <w:lastRenderedPageBreak/>
+        <w:t>默认模型服务为本机Ollama，其聊天接口接收模型名称与消息内容并返回生成信息</w:t>
+      </w:r>
+      <w:r>
+        <w:rPr>
           <w:lang w:eastAsia="zh-CN"/>
         </w:rPr>
         <w:t>[6]</w:t>
@@ -457,7 +467,7 @@
     <w:p>
       <w:pPr>
         <w:spacing w:line="240" w:lineRule="auto"/>
-        <w:ind w:firstLineChars="200"/>
+        <w:ind w:firstLine="482"/>
         <w:rPr>
           <w:rFonts w:hint="eastAsia"/>
           <w:lang w:eastAsia="zh-CN"/>
@@ -471,7 +481,6 @@
       </w:r>
       <w:r>
         <w:rPr>
-          <w:vertAlign w:val="superscript"/>
           <w:lang w:eastAsia="zh-CN"/>
         </w:rPr>
         <w:t>[7]</w:t>
@@ -486,7 +495,7 @@
     <w:p>
       <w:pPr>
         <w:spacing w:line="240" w:lineRule="auto"/>
-        <w:ind w:firstLineChars="200"/>
+        <w:ind w:firstLine="482"/>
         <w:rPr>
           <w:rFonts w:hint="eastAsia"/>
           <w:lang w:eastAsia="zh-CN"/>
@@ -502,7 +511,7 @@
     <w:p>
       <w:pPr>
         <w:spacing w:line="240" w:lineRule="auto"/>
-        <w:ind w:firstLineChars="200"/>
+        <w:ind w:firstLine="482"/>
         <w:rPr>
           <w:rFonts w:hint="eastAsia"/>
           <w:lang w:eastAsia="zh-CN"/>
@@ -535,7 +544,7 @@
     <w:p>
       <w:pPr>
         <w:spacing w:line="240" w:lineRule="auto"/>
-        <w:ind w:firstLineChars="200"/>
+        <w:ind w:firstLine="482"/>
         <w:rPr>
           <w:rFonts w:hint="eastAsia"/>
           <w:lang w:eastAsia="zh-CN"/>
@@ -545,27 +554,13 @@
         <w:rPr>
           <w:lang w:eastAsia="zh-CN"/>
         </w:rPr>
-        <w:t>（1</w:t>
-      </w:r>
-      <w:proofErr w:type="gramStart"/>
-      <w:r>
-        <w:rPr>
-          <w:lang w:eastAsia="zh-CN"/>
-        </w:rPr>
-        <w:t>） 账户</w:t>
-      </w:r>
-      <w:proofErr w:type="gramEnd"/>
-      <w:r>
-        <w:rPr>
-          <w:lang w:eastAsia="zh-CN"/>
-        </w:rPr>
-        <w:t>与错题操作。后端使用Spring Security检查访问权限，登录后签发携带身份信息的令牌；受保护接口先验证令牌，再按当前用户编号筛选数据。错题新增接口校验必填内容，查询接口支持分页和条件搜索，编辑与删除前再次校验归属。这样的双重检查使页面隐藏其他用户数据之外，后端也不会因为直接访问编号而返回别人的记录。</w:t>
+        <w:t>（1）账户与错题操作。后端使用Spring Security检查访问权限，登录后签发携带身份信息的令牌；受保护接口先验证令牌，再按当前用户编号筛选数据。错题新增接口校验必填内容，查询接口支持分页和条件搜索，编辑与删除前再次校验归属。这样的双重检查使页面隐藏其他用户数据之外，后端也不会因为直接访问编号而返回别人的记录。</w:t>
       </w:r>
     </w:p>
     <w:p>
       <w:pPr>
         <w:spacing w:line="240" w:lineRule="auto"/>
-        <w:ind w:firstLineChars="200"/>
+        <w:ind w:firstLine="482"/>
         <w:rPr>
           <w:rFonts w:hint="eastAsia"/>
           <w:lang w:eastAsia="zh-CN"/>
@@ -575,21 +570,7 @@
         <w:rPr>
           <w:lang w:eastAsia="zh-CN"/>
         </w:rPr>
-        <w:t>（2</w:t>
-      </w:r>
-      <w:proofErr w:type="gramStart"/>
-      <w:r>
-        <w:rPr>
-          <w:lang w:eastAsia="zh-CN"/>
-        </w:rPr>
-        <w:t>） 解析</w:t>
-      </w:r>
-      <w:proofErr w:type="gramEnd"/>
-      <w:r>
-        <w:rPr>
-          <w:lang w:eastAsia="zh-CN"/>
-        </w:rPr>
-        <w:t>内容生成。</w:t>
+        <w:t>（2）解析内容生成。</w:t>
       </w:r>
       <w:proofErr w:type="spellStart"/>
       <w:r>
@@ -651,7 +632,7 @@
     <w:p>
       <w:pPr>
         <w:spacing w:line="240" w:lineRule="auto"/>
-        <w:ind w:firstLineChars="200"/>
+        <w:ind w:firstLine="482"/>
         <w:rPr>
           <w:rFonts w:hint="eastAsia"/>
           <w:lang w:eastAsia="zh-CN"/>
@@ -661,21 +642,7 @@
         <w:rPr>
           <w:lang w:eastAsia="zh-CN"/>
         </w:rPr>
-        <w:t>（3</w:t>
-      </w:r>
-      <w:proofErr w:type="gramStart"/>
-      <w:r>
-        <w:rPr>
-          <w:lang w:eastAsia="zh-CN"/>
-        </w:rPr>
-        <w:t>） 状态</w:t>
-      </w:r>
-      <w:proofErr w:type="gramEnd"/>
-      <w:r>
-        <w:rPr>
-          <w:lang w:eastAsia="zh-CN"/>
-        </w:rPr>
-        <w:t>与资源控制。</w:t>
+        <w:t>（3）状态与资源控制。</w:t>
       </w:r>
       <w:proofErr w:type="spellStart"/>
       <w:r>
@@ -695,7 +662,7 @@
     <w:p>
       <w:pPr>
         <w:spacing w:line="240" w:lineRule="auto"/>
-        <w:ind w:firstLineChars="200"/>
+        <w:ind w:firstLine="482"/>
         <w:rPr>
           <w:rFonts w:hint="eastAsia"/>
           <w:lang w:eastAsia="zh-CN"/>
@@ -705,21 +672,7 @@
         <w:rPr>
           <w:lang w:eastAsia="zh-CN"/>
         </w:rPr>
-        <w:t>（4</w:t>
-      </w:r>
-      <w:proofErr w:type="gramStart"/>
-      <w:r>
-        <w:rPr>
-          <w:lang w:eastAsia="zh-CN"/>
-        </w:rPr>
-        <w:t>） 复习</w:t>
-      </w:r>
-      <w:proofErr w:type="gramEnd"/>
-      <w:r>
-        <w:rPr>
-          <w:lang w:eastAsia="zh-CN"/>
-        </w:rPr>
-        <w:t>与展示。</w:t>
+        <w:t>（4）复习与展示。</w:t>
       </w:r>
       <w:proofErr w:type="spellStart"/>
       <w:r>
@@ -749,6 +702,7 @@
         <w:rPr>
           <w:lang w:eastAsia="zh-CN"/>
         </w:rPr>
+        <w:lastRenderedPageBreak/>
         <w:t>5结果与讨论</w:t>
       </w:r>
       <w:bookmarkEnd w:id="4"/>
@@ -756,7 +710,7 @@
     <w:p>
       <w:pPr>
         <w:spacing w:line="240" w:lineRule="auto"/>
-        <w:ind w:firstLineChars="200"/>
+        <w:ind w:firstLine="482"/>
         <w:rPr>
           <w:rFonts w:hint="eastAsia"/>
           <w:lang w:eastAsia="zh-CN"/>
@@ -767,34 +721,6 @@
           <w:lang w:eastAsia="zh-CN"/>
         </w:rPr>
         <w:t>2026年10月27日在项目版本中执行mvn -q test，测试报告记录16项测试、0项失败、0项错误。验证范围包括登录限制、登录身份校验、模型调用次数与同时处理数量限制，以及复习记录的归属检查和到期判断。复习测试确认了访问他人错题、未到期重复提交会被拒绝；配额测试确认了每日次数和同时调用数量的上限。上述结果支持账户访问、调用限制与复习规则按既定要求运行</w:t>
-      </w:r>
-      <w:proofErr w:type="gramStart"/>
-      <w:r>
-        <w:rPr>
-          <w:lang w:eastAsia="zh-CN"/>
-        </w:rPr>
-        <w:t/>
-      </w:r>
-      <w:proofErr w:type="gramEnd"/>
-      <w:r>
-        <w:rPr>
-          <w:lang w:eastAsia="zh-CN"/>
-        </w:rPr>
-        <w:t/>
-      </w:r>
-      <w:proofErr w:type="spellStart"/>
-      <w:r>
-        <w:rPr>
-          <w:lang w:eastAsia="zh-CN"/>
-        </w:rPr>
-        <w:t/>
-      </w:r>
-      <w:proofErr w:type="spellEnd"/>
-      <w:r>
-        <w:rPr>
-          <w:lang w:eastAsia="zh-CN"/>
-        </w:rPr>
-        <w:t xml:space="preserve"/>
       </w:r>
       <w:r>
         <w:rPr>
@@ -823,7 +749,7 @@
     <w:p>
       <w:pPr>
         <w:spacing w:line="240" w:lineRule="auto"/>
-        <w:ind w:firstLineChars="200"/>
+        <w:ind w:firstLine="482"/>
         <w:rPr>
           <w:rFonts w:hint="eastAsia"/>
           <w:lang w:eastAsia="zh-CN"/>
@@ -1049,17 +975,17 @@
         </w:rPr>
       </w:pPr>
       <w:r>
-        <w:rPr>
-          <w:rFonts w:ascii="Times New Roman" w:eastAsia="Times New Roman" w:hAnsi="Times New Roman"/>
-        </w:rPr>
         <w:t>[</w:t>
       </w:r>
       <w:proofErr w:type="gramStart"/>
       <w:r>
+        <w:t>3]</w:t>
+      </w:r>
+      <w:r>
         <w:rPr>
           <w:rFonts w:ascii="Times New Roman" w:eastAsia="Times New Roman" w:hAnsi="Times New Roman"/>
         </w:rPr>
-        <w:t>3]KEUNING</w:t>
+        <w:t>KEUNING</w:t>
       </w:r>
       <w:proofErr w:type="gramEnd"/>
       <w:r>
@@ -1077,17 +1003,17 @@
         </w:rPr>
       </w:pPr>
       <w:r>
-        <w:rPr>
-          <w:rFonts w:ascii="Times New Roman" w:eastAsia="Times New Roman" w:hAnsi="Times New Roman"/>
-        </w:rPr>
         <w:t>[</w:t>
       </w:r>
       <w:proofErr w:type="gramStart"/>
       <w:r>
+        <w:t>4]</w:t>
+      </w:r>
+      <w:r>
         <w:rPr>
           <w:rFonts w:ascii="Times New Roman" w:eastAsia="Times New Roman" w:hAnsi="Times New Roman"/>
         </w:rPr>
-        <w:t>4]KASNECI</w:t>
+        <w:t>KASNECI</w:t>
       </w:r>
       <w:proofErr w:type="gramEnd"/>
       <w:r>
@@ -1105,17 +1031,17 @@
         </w:rPr>
       </w:pPr>
       <w:r>
-        <w:rPr>
-          <w:rFonts w:ascii="Times New Roman" w:eastAsia="Times New Roman" w:hAnsi="Times New Roman"/>
-        </w:rPr>
         <w:t>[</w:t>
       </w:r>
       <w:proofErr w:type="gramStart"/>
       <w:r>
+        <w:t>5]</w:t>
+      </w:r>
+      <w:r>
         <w:rPr>
           <w:rFonts w:ascii="Times New Roman" w:eastAsia="Times New Roman" w:hAnsi="Times New Roman"/>
         </w:rPr>
-        <w:t>5]SPRING</w:t>
+        <w:t>SPRING</w:t>
       </w:r>
       <w:proofErr w:type="gramEnd"/>
       <w:r>
@@ -1147,17 +1073,17 @@
         </w:rPr>
       </w:pPr>
       <w:r>
-        <w:rPr>
-          <w:rFonts w:ascii="Times New Roman" w:eastAsia="Times New Roman" w:hAnsi="Times New Roman"/>
-        </w:rPr>
         <w:t>[</w:t>
       </w:r>
       <w:proofErr w:type="gramStart"/>
       <w:r>
+        <w:t>6]</w:t>
+      </w:r>
+      <w:r>
         <w:rPr>
           <w:rFonts w:ascii="Times New Roman" w:eastAsia="Times New Roman" w:hAnsi="Times New Roman"/>
         </w:rPr>
-        <w:t>6]OLLAMA</w:t>
+        <w:t>OLLAMA</w:t>
       </w:r>
       <w:proofErr w:type="gramEnd"/>
       <w:r>
@@ -1189,17 +1115,17 @@
         </w:rPr>
       </w:pPr>
       <w:r>
-        <w:rPr>
-          <w:rFonts w:ascii="Times New Roman" w:eastAsia="Times New Roman" w:hAnsi="Times New Roman"/>
-        </w:rPr>
         <w:t>[</w:t>
       </w:r>
       <w:proofErr w:type="gramStart"/>
       <w:r>
+        <w:t>7]</w:t>
+      </w:r>
+      <w:r>
         <w:rPr>
           <w:rFonts w:ascii="Times New Roman" w:eastAsia="Times New Roman" w:hAnsi="Times New Roman"/>
         </w:rPr>
-        <w:t>7]ORACLE</w:t>
+        <w:t>ORACLE</w:t>
       </w:r>
       <w:proofErr w:type="gramEnd"/>
       <w:r>

</xml_diff>

<commit_message>
chore: auto sync 2026-10-27 10:27:50
</commit_message>
<xml_diff>
--- a/docs/papers/20230411330_严何涛_基于Spring Boot的编程错题智能解析助手系统设计与实现.docx
+++ b/docs/papers/20230411330_严何涛_基于Spring Boot的编程错题智能解析助手系统设计与实现.docx
@@ -434,6 +434,7 @@
       </w:r>
       <w:r>
         <w:rPr>
+          <w:vertAlign w:val="superscript"/>
           <w:lang w:eastAsia="zh-CN"/>
         </w:rPr>
         <w:t>[5]</w:t>
@@ -453,6 +454,7 @@
       </w:r>
       <w:r>
         <w:rPr>
+          <w:vertAlign w:val="superscript"/>
           <w:lang w:eastAsia="zh-CN"/>
         </w:rPr>
         <w:t>[6]</w:t>
@@ -481,6 +483,7 @@
       </w:r>
       <w:r>
         <w:rPr>
+          <w:vertAlign w:val="superscript"/>
           <w:lang w:eastAsia="zh-CN"/>
         </w:rPr>
         <w:t>[7]</w:t>
@@ -720,7 +723,21 @@
         <w:rPr>
           <w:lang w:eastAsia="zh-CN"/>
         </w:rPr>
-        <w:t>2026年10月27日在项目版本中执行mvn -q test，测试报告记录16项测试、0项失败、0项错误。验证范围包括登录限制、登录身份校验、模型调用次数与同时处理数量限制，以及复习记录的归属检查和到期判断。复习测试确认了访问他人错题、未到期重复提交会被拒绝；配额测试确认了每日次数和同时调用数量的上限。上述结果支持账户访问、调用限制与复习规则按既定要求运行</w:t>
+        <w:t>在项目版本中执行</w:t>
+      </w:r>
+      <w:proofErr w:type="spellStart"/>
+      <w:r>
+        <w:rPr>
+          <w:lang w:eastAsia="zh-CN"/>
+        </w:rPr>
+        <w:t>mvn</w:t>
+      </w:r>
+      <w:proofErr w:type="spellEnd"/>
+      <w:r>
+        <w:rPr>
+          <w:lang w:eastAsia="zh-CN"/>
+        </w:rPr>
+        <w:t xml:space="preserve"> -q test，测试报告记录16项测试、0项失败、0项错误。验证范围包括登录限制、登录身份校验、模型调用次数与同时处理数量限制，以及复习记录的归属检查和到期判断。复习测试确认了访问他人错题、未到期重复提交会被拒绝；配额测试确认了每日次数和同时调用数量的上限。上述结果支持账户访问、调用限制与复习规则按既定要求运行</w:t>
       </w:r>
       <w:r>
         <w:rPr>

</xml_diff>

<commit_message>
chore: auto sync 2026-10-27 10:36:38
</commit_message>
<xml_diff>
--- a/docs/papers/20230411330_严何涛_基于Spring Boot的编程错题智能解析助手系统设计与实现.docx
+++ b/docs/papers/20230411330_严何涛_基于Spring Boot的编程错题智能解析助手系统设计与实现.docx
@@ -57,20 +57,37 @@
     <w:p>
       <w:pPr>
         <w:pStyle w:val="aff9"/>
+        <w:spacing w:beforeLines="100" w:before="240" w:afterLines="100" w:after="240"/>
         <w:rPr>
           <w:rFonts w:hint="eastAsia"/>
           <w:lang w:eastAsia="zh-CN"/>
         </w:rPr>
       </w:pPr>
+      <w:proofErr w:type="gramStart"/>
       <w:r>
         <w:rPr>
           <w:lang w:eastAsia="zh-CN"/>
         </w:rPr>
-        <w:t>摘要</w:t>
+        <w:t>摘</w:t>
       </w:r>
+      <w:r>
+        <w:rPr>
+          <w:rFonts w:hint="eastAsia"/>
+          <w:lang w:eastAsia="zh-CN"/>
+        </w:rPr>
+        <w:t xml:space="preserve">  </w:t>
+      </w:r>
+      <w:r>
+        <w:rPr>
+          <w:lang w:eastAsia="zh-CN"/>
+        </w:rPr>
+        <w:t>要</w:t>
+      </w:r>
+      <w:proofErr w:type="gramEnd"/>
     </w:p>
     <w:p>
       <w:pPr>
+        <w:ind w:firstLine="482"/>
         <w:rPr>
           <w:rFonts w:hint="eastAsia"/>
           <w:lang w:eastAsia="zh-CN"/>
@@ -116,7 +133,7 @@
         <w:rPr>
           <w:lang w:eastAsia="zh-CN"/>
         </w:rPr>
-        <w:t>编程错题；Spring Boot；智能解析；复习记录；人工核验</w:t>
+        <w:t>编程错题；Spring Boot；智能解析；复习记录</w:t>
       </w:r>
     </w:p>
     <w:p>
@@ -163,6 +180,7 @@
     <w:p>
       <w:pPr>
         <w:pStyle w:val="affc"/>
+        <w:ind w:firstLine="482"/>
       </w:pPr>
       <w:r>
         <w:t>When error messages, source code, and revisions are stored separately, students may struggle to trace the cause of a mistake during review. Accepting a model-generated answer without checking it can also bypass the reasoning needed to understand the error. To preserve the original error context and the reasons for revisions during review, this paper presents a Spring Boot assistant for programming mistakes. Each record stores the task, original code, error message, and actual and expected output. The backend sends this context to a model for error localization, an explanation, revision advice, and reference code. It checks the returned fields and retains the raw response so that students can verify the advice against the code and output. They can record a judgment with reasons and schedule the next review according to their recall. All 16 automated tests pass in the current version.</w:t>
@@ -186,7 +204,7 @@
         <w:rPr>
           <w:rFonts w:ascii="Times New Roman" w:hAnsi="Times New Roman"/>
         </w:rPr>
-        <w:t>programming mistakes; Spring Boot; error analysis; review records; human verification</w:t>
+        <w:t>programming mistakes; Spring Boot; error analysis; review records</w:t>
       </w:r>
     </w:p>
     <w:p>
@@ -208,6 +226,7 @@
     <w:p>
       <w:pPr>
         <w:pStyle w:val="1"/>
+        <w:spacing w:beforeLines="100" w:before="240" w:afterLines="100" w:after="240"/>
         <w:rPr>
           <w:rFonts w:hint="eastAsia"/>
           <w:lang w:eastAsia="zh-CN"/>
@@ -225,7 +244,6 @@
     </w:p>
     <w:p>
       <w:pPr>
-        <w:spacing w:line="240" w:lineRule="auto"/>
         <w:ind w:firstLine="482"/>
         <w:rPr>
           <w:rFonts w:hint="eastAsia"/>
@@ -280,7 +298,6 @@
     </w:p>
     <w:p>
       <w:pPr>
-        <w:spacing w:line="240" w:lineRule="auto"/>
         <w:ind w:firstLine="482"/>
         <w:rPr>
           <w:rFonts w:hint="eastAsia"/>
@@ -309,7 +326,6 @@
     </w:p>
     <w:p>
       <w:pPr>
-        <w:spacing w:line="240" w:lineRule="auto"/>
         <w:ind w:firstLine="482"/>
         <w:rPr>
           <w:rFonts w:hint="eastAsia"/>
@@ -326,6 +342,7 @@
     <w:p>
       <w:pPr>
         <w:pStyle w:val="1"/>
+        <w:spacing w:beforeLines="100" w:before="240" w:afterLines="100" w:after="240"/>
         <w:rPr>
           <w:rFonts w:hint="eastAsia"/>
           <w:lang w:eastAsia="zh-CN"/>
@@ -342,7 +359,6 @@
     </w:p>
     <w:p>
       <w:pPr>
-        <w:spacing w:line="240" w:lineRule="auto"/>
         <w:ind w:firstLine="482"/>
         <w:rPr>
           <w:rFonts w:hint="eastAsia"/>
@@ -370,7 +386,6 @@
     </w:p>
     <w:p>
       <w:pPr>
-        <w:spacing w:line="240" w:lineRule="auto"/>
         <w:ind w:firstLine="482"/>
         <w:rPr>
           <w:rFonts w:hint="eastAsia"/>
@@ -386,7 +401,6 @@
     </w:p>
     <w:p>
       <w:pPr>
-        <w:spacing w:line="240" w:lineRule="auto"/>
         <w:ind w:firstLine="482"/>
         <w:rPr>
           <w:rFonts w:hint="eastAsia"/>
@@ -403,6 +417,7 @@
     <w:p>
       <w:pPr>
         <w:pStyle w:val="1"/>
+        <w:spacing w:beforeLines="100" w:before="240" w:afterLines="100" w:after="240"/>
         <w:rPr>
           <w:rFonts w:hint="eastAsia"/>
           <w:lang w:eastAsia="zh-CN"/>
@@ -413,13 +428,13 @@
         <w:rPr>
           <w:lang w:eastAsia="zh-CN"/>
         </w:rPr>
+        <w:lastRenderedPageBreak/>
         <w:t>3系统设计</w:t>
       </w:r>
       <w:bookmarkEnd w:id="2"/>
     </w:p>
     <w:p>
       <w:pPr>
-        <w:spacing w:line="240" w:lineRule="auto"/>
         <w:ind w:firstLine="482"/>
         <w:rPr>
           <w:rFonts w:hint="eastAsia"/>
@@ -434,7 +449,6 @@
       </w:r>
       <w:r>
         <w:rPr>
-          <w:vertAlign w:val="superscript"/>
           <w:lang w:eastAsia="zh-CN"/>
         </w:rPr>
         <w:t>[5]</w:t>
@@ -443,18 +457,10 @@
         <w:rPr>
           <w:lang w:eastAsia="zh-CN"/>
         </w:rPr>
-        <w:t>。</w:t>
+        <w:t>。默认模型服务为本机Ollama，其聊天接口接收模型名称与消息内容并返回生成信息</w:t>
       </w:r>
       <w:r>
         <w:rPr>
-          <w:lang w:eastAsia="zh-CN"/>
-        </w:rPr>
-        <w:lastRenderedPageBreak/>
-        <w:t>默认模型服务为本机Ollama，其聊天接口接收模型名称与消息内容并返回生成信息</w:t>
-      </w:r>
-      <w:r>
-        <w:rPr>
-          <w:vertAlign w:val="superscript"/>
           <w:lang w:eastAsia="zh-CN"/>
         </w:rPr>
         <w:t>[6]</w:t>
@@ -468,7 +474,6 @@
     </w:p>
     <w:p>
       <w:pPr>
-        <w:spacing w:line="240" w:lineRule="auto"/>
         <w:ind w:firstLine="482"/>
         <w:rPr>
           <w:rFonts w:hint="eastAsia"/>
@@ -483,7 +488,6 @@
       </w:r>
       <w:r>
         <w:rPr>
-          <w:vertAlign w:val="superscript"/>
           <w:lang w:eastAsia="zh-CN"/>
         </w:rPr>
         <w:t>[7]</w:t>
@@ -497,7 +501,6 @@
     </w:p>
     <w:p>
       <w:pPr>
-        <w:spacing w:line="240" w:lineRule="auto"/>
         <w:ind w:firstLine="482"/>
         <w:rPr>
           <w:rFonts w:hint="eastAsia"/>
@@ -513,7 +516,6 @@
     </w:p>
     <w:p>
       <w:pPr>
-        <w:spacing w:line="240" w:lineRule="auto"/>
         <w:ind w:firstLine="482"/>
         <w:rPr>
           <w:rFonts w:hint="eastAsia"/>
@@ -530,6 +532,7 @@
     <w:p>
       <w:pPr>
         <w:pStyle w:val="1"/>
+        <w:spacing w:beforeLines="100" w:before="240" w:afterLines="100" w:after="240"/>
         <w:rPr>
           <w:rFonts w:hint="eastAsia"/>
           <w:lang w:eastAsia="zh-CN"/>
@@ -546,7 +549,6 @@
     </w:p>
     <w:p>
       <w:pPr>
-        <w:spacing w:line="240" w:lineRule="auto"/>
         <w:ind w:firstLine="482"/>
         <w:rPr>
           <w:rFonts w:hint="eastAsia"/>
@@ -562,7 +564,6 @@
     </w:p>
     <w:p>
       <w:pPr>
-        <w:spacing w:line="240" w:lineRule="auto"/>
         <w:ind w:firstLine="482"/>
         <w:rPr>
           <w:rFonts w:hint="eastAsia"/>
@@ -615,7 +616,14 @@
         <w:rPr>
           <w:lang w:eastAsia="zh-CN"/>
         </w:rPr>
-        <w:t>检查返回字段的类型、非空要求和长度限制，</w:t>
+        <w:t>检查返回字段的类型、非</w:t>
+      </w:r>
+      <w:r>
+        <w:rPr>
+          <w:lang w:eastAsia="zh-CN"/>
+        </w:rPr>
+        <w:lastRenderedPageBreak/>
+        <w:t>空要求和长度限制，</w:t>
       </w:r>
       <w:proofErr w:type="spellStart"/>
       <w:r>
@@ -634,7 +642,6 @@
     </w:p>
     <w:p>
       <w:pPr>
-        <w:spacing w:line="240" w:lineRule="auto"/>
         <w:ind w:firstLine="482"/>
         <w:rPr>
           <w:rFonts w:hint="eastAsia"/>
@@ -664,7 +671,6 @@
     </w:p>
     <w:p>
       <w:pPr>
-        <w:spacing w:line="240" w:lineRule="auto"/>
         <w:ind w:firstLine="482"/>
         <w:rPr>
           <w:rFonts w:hint="eastAsia"/>
@@ -695,6 +701,7 @@
     <w:p>
       <w:pPr>
         <w:pStyle w:val="1"/>
+        <w:spacing w:beforeLines="100" w:before="240" w:afterLines="100" w:after="240"/>
         <w:rPr>
           <w:rFonts w:hint="eastAsia"/>
           <w:lang w:eastAsia="zh-CN"/>
@@ -705,14 +712,12 @@
         <w:rPr>
           <w:lang w:eastAsia="zh-CN"/>
         </w:rPr>
-        <w:lastRenderedPageBreak/>
         <w:t>5结果与讨论</w:t>
       </w:r>
       <w:bookmarkEnd w:id="4"/>
     </w:p>
     <w:p>
       <w:pPr>
-        <w:spacing w:line="240" w:lineRule="auto"/>
         <w:ind w:firstLine="482"/>
         <w:rPr>
           <w:rFonts w:hint="eastAsia"/>
@@ -749,6 +754,7 @@
     <w:p>
       <w:pPr>
         <w:pStyle w:val="1"/>
+        <w:spacing w:beforeLines="100" w:before="240" w:afterLines="100" w:after="240"/>
         <w:rPr>
           <w:rFonts w:hint="eastAsia"/>
           <w:lang w:eastAsia="zh-CN"/>
@@ -765,7 +771,6 @@
     </w:p>
     <w:p>
       <w:pPr>
-        <w:spacing w:line="240" w:lineRule="auto"/>
         <w:ind w:firstLine="482"/>
         <w:rPr>
           <w:rFonts w:hint="eastAsia"/>

</xml_diff>

<commit_message>
chore: auto sync 2026-10-27 10:39:01
</commit_message>
<xml_diff>
--- a/docs/papers/20230411330_严何涛_基于Spring Boot的编程错题智能解析助手系统设计与实现.docx
+++ b/docs/papers/20230411330_严何涛_基于Spring Boot的编程错题智能解析助手系统设计与实现.docx
@@ -807,6 +807,7 @@
     <w:p>
       <w:pPr>
         <w:pStyle w:val="1"/>
+        <w:spacing w:beforeLines="100" w:before="240" w:afterLines="100" w:after="240"/>
         <w:rPr>
           <w:rFonts w:hint="eastAsia"/>
           <w:lang w:eastAsia="zh-CN"/>
@@ -995,6 +996,7 @@
     <w:p>
       <w:pPr>
         <w:pStyle w:val="affd"/>
+        <w:jc w:val="both"/>
         <w:rPr>
           <w:rFonts w:hint="eastAsia"/>
         </w:rPr>
@@ -1023,6 +1025,7 @@
     <w:p>
       <w:pPr>
         <w:pStyle w:val="affd"/>
+        <w:jc w:val="both"/>
         <w:rPr>
           <w:rFonts w:hint="eastAsia"/>
         </w:rPr>
@@ -1051,6 +1054,7 @@
     <w:p>
       <w:pPr>
         <w:pStyle w:val="affd"/>
+        <w:jc w:val="both"/>
         <w:rPr>
           <w:rFonts w:hint="eastAsia"/>
         </w:rPr>
@@ -1093,6 +1097,7 @@
     <w:p>
       <w:pPr>
         <w:pStyle w:val="affd"/>
+        <w:jc w:val="both"/>
         <w:rPr>
           <w:rFonts w:hint="eastAsia"/>
         </w:rPr>
@@ -1135,6 +1140,7 @@
     <w:p>
       <w:pPr>
         <w:pStyle w:val="affd"/>
+        <w:jc w:val="both"/>
         <w:rPr>
           <w:rFonts w:hint="eastAsia"/>
         </w:rPr>

</xml_diff>

<commit_message>
chore: auto sync 2026-10-29 10:03:24
</commit_message>
<xml_diff>
--- a/docs/papers/20230411330_严何涛_基于Spring Boot的编程错题智能解析助手系统设计与实现.docx
+++ b/docs/papers/20230411330_严何涛_基于Spring Boot的编程错题智能解析助手系统设计与实现.docx
@@ -4,14 +4,20 @@
   <w:body>
     <w:p>
       <w:pPr>
-        <w:pStyle w:val="aa"/>
-        <w:rPr>
-          <w:rFonts w:hint="eastAsia"/>
-          <w:lang w:eastAsia="zh-CN"/>
-        </w:rPr>
-      </w:pPr>
-      <w:r>
-        <w:rPr>
+        <w:keepNext w:val="0"/>
+        <w:keepLines w:val="0"/>
+        <w:widowControl w:val="0"/>
+        <w:spacing w:after="320"/>
+        <w:jc w:val="center"/>
+        <w:rPr>
+          <w:lang w:eastAsia="zh-CN"/>
+        </w:rPr>
+      </w:pPr>
+      <w:r>
+        <w:rPr>
+          <w:rFonts w:ascii="宋体" w:hAnsi="宋体" w:cs="宋体"/>
+          <w:b/>
+          <w:sz w:val="30"/>
           <w:lang w:eastAsia="zh-CN"/>
         </w:rPr>
         <w:t>基于Spring Boot的编程错题智能解析助手系统设计与实现</w:t>
@@ -19,820 +25,1634 @@
     </w:p>
     <w:p>
       <w:pPr>
+        <w:keepNext w:val="0"/>
+        <w:keepLines w:val="0"/>
+        <w:widowControl w:val="0"/>
+        <w:spacing w:before="120" w:after="60" w:line="288" w:lineRule="auto"/>
+        <w:jc w:val="center"/>
+        <w:rPr>
+          <w:lang w:eastAsia="zh-CN"/>
+        </w:rPr>
+      </w:pPr>
+      <w:r>
+        <w:rPr>
+          <w:rFonts w:ascii="宋体" w:hAnsi="宋体" w:cs="宋体"/>
+          <w:b/>
+          <w:lang w:eastAsia="zh-CN"/>
+        </w:rPr>
+        <w:t>摘要</w:t>
+      </w:r>
+    </w:p>
+    <w:p>
+      <w:pPr>
+        <w:keepNext w:val="0"/>
+        <w:keepLines w:val="0"/>
+        <w:widowControl w:val="0"/>
+        <w:ind w:firstLine="480"/>
+        <w:jc w:val="both"/>
+        <w:rPr>
+          <w:lang w:eastAsia="zh-CN"/>
+        </w:rPr>
+      </w:pPr>
+      <w:r>
+        <w:rPr>
+          <w:rFonts w:ascii="宋体" w:hAnsi="宋体" w:cs="宋体"/>
+          <w:lang w:eastAsia="zh-CN"/>
+        </w:rPr>
+        <w:t>针对编程学习中错题分散、错误原因难以归纳、修改建议不便保存等问题，本文设计并实现了一套编程错题智能解析助手系统。系统采用浏览器页面、Spring Boot服务端、MySQL数据库和本地大语言模型构成的整体方案，提供用户登录、错题管理、智能解析、解析记录、人工反馈、知识点整理、复习记录与统计等功能。系统将模型输出限定为七个字段，包括错误类型、错误位置、错误原因、修改建议、修正代码、知识点和学习建议，并保存分析过程中的提示内容、模型响应与处理状态，便于查看和追溯。对于模型生成结果，系统支持用户标注“准确”“不准确”或“无法判断”，但此功能属于个人反馈，并不等同于经过专家验证的准确率评估。现有项目保存的Maven测试报告记录了26个单元测试通过；另有150条候选测试案例和成对提示词比较脚本，但评分表尚无有效评分数据。因此，本文报告系统功能与已有测试记录，不对智能解析准确率作未经验证的结论。</w:t>
+      </w:r>
+    </w:p>
+    <w:p>
+      <w:pPr>
+        <w:keepNext w:val="0"/>
+        <w:keepLines w:val="0"/>
+        <w:widowControl w:val="0"/>
+        <w:spacing w:after="200" w:line="288" w:lineRule="auto"/>
+      </w:pPr>
+      <w:proofErr w:type="spellStart"/>
+      <w:r>
+        <w:rPr>
+          <w:rFonts w:ascii="宋体" w:hAnsi="宋体" w:cs="宋体"/>
+        </w:rPr>
+        <w:t>关键词：编程错题；Spring</w:t>
+      </w:r>
+      <w:proofErr w:type="spellEnd"/>
+      <w:r>
+        <w:rPr>
+          <w:rFonts w:ascii="宋体" w:hAnsi="宋体" w:cs="宋体"/>
+        </w:rPr>
+        <w:t xml:space="preserve"> </w:t>
+      </w:r>
+      <w:proofErr w:type="spellStart"/>
+      <w:r>
+        <w:rPr>
+          <w:rFonts w:ascii="宋体" w:hAnsi="宋体" w:cs="宋体"/>
+        </w:rPr>
+        <w:t>Boot；智能解析；本地大语言模型；人工复核</w:t>
+      </w:r>
+      <w:proofErr w:type="spellEnd"/>
+    </w:p>
+    <w:p>
+      <w:pPr>
+        <w:keepNext w:val="0"/>
+        <w:keepLines w:val="0"/>
+        <w:widowControl w:val="0"/>
+        <w:spacing w:before="120" w:after="60" w:line="288" w:lineRule="auto"/>
+        <w:jc w:val="center"/>
+      </w:pPr>
+      <w:r>
+        <w:rPr>
+          <w:rFonts w:ascii="宋体" w:hAnsi="宋体" w:cs="宋体"/>
+          <w:b/>
+        </w:rPr>
+        <w:t>Abstract</w:t>
+      </w:r>
+    </w:p>
+    <w:p>
+      <w:pPr>
+        <w:keepNext w:val="0"/>
+        <w:keepLines w:val="0"/>
+        <w:widowControl w:val="0"/>
+        <w:ind w:firstLine="480"/>
+        <w:jc w:val="both"/>
+      </w:pPr>
+      <w:r>
+        <w:rPr>
+          <w:rFonts w:eastAsia="Times New Roman" w:cs="Times New Roman"/>
+          <w:sz w:val="22"/>
+        </w:rPr>
+        <w:t xml:space="preserve">To address scattered programming mistakes, difficulty in identifying error causes, and the lack of a convenient review process, this paper presents a programming-error analysis assistant built with Spring Boot. The system consists of a browser-based interface, a Spring Boot backend, a MySQL database, and a locally hosted large language model. It supports user authentication, wrong-question management, AI-assisted analysis, </w:t>
+      </w:r>
+      <w:proofErr w:type="gramStart"/>
+      <w:r>
+        <w:rPr>
+          <w:rFonts w:eastAsia="Times New Roman" w:cs="Times New Roman"/>
+          <w:sz w:val="22"/>
+        </w:rPr>
+        <w:t>analysis history</w:t>
+      </w:r>
+      <w:proofErr w:type="gramEnd"/>
+      <w:r>
+        <w:rPr>
+          <w:rFonts w:eastAsia="Times New Roman" w:cs="Times New Roman"/>
+          <w:sz w:val="22"/>
+        </w:rPr>
+        <w:t>, user feedback, knowledge-point organization, review records, and statistics. Model responses are requested in seven fields: error type, error location, cause, suggested correction, corrected code, related knowledge points, and learning advice. The system stores prompts, raw responses, and processing status for traceability. Users can label an analysis as accurate, inaccurate, or uncertain; these labels are personal feedback and do not establish expert-verified model accuracy. The latest retained Maven report records 26 passing unit tests. The project also contains 150 candidate cases and a paired-prompt comparison script, but its rating sheet has not been completed. Therefore, this paper reports implementation and available test records without claiming a measured analysis-accuracy rate.</w:t>
+      </w:r>
+    </w:p>
+    <w:p>
+      <w:pPr>
+        <w:keepNext w:val="0"/>
+        <w:keepLines w:val="0"/>
+        <w:widowControl w:val="0"/>
+        <w:spacing w:after="200" w:line="288" w:lineRule="auto"/>
+      </w:pPr>
+      <w:r>
+        <w:rPr>
+          <w:rFonts w:eastAsia="Times New Roman" w:cs="Times New Roman"/>
+          <w:sz w:val="22"/>
+        </w:rPr>
+        <w:t>Keywords: programming errors; Spring Boot; AI-assisted analysis; local large language model; human review</w:t>
+      </w:r>
+    </w:p>
+    <w:p>
+      <w:pPr>
+        <w:keepNext w:val="0"/>
+        <w:keepLines w:val="0"/>
+        <w:pageBreakBefore/>
+        <w:widowControl w:val="0"/>
+        <w:spacing w:before="280" w:after="280"/>
+        <w:jc w:val="center"/>
+      </w:pPr>
+      <w:r>
+        <w:rPr>
+          <w:rFonts w:ascii="黑体" w:hAnsi="黑体" w:eastAsia="黑体"/>
+          <w:b/>
+          <w:sz w:val="28"/>
+        </w:rPr>
+        <w:t>目　录</w:t>
+      </w:r>
+    </w:p>
+    <w:p>
+      <w:pPr>
+        <w:keepNext w:val="0"/>
+        <w:keepLines w:val="0"/>
+        <w:widowControl w:val="0"/>
+        <w:spacing w:line="400" w:lineRule="exact" w:before="0" w:after="0"/>
         <w:ind w:firstLine="0"/>
         <w:jc w:val="center"/>
-        <w:rPr>
-          <w:rFonts w:hint="eastAsia"/>
-          <w:lang w:eastAsia="zh-CN"/>
-        </w:rPr>
-      </w:pPr>
-      <w:proofErr w:type="gramStart"/>
-      <w:r>
-        <w:rPr>
-          <w:lang w:eastAsia="zh-CN"/>
-        </w:rPr>
-        <w:t>严何涛</w:t>
-      </w:r>
-      <w:r>
-        <w:rPr>
-          <w:rFonts w:hint="eastAsia"/>
-          <w:lang w:eastAsia="zh-CN"/>
-        </w:rPr>
-        <w:t xml:space="preserve">  </w:t>
-      </w:r>
-      <w:r>
-        <w:rPr>
-          <w:lang w:eastAsia="zh-CN"/>
-        </w:rPr>
-        <w:t>学号</w:t>
-      </w:r>
-      <w:proofErr w:type="gramEnd"/>
-      <w:r>
-        <w:rPr>
-          <w:lang w:eastAsia="zh-CN"/>
-        </w:rPr>
-        <w:t>：20230411330</w:t>
+      </w:pPr>
+      <w:r>
+        <w:rPr>
+          <w:rFonts w:ascii="宋体" w:hAnsi="宋体" w:eastAsia="宋体"/>
+          <w:sz w:val="24"/>
+        </w:rPr>
+        <w:t>一、引言  ········  1</w:t>
       </w:r>
     </w:p>
     <w:p>
       <w:pPr>
-        <w:pStyle w:val="aff9"/>
-        <w:spacing w:beforeLines="100" w:before="240" w:afterLines="100" w:after="240"/>
-        <w:rPr>
-          <w:rFonts w:hint="eastAsia"/>
-          <w:lang w:eastAsia="zh-CN"/>
-        </w:rPr>
-      </w:pPr>
-      <w:proofErr w:type="gramStart"/>
-      <w:r>
-        <w:rPr>
-          <w:lang w:eastAsia="zh-CN"/>
-        </w:rPr>
-        <w:t>摘</w:t>
-      </w:r>
-      <w:r>
-        <w:rPr>
-          <w:rFonts w:hint="eastAsia"/>
-          <w:lang w:eastAsia="zh-CN"/>
-        </w:rPr>
-        <w:t xml:space="preserve">  </w:t>
-      </w:r>
-      <w:r>
-        <w:rPr>
-          <w:lang w:eastAsia="zh-CN"/>
-        </w:rPr>
-        <w:t>要</w:t>
-      </w:r>
-      <w:proofErr w:type="gramEnd"/>
+        <w:keepNext w:val="0"/>
+        <w:keepLines w:val="0"/>
+        <w:widowControl w:val="0"/>
+        <w:spacing w:line="400" w:lineRule="exact" w:before="0" w:after="0"/>
+        <w:ind w:firstLine="0"/>
+        <w:jc w:val="center"/>
+      </w:pPr>
+      <w:r>
+        <w:rPr>
+          <w:rFonts w:ascii="宋体" w:hAnsi="宋体" w:eastAsia="宋体"/>
+          <w:sz w:val="24"/>
+        </w:rPr>
+        <w:t>二、系统分析  ········  1</w:t>
+      </w:r>
     </w:p>
     <w:p>
       <w:pPr>
-        <w:ind w:firstLine="482"/>
-        <w:rPr>
-          <w:rFonts w:hint="eastAsia"/>
-          <w:lang w:eastAsia="zh-CN"/>
-        </w:rPr>
-      </w:pPr>
-      <w:r>
-        <w:rPr>
-          <w:lang w:eastAsia="zh-CN"/>
-        </w:rPr>
-        <w:t>编程练习中的报错信息、源代码与修改经过</w:t>
-      </w:r>
-      <w:r>
-        <w:rPr>
-          <w:rFonts w:hint="eastAsia"/>
-          <w:lang w:eastAsia="zh-CN"/>
-        </w:rPr>
-        <w:t>被</w:t>
-      </w:r>
-      <w:r>
-        <w:rPr>
-          <w:lang w:eastAsia="zh-CN"/>
-        </w:rPr>
-        <w:t>分散保存，学生复习时难以追溯错误原因；直接采用模型生成的答案，还可能跳过对错误的判断。为在复习时保留原始报错和修改依据，本文设计并实现基于Spring Boot的编程错题智能解析助手。系统以错题为单位保存题目、原始代码、报错信息和实际、预期输出，再将这些信息提交给模型生成错误定位、原因解释、修改建议与参考代码。后端检查返回字段并保留原始响应，供学生结合代码和运行结果核验；学生可记录判断及依据，并根据复习表现安排下次回顾。当前版本的16项自动化测试全部通过。</w:t>
+        <w:keepNext w:val="0"/>
+        <w:keepLines w:val="0"/>
+        <w:widowControl w:val="0"/>
+        <w:spacing w:line="400" w:lineRule="exact" w:before="0" w:after="0"/>
+        <w:ind w:firstLine="0"/>
+        <w:jc w:val="center"/>
+      </w:pPr>
+      <w:r>
+        <w:rPr>
+          <w:rFonts w:ascii="宋体" w:hAnsi="宋体" w:eastAsia="宋体"/>
+          <w:sz w:val="24"/>
+        </w:rPr>
+        <w:t>（一）需求分析  ········  1</w:t>
       </w:r>
     </w:p>
     <w:p>
       <w:pPr>
-        <w:pStyle w:val="affe"/>
-        <w:rPr>
-          <w:rFonts w:hint="eastAsia"/>
-          <w:lang w:eastAsia="zh-CN"/>
-        </w:rPr>
-      </w:pPr>
-      <w:r>
-        <w:rPr>
-          <w:rFonts w:ascii="黑体" w:hAnsi="黑体"/>
-          <w:b/>
-          <w:lang w:eastAsia="zh-CN"/>
-        </w:rPr>
-        <w:t>关键词：</w:t>
-      </w:r>
-      <w:r>
-        <w:rPr>
-          <w:lang w:eastAsia="zh-CN"/>
-        </w:rPr>
-        <w:t>编程错题；Spring Boot；智能解析；复习记录</w:t>
+        <w:keepNext w:val="0"/>
+        <w:keepLines w:val="0"/>
+        <w:widowControl w:val="0"/>
+        <w:spacing w:line="400" w:lineRule="exact" w:before="0" w:after="0"/>
+        <w:ind w:firstLine="0"/>
+        <w:jc w:val="center"/>
+      </w:pPr>
+      <w:r>
+        <w:rPr>
+          <w:rFonts w:ascii="宋体" w:hAnsi="宋体" w:eastAsia="宋体"/>
+          <w:sz w:val="24"/>
+        </w:rPr>
+        <w:t>（二）可行性与范围  ········  2</w:t>
       </w:r>
     </w:p>
     <w:p>
       <w:pPr>
-        <w:rPr>
-          <w:rFonts w:hint="eastAsia"/>
-          <w:lang w:eastAsia="zh-CN"/>
-        </w:rPr>
-        <w:sectPr>
-          <w:headerReference w:type="default" r:id="rId8"/>
-          <w:footerReference w:type="default" r:id="rId9"/>
-          <w:pgSz w:w="11906" w:h="16838"/>
-          <w:pgMar w:top="1417" w:right="1474" w:bottom="1417" w:left="1871" w:header="850" w:footer="850" w:gutter="0"/>
-          <w:pgNumType w:fmt="upperRoman" w:start="1"/>
-          <w:cols w:space="720"/>
-          <w:docGrid w:linePitch="360"/>
-        </w:sectPr>
-      </w:pPr>
+        <w:keepNext w:val="0"/>
+        <w:keepLines w:val="0"/>
+        <w:widowControl w:val="0"/>
+        <w:spacing w:line="400" w:lineRule="exact" w:before="0" w:after="0"/>
+        <w:ind w:firstLine="0"/>
+        <w:jc w:val="center"/>
+      </w:pPr>
+      <w:r>
+        <w:rPr>
+          <w:rFonts w:ascii="宋体" w:hAnsi="宋体" w:eastAsia="宋体"/>
+          <w:sz w:val="24"/>
+        </w:rPr>
+        <w:t>三、系统设计  ········  2</w:t>
+      </w:r>
     </w:p>
     <w:p>
       <w:pPr>
-        <w:pStyle w:val="aa"/>
-        <w:rPr>
-          <w:rFonts w:hint="eastAsia"/>
-        </w:rPr>
-      </w:pPr>
-      <w:r>
-        <w:rPr>
-          <w:rFonts w:ascii="Times New Roman" w:hAnsi="Times New Roman"/>
-          <w:b/>
-        </w:rPr>
-        <w:lastRenderedPageBreak/>
-        <w:t>Design and Implementation of an Intelligent Assistant for Analyzing Programming Mistakes Based on Spring Boot</w:t>
+        <w:keepNext w:val="0"/>
+        <w:keepLines w:val="0"/>
+        <w:widowControl w:val="0"/>
+        <w:spacing w:line="400" w:lineRule="exact" w:before="0" w:after="0"/>
+        <w:ind w:firstLine="0"/>
+        <w:jc w:val="center"/>
+      </w:pPr>
+      <w:r>
+        <w:rPr>
+          <w:rFonts w:ascii="宋体" w:hAnsi="宋体" w:eastAsia="宋体"/>
+          <w:sz w:val="24"/>
+        </w:rPr>
+        <w:t>（一）总体结构与处理流程  ········  2</w:t>
       </w:r>
     </w:p>
     <w:p>
       <w:pPr>
-        <w:pStyle w:val="affa"/>
-      </w:pPr>
-      <w:r>
-        <w:t>Abstract</w:t>
+        <w:keepNext w:val="0"/>
+        <w:keepLines w:val="0"/>
+        <w:widowControl w:val="0"/>
+        <w:spacing w:line="400" w:lineRule="exact" w:before="0" w:after="0"/>
+        <w:ind w:firstLine="0"/>
+        <w:jc w:val="center"/>
+      </w:pPr>
+      <w:r>
+        <w:rPr>
+          <w:rFonts w:ascii="宋体" w:hAnsi="宋体" w:eastAsia="宋体"/>
+          <w:sz w:val="24"/>
+        </w:rPr>
+        <w:t>（二）数据结构设计  ········  3</w:t>
       </w:r>
     </w:p>
     <w:p>
       <w:pPr>
-        <w:pStyle w:val="affc"/>
-        <w:ind w:firstLine="482"/>
-      </w:pPr>
-      <w:r>
-        <w:t>When error messages, source code, and revisions are stored separately, students may struggle to trace the cause of a mistake during review. Accepting a model-generated answer without checking it can also bypass the reasoning needed to understand the error. To preserve the original error context and the reasons for revisions during review, this paper presents a Spring Boot assistant for programming mistakes. Each record stores the task, original code, error message, and actual and expected output. The backend sends this context to a model for error localization, an explanation, revision advice, and reference code. It checks the returned fields and retains the raw response so that students can verify the advice against the code and output. They can record a judgment with reasons and schedule the next review according to their recall. All 16 automated tests pass in the current version.</w:t>
+        <w:keepNext w:val="0"/>
+        <w:keepLines w:val="0"/>
+        <w:widowControl w:val="0"/>
+        <w:spacing w:line="400" w:lineRule="exact" w:before="0" w:after="0"/>
+        <w:ind w:firstLine="0"/>
+        <w:jc w:val="center"/>
+      </w:pPr>
+      <w:r>
+        <w:rPr>
+          <w:rFonts w:ascii="宋体" w:hAnsi="宋体" w:eastAsia="宋体"/>
+          <w:sz w:val="24"/>
+        </w:rPr>
+        <w:t>（三）智能解析结果设计  ········  3</w:t>
       </w:r>
     </w:p>
     <w:p>
       <w:pPr>
-        <w:pStyle w:val="affe"/>
-        <w:rPr>
-          <w:rFonts w:hint="eastAsia"/>
-        </w:rPr>
-      </w:pPr>
-      <w:r>
-        <w:rPr>
-          <w:rFonts w:ascii="Times New Roman" w:hAnsi="Times New Roman"/>
-          <w:b/>
-        </w:rPr>
-        <w:t xml:space="preserve">Keywords: </w:t>
-      </w:r>
-      <w:r>
-        <w:rPr>
-          <w:rFonts w:ascii="Times New Roman" w:hAnsi="Times New Roman"/>
-        </w:rPr>
-        <w:t>programming mistakes; Spring Boot; error analysis; review records</w:t>
+        <w:keepNext w:val="0"/>
+        <w:keepLines w:val="0"/>
+        <w:widowControl w:val="0"/>
+        <w:spacing w:line="400" w:lineRule="exact" w:before="0" w:after="0"/>
+        <w:ind w:firstLine="0"/>
+        <w:jc w:val="center"/>
+      </w:pPr>
+      <w:r>
+        <w:rPr>
+          <w:rFonts w:ascii="宋体" w:hAnsi="宋体" w:eastAsia="宋体"/>
+          <w:sz w:val="24"/>
+        </w:rPr>
+        <w:t>（四）复习机制设计  ········  3</w:t>
       </w:r>
     </w:p>
     <w:p>
       <w:pPr>
-        <w:rPr>
-          <w:rFonts w:hint="eastAsia"/>
-        </w:rPr>
-        <w:sectPr>
-          <w:headerReference w:type="default" r:id="rId10"/>
-          <w:footerReference w:type="default" r:id="rId11"/>
-          <w:pgSz w:w="11906" w:h="16838"/>
-          <w:pgMar w:top="1417" w:right="1474" w:bottom="1417" w:left="1871" w:header="850" w:footer="850" w:gutter="0"/>
-          <w:pgNumType w:fmt="upperRoman" w:start="1"/>
-          <w:cols w:space="720"/>
-          <w:docGrid w:linePitch="360"/>
-        </w:sectPr>
-      </w:pPr>
+        <w:keepNext w:val="0"/>
+        <w:keepLines w:val="0"/>
+        <w:widowControl w:val="0"/>
+        <w:spacing w:line="400" w:lineRule="exact" w:before="0" w:after="0"/>
+        <w:ind w:firstLine="0"/>
+        <w:jc w:val="center"/>
+      </w:pPr>
+      <w:r>
+        <w:rPr>
+          <w:rFonts w:ascii="宋体" w:hAnsi="宋体" w:eastAsia="宋体"/>
+          <w:sz w:val="24"/>
+        </w:rPr>
+        <w:t>四、系统实现  ········  4</w:t>
+      </w:r>
     </w:p>
     <w:p>
       <w:pPr>
-        <w:pStyle w:val="1"/>
-        <w:spacing w:beforeLines="100" w:before="240" w:afterLines="100" w:after="240"/>
-        <w:rPr>
-          <w:rFonts w:hint="eastAsia"/>
-          <w:lang w:eastAsia="zh-CN"/>
-        </w:rPr>
-      </w:pPr>
-      <w:bookmarkStart w:id="0" w:name="_Toc243984165"/>
-      <w:r>
-        <w:rPr>
-          <w:lang w:eastAsia="zh-CN"/>
-        </w:rPr>
-        <w:lastRenderedPageBreak/>
-        <w:t>1引言</w:t>
-      </w:r>
-      <w:bookmarkEnd w:id="0"/>
+        <w:keepNext w:val="0"/>
+        <w:keepLines w:val="0"/>
+        <w:widowControl w:val="0"/>
+        <w:spacing w:line="400" w:lineRule="exact" w:before="0" w:after="0"/>
+        <w:ind w:firstLine="0"/>
+        <w:jc w:val="center"/>
+      </w:pPr>
+      <w:r>
+        <w:rPr>
+          <w:rFonts w:ascii="宋体" w:hAnsi="宋体" w:eastAsia="宋体"/>
+          <w:sz w:val="24"/>
+        </w:rPr>
+        <w:t>（一）前端与接口实现  ········  4</w:t>
+      </w:r>
     </w:p>
     <w:p>
       <w:pPr>
-        <w:ind w:firstLine="482"/>
-        <w:rPr>
-          <w:rFonts w:hint="eastAsia"/>
-          <w:lang w:eastAsia="zh-CN"/>
-        </w:rPr>
-      </w:pPr>
-      <w:r>
-        <w:rPr>
-          <w:lang w:eastAsia="zh-CN"/>
-        </w:rPr>
-        <w:t>程序设计课程的练习通常伴随编译错误、运行异常和结果不符合预期等问题。学生若只保存报错截图或修正后的代码，过一段时间便难以还原原始思路，也不容易区分语法失误、边界条件遗漏和算法理解偏差。唐琳等在编程实践课程中引入大语言模型</w:t>
-      </w:r>
-      <w:r>
-        <w:rPr>
-          <w:vertAlign w:val="superscript"/>
-          <w:lang w:eastAsia="zh-CN"/>
-        </w:rPr>
-        <w:t>[1]</w:t>
-      </w:r>
-      <w:r>
-        <w:rPr>
-          <w:lang w:eastAsia="zh-CN"/>
-        </w:rPr>
-        <w:t>，陈峥等将其用于Java编程作业评估</w:t>
-      </w:r>
-      <w:r>
-        <w:rPr>
-          <w:vertAlign w:val="superscript"/>
-          <w:lang w:eastAsia="zh-CN"/>
-        </w:rPr>
-        <w:t>[2]</w:t>
-      </w:r>
-      <w:r>
-        <w:rPr>
-          <w:lang w:eastAsia="zh-CN"/>
-        </w:rPr>
-        <w:t>。针对编程练习自动反馈的综述指出，反馈的内容、生成方式及其对学习者的帮助需要分别分析</w:t>
-      </w:r>
-      <w:r>
-        <w:rPr>
-          <w:vertAlign w:val="superscript"/>
-          <w:lang w:eastAsia="zh-CN"/>
-        </w:rPr>
-        <w:t>[3]</w:t>
-      </w:r>
-      <w:r>
-        <w:rPr>
-          <w:lang w:eastAsia="zh-CN"/>
-        </w:rPr>
-        <w:t>。因此，错题工具除存储原始材料外，还应把错误解释、修改过程和复习活动连接起来。</w:t>
+        <w:keepNext w:val="0"/>
+        <w:keepLines w:val="0"/>
+        <w:widowControl w:val="0"/>
+        <w:spacing w:line="400" w:lineRule="exact" w:before="0" w:after="0"/>
+        <w:ind w:firstLine="0"/>
+        <w:jc w:val="center"/>
+      </w:pPr>
+      <w:r>
+        <w:rPr>
+          <w:rFonts w:ascii="宋体" w:hAnsi="宋体" w:eastAsia="宋体"/>
+          <w:sz w:val="24"/>
+        </w:rPr>
+        <w:t>（二）业务与权限实现  ········  4</w:t>
       </w:r>
     </w:p>
     <w:p>
       <w:pPr>
-        <w:ind w:firstLine="482"/>
-        <w:rPr>
-          <w:rFonts w:hint="eastAsia"/>
-          <w:lang w:eastAsia="zh-CN"/>
-        </w:rPr>
-      </w:pPr>
-      <w:r>
-        <w:rPr>
-          <w:lang w:eastAsia="zh-CN"/>
-        </w:rPr>
-        <w:t>大语言模型能够生成自然语言解释和参考代码，但流畅的表述不能直接证明判断正确。教育领域的研究同时讨论了这类工具的学习机会与准确性、依赖性等问题</w:t>
-      </w:r>
-      <w:r>
-        <w:rPr>
-          <w:vertAlign w:val="superscript"/>
-          <w:lang w:eastAsia="zh-CN"/>
-        </w:rPr>
-        <w:t>[4]</w:t>
-      </w:r>
-      <w:r>
-        <w:rPr>
-          <w:lang w:eastAsia="zh-CN"/>
-        </w:rPr>
-        <w:t>。学生在“AI分析”页查看错误原因、修改建议和参考代码后，可选择“分析正确”“分析有误”或“暂不确定”，填写核验说明；系统按当前账户保存判断，并保留原始模型响应供后续核查。本文围绕个人错题的保存、解释查看、人工核验和定期复习设计操作流程。</w:t>
+        <w:keepNext w:val="0"/>
+        <w:keepLines w:val="0"/>
+        <w:widowControl w:val="0"/>
+        <w:spacing w:line="400" w:lineRule="exact" w:before="0" w:after="0"/>
+        <w:ind w:firstLine="0"/>
+        <w:jc w:val="center"/>
+      </w:pPr>
+      <w:r>
+        <w:rPr>
+          <w:rFonts w:ascii="宋体" w:hAnsi="宋体" w:eastAsia="宋体"/>
+          <w:sz w:val="24"/>
+        </w:rPr>
+        <w:t>（三）模型调用与结果检查实现  ········  4</w:t>
       </w:r>
     </w:p>
     <w:p>
       <w:pPr>
-        <w:ind w:firstLine="482"/>
-        <w:rPr>
-          <w:rFonts w:hint="eastAsia"/>
-          <w:lang w:eastAsia="zh-CN"/>
-        </w:rPr>
-      </w:pPr>
-      <w:r>
-        <w:rPr>
-          <w:lang w:eastAsia="zh-CN"/>
-        </w:rPr>
-        <w:t>本文以个人Java编程错题为主要分析对象：学习者提供原题、代码和运行现象，应用保存这些材料及后续分析记录。参考代码由页面展示，应用服务器不执行用户提交的程序。这一使用范围要求结果评价同时检查解释文本与参考代码。</w:t>
+        <w:keepNext w:val="0"/>
+        <w:keepLines w:val="0"/>
+        <w:widowControl w:val="0"/>
+        <w:spacing w:line="400" w:lineRule="exact" w:before="0" w:after="0"/>
+        <w:ind w:firstLine="0"/>
+        <w:jc w:val="center"/>
+      </w:pPr>
+      <w:r>
+        <w:rPr>
+          <w:rFonts w:ascii="宋体" w:hAnsi="宋体" w:eastAsia="宋体"/>
+          <w:sz w:val="24"/>
+        </w:rPr>
+        <w:t>五、结果与讨论  ········  5</w:t>
       </w:r>
     </w:p>
     <w:p>
       <w:pPr>
-        <w:pStyle w:val="1"/>
-        <w:spacing w:beforeLines="100" w:before="240" w:afterLines="100" w:after="240"/>
-        <w:rPr>
-          <w:rFonts w:hint="eastAsia"/>
-          <w:lang w:eastAsia="zh-CN"/>
-        </w:rPr>
-      </w:pPr>
-      <w:bookmarkStart w:id="1" w:name="_Toc243984166"/>
-      <w:r>
-        <w:rPr>
-          <w:lang w:eastAsia="zh-CN"/>
-        </w:rPr>
-        <w:t>2系统分析</w:t>
-      </w:r>
-      <w:bookmarkEnd w:id="1"/>
+        <w:keepNext w:val="0"/>
+        <w:keepLines w:val="0"/>
+        <w:widowControl w:val="0"/>
+        <w:spacing w:line="400" w:lineRule="exact" w:before="0" w:after="0"/>
+        <w:ind w:firstLine="0"/>
+        <w:jc w:val="center"/>
+      </w:pPr>
+      <w:r>
+        <w:rPr>
+          <w:rFonts w:ascii="宋体" w:hAnsi="宋体" w:eastAsia="宋体"/>
+          <w:sz w:val="24"/>
+        </w:rPr>
+        <w:t>六、结论  ········  6</w:t>
+      </w:r>
     </w:p>
     <w:p>
       <w:pPr>
-        <w:ind w:firstLine="482"/>
-        <w:rPr>
-          <w:rFonts w:hint="eastAsia"/>
-          <w:lang w:eastAsia="zh-CN"/>
-        </w:rPr>
-      </w:pPr>
-      <w:r>
-        <w:rPr>
-          <w:lang w:eastAsia="zh-CN"/>
-        </w:rPr>
-        <w:t>（1</w:t>
-      </w:r>
-      <w:r>
-        <w:rPr>
-          <w:lang w:eastAsia="zh-CN"/>
-        </w:rPr>
-        <w:t>）</w:t>
-      </w:r>
-      <w:r>
-        <w:rPr>
-          <w:lang w:eastAsia="zh-CN"/>
-        </w:rPr>
-        <w:t>用户与任务分析。系统面向已注册的个人学习者。未登录者可访问注册、登录和密码找回入口；登录后可新增、查询、编辑及删除自己的错题，调用解析服务，查看历史分析，记录分析是否可信，并按计划复习。学习者录入的题目描述、源代码、错误消息、实际输出和期望输出共同构成分析依据。若输入缺失，系统可以提示模型说明信息不足，而不能把猜测当成确定原因。</w:t>
+        <w:keepNext w:val="0"/>
+        <w:keepLines w:val="0"/>
+        <w:widowControl w:val="0"/>
+        <w:spacing w:line="400" w:lineRule="exact" w:before="0" w:after="0"/>
+        <w:ind w:firstLine="0"/>
+        <w:jc w:val="center"/>
+      </w:pPr>
+      <w:r>
+        <w:rPr>
+          <w:rFonts w:ascii="宋体" w:hAnsi="宋体" w:eastAsia="宋体"/>
+          <w:sz w:val="24"/>
+        </w:rPr>
+        <w:t>参考文献  ········  7</w:t>
       </w:r>
     </w:p>
     <w:p>
       <w:pPr>
-        <w:ind w:firstLine="482"/>
-        <w:rPr>
-          <w:rFonts w:hint="eastAsia"/>
-          <w:lang w:eastAsia="zh-CN"/>
-        </w:rPr>
-      </w:pPr>
-      <w:r>
-        <w:rPr>
-          <w:lang w:eastAsia="zh-CN"/>
-        </w:rPr>
-        <w:t>（2）业务需求分析。一次错题分析应先确认错题归属，再控制调用次数，随后组织模型输入、检查输出并保存结果。系统需要对同一道错题的重复并发分析作限制；对模型不可用或格式错误的情况记录失败状态，避免页面显示虚假的成功。查询分析历史时仍要按当前账户核对错题归属。知识点应与错题关联，便于以后按主题回看。</w:t>
+        <w:keepNext w:val="0"/>
+        <w:keepLines w:val="0"/>
+        <w:pageBreakBefore/>
+        <w:widowControl w:val="0"/>
+        <w:spacing w:beforeLines="50" w:before="120" w:after="0" w:line="240" w:lineRule="auto"/>
+        <w:rPr>
+          <w:lang w:eastAsia="zh-CN"/>
+        </w:rPr>
+      </w:pPr>
+      <w:r>
+        <w:rPr>
+          <w:rFonts w:ascii="宋体" w:hAnsi="宋体" w:cs="宋体"/>
+          <w:b/>
+          <w:sz w:val="28"/>
+          <w:lang w:eastAsia="zh-CN"/>
+        </w:rPr>
+        <w:t>一、引言</w:t>
       </w:r>
     </w:p>
     <w:p>
       <w:pPr>
+        <w:keepNext w:val="0"/>
+        <w:keepLines w:val="0"/>
+        <w:widowControl w:val="0"/>
+        <w:spacing w:line="240" w:lineRule="auto"/>
         <w:ind w:firstLine="482"/>
-        <w:rPr>
-          <w:rFonts w:hint="eastAsia"/>
-          <w:lang w:eastAsia="zh-CN"/>
-        </w:rPr>
-      </w:pPr>
-      <w:r>
-        <w:rPr>
-          <w:lang w:eastAsia="zh-CN"/>
-        </w:rPr>
-        <w:t>（3）非功能需求分析。个人代码和学习记录需要账户隔离，登录凭证不能替代每次数据归属校验。模型请求可能耗时，因此还需限制单用户调用频率与全局并发。已有实现默认每人每天最多20次、全局同时最多3次，但该计数保存在应用进程中，若部署多个进程，应改为共享计数。页面提供中文桌面工作台；当前需求不包含独立移动端应用。</w:t>
+        <w:jc w:val="both"/>
+        <w:rPr>
+          <w:rFonts w:ascii="宋体" w:hAnsi="宋体"/>
+          <w:lang w:eastAsia="zh-CN"/>
+        </w:rPr>
+      </w:pPr>
+      <w:r>
+        <w:rPr>
+          <w:rFonts w:ascii="宋体" w:hAnsi="宋体"/>
+          <w:lang w:eastAsia="zh-CN"/>
+        </w:rPr>
+        <w:lastRenderedPageBreak/>
+        <w:t>编程学习不仅要求学生掌握语法，还要能根据报错信息和程序运行结果定位问题、解释原因并验证修改。已有研究从不同角度探索了大语言模型辅助编程学习：王帅等将复杂任务拆分为语义理解、逻辑设计和代码实现等层次，并在关键步骤加入反思性提示，尝试减少直接展示完整代码带来的思维跳跃[1]；陈峥、喻俊杰针对传统自动评测侧重输入输出正确性、较少评价设计质量的问题，提出将代码设计和规范性纳入Java作业反馈[2]。另有研究结合代码词汇与语法结构信息定位错误片段并生成修正代码[3]。一项对某高校36名学生编程过程的观察发现，学生会将代码或报错信息复制给模型并复用其反馈，不同学习表现群体的使用方式存在差异[4]。这些工作为任务提示、代码评估、错误定位和人工复核提供了参考；本文重点解决个人错题记录、解析留存和复习管理问题，模型输出仍作为待核验建议，不作为标准答案。</w:t>
       </w:r>
     </w:p>
     <w:p>
       <w:pPr>
-        <w:pStyle w:val="1"/>
-        <w:spacing w:beforeLines="100" w:before="240" w:afterLines="100" w:after="240"/>
-        <w:rPr>
-          <w:rFonts w:hint="eastAsia"/>
-          <w:lang w:eastAsia="zh-CN"/>
-        </w:rPr>
-      </w:pPr>
-      <w:bookmarkStart w:id="2" w:name="_Toc243984167"/>
-      <w:r>
-        <w:rPr>
-          <w:lang w:eastAsia="zh-CN"/>
-        </w:rPr>
-        <w:lastRenderedPageBreak/>
-        <w:t>3系统设计</w:t>
-      </w:r>
-      <w:bookmarkEnd w:id="2"/>
+        <w:keepNext w:val="0"/>
+        <w:keepLines w:val="0"/>
+        <w:widowControl w:val="0"/>
+        <w:spacing w:line="240" w:lineRule="auto"/>
+        <w:ind w:firstLine="482"/>
+        <w:jc w:val="both"/>
+        <w:rPr>
+          <w:lang w:eastAsia="zh-CN"/>
+        </w:rPr>
+      </w:pPr>
+      <w:r>
+        <w:rPr>
+          <w:rFonts w:ascii="宋体" w:hAnsi="宋体"/>
+          <w:lang w:eastAsia="zh-CN"/>
+        </w:rPr>
+        <w:t>在教学应用方面，李希等把提示词设计用于数据结构课程的学习路径、编程辅助和调试指导</w:t>
+      </w:r>
+      <w:r>
+        <w:rPr>
+          <w:rFonts w:ascii="宋体" w:hAnsi="宋体"/>
+          <w:vertAlign w:val="superscript"/>
+          <w:lang w:eastAsia="zh-CN"/>
+        </w:rPr>
+        <w:t>[5]</w:t>
+      </w:r>
+      <w:r>
+        <w:rPr>
+          <w:rFonts w:ascii="宋体" w:hAnsi="宋体"/>
+          <w:lang w:eastAsia="zh-CN"/>
+        </w:rPr>
+        <w:t>；姚嘉轩、夏小俊提出编程作业评估助手，尝试从多个维度给出评分和个性化反馈</w:t>
+      </w:r>
+      <w:r>
+        <w:rPr>
+          <w:rFonts w:ascii="宋体" w:hAnsi="宋体"/>
+          <w:vertAlign w:val="superscript"/>
+          <w:lang w:eastAsia="zh-CN"/>
+        </w:rPr>
+        <w:t>[6]</w:t>
+      </w:r>
+      <w:r>
+        <w:rPr>
+          <w:rFonts w:ascii="宋体" w:hAnsi="宋体"/>
+          <w:lang w:eastAsia="zh-CN"/>
+        </w:rPr>
+        <w:t>；唐琳等将模型用于编程实践课，组织师生评价代码质量</w:t>
+      </w:r>
+      <w:r>
+        <w:rPr>
+          <w:rFonts w:ascii="宋体" w:hAnsi="宋体"/>
+          <w:vertAlign w:val="superscript"/>
+          <w:lang w:eastAsia="zh-CN"/>
+        </w:rPr>
+        <w:t>[7]</w:t>
+      </w:r>
+      <w:r>
+        <w:rPr>
+          <w:rFonts w:ascii="宋体" w:hAnsi="宋体"/>
+          <w:lang w:eastAsia="zh-CN"/>
+        </w:rPr>
+        <w:t>。徐建军等讨论了课堂教学、编程实践与考核评价的重构</w:t>
+      </w:r>
+      <w:r>
+        <w:rPr>
+          <w:rFonts w:ascii="宋体" w:hAnsi="宋体"/>
+          <w:vertAlign w:val="superscript"/>
+          <w:lang w:eastAsia="zh-CN"/>
+        </w:rPr>
+        <w:t>[8]</w:t>
+      </w:r>
+      <w:r>
+        <w:rPr>
+          <w:rFonts w:ascii="宋体" w:hAnsi="宋体"/>
+          <w:lang w:eastAsia="zh-CN"/>
+        </w:rPr>
+        <w:t>；陈小强等围绕Python程序设计课程设计学习资源和评价环节</w:t>
+      </w:r>
+      <w:r>
+        <w:rPr>
+          <w:rFonts w:ascii="宋体" w:hAnsi="宋体"/>
+          <w:vertAlign w:val="superscript"/>
+          <w:lang w:eastAsia="zh-CN"/>
+        </w:rPr>
+        <w:t>[9]</w:t>
+      </w:r>
+      <w:r>
+        <w:rPr>
+          <w:rFonts w:ascii="宋体" w:hAnsi="宋体"/>
+          <w:lang w:eastAsia="zh-CN"/>
+        </w:rPr>
+        <w:t>。</w:t>
+      </w:r>
     </w:p>
     <w:p>
       <w:pPr>
+        <w:keepNext w:val="0"/>
+        <w:keepLines w:val="0"/>
+        <w:widowControl w:val="0"/>
+        <w:spacing w:line="240" w:lineRule="auto"/>
         <w:ind w:firstLine="482"/>
-        <w:rPr>
-          <w:rFonts w:hint="eastAsia"/>
-          <w:lang w:eastAsia="zh-CN"/>
-        </w:rPr>
-      </w:pPr>
-      <w:r>
-        <w:rPr>
-          <w:lang w:eastAsia="zh-CN"/>
-        </w:rPr>
-        <w:t>（1）总体结构。浏览器页面接收错题材料并展示历史记录；Spring Boot后端根据登录身份检查数据归属，再处理错题和解析请求；MySQL保存用户、错题、解析、知识点及复习记录。Spring Boot承担应用启动、接口接入和配置管理</w:t>
-      </w:r>
-      <w:r>
-        <w:rPr>
-          <w:vertAlign w:val="superscript"/>
-          <w:lang w:eastAsia="zh-CN"/>
-        </w:rPr>
-        <w:t>[5]</w:t>
-      </w:r>
-      <w:r>
-        <w:rPr>
-          <w:lang w:eastAsia="zh-CN"/>
-        </w:rPr>
-        <w:t>。默认模型服务为本机Ollama，其聊天接口接收模型名称与消息内容并返回生成信息</w:t>
-      </w:r>
-      <w:r>
-        <w:rPr>
-          <w:vertAlign w:val="superscript"/>
-          <w:lang w:eastAsia="zh-CN"/>
-        </w:rPr>
-        <w:t>[6]</w:t>
-      </w:r>
-      <w:r>
-        <w:rPr>
-          <w:lang w:eastAsia="zh-CN"/>
-        </w:rPr>
-        <w:t>；配置项也允许切换到兼容接口。</w:t>
+        <w:jc w:val="both"/>
+        <w:rPr>
+          <w:rFonts w:ascii="宋体" w:hAnsi="宋体"/>
+          <w:lang w:eastAsia="zh-CN"/>
+        </w:rPr>
+      </w:pPr>
+      <w:r>
+        <w:rPr>
+          <w:rFonts w:ascii="宋体" w:hAnsi="宋体"/>
+          <w:lang w:eastAsia="zh-CN"/>
+        </w:rPr>
+        <w:t>同时，徐慧等指出，依赖模型生成代码可能削弱独立思考与实践训练</w:t>
+      </w:r>
+      <w:r>
+        <w:rPr>
+          <w:rFonts w:ascii="宋体" w:hAnsi="宋体"/>
+          <w:lang w:eastAsia="zh-CN"/>
+        </w:rPr>
+        <w:t>[10]</w:t>
+      </w:r>
+      <w:r>
+        <w:rPr>
+          <w:rFonts w:ascii="宋体" w:hAnsi="宋体"/>
+          <w:lang w:eastAsia="zh-CN"/>
+        </w:rPr>
+        <w:t>；何洋等在白盒测试教学中结合程序分析与模型生成测试用例，并用测试结果辅助诊断</w:t>
+      </w:r>
+      <w:r>
+        <w:rPr>
+          <w:rFonts w:ascii="宋体" w:hAnsi="宋体"/>
+          <w:lang w:eastAsia="zh-CN"/>
+        </w:rPr>
+        <w:t>[11]</w:t>
+      </w:r>
+      <w:r>
+        <w:rPr>
+          <w:rFonts w:ascii="宋体" w:hAnsi="宋体"/>
+          <w:lang w:eastAsia="zh-CN"/>
+        </w:rPr>
+        <w:t>。这些研究分别聚焦课程教学、作业评估与测试训练。本系统将范围收在个人错题的记录、解析反馈和复习安排，帮助学习者持续查看同类错误。</w:t>
       </w:r>
     </w:p>
     <w:p>
       <w:pPr>
+        <w:keepNext w:val="0"/>
+        <w:keepLines w:val="0"/>
+        <w:widowControl w:val="0"/>
+        <w:spacing w:line="240" w:lineRule="auto"/>
         <w:ind w:firstLine="482"/>
-        <w:rPr>
-          <w:rFonts w:hint="eastAsia"/>
-          <w:lang w:eastAsia="zh-CN"/>
-        </w:rPr>
-      </w:pPr>
-      <w:r>
-        <w:rPr>
-          <w:lang w:eastAsia="zh-CN"/>
-        </w:rPr>
-        <w:t>（2）数据结构。用户表与错题表形成一对多关系，错题表保存题目、编程语言、代码及错误上下文。解析结果表保存七项结构化内容，分析记录表保存请求和原始响应，二者分开后既能快速展示，也能追查生成过程。知识点表与错题之间通过关联表建立多对多关系。复习状态表记录连续记住次数和下次日期，复习明细表保存每次选择。数据库通过主键、索引与外键保持关联数据的一致性；外键在删除相关记录时的行为由建表约束确定</w:t>
-      </w:r>
-      <w:r>
-        <w:rPr>
-          <w:vertAlign w:val="superscript"/>
-          <w:lang w:eastAsia="zh-CN"/>
-        </w:rPr>
-        <w:t>[7]</w:t>
-      </w:r>
-      <w:r>
-        <w:rPr>
-          <w:lang w:eastAsia="zh-CN"/>
-        </w:rPr>
-        <w:t>。</w:t>
+        <w:jc w:val="both"/>
+        <w:rPr>
+          <w:rFonts w:ascii="宋体" w:hAnsi="宋体"/>
+          <w:lang w:eastAsia="zh-CN"/>
+        </w:rPr>
+      </w:pPr>
+      <w:r>
+        <w:rPr>
+          <w:rFonts w:ascii="宋体" w:hAnsi="宋体"/>
+          <w:lang w:eastAsia="zh-CN"/>
+        </w:rPr>
+        <w:t>基于上述问题，本文围绕个人编程错题的记录、解析、复核和复习过程，设计一套面向学习者的辅助系统。系统的主要目标是帮助用户整理错题并获得结构清晰的分析结果，而不是代替教师判定答案，也不以模型生成代码的形式完整执行自动修复。本文重点说明需求分析、系统结构、主要功能实现及现有测试证据，并对尚未完成的模型效果评估作出明确说明。</w:t>
       </w:r>
     </w:p>
     <w:p>
       <w:pPr>
-        <w:ind w:firstLine="482"/>
-        <w:rPr>
-          <w:rFonts w:hint="eastAsia"/>
-          <w:lang w:eastAsia="zh-CN"/>
-        </w:rPr>
-      </w:pPr>
-      <w:r>
-        <w:rPr>
-          <w:lang w:eastAsia="zh-CN"/>
-        </w:rPr>
-        <w:t>（3）分析流程。系统先用用户编号和错题编号共同查询目标错题；确认该题未处于分析中且配额可用后，将状态设为分析中。输入模板按题目、代码、报错、实际结果与期望结果分段组织，并明确要求返回固定的JSON字段。模型响应到达后，程序逐项检查文本字段和知识点数组，拒绝缺失或空值；通过检查的内容在一次数据库处理中保存解析结果、知识点关联和成功记录。若调用或解析失败，则保存失败状态和错误信息。</w:t>
+        <w:keepNext w:val="0"/>
+        <w:keepLines w:val="0"/>
+        <w:widowControl w:val="0"/>
+        <w:spacing w:before="200" w:after="100" w:line="288" w:lineRule="auto"/>
+        <w:rPr>
+          <w:lang w:eastAsia="zh-CN"/>
+        </w:rPr>
+      </w:pPr>
+      <w:r>
+        <w:rPr>
+          <w:rFonts w:ascii="宋体" w:hAnsi="宋体" w:cs="宋体"/>
+          <w:b/>
+          <w:sz w:val="28"/>
+          <w:lang w:eastAsia="zh-CN"/>
+        </w:rPr>
+        <w:t>二、系统分析</w:t>
       </w:r>
     </w:p>
     <w:p>
       <w:pPr>
-        <w:ind w:firstLine="482"/>
-        <w:rPr>
-          <w:rFonts w:hint="eastAsia"/>
-          <w:lang w:eastAsia="zh-CN"/>
-        </w:rPr>
-      </w:pPr>
-      <w:r>
-        <w:rPr>
-          <w:lang w:eastAsia="zh-CN"/>
-        </w:rPr>
-        <w:t>（4）分析核验与复习安排。错题经过分析后，用户可将分析标为准确、不准确或无法判断，并写下依据。这是个人反馈，不等同于专家评分。复习模块记录“已经记住”或“还需练习”：连续记住时依次安排1、3、7、14、30天后的回顾，忘记时重新安排1天后复习。统计模块按当前账户汇总错题总数、已解析数和分析次数，帮助用户发现尚未处理的记录。</w:t>
+        <w:keepNext w:val="0"/>
+        <w:keepLines w:val="0"/>
+        <w:widowControl w:val="0"/>
+        <w:spacing w:before="120" w:after="60" w:line="288" w:lineRule="auto"/>
+        <w:rPr>
+          <w:lang w:eastAsia="zh-CN"/>
+        </w:rPr>
+      </w:pPr>
+      <w:r>
+        <w:rPr>
+          <w:rFonts w:ascii="宋体" w:hAnsi="宋体" w:cs="宋体"/>
+          <w:b/>
+          <w:lang w:eastAsia="zh-CN"/>
+        </w:rPr>
+        <w:t>（一）需求分析</w:t>
       </w:r>
     </w:p>
     <w:p>
       <w:pPr>
-        <w:pStyle w:val="1"/>
-        <w:spacing w:beforeLines="100" w:before="240" w:afterLines="100" w:after="240"/>
-        <w:rPr>
-          <w:rFonts w:hint="eastAsia"/>
-          <w:lang w:eastAsia="zh-CN"/>
-        </w:rPr>
-      </w:pPr>
-      <w:bookmarkStart w:id="3" w:name="_Toc243984168"/>
-      <w:r>
-        <w:rPr>
-          <w:lang w:eastAsia="zh-CN"/>
-        </w:rPr>
-        <w:t>4系统实现</w:t>
-      </w:r>
-      <w:bookmarkEnd w:id="3"/>
+        <w:keepNext w:val="0"/>
+        <w:keepLines w:val="0"/>
+        <w:widowControl w:val="0"/>
+        <w:spacing w:line="240" w:lineRule="auto"/>
+        <w:ind w:firstLine="482"/>
+        <w:jc w:val="both"/>
+        <w:rPr>
+          <w:rFonts w:ascii="宋体" w:hAnsi="宋体"/>
+          <w:lang w:eastAsia="zh-CN"/>
+        </w:rPr>
+      </w:pPr>
+      <w:r>
+        <w:rPr>
+          <w:rFonts w:ascii="宋体" w:hAnsi="宋体"/>
+          <w:lang w:eastAsia="zh-CN"/>
+        </w:rPr>
+        <w:t>系统的主要使用者是需要记录和复习编程问题的学生。用户可录入题目标题、题目描述、编程语言、自己的代码、报错信息，以及实际输出和预期输出等内容。系统保存错题后，可请求模型生成结构化解析，并将解析与对应错题关联。用户还可以查看历史解析、添加人工反馈、整理知识点，以及记录复习情况。</w:t>
+      </w:r>
     </w:p>
     <w:p>
       <w:pPr>
-        <w:ind w:firstLine="482"/>
-        <w:rPr>
-          <w:rFonts w:hint="eastAsia"/>
-          <w:lang w:eastAsia="zh-CN"/>
-        </w:rPr>
-      </w:pPr>
-      <w:r>
-        <w:rPr>
-          <w:lang w:eastAsia="zh-CN"/>
-        </w:rPr>
-        <w:t>（1）账户与错题操作。后端使用Spring Security检查访问权限，登录后签发携带身份信息的令牌；受保护接口先验证令牌，再按当前用户编号筛选数据。错题新增接口校验必填内容，查询接口支持分页和条件搜索，编辑与删除前再次校验归属。这样的双重检查使页面隐藏其他用户数据之外，后端也不会因为直接访问编号而返回别人的记录。</w:t>
+        <w:keepNext w:val="0"/>
+        <w:keepLines w:val="0"/>
+        <w:widowControl w:val="0"/>
+        <w:spacing w:line="400" w:lineRule="exact" w:before="0" w:after="0"/>
+        <w:ind w:firstLine="480"/>
+        <w:jc w:val="both"/>
+      </w:pPr>
+      <w:r>
+        <w:rPr>
+          <w:rFonts w:ascii="宋体" w:hAnsi="宋体" w:eastAsia="宋体"/>
+          <w:sz w:val="24"/>
+        </w:rPr>
+        <w:t>需求分析还应区分用户能完成的操作与系统能够证明的结果。用户提交错题时，七项输入中有些可能缺失，例如只有编译器报错而没有实际输出；服务端需要对必填项、文本长度和登录状态给出明确反馈。用户再次打开错题时，应能看到原始代码和所记录的运行现象，而不是只看到模型总结。对于同一题多次解析，页面需要保留生成时间、模型名称和当时输入，方便辨认结果对应的题目版本。</w:t>
       </w:r>
     </w:p>
     <w:p>
       <w:pPr>
+        <w:keepNext w:val="0"/>
+        <w:keepLines w:val="0"/>
+        <w:widowControl w:val="0"/>
+        <w:spacing w:line="240" w:lineRule="auto"/>
         <w:ind w:firstLine="482"/>
-        <w:rPr>
-          <w:rFonts w:hint="eastAsia"/>
-          <w:lang w:eastAsia="zh-CN"/>
-        </w:rPr>
-      </w:pPr>
-      <w:r>
-        <w:rPr>
-          <w:lang w:eastAsia="zh-CN"/>
-        </w:rPr>
-        <w:t>（2）解析内容生成。</w:t>
-      </w:r>
-      <w:proofErr w:type="spellStart"/>
-      <w:r>
-        <w:rPr>
-          <w:lang w:eastAsia="zh-CN"/>
-        </w:rPr>
-        <w:t>PromptService</w:t>
-      </w:r>
-      <w:proofErr w:type="spellEnd"/>
-      <w:r>
-        <w:rPr>
-          <w:lang w:eastAsia="zh-CN"/>
-        </w:rPr>
-        <w:t>把错题上下文写入统一模板，并说明题目及代码属于待分析数据，不能把其中的命令当作新指令执行。模板要求模型生成错误类型、位置、原因、建议、完整参考代码、1至6个知识点及学习建议。</w:t>
-      </w:r>
-      <w:proofErr w:type="spellStart"/>
-      <w:r>
-        <w:rPr>
-          <w:lang w:eastAsia="zh-CN"/>
-        </w:rPr>
-        <w:t>DeepSeekClient</w:t>
-      </w:r>
-      <w:proofErr w:type="spellEnd"/>
-      <w:r>
-        <w:rPr>
-          <w:lang w:eastAsia="zh-CN"/>
-        </w:rPr>
-        <w:t>调用配置的模型接口；</w:t>
-      </w:r>
-      <w:proofErr w:type="spellStart"/>
-      <w:r>
-        <w:rPr>
-          <w:lang w:eastAsia="zh-CN"/>
-        </w:rPr>
-        <w:t>AiResultParser</w:t>
-      </w:r>
-      <w:proofErr w:type="spellEnd"/>
-      <w:r>
-        <w:rPr>
-          <w:lang w:eastAsia="zh-CN"/>
-        </w:rPr>
-        <w:t>检查返回字段的类型、非</w:t>
-      </w:r>
-      <w:r>
-        <w:rPr>
-          <w:lang w:eastAsia="zh-CN"/>
-        </w:rPr>
-        <w:lastRenderedPageBreak/>
-        <w:t>空要求和长度限制，</w:t>
-      </w:r>
-      <w:proofErr w:type="spellStart"/>
-      <w:r>
-        <w:rPr>
-          <w:lang w:eastAsia="zh-CN"/>
-        </w:rPr>
-        <w:t>AnalysisService</w:t>
-      </w:r>
-      <w:proofErr w:type="spellEnd"/>
-      <w:r>
-        <w:rPr>
-          <w:lang w:eastAsia="zh-CN"/>
-        </w:rPr>
-        <w:t>再保存通过检查的内容。字段检查保证结果能够展示，原因是否正确仍需结合原题判断。</w:t>
+        <w:jc w:val="both"/>
+        <w:rPr>
+          <w:rFonts w:ascii="宋体" w:hAnsi="宋体"/>
+          <w:lang w:eastAsia="zh-CN"/>
+        </w:rPr>
+      </w:pPr>
+      <w:r>
+        <w:rPr>
+          <w:rFonts w:ascii="宋体" w:hAnsi="宋体"/>
+          <w:lang w:eastAsia="zh-CN"/>
+        </w:rPr>
+        <w:t>从功能需求看，系统包括以下内容。（1）账户功能，用于注册、登录和管理个人账户；（2）错题功能，用于新增、查询、修改、删除和分页查看个人错题；（3）智能解析功能，根据错题上下文请求模型生成错误说明、修改建议和修正代码；（4）人工反馈功能，允许用户对结果作准确性判断并填写备注；（5）知识点与复习功能，用于整理相关知识点、记录复习结果并安排下一次复习；（6）统计功能，用于汇总个人错题与学习记录。</w:t>
       </w:r>
     </w:p>
     <w:p>
       <w:pPr>
+        <w:keepNext w:val="0"/>
+        <w:keepLines w:val="0"/>
+        <w:widowControl w:val="0"/>
+        <w:spacing w:line="240" w:lineRule="auto"/>
         <w:ind w:firstLine="482"/>
-        <w:rPr>
-          <w:rFonts w:hint="eastAsia"/>
-          <w:lang w:eastAsia="zh-CN"/>
-        </w:rPr>
-      </w:pPr>
-      <w:r>
-        <w:rPr>
-          <w:lang w:eastAsia="zh-CN"/>
-        </w:rPr>
-        <w:t>（3）状态与资源控制。</w:t>
-      </w:r>
-      <w:proofErr w:type="spellStart"/>
-      <w:r>
-        <w:rPr>
-          <w:lang w:eastAsia="zh-CN"/>
-        </w:rPr>
-        <w:t>AnalysisService</w:t>
-      </w:r>
-      <w:proofErr w:type="spellEnd"/>
-      <w:r>
-        <w:rPr>
-          <w:lang w:eastAsia="zh-CN"/>
-        </w:rPr>
-        <w:t>在模型调用前以数据库条件更新争取分析资格，避免同一道错题被重复处理；调用时获取配额许可，结束后释放。模型返回后，结果、知识点关系和成功记录在同一次处理事务中写入。发生异常时系统记录失败并向页面返回服务不可用信息，用户可以稍后重试。分析历史保留多次解析，以便比较不同时间的回答。</w:t>
+        <w:jc w:val="both"/>
+        <w:rPr>
+          <w:rFonts w:ascii="宋体" w:hAnsi="宋体"/>
+          <w:lang w:eastAsia="zh-CN"/>
+        </w:rPr>
+      </w:pPr>
+      <w:r>
+        <w:rPr>
+          <w:rFonts w:ascii="宋体" w:hAnsi="宋体"/>
+          <w:lang w:eastAsia="zh-CN"/>
+        </w:rPr>
+        <w:t>系统的数据需要按用户隔离。用户只能操作属于自己的错题及其关联记录，不能因猜测编号或直接调用接口而查看其他用户的数据。模型生成结果可能存在错误，因此系统还需要保留分析记录并提供人工反馈入口。当前系统提供的是用户个人复核，并不包含教师审核工作流，也不能据此称为“双人独立评分”或“专家复核”。</w:t>
       </w:r>
     </w:p>
     <w:p>
       <w:pPr>
-        <w:ind w:firstLine="482"/>
-        <w:rPr>
-          <w:rFonts w:hint="eastAsia"/>
-          <w:lang w:eastAsia="zh-CN"/>
-        </w:rPr>
-      </w:pPr>
-      <w:r>
-        <w:rPr>
-          <w:lang w:eastAsia="zh-CN"/>
-        </w:rPr>
-        <w:t>（4）复习与展示。</w:t>
-      </w:r>
-      <w:proofErr w:type="spellStart"/>
-      <w:r>
-        <w:rPr>
-          <w:lang w:eastAsia="zh-CN"/>
-        </w:rPr>
-        <w:t>ReviewService</w:t>
-      </w:r>
-      <w:proofErr w:type="spellEnd"/>
-      <w:r>
-        <w:rPr>
-          <w:lang w:eastAsia="zh-CN"/>
-        </w:rPr>
-        <w:t>查询当前账户待复习的错题，写入复习明细并更新下一次日期；对尚未到期的重复提交返回冲突信息。浏览器工作台把原题、模型解释、参考代码、人工判断和复习入口放在连续操作路径中。页面显示的参考代码不会由应用自动编译或运行，因此用户应结合题目要求和测试结果决定是否采纳。</w:t>
+        <w:keepNext w:val="0"/>
+        <w:keepLines w:val="0"/>
+        <w:widowControl w:val="0"/>
+        <w:spacing w:before="120" w:after="60" w:line="288" w:lineRule="auto"/>
+        <w:rPr>
+          <w:lang w:eastAsia="zh-CN"/>
+        </w:rPr>
+      </w:pPr>
+      <w:r>
+        <w:rPr>
+          <w:rFonts w:ascii="宋体" w:hAnsi="宋体" w:cs="宋体"/>
+          <w:b/>
+          <w:lang w:eastAsia="zh-CN"/>
+        </w:rPr>
+        <w:lastRenderedPageBreak/>
+        <w:t>（二）可行性与范围</w:t>
       </w:r>
     </w:p>
     <w:p>
       <w:pPr>
-        <w:pStyle w:val="1"/>
-        <w:spacing w:beforeLines="100" w:before="240" w:afterLines="100" w:after="240"/>
-        <w:rPr>
-          <w:rFonts w:hint="eastAsia"/>
-          <w:lang w:eastAsia="zh-CN"/>
-        </w:rPr>
-      </w:pPr>
-      <w:bookmarkStart w:id="4" w:name="_Toc243984169"/>
-      <w:r>
-        <w:rPr>
-          <w:lang w:eastAsia="zh-CN"/>
-        </w:rPr>
-        <w:t>5结果与讨论</w:t>
-      </w:r>
-      <w:bookmarkEnd w:id="4"/>
+        <w:keepNext w:val="0"/>
+        <w:keepLines w:val="0"/>
+        <w:widowControl w:val="0"/>
+        <w:spacing w:line="240" w:lineRule="auto"/>
+        <w:ind w:firstLine="482"/>
+        <w:jc w:val="both"/>
+        <w:rPr>
+          <w:rFonts w:ascii="宋体" w:hAnsi="宋体"/>
+          <w:lang w:eastAsia="zh-CN"/>
+        </w:rPr>
+      </w:pPr>
+      <w:r>
+        <w:rPr>
+          <w:rFonts w:ascii="宋体" w:hAnsi="宋体"/>
+          <w:lang w:eastAsia="zh-CN"/>
+        </w:rPr>
+        <w:t>系统采用成熟的Java后端框架、关系型数据库和浏览器页面，适合本科毕业设计的开发范围。Spring Boot提供应用配置和服务运行基础[12]；</w:t>
+      </w:r>
+      <w:proofErr w:type="spellStart"/>
+      <w:r>
+        <w:rPr>
+          <w:rFonts w:ascii="宋体" w:hAnsi="宋体"/>
+          <w:lang w:eastAsia="zh-CN"/>
+        </w:rPr>
+        <w:t>MyBatis</w:t>
+      </w:r>
+      <w:proofErr w:type="spellEnd"/>
+      <w:r>
+        <w:rPr>
+          <w:rFonts w:ascii="宋体" w:hAnsi="宋体"/>
+          <w:lang w:eastAsia="zh-CN"/>
+        </w:rPr>
+        <w:t>-Plus用于简化数据库读写操作，其官方说明包括常见的增删改查和分页能力[13]。MySQL通过表关系和外键约束帮助维护关联数据的一致性[14]。</w:t>
+      </w:r>
     </w:p>
     <w:p>
       <w:pPr>
-        <w:ind w:firstLine="482"/>
-        <w:rPr>
-          <w:rFonts w:hint="eastAsia"/>
-          <w:lang w:eastAsia="zh-CN"/>
-        </w:rPr>
-      </w:pPr>
-      <w:r>
-        <w:rPr>
-          <w:lang w:eastAsia="zh-CN"/>
-        </w:rPr>
-        <w:t>在项目版本中执行</w:t>
-      </w:r>
-      <w:proofErr w:type="spellStart"/>
-      <w:r>
-        <w:rPr>
-          <w:lang w:eastAsia="zh-CN"/>
-        </w:rPr>
-        <w:t>mvn</w:t>
-      </w:r>
-      <w:proofErr w:type="spellEnd"/>
-      <w:r>
-        <w:rPr>
-          <w:lang w:eastAsia="zh-CN"/>
-        </w:rPr>
-        <w:t xml:space="preserve"> -q test，测试报告记录16项测试、0项失败、0项错误。验证范围包括登录限制、登录身份校验、模型调用次数与同时处理数量限制，以及复习记录的归属检查和到期判断。复习测试确认了访问他人错题、未到期重复提交会被拒绝；配额测试确认了每日次数和同时调用数量的上限。上述结果支持账户访问、调用限制与复习规则按既定要求运行</w:t>
-      </w:r>
-      <w:r>
-        <w:rPr>
-          <w:lang w:eastAsia="zh-CN"/>
-        </w:rPr>
-        <w:t>。</w:t>
+        <w:keepNext w:val="0"/>
+        <w:keepLines w:val="0"/>
+        <w:widowControl w:val="0"/>
+        <w:spacing w:line="400" w:lineRule="exact" w:before="0" w:after="0"/>
+        <w:ind w:firstLine="480"/>
+        <w:jc w:val="both"/>
+      </w:pPr>
+      <w:r>
+        <w:rPr>
+          <w:rFonts w:ascii="宋体" w:hAnsi="宋体" w:eastAsia="宋体"/>
+          <w:sz w:val="24"/>
+        </w:rPr>
+        <w:t>从实际部署看，系统需要Java运行环境、MySQL数据库和可访问的模型服务。首次启动时先创建数据库，再执行建表脚本；旧库升级需要先备份，并按升级脚本扩大长文本字段。数据库账号可在建表后改为仅拥有本库数据读写权限的账号。登录凭证密钥和邮箱授权码通过运行环境配置，避免写入源代码。这样的部署步骤也决定了验收不能只看页面截图，还应从空库完成启动、注册、录题、解析和复习的完整流程。</w:t>
       </w:r>
     </w:p>
     <w:p>
       <w:pPr>
-        <w:pStyle w:val="1"/>
-        <w:spacing w:beforeLines="100" w:before="240" w:afterLines="100" w:after="240"/>
-        <w:rPr>
-          <w:rFonts w:hint="eastAsia"/>
-          <w:lang w:eastAsia="zh-CN"/>
-        </w:rPr>
-      </w:pPr>
-      <w:bookmarkStart w:id="5" w:name="_Toc243984170"/>
-      <w:r>
-        <w:rPr>
-          <w:lang w:eastAsia="zh-CN"/>
-        </w:rPr>
-        <w:t>6结论</w:t>
-      </w:r>
-      <w:bookmarkEnd w:id="5"/>
+        <w:keepNext w:val="0"/>
+        <w:keepLines w:val="0"/>
+        <w:widowControl w:val="0"/>
+        <w:spacing w:line="240" w:lineRule="auto"/>
+        <w:ind w:firstLine="482"/>
+        <w:jc w:val="both"/>
+        <w:rPr>
+          <w:rFonts w:ascii="宋体" w:hAnsi="宋体"/>
+          <w:lang w:eastAsia="zh-CN"/>
+        </w:rPr>
+      </w:pPr>
+      <w:r>
+        <w:rPr>
+          <w:rFonts w:ascii="宋体" w:hAnsi="宋体"/>
+          <w:lang w:eastAsia="zh-CN"/>
+        </w:rPr>
+        <w:t>为控制项目范围，系统主要面向个人错题管理和学习辅助。当前实现不应被描述为在线编译平台，也没有证据表明每段模型生成的修正代码都会由系统自动编译并运行。模型调用能否成功还受到本地模型服务运行状态、模型配置和请求限制等因素影响。特别是模型返回了格式正确的JSON，并不代表分析内容或代码一定正确。</w:t>
+      </w:r>
     </w:p>
     <w:p>
       <w:pPr>
-        <w:ind w:firstLine="482"/>
-        <w:rPr>
-          <w:rFonts w:hint="eastAsia"/>
-          <w:lang w:eastAsia="zh-CN"/>
-        </w:rPr>
-      </w:pPr>
-      <w:r>
-        <w:rPr>
-          <w:lang w:eastAsia="zh-CN"/>
-        </w:rPr>
-        <w:t>系统把原题材料、模型生成解释、人工判断和复习日期关联到同一条错题。账户归属检查、字段校验和调用限额使这些记录能够按用户保存和查看。个人学习者可沿同一条记录查看原始问题、核对模型建议并安排复习。</w:t>
+        <w:keepNext w:val="0"/>
+        <w:keepLines w:val="0"/>
+        <w:widowControl w:val="0"/>
+        <w:spacing w:before="200" w:after="100" w:line="288" w:lineRule="auto"/>
+        <w:rPr>
+          <w:lang w:eastAsia="zh-CN"/>
+        </w:rPr>
+      </w:pPr>
+      <w:r>
+        <w:rPr>
+          <w:rFonts w:ascii="宋体" w:hAnsi="宋体" w:cs="宋体"/>
+          <w:b/>
+          <w:sz w:val="28"/>
+          <w:lang w:eastAsia="zh-CN"/>
+        </w:rPr>
+        <w:t>三、系统设计</w:t>
       </w:r>
     </w:p>
     <w:p>
       <w:pPr>
-        <w:rPr>
-          <w:rFonts w:hint="eastAsia"/>
-          <w:lang w:eastAsia="zh-CN"/>
-        </w:rPr>
-        <w:sectPr>
-          <w:headerReference w:type="default" r:id="rId12"/>
-          <w:footerReference w:type="default" r:id="rId13"/>
-          <w:pgSz w:w="11906" w:h="16838"/>
-          <w:pgMar w:top="1417" w:right="1474" w:bottom="1417" w:left="1871" w:header="850" w:footer="850" w:gutter="0"/>
-          <w:pgNumType w:start="1"/>
-          <w:cols w:space="720"/>
-          <w:docGrid w:linePitch="360"/>
-        </w:sectPr>
-      </w:pPr>
+        <w:keepNext w:val="0"/>
+        <w:keepLines w:val="0"/>
+        <w:widowControl w:val="0"/>
+        <w:spacing w:before="120" w:after="60" w:line="288" w:lineRule="auto"/>
+        <w:rPr>
+          <w:lang w:eastAsia="zh-CN"/>
+        </w:rPr>
+      </w:pPr>
+      <w:r>
+        <w:rPr>
+          <w:rFonts w:ascii="宋体" w:hAnsi="宋体" w:cs="宋体"/>
+          <w:b/>
+          <w:lang w:eastAsia="zh-CN"/>
+        </w:rPr>
+        <w:t>（一）总体结构与处理流程</w:t>
+      </w:r>
     </w:p>
     <w:p>
       <w:pPr>
-        <w:pStyle w:val="1"/>
-        <w:spacing w:beforeLines="100" w:before="240" w:afterLines="100" w:after="240"/>
-        <w:rPr>
-          <w:rFonts w:hint="eastAsia"/>
-          <w:lang w:eastAsia="zh-CN"/>
-        </w:rPr>
-      </w:pPr>
-      <w:bookmarkStart w:id="6" w:name="_Toc243984171"/>
-      <w:r>
-        <w:rPr>
+        <w:keepNext w:val="0"/>
+        <w:keepLines w:val="0"/>
+        <w:widowControl w:val="0"/>
+        <w:spacing w:line="240" w:lineRule="auto"/>
+        <w:ind w:firstLine="482"/>
+        <w:jc w:val="both"/>
+        <w:rPr>
+          <w:rFonts w:ascii="宋体" w:hAnsi="宋体"/>
+          <w:lang w:eastAsia="zh-CN"/>
+        </w:rPr>
+      </w:pPr>
+      <w:r>
+        <w:rPr>
+          <w:rFonts w:ascii="宋体" w:hAnsi="宋体"/>
+          <w:lang w:eastAsia="zh-CN"/>
+        </w:rPr>
+        <w:t>系统由浏览器前端、Spring Boot服务端、MySQL数据库和模型服务组成。浏览器用于提交错题、显示解析结果和记录复习情况；服务端负责身份校验、请求参数检查、用户数据隔离、业务处理和模型调用；数据库保存用户、错题、解析、知识点和复习等信息；模型服务根据服务端整理的错题信息生成解析内容。Spring Boot官方文档介绍了该框架的应用配置与运行方式[12]。</w:t>
+      </w:r>
+    </w:p>
+    <w:p>
+      <w:pPr>
+        <w:keepNext w:val="0"/>
+        <w:keepLines w:val="0"/>
+        <w:widowControl w:val="0"/>
+        <w:spacing w:line="240" w:lineRule="auto"/>
+        <w:ind w:firstLine="482"/>
+        <w:jc w:val="both"/>
+        <w:rPr>
+          <w:rFonts w:ascii="宋体" w:hAnsi="宋体"/>
+          <w:lang w:eastAsia="zh-CN"/>
+        </w:rPr>
+      </w:pPr>
+      <w:r>
+        <w:rPr>
+          <w:rFonts w:ascii="宋体" w:hAnsi="宋体"/>
+          <w:lang w:eastAsia="zh-CN"/>
+        </w:rPr>
+        <w:t>典型处理流程为：用户登录后录入错题，前端将请求发送到服务端；服务端核对用户身份和输入内容，并检查该错题是否属于当前用户；之后服务端组合题目、代码、错误信息和输入输出等内容，发送至配置的模型服务；收到响应后，系统检查返回内容是否符合约定格式，并保存结构化结果和分析记录；最后，用户查看解析并决定是否提交反馈或安排复习。若模型调用失败或结果无法解析，系统记录相应状态，避免将失败请求伪装成成功结果。</w:t>
+      </w:r>
+    </w:p>
+    <w:p>
+      <w:pPr>
+        <w:keepNext w:val="0"/>
+        <w:keepLines w:val="0"/>
+        <w:widowControl w:val="0"/>
+        <w:spacing w:line="400" w:lineRule="exact" w:before="0" w:after="0"/>
+        <w:ind w:firstLine="480"/>
+        <w:jc w:val="both"/>
+      </w:pPr>
+      <w:r>
+        <w:rPr>
+          <w:rFonts w:ascii="宋体" w:hAnsi="宋体" w:eastAsia="宋体"/>
+          <w:sz w:val="24"/>
+        </w:rPr>
+        <w:t>对同一错题发起分析时，服务端先在数据库事务中确认用户归属与题目状态，再把状态设为分析中。分析期间的编辑和删除请求在数据库执行时检查状态，若状态已经改变则返回冲突提示。模型调用完成后，系统只更新分析状态，并在同一事务内保存解析结果、输入快照与知识点关联，避免使用调用模型前读到的旧题目对象覆盖用户的新数据。这一处理使“题目内容”和“本次解析所依据的内容”能够相互核对。</w:t>
+      </w:r>
+    </w:p>
+    <w:p>
+      <w:pPr>
+        <w:keepNext w:val="0"/>
+        <w:keepLines w:val="0"/>
+        <w:widowControl w:val="0"/>
+        <w:spacing w:line="400" w:lineRule="exact" w:before="0" w:after="0"/>
+        <w:ind w:firstLine="480"/>
+        <w:jc w:val="both"/>
+      </w:pPr>
+      <w:r>
+        <w:rPr>
+          <w:rFonts w:ascii="宋体" w:hAnsi="宋体" w:eastAsia="宋体"/>
+          <w:sz w:val="24"/>
+        </w:rPr>
+        <w:t>模型调用可能超时，也可能在进程被终止时来不及进入异常处理。当前系统按单实例运行设计：启动时检查遗留的分析中任务，将其转为失败状态并保存中断说明，用户随后可以重新提交。这个恢复方式仅适用于同一数据库只有一个应用实例的情况；如果多个实例同时运行，需要为任务增加归属和过期判断，否则一个实例启动时可能误把另一个实例仍在处理的任务标为失败。</w:t>
+      </w:r>
+    </w:p>
+    <w:p>
+      <w:pPr>
+        <w:keepNext w:val="0"/>
+        <w:keepLines w:val="0"/>
+        <w:widowControl w:val="0"/>
+        <w:spacing w:before="120" w:after="60" w:line="288" w:lineRule="auto"/>
+        <w:rPr>
+          <w:lang w:eastAsia="zh-CN"/>
+        </w:rPr>
+      </w:pPr>
+      <w:r>
+        <w:rPr>
+          <w:rFonts w:ascii="宋体" w:hAnsi="宋体" w:cs="宋体"/>
+          <w:b/>
+          <w:lang w:eastAsia="zh-CN"/>
+        </w:rPr>
+        <w:t>（二）数据结构设计</w:t>
+      </w:r>
+    </w:p>
+    <w:p>
+      <w:pPr>
+        <w:keepNext w:val="0"/>
+        <w:keepLines w:val="0"/>
+        <w:widowControl w:val="0"/>
+        <w:spacing w:line="240" w:lineRule="auto"/>
+        <w:ind w:firstLine="482"/>
+        <w:jc w:val="both"/>
+        <w:rPr>
+          <w:rFonts w:ascii="宋体" w:hAnsi="宋体"/>
+          <w:lang w:eastAsia="zh-CN"/>
+        </w:rPr>
+      </w:pPr>
+      <w:r>
+        <w:rPr>
+          <w:rFonts w:ascii="宋体" w:hAnsi="宋体"/>
+          <w:lang w:eastAsia="zh-CN"/>
+        </w:rPr>
+        <w:t>数据库包含11张表，分别用于保存用户、密码重置码、密码重置尝试、错题、人工智能解析、知识点、错题与知识点的关联、解析记录、错题复习状态、复习记录和解析反馈。错题表是核心业务表，解析表保存模型整理后的结果，解析记录表用于留存提示内容、原始响应和处理状态；知识点关联表支持错题与知识点之间的关联；复习记录表和反馈表分别保存用户复习过程和对解析结果的意见。</w:t>
+      </w:r>
+    </w:p>
+    <w:p>
+      <w:pPr>
+        <w:keepNext w:val="0"/>
+        <w:keepLines w:val="0"/>
+        <w:widowControl w:val="0"/>
+        <w:spacing w:line="400" w:lineRule="exact" w:before="0" w:after="0"/>
+        <w:ind w:firstLine="480"/>
+        <w:jc w:val="both"/>
+      </w:pPr>
+      <w:r>
+        <w:rPr>
+          <w:rFonts w:ascii="宋体" w:hAnsi="宋体" w:eastAsia="宋体"/>
+          <w:sz w:val="24"/>
+        </w:rPr>
+        <w:t>错题与解析采用一对多关系，用户重新分析时不会删除以前的结果。解析表保存每次返回的七项内容和对应的题目输入快照，便于比较不同版本的原因、建议与代码。用户修改代码、题意、语言、报错或输入输出后，旧结果不再作为当前有效结论显示，旧知识点关联也一并清除；只修改个人笔记则保留当前分析。这一规则比简单地“每次编辑都重新调用模型”更符合实际使用，也避免旧答案对应新题目。</w:t>
+      </w:r>
+    </w:p>
+    <w:p>
+      <w:pPr>
+        <w:keepNext w:val="0"/>
+        <w:keepLines w:val="0"/>
+        <w:widowControl w:val="0"/>
+        <w:spacing w:line="240" w:lineRule="auto"/>
+        <w:ind w:firstLine="482"/>
+        <w:jc w:val="both"/>
+        <w:rPr>
+          <w:rFonts w:ascii="宋体" w:hAnsi="宋体"/>
+          <w:lang w:eastAsia="zh-CN"/>
+        </w:rPr>
+      </w:pPr>
+      <w:r>
+        <w:rPr>
+          <w:rFonts w:ascii="宋体" w:hAnsi="宋体"/>
+          <w:lang w:eastAsia="zh-CN"/>
+        </w:rPr>
+        <w:t>这种设计将用户输入、模型输出和后续学习记录分开保存，便于按业务用途查询，也有利于追踪某次解析如何产生。但数据库中存在这些表，并不自动证明系统具有完整的教学效果；它只提供记录和管理数据的结构基础。</w:t>
+      </w:r>
+    </w:p>
+    <w:p>
+      <w:pPr>
+        <w:keepNext w:val="0"/>
+        <w:keepLines w:val="0"/>
+        <w:widowControl w:val="0"/>
+        <w:spacing w:before="120" w:after="60" w:line="288" w:lineRule="auto"/>
+        <w:rPr>
+          <w:lang w:eastAsia="zh-CN"/>
+        </w:rPr>
+      </w:pPr>
+      <w:r>
+        <w:rPr>
+          <w:rFonts w:ascii="宋体" w:hAnsi="宋体" w:cs="宋体"/>
+          <w:b/>
+          <w:lang w:eastAsia="zh-CN"/>
+        </w:rPr>
+        <w:t>（三）智能解析结果设计</w:t>
+      </w:r>
+    </w:p>
+    <w:p>
+      <w:pPr>
+        <w:keepNext w:val="0"/>
+        <w:keepLines w:val="0"/>
+        <w:widowControl w:val="0"/>
+        <w:spacing w:line="240" w:lineRule="auto"/>
+        <w:ind w:firstLine="482"/>
+        <w:jc w:val="both"/>
+        <w:rPr>
+          <w:rFonts w:ascii="宋体" w:hAnsi="宋体"/>
+          <w:lang w:eastAsia="zh-CN"/>
+        </w:rPr>
+      </w:pPr>
+      <w:r>
+        <w:rPr>
+          <w:rFonts w:ascii="宋体" w:hAnsi="宋体"/>
+          <w:lang w:eastAsia="zh-CN"/>
+        </w:rPr>
+        <w:t>系统要求模型返回七个字段：错误类型、错误位置、错误原因、修改建议、修正代码、知识点和学习建议。服务端检查结果是否为JSON对象、必需字段是否存在、字段内容是否为空，并对知识点数量和文本长度作限制。该检查解决的是“输出能否被系统读取”和“约定字段是否齐全”的问题，不能判断错误原因是否符合标准答案，也不能判断修正代码是否可以编译通过。</w:t>
+      </w:r>
+    </w:p>
+    <w:p>
+      <w:pPr>
+        <w:keepNext w:val="0"/>
+        <w:keepLines w:val="0"/>
+        <w:widowControl w:val="0"/>
+        <w:spacing w:line="240" w:lineRule="auto"/>
+        <w:ind w:firstLine="482"/>
+        <w:jc w:val="both"/>
+        <w:rPr>
+          <w:rFonts w:ascii="宋体" w:hAnsi="宋体"/>
+          <w:lang w:eastAsia="zh-CN"/>
+        </w:rPr>
+      </w:pPr>
+      <w:r>
+        <w:rPr>
+          <w:rFonts w:ascii="宋体" w:hAnsi="宋体"/>
+          <w:lang w:eastAsia="zh-CN"/>
+        </w:rPr>
+        <w:t>模型服务配置中的温度参数为0.2，用于控制模型生成时的变化程度。这个数值不是解析正确率，也不表示回答有20%的随机性。即使参数保持不变，同一题目的回</w:t>
+      </w:r>
+      <w:r>
+        <w:rPr>
+          <w:rFonts w:ascii="宋体" w:hAnsi="宋体"/>
+          <w:lang w:eastAsia="zh-CN"/>
+        </w:rPr>
+        <w:lastRenderedPageBreak/>
+        <w:t>答仍可能受到模型版本、提示内容和输入上下文等因素影响，因此需要保存结果并安排人工判断。</w:t>
+      </w:r>
+    </w:p>
+    <w:p>
+      <w:pPr>
+        <w:keepNext w:val="0"/>
+        <w:keepLines w:val="0"/>
+        <w:widowControl w:val="0"/>
+        <w:spacing w:before="120" w:after="60" w:line="288" w:lineRule="auto"/>
+        <w:rPr>
+          <w:lang w:eastAsia="zh-CN"/>
+        </w:rPr>
+      </w:pPr>
+      <w:r>
+        <w:rPr>
+          <w:rFonts w:ascii="宋体" w:hAnsi="宋体" w:cs="宋体"/>
+          <w:b/>
+          <w:lang w:eastAsia="zh-CN"/>
+        </w:rPr>
+        <w:t>（四）复习机制设计</w:t>
+      </w:r>
+    </w:p>
+    <w:p>
+      <w:pPr>
+        <w:keepNext w:val="0"/>
+        <w:keepLines w:val="0"/>
+        <w:widowControl w:val="0"/>
+        <w:spacing w:line="240" w:lineRule="auto"/>
+        <w:ind w:firstLine="482"/>
+        <w:jc w:val="both"/>
+        <w:rPr>
+          <w:rFonts w:ascii="宋体" w:hAnsi="宋体"/>
+          <w:lang w:eastAsia="zh-CN"/>
+        </w:rPr>
+      </w:pPr>
+      <w:r>
+        <w:rPr>
+          <w:rFonts w:ascii="宋体" w:hAnsi="宋体"/>
+          <w:lang w:eastAsia="zh-CN"/>
+        </w:rPr>
+        <w:t>复习功能根据用户对错题的记忆情况更新下一次复习时间。系统设置了1、3、7、14和30天等间隔；用户表示记得时，连续记忆次数增加，并根据规则延长间隔；用户表示忘记时，连续次数重置，下一次复习间隔缩短。该功能的设计意图是帮助用户持续回顾错题，但当前的间隔规则不应表述为经过本项目学习实验验证的最佳方案。</w:t>
+      </w:r>
+    </w:p>
+    <w:p>
+      <w:pPr>
+        <w:keepNext w:val="0"/>
+        <w:keepLines w:val="0"/>
+        <w:widowControl w:val="0"/>
+        <w:spacing w:line="400" w:lineRule="exact" w:before="0" w:after="0"/>
+        <w:ind w:firstLine="480"/>
+        <w:jc w:val="both"/>
+      </w:pPr>
+      <w:r>
+        <w:rPr>
+          <w:rFonts w:ascii="宋体" w:hAnsi="宋体" w:eastAsia="宋体"/>
+          <w:sz w:val="24"/>
+        </w:rPr>
+        <w:t>复习间隔由程序中的固定规则计算，输入是用户本次选择“已经记住”还是“还需练习”，输出是下次回顾时间。系统还保存本次备注，便于用户把“看懂了解析”和“能够独立重写代码”区分开。统计页面展示错题总数、已分析数和待复习数，统计含义必须与数据库查询一致；这些数量反映使用情况，不能代替学习成效测量。若要证明学习提升，还需要前后测或其他独立评价设计。</w:t>
+      </w:r>
+    </w:p>
+    <w:p>
+      <w:pPr>
+        <w:keepNext w:val="0"/>
+        <w:keepLines w:val="0"/>
+        <w:widowControl w:val="0"/>
+        <w:spacing w:before="200" w:after="100" w:line="288" w:lineRule="auto"/>
+        <w:rPr>
+          <w:lang w:eastAsia="zh-CN"/>
+        </w:rPr>
+      </w:pPr>
+      <w:r>
+        <w:rPr>
+          <w:rFonts w:ascii="宋体" w:hAnsi="宋体" w:cs="宋体"/>
+          <w:b/>
+          <w:sz w:val="28"/>
+          <w:lang w:eastAsia="zh-CN"/>
+        </w:rPr>
+        <w:t>四、系统实现</w:t>
+      </w:r>
+    </w:p>
+    <w:p>
+      <w:pPr>
+        <w:keepNext w:val="0"/>
+        <w:keepLines w:val="0"/>
+        <w:widowControl w:val="0"/>
+        <w:spacing w:before="120" w:after="60" w:line="288" w:lineRule="auto"/>
+        <w:rPr>
+          <w:lang w:eastAsia="zh-CN"/>
+        </w:rPr>
+      </w:pPr>
+      <w:r>
+        <w:rPr>
+          <w:rFonts w:ascii="宋体" w:hAnsi="宋体" w:cs="宋体"/>
+          <w:b/>
+          <w:lang w:eastAsia="zh-CN"/>
+        </w:rPr>
+        <w:t>（一）前端与接口实现</w:t>
+      </w:r>
+    </w:p>
+    <w:p>
+      <w:pPr>
+        <w:keepNext w:val="0"/>
+        <w:keepLines w:val="0"/>
+        <w:widowControl w:val="0"/>
+        <w:spacing w:line="240" w:lineRule="auto"/>
+        <w:ind w:firstLine="482"/>
+        <w:jc w:val="both"/>
+        <w:rPr>
+          <w:rFonts w:ascii="宋体" w:hAnsi="宋体"/>
+          <w:lang w:eastAsia="zh-CN"/>
+        </w:rPr>
+      </w:pPr>
+      <w:r>
+        <w:rPr>
+          <w:rFonts w:ascii="宋体" w:hAnsi="宋体"/>
+          <w:lang w:eastAsia="zh-CN"/>
+        </w:rPr>
+        <w:t>前端由HTML、CSS和JavaScript构成，负责展示登录、错题列表、错题编辑、解析结果、复习和统计等页面。页面通过HTTP请求调用后端接口，服务端完成身份校验和业务处理后返回数据。前端显示解析结果时，将七个字段按固定位置呈现，帮助用户区分原因、建议和修正代码，而不是把模型生成的一整段文字直接作为不可检查的答案展示。</w:t>
+      </w:r>
+    </w:p>
+    <w:p>
+      <w:pPr>
+        <w:keepNext w:val="0"/>
+        <w:keepLines w:val="0"/>
+        <w:widowControl w:val="0"/>
+        <w:spacing w:line="400" w:lineRule="exact" w:before="0" w:after="0"/>
+        <w:ind w:firstLine="480"/>
+        <w:jc w:val="both"/>
+      </w:pPr>
+      <w:r>
+        <w:rPr>
+          <w:rFonts w:ascii="宋体" w:hAnsi="宋体" w:eastAsia="宋体"/>
+          <w:sz w:val="24"/>
+        </w:rPr>
+        <w:t>错题列表把关键词、编程语言、完整错误类型和分析状态放在同一筛选区域，翻页时继续保留当前条件。错误类型由模型文本生成，目前采用完整名称匹配，因此页面明确提示输入分析结果中的名称。历史页可展开每次解析的原因、修改建议、参考代码与原题快照；失败记录页只显示可公开的时间与简短说明，不把原始模型响应或内部异常信息展示给普通用户。这些页面入口使已有后端能力能够被实际使用。</w:t>
+      </w:r>
+    </w:p>
+    <w:p>
+      <w:pPr>
+        <w:keepNext w:val="0"/>
+        <w:keepLines w:val="0"/>
+        <w:widowControl w:val="0"/>
+        <w:spacing w:before="120" w:after="60" w:line="288" w:lineRule="auto"/>
+        <w:rPr>
+          <w:lang w:eastAsia="zh-CN"/>
+        </w:rPr>
+      </w:pPr>
+      <w:r>
+        <w:rPr>
+          <w:rFonts w:ascii="宋体" w:hAnsi="宋体" w:cs="宋体"/>
+          <w:b/>
+          <w:lang w:eastAsia="zh-CN"/>
+        </w:rPr>
+        <w:t>（二）业务与权限实现</w:t>
+      </w:r>
+    </w:p>
+    <w:p>
+      <w:pPr>
+        <w:keepNext w:val="0"/>
+        <w:keepLines w:val="0"/>
+        <w:widowControl w:val="0"/>
+        <w:spacing w:line="240" w:lineRule="auto"/>
+        <w:ind w:firstLine="482"/>
+        <w:jc w:val="both"/>
+        <w:rPr>
+          <w:rFonts w:ascii="宋体" w:hAnsi="宋体"/>
+          <w:lang w:eastAsia="zh-CN"/>
+        </w:rPr>
+      </w:pPr>
+      <w:r>
+        <w:rPr>
+          <w:rFonts w:ascii="宋体" w:hAnsi="宋体"/>
+          <w:lang w:eastAsia="zh-CN"/>
+        </w:rPr>
+        <w:t>后端将接口接收、业务处理和数据库访问分开组织。业务处理过程中，系统检查请求数据是否有效，并核对用户对目标错题的操作权限。错题查询、解析和复习等操作都需要关联当前登录用户，以减少越权访问风险。系统还对模型请求设置每日调用限制和并发限制，控制服务资源占用。</w:t>
+      </w:r>
+    </w:p>
+    <w:p>
+      <w:pPr>
+        <w:keepNext w:val="0"/>
+        <w:keepLines w:val="0"/>
+        <w:widowControl w:val="0"/>
+        <w:spacing w:line="400" w:lineRule="exact" w:before="0" w:after="0"/>
+        <w:ind w:firstLine="480"/>
+        <w:jc w:val="both"/>
+      </w:pPr>
+      <w:r>
+        <w:rPr>
+          <w:rFonts w:ascii="宋体" w:hAnsi="宋体" w:eastAsia="宋体"/>
+          <w:sz w:val="24"/>
+        </w:rPr>
+        <w:t>页面上的“查看”“修改”“删除”“重新分析”分别对应不同接口，但权限检查不能仅依赖按钮是否出现。服务端对错题详情、分析历史、失败记录与复习历史都先核对当前登录用户是否拥有该题。分页查询也按用户编号限定范围。复习记录在写入前检查题目归属和到期时间：未到下次复习时间的重复提交返回冲突，避免连续点击按钮把复习次数虚增。页面提供复习备注和历史入口，用户能回看当时是否真正理解了错误。</w:t>
+      </w:r>
+    </w:p>
+    <w:p>
+      <w:pPr>
+        <w:keepNext w:val="0"/>
+        <w:keepLines w:val="0"/>
+        <w:widowControl w:val="0"/>
+        <w:spacing w:line="240" w:lineRule="auto"/>
+        <w:ind w:firstLine="482"/>
+        <w:jc w:val="both"/>
+        <w:rPr>
+          <w:rFonts w:ascii="宋体" w:hAnsi="宋体"/>
+          <w:lang w:eastAsia="zh-CN"/>
+        </w:rPr>
+      </w:pPr>
+      <w:r>
+        <w:rPr>
+          <w:rFonts w:ascii="宋体" w:hAnsi="宋体"/>
+          <w:lang w:eastAsia="zh-CN"/>
+        </w:rPr>
+        <w:t>解析服务在收到请求后先确认错题状态和归属，再生成提示内容并调用模型。结果解析成功时，服务端保存结构化解析及知识点关联；解析失败时则保留失败记录和状态，供后续排查。人工反馈由用户对解析选择“准确”“不准确”或“无法判断”，并可补充文字意见。这些反馈能够作为后续检查的线索，但不能直接替代按统一标准进行的模型评测。</w:t>
+      </w:r>
+    </w:p>
+    <w:p>
+      <w:pPr>
+        <w:keepNext w:val="0"/>
+        <w:keepLines w:val="0"/>
+        <w:widowControl w:val="0"/>
+        <w:spacing w:before="120" w:after="60" w:line="288" w:lineRule="auto"/>
+        <w:rPr>
+          <w:lang w:eastAsia="zh-CN"/>
+        </w:rPr>
+      </w:pPr>
+      <w:r>
+        <w:rPr>
+          <w:rFonts w:ascii="宋体" w:hAnsi="宋体" w:cs="宋体"/>
+          <w:b/>
+          <w:lang w:eastAsia="zh-CN"/>
+        </w:rPr>
+        <w:t>（三）模型调用与结果检查实现</w:t>
+      </w:r>
+    </w:p>
+    <w:p>
+      <w:pPr>
+        <w:keepNext w:val="0"/>
+        <w:keepLines w:val="0"/>
+        <w:widowControl w:val="0"/>
+        <w:spacing w:line="240" w:lineRule="auto"/>
+        <w:ind w:firstLine="482"/>
+        <w:jc w:val="both"/>
+        <w:rPr>
+          <w:rFonts w:ascii="宋体" w:hAnsi="宋体"/>
+          <w:lang w:eastAsia="zh-CN"/>
+        </w:rPr>
+      </w:pPr>
+      <w:r>
+        <w:rPr>
+          <w:rFonts w:ascii="宋体" w:hAnsi="宋体"/>
+          <w:lang w:eastAsia="zh-CN"/>
+        </w:rPr>
+        <w:t>系统通过与OpenAI兼容的接口格式调用本地Ollama模型服务，项目默认配置使用qwen3:8b。提示内容包含编程语言、题目描述、用户代码、错误信息和实际输出、预期输出等上下文，并要求模型按七字段返回结果。提示还要求模型在信息不足时说明不确定性，避免把缺少证据的推断写成确定结论。</w:t>
+      </w:r>
+    </w:p>
+    <w:p>
+      <w:pPr>
+        <w:keepNext w:val="0"/>
+        <w:keepLines w:val="0"/>
+        <w:widowControl w:val="0"/>
+        <w:spacing w:line="400" w:lineRule="exact" w:before="0" w:after="0"/>
+        <w:ind w:firstLine="480"/>
+        <w:jc w:val="both"/>
+      </w:pPr>
+      <w:r>
+        <w:rPr>
+          <w:rFonts w:ascii="宋体" w:hAnsi="宋体" w:eastAsia="宋体"/>
+          <w:sz w:val="24"/>
+        </w:rPr>
+        <w:t>结果检查分为三层。第一层是接口是否正常返回，超时和服务不可用应单独记录；第二层是七字段的结构检查，系统核对文本非空、知识点数量为1至6项，以及各字段长度；第三层是内容判断，需要把错误位置和原因与标准答案对照，并将修正代码置于隔离环境离线编译和运行对应测试。当前程序只实现了前两层的自动处理，第三层属于实验评估与人工复核，不能把页面出现一段修正代码写成“已经验证正确”。</w:t>
+      </w:r>
+    </w:p>
+    <w:p>
+      <w:pPr>
+        <w:keepNext w:val="0"/>
+        <w:keepLines w:val="0"/>
+        <w:widowControl w:val="0"/>
+        <w:spacing w:line="240" w:lineRule="auto"/>
+        <w:ind w:firstLine="482"/>
+        <w:jc w:val="both"/>
+        <w:rPr>
+          <w:rFonts w:ascii="宋体" w:hAnsi="宋体"/>
+          <w:lang w:eastAsia="zh-CN"/>
+        </w:rPr>
+      </w:pPr>
+      <w:r>
+        <w:rPr>
+          <w:rFonts w:ascii="宋体" w:hAnsi="宋体"/>
+          <w:lang w:eastAsia="zh-CN"/>
+        </w:rPr>
+        <w:t>服务端对模型调用设置超时和有限重试，并检查JSON格式和字段完整性。JSON解析成功只说明返回内容符合结构约定，不能证明技术判断正确。</w:t>
+      </w:r>
+      <w:proofErr w:type="spellStart"/>
+      <w:r>
+        <w:rPr>
+          <w:rFonts w:ascii="宋体" w:hAnsi="宋体"/>
+          <w:lang w:eastAsia="zh-CN"/>
+        </w:rPr>
+        <w:t>Monperrus</w:t>
+      </w:r>
+      <w:proofErr w:type="spellEnd"/>
+      <w:r>
+        <w:rPr>
+          <w:rFonts w:ascii="宋体" w:hAnsi="宋体"/>
+          <w:lang w:eastAsia="zh-CN"/>
+        </w:rPr>
+        <w:t>的综述指出，判断自动修复是否有效，需要测试用例或程序应满足的条件等依据[15]。已有自调试研究尝试将程序执行结果反馈给模型，促使模型解释并修正生成代码[16]。本系统尚未实现自动编译、执行和反馈闭环，因此修正代码仍需按题目标准输入、标准输出和测试用例离线验证。</w:t>
+      </w:r>
+    </w:p>
+    <w:p>
+      <w:pPr>
+        <w:keepNext w:val="0"/>
+        <w:keepLines w:val="0"/>
+        <w:widowControl w:val="0"/>
+        <w:spacing w:before="200" w:after="100" w:line="288" w:lineRule="auto"/>
+        <w:rPr>
+          <w:lang w:eastAsia="zh-CN"/>
+        </w:rPr>
+      </w:pPr>
+      <w:r>
+        <w:t>五、结果与讨论</w:t>
+      </w:r>
+    </w:p>
+    <w:p>
+      <w:pPr>
+        <w:keepNext w:val="0"/>
+        <w:keepLines w:val="0"/>
+        <w:widowControl w:val="0"/>
+        <w:spacing w:line="240" w:lineRule="auto"/>
+        <w:ind w:firstLine="482"/>
+        <w:jc w:val="both"/>
+        <w:rPr>
+          <w:rFonts w:ascii="宋体" w:hAnsi="宋体"/>
+          <w:lang w:eastAsia="zh-CN"/>
+        </w:rPr>
+      </w:pPr>
+      <w:r>
+        <w:t>2026年10月29日重新运行Maven测试，11个测试类共26个测试用例通过，失败、错误和跳过均为0。新增测试覆盖错题编辑时旧结果失效、仅修改笔记时保留结果、分析期间的冲突返回、解析字段检查以及复习权限和到期限制。这些自动测试主要验证局部处理逻辑，不能替代真实MySQL环境中的接口与页面操作。</w:t>
+      </w:r>
+    </w:p>
+    <w:p>
+      <w:pPr>
+        <w:keepNext w:val="0"/>
+        <w:keepLines w:val="0"/>
+        <w:widowControl w:val="0"/>
+        <w:spacing w:line="400" w:lineRule="exact" w:before="0" w:after="0"/>
+        <w:ind w:firstLine="480"/>
+        <w:jc w:val="both"/>
+      </w:pPr>
+      <w:r>
+        <w:rPr>
+          <w:rFonts w:ascii="宋体" w:hAnsi="宋体" w:eastAsia="宋体"/>
+          <w:sz w:val="24"/>
+        </w:rPr>
+        <w:t>同日使用独立验收库进行接口检查：一组13个请求、34条断言验证错题首次解析、修改笔记、修改代码、旧结果留存及重新分析；另一组8个请求、20条断言验证101道错题的分页、复习备注和重复提交限制；14个请求、32条断言覆盖长中文保存、输入上限、失败记录安全字段与双账号隔离。并发验收中，分析进行时修改和删除均得到409响应。上述验收使用测试模型响应，证明的是业务流程与数据处理，不是本地模型给出解释的正确率。</w:t>
+      </w:r>
+    </w:p>
+    <w:p>
+      <w:pPr>
+        <w:keepNext w:val="0"/>
+        <w:keepLines w:val="0"/>
+        <w:widowControl w:val="0"/>
+        <w:spacing w:line="240" w:lineRule="auto"/>
+        <w:ind w:firstLine="482"/>
+        <w:jc w:val="both"/>
+        <w:rPr>
+          <w:rFonts w:ascii="宋体" w:hAnsi="宋体"/>
+          <w:lang w:eastAsia="zh-CN"/>
+        </w:rPr>
+      </w:pPr>
+      <w:r>
+        <w:t>现有实验文件含150条可追溯的Java候选案例及空白人工评分表。它们用于筛选正式样本和准备评分流程，不能据此报告解析准确率或学习成绩提升。</w:t>
+      </w:r>
+    </w:p>
+    <w:p>
+      <w:pPr>
+        <w:keepNext w:val="0"/>
+        <w:keepLines w:val="0"/>
+        <w:widowControl w:val="0"/>
+        <w:spacing w:line="400" w:lineRule="exact" w:before="0" w:after="0"/>
+        <w:ind w:firstLine="480"/>
+        <w:jc w:val="both"/>
+      </w:pPr>
+      <w:r>
+        <w:rPr>
+          <w:rFonts w:ascii="宋体" w:hAnsi="宋体" w:eastAsia="宋体"/>
+          <w:sz w:val="24"/>
+        </w:rPr>
+        <w:t>正式对照方案固定30道Java错题，其中编译错误、运行错误和逻辑错误各10道。每题先准备题意、错误代码、现象、预期结果、参考修正代码和可执行测试，再由人工核实资料。实验设置四组逐步增加题目信息的结构化提示和一组普通提示；每种条件重复两次，完整运行应产生300次请求记录。运行顺序随机打乱，模型名称、温度0.2、提示版本、耗时、失败情况和原始响应同时保存。现有30条公开候选只通过编译预检查，尚未完成另外两类题目的标准答案与人工核实，因此不能把它们当作正式样本。</w:t>
+      </w:r>
+    </w:p>
+    <w:p>
+      <w:pPr>
+        <w:keepNext w:val="0"/>
+        <w:keepLines w:val="0"/>
+        <w:widowControl w:val="0"/>
+        <w:spacing w:line="240" w:lineRule="auto"/>
+        <w:ind w:firstLine="482"/>
+        <w:jc w:val="both"/>
+        <w:rPr>
+          <w:rFonts w:ascii="宋体" w:hAnsi="宋体"/>
+          <w:lang w:eastAsia="zh-CN"/>
+        </w:rPr>
+      </w:pPr>
+      <w:r>
+        <w:t>研究效果的最终判断仍取决于按标准答案进行的独立评分和离线测试。现阶段不提供尚未测得的准确率。</w:t>
+      </w:r>
+    </w:p>
+    <w:p>
+      <w:pPr>
+        <w:keepNext w:val="0"/>
+        <w:keepLines w:val="0"/>
+        <w:widowControl w:val="0"/>
+        <w:spacing w:line="400" w:lineRule="exact" w:before="0" w:after="0"/>
+        <w:ind w:firstLine="480"/>
+        <w:jc w:val="both"/>
+      </w:pPr>
+      <w:r>
+        <w:rPr>
+          <w:rFonts w:ascii="宋体" w:hAnsi="宋体" w:eastAsia="宋体"/>
+          <w:sz w:val="24"/>
+        </w:rPr>
+        <w:t>两名评分者分别查看去掉提示条件标识的模型输出，独立判断原因、修改建议、知识点和修正代码的结果。每项按0或1记录，不能确定时留空并说明。汇总时先给出两人都评分的数量、判断相同的数量和一致率，再列出具体分歧；复核分歧时记录最终结论及依据。对于模型请求失败，应单列失败次数；对于字段完整度，应按七项是否有效分别记录。只有评分、离线测试和分歧复核完成后，才能计算各条件下的内容正确比例。</w:t>
+      </w:r>
+    </w:p>
+    <w:p>
+      <w:pPr>
+        <w:keepNext w:val="0"/>
+        <w:keepLines w:val="0"/>
+        <w:pageBreakBefore w:val="0"/>
+        <w:widowControl w:val="0"/>
+        <w:spacing w:before="200" w:after="100" w:line="288" w:lineRule="auto"/>
+        <w:rPr>
+          <w:lang w:eastAsia="zh-CN"/>
+        </w:rPr>
+      </w:pPr>
+      <w:r>
+        <w:rPr>
+          <w:rFonts w:ascii="宋体" w:hAnsi="宋体" w:cs="宋体"/>
+          <w:b/>
+          <w:sz w:val="28"/>
+          <w:lang w:eastAsia="zh-CN"/>
+        </w:rPr>
+        <w:lastRenderedPageBreak/>
+        <w:t>六、结论</w:t>
+      </w:r>
+    </w:p>
+    <w:p>
+      <w:pPr>
+        <w:keepNext w:val="0"/>
+        <w:keepLines w:val="0"/>
+        <w:widowControl w:val="0"/>
+        <w:spacing w:line="240" w:lineRule="auto"/>
+        <w:ind w:firstLine="482"/>
+        <w:jc w:val="both"/>
+        <w:rPr>
+          <w:rFonts w:ascii="宋体" w:hAnsi="宋体"/>
+          <w:lang w:eastAsia="zh-CN"/>
+        </w:rPr>
+      </w:pPr>
+      <w:r>
+        <w:rPr>
+          <w:rFonts w:ascii="宋体" w:hAnsi="宋体"/>
+          <w:lang w:eastAsia="zh-CN"/>
+        </w:rPr>
+        <w:t>本文围绕个人编程错题的记录、分析和复习需求，设计并实现了一套基于Spring Boot的智能解析助手系统。系统将浏览器页面、后端业务、MySQL数据存储和本地模型调用连接起来，支持错题管理、七字段结构化解析、解析历史、个人反馈、知识点关联和复习记录。现有单元测试报告为部分业务逻辑提供了验证依据。</w:t>
+      </w:r>
+    </w:p>
+    <w:p>
+      <w:pPr>
+        <w:keepNext w:val="0"/>
+        <w:keepLines w:val="0"/>
+        <w:widowControl w:val="0"/>
+        <w:spacing w:line="240" w:lineRule="auto"/>
+        <w:ind w:firstLine="482"/>
+        <w:jc w:val="both"/>
+        <w:rPr>
+          <w:rFonts w:ascii="宋体" w:hAnsi="宋体"/>
+          <w:lang w:eastAsia="zh-CN"/>
+        </w:rPr>
+      </w:pPr>
+      <w:r>
+        <w:rPr>
+          <w:rFonts w:ascii="宋体" w:hAnsi="宋体"/>
+          <w:lang w:eastAsia="zh-CN"/>
+        </w:rPr>
+        <w:t>本系统的主要价值在于把错题与模型分析、人工反馈和后续复习放在同一流程中，便于学习者查看和整理问题。当前证据尚不足以证明模型分析结果总体准确，也没有完成双人评分和代码离线验证实验。下一步应先完成候选案例的标准答案核对和两名评分者独立评分，再报告一致率、七字段完整度、原因判断情况以及修正代码编译和测试结果。只有在获得这些数据后，才能进一步讨论结构化提示是否改善了解析质量。</w:t>
+      </w:r>
+    </w:p>
+    <w:p>
+      <w:pPr>
+        <w:keepNext w:val="0"/>
+        <w:keepLines w:val="0"/>
+        <w:pageBreakBefore/>
+        <w:widowControl w:val="0"/>
+        <w:spacing w:beforeLines="100" w:before="240" w:afterLines="100" w:after="240" w:line="240" w:lineRule="auto"/>
+        <w:jc w:val="center"/>
+        <w:rPr>
+          <w:lang w:eastAsia="zh-CN"/>
+        </w:rPr>
+      </w:pPr>
+      <w:r>
+        <w:rPr>
+          <w:rFonts w:ascii="黑体" w:eastAsia="黑体" w:hAnsi="黑体" w:cs="宋体"/>
+          <w:b/>
+          <w:sz w:val="30"/>
           <w:lang w:eastAsia="zh-CN"/>
         </w:rPr>
         <w:lastRenderedPageBreak/>
         <w:t>参考文献</w:t>
       </w:r>
-      <w:bookmarkEnd w:id="6"/>
     </w:p>
     <w:p>
       <w:pPr>
-        <w:pStyle w:val="affd"/>
-        <w:rPr>
-          <w:rFonts w:hint="eastAsia"/>
-          <w:lang w:eastAsia="zh-CN"/>
-        </w:rPr>
-      </w:pPr>
-      <w:r>
-        <w:rPr>
+        <w:keepNext w:val="0"/>
+        <w:keepLines w:val="0"/>
+        <w:widowControl w:val="0"/>
+        <w:spacing w:after="0" w:line="400" w:lineRule="exact"/>
+        <w:jc w:val="both"/>
+        <w:rPr>
+          <w:lang w:eastAsia="zh-CN"/>
+        </w:rPr>
+      </w:pPr>
+      <w:r>
+        <w:rPr>
+          <w:rFonts w:ascii="宋体" w:hAnsi="宋体"/>
+          <w:sz w:val="21"/>
           <w:lang w:eastAsia="zh-CN"/>
         </w:rPr>
         <w:t>[1]</w:t>
@@ -840,13 +1660,17 @@
       <w:proofErr w:type="gramStart"/>
       <w:r>
         <w:rPr>
-          <w:lang w:eastAsia="zh-CN"/>
-        </w:rPr>
-        <w:t>唐琳,</w:t>
+          <w:rFonts w:ascii="宋体" w:hAnsi="宋体"/>
+          <w:sz w:val="21"/>
+          <w:lang w:eastAsia="zh-CN"/>
+        </w:rPr>
+        <w:t>王帅,</w:t>
       </w:r>
       <w:proofErr w:type="gramEnd"/>
       <w:r>
         <w:rPr>
+          <w:rFonts w:ascii="宋体" w:hAnsi="宋体"/>
+          <w:sz w:val="21"/>
           <w:lang w:eastAsia="zh-CN"/>
         </w:rPr>
         <w:t xml:space="preserve"> </w:t>
@@ -854,13 +1678,17 @@
       <w:proofErr w:type="gramStart"/>
       <w:r>
         <w:rPr>
-          <w:lang w:eastAsia="zh-CN"/>
-        </w:rPr>
-        <w:t>张佳鑫,</w:t>
+          <w:rFonts w:ascii="宋体" w:hAnsi="宋体"/>
+          <w:sz w:val="21"/>
+          <w:lang w:eastAsia="zh-CN"/>
+        </w:rPr>
+        <w:t>杨大智,</w:t>
       </w:r>
       <w:proofErr w:type="gramEnd"/>
       <w:r>
         <w:rPr>
+          <w:rFonts w:ascii="宋体" w:hAnsi="宋体"/>
+          <w:sz w:val="21"/>
           <w:lang w:eastAsia="zh-CN"/>
         </w:rPr>
         <w:t xml:space="preserve"> </w:t>
@@ -868,20 +1696,98 @@
       <w:proofErr w:type="gramStart"/>
       <w:r>
         <w:rPr>
-          <w:lang w:eastAsia="zh-CN"/>
-        </w:rPr>
-        <w:t>徐照光.</w:t>
+          <w:rFonts w:ascii="宋体" w:hAnsi="宋体"/>
+          <w:sz w:val="21"/>
+          <w:lang w:eastAsia="zh-CN"/>
+        </w:rPr>
+        <w:t>盛浩,</w:t>
       </w:r>
       <w:proofErr w:type="gramEnd"/>
       <w:r>
         <w:rPr>
-          <w:lang w:eastAsia="zh-CN"/>
-        </w:rPr>
-        <w:t xml:space="preserve"> 大语言模型在计算机编程实践课程教学中的应用[J]. 计算机</w:t>
+          <w:rFonts w:ascii="宋体" w:hAnsi="宋体"/>
+          <w:sz w:val="21"/>
+          <w:lang w:eastAsia="zh-CN"/>
+        </w:rPr>
+        <w:t xml:space="preserve"> 杜</w:t>
       </w:r>
       <w:proofErr w:type="gramStart"/>
       <w:r>
         <w:rPr>
+          <w:rFonts w:ascii="宋体" w:hAnsi="宋体"/>
+          <w:sz w:val="21"/>
+          <w:lang w:eastAsia="zh-CN"/>
+        </w:rPr>
+        <w:t>鹏程,</w:t>
+      </w:r>
+      <w:proofErr w:type="gramEnd"/>
+      <w:r>
+        <w:rPr>
+          <w:rFonts w:ascii="宋体" w:hAnsi="宋体"/>
+          <w:sz w:val="21"/>
+          <w:lang w:eastAsia="zh-CN"/>
+        </w:rPr>
+        <w:t xml:space="preserve"> </w:t>
+      </w:r>
+      <w:proofErr w:type="gramStart"/>
+      <w:r>
+        <w:rPr>
+          <w:rFonts w:ascii="宋体" w:hAnsi="宋体"/>
+          <w:sz w:val="21"/>
+          <w:lang w:eastAsia="zh-CN"/>
+        </w:rPr>
+        <w:t>李莹,</w:t>
+      </w:r>
+      <w:proofErr w:type="gramEnd"/>
+      <w:r>
+        <w:rPr>
+          <w:rFonts w:ascii="宋体" w:hAnsi="宋体"/>
+          <w:sz w:val="21"/>
+          <w:lang w:eastAsia="zh-CN"/>
+        </w:rPr>
+        <w:t xml:space="preserve"> </w:t>
+      </w:r>
+      <w:proofErr w:type="gramStart"/>
+      <w:r>
+        <w:rPr>
+          <w:rFonts w:ascii="宋体" w:hAnsi="宋体"/>
+          <w:sz w:val="21"/>
+          <w:lang w:eastAsia="zh-CN"/>
+        </w:rPr>
+        <w:t>金鑫,</w:t>
+      </w:r>
+      <w:proofErr w:type="gramEnd"/>
+      <w:r>
+        <w:rPr>
+          <w:rFonts w:ascii="宋体" w:hAnsi="宋体"/>
+          <w:sz w:val="21"/>
+          <w:lang w:eastAsia="zh-CN"/>
+        </w:rPr>
+        <w:t xml:space="preserve"> 柯</w:t>
+      </w:r>
+      <w:proofErr w:type="gramStart"/>
+      <w:r>
+        <w:rPr>
+          <w:rFonts w:ascii="宋体" w:hAnsi="宋体"/>
+          <w:sz w:val="21"/>
+          <w:lang w:eastAsia="zh-CN"/>
+        </w:rPr>
+        <w:t>韦.</w:t>
+      </w:r>
+      <w:proofErr w:type="gramEnd"/>
+      <w:r>
+        <w:rPr>
+          <w:rFonts w:ascii="宋体" w:hAnsi="宋体"/>
+          <w:sz w:val="21"/>
+          <w:lang w:eastAsia="zh-CN"/>
+        </w:rPr>
+        <w:t xml:space="preserve"> AI辅助编程教学中思维链式启发策略探索[J]. 计算机</w:t>
+      </w:r>
+      <w:proofErr w:type="gramStart"/>
+      <w:r>
+        <w:rPr>
+          <w:rFonts w:ascii="宋体" w:hAnsi="宋体"/>
+          <w:sz w:val="21"/>
           <w:lang w:eastAsia="zh-CN"/>
         </w:rPr>
         <w:t>教育,</w:t>
@@ -889,49 +1795,46 @@
       <w:proofErr w:type="gramEnd"/>
       <w:r>
         <w:rPr>
-          <w:lang w:eastAsia="zh-CN"/>
-        </w:rPr>
-        <w:t xml:space="preserve"> 2025</w:t>
+          <w:rFonts w:ascii="宋体" w:hAnsi="宋体"/>
+          <w:sz w:val="21"/>
+          <w:lang w:eastAsia="zh-CN"/>
+        </w:rPr>
+        <w:t xml:space="preserve"> 2026</w:t>
       </w:r>
       <w:proofErr w:type="gramStart"/>
       <w:r>
         <w:rPr>
-          <w:lang w:eastAsia="zh-CN"/>
-        </w:rPr>
-        <w:t>(2): 97</w:t>
+          <w:rFonts w:ascii="宋体" w:hAnsi="宋体"/>
+          <w:sz w:val="21"/>
+          <w:lang w:eastAsia="zh-CN"/>
+        </w:rPr>
+        <w:t>(2): 143</w:t>
       </w:r>
       <w:proofErr w:type="gramEnd"/>
       <w:r>
         <w:rPr>
-          <w:lang w:eastAsia="zh-CN"/>
-        </w:rPr>
-        <w:t>-101</w:t>
-      </w:r>
-      <w:proofErr w:type="gramStart"/>
-      <w:r>
-        <w:rPr>
-          <w:lang w:eastAsia="zh-CN"/>
-        </w:rPr>
-        <w:t>, 106</w:t>
-      </w:r>
-      <w:proofErr w:type="gramEnd"/>
-      <w:r>
-        <w:rPr>
-          <w:lang w:eastAsia="zh-CN"/>
-        </w:rPr>
-        <w:t>.</w:t>
+          <w:rFonts w:ascii="宋体" w:hAnsi="宋体"/>
+          <w:sz w:val="21"/>
+          <w:lang w:eastAsia="zh-CN"/>
+        </w:rPr>
+        <w:t>-147.</w:t>
       </w:r>
     </w:p>
     <w:p>
       <w:pPr>
-        <w:pStyle w:val="affd"/>
-        <w:rPr>
-          <w:rFonts w:hint="eastAsia"/>
-          <w:lang w:eastAsia="zh-CN"/>
-        </w:rPr>
-      </w:pPr>
-      <w:r>
-        <w:rPr>
+        <w:keepNext w:val="0"/>
+        <w:keepLines w:val="0"/>
+        <w:widowControl w:val="0"/>
+        <w:spacing w:after="0" w:line="400" w:lineRule="exact"/>
+        <w:jc w:val="both"/>
+        <w:rPr>
+          <w:lang w:eastAsia="zh-CN"/>
+        </w:rPr>
+      </w:pPr>
+      <w:r>
+        <w:rPr>
+          <w:rFonts w:ascii="宋体" w:hAnsi="宋体"/>
+          <w:sz w:val="21"/>
           <w:lang w:eastAsia="zh-CN"/>
         </w:rPr>
         <w:t>[2]</w:t>
@@ -939,6 +1842,8 @@
       <w:proofErr w:type="gramStart"/>
       <w:r>
         <w:rPr>
+          <w:rFonts w:ascii="宋体" w:hAnsi="宋体"/>
+          <w:sz w:val="21"/>
           <w:lang w:eastAsia="zh-CN"/>
         </w:rPr>
         <w:t>陈峥,</w:t>
@@ -946,6 +1851,8 @@
       <w:proofErr w:type="gramEnd"/>
       <w:r>
         <w:rPr>
+          <w:rFonts w:ascii="宋体" w:hAnsi="宋体"/>
+          <w:sz w:val="21"/>
           <w:lang w:eastAsia="zh-CN"/>
         </w:rPr>
         <w:t xml:space="preserve"> 喻</w:t>
@@ -953,6 +1860,8 @@
       <w:proofErr w:type="gramStart"/>
       <w:r>
         <w:rPr>
+          <w:rFonts w:ascii="宋体" w:hAnsi="宋体"/>
+          <w:sz w:val="21"/>
           <w:lang w:eastAsia="zh-CN"/>
         </w:rPr>
         <w:t>俊杰.</w:t>
@@ -960,6 +1869,8 @@
       <w:proofErr w:type="gramEnd"/>
       <w:r>
         <w:rPr>
+          <w:rFonts w:ascii="宋体" w:hAnsi="宋体"/>
+          <w:sz w:val="21"/>
           <w:lang w:eastAsia="zh-CN"/>
         </w:rPr>
         <w:t xml:space="preserve"> 基于LLM的Java编程作业评估与教学实践[J]. 计算机</w:t>
@@ -967,6 +1878,8 @@
       <w:proofErr w:type="gramStart"/>
       <w:r>
         <w:rPr>
+          <w:rFonts w:ascii="宋体" w:hAnsi="宋体"/>
+          <w:sz w:val="21"/>
           <w:lang w:eastAsia="zh-CN"/>
         </w:rPr>
         <w:t>教育,</w:t>
@@ -974,6 +1887,8 @@
       <w:proofErr w:type="gramEnd"/>
       <w:r>
         <w:rPr>
+          <w:rFonts w:ascii="宋体" w:hAnsi="宋体"/>
+          <w:sz w:val="21"/>
           <w:lang w:eastAsia="zh-CN"/>
         </w:rPr>
         <w:t xml:space="preserve"> 2026</w:t>
@@ -981,6 +1896,8 @@
       <w:proofErr w:type="gramStart"/>
       <w:r>
         <w:rPr>
+          <w:rFonts w:ascii="宋体" w:hAnsi="宋体"/>
+          <w:sz w:val="21"/>
           <w:lang w:eastAsia="zh-CN"/>
         </w:rPr>
         <w:t>(6): 198</w:t>
@@ -988,6 +1905,8 @@
       <w:proofErr w:type="gramEnd"/>
       <w:r>
         <w:rPr>
+          <w:rFonts w:ascii="宋体" w:hAnsi="宋体"/>
+          <w:sz w:val="21"/>
           <w:lang w:eastAsia="zh-CN"/>
         </w:rPr>
         <w:t>-205.</w:t>
@@ -995,196 +1914,1269 @@
     </w:p>
     <w:p>
       <w:pPr>
-        <w:pStyle w:val="affd"/>
+        <w:keepNext w:val="0"/>
+        <w:keepLines w:val="0"/>
+        <w:widowControl w:val="0"/>
+        <w:spacing w:after="0" w:line="400" w:lineRule="exact"/>
         <w:jc w:val="both"/>
         <w:rPr>
-          <w:rFonts w:hint="eastAsia"/>
-        </w:rPr>
-      </w:pPr>
-      <w:r>
-        <w:t>[</w:t>
+          <w:lang w:eastAsia="zh-CN"/>
+        </w:rPr>
+      </w:pPr>
+      <w:r>
+        <w:rPr>
+          <w:rFonts w:ascii="宋体" w:hAnsi="宋体"/>
+          <w:sz w:val="21"/>
+          <w:lang w:eastAsia="zh-CN"/>
+        </w:rPr>
+        <w:t>[3]</w:t>
       </w:r>
       <w:proofErr w:type="gramStart"/>
       <w:r>
-        <w:t>3]</w:t>
-      </w:r>
-      <w:r>
-        <w:rPr>
-          <w:rFonts w:ascii="Times New Roman" w:eastAsia="Times New Roman" w:hAnsi="Times New Roman"/>
-        </w:rPr>
-        <w:t>KEUNING</w:t>
+        <w:rPr>
+          <w:rFonts w:ascii="宋体" w:hAnsi="宋体"/>
+          <w:sz w:val="21"/>
+          <w:lang w:eastAsia="zh-CN"/>
+        </w:rPr>
+        <w:t>文继权,</w:t>
       </w:r>
       <w:proofErr w:type="gramEnd"/>
       <w:r>
         <w:rPr>
-          <w:rFonts w:ascii="Times New Roman" w:eastAsia="Times New Roman" w:hAnsi="Times New Roman"/>
-        </w:rPr>
-        <w:t xml:space="preserve"> H, JEURING J T, HEEREN B. A systematic literature review of automated feedback generation for programming exercises[J]. ACM Transactions on Computing Education, 2018, 19(1).</w:t>
+          <w:rFonts w:ascii="宋体" w:hAnsi="宋体"/>
+          <w:sz w:val="21"/>
+          <w:lang w:eastAsia="zh-CN"/>
+        </w:rPr>
+        <w:t xml:space="preserve"> </w:t>
+      </w:r>
+      <w:proofErr w:type="gramStart"/>
+      <w:r>
+        <w:rPr>
+          <w:rFonts w:ascii="宋体" w:hAnsi="宋体"/>
+          <w:sz w:val="21"/>
+          <w:lang w:eastAsia="zh-CN"/>
+        </w:rPr>
+        <w:t>孟庆伟.</w:t>
+      </w:r>
+      <w:proofErr w:type="gramEnd"/>
+      <w:r>
+        <w:rPr>
+          <w:rFonts w:ascii="宋体" w:hAnsi="宋体"/>
+          <w:sz w:val="21"/>
+          <w:lang w:eastAsia="zh-CN"/>
+        </w:rPr>
+        <w:t xml:space="preserve"> 基于大模型的代码数据自动纠错技术研究[J]. 现代电子</w:t>
+      </w:r>
+      <w:proofErr w:type="gramStart"/>
+      <w:r>
+        <w:rPr>
+          <w:rFonts w:ascii="宋体" w:hAnsi="宋体"/>
+          <w:sz w:val="21"/>
+          <w:lang w:eastAsia="zh-CN"/>
+        </w:rPr>
+        <w:t>技术,</w:t>
+      </w:r>
+      <w:proofErr w:type="gramEnd"/>
+      <w:r>
+        <w:rPr>
+          <w:rFonts w:ascii="宋体" w:hAnsi="宋体"/>
+          <w:sz w:val="21"/>
+          <w:lang w:eastAsia="zh-CN"/>
+        </w:rPr>
+        <w:t xml:space="preserve"> 2026, 49</w:t>
+      </w:r>
+      <w:proofErr w:type="gramStart"/>
+      <w:r>
+        <w:rPr>
+          <w:rFonts w:ascii="宋体" w:hAnsi="宋体"/>
+          <w:sz w:val="21"/>
+          <w:lang w:eastAsia="zh-CN"/>
+        </w:rPr>
+        <w:t>(16): 187</w:t>
+      </w:r>
+      <w:proofErr w:type="gramEnd"/>
+      <w:r>
+        <w:rPr>
+          <w:rFonts w:ascii="宋体" w:hAnsi="宋体"/>
+          <w:sz w:val="21"/>
+          <w:lang w:eastAsia="zh-CN"/>
+        </w:rPr>
+        <w:t>-191.</w:t>
       </w:r>
     </w:p>
     <w:p>
       <w:pPr>
-        <w:pStyle w:val="affd"/>
+        <w:keepNext w:val="0"/>
+        <w:keepLines w:val="0"/>
+        <w:widowControl w:val="0"/>
+        <w:spacing w:after="0" w:line="400" w:lineRule="exact"/>
         <w:jc w:val="both"/>
         <w:rPr>
-          <w:rFonts w:hint="eastAsia"/>
-        </w:rPr>
-      </w:pPr>
-      <w:r>
-        <w:t>[</w:t>
+          <w:lang w:eastAsia="zh-CN"/>
+        </w:rPr>
+      </w:pPr>
+      <w:r>
+        <w:rPr>
+          <w:rFonts w:ascii="宋体" w:hAnsi="宋体"/>
+          <w:sz w:val="21"/>
+          <w:lang w:eastAsia="zh-CN"/>
+        </w:rPr>
+        <w:t>[4]</w:t>
       </w:r>
       <w:proofErr w:type="gramStart"/>
       <w:r>
-        <w:t>4]</w:t>
-      </w:r>
-      <w:r>
-        <w:rPr>
-          <w:rFonts w:ascii="Times New Roman" w:eastAsia="Times New Roman" w:hAnsi="Times New Roman"/>
-        </w:rPr>
-        <w:t>KASNECI</w:t>
+        <w:rPr>
+          <w:rFonts w:ascii="宋体" w:hAnsi="宋体"/>
+          <w:sz w:val="21"/>
+          <w:lang w:eastAsia="zh-CN"/>
+        </w:rPr>
+        <w:t>孙丹,</w:t>
       </w:r>
       <w:proofErr w:type="gramEnd"/>
       <w:r>
         <w:rPr>
-          <w:rFonts w:ascii="Times New Roman" w:eastAsia="Times New Roman" w:hAnsi="Times New Roman"/>
-        </w:rPr>
-        <w:t xml:space="preserve"> E, SESSLER K, KÜCHEMANN S, et al. ChatGPT for good? On opportunities and challenges of large language models for education[J]. Learning and Individual Differences, 2023, 103: 102274.</w:t>
+          <w:rFonts w:ascii="宋体" w:hAnsi="宋体"/>
+          <w:sz w:val="21"/>
+          <w:lang w:eastAsia="zh-CN"/>
+        </w:rPr>
+        <w:t xml:space="preserve"> </w:t>
+      </w:r>
+      <w:proofErr w:type="gramStart"/>
+      <w:r>
+        <w:rPr>
+          <w:rFonts w:ascii="宋体" w:hAnsi="宋体"/>
+          <w:sz w:val="21"/>
+          <w:lang w:eastAsia="zh-CN"/>
+        </w:rPr>
+        <w:t>朱城聪,</w:t>
+      </w:r>
+      <w:proofErr w:type="gramEnd"/>
+      <w:r>
+        <w:rPr>
+          <w:rFonts w:ascii="宋体" w:hAnsi="宋体"/>
+          <w:sz w:val="21"/>
+          <w:lang w:eastAsia="zh-CN"/>
+        </w:rPr>
+        <w:t xml:space="preserve"> </w:t>
+      </w:r>
+      <w:proofErr w:type="gramStart"/>
+      <w:r>
+        <w:rPr>
+          <w:rFonts w:ascii="宋体" w:hAnsi="宋体"/>
+          <w:sz w:val="21"/>
+          <w:lang w:eastAsia="zh-CN"/>
+        </w:rPr>
+        <w:t>许作栋,</w:t>
+      </w:r>
+      <w:proofErr w:type="gramEnd"/>
+      <w:r>
+        <w:rPr>
+          <w:rFonts w:ascii="宋体" w:hAnsi="宋体"/>
+          <w:sz w:val="21"/>
+          <w:lang w:eastAsia="zh-CN"/>
+        </w:rPr>
+        <w:t xml:space="preserve"> </w:t>
+      </w:r>
+      <w:proofErr w:type="gramStart"/>
+      <w:r>
+        <w:rPr>
+          <w:rFonts w:ascii="宋体" w:hAnsi="宋体"/>
+          <w:sz w:val="21"/>
+          <w:lang w:eastAsia="zh-CN"/>
+        </w:rPr>
+        <w:t>徐光涛.</w:t>
+      </w:r>
+      <w:proofErr w:type="gramEnd"/>
+      <w:r>
+        <w:rPr>
+          <w:rFonts w:ascii="宋体" w:hAnsi="宋体"/>
+          <w:sz w:val="21"/>
+          <w:lang w:eastAsia="zh-CN"/>
+        </w:rPr>
+        <w:t xml:space="preserve"> 基于生成式人工智能的大学生编程学习行为分析研究[J]. 电化教育</w:t>
+      </w:r>
+      <w:proofErr w:type="gramStart"/>
+      <w:r>
+        <w:rPr>
+          <w:rFonts w:ascii="宋体" w:hAnsi="宋体"/>
+          <w:sz w:val="21"/>
+          <w:lang w:eastAsia="zh-CN"/>
+        </w:rPr>
+        <w:t>研究,</w:t>
+      </w:r>
+      <w:proofErr w:type="gramEnd"/>
+      <w:r>
+        <w:rPr>
+          <w:rFonts w:ascii="宋体" w:hAnsi="宋体"/>
+          <w:sz w:val="21"/>
+          <w:lang w:eastAsia="zh-CN"/>
+        </w:rPr>
+        <w:t xml:space="preserve"> 2024</w:t>
+      </w:r>
+      <w:proofErr w:type="gramStart"/>
+      <w:r>
+        <w:rPr>
+          <w:rFonts w:ascii="宋体" w:hAnsi="宋体"/>
+          <w:sz w:val="21"/>
+          <w:lang w:eastAsia="zh-CN"/>
+        </w:rPr>
+        <w:t>(3): 113</w:t>
+      </w:r>
+      <w:proofErr w:type="gramEnd"/>
+      <w:r>
+        <w:rPr>
+          <w:rFonts w:ascii="宋体" w:hAnsi="宋体"/>
+          <w:sz w:val="21"/>
+          <w:lang w:eastAsia="zh-CN"/>
+        </w:rPr>
+        <w:t>-120.</w:t>
       </w:r>
     </w:p>
     <w:p>
       <w:pPr>
-        <w:pStyle w:val="affd"/>
+        <w:keepNext w:val="0"/>
+        <w:keepLines w:val="0"/>
+        <w:widowControl w:val="0"/>
+        <w:spacing w:after="0" w:line="400" w:lineRule="exact"/>
         <w:jc w:val="both"/>
         <w:rPr>
-          <w:rFonts w:hint="eastAsia"/>
-        </w:rPr>
-      </w:pPr>
-      <w:r>
-        <w:t>[</w:t>
+          <w:lang w:eastAsia="zh-CN"/>
+        </w:rPr>
+      </w:pPr>
+      <w:r>
+        <w:rPr>
+          <w:rFonts w:ascii="宋体" w:hAnsi="宋体"/>
+          <w:sz w:val="21"/>
+          <w:lang w:eastAsia="zh-CN"/>
+        </w:rPr>
+        <w:t>[5]</w:t>
       </w:r>
       <w:proofErr w:type="gramStart"/>
       <w:r>
-        <w:t>5]</w:t>
-      </w:r>
-      <w:r>
-        <w:rPr>
-          <w:rFonts w:ascii="Times New Roman" w:eastAsia="Times New Roman" w:hAnsi="Times New Roman"/>
-        </w:rPr>
-        <w:t>SPRING</w:t>
+        <w:rPr>
+          <w:rFonts w:ascii="宋体" w:hAnsi="宋体"/>
+          <w:sz w:val="21"/>
+          <w:lang w:eastAsia="zh-CN"/>
+        </w:rPr>
+        <w:t>李希,</w:t>
       </w:r>
       <w:proofErr w:type="gramEnd"/>
       <w:r>
         <w:rPr>
-          <w:rFonts w:ascii="Times New Roman" w:eastAsia="Times New Roman" w:hAnsi="Times New Roman"/>
-        </w:rPr>
-        <w:t xml:space="preserve">. Spring Boot 3.5 Reference </w:t>
+          <w:rFonts w:ascii="宋体" w:hAnsi="宋体"/>
+          <w:sz w:val="21"/>
+          <w:lang w:eastAsia="zh-CN"/>
+        </w:rPr>
+        <w:t xml:space="preserve"> </w:t>
       </w:r>
       <w:proofErr w:type="gramStart"/>
       <w:r>
         <w:rPr>
-          <w:rFonts w:ascii="Times New Roman" w:eastAsia="Times New Roman" w:hAnsi="Times New Roman"/>
-        </w:rPr>
-        <w:t>Documentation[</w:t>
+          <w:rFonts w:ascii="宋体" w:hAnsi="宋体"/>
+          <w:sz w:val="21"/>
+          <w:lang w:eastAsia="zh-CN"/>
+        </w:rPr>
+        <w:t>刘喜平,</w:t>
       </w:r>
       <w:proofErr w:type="gramEnd"/>
       <w:r>
         <w:rPr>
-          <w:rFonts w:ascii="Times New Roman" w:eastAsia="Times New Roman" w:hAnsi="Times New Roman"/>
-        </w:rPr>
-        <w:t>EB/OL]. https://docs.spring.io/spring-boot/3.5/reference/index.html, 2026-10-26.</w:t>
+          <w:rFonts w:ascii="宋体" w:hAnsi="宋体"/>
+          <w:sz w:val="21"/>
+          <w:lang w:eastAsia="zh-CN"/>
+        </w:rPr>
+        <w:t xml:space="preserve"> </w:t>
+      </w:r>
+      <w:proofErr w:type="gramStart"/>
+      <w:r>
+        <w:rPr>
+          <w:rFonts w:ascii="宋体" w:hAnsi="宋体"/>
+          <w:sz w:val="21"/>
+          <w:lang w:eastAsia="zh-CN"/>
+        </w:rPr>
+        <w:t>戴航,</w:t>
+      </w:r>
+      <w:proofErr w:type="gramEnd"/>
+      <w:r>
+        <w:rPr>
+          <w:rFonts w:ascii="宋体" w:hAnsi="宋体"/>
+          <w:sz w:val="21"/>
+          <w:lang w:eastAsia="zh-CN"/>
+        </w:rPr>
+        <w:t xml:space="preserve"> </w:t>
+      </w:r>
+      <w:proofErr w:type="gramStart"/>
+      <w:r>
+        <w:rPr>
+          <w:rFonts w:ascii="宋体" w:hAnsi="宋体"/>
+          <w:sz w:val="21"/>
+          <w:lang w:eastAsia="zh-CN"/>
+        </w:rPr>
+        <w:t>姜火文,</w:t>
+      </w:r>
+      <w:proofErr w:type="gramEnd"/>
+      <w:r>
+        <w:rPr>
+          <w:rFonts w:ascii="宋体" w:hAnsi="宋体"/>
+          <w:sz w:val="21"/>
+          <w:lang w:eastAsia="zh-CN"/>
+        </w:rPr>
+        <w:t xml:space="preserve"> </w:t>
+      </w:r>
+      <w:proofErr w:type="gramStart"/>
+      <w:r>
+        <w:rPr>
+          <w:rFonts w:ascii="宋体" w:hAnsi="宋体"/>
+          <w:sz w:val="21"/>
+          <w:lang w:eastAsia="zh-CN"/>
+        </w:rPr>
+        <w:t>赵芸,</w:t>
+      </w:r>
+      <w:proofErr w:type="gramEnd"/>
+      <w:r>
+        <w:rPr>
+          <w:rFonts w:ascii="宋体" w:hAnsi="宋体"/>
+          <w:sz w:val="21"/>
+          <w:lang w:eastAsia="zh-CN"/>
+        </w:rPr>
+        <w:t xml:space="preserve"> 舒</w:t>
+      </w:r>
+      <w:proofErr w:type="gramStart"/>
+      <w:r>
+        <w:rPr>
+          <w:rFonts w:ascii="宋体" w:hAnsi="宋体"/>
+          <w:sz w:val="21"/>
+          <w:lang w:eastAsia="zh-CN"/>
+        </w:rPr>
+        <w:t>晴.</w:t>
+      </w:r>
+      <w:proofErr w:type="gramEnd"/>
+      <w:r>
+        <w:rPr>
+          <w:rFonts w:ascii="宋体" w:hAnsi="宋体"/>
+          <w:sz w:val="21"/>
+          <w:lang w:eastAsia="zh-CN"/>
+        </w:rPr>
+        <w:t xml:space="preserve"> 提示工程应用于数据结构课程教学的创新模式设计与实践[J]. 计算机</w:t>
+      </w:r>
+      <w:proofErr w:type="gramStart"/>
+      <w:r>
+        <w:rPr>
+          <w:rFonts w:ascii="宋体" w:hAnsi="宋体"/>
+          <w:sz w:val="21"/>
+          <w:lang w:eastAsia="zh-CN"/>
+        </w:rPr>
+        <w:t>教育,</w:t>
+      </w:r>
+      <w:proofErr w:type="gramEnd"/>
+      <w:r>
+        <w:rPr>
+          <w:rFonts w:ascii="宋体" w:hAnsi="宋体"/>
+          <w:sz w:val="21"/>
+          <w:lang w:eastAsia="zh-CN"/>
+        </w:rPr>
+        <w:t xml:space="preserve"> 2025</w:t>
+      </w:r>
+      <w:proofErr w:type="gramStart"/>
+      <w:r>
+        <w:rPr>
+          <w:rFonts w:ascii="宋体" w:hAnsi="宋体"/>
+          <w:sz w:val="21"/>
+          <w:lang w:eastAsia="zh-CN"/>
+        </w:rPr>
+        <w:t>(4): 131</w:t>
+      </w:r>
+      <w:proofErr w:type="gramEnd"/>
+      <w:r>
+        <w:rPr>
+          <w:rFonts w:ascii="宋体" w:hAnsi="宋体"/>
+          <w:sz w:val="21"/>
+          <w:lang w:eastAsia="zh-CN"/>
+        </w:rPr>
+        <w:t>-136.</w:t>
       </w:r>
     </w:p>
     <w:p>
       <w:pPr>
-        <w:pStyle w:val="affd"/>
+        <w:keepNext w:val="0"/>
+        <w:keepLines w:val="0"/>
+        <w:widowControl w:val="0"/>
+        <w:spacing w:after="0" w:line="400" w:lineRule="exact"/>
         <w:jc w:val="both"/>
         <w:rPr>
-          <w:rFonts w:hint="eastAsia"/>
-        </w:rPr>
-      </w:pPr>
-      <w:r>
-        <w:t>[</w:t>
+          <w:lang w:eastAsia="zh-CN"/>
+        </w:rPr>
+      </w:pPr>
+      <w:r>
+        <w:rPr>
+          <w:rFonts w:ascii="宋体" w:hAnsi="宋体"/>
+          <w:sz w:val="21"/>
+          <w:lang w:eastAsia="zh-CN"/>
+        </w:rPr>
+        <w:t>[6]</w:t>
       </w:r>
       <w:proofErr w:type="gramStart"/>
       <w:r>
-        <w:t>6]</w:t>
-      </w:r>
-      <w:r>
-        <w:rPr>
-          <w:rFonts w:ascii="Times New Roman" w:eastAsia="Times New Roman" w:hAnsi="Times New Roman"/>
-        </w:rPr>
-        <w:t>OLLAMA</w:t>
+        <w:rPr>
+          <w:rFonts w:ascii="宋体" w:hAnsi="宋体"/>
+          <w:sz w:val="21"/>
+          <w:lang w:eastAsia="zh-CN"/>
+        </w:rPr>
+        <w:t>姚嘉轩,</w:t>
       </w:r>
       <w:proofErr w:type="gramEnd"/>
       <w:r>
         <w:rPr>
-          <w:rFonts w:ascii="Times New Roman" w:eastAsia="Times New Roman" w:hAnsi="Times New Roman"/>
-        </w:rPr>
-        <w:t xml:space="preserve">. Generate a chat </w:t>
+          <w:rFonts w:ascii="宋体" w:hAnsi="宋体"/>
+          <w:sz w:val="21"/>
+          <w:lang w:eastAsia="zh-CN"/>
+        </w:rPr>
+        <w:t xml:space="preserve"> </w:t>
       </w:r>
       <w:proofErr w:type="gramStart"/>
       <w:r>
         <w:rPr>
-          <w:rFonts w:ascii="Times New Roman" w:eastAsia="Times New Roman" w:hAnsi="Times New Roman"/>
-        </w:rPr>
-        <w:t>message[</w:t>
+          <w:rFonts w:ascii="宋体" w:hAnsi="宋体"/>
+          <w:sz w:val="21"/>
+          <w:lang w:eastAsia="zh-CN"/>
+        </w:rPr>
+        <w:t>夏小俊.</w:t>
       </w:r>
       <w:proofErr w:type="gramEnd"/>
       <w:r>
         <w:rPr>
-          <w:rFonts w:ascii="Times New Roman" w:eastAsia="Times New Roman" w:hAnsi="Times New Roman"/>
-        </w:rPr>
-        <w:t>EB/OL]. https://docs.ollama.com/api/chat, 2026-10-26.</w:t>
+          <w:rFonts w:ascii="宋体" w:hAnsi="宋体"/>
+          <w:sz w:val="21"/>
+          <w:lang w:eastAsia="zh-CN"/>
+        </w:rPr>
+        <w:t xml:space="preserve"> 大模型赋能的编程作业评估智能体设计与应用[J]. 计算机</w:t>
+      </w:r>
+      <w:proofErr w:type="gramStart"/>
+      <w:r>
+        <w:rPr>
+          <w:rFonts w:ascii="宋体" w:hAnsi="宋体"/>
+          <w:sz w:val="21"/>
+          <w:lang w:eastAsia="zh-CN"/>
+        </w:rPr>
+        <w:t>教育,</w:t>
+      </w:r>
+      <w:proofErr w:type="gramEnd"/>
+      <w:r>
+        <w:rPr>
+          <w:rFonts w:ascii="宋体" w:hAnsi="宋体"/>
+          <w:sz w:val="21"/>
+          <w:lang w:eastAsia="zh-CN"/>
+        </w:rPr>
+        <w:t xml:space="preserve"> 2026</w:t>
+      </w:r>
+      <w:proofErr w:type="gramStart"/>
+      <w:r>
+        <w:rPr>
+          <w:rFonts w:ascii="宋体" w:hAnsi="宋体"/>
+          <w:sz w:val="21"/>
+          <w:lang w:eastAsia="zh-CN"/>
+        </w:rPr>
+        <w:t>(2): 98</w:t>
+      </w:r>
+      <w:proofErr w:type="gramEnd"/>
+      <w:r>
+        <w:rPr>
+          <w:rFonts w:ascii="宋体" w:hAnsi="宋体"/>
+          <w:sz w:val="21"/>
+          <w:lang w:eastAsia="zh-CN"/>
+        </w:rPr>
+        <w:t>-103.</w:t>
       </w:r>
     </w:p>
     <w:p>
       <w:pPr>
-        <w:pStyle w:val="affd"/>
+        <w:keepNext w:val="0"/>
+        <w:keepLines w:val="0"/>
+        <w:widowControl w:val="0"/>
+        <w:spacing w:after="0" w:line="400" w:lineRule="exact"/>
         <w:jc w:val="both"/>
         <w:rPr>
-          <w:rFonts w:hint="eastAsia"/>
-        </w:rPr>
-      </w:pPr>
-      <w:r>
-        <w:t>[</w:t>
+          <w:lang w:eastAsia="zh-CN"/>
+        </w:rPr>
+      </w:pPr>
+      <w:r>
+        <w:rPr>
+          <w:rFonts w:ascii="宋体" w:hAnsi="宋体"/>
+          <w:sz w:val="21"/>
+          <w:lang w:eastAsia="zh-CN"/>
+        </w:rPr>
+        <w:t>[7]</w:t>
       </w:r>
       <w:proofErr w:type="gramStart"/>
       <w:r>
-        <w:t>7]</w:t>
-      </w:r>
-      <w:r>
-        <w:rPr>
-          <w:rFonts w:ascii="Times New Roman" w:eastAsia="Times New Roman" w:hAnsi="Times New Roman"/>
-        </w:rPr>
-        <w:t>ORACLE</w:t>
+        <w:rPr>
+          <w:rFonts w:ascii="宋体" w:hAnsi="宋体"/>
+          <w:sz w:val="21"/>
+          <w:lang w:eastAsia="zh-CN"/>
+        </w:rPr>
+        <w:t>唐琳,</w:t>
       </w:r>
       <w:proofErr w:type="gramEnd"/>
       <w:r>
         <w:rPr>
-          <w:rFonts w:ascii="Times New Roman" w:eastAsia="Times New Roman" w:hAnsi="Times New Roman"/>
-        </w:rPr>
-        <w:t xml:space="preserve">. MySQL8.4 Reference Manual: FOREIGN KEY </w:t>
+          <w:rFonts w:ascii="宋体" w:hAnsi="宋体"/>
+          <w:sz w:val="21"/>
+          <w:lang w:eastAsia="zh-CN"/>
+        </w:rPr>
+        <w:t xml:space="preserve"> </w:t>
       </w:r>
       <w:proofErr w:type="gramStart"/>
       <w:r>
         <w:rPr>
-          <w:rFonts w:ascii="Times New Roman" w:eastAsia="Times New Roman" w:hAnsi="Times New Roman"/>
+          <w:rFonts w:ascii="宋体" w:hAnsi="宋体"/>
+          <w:sz w:val="21"/>
+          <w:lang w:eastAsia="zh-CN"/>
+        </w:rPr>
+        <w:t>张佳鑫,</w:t>
+      </w:r>
+      <w:proofErr w:type="gramEnd"/>
+      <w:r>
+        <w:rPr>
+          <w:rFonts w:ascii="宋体" w:hAnsi="宋体"/>
+          <w:sz w:val="21"/>
+          <w:lang w:eastAsia="zh-CN"/>
+        </w:rPr>
+        <w:t xml:space="preserve"> </w:t>
+      </w:r>
+      <w:proofErr w:type="gramStart"/>
+      <w:r>
+        <w:rPr>
+          <w:rFonts w:ascii="宋体" w:hAnsi="宋体"/>
+          <w:sz w:val="21"/>
+          <w:lang w:eastAsia="zh-CN"/>
+        </w:rPr>
+        <w:t>徐照光.</w:t>
+      </w:r>
+      <w:proofErr w:type="gramEnd"/>
+      <w:r>
+        <w:rPr>
+          <w:rFonts w:ascii="宋体" w:hAnsi="宋体"/>
+          <w:sz w:val="21"/>
+          <w:lang w:eastAsia="zh-CN"/>
+        </w:rPr>
+        <w:t xml:space="preserve"> 大语言模型在计算机编程实践课程教学中的应用[J]. 计算机</w:t>
+      </w:r>
+      <w:proofErr w:type="gramStart"/>
+      <w:r>
+        <w:rPr>
+          <w:rFonts w:ascii="宋体" w:hAnsi="宋体"/>
+          <w:sz w:val="21"/>
+          <w:lang w:eastAsia="zh-CN"/>
+        </w:rPr>
+        <w:t>教育,</w:t>
+      </w:r>
+      <w:proofErr w:type="gramEnd"/>
+      <w:r>
+        <w:rPr>
+          <w:rFonts w:ascii="宋体" w:hAnsi="宋体"/>
+          <w:sz w:val="21"/>
+          <w:lang w:eastAsia="zh-CN"/>
+        </w:rPr>
+        <w:t xml:space="preserve"> 2025</w:t>
+      </w:r>
+      <w:proofErr w:type="gramStart"/>
+      <w:r>
+        <w:rPr>
+          <w:rFonts w:ascii="宋体" w:hAnsi="宋体"/>
+          <w:sz w:val="21"/>
+          <w:lang w:eastAsia="zh-CN"/>
+        </w:rPr>
+        <w:t>(2): 97</w:t>
+      </w:r>
+      <w:proofErr w:type="gramEnd"/>
+      <w:r>
+        <w:rPr>
+          <w:rFonts w:ascii="宋体" w:hAnsi="宋体"/>
+          <w:sz w:val="21"/>
+          <w:lang w:eastAsia="zh-CN"/>
+        </w:rPr>
+        <w:t>-101.</w:t>
+      </w:r>
+    </w:p>
+    <w:p>
+      <w:pPr>
+        <w:keepNext w:val="0"/>
+        <w:keepLines w:val="0"/>
+        <w:widowControl w:val="0"/>
+        <w:spacing w:after="0" w:line="400" w:lineRule="exact"/>
+        <w:jc w:val="both"/>
+        <w:rPr>
+          <w:lang w:eastAsia="zh-CN"/>
+        </w:rPr>
+      </w:pPr>
+      <w:r>
+        <w:rPr>
+          <w:rFonts w:ascii="宋体" w:hAnsi="宋体"/>
+          <w:sz w:val="21"/>
+          <w:lang w:eastAsia="zh-CN"/>
+        </w:rPr>
+        <w:t>[8]</w:t>
+      </w:r>
+      <w:proofErr w:type="gramStart"/>
+      <w:r>
+        <w:rPr>
+          <w:rFonts w:ascii="宋体" w:hAnsi="宋体"/>
+          <w:sz w:val="21"/>
+          <w:lang w:eastAsia="zh-CN"/>
+        </w:rPr>
+        <w:t>徐建军,</w:t>
+      </w:r>
+      <w:proofErr w:type="gramEnd"/>
+      <w:r>
+        <w:rPr>
+          <w:rFonts w:ascii="宋体" w:hAnsi="宋体"/>
+          <w:sz w:val="21"/>
+          <w:lang w:eastAsia="zh-CN"/>
+        </w:rPr>
+        <w:t xml:space="preserve"> </w:t>
+      </w:r>
+      <w:proofErr w:type="gramStart"/>
+      <w:r>
+        <w:rPr>
+          <w:rFonts w:ascii="宋体" w:hAnsi="宋体"/>
+          <w:sz w:val="21"/>
+          <w:lang w:eastAsia="zh-CN"/>
+        </w:rPr>
+        <w:t>毛晓光,</w:t>
+      </w:r>
+      <w:proofErr w:type="gramEnd"/>
+      <w:r>
+        <w:rPr>
+          <w:rFonts w:ascii="宋体" w:hAnsi="宋体"/>
+          <w:sz w:val="21"/>
+          <w:lang w:eastAsia="zh-CN"/>
+        </w:rPr>
+        <w:t xml:space="preserve"> </w:t>
+      </w:r>
+      <w:proofErr w:type="gramStart"/>
+      <w:r>
+        <w:rPr>
+          <w:rFonts w:ascii="宋体" w:hAnsi="宋体"/>
+          <w:sz w:val="21"/>
+          <w:lang w:eastAsia="zh-CN"/>
+        </w:rPr>
+        <w:t>尹良泽,</w:t>
+      </w:r>
+      <w:proofErr w:type="gramEnd"/>
+      <w:r>
+        <w:rPr>
+          <w:rFonts w:ascii="宋体" w:hAnsi="宋体"/>
+          <w:sz w:val="21"/>
+          <w:lang w:eastAsia="zh-CN"/>
+        </w:rPr>
+        <w:t xml:space="preserve"> 翦</w:t>
+      </w:r>
+      <w:proofErr w:type="gramStart"/>
+      <w:r>
+        <w:rPr>
+          <w:rFonts w:ascii="宋体" w:hAnsi="宋体"/>
+          <w:sz w:val="21"/>
+          <w:lang w:eastAsia="zh-CN"/>
+        </w:rPr>
+        <w:t>杰,</w:t>
+      </w:r>
+      <w:proofErr w:type="gramEnd"/>
+      <w:r>
+        <w:rPr>
+          <w:rFonts w:ascii="宋体" w:hAnsi="宋体"/>
+          <w:sz w:val="21"/>
+          <w:lang w:eastAsia="zh-CN"/>
+        </w:rPr>
+        <w:t xml:space="preserve"> 李</w:t>
+      </w:r>
+      <w:proofErr w:type="gramStart"/>
+      <w:r>
+        <w:rPr>
+          <w:rFonts w:ascii="宋体" w:hAnsi="宋体"/>
+          <w:sz w:val="21"/>
+          <w:lang w:eastAsia="zh-CN"/>
+        </w:rPr>
+        <w:t>姗姗.</w:t>
+      </w:r>
+      <w:proofErr w:type="gramEnd"/>
+      <w:r>
+        <w:rPr>
+          <w:rFonts w:ascii="宋体" w:hAnsi="宋体"/>
+          <w:sz w:val="21"/>
+          <w:lang w:eastAsia="zh-CN"/>
+        </w:rPr>
+        <w:t xml:space="preserve"> 面向大语言模型的计算机程序设计课程教学重构[J]. 计算机</w:t>
+      </w:r>
+      <w:proofErr w:type="gramStart"/>
+      <w:r>
+        <w:rPr>
+          <w:rFonts w:ascii="宋体" w:hAnsi="宋体"/>
+          <w:sz w:val="21"/>
+          <w:lang w:eastAsia="zh-CN"/>
+        </w:rPr>
+        <w:t>教育,</w:t>
+      </w:r>
+      <w:proofErr w:type="gramEnd"/>
+      <w:r>
+        <w:rPr>
+          <w:rFonts w:ascii="宋体" w:hAnsi="宋体"/>
+          <w:sz w:val="21"/>
+          <w:lang w:eastAsia="zh-CN"/>
+        </w:rPr>
+        <w:t xml:space="preserve"> 2026</w:t>
+      </w:r>
+      <w:proofErr w:type="gramStart"/>
+      <w:r>
+        <w:rPr>
+          <w:rFonts w:ascii="宋体" w:hAnsi="宋体"/>
+          <w:sz w:val="21"/>
+          <w:lang w:eastAsia="zh-CN"/>
+        </w:rPr>
+        <w:t>(4): 156</w:t>
+      </w:r>
+      <w:proofErr w:type="gramEnd"/>
+      <w:r>
+        <w:rPr>
+          <w:rFonts w:ascii="宋体" w:hAnsi="宋体"/>
+          <w:sz w:val="21"/>
+          <w:lang w:eastAsia="zh-CN"/>
+        </w:rPr>
+        <w:t>-161.</w:t>
+      </w:r>
+    </w:p>
+    <w:p>
+      <w:pPr>
+        <w:keepNext w:val="0"/>
+        <w:keepLines w:val="0"/>
+        <w:widowControl w:val="0"/>
+        <w:spacing w:after="0" w:line="400" w:lineRule="exact"/>
+        <w:jc w:val="both"/>
+        <w:rPr>
+          <w:lang w:eastAsia="zh-CN"/>
+        </w:rPr>
+      </w:pPr>
+      <w:r>
+        <w:rPr>
+          <w:rFonts w:ascii="宋体" w:hAnsi="宋体"/>
+          <w:sz w:val="21"/>
+          <w:lang w:eastAsia="zh-CN"/>
+        </w:rPr>
+        <w:t>[9]</w:t>
+      </w:r>
+      <w:proofErr w:type="gramStart"/>
+      <w:r>
+        <w:rPr>
+          <w:rFonts w:ascii="宋体" w:hAnsi="宋体"/>
+          <w:sz w:val="21"/>
+          <w:lang w:eastAsia="zh-CN"/>
+        </w:rPr>
+        <w:t>陈小强,</w:t>
+      </w:r>
+      <w:proofErr w:type="gramEnd"/>
+      <w:r>
+        <w:rPr>
+          <w:rFonts w:ascii="宋体" w:hAnsi="宋体"/>
+          <w:sz w:val="21"/>
+          <w:lang w:eastAsia="zh-CN"/>
+        </w:rPr>
+        <w:t xml:space="preserve"> </w:t>
+      </w:r>
+      <w:proofErr w:type="gramStart"/>
+      <w:r>
+        <w:rPr>
+          <w:rFonts w:ascii="宋体" w:hAnsi="宋体"/>
+          <w:sz w:val="21"/>
+          <w:lang w:eastAsia="zh-CN"/>
+        </w:rPr>
+        <w:t>黄志鹏,</w:t>
+      </w:r>
+      <w:proofErr w:type="gramEnd"/>
+      <w:r>
+        <w:rPr>
+          <w:rFonts w:ascii="宋体" w:hAnsi="宋体"/>
+          <w:sz w:val="21"/>
+          <w:lang w:eastAsia="zh-CN"/>
+        </w:rPr>
+        <w:t xml:space="preserve"> </w:t>
+      </w:r>
+      <w:proofErr w:type="gramStart"/>
+      <w:r>
+        <w:rPr>
+          <w:rFonts w:ascii="宋体" w:hAnsi="宋体"/>
+          <w:sz w:val="21"/>
+          <w:lang w:eastAsia="zh-CN"/>
+        </w:rPr>
+        <w:t>胡翰.</w:t>
+      </w:r>
+      <w:proofErr w:type="gramEnd"/>
+      <w:r>
+        <w:rPr>
+          <w:rFonts w:ascii="宋体" w:hAnsi="宋体"/>
+          <w:sz w:val="21"/>
+          <w:lang w:eastAsia="zh-CN"/>
+        </w:rPr>
+        <w:t xml:space="preserve"> 生成式AI赋能Python程序设计课程教学设计与实践[J]. 计算机</w:t>
+      </w:r>
+      <w:proofErr w:type="gramStart"/>
+      <w:r>
+        <w:rPr>
+          <w:rFonts w:ascii="宋体" w:hAnsi="宋体"/>
+          <w:sz w:val="21"/>
+          <w:lang w:eastAsia="zh-CN"/>
+        </w:rPr>
+        <w:t>教育,</w:t>
+      </w:r>
+      <w:proofErr w:type="gramEnd"/>
+      <w:r>
+        <w:rPr>
+          <w:rFonts w:ascii="宋体" w:hAnsi="宋体"/>
+          <w:sz w:val="21"/>
+          <w:lang w:eastAsia="zh-CN"/>
+        </w:rPr>
+        <w:t xml:space="preserve"> 2025</w:t>
+      </w:r>
+      <w:proofErr w:type="gramStart"/>
+      <w:r>
+        <w:rPr>
+          <w:rFonts w:ascii="宋体" w:hAnsi="宋体"/>
+          <w:sz w:val="21"/>
+          <w:lang w:eastAsia="zh-CN"/>
+        </w:rPr>
+        <w:t>(12): 109</w:t>
+      </w:r>
+      <w:proofErr w:type="gramEnd"/>
+      <w:r>
+        <w:rPr>
+          <w:rFonts w:ascii="宋体" w:hAnsi="宋体"/>
+          <w:sz w:val="21"/>
+          <w:lang w:eastAsia="zh-CN"/>
+        </w:rPr>
+        <w:t>-113.</w:t>
+      </w:r>
+    </w:p>
+    <w:p>
+      <w:pPr>
+        <w:keepNext w:val="0"/>
+        <w:keepLines w:val="0"/>
+        <w:widowControl w:val="0"/>
+        <w:spacing w:after="0" w:line="400" w:lineRule="exact"/>
+        <w:jc w:val="both"/>
+        <w:rPr>
+          <w:lang w:eastAsia="zh-CN"/>
+        </w:rPr>
+      </w:pPr>
+      <w:r>
+        <w:rPr>
+          <w:rFonts w:ascii="宋体" w:hAnsi="宋体"/>
+          <w:sz w:val="21"/>
+          <w:lang w:eastAsia="zh-CN"/>
+        </w:rPr>
+        <w:t>[10]</w:t>
+      </w:r>
+      <w:proofErr w:type="gramStart"/>
+      <w:r>
+        <w:rPr>
+          <w:rFonts w:ascii="宋体" w:hAnsi="宋体"/>
+          <w:sz w:val="21"/>
+          <w:lang w:eastAsia="zh-CN"/>
+        </w:rPr>
+        <w:t>徐慧,</w:t>
+      </w:r>
+      <w:proofErr w:type="gramEnd"/>
+      <w:r>
+        <w:rPr>
+          <w:rFonts w:ascii="宋体" w:hAnsi="宋体"/>
+          <w:sz w:val="21"/>
+          <w:lang w:eastAsia="zh-CN"/>
+        </w:rPr>
+        <w:t xml:space="preserve"> 鞠</w:t>
+      </w:r>
+      <w:proofErr w:type="gramStart"/>
+      <w:r>
+        <w:rPr>
+          <w:rFonts w:ascii="宋体" w:hAnsi="宋体"/>
+          <w:sz w:val="21"/>
+          <w:lang w:eastAsia="zh-CN"/>
+        </w:rPr>
+        <w:t>小林,</w:t>
+      </w:r>
+      <w:proofErr w:type="gramEnd"/>
+      <w:r>
+        <w:rPr>
+          <w:rFonts w:ascii="宋体" w:hAnsi="宋体"/>
+          <w:sz w:val="21"/>
+          <w:lang w:eastAsia="zh-CN"/>
+        </w:rPr>
+        <w:t xml:space="preserve"> 王皓</w:t>
+      </w:r>
+      <w:proofErr w:type="gramStart"/>
+      <w:r>
+        <w:rPr>
+          <w:rFonts w:ascii="宋体" w:hAnsi="宋体"/>
+          <w:sz w:val="21"/>
+          <w:lang w:eastAsia="zh-CN"/>
+        </w:rPr>
+        <w:t>晨.</w:t>
+      </w:r>
+      <w:proofErr w:type="gramEnd"/>
+      <w:r>
+        <w:rPr>
+          <w:rFonts w:ascii="宋体" w:hAnsi="宋体"/>
+          <w:sz w:val="21"/>
+          <w:lang w:eastAsia="zh-CN"/>
+        </w:rPr>
+        <w:t xml:space="preserve"> 大模型下编程教学面临的挑战与应对[J]. 计算机</w:t>
+      </w:r>
+      <w:proofErr w:type="gramStart"/>
+      <w:r>
+        <w:rPr>
+          <w:rFonts w:ascii="宋体" w:hAnsi="宋体"/>
+          <w:sz w:val="21"/>
+          <w:lang w:eastAsia="zh-CN"/>
+        </w:rPr>
+        <w:t>教育,</w:t>
+      </w:r>
+      <w:proofErr w:type="gramEnd"/>
+      <w:r>
+        <w:rPr>
+          <w:rFonts w:ascii="宋体" w:hAnsi="宋体"/>
+          <w:sz w:val="21"/>
+          <w:lang w:eastAsia="zh-CN"/>
+        </w:rPr>
+        <w:t xml:space="preserve"> 2023</w:t>
+      </w:r>
+      <w:proofErr w:type="gramStart"/>
+      <w:r>
+        <w:rPr>
+          <w:rFonts w:ascii="宋体" w:hAnsi="宋体"/>
+          <w:sz w:val="21"/>
+          <w:lang w:eastAsia="zh-CN"/>
+        </w:rPr>
+        <w:t>(11): 60</w:t>
+      </w:r>
+      <w:proofErr w:type="gramEnd"/>
+      <w:r>
+        <w:rPr>
+          <w:rFonts w:ascii="宋体" w:hAnsi="宋体"/>
+          <w:sz w:val="21"/>
+          <w:lang w:eastAsia="zh-CN"/>
+        </w:rPr>
+        <w:t>-64.</w:t>
+      </w:r>
+    </w:p>
+    <w:p>
+      <w:pPr>
+        <w:keepNext w:val="0"/>
+        <w:keepLines w:val="0"/>
+        <w:widowControl w:val="0"/>
+        <w:spacing w:after="0" w:line="400" w:lineRule="exact"/>
+        <w:jc w:val="both"/>
+        <w:rPr>
+          <w:lang w:eastAsia="zh-CN"/>
+        </w:rPr>
+      </w:pPr>
+      <w:r>
+        <w:rPr>
+          <w:rFonts w:ascii="宋体" w:hAnsi="宋体"/>
+          <w:sz w:val="21"/>
+          <w:lang w:eastAsia="zh-CN"/>
+        </w:rPr>
+        <w:t>[11]</w:t>
+      </w:r>
+      <w:proofErr w:type="gramStart"/>
+      <w:r>
+        <w:rPr>
+          <w:rFonts w:ascii="宋体" w:hAnsi="宋体"/>
+          <w:sz w:val="21"/>
+          <w:lang w:eastAsia="zh-CN"/>
+        </w:rPr>
+        <w:t>何洋,</w:t>
+      </w:r>
+      <w:proofErr w:type="gramEnd"/>
+      <w:r>
+        <w:rPr>
+          <w:rFonts w:ascii="宋体" w:hAnsi="宋体"/>
+          <w:sz w:val="21"/>
+          <w:lang w:eastAsia="zh-CN"/>
+        </w:rPr>
+        <w:t xml:space="preserve"> </w:t>
+      </w:r>
+      <w:proofErr w:type="gramStart"/>
+      <w:r>
+        <w:rPr>
+          <w:rFonts w:ascii="宋体" w:hAnsi="宋体"/>
+          <w:sz w:val="21"/>
+          <w:lang w:eastAsia="zh-CN"/>
+        </w:rPr>
+        <w:t>李钰敏,</w:t>
+      </w:r>
+      <w:proofErr w:type="gramEnd"/>
+      <w:r>
+        <w:rPr>
+          <w:rFonts w:ascii="宋体" w:hAnsi="宋体"/>
+          <w:sz w:val="21"/>
+          <w:lang w:eastAsia="zh-CN"/>
+        </w:rPr>
+        <w:t xml:space="preserve"> </w:t>
+      </w:r>
+      <w:proofErr w:type="gramStart"/>
+      <w:r>
+        <w:rPr>
+          <w:rFonts w:ascii="宋体" w:hAnsi="宋体"/>
+          <w:sz w:val="21"/>
+          <w:lang w:eastAsia="zh-CN"/>
+        </w:rPr>
+        <w:t>俞佳君,</w:t>
+      </w:r>
+      <w:proofErr w:type="gramEnd"/>
+      <w:r>
+        <w:rPr>
+          <w:rFonts w:ascii="宋体" w:hAnsi="宋体"/>
+          <w:sz w:val="21"/>
+          <w:lang w:eastAsia="zh-CN"/>
+        </w:rPr>
+        <w:t xml:space="preserve"> 常筱</w:t>
+      </w:r>
+      <w:proofErr w:type="gramStart"/>
+      <w:r>
+        <w:rPr>
+          <w:rFonts w:ascii="宋体" w:hAnsi="宋体"/>
+          <w:sz w:val="21"/>
+          <w:lang w:eastAsia="zh-CN"/>
+        </w:rPr>
+        <w:t>微.</w:t>
+      </w:r>
+      <w:proofErr w:type="gramEnd"/>
+      <w:r>
+        <w:rPr>
+          <w:rFonts w:ascii="宋体" w:hAnsi="宋体"/>
+          <w:sz w:val="21"/>
+          <w:lang w:eastAsia="zh-CN"/>
+        </w:rPr>
+        <w:t xml:space="preserve"> 一种大语言模型赋能的白盒测试教学新范式[J]. 计算机</w:t>
+      </w:r>
+      <w:proofErr w:type="gramStart"/>
+      <w:r>
+        <w:rPr>
+          <w:rFonts w:ascii="宋体" w:hAnsi="宋体"/>
+          <w:sz w:val="21"/>
+          <w:lang w:eastAsia="zh-CN"/>
+        </w:rPr>
+        <w:t>教育,</w:t>
+      </w:r>
+      <w:proofErr w:type="gramEnd"/>
+      <w:r>
+        <w:rPr>
+          <w:rFonts w:ascii="宋体" w:hAnsi="宋体"/>
+          <w:sz w:val="21"/>
+          <w:lang w:eastAsia="zh-CN"/>
+        </w:rPr>
+        <w:t xml:space="preserve"> 2026</w:t>
+      </w:r>
+      <w:proofErr w:type="gramStart"/>
+      <w:r>
+        <w:rPr>
+          <w:rFonts w:ascii="宋体" w:hAnsi="宋体"/>
+          <w:sz w:val="21"/>
+          <w:lang w:eastAsia="zh-CN"/>
+        </w:rPr>
+        <w:t>(4): 118</w:t>
+      </w:r>
+      <w:proofErr w:type="gramEnd"/>
+      <w:r>
+        <w:rPr>
+          <w:rFonts w:ascii="宋体" w:hAnsi="宋体"/>
+          <w:sz w:val="21"/>
+          <w:lang w:eastAsia="zh-CN"/>
+        </w:rPr>
+        <w:t>-122.</w:t>
+      </w:r>
+    </w:p>
+    <w:p>
+      <w:pPr>
+        <w:keepNext w:val="0"/>
+        <w:keepLines w:val="0"/>
+        <w:widowControl w:val="0"/>
+        <w:spacing w:after="0" w:line="400" w:lineRule="exact"/>
+        <w:jc w:val="both"/>
+      </w:pPr>
+      <w:r>
+        <w:rPr>
+          <w:rFonts w:eastAsia="Times New Roman"/>
+          <w:sz w:val="21"/>
+        </w:rPr>
+        <w:t xml:space="preserve">[12]Spring. Spring Boot 3.5 Reference </w:t>
+      </w:r>
+      <w:proofErr w:type="gramStart"/>
+      <w:r>
+        <w:rPr>
+          <w:rFonts w:eastAsia="Times New Roman"/>
+          <w:sz w:val="21"/>
+        </w:rPr>
+        <w:t>Documentation[</w:t>
+      </w:r>
+      <w:proofErr w:type="gramEnd"/>
+      <w:r>
+        <w:rPr>
+          <w:rFonts w:eastAsia="Times New Roman"/>
+          <w:sz w:val="21"/>
+        </w:rPr>
+        <w:t>EB/OL]. https://docs.spring.io/spring-boot/3.5/reference/index.html, [2026-10-26].</w:t>
+      </w:r>
+    </w:p>
+    <w:p>
+      <w:pPr>
+        <w:keepNext w:val="0"/>
+        <w:keepLines w:val="0"/>
+        <w:widowControl w:val="0"/>
+        <w:spacing w:after="0" w:line="400" w:lineRule="exact"/>
+        <w:jc w:val="both"/>
+      </w:pPr>
+      <w:r>
+        <w:rPr>
+          <w:rFonts w:eastAsia="Times New Roman"/>
+          <w:sz w:val="21"/>
+        </w:rPr>
+        <w:t>[13]</w:t>
+      </w:r>
+      <w:proofErr w:type="spellStart"/>
+      <w:r>
+        <w:rPr>
+          <w:rFonts w:eastAsia="Times New Roman"/>
+          <w:sz w:val="21"/>
+        </w:rPr>
+        <w:t>MyBatis</w:t>
+      </w:r>
+      <w:proofErr w:type="spellEnd"/>
+      <w:r>
+        <w:rPr>
+          <w:rFonts w:eastAsia="Times New Roman"/>
+          <w:sz w:val="21"/>
+        </w:rPr>
+        <w:t xml:space="preserve">-Plus. </w:t>
+      </w:r>
+      <w:proofErr w:type="gramStart"/>
+      <w:r>
+        <w:rPr>
+          <w:rFonts w:eastAsia="Times New Roman"/>
+          <w:sz w:val="21"/>
+        </w:rPr>
+        <w:t>Introduction[</w:t>
+      </w:r>
+      <w:proofErr w:type="gramEnd"/>
+      <w:r>
+        <w:rPr>
+          <w:rFonts w:eastAsia="Times New Roman"/>
+          <w:sz w:val="21"/>
+        </w:rPr>
+        <w:t>EB/OL]. https://baomidou.com/en/introduce/, 2025-10-04/2026-10-26.</w:t>
+      </w:r>
+    </w:p>
+    <w:p>
+      <w:pPr>
+        <w:keepNext w:val="0"/>
+        <w:keepLines w:val="0"/>
+        <w:widowControl w:val="0"/>
+        <w:spacing w:after="0" w:line="400" w:lineRule="exact"/>
+        <w:jc w:val="both"/>
+      </w:pPr>
+      <w:r>
+        <w:rPr>
+          <w:rFonts w:eastAsia="Times New Roman"/>
+          <w:sz w:val="21"/>
+        </w:rPr>
+        <w:t xml:space="preserve">[14]Oracle Corporation. MySQL 8.4 Reference Manual: FOREIGN KEY </w:t>
+      </w:r>
+      <w:proofErr w:type="gramStart"/>
+      <w:r>
+        <w:rPr>
+          <w:rFonts w:eastAsia="Times New Roman"/>
+          <w:sz w:val="21"/>
         </w:rPr>
         <w:t>Constraints[</w:t>
       </w:r>
       <w:proofErr w:type="gramEnd"/>
       <w:r>
         <w:rPr>
-          <w:rFonts w:ascii="Times New Roman" w:eastAsia="Times New Roman" w:hAnsi="Times New Roman"/>
-        </w:rPr>
-        <w:t>EB/OL]. https://dev.mysql.com/doc/refman/8.4/en/constraint-foreign-key.html, 2026-10-26.</w:t>
+          <w:rFonts w:eastAsia="Times New Roman"/>
+          <w:sz w:val="21"/>
+        </w:rPr>
+        <w:t>EB/OL]. https://dev.mysql.com/doc/refman/8.4/en/create-table-foreign-keys.html, [2026-10-26].</w:t>
+      </w:r>
+    </w:p>
+    <w:p>
+      <w:pPr>
+        <w:keepNext w:val="0"/>
+        <w:keepLines w:val="0"/>
+        <w:widowControl w:val="0"/>
+        <w:spacing w:after="0" w:line="400" w:lineRule="exact"/>
+        <w:jc w:val="both"/>
+      </w:pPr>
+      <w:r>
+        <w:rPr>
+          <w:rFonts w:eastAsia="Times New Roman"/>
+          <w:sz w:val="21"/>
+        </w:rPr>
+        <w:t>[15]</w:t>
+      </w:r>
+      <w:proofErr w:type="spellStart"/>
+      <w:r>
+        <w:rPr>
+          <w:rFonts w:eastAsia="Times New Roman"/>
+          <w:sz w:val="21"/>
+        </w:rPr>
+        <w:t>Monperrus</w:t>
+      </w:r>
+      <w:proofErr w:type="spellEnd"/>
+      <w:r>
+        <w:rPr>
+          <w:rFonts w:eastAsia="Times New Roman"/>
+          <w:sz w:val="21"/>
+        </w:rPr>
+        <w:t xml:space="preserve"> Martin. Automatic Software Repair: A Bibliography[J]. ACM Computing Surveys, 2018, 51(1): 17:1-17:24.</w:t>
+      </w:r>
+    </w:p>
+    <w:p>
+      <w:pPr>
+        <w:keepNext w:val="0"/>
+        <w:keepLines w:val="0"/>
+        <w:widowControl w:val="0"/>
+        <w:spacing w:after="0" w:line="400" w:lineRule="exact"/>
+        <w:jc w:val="both"/>
+      </w:pPr>
+      <w:r>
+        <w:rPr>
+          <w:rFonts w:eastAsia="Times New Roman"/>
+          <w:sz w:val="21"/>
+        </w:rPr>
+        <w:t xml:space="preserve">[16]Chen Xinyun, Lin Maxwell, </w:t>
+      </w:r>
+      <w:proofErr w:type="spellStart"/>
+      <w:r>
+        <w:rPr>
+          <w:rFonts w:eastAsia="Times New Roman"/>
+          <w:sz w:val="21"/>
+        </w:rPr>
+        <w:t>Schärli</w:t>
+      </w:r>
+      <w:proofErr w:type="spellEnd"/>
+      <w:r>
+        <w:rPr>
+          <w:rFonts w:eastAsia="Times New Roman"/>
+          <w:sz w:val="21"/>
+        </w:rPr>
+        <w:t xml:space="preserve"> Nathanael, Zhou Denny. Teaching Large Language Models to Self-Debug[EB/OL]. https://openreview.net/forum?id=KuPixIqPiq, 2024/2026-10-26.</w:t>
       </w:r>
     </w:p>
     <w:sectPr>
-      <w:headerReference w:type="default" r:id="rId14"/>
-      <w:footerReference w:type="default" r:id="rId15"/>
+      <w:headerReference w:type="even" r:id="rId8"/>
+      <w:headerReference w:type="default" r:id="rId9"/>
+      <w:footerReference w:type="even" r:id="rId10"/>
+      <w:footerReference w:type="default" r:id="rId11"/>
+      <w:headerReference w:type="first" r:id="rId12"/>
+      <w:footerReference w:type="first" r:id="rId13"/>
       <w:pgSz w:w="11906" w:h="16838"/>
-      <w:pgMar w:top="1417" w:right="1474" w:bottom="1417" w:left="1871" w:header="850" w:footer="850" w:gutter="0"/>
+      <w:pgMar w:top="1440" w:right="1417" w:bottom="1440" w:left="1587" w:header="720" w:footer="720" w:gutter="0"/>
       <w:cols w:space="720"/>
       <w:docGrid w:linePitch="360"/>
     </w:sectPr>
@@ -1197,10 +3189,7 @@
   <w:endnote w:type="separator" w:id="-1">
     <w:p>
       <w:pPr>
-        <w:spacing w:line="240" w:lineRule="auto"/>
-        <w:rPr>
-          <w:rFonts w:hint="eastAsia"/>
-        </w:rPr>
+        <w:spacing w:after="0" w:line="240" w:lineRule="auto"/>
       </w:pPr>
       <w:r>
         <w:separator/>
@@ -1210,10 +3199,7 @@
   <w:endnote w:type="continuationSeparator" w:id="0">
     <w:p>
       <w:pPr>
-        <w:spacing w:line="240" w:lineRule="auto"/>
-        <w:rPr>
-          <w:rFonts w:hint="eastAsia"/>
-        </w:rPr>
+        <w:spacing w:after="0" w:line="240" w:lineRule="auto"/>
       </w:pPr>
       <w:r>
         <w:continuationSeparator/>
@@ -1228,47 +3214,7 @@
   <w:p>
     <w:pPr>
       <w:pStyle w:val="a7"/>
-      <w:ind w:firstLine="0"/>
-      <w:jc w:val="center"/>
-      <w:rPr>
-        <w:rFonts w:hint="eastAsia"/>
-      </w:rPr>
     </w:pPr>
-    <w:r>
-      <w:rPr>
-        <w:rFonts w:ascii="Times New Roman" w:hAnsi="Times New Roman"/>
-        <w:sz w:val="18"/>
-      </w:rPr>
-      <w:fldChar w:fldCharType="begin"/>
-    </w:r>
-    <w:r>
-      <w:rPr>
-        <w:rFonts w:ascii="Times New Roman" w:hAnsi="Times New Roman"/>
-        <w:sz w:val="18"/>
-      </w:rPr>
-      <w:instrText xml:space="preserve"> PAGE </w:instrText>
-    </w:r>
-    <w:r>
-      <w:rPr>
-        <w:rFonts w:ascii="Times New Roman" w:hAnsi="Times New Roman"/>
-        <w:sz w:val="18"/>
-      </w:rPr>
-      <w:fldChar w:fldCharType="separate"/>
-    </w:r>
-    <w:r>
-      <w:rPr>
-        <w:rFonts w:ascii="Times New Roman" w:hAnsi="Times New Roman"/>
-        <w:sz w:val="18"/>
-      </w:rPr>
-      <w:t>1</w:t>
-    </w:r>
-    <w:r>
-      <w:rPr>
-        <w:rFonts w:ascii="Times New Roman" w:hAnsi="Times New Roman"/>
-        <w:sz w:val="18"/>
-      </w:rPr>
-      <w:fldChar w:fldCharType="end"/>
-    </w:r>
   </w:p>
 </w:ftr>
 </file>
@@ -1278,47 +3224,12 @@
   <w:p>
     <w:pPr>
       <w:pStyle w:val="a7"/>
-      <w:ind w:firstLine="0"/>
       <w:jc w:val="center"/>
       <w:rPr>
-        <w:rFonts w:hint="eastAsia"/>
+        <w:rFonts w:cs="Times New Roman"/>
+        <w:sz w:val="20"/>
       </w:rPr>
     </w:pPr>
-    <w:r>
-      <w:rPr>
-        <w:rFonts w:ascii="Times New Roman" w:hAnsi="Times New Roman"/>
-        <w:sz w:val="18"/>
-      </w:rPr>
-      <w:fldChar w:fldCharType="begin"/>
-    </w:r>
-    <w:r>
-      <w:rPr>
-        <w:rFonts w:ascii="Times New Roman" w:hAnsi="Times New Roman"/>
-        <w:sz w:val="18"/>
-      </w:rPr>
-      <w:instrText xml:space="preserve"> PAGE </w:instrText>
-    </w:r>
-    <w:r>
-      <w:rPr>
-        <w:rFonts w:ascii="Times New Roman" w:hAnsi="Times New Roman"/>
-        <w:sz w:val="18"/>
-      </w:rPr>
-      <w:fldChar w:fldCharType="separate"/>
-    </w:r>
-    <w:r>
-      <w:rPr>
-        <w:rFonts w:ascii="Times New Roman" w:hAnsi="Times New Roman"/>
-        <w:sz w:val="18"/>
-      </w:rPr>
-      <w:t>1</w:t>
-    </w:r>
-    <w:r>
-      <w:rPr>
-        <w:rFonts w:ascii="Times New Roman" w:hAnsi="Times New Roman"/>
-        <w:sz w:val="18"/>
-      </w:rPr>
-      <w:fldChar w:fldCharType="end"/>
-    </w:r>
   </w:p>
 </w:ftr>
 </file>
@@ -1328,87 +3239,7 @@
   <w:p>
     <w:pPr>
       <w:pStyle w:val="a7"/>
-      <w:ind w:firstLine="0"/>
-      <w:jc w:val="center"/>
-      <w:rPr>
-        <w:rFonts w:hint="eastAsia"/>
-      </w:rPr>
     </w:pPr>
-    <w:r>
-      <w:rPr>
-        <w:sz w:val="18"/>
-      </w:rPr>
-      <w:fldChar w:fldCharType="begin"/>
-    </w:r>
-    <w:r>
-      <w:rPr>
-        <w:sz w:val="18"/>
-      </w:rPr>
-      <w:instrText xml:space="preserve"> PAGE </w:instrText>
-    </w:r>
-    <w:r>
-      <w:rPr>
-        <w:sz w:val="18"/>
-      </w:rPr>
-      <w:fldChar w:fldCharType="separate"/>
-    </w:r>
-    <w:r>
-      <w:rPr>
-        <w:sz w:val="18"/>
-      </w:rPr>
-      <w:t>1</w:t>
-    </w:r>
-    <w:r>
-      <w:rPr>
-        <w:sz w:val="18"/>
-      </w:rPr>
-      <w:fldChar w:fldCharType="end"/>
-    </w:r>
-  </w:p>
-</w:ftr>
-</file>
-
-<file path=word/footer4.xml><?xml version="1.0" encoding="utf-8"?>
-<w:ftr xmlns:wpc="http://schemas.microsoft.com/office/word/2010/wordprocessingCanvas" xmlns:cx="http://schemas.microsoft.com/office/drawing/2014/chartex" xmlns:cx1="http://schemas.microsoft.com/office/drawing/2015/9/8/chartex" xmlns:cx2="http://schemas.microsoft.com/office/drawing/2015/10/21/chartex" xmlns:cx3="http://schemas.microsoft.com/office/drawing/2016/5/9/chartex" xmlns:cx4="http://schemas.microsoft.com/office/drawing/2016/5/10/chartex" xmlns:cx5="http://schemas.microsoft.com/office/drawing/2016/5/11/chartex" xmlns:cx6="http://schemas.microsoft.com/office/drawing/2016/5/12/chartex" xmlns:cx7="http://schemas.microsoft.com/office/drawing/2016/5/13/chartex" xmlns:cx8="http://schemas.microsoft.com/office/drawing/2016/5/14/chartex" xmlns:mc="http://schemas.openxmlformats.org/markup-compatibility/2006" xmlns:aink="http://schemas.microsoft.com/office/drawing/2016/ink" xmlns:am3d="http://schemas.microsoft.com/office/drawing/2017/model3d" xmlns:o="urn:schemas-microsoft-com:office:office" xmlns:oel="http://schemas.microsoft.com/office/2019/extlst" xmlns:r="http://schemas.openxmlformats.org/officeDocument/2006/relationships" xmlns:m="http://schemas.openxmlformats.org/officeDocument/2006/math" xmlns:v="urn:schemas-microsoft-com:vml" xmlns:wp14="http://schemas.microsoft.com/office/word/2010/wordprocessingDrawing" xmlns:wp="http://schemas.openxmlformats.org/drawingml/2006/wordprocessingDrawing" xmlns:w10="urn:schemas-microsoft-com:office:word" xmlns:w="http://schemas.openxmlformats.org/wordprocessingml/2006/main" xmlns:w14="http://schemas.microsoft.com/office/word/2010/wordml" xmlns:w15="http://schemas.microsoft.com/office/word/2012/wordml" xmlns:w16cex="http://schemas.microsoft.com/office/word/2018/wordml/cex" xmlns:w16cid="http://schemas.microsoft.com/office/word/2016/wordml/cid" xmlns:w16="http://schemas.microsoft.com/office/word/2018/wordml" xmlns:w16du="http://schemas.microsoft.com/office/word/2023/wordml/word16du" xmlns:w16sdtdh="http://schemas.microsoft.com/office/word/2020/wordml/sdtdatahash" xmlns:w16sdtfl="http://schemas.microsoft.com/office/word/2024/wordml/sdtformatlock" xmlns:w16se="http://schemas.microsoft.com/office/word/2015/wordml/symex" xmlns:wpg="http://schemas.microsoft.com/office/word/2010/wordprocessingGroup" xmlns:wpi="http://schemas.microsoft.com/office/word/2010/wordprocessingInk" xmlns:wne="http://schemas.microsoft.com/office/word/2006/wordml" xmlns:wps="http://schemas.microsoft.com/office/word/2010/wordprocessingShape" mc:Ignorable="w14 w15 w16se w16cid w16 w16cex w16sdtdh w16sdtfl w16du wp14">
-  <w:p>
-    <w:pPr>
-      <w:pStyle w:val="a7"/>
-      <w:ind w:firstLine="0"/>
-      <w:jc w:val="center"/>
-      <w:rPr>
-        <w:rFonts w:hint="eastAsia"/>
-      </w:rPr>
-    </w:pPr>
-    <w:r>
-      <w:rPr>
-        <w:sz w:val="18"/>
-      </w:rPr>
-      <w:fldChar w:fldCharType="begin"/>
-    </w:r>
-    <w:r>
-      <w:rPr>
-        <w:sz w:val="18"/>
-      </w:rPr>
-      <w:instrText xml:space="preserve"> PAGE </w:instrText>
-    </w:r>
-    <w:r>
-      <w:rPr>
-        <w:sz w:val="18"/>
-      </w:rPr>
-      <w:fldChar w:fldCharType="separate"/>
-    </w:r>
-    <w:r>
-      <w:rPr>
-        <w:sz w:val="18"/>
-      </w:rPr>
-      <w:t>1</w:t>
-    </w:r>
-    <w:r>
-      <w:rPr>
-        <w:sz w:val="18"/>
-      </w:rPr>
-      <w:fldChar w:fldCharType="end"/>
-    </w:r>
   </w:p>
 </w:ftr>
 </file>
@@ -1418,10 +3249,7 @@
   <w:footnote w:type="separator" w:id="-1">
     <w:p>
       <w:pPr>
-        <w:spacing w:line="240" w:lineRule="auto"/>
-        <w:rPr>
-          <w:rFonts w:hint="eastAsia"/>
-        </w:rPr>
+        <w:spacing w:after="0" w:line="240" w:lineRule="auto"/>
       </w:pPr>
       <w:r>
         <w:separator/>
@@ -1431,10 +3259,7 @@
   <w:footnote w:type="continuationSeparator" w:id="0">
     <w:p>
       <w:pPr>
-        <w:spacing w:line="240" w:lineRule="auto"/>
-        <w:rPr>
-          <w:rFonts w:hint="eastAsia"/>
-        </w:rPr>
+        <w:spacing w:after="0" w:line="240" w:lineRule="auto"/>
       </w:pPr>
       <w:r>
         <w:continuationSeparator/>
@@ -1449,24 +3274,7 @@
   <w:p>
     <w:pPr>
       <w:pStyle w:val="a5"/>
-      <w:pBdr>
-        <w:bottom w:val="double" w:sz="6" w:space="1" w:color="000000"/>
-      </w:pBdr>
-      <w:spacing w:line="240" w:lineRule="exact"/>
-      <w:ind w:firstLine="0"/>
-      <w:jc w:val="center"/>
-      <w:rPr>
-        <w:rFonts w:hint="eastAsia"/>
-      </w:rPr>
     </w:pPr>
-    <w:proofErr w:type="spellStart"/>
-    <w:r>
-      <w:rPr>
-        <w:sz w:val="18"/>
-      </w:rPr>
-      <w:t>摘要</w:t>
-    </w:r>
-    <w:proofErr w:type="spellEnd"/>
   </w:p>
 </w:hdr>
 </file>
@@ -1476,23 +3284,7 @@
   <w:p>
     <w:pPr>
       <w:pStyle w:val="a5"/>
-      <w:pBdr>
-        <w:bottom w:val="double" w:sz="6" w:space="1" w:color="000000"/>
-      </w:pBdr>
-      <w:spacing w:line="240" w:lineRule="exact"/>
-      <w:ind w:firstLine="0"/>
-      <w:jc w:val="center"/>
-      <w:rPr>
-        <w:rFonts w:hint="eastAsia"/>
-      </w:rPr>
     </w:pPr>
-    <w:r>
-      <w:rPr>
-        <w:rFonts w:ascii="Times New Roman" w:hAnsi="Times New Roman"/>
-        <w:sz w:val="18"/>
-      </w:rPr>
-      <w:t>ABSTRACT</w:t>
-    </w:r>
   </w:p>
 </w:hdr>
 </file>
@@ -1502,79 +3294,7 @@
   <w:p>
     <w:pPr>
       <w:pStyle w:val="a5"/>
-      <w:pBdr>
-        <w:bottom w:val="double" w:sz="6" w:space="1" w:color="000000"/>
-      </w:pBdr>
-      <w:spacing w:line="240" w:lineRule="exact"/>
-      <w:ind w:firstLine="0"/>
-      <w:jc w:val="center"/>
-      <w:rPr>
-        <w:rFonts w:hint="eastAsia"/>
-      </w:rPr>
     </w:pPr>
-    <w:proofErr w:type="spellStart"/>
-    <w:r>
-      <w:rPr>
-        <w:sz w:val="18"/>
-      </w:rPr>
-      <w:t>基于Spring</w:t>
-    </w:r>
-    <w:proofErr w:type="spellEnd"/>
-    <w:r>
-      <w:rPr>
-        <w:sz w:val="18"/>
-      </w:rPr>
-      <w:t xml:space="preserve"> </w:t>
-    </w:r>
-    <w:proofErr w:type="spellStart"/>
-    <w:r>
-      <w:rPr>
-        <w:sz w:val="18"/>
-      </w:rPr>
-      <w:t>Boot的编程错题智能解析助手系统设计与实现</w:t>
-    </w:r>
-    <w:proofErr w:type="spellEnd"/>
-  </w:p>
-</w:hdr>
-</file>
-
-<file path=word/header4.xml><?xml version="1.0" encoding="utf-8"?>
-<w:hdr xmlns:wpc="http://schemas.microsoft.com/office/word/2010/wordprocessingCanvas" xmlns:cx="http://schemas.microsoft.com/office/drawing/2014/chartex" xmlns:cx1="http://schemas.microsoft.com/office/drawing/2015/9/8/chartex" xmlns:cx2="http://schemas.microsoft.com/office/drawing/2015/10/21/chartex" xmlns:cx3="http://schemas.microsoft.com/office/drawing/2016/5/9/chartex" xmlns:cx4="http://schemas.microsoft.com/office/drawing/2016/5/10/chartex" xmlns:cx5="http://schemas.microsoft.com/office/drawing/2016/5/11/chartex" xmlns:cx6="http://schemas.microsoft.com/office/drawing/2016/5/12/chartex" xmlns:cx7="http://schemas.microsoft.com/office/drawing/2016/5/13/chartex" xmlns:cx8="http://schemas.microsoft.com/office/drawing/2016/5/14/chartex" xmlns:mc="http://schemas.openxmlformats.org/markup-compatibility/2006" xmlns:aink="http://schemas.microsoft.com/office/drawing/2016/ink" xmlns:am3d="http://schemas.microsoft.com/office/drawing/2017/model3d" xmlns:o="urn:schemas-microsoft-com:office:office" xmlns:oel="http://schemas.microsoft.com/office/2019/extlst" xmlns:r="http://schemas.openxmlformats.org/officeDocument/2006/relationships" xmlns:m="http://schemas.openxmlformats.org/officeDocument/2006/math" xmlns:v="urn:schemas-microsoft-com:vml" xmlns:wp14="http://schemas.microsoft.com/office/word/2010/wordprocessingDrawing" xmlns:wp="http://schemas.openxmlformats.org/drawingml/2006/wordprocessingDrawing" xmlns:w10="urn:schemas-microsoft-com:office:word" xmlns:w="http://schemas.openxmlformats.org/wordprocessingml/2006/main" xmlns:w14="http://schemas.microsoft.com/office/word/2010/wordml" xmlns:w15="http://schemas.microsoft.com/office/word/2012/wordml" xmlns:w16cex="http://schemas.microsoft.com/office/word/2018/wordml/cex" xmlns:w16cid="http://schemas.microsoft.com/office/word/2016/wordml/cid" xmlns:w16="http://schemas.microsoft.com/office/word/2018/wordml" xmlns:w16du="http://schemas.microsoft.com/office/word/2023/wordml/word16du" xmlns:w16sdtdh="http://schemas.microsoft.com/office/word/2020/wordml/sdtdatahash" xmlns:w16sdtfl="http://schemas.microsoft.com/office/word/2024/wordml/sdtformatlock" xmlns:w16se="http://schemas.microsoft.com/office/word/2015/wordml/symex" xmlns:wpg="http://schemas.microsoft.com/office/word/2010/wordprocessingGroup" xmlns:wpi="http://schemas.microsoft.com/office/word/2010/wordprocessingInk" xmlns:wne="http://schemas.microsoft.com/office/word/2006/wordml" xmlns:wps="http://schemas.microsoft.com/office/word/2010/wordprocessingShape" mc:Ignorable="w14 w15 w16se w16cid w16 w16cex w16sdtdh w16sdtfl w16du wp14">
-  <w:p>
-    <w:pPr>
-      <w:pStyle w:val="a5"/>
-      <w:pBdr>
-        <w:bottom w:val="double" w:sz="6" w:space="1" w:color="000000"/>
-      </w:pBdr>
-      <w:spacing w:line="240" w:lineRule="exact"/>
-      <w:ind w:firstLine="0"/>
-      <w:jc w:val="center"/>
-      <w:rPr>
-        <w:rFonts w:hint="eastAsia"/>
-      </w:rPr>
-    </w:pPr>
-    <w:proofErr w:type="spellStart"/>
-    <w:r>
-      <w:rPr>
-        <w:sz w:val="18"/>
-      </w:rPr>
-      <w:t>基于Spring</w:t>
-    </w:r>
-    <w:proofErr w:type="spellEnd"/>
-    <w:r>
-      <w:rPr>
-        <w:sz w:val="18"/>
-      </w:rPr>
-      <w:t xml:space="preserve"> </w:t>
-    </w:r>
-    <w:proofErr w:type="spellStart"/>
-    <w:r>
-      <w:rPr>
-        <w:sz w:val="18"/>
-      </w:rPr>
-      <w:t>Boot的编程错题智能解析助手系统设计与实现</w:t>
-    </w:r>
-    <w:proofErr w:type="spellEnd"/>
   </w:p>
 </w:hdr>
 </file>
@@ -1752,31 +3472,31 @@
       </w:rPr>
     </w:lvl>
   </w:abstractNum>
-  <w:num w:numId="1" w16cid:durableId="418016514">
+  <w:num w:numId="1" w16cid:durableId="1577471375">
     <w:abstractNumId w:val="8"/>
   </w:num>
-  <w:num w:numId="2" w16cid:durableId="1817411077">
+  <w:num w:numId="2" w16cid:durableId="98991967">
     <w:abstractNumId w:val="6"/>
   </w:num>
-  <w:num w:numId="3" w16cid:durableId="235628597">
+  <w:num w:numId="3" w16cid:durableId="973407794">
     <w:abstractNumId w:val="5"/>
   </w:num>
-  <w:num w:numId="4" w16cid:durableId="1275090183">
+  <w:num w:numId="4" w16cid:durableId="2056343458">
     <w:abstractNumId w:val="4"/>
   </w:num>
-  <w:num w:numId="5" w16cid:durableId="794328566">
+  <w:num w:numId="5" w16cid:durableId="922954021">
     <w:abstractNumId w:val="7"/>
   </w:num>
-  <w:num w:numId="6" w16cid:durableId="463430757">
+  <w:num w:numId="6" w16cid:durableId="1477722848">
     <w:abstractNumId w:val="3"/>
   </w:num>
-  <w:num w:numId="7" w16cid:durableId="196356904">
+  <w:num w:numId="7" w16cid:durableId="2112431400">
     <w:abstractNumId w:val="2"/>
   </w:num>
-  <w:num w:numId="8" w16cid:durableId="2006207957">
+  <w:num w:numId="8" w16cid:durableId="968976116">
     <w:abstractNumId w:val="1"/>
   </w:num>
-  <w:num w:numId="9" w16cid:durableId="585573988">
+  <w:num w:numId="9" w16cid:durableId="1023676990">
     <w:abstractNumId w:val="0"/>
   </w:num>
 </w:numbering>
@@ -2173,12 +3893,10 @@
     <w:qFormat/>
     <w:rsid w:val="00FC693F"/>
     <w:pPr>
-      <w:widowControl w:val="0"/>
-      <w:spacing w:after="0" w:line="400" w:lineRule="exact"/>
-      <w:ind w:firstLine="480"/>
+      <w:spacing w:after="120" w:line="360" w:lineRule="auto"/>
     </w:pPr>
     <w:rPr>
-      <w:rFonts w:ascii="宋体" w:eastAsia="宋体" w:hAnsi="宋体"/>
+      <w:rFonts w:ascii="Times New Roman" w:eastAsia="宋体" w:hAnsi="Times New Roman"/>
       <w:color w:val="000000"/>
       <w:sz w:val="24"/>
     </w:rPr>
@@ -2192,15 +3910,17 @@
     <w:qFormat/>
     <w:rsid w:val="00FC693F"/>
     <w:pPr>
-      <w:spacing w:before="400" w:after="400" w:line="240" w:lineRule="auto"/>
-      <w:ind w:firstLine="0"/>
-      <w:jc w:val="center"/>
+      <w:keepNext/>
+      <w:keepLines/>
+      <w:spacing w:before="480" w:after="0"/>
       <w:outlineLvl w:val="0"/>
     </w:pPr>
     <w:rPr>
-      <w:rFonts w:ascii="黑体" w:eastAsia="黑体" w:hAnsi="黑体"/>
+      <w:rFonts w:asciiTheme="majorHAnsi" w:eastAsiaTheme="majorEastAsia" w:hAnsiTheme="majorHAnsi" w:cstheme="majorBidi"/>
+      <w:b/>
       <w:bCs/>
-      <w:sz w:val="30"/>
+      <w:color w:val="365F91" w:themeColor="accent1" w:themeShade="BF"/>
+      <w:sz w:val="28"/>
       <w:szCs w:val="28"/>
     </w:rPr>
   </w:style>
@@ -2214,7 +3934,9 @@
     <w:qFormat/>
     <w:rsid w:val="00FC693F"/>
     <w:pPr>
-      <w:spacing w:before="200"/>
+      <w:keepNext/>
+      <w:keepLines/>
+      <w:spacing w:before="200" w:after="0"/>
       <w:outlineLvl w:val="1"/>
     </w:pPr>
     <w:rPr>
@@ -2236,7 +3958,9 @@
     <w:qFormat/>
     <w:rsid w:val="00FC693F"/>
     <w:pPr>
-      <w:spacing w:before="200"/>
+      <w:keepNext/>
+      <w:keepLines/>
+      <w:spacing w:before="200" w:after="0"/>
       <w:outlineLvl w:val="2"/>
     </w:pPr>
     <w:rPr>
@@ -2257,7 +3981,9 @@
     <w:qFormat/>
     <w:rsid w:val="00FC693F"/>
     <w:pPr>
-      <w:spacing w:before="200"/>
+      <w:keepNext/>
+      <w:keepLines/>
+      <w:spacing w:before="200" w:after="0"/>
       <w:outlineLvl w:val="3"/>
     </w:pPr>
     <w:rPr>
@@ -2280,7 +4006,9 @@
     <w:qFormat/>
     <w:rsid w:val="00FC693F"/>
     <w:pPr>
-      <w:spacing w:before="200"/>
+      <w:keepNext/>
+      <w:keepLines/>
+      <w:spacing w:before="200" w:after="0"/>
       <w:outlineLvl w:val="4"/>
     </w:pPr>
     <w:rPr>
@@ -2299,7 +4027,9 @@
     <w:qFormat/>
     <w:rsid w:val="00FC693F"/>
     <w:pPr>
-      <w:spacing w:before="200"/>
+      <w:keepNext/>
+      <w:keepLines/>
+      <w:spacing w:before="200" w:after="0"/>
       <w:outlineLvl w:val="5"/>
     </w:pPr>
     <w:rPr>
@@ -2320,7 +4050,9 @@
     <w:qFormat/>
     <w:rsid w:val="00FC693F"/>
     <w:pPr>
-      <w:spacing w:before="200"/>
+      <w:keepNext/>
+      <w:keepLines/>
+      <w:spacing w:before="200" w:after="0"/>
       <w:outlineLvl w:val="6"/>
     </w:pPr>
     <w:rPr>
@@ -2341,7 +4073,9 @@
     <w:qFormat/>
     <w:rsid w:val="00FC693F"/>
     <w:pPr>
-      <w:spacing w:before="200"/>
+      <w:keepNext/>
+      <w:keepLines/>
+      <w:spacing w:before="200" w:after="0"/>
       <w:outlineLvl w:val="7"/>
     </w:pPr>
     <w:rPr>
@@ -2362,7 +4096,9 @@
     <w:qFormat/>
     <w:rsid w:val="00FC693F"/>
     <w:pPr>
-      <w:spacing w:before="200"/>
+      <w:keepNext/>
+      <w:keepLines/>
+      <w:spacing w:before="200" w:after="0"/>
       <w:outlineLvl w:val="8"/>
     </w:pPr>
     <w:rPr>
@@ -2413,7 +4149,7 @@
         <w:tab w:val="center" w:pos="4680"/>
         <w:tab w:val="right" w:pos="9360"/>
       </w:tabs>
-      <w:spacing w:line="240" w:lineRule="auto"/>
+      <w:spacing w:after="0" w:line="240" w:lineRule="auto"/>
     </w:pPr>
   </w:style>
   <w:style w:type="character" w:customStyle="1" w:styleId="a6">
@@ -2435,7 +4171,7 @@
         <w:tab w:val="center" w:pos="4680"/>
         <w:tab w:val="right" w:pos="9360"/>
       </w:tabs>
-      <w:spacing w:line="240" w:lineRule="auto"/>
+      <w:spacing w:after="0" w:line="240" w:lineRule="auto"/>
     </w:pPr>
   </w:style>
   <w:style w:type="character" w:customStyle="1" w:styleId="a8">
@@ -2451,7 +4187,6 @@
     <w:qFormat/>
     <w:rsid w:val="00FC693F"/>
     <w:pPr>
-      <w:widowControl w:val="0"/>
       <w:spacing w:after="0" w:line="240" w:lineRule="auto"/>
     </w:pPr>
   </w:style>
@@ -2507,16 +4242,18 @@
     <w:qFormat/>
     <w:rsid w:val="00FC693F"/>
     <w:pPr>
-      <w:spacing w:before="720" w:line="240" w:lineRule="auto"/>
-      <w:ind w:firstLine="0"/>
+      <w:pBdr>
+        <w:bottom w:val="single" w:sz="8" w:space="4" w:color="4F81BD" w:themeColor="accent1"/>
+      </w:pBdr>
+      <w:spacing w:after="300" w:line="240" w:lineRule="auto"/>
       <w:contextualSpacing/>
-      <w:jc w:val="center"/>
     </w:pPr>
     <w:rPr>
-      <w:rFonts w:ascii="黑体" w:eastAsia="黑体" w:hAnsi="黑体"/>
+      <w:rFonts w:asciiTheme="majorHAnsi" w:eastAsiaTheme="majorEastAsia" w:hAnsiTheme="majorHAnsi" w:cstheme="majorBidi"/>
+      <w:color w:val="17365D" w:themeColor="text2" w:themeShade="BF"/>
       <w:spacing w:val="5"/>
       <w:kern w:val="28"/>
-      <w:sz w:val="36"/>
+      <w:sz w:val="52"/>
       <w:szCs w:val="52"/>
     </w:rPr>
   </w:style>
@@ -2547,7 +4284,6 @@
       <w:numPr>
         <w:ilvl w:val="1"/>
       </w:numPr>
-      <w:ind w:firstLine="480"/>
     </w:pPr>
     <w:rPr>
       <w:rFonts w:asciiTheme="majorHAnsi" w:eastAsiaTheme="majorEastAsia" w:hAnsiTheme="majorHAnsi" w:cstheme="majorBidi"/>
@@ -2592,9 +4328,6 @@
     <w:uiPriority w:val="99"/>
     <w:unhideWhenUsed/>
     <w:rsid w:val="00AA1D8D"/>
-    <w:pPr>
-      <w:spacing w:after="120"/>
-    </w:pPr>
   </w:style>
   <w:style w:type="character" w:customStyle="1" w:styleId="af0">
     <w:name w:val="正文文本 字符"/>
@@ -2611,7 +4344,7 @@
     <w:unhideWhenUsed/>
     <w:rsid w:val="00AA1D8D"/>
     <w:pPr>
-      <w:spacing w:after="120" w:line="480" w:lineRule="auto"/>
+      <w:spacing w:line="480" w:lineRule="auto"/>
     </w:pPr>
   </w:style>
   <w:style w:type="character" w:customStyle="1" w:styleId="24">
@@ -2628,9 +4361,6 @@
     <w:uiPriority w:val="99"/>
     <w:unhideWhenUsed/>
     <w:rsid w:val="00AA1D8D"/>
-    <w:pPr>
-      <w:spacing w:after="120"/>
-    </w:pPr>
     <w:rPr>
       <w:sz w:val="16"/>
       <w:szCs w:val="16"/>
@@ -2765,7 +4495,6 @@
     <w:unhideWhenUsed/>
     <w:rsid w:val="0029639D"/>
     <w:pPr>
-      <w:spacing w:after="120"/>
       <w:ind w:left="360"/>
       <w:contextualSpacing/>
     </w:pPr>
@@ -2777,7 +4506,6 @@
     <w:unhideWhenUsed/>
     <w:rsid w:val="0029639D"/>
     <w:pPr>
-      <w:spacing w:after="120"/>
       <w:ind w:left="720"/>
       <w:contextualSpacing/>
     </w:pPr>
@@ -2789,7 +4517,6 @@
     <w:unhideWhenUsed/>
     <w:rsid w:val="0029639D"/>
     <w:pPr>
-      <w:spacing w:after="120"/>
       <w:ind w:left="1080"/>
       <w:contextualSpacing/>
     </w:pPr>
@@ -2801,7 +4528,6 @@
     <w:unhideWhenUsed/>
     <w:rsid w:val="0029639D"/>
     <w:pPr>
-      <w:widowControl w:val="0"/>
       <w:tabs>
         <w:tab w:val="left" w:pos="576"/>
         <w:tab w:val="left" w:pos="1152"/>
@@ -13153,115 +14879,6 @@
         <w:shd w:val="clear" w:color="auto" w:fill="FBCAA2" w:themeFill="accent6" w:themeFillTint="7F"/>
       </w:tcPr>
     </w:tblStylePr>
-  </w:style>
-  <w:style w:type="paragraph" w:customStyle="1" w:styleId="aff9">
-    <w:name w:val="摘要标题"/>
-    <w:pPr>
-      <w:widowControl w:val="0"/>
-      <w:spacing w:before="400" w:after="400" w:line="240" w:lineRule="auto"/>
-      <w:jc w:val="center"/>
-    </w:pPr>
-    <w:rPr>
-      <w:rFonts w:ascii="黑体" w:eastAsia="黑体" w:hAnsi="黑体"/>
-      <w:color w:val="000000"/>
-      <w:sz w:val="28"/>
-    </w:rPr>
-  </w:style>
-  <w:style w:type="paragraph" w:customStyle="1" w:styleId="affa">
-    <w:name w:val="英文摘要标题"/>
-    <w:pPr>
-      <w:widowControl w:val="0"/>
-      <w:spacing w:before="400" w:after="400" w:line="240" w:lineRule="auto"/>
-      <w:jc w:val="center"/>
-    </w:pPr>
-    <w:rPr>
-      <w:rFonts w:ascii="Times New Roman" w:eastAsia="Times New Roman" w:hAnsi="Times New Roman"/>
-      <w:b/>
-      <w:color w:val="000000"/>
-      <w:sz w:val="28"/>
-    </w:rPr>
-  </w:style>
-  <w:style w:type="paragraph" w:customStyle="1" w:styleId="affb">
-    <w:name w:val="目录标题"/>
-    <w:pPr>
-      <w:widowControl w:val="0"/>
-      <w:spacing w:before="400" w:after="400" w:line="240" w:lineRule="auto"/>
-      <w:jc w:val="center"/>
-    </w:pPr>
-    <w:rPr>
-      <w:rFonts w:ascii="黑体" w:eastAsia="黑体" w:hAnsi="黑体"/>
-      <w:color w:val="000000"/>
-      <w:sz w:val="28"/>
-    </w:rPr>
-  </w:style>
-  <w:style w:type="paragraph" w:customStyle="1" w:styleId="affc">
-    <w:name w:val="英文摘要正文"/>
-    <w:pPr>
-      <w:widowControl w:val="0"/>
-      <w:spacing w:after="0" w:line="400" w:lineRule="exact"/>
-      <w:ind w:firstLine="480"/>
-    </w:pPr>
-    <w:rPr>
-      <w:rFonts w:ascii="Times New Roman" w:eastAsia="Times New Roman" w:hAnsi="Times New Roman"/>
-      <w:color w:val="000000"/>
-      <w:sz w:val="24"/>
-    </w:rPr>
-  </w:style>
-  <w:style w:type="paragraph" w:customStyle="1" w:styleId="affd">
-    <w:name w:val="参考文献正文"/>
-    <w:pPr>
-      <w:widowControl w:val="0"/>
-      <w:spacing w:after="0" w:line="400" w:lineRule="exact"/>
-    </w:pPr>
-    <w:rPr>
-      <w:rFonts w:ascii="宋体" w:eastAsia="宋体" w:hAnsi="宋体"/>
-      <w:color w:val="000000"/>
-      <w:sz w:val="21"/>
-    </w:rPr>
-  </w:style>
-  <w:style w:type="paragraph" w:customStyle="1" w:styleId="affe">
-    <w:name w:val="关键词"/>
-    <w:pPr>
-      <w:widowControl w:val="0"/>
-      <w:spacing w:after="0" w:line="400" w:lineRule="exact"/>
-    </w:pPr>
-    <w:rPr>
-      <w:rFonts w:ascii="宋体" w:eastAsia="宋体" w:hAnsi="宋体"/>
-      <w:color w:val="000000"/>
-      <w:sz w:val="24"/>
-    </w:rPr>
-  </w:style>
-  <w:style w:type="paragraph" w:customStyle="1" w:styleId="afff">
-    <w:name w:val="目录正文"/>
-    <w:pPr>
-      <w:widowControl w:val="0"/>
-      <w:spacing w:after="0" w:line="400" w:lineRule="exact"/>
-    </w:pPr>
-    <w:rPr>
-      <w:rFonts w:ascii="宋体" w:eastAsia="宋体" w:hAnsi="宋体"/>
-      <w:color w:val="000000"/>
-      <w:sz w:val="24"/>
-    </w:rPr>
-  </w:style>
-  <w:style w:type="paragraph" w:styleId="TOC1">
-    <w:name w:val="toc 1"/>
-    <w:basedOn w:val="a1"/>
-    <w:next w:val="a1"/>
-    <w:autoRedefine/>
-    <w:uiPriority w:val="39"/>
-    <w:unhideWhenUsed/>
-    <w:rsid w:val="00AF7207"/>
-  </w:style>
-  <w:style w:type="character" w:styleId="afff0">
-    <w:name w:val="Hyperlink"/>
-    <w:basedOn w:val="a2"/>
-    <w:uiPriority w:val="99"/>
-    <w:unhideWhenUsed/>
-    <w:rsid w:val="00AF7207"/>
-    <w:rPr>
-      <w:color w:val="0000FF" w:themeColor="hyperlink"/>
-      <w:u w:val="single"/>
-    </w:rPr>
   </w:style>
 </w:styles>
 </file>

</xml_diff>